<commit_message>
Update Technical Report Eoin Fitzsimons.docx
</commit_message>
<xml_diff>
--- a/docs/Technical Report Eoin Fitzsimons.docx
+++ b/docs/Technical Report Eoin Fitzsimons.docx
@@ -3093,6 +3093,11 @@
     <w:p>
       <w:pPr>
         <w:pStyle w:val="Heading1"/>
+        <w:numPr>
+          <w:ilvl w:val="0"/>
+          <w:numId w:val="0"/>
+        </w:numPr>
+        <w:ind w:left="432"/>
       </w:pPr>
       <w:bookmarkStart w:id="0" w:name="_Toc232419747"/>
       <w:r>
@@ -3133,10 +3138,6 @@
     <w:p>
       <w:pPr>
         <w:pStyle w:val="Heading1"/>
-        <w:numPr>
-          <w:ilvl w:val="0"/>
-          <w:numId w:val="1"/>
-        </w:numPr>
       </w:pPr>
       <w:bookmarkStart w:id="1" w:name="_Toc232419748"/>
       <w:r>
@@ -3147,10 +3148,6 @@
     <w:p>
       <w:pPr>
         <w:pStyle w:val="Heading2"/>
-        <w:numPr>
-          <w:ilvl w:val="1"/>
-          <w:numId w:val="1"/>
-        </w:numPr>
       </w:pPr>
       <w:bookmarkStart w:id="2" w:name="_Toc232419749"/>
       <w:r>
@@ -3178,10 +3175,6 @@
     <w:p>
       <w:pPr>
         <w:pStyle w:val="Heading2"/>
-        <w:numPr>
-          <w:ilvl w:val="1"/>
-          <w:numId w:val="1"/>
-        </w:numPr>
       </w:pPr>
       <w:bookmarkStart w:id="3" w:name="_Toc232419750"/>
       <w:r>
@@ -3209,10 +3202,6 @@
     <w:p>
       <w:pPr>
         <w:pStyle w:val="Heading2"/>
-        <w:numPr>
-          <w:ilvl w:val="1"/>
-          <w:numId w:val="1"/>
-        </w:numPr>
       </w:pPr>
       <w:bookmarkStart w:id="4" w:name="_Toc232419751"/>
       <w:r>
@@ -3240,10 +3229,6 @@
     <w:p>
       <w:pPr>
         <w:pStyle w:val="Heading2"/>
-        <w:numPr>
-          <w:ilvl w:val="1"/>
-          <w:numId w:val="1"/>
-        </w:numPr>
       </w:pPr>
       <w:bookmarkStart w:id="5" w:name="_Toc232419752"/>
       <w:r>
@@ -3271,10 +3256,6 @@
     <w:p>
       <w:pPr>
         <w:pStyle w:val="Heading1"/>
-        <w:numPr>
-          <w:ilvl w:val="0"/>
-          <w:numId w:val="1"/>
-        </w:numPr>
       </w:pPr>
       <w:bookmarkStart w:id="6" w:name="_Toc232419753"/>
       <w:r>
@@ -3285,10 +3266,6 @@
     <w:p>
       <w:pPr>
         <w:pStyle w:val="Heading2"/>
-        <w:numPr>
-          <w:ilvl w:val="1"/>
-          <w:numId w:val="1"/>
-        </w:numPr>
       </w:pPr>
       <w:bookmarkStart w:id="7" w:name="_Toc232419754"/>
       <w:r>
@@ -3316,11 +3293,7 @@
     <w:p/>
     <w:p>
       <w:pPr>
-        <w:pStyle w:val="Heading2"/>
-        <w:numPr>
-          <w:ilvl w:val="2"/>
-          <w:numId w:val="1"/>
-        </w:numPr>
+        <w:pStyle w:val="Heading3"/>
       </w:pPr>
       <w:bookmarkStart w:id="8" w:name="_Toc232419755"/>
       <w:r>
@@ -3416,11 +3389,7 @@
     </w:p>
     <w:p>
       <w:pPr>
-        <w:pStyle w:val="Heading2"/>
-        <w:numPr>
-          <w:ilvl w:val="3"/>
-          <w:numId w:val="1"/>
-        </w:numPr>
+        <w:pStyle w:val="Heading4"/>
       </w:pPr>
       <w:bookmarkStart w:id="9" w:name="_Toc232419756"/>
       <w:r>
@@ -3431,11 +3400,7 @@
     </w:p>
     <w:p>
       <w:pPr>
-        <w:pStyle w:val="Heading2"/>
-        <w:numPr>
-          <w:ilvl w:val="3"/>
-          <w:numId w:val="1"/>
-        </w:numPr>
+        <w:pStyle w:val="Heading4"/>
       </w:pPr>
       <w:bookmarkStart w:id="10" w:name="_Toc232419757"/>
       <w:r>
@@ -3468,11 +3433,7 @@
     </w:p>
     <w:p>
       <w:pPr>
-        <w:pStyle w:val="Heading2"/>
-        <w:numPr>
-          <w:ilvl w:val="3"/>
-          <w:numId w:val="1"/>
-        </w:numPr>
+        <w:pStyle w:val="Heading4"/>
       </w:pPr>
       <w:bookmarkStart w:id="11" w:name="_Toc232419758"/>
       <w:r>
@@ -3498,11 +3459,7 @@
     </w:p>
     <w:p>
       <w:pPr>
-        <w:pStyle w:val="Heading2"/>
-        <w:numPr>
-          <w:ilvl w:val="3"/>
-          <w:numId w:val="1"/>
-        </w:numPr>
+        <w:pStyle w:val="Heading4"/>
       </w:pPr>
       <w:bookmarkStart w:id="12" w:name="_Toc232419759"/>
       <w:r>
@@ -3529,9 +3486,22 @@
     </w:p>
     <w:p>
       <w:pPr>
+        <w:pStyle w:val="Heading5"/>
+        <w:rPr>
+          <w:lang w:val="en-GB"/>
+        </w:rPr>
+      </w:pPr>
+      <w:r>
+        <w:rPr>
+          <w:lang w:val="en-GB"/>
+        </w:rPr>
+        <w:t>Scope</w:t>
+      </w:r>
+    </w:p>
+    <w:p>
+      <w:pPr>
         <w:ind w:left="1080"/>
         <w:rPr>
-          <w:b/>
           <w:sz w:val="24"/>
           <w:szCs w:val="24"/>
           <w:lang w:val="en-GB"/>
@@ -3539,12 +3509,26 @@
       </w:pPr>
       <w:r>
         <w:rPr>
-          <w:b/>
-          <w:sz w:val="24"/>
-          <w:szCs w:val="24"/>
+          <w:sz w:val="24"/>
+          <w:szCs w:val="24"/>
+          <w:highlight w:val="yellow"/>
           <w:lang w:val="en-GB"/>
         </w:rPr>
-        <w:t>Scope</w:t>
+        <w:t>The scope of this use case is to …….</w:t>
+      </w:r>
+    </w:p>
+    <w:p>
+      <w:pPr>
+        <w:pStyle w:val="Heading5"/>
+        <w:rPr>
+          <w:lang w:val="en-GB"/>
+        </w:rPr>
+      </w:pPr>
+      <w:r>
+        <w:rPr>
+          <w:lang w:val="en-GB"/>
+        </w:rPr>
+        <w:t>Description</w:t>
       </w:r>
     </w:p>
     <w:p>
@@ -3563,7 +3547,40 @@
           <w:highlight w:val="yellow"/>
           <w:lang w:val="en-GB"/>
         </w:rPr>
-        <w:t>The scope of this use case is to …….</w:t>
+        <w:t>This use case describes the ……</w:t>
+      </w:r>
+      <w:proofErr w:type="gramStart"/>
+      <w:r>
+        <w:rPr>
+          <w:sz w:val="24"/>
+          <w:szCs w:val="24"/>
+          <w:highlight w:val="yellow"/>
+          <w:lang w:val="en-GB"/>
+        </w:rPr>
+        <w:t>…..</w:t>
+      </w:r>
+      <w:proofErr w:type="gramEnd"/>
+      <w:r>
+        <w:rPr>
+          <w:sz w:val="24"/>
+          <w:szCs w:val="24"/>
+          <w:lang w:val="en-GB"/>
+        </w:rPr>
+        <w:t xml:space="preserve"> </w:t>
+      </w:r>
+    </w:p>
+    <w:p>
+      <w:pPr>
+        <w:pStyle w:val="Heading5"/>
+        <w:rPr>
+          <w:lang w:val="en-GB"/>
+        </w:rPr>
+      </w:pPr>
+      <w:r>
+        <w:rPr>
+          <w:lang w:val="en-GB"/>
+        </w:rPr>
+        <w:t>Use Case Diagram</w:t>
       </w:r>
     </w:p>
     <w:p>
@@ -3577,12 +3594,45 @@
       </w:pPr>
       <w:r>
         <w:rPr>
-          <w:b/>
-          <w:sz w:val="24"/>
-          <w:szCs w:val="24"/>
+          <w:sz w:val="24"/>
+          <w:szCs w:val="24"/>
+          <w:highlight w:val="yellow"/>
           <w:lang w:val="en-GB"/>
         </w:rPr>
-        <w:t>Description</w:t>
+        <w:t>Diagram should highlight actors and uses cases…</w:t>
+      </w:r>
+      <w:proofErr w:type="gramStart"/>
+      <w:r>
+        <w:rPr>
+          <w:sz w:val="24"/>
+          <w:szCs w:val="24"/>
+          <w:highlight w:val="yellow"/>
+          <w:lang w:val="en-GB"/>
+        </w:rPr>
+        <w:t>…..</w:t>
+      </w:r>
+      <w:proofErr w:type="gramEnd"/>
+    </w:p>
+    <w:p>
+      <w:pPr>
+        <w:pStyle w:val="Heading5"/>
+        <w:rPr>
+          <w:lang w:val="en-GB"/>
+        </w:rPr>
+      </w:pPr>
+      <w:r>
+        <w:rPr>
+          <w:lang w:val="en-GB"/>
+        </w:rPr>
+        <w:t>Flow Description</w:t>
+      </w:r>
+    </w:p>
+    <w:p>
+      <w:pPr>
+        <w:pStyle w:val="Heading6"/>
+      </w:pPr>
+      <w:r>
+        <w:t>Precondition</w:t>
       </w:r>
     </w:p>
     <w:p>
@@ -3601,7 +3651,7 @@
           <w:highlight w:val="yellow"/>
           <w:lang w:val="en-GB"/>
         </w:rPr>
-        <w:t>This use case describes the ……</w:t>
+        <w:t>The system is in initialisation mode…</w:t>
       </w:r>
       <w:proofErr w:type="gramStart"/>
       <w:r>
@@ -3614,185 +3664,39 @@
         <w:t>…..</w:t>
       </w:r>
       <w:proofErr w:type="gramEnd"/>
-      <w:r>
+    </w:p>
+    <w:p>
+      <w:pPr>
+        <w:pStyle w:val="Heading6"/>
+      </w:pPr>
+      <w:r>
+        <w:t>Activation</w:t>
+      </w:r>
+    </w:p>
+    <w:p>
+      <w:pPr>
+        <w:ind w:left="1080"/>
         <w:rPr>
           <w:sz w:val="24"/>
           <w:szCs w:val="24"/>
           <w:lang w:val="en-GB"/>
         </w:rPr>
-        <w:t xml:space="preserve"> </w:t>
-      </w:r>
-    </w:p>
-    <w:p>
-      <w:pPr>
-        <w:ind w:left="1080"/>
-        <w:rPr>
-          <w:b/>
-          <w:sz w:val="24"/>
-          <w:szCs w:val="24"/>
+      </w:pPr>
+      <w:r>
+        <w:rPr>
+          <w:sz w:val="24"/>
+          <w:szCs w:val="24"/>
+          <w:highlight w:val="yellow"/>
           <w:lang w:val="en-GB"/>
         </w:rPr>
-      </w:pPr>
-      <w:r>
-        <w:rPr>
-          <w:b/>
-          <w:sz w:val="24"/>
-          <w:szCs w:val="24"/>
-          <w:lang w:val="en-GB"/>
-        </w:rPr>
-        <w:t>Use Case Diagram</w:t>
-      </w:r>
-    </w:p>
-    <w:p>
-      <w:pPr>
-        <w:ind w:left="1080"/>
-        <w:rPr>
-          <w:sz w:val="24"/>
-          <w:szCs w:val="24"/>
-          <w:lang w:val="en-GB"/>
-        </w:rPr>
-      </w:pPr>
-      <w:r>
-        <w:rPr>
-          <w:sz w:val="24"/>
-          <w:szCs w:val="24"/>
-          <w:highlight w:val="yellow"/>
-          <w:lang w:val="en-GB"/>
-        </w:rPr>
-        <w:t>Diagram should highlight actors and uses cases…</w:t>
-      </w:r>
-      <w:proofErr w:type="gramStart"/>
-      <w:r>
-        <w:rPr>
-          <w:sz w:val="24"/>
-          <w:szCs w:val="24"/>
-          <w:highlight w:val="yellow"/>
-          <w:lang w:val="en-GB"/>
-        </w:rPr>
-        <w:t>…..</w:t>
-      </w:r>
-      <w:proofErr w:type="gramEnd"/>
-    </w:p>
-    <w:p>
-      <w:pPr>
-        <w:ind w:left="1080"/>
-        <w:rPr>
-          <w:b/>
-          <w:sz w:val="24"/>
-          <w:szCs w:val="24"/>
-          <w:lang w:val="en-GB"/>
-        </w:rPr>
-      </w:pPr>
-      <w:r>
-        <w:rPr>
-          <w:b/>
-          <w:sz w:val="24"/>
-          <w:szCs w:val="24"/>
-          <w:lang w:val="en-GB"/>
-        </w:rPr>
-        <w:t>Flow Description</w:t>
-      </w:r>
-    </w:p>
-    <w:p>
-      <w:pPr>
-        <w:ind w:left="1080"/>
-        <w:rPr>
-          <w:b/>
-          <w:sz w:val="24"/>
-          <w:szCs w:val="24"/>
-        </w:rPr>
-      </w:pPr>
-      <w:r>
-        <w:rPr>
-          <w:b/>
-          <w:sz w:val="24"/>
-          <w:szCs w:val="24"/>
-        </w:rPr>
-        <w:t>Precondition</w:t>
-      </w:r>
-    </w:p>
-    <w:p>
-      <w:pPr>
-        <w:ind w:left="1080"/>
-        <w:rPr>
-          <w:sz w:val="24"/>
-          <w:szCs w:val="24"/>
-          <w:lang w:val="en-GB"/>
-        </w:rPr>
-      </w:pPr>
-      <w:r>
-        <w:rPr>
-          <w:sz w:val="24"/>
-          <w:szCs w:val="24"/>
-          <w:highlight w:val="yellow"/>
-          <w:lang w:val="en-GB"/>
-        </w:rPr>
-        <w:t>The system is in initialisation mode…</w:t>
-      </w:r>
-      <w:proofErr w:type="gramStart"/>
-      <w:r>
-        <w:rPr>
-          <w:sz w:val="24"/>
-          <w:szCs w:val="24"/>
-          <w:highlight w:val="yellow"/>
-          <w:lang w:val="en-GB"/>
-        </w:rPr>
-        <w:t>…..</w:t>
-      </w:r>
-      <w:proofErr w:type="gramEnd"/>
-    </w:p>
-    <w:p>
-      <w:pPr>
-        <w:ind w:left="1080"/>
-        <w:rPr>
-          <w:b/>
-          <w:sz w:val="24"/>
-          <w:szCs w:val="24"/>
-        </w:rPr>
-      </w:pPr>
-      <w:r>
-        <w:rPr>
-          <w:b/>
-          <w:sz w:val="24"/>
-          <w:szCs w:val="24"/>
-        </w:rPr>
-        <w:t>Activation</w:t>
-      </w:r>
-    </w:p>
-    <w:p>
-      <w:pPr>
-        <w:ind w:left="1080"/>
-        <w:rPr>
-          <w:sz w:val="24"/>
-          <w:szCs w:val="24"/>
-          <w:lang w:val="en-GB"/>
-        </w:rPr>
-      </w:pPr>
-      <w:r>
-        <w:rPr>
-          <w:sz w:val="24"/>
-          <w:szCs w:val="24"/>
-          <w:highlight w:val="yellow"/>
-          <w:lang w:val="en-GB"/>
-        </w:rPr>
         <w:t>This use case starts when an &lt;Actor&gt;…………</w:t>
       </w:r>
     </w:p>
     <w:p>
       <w:pPr>
-        <w:ind w:left="1080"/>
-        <w:rPr>
-          <w:b/>
-          <w:sz w:val="24"/>
-          <w:szCs w:val="24"/>
-        </w:rPr>
-      </w:pPr>
-      <w:r>
-        <w:rPr>
-          <w:b/>
-          <w:sz w:val="24"/>
-          <w:szCs w:val="24"/>
-        </w:rPr>
+        <w:pStyle w:val="Heading6"/>
+      </w:pPr>
+      <w:r>
         <w:t>Main flow</w:t>
       </w:r>
     </w:p>
@@ -3934,19 +3838,9 @@
     </w:p>
     <w:p>
       <w:pPr>
-        <w:ind w:left="1080"/>
-        <w:rPr>
-          <w:b/>
-          <w:sz w:val="24"/>
-          <w:szCs w:val="24"/>
-        </w:rPr>
-      </w:pPr>
-      <w:r>
-        <w:rPr>
-          <w:b/>
-          <w:sz w:val="24"/>
-          <w:szCs w:val="24"/>
-        </w:rPr>
+        <w:pStyle w:val="Heading6"/>
+      </w:pPr>
+      <w:r>
         <w:t>Alternate flow</w:t>
       </w:r>
     </w:p>
@@ -4082,20 +3976,9 @@
     </w:p>
     <w:p>
       <w:pPr>
-        <w:ind w:left="1080"/>
-        <w:rPr>
-          <w:b/>
-          <w:sz w:val="24"/>
-          <w:szCs w:val="24"/>
-        </w:rPr>
-      </w:pPr>
-      <w:r>
-        <w:rPr>
-          <w:b/>
-          <w:sz w:val="24"/>
-          <w:szCs w:val="24"/>
-        </w:rPr>
-        <w:lastRenderedPageBreak/>
+        <w:pStyle w:val="Heading6"/>
+      </w:pPr>
+      <w:r>
         <w:t>Exceptional flow</w:t>
       </w:r>
     </w:p>
@@ -4231,110 +4114,86 @@
     </w:p>
     <w:p>
       <w:pPr>
+        <w:pStyle w:val="Heading6"/>
+      </w:pPr>
+      <w:r>
+        <w:t>Termination</w:t>
+      </w:r>
+    </w:p>
+    <w:p>
+      <w:pPr>
         <w:ind w:left="1080"/>
         <w:rPr>
+          <w:sz w:val="24"/>
+          <w:szCs w:val="24"/>
+          <w:lang w:val="en-GB"/>
+        </w:rPr>
+      </w:pPr>
+      <w:r>
+        <w:rPr>
+          <w:sz w:val="24"/>
+          <w:szCs w:val="24"/>
+          <w:highlight w:val="yellow"/>
+          <w:lang w:val="en-GB"/>
+        </w:rPr>
+        <w:t>The system presents the next ……….</w:t>
+      </w:r>
+    </w:p>
+    <w:p>
+      <w:pPr>
+        <w:pStyle w:val="Heading6"/>
+      </w:pPr>
+      <w:r>
+        <w:t>Post condition</w:t>
+      </w:r>
+    </w:p>
+    <w:p>
+      <w:pPr>
+        <w:ind w:left="864" w:firstLine="216"/>
+        <w:rPr>
+          <w:sz w:val="24"/>
+          <w:szCs w:val="24"/>
+        </w:rPr>
+      </w:pPr>
+      <w:r>
+        <w:rPr>
+          <w:sz w:val="24"/>
+          <w:szCs w:val="24"/>
+          <w:highlight w:val="yellow"/>
+        </w:rPr>
+        <w:t>The system goes into a wait state</w:t>
+      </w:r>
+    </w:p>
+    <w:p>
+      <w:pPr>
+        <w:ind w:left="864"/>
+        <w:rPr>
+          <w:sz w:val="24"/>
+          <w:szCs w:val="24"/>
+        </w:rPr>
+      </w:pPr>
+      <w:r>
+        <w:rPr>
           <w:b/>
-          <w:sz w:val="24"/>
-          <w:szCs w:val="24"/>
-        </w:rPr>
-      </w:pPr>
+        </w:rPr>
+        <w:t>List further functional requirements here, using the same st</w:t>
+      </w:r>
       <w:r>
         <w:rPr>
           <w:b/>
-          <w:sz w:val="24"/>
-          <w:szCs w:val="24"/>
-        </w:rPr>
-        <w:t>Termination</w:t>
-      </w:r>
-    </w:p>
-    <w:p>
-      <w:pPr>
-        <w:ind w:left="1080"/>
-        <w:rPr>
-          <w:sz w:val="24"/>
-          <w:szCs w:val="24"/>
-          <w:lang w:val="en-GB"/>
-        </w:rPr>
-      </w:pPr>
-      <w:r>
-        <w:rPr>
-          <w:sz w:val="24"/>
-          <w:szCs w:val="24"/>
-          <w:highlight w:val="yellow"/>
-          <w:lang w:val="en-GB"/>
-        </w:rPr>
-        <w:t>The system presents the next ……….</w:t>
-      </w:r>
-    </w:p>
-    <w:p>
-      <w:pPr>
-        <w:ind w:left="1080"/>
+        </w:rPr>
+        <w:t>ructure as for Requirement1</w:t>
+      </w:r>
+      <w:r>
         <w:rPr>
           <w:b/>
-          <w:sz w:val="24"/>
-          <w:szCs w:val="24"/>
-        </w:rPr>
-      </w:pPr>
-      <w:r>
-        <w:rPr>
-          <w:b/>
-          <w:sz w:val="24"/>
-          <w:szCs w:val="24"/>
-        </w:rPr>
-        <w:t>Post condition</w:t>
-      </w:r>
-    </w:p>
-    <w:p>
-      <w:pPr>
-        <w:ind w:left="864" w:firstLine="216"/>
-        <w:rPr>
-          <w:sz w:val="24"/>
-          <w:szCs w:val="24"/>
-        </w:rPr>
-      </w:pPr>
-      <w:r>
-        <w:rPr>
-          <w:sz w:val="24"/>
-          <w:szCs w:val="24"/>
-          <w:highlight w:val="yellow"/>
-        </w:rPr>
-        <w:t>The system goes into a wait state</w:t>
-      </w:r>
-    </w:p>
-    <w:p>
-      <w:pPr>
-        <w:ind w:left="864"/>
-        <w:rPr>
-          <w:sz w:val="24"/>
-          <w:szCs w:val="24"/>
-        </w:rPr>
-      </w:pPr>
-      <w:r>
-        <w:rPr>
-          <w:b/>
-        </w:rPr>
-        <w:t>List further functional requirements here, using the same st</w:t>
-      </w:r>
-      <w:r>
-        <w:rPr>
-          <w:b/>
-        </w:rPr>
-        <w:t>ructure as for Requirement1</w:t>
-      </w:r>
-      <w:r>
-        <w:rPr>
-          <w:b/>
         </w:rPr>
         <w:t xml:space="preserve">. </w:t>
       </w:r>
     </w:p>
     <w:p>
       <w:pPr>
-        <w:pStyle w:val="Heading2"/>
-        <w:numPr>
-          <w:ilvl w:val="2"/>
-          <w:numId w:val="1"/>
-        </w:numPr>
+        <w:pStyle w:val="Heading3"/>
       </w:pPr>
       <w:bookmarkStart w:id="13" w:name="_Toc232419760"/>
       <w:r>
@@ -4345,11 +4204,7 @@
     <w:p/>
     <w:p>
       <w:pPr>
-        <w:pStyle w:val="Heading2"/>
-        <w:numPr>
-          <w:ilvl w:val="2"/>
-          <w:numId w:val="1"/>
-        </w:numPr>
+        <w:pStyle w:val="Heading3"/>
       </w:pPr>
       <w:bookmarkStart w:id="14" w:name="_Toc232419761"/>
       <w:r>
@@ -4360,11 +4215,7 @@
     <w:p/>
     <w:p>
       <w:pPr>
-        <w:pStyle w:val="Heading2"/>
-        <w:numPr>
-          <w:ilvl w:val="2"/>
-          <w:numId w:val="1"/>
-        </w:numPr>
+        <w:pStyle w:val="Heading3"/>
       </w:pPr>
       <w:bookmarkStart w:id="15" w:name="_Toc232419762"/>
       <w:r>
@@ -4375,11 +4226,7 @@
     <w:p/>
     <w:p>
       <w:pPr>
-        <w:pStyle w:val="Heading2"/>
-        <w:numPr>
-          <w:ilvl w:val="2"/>
-          <w:numId w:val="1"/>
-        </w:numPr>
+        <w:pStyle w:val="Heading3"/>
       </w:pPr>
       <w:bookmarkStart w:id="16" w:name="_Toc232419763"/>
       <w:r>
@@ -4474,10 +4321,6 @@
     <w:p>
       <w:pPr>
         <w:pStyle w:val="Heading2"/>
-        <w:numPr>
-          <w:ilvl w:val="1"/>
-          <w:numId w:val="1"/>
-        </w:numPr>
       </w:pPr>
       <w:bookmarkStart w:id="18" w:name="_Toc232419765"/>
       <w:r>
@@ -4770,10 +4613,6 @@
     <w:p>
       <w:pPr>
         <w:pStyle w:val="Heading1"/>
-        <w:numPr>
-          <w:ilvl w:val="0"/>
-          <w:numId w:val="1"/>
-        </w:numPr>
       </w:pPr>
       <w:bookmarkStart w:id="22" w:name="_Toc232419769"/>
       <w:r>
@@ -4830,10 +4669,6 @@
     <w:p>
       <w:pPr>
         <w:pStyle w:val="Heading1"/>
-        <w:numPr>
-          <w:ilvl w:val="0"/>
-          <w:numId w:val="1"/>
-        </w:numPr>
       </w:pPr>
       <w:bookmarkStart w:id="23" w:name="_Toc232419770"/>
       <w:r>
@@ -4874,10 +4709,6 @@
     <w:p>
       <w:pPr>
         <w:pStyle w:val="Heading1"/>
-        <w:numPr>
-          <w:ilvl w:val="0"/>
-          <w:numId w:val="1"/>
-        </w:numPr>
       </w:pPr>
       <w:bookmarkStart w:id="24" w:name="_Toc232419771"/>
       <w:r>
@@ -4937,10 +4768,6 @@
     <w:p>
       <w:pPr>
         <w:pStyle w:val="Heading1"/>
-        <w:numPr>
-          <w:ilvl w:val="0"/>
-          <w:numId w:val="1"/>
-        </w:numPr>
       </w:pPr>
       <w:bookmarkStart w:id="25" w:name="_Toc232419772"/>
       <w:r>
@@ -4963,10 +4790,6 @@
     <w:p>
       <w:pPr>
         <w:pStyle w:val="Heading2"/>
-        <w:numPr>
-          <w:ilvl w:val="1"/>
-          <w:numId w:val="1"/>
-        </w:numPr>
       </w:pPr>
       <w:bookmarkStart w:id="26" w:name="_Toc232419773"/>
       <w:r>
@@ -4977,10 +4800,6 @@
     <w:p>
       <w:pPr>
         <w:pStyle w:val="Heading2"/>
-        <w:numPr>
-          <w:ilvl w:val="1"/>
-          <w:numId w:val="1"/>
-        </w:numPr>
       </w:pPr>
       <w:bookmarkStart w:id="27" w:name="_Toc232419775"/>
       <w:r>
@@ -4992,10 +4811,6 @@
     <w:p>
       <w:pPr>
         <w:pStyle w:val="Heading2"/>
-        <w:numPr>
-          <w:ilvl w:val="1"/>
-          <w:numId w:val="1"/>
-        </w:numPr>
       </w:pPr>
       <w:bookmarkStart w:id="29" w:name="_Toc232419776"/>
       <w:bookmarkEnd w:id="28"/>
@@ -5254,7 +5069,7 @@
   <w:abstractNum w:abstractNumId="1" w15:restartNumberingAfterBreak="0">
     <w:nsid w:val="1482775B"/>
     <w:multiLevelType w:val="multilevel"/>
-    <w:tmpl w:val="0EBA3C40"/>
+    <w:tmpl w:val="A09E5D98"/>
     <w:lvl w:ilvl="0">
       <w:start w:val="1"/>
       <w:numFmt w:val="decimal"/>
@@ -5347,6 +5162,92 @@
     </w:lvl>
   </w:abstractNum>
   <w:abstractNum w:abstractNumId="2" w15:restartNumberingAfterBreak="0">
+    <w:nsid w:val="15994805"/>
+    <w:multiLevelType w:val="hybridMultilevel"/>
+    <w:tmpl w:val="706EC754"/>
+    <w:lvl w:ilvl="0" w:tplc="1809000F">
+      <w:start w:val="1"/>
+      <w:numFmt w:val="decimal"/>
+      <w:lvlText w:val="%1."/>
+      <w:lvlJc w:val="left"/>
+      <w:pPr>
+        <w:ind w:left="720" w:hanging="360"/>
+      </w:pPr>
+    </w:lvl>
+    <w:lvl w:ilvl="1" w:tplc="18090019" w:tentative="1">
+      <w:start w:val="1"/>
+      <w:numFmt w:val="lowerLetter"/>
+      <w:lvlText w:val="%2."/>
+      <w:lvlJc w:val="left"/>
+      <w:pPr>
+        <w:ind w:left="1440" w:hanging="360"/>
+      </w:pPr>
+    </w:lvl>
+    <w:lvl w:ilvl="2" w:tplc="1809001B" w:tentative="1">
+      <w:start w:val="1"/>
+      <w:numFmt w:val="lowerRoman"/>
+      <w:lvlText w:val="%3."/>
+      <w:lvlJc w:val="right"/>
+      <w:pPr>
+        <w:ind w:left="2160" w:hanging="180"/>
+      </w:pPr>
+    </w:lvl>
+    <w:lvl w:ilvl="3" w:tplc="1809000F" w:tentative="1">
+      <w:start w:val="1"/>
+      <w:numFmt w:val="decimal"/>
+      <w:lvlText w:val="%4."/>
+      <w:lvlJc w:val="left"/>
+      <w:pPr>
+        <w:ind w:left="2880" w:hanging="360"/>
+      </w:pPr>
+    </w:lvl>
+    <w:lvl w:ilvl="4" w:tplc="18090019" w:tentative="1">
+      <w:start w:val="1"/>
+      <w:numFmt w:val="lowerLetter"/>
+      <w:lvlText w:val="%5."/>
+      <w:lvlJc w:val="left"/>
+      <w:pPr>
+        <w:ind w:left="3600" w:hanging="360"/>
+      </w:pPr>
+    </w:lvl>
+    <w:lvl w:ilvl="5" w:tplc="1809001B" w:tentative="1">
+      <w:start w:val="1"/>
+      <w:numFmt w:val="lowerRoman"/>
+      <w:lvlText w:val="%6."/>
+      <w:lvlJc w:val="right"/>
+      <w:pPr>
+        <w:ind w:left="4320" w:hanging="180"/>
+      </w:pPr>
+    </w:lvl>
+    <w:lvl w:ilvl="6" w:tplc="1809000F" w:tentative="1">
+      <w:start w:val="1"/>
+      <w:numFmt w:val="decimal"/>
+      <w:lvlText w:val="%7."/>
+      <w:lvlJc w:val="left"/>
+      <w:pPr>
+        <w:ind w:left="5040" w:hanging="360"/>
+      </w:pPr>
+    </w:lvl>
+    <w:lvl w:ilvl="7" w:tplc="18090019" w:tentative="1">
+      <w:start w:val="1"/>
+      <w:numFmt w:val="lowerLetter"/>
+      <w:lvlText w:val="%8."/>
+      <w:lvlJc w:val="left"/>
+      <w:pPr>
+        <w:ind w:left="5760" w:hanging="360"/>
+      </w:pPr>
+    </w:lvl>
+    <w:lvl w:ilvl="8" w:tplc="1809001B" w:tentative="1">
+      <w:start w:val="1"/>
+      <w:numFmt w:val="lowerRoman"/>
+      <w:lvlText w:val="%9."/>
+      <w:lvlJc w:val="right"/>
+      <w:pPr>
+        <w:ind w:left="6480" w:hanging="180"/>
+      </w:pPr>
+    </w:lvl>
+  </w:abstractNum>
+  <w:abstractNum w:abstractNumId="3" w15:restartNumberingAfterBreak="0">
     <w:nsid w:val="2F9E722A"/>
     <w:multiLevelType w:val="hybridMultilevel"/>
     <w:tmpl w:val="279036DA"/>
@@ -5459,7 +5360,7 @@
       </w:pPr>
     </w:lvl>
   </w:abstractNum>
-  <w:abstractNum w:abstractNumId="3" w15:restartNumberingAfterBreak="0">
+  <w:abstractNum w:abstractNumId="4" w15:restartNumberingAfterBreak="0">
     <w:nsid w:val="362F6220"/>
     <w:multiLevelType w:val="multilevel"/>
     <w:tmpl w:val="0B7C0C30"/>
@@ -5548,7 +5449,7 @@
       </w:pPr>
     </w:lvl>
   </w:abstractNum>
-  <w:abstractNum w:abstractNumId="4" w15:restartNumberingAfterBreak="0">
+  <w:abstractNum w:abstractNumId="5" w15:restartNumberingAfterBreak="0">
     <w:nsid w:val="49224F5E"/>
     <w:multiLevelType w:val="hybridMultilevel"/>
     <w:tmpl w:val="3EF25212"/>
@@ -5665,7 +5566,7 @@
       </w:pPr>
     </w:lvl>
   </w:abstractNum>
-  <w:abstractNum w:abstractNumId="5" w15:restartNumberingAfterBreak="0">
+  <w:abstractNum w:abstractNumId="6" w15:restartNumberingAfterBreak="0">
     <w:nsid w:val="4F1C2CEA"/>
     <w:multiLevelType w:val="hybridMultilevel"/>
     <w:tmpl w:val="8EFE1C82"/>
@@ -5751,7 +5652,7 @@
       </w:pPr>
     </w:lvl>
   </w:abstractNum>
-  <w:abstractNum w:abstractNumId="6" w15:restartNumberingAfterBreak="0">
+  <w:abstractNum w:abstractNumId="7" w15:restartNumberingAfterBreak="0">
     <w:nsid w:val="62DC698C"/>
     <w:multiLevelType w:val="hybridMultilevel"/>
     <w:tmpl w:val="FF68CF6A"/>
@@ -5838,19 +5739,19 @@
     </w:lvl>
   </w:abstractNum>
   <w:num w:numId="1" w16cid:durableId="207835776">
-    <w:abstractNumId w:val="3"/>
+    <w:abstractNumId w:val="4"/>
   </w:num>
   <w:num w:numId="2" w16cid:durableId="987784705">
     <w:abstractNumId w:val="0"/>
   </w:num>
   <w:num w:numId="3" w16cid:durableId="1979412930">
-    <w:abstractNumId w:val="4"/>
+    <w:abstractNumId w:val="5"/>
   </w:num>
   <w:num w:numId="4" w16cid:durableId="639850562">
-    <w:abstractNumId w:val="2"/>
+    <w:abstractNumId w:val="3"/>
   </w:num>
   <w:num w:numId="5" w16cid:durableId="1737777919">
-    <w:abstractNumId w:val="3"/>
+    <w:abstractNumId w:val="4"/>
     <w:lvlOverride w:ilvl="0">
       <w:startOverride w:val="1"/>
     </w:lvlOverride>
@@ -5880,10 +5781,10 @@
     </w:lvlOverride>
   </w:num>
   <w:num w:numId="6" w16cid:durableId="870148695">
-    <w:abstractNumId w:val="5"/>
+    <w:abstractNumId w:val="6"/>
   </w:num>
   <w:num w:numId="7" w16cid:durableId="47805787">
-    <w:abstractNumId w:val="6"/>
+    <w:abstractNumId w:val="7"/>
   </w:num>
   <w:num w:numId="8" w16cid:durableId="1131173976">
     <w:abstractNumId w:val="1"/>
@@ -5914,6 +5815,9 @@
   </w:num>
   <w:num w:numId="17" w16cid:durableId="1704557423">
     <w:abstractNumId w:val="1"/>
+  </w:num>
+  <w:num w:numId="18" w16cid:durableId="1316570430">
+    <w:abstractNumId w:val="2"/>
   </w:num>
 </w:numbering>
 </file>
@@ -6383,7 +6287,6 @@
     <w:next w:val="Normal"/>
     <w:link w:val="Heading3Char"/>
     <w:uiPriority w:val="9"/>
-    <w:semiHidden/>
     <w:unhideWhenUsed/>
     <w:qFormat/>
     <w:rsid w:val="00D7483C"/>
@@ -6410,7 +6313,6 @@
     <w:next w:val="Normal"/>
     <w:link w:val="Heading4Char"/>
     <w:uiPriority w:val="9"/>
-    <w:semiHidden/>
     <w:unhideWhenUsed/>
     <w:qFormat/>
     <w:rsid w:val="00D7483C"/>
@@ -6439,7 +6341,6 @@
     <w:next w:val="Normal"/>
     <w:link w:val="Heading5Char"/>
     <w:uiPriority w:val="9"/>
-    <w:semiHidden/>
     <w:unhideWhenUsed/>
     <w:qFormat/>
     <w:rsid w:val="00D7483C"/>
@@ -6464,7 +6365,6 @@
     <w:next w:val="Normal"/>
     <w:link w:val="Heading6Char"/>
     <w:uiPriority w:val="9"/>
-    <w:semiHidden/>
     <w:unhideWhenUsed/>
     <w:qFormat/>
     <w:rsid w:val="00D7483C"/>
@@ -6718,7 +6618,6 @@
     <w:basedOn w:val="DefaultParagraphFont"/>
     <w:link w:val="Heading3"/>
     <w:uiPriority w:val="9"/>
-    <w:semiHidden/>
     <w:rsid w:val="00D7483C"/>
     <w:rPr>
       <w:rFonts w:asciiTheme="majorHAnsi" w:eastAsiaTheme="majorEastAsia" w:hAnsiTheme="majorHAnsi" w:cstheme="majorBidi"/>
@@ -6732,7 +6631,6 @@
     <w:basedOn w:val="DefaultParagraphFont"/>
     <w:link w:val="Heading4"/>
     <w:uiPriority w:val="9"/>
-    <w:semiHidden/>
     <w:rsid w:val="00D7483C"/>
     <w:rPr>
       <w:rFonts w:asciiTheme="majorHAnsi" w:eastAsiaTheme="majorEastAsia" w:hAnsiTheme="majorHAnsi" w:cstheme="majorBidi"/>
@@ -6837,7 +6735,6 @@
     <w:basedOn w:val="DefaultParagraphFont"/>
     <w:link w:val="Heading5"/>
     <w:uiPriority w:val="9"/>
-    <w:semiHidden/>
     <w:rsid w:val="00D7483C"/>
     <w:rPr>
       <w:rFonts w:asciiTheme="majorHAnsi" w:eastAsiaTheme="majorEastAsia" w:hAnsiTheme="majorHAnsi" w:cstheme="majorBidi"/>
@@ -6849,7 +6746,6 @@
     <w:basedOn w:val="DefaultParagraphFont"/>
     <w:link w:val="Heading6"/>
     <w:uiPriority w:val="9"/>
-    <w:semiHidden/>
     <w:rsid w:val="00D7483C"/>
     <w:rPr>
       <w:rFonts w:asciiTheme="majorHAnsi" w:eastAsiaTheme="majorEastAsia" w:hAnsiTheme="majorHAnsi" w:cstheme="majorBidi"/>

</xml_diff>

<commit_message>
Cover Sheet and car
</commit_message>
<xml_diff>
--- a/docs/Technical Report Eoin Fitzsimons.docx
+++ b/docs/Technical Report Eoin Fitzsimons.docx
@@ -10,6 +10,2528 @@
         <w:rPr>
           <w:noProof/>
         </w:rPr>
+        <w:drawing>
+          <wp:inline distT="0" distB="0" distL="0" distR="0" wp14:anchorId="26EC7D9F" wp14:editId="599C1267">
+            <wp:extent cx="1333500" cy="952500"/>
+            <wp:effectExtent l="0" t="0" r="0" b="0"/>
+            <wp:docPr id="1" name="Picture 6"/>
+            <wp:cNvGraphicFramePr>
+              <a:graphicFrameLocks xmlns:a="http://schemas.openxmlformats.org/drawingml/2006/main" noChangeAspect="1"/>
+            </wp:cNvGraphicFramePr>
+            <a:graphic xmlns:a="http://schemas.openxmlformats.org/drawingml/2006/main">
+              <a:graphicData uri="http://schemas.openxmlformats.org/drawingml/2006/picture">
+                <pic:pic xmlns:pic="http://schemas.openxmlformats.org/drawingml/2006/picture">
+                  <pic:nvPicPr>
+                    <pic:cNvPr id="0" name="Picture 1"/>
+                    <pic:cNvPicPr>
+                      <a:picLocks noChangeAspect="1" noChangeArrowheads="1"/>
+                    </pic:cNvPicPr>
+                  </pic:nvPicPr>
+                  <pic:blipFill>
+                    <a:blip r:embed="rId11" cstate="print">
+                      <a:extLst>
+                        <a:ext uri="{28A0092B-C50C-407E-A947-70E740481C1C}">
+                          <a14:useLocalDpi xmlns:a14="http://schemas.microsoft.com/office/drawing/2010/main" val="0"/>
+                        </a:ext>
+                      </a:extLst>
+                    </a:blip>
+                    <a:srcRect/>
+                    <a:stretch>
+                      <a:fillRect/>
+                    </a:stretch>
+                  </pic:blipFill>
+                  <pic:spPr bwMode="auto">
+                    <a:xfrm>
+                      <a:off x="0" y="0"/>
+                      <a:ext cx="1333500" cy="952500"/>
+                    </a:xfrm>
+                    <a:prstGeom prst="rect">
+                      <a:avLst/>
+                    </a:prstGeom>
+                    <a:noFill/>
+                    <a:ln>
+                      <a:noFill/>
+                    </a:ln>
+                  </pic:spPr>
+                </pic:pic>
+              </a:graphicData>
+            </a:graphic>
+          </wp:inline>
+        </w:drawing>
+      </w:r>
+    </w:p>
+    <w:p/>
+    <w:p>
+      <w:pPr>
+        <w:jc w:val="center"/>
+        <w:rPr>
+          <w:b/>
+        </w:rPr>
+      </w:pPr>
+      <w:smartTag w:uri="urn:schemas-microsoft-com:office:smarttags" w:element="PlaceName">
+        <w:r>
+          <w:rPr>
+            <w:b/>
+          </w:rPr>
+          <w:t>National</w:t>
+        </w:r>
+      </w:smartTag>
+      <w:r>
+        <w:rPr>
+          <w:b/>
+        </w:rPr>
+        <w:t xml:space="preserve"> </w:t>
+      </w:r>
+      <w:smartTag w:uri="urn:schemas-microsoft-com:office:smarttags" w:element="PlaceType">
+        <w:r>
+          <w:rPr>
+            <w:b/>
+          </w:rPr>
+          <w:t>College</w:t>
+        </w:r>
+      </w:smartTag>
+      <w:r>
+        <w:rPr>
+          <w:b/>
+        </w:rPr>
+        <w:t xml:space="preserve"> of </w:t>
+      </w:r>
+      <w:smartTag w:uri="urn:schemas-microsoft-com:office:smarttags" w:element="country-region">
+        <w:r>
+          <w:rPr>
+            <w:b/>
+          </w:rPr>
+          <w:t>Ireland</w:t>
+        </w:r>
+      </w:smartTag>
+    </w:p>
+    <w:p>
+      <w:pPr>
+        <w:rPr>
+          <w:b/>
+        </w:rPr>
+      </w:pPr>
+    </w:p>
+    <w:p>
+      <w:pPr>
+        <w:jc w:val="center"/>
+        <w:rPr>
+          <w:b/>
+        </w:rPr>
+      </w:pPr>
+      <w:r>
+        <w:rPr>
+          <w:b/>
+        </w:rPr>
+        <w:t>Project Submission Sheet</w:t>
+      </w:r>
+      <w:r>
+        <w:rPr>
+          <w:b/>
+        </w:rPr>
+        <w:t xml:space="preserve"> </w:t>
+      </w:r>
+    </w:p>
+    <w:p/>
+    <w:p/>
+    <w:tbl>
+      <w:tblPr>
+        <w:tblW w:w="0" w:type="auto"/>
+        <w:tblLook w:val="01E0" w:firstRow="1" w:lastRow="1" w:firstColumn="1" w:lastColumn="1" w:noHBand="0" w:noVBand="0"/>
+      </w:tblPr>
+      <w:tblGrid>
+        <w:gridCol w:w="1901"/>
+        <w:gridCol w:w="3787"/>
+        <w:gridCol w:w="1080"/>
+        <w:gridCol w:w="1754"/>
+      </w:tblGrid>
+      <w:tr>
+        <w:tc>
+          <w:tcPr>
+            <w:tcW w:w="1901" w:type="dxa"/>
+          </w:tcPr>
+          <w:p>
+            <w:pPr>
+              <w:rPr>
+                <w:b/>
+              </w:rPr>
+            </w:pPr>
+          </w:p>
+          <w:p>
+            <w:pPr>
+              <w:rPr>
+                <w:b/>
+              </w:rPr>
+            </w:pPr>
+            <w:r>
+              <w:rPr>
+                <w:b/>
+              </w:rPr>
+              <w:t>Student Name:</w:t>
+            </w:r>
+          </w:p>
+        </w:tc>
+        <w:tc>
+          <w:tcPr>
+            <w:tcW w:w="6621" w:type="dxa"/>
+            <w:gridSpan w:val="3"/>
+          </w:tcPr>
+          <w:p/>
+          <w:p>
+            <w:r>
+              <w:t>Eoin Fitzsimons</w:t>
+            </w:r>
+          </w:p>
+        </w:tc>
+      </w:tr>
+      <w:tr>
+        <w:tc>
+          <w:tcPr>
+            <w:tcW w:w="1901" w:type="dxa"/>
+          </w:tcPr>
+          <w:p>
+            <w:pPr>
+              <w:rPr>
+                <w:b/>
+              </w:rPr>
+            </w:pPr>
+          </w:p>
+          <w:p>
+            <w:pPr>
+              <w:rPr>
+                <w:b/>
+              </w:rPr>
+            </w:pPr>
+            <w:r>
+              <w:rPr>
+                <w:b/>
+              </w:rPr>
+              <w:t>Student ID:</w:t>
+            </w:r>
+          </w:p>
+        </w:tc>
+        <w:tc>
+          <w:tcPr>
+            <w:tcW w:w="6621" w:type="dxa"/>
+            <w:gridSpan w:val="3"/>
+          </w:tcPr>
+          <w:p/>
+          <w:p>
+            <w:r>
+              <w:t>X23151374</w:t>
+            </w:r>
+          </w:p>
+        </w:tc>
+      </w:tr>
+      <w:tr>
+        <w:tc>
+          <w:tcPr>
+            <w:tcW w:w="1901" w:type="dxa"/>
+          </w:tcPr>
+          <w:p>
+            <w:pPr>
+              <w:rPr>
+                <w:b/>
+              </w:rPr>
+            </w:pPr>
+          </w:p>
+          <w:p>
+            <w:pPr>
+              <w:rPr>
+                <w:b/>
+              </w:rPr>
+            </w:pPr>
+            <w:r>
+              <w:rPr>
+                <w:b/>
+              </w:rPr>
+              <w:t>Programme:</w:t>
+            </w:r>
+          </w:p>
+        </w:tc>
+        <w:tc>
+          <w:tcPr>
+            <w:tcW w:w="3787" w:type="dxa"/>
+          </w:tcPr>
+          <w:p/>
+          <w:p>
+            <w:r>
+              <w:t>Computing</w:t>
+            </w:r>
+          </w:p>
+        </w:tc>
+        <w:tc>
+          <w:tcPr>
+            <w:tcW w:w="1080" w:type="dxa"/>
+          </w:tcPr>
+          <w:p/>
+          <w:p>
+            <w:pPr>
+              <w:rPr>
+                <w:b/>
+              </w:rPr>
+            </w:pPr>
+            <w:r>
+              <w:rPr>
+                <w:b/>
+              </w:rPr>
+              <w:t>Year:</w:t>
+            </w:r>
+          </w:p>
+        </w:tc>
+        <w:tc>
+          <w:tcPr>
+            <w:tcW w:w="1754" w:type="dxa"/>
+          </w:tcPr>
+          <w:p/>
+          <w:p>
+            <w:r>
+              <w:t>4</w:t>
+            </w:r>
+          </w:p>
+        </w:tc>
+      </w:tr>
+      <w:tr>
+        <w:tc>
+          <w:tcPr>
+            <w:tcW w:w="1901" w:type="dxa"/>
+          </w:tcPr>
+          <w:p>
+            <w:pPr>
+              <w:rPr>
+                <w:b/>
+              </w:rPr>
+            </w:pPr>
+          </w:p>
+          <w:p>
+            <w:pPr>
+              <w:rPr>
+                <w:b/>
+              </w:rPr>
+            </w:pPr>
+            <w:r>
+              <w:rPr>
+                <w:b/>
+              </w:rPr>
+              <w:t>Module:</w:t>
+            </w:r>
+          </w:p>
+        </w:tc>
+        <w:tc>
+          <w:tcPr>
+            <w:tcW w:w="6621" w:type="dxa"/>
+            <w:gridSpan w:val="3"/>
+          </w:tcPr>
+          <w:p/>
+          <w:p>
+            <w:r>
+              <w:t>Final Project</w:t>
+            </w:r>
+          </w:p>
+        </w:tc>
+      </w:tr>
+      <w:tr>
+        <w:tc>
+          <w:tcPr>
+            <w:tcW w:w="1901" w:type="dxa"/>
+          </w:tcPr>
+          <w:p>
+            <w:pPr>
+              <w:rPr>
+                <w:b/>
+              </w:rPr>
+            </w:pPr>
+          </w:p>
+          <w:p>
+            <w:pPr>
+              <w:rPr>
+                <w:b/>
+              </w:rPr>
+            </w:pPr>
+            <w:r>
+              <w:rPr>
+                <w:b/>
+              </w:rPr>
+              <w:t>Lecturer:</w:t>
+            </w:r>
+          </w:p>
+        </w:tc>
+        <w:tc>
+          <w:tcPr>
+            <w:tcW w:w="6621" w:type="dxa"/>
+            <w:gridSpan w:val="3"/>
+          </w:tcPr>
+          <w:p/>
+          <w:p>
+            <w:r>
+              <w:t>Frances Sheridan</w:t>
+            </w:r>
+          </w:p>
+        </w:tc>
+      </w:tr>
+      <w:tr>
+        <w:tc>
+          <w:tcPr>
+            <w:tcW w:w="1901" w:type="dxa"/>
+          </w:tcPr>
+          <w:p>
+            <w:pPr>
+              <w:rPr>
+                <w:b/>
+              </w:rPr>
+            </w:pPr>
+            <w:r>
+              <w:rPr>
+                <w:b/>
+              </w:rPr>
+              <w:t>Submission Due Date:</w:t>
+            </w:r>
+          </w:p>
+        </w:tc>
+        <w:tc>
+          <w:tcPr>
+            <w:tcW w:w="6621" w:type="dxa"/>
+            <w:gridSpan w:val="3"/>
+          </w:tcPr>
+          <w:p/>
+          <w:p>
+            <w:r>
+              <w:t>03/07/2026</w:t>
+            </w:r>
+          </w:p>
+        </w:tc>
+      </w:tr>
+      <w:tr>
+        <w:tc>
+          <w:tcPr>
+            <w:tcW w:w="1901" w:type="dxa"/>
+          </w:tcPr>
+          <w:p>
+            <w:pPr>
+              <w:rPr>
+                <w:b/>
+              </w:rPr>
+            </w:pPr>
+          </w:p>
+          <w:p>
+            <w:pPr>
+              <w:rPr>
+                <w:b/>
+              </w:rPr>
+            </w:pPr>
+            <w:r>
+              <w:rPr>
+                <w:b/>
+              </w:rPr>
+              <w:t>Project Title:</w:t>
+            </w:r>
+          </w:p>
+        </w:tc>
+        <w:tc>
+          <w:tcPr>
+            <w:tcW w:w="6621" w:type="dxa"/>
+            <w:gridSpan w:val="3"/>
+          </w:tcPr>
+          <w:p/>
+          <w:p>
+            <w:r>
+              <w:t>Momentum</w:t>
+            </w:r>
+          </w:p>
+        </w:tc>
+      </w:tr>
+      <w:tr>
+        <w:tc>
+          <w:tcPr>
+            <w:tcW w:w="1901" w:type="dxa"/>
+            <w:vAlign w:val="bottom"/>
+          </w:tcPr>
+          <w:p>
+            <w:pPr>
+              <w:rPr>
+                <w:b/>
+              </w:rPr>
+            </w:pPr>
+            <w:r>
+              <w:rPr>
+                <w:b/>
+              </w:rPr>
+              <w:t>Word Count:</w:t>
+            </w:r>
+          </w:p>
+        </w:tc>
+        <w:tc>
+          <w:tcPr>
+            <w:tcW w:w="6621" w:type="dxa"/>
+            <w:gridSpan w:val="3"/>
+          </w:tcPr>
+          <w:p/>
+          <w:p/>
+        </w:tc>
+      </w:tr>
+    </w:tbl>
+    <w:p/>
+    <w:p>
+      <w:r>
+        <w:rPr>
+          <w:b/>
+          <w:bCs/>
+        </w:rPr>
+        <w:t xml:space="preserve">Academic Integrity Certificate </w:t>
+      </w:r>
+      <w:r>
+        <w:rPr>
+          <w:b/>
+          <w:bCs/>
+        </w:rPr>
+        <w:t>Verification Code</w:t>
+      </w:r>
+      <w:r>
+        <w:t xml:space="preserve">: </w:t>
+      </w:r>
+      <w:r>
+        <w:t>i1hvGctrkB</w:t>
+      </w:r>
+    </w:p>
+    <w:p/>
+    <w:p>
+      <w:pPr>
+        <w:pStyle w:val="BodyText"/>
+        <w:jc w:val="both"/>
+        <w:rPr>
+          <w:rFonts w:ascii="Verdana" w:hAnsi="Verdana"/>
+          <w:sz w:val="18"/>
+          <w:szCs w:val="18"/>
+        </w:rPr>
+      </w:pPr>
+      <w:r>
+        <w:rPr>
+          <w:rFonts w:ascii="Verdana" w:hAnsi="Verdana"/>
+          <w:sz w:val="18"/>
+          <w:szCs w:val="18"/>
+        </w:rPr>
+        <w:t>I her</w:t>
+      </w:r>
+      <w:r>
+        <w:rPr>
+          <w:rFonts w:ascii="Verdana" w:hAnsi="Verdana"/>
+          <w:sz w:val="18"/>
+          <w:szCs w:val="18"/>
+        </w:rPr>
+        <w:t>e</w:t>
+      </w:r>
+      <w:r>
+        <w:rPr>
+          <w:rFonts w:ascii="Verdana" w:hAnsi="Verdana"/>
+          <w:sz w:val="18"/>
+          <w:szCs w:val="18"/>
+        </w:rPr>
+        <w:t>by certify that the information contained in this (my submission) is information pertaining to research I conducted for this project.  All information other than my own contribution will be fully referenced and listed in the relevant bibliography section at the rear of the project.</w:t>
+      </w:r>
+    </w:p>
+    <w:p>
+      <w:pPr>
+        <w:pStyle w:val="BodyText"/>
+        <w:jc w:val="both"/>
+        <w:rPr>
+          <w:rFonts w:ascii="Verdana" w:hAnsi="Verdana"/>
+          <w:sz w:val="18"/>
+          <w:szCs w:val="18"/>
+        </w:rPr>
+      </w:pPr>
+      <w:r>
+        <w:rPr>
+          <w:rFonts w:ascii="Verdana" w:hAnsi="Verdana"/>
+          <w:sz w:val="18"/>
+          <w:szCs w:val="18"/>
+          <w:u w:val="single"/>
+        </w:rPr>
+        <w:lastRenderedPageBreak/>
+        <w:t>ALL</w:t>
+      </w:r>
+      <w:r>
+        <w:rPr>
+          <w:rFonts w:ascii="Verdana" w:hAnsi="Verdana"/>
+          <w:sz w:val="18"/>
+          <w:szCs w:val="18"/>
+        </w:rPr>
+        <w:t xml:space="preserve"> internet material must be referenced in the </w:t>
+      </w:r>
+      <w:r>
+        <w:rPr>
+          <w:rFonts w:ascii="Verdana" w:hAnsi="Verdana"/>
+          <w:sz w:val="18"/>
+          <w:szCs w:val="18"/>
+        </w:rPr>
+        <w:t>references</w:t>
+      </w:r>
+      <w:r>
+        <w:rPr>
+          <w:rFonts w:ascii="Verdana" w:hAnsi="Verdana"/>
+          <w:sz w:val="18"/>
+          <w:szCs w:val="18"/>
+        </w:rPr>
+        <w:t xml:space="preserve"> section.  Students are encouraged to use the Harvard Referencing Standard </w:t>
+      </w:r>
+      <w:r>
+        <w:rPr>
+          <w:rFonts w:ascii="Verdana" w:hAnsi="Verdana"/>
+          <w:sz w:val="18"/>
+          <w:szCs w:val="18"/>
+        </w:rPr>
+        <w:t xml:space="preserve">or appropriate referencing style </w:t>
+      </w:r>
+      <w:r>
+        <w:rPr>
+          <w:rFonts w:ascii="Verdana" w:hAnsi="Verdana"/>
+          <w:sz w:val="18"/>
+          <w:szCs w:val="18"/>
+        </w:rPr>
+        <w:t xml:space="preserve">supplied by the </w:t>
+      </w:r>
+      <w:proofErr w:type="gramStart"/>
+      <w:r>
+        <w:rPr>
+          <w:rFonts w:ascii="Verdana" w:hAnsi="Verdana"/>
+          <w:sz w:val="18"/>
+          <w:szCs w:val="18"/>
+        </w:rPr>
+        <w:t>Library</w:t>
+      </w:r>
+      <w:proofErr w:type="gramEnd"/>
+      <w:r>
+        <w:rPr>
+          <w:rFonts w:ascii="Verdana" w:hAnsi="Verdana"/>
+          <w:sz w:val="18"/>
+          <w:szCs w:val="18"/>
+        </w:rPr>
+        <w:t>.  To use other author's written or electronic work is illegal (plagiarism) and may result in disciplinary action.  Students may be required to undergo a viva (oral examination) if there is suspicion about the validity of their submitted work.</w:t>
+      </w:r>
+    </w:p>
+    <w:p/>
+    <w:p>
+      <w:pPr>
+        <w:spacing w:line="278" w:lineRule="auto"/>
+      </w:pPr>
+      <w:r>
+        <w:rPr>
+          <w:b/>
+          <w:bCs/>
+          <w:highlight w:val="yellow"/>
+        </w:rPr>
+        <w:t>Note:</w:t>
+      </w:r>
+      <w:r>
+        <w:t xml:space="preserve"> </w:t>
+      </w:r>
+      <w:r>
+        <w:rPr>
+          <w:b/>
+          <w:bCs/>
+          <w:highlight w:val="yellow"/>
+        </w:rPr>
+        <w:t xml:space="preserve">Academic Integrity Course Requirement – </w:t>
+      </w:r>
+      <w:r>
+        <w:rPr>
+          <w:highlight w:val="yellow"/>
+        </w:rPr>
+        <w:t xml:space="preserve">Starting </w:t>
+      </w:r>
+      <w:r>
+        <w:rPr>
+          <w:b/>
+          <w:bCs/>
+          <w:highlight w:val="yellow"/>
+        </w:rPr>
+        <w:t>Monday, 19th January 2026</w:t>
+      </w:r>
+      <w:r>
+        <w:rPr>
+          <w:highlight w:val="yellow"/>
+        </w:rPr>
+        <w:t xml:space="preserve">, </w:t>
+      </w:r>
+      <w:r>
+        <w:rPr>
+          <w:b/>
+          <w:bCs/>
+          <w:highlight w:val="yellow"/>
+        </w:rPr>
+        <w:t>all students are required to</w:t>
+      </w:r>
+      <w:r>
+        <w:rPr>
+          <w:highlight w:val="yellow"/>
+        </w:rPr>
+        <w:t xml:space="preserve"> </w:t>
+      </w:r>
+      <w:r>
+        <w:rPr>
+          <w:b/>
+          <w:bCs/>
+          <w:highlight w:val="yellow"/>
+        </w:rPr>
+        <w:t xml:space="preserve">successfully complete the </w:t>
+      </w:r>
+      <w:proofErr w:type="spellStart"/>
+      <w:r>
+        <w:rPr>
+          <w:b/>
+          <w:bCs/>
+          <w:highlight w:val="yellow"/>
+        </w:rPr>
+        <w:t>Epigeum</w:t>
+      </w:r>
+      <w:proofErr w:type="spellEnd"/>
+      <w:r>
+        <w:rPr>
+          <w:b/>
+          <w:bCs/>
+          <w:highlight w:val="yellow"/>
+        </w:rPr>
+        <w:t xml:space="preserve"> Academic Integrity Course</w:t>
+      </w:r>
+      <w:r>
+        <w:rPr>
+          <w:highlight w:val="yellow"/>
+        </w:rPr>
+        <w:t xml:space="preserve">, which is available on </w:t>
+      </w:r>
+      <w:r>
+        <w:rPr>
+          <w:b/>
+          <w:bCs/>
+          <w:highlight w:val="yellow"/>
+        </w:rPr>
+        <w:t>Moodle</w:t>
+      </w:r>
+      <w:r>
+        <w:rPr>
+          <w:highlight w:val="yellow"/>
+        </w:rPr>
+        <w:t xml:space="preserve">. This is a </w:t>
+      </w:r>
+      <w:r>
+        <w:rPr>
+          <w:b/>
+          <w:bCs/>
+          <w:highlight w:val="yellow"/>
+        </w:rPr>
+        <w:t>self-paced online course</w:t>
+      </w:r>
+      <w:r>
+        <w:rPr>
+          <w:highlight w:val="yellow"/>
+        </w:rPr>
+        <w:t xml:space="preserve"> consisting of </w:t>
+      </w:r>
+      <w:r>
+        <w:rPr>
+          <w:b/>
+          <w:bCs/>
+          <w:highlight w:val="yellow"/>
+        </w:rPr>
+        <w:t>4 modules</w:t>
+      </w:r>
+      <w:r>
+        <w:rPr>
+          <w:highlight w:val="yellow"/>
+        </w:rPr>
+        <w:t xml:space="preserve"> </w:t>
+      </w:r>
+      <w:r>
+        <w:rPr>
+          <w:highlight w:val="yellow"/>
+        </w:rPr>
+        <w:t xml:space="preserve">and will take approximately </w:t>
+      </w:r>
+      <w:r>
+        <w:rPr>
+          <w:b/>
+          <w:bCs/>
+          <w:highlight w:val="yellow"/>
+        </w:rPr>
+        <w:t>2 hours</w:t>
+      </w:r>
+      <w:r>
+        <w:rPr>
+          <w:highlight w:val="yellow"/>
+        </w:rPr>
+        <w:t xml:space="preserve"> to complete. Once you have successfully completed the course, you will receive a </w:t>
+      </w:r>
+      <w:r>
+        <w:rPr>
+          <w:b/>
+          <w:bCs/>
+          <w:highlight w:val="yellow"/>
+        </w:rPr>
+        <w:t xml:space="preserve">Certificate </w:t>
+      </w:r>
+      <w:r>
+        <w:rPr>
+          <w:b/>
+          <w:bCs/>
+          <w:highlight w:val="yellow"/>
+        </w:rPr>
+        <w:t xml:space="preserve">&amp; </w:t>
+      </w:r>
+      <w:r>
+        <w:rPr>
+          <w:b/>
+          <w:bCs/>
+          <w:highlight w:val="yellow"/>
+        </w:rPr>
+        <w:t>Verification Code</w:t>
+      </w:r>
+      <w:r>
+        <w:rPr>
+          <w:highlight w:val="yellow"/>
+        </w:rPr>
+        <w:t xml:space="preserve">. This code </w:t>
+      </w:r>
+      <w:r>
+        <w:rPr>
+          <w:b/>
+          <w:bCs/>
+          <w:highlight w:val="yellow"/>
+        </w:rPr>
+        <w:t>must be included on the Project Cover Sheet</w:t>
+      </w:r>
+      <w:r>
+        <w:rPr>
+          <w:highlight w:val="yellow"/>
+        </w:rPr>
+        <w:t xml:space="preserve"> when submitting your work. For full details and guidance, please visit: </w:t>
+      </w:r>
+      <w:r>
+        <w:rPr>
+          <w:rFonts w:ascii="Segoe UI Emoji" w:hAnsi="Segoe UI Emoji" w:cs="Segoe UI Emoji"/>
+          <w:highlight w:val="yellow"/>
+        </w:rPr>
+        <w:t>🔗</w:t>
+      </w:r>
+      <w:r>
+        <w:rPr>
+          <w:highlight w:val="yellow"/>
+        </w:rPr>
+        <w:t xml:space="preserve"> ttps://libguides.ncirl.ie/academicintegrity/epigeumforstudents</w:t>
+      </w:r>
+    </w:p>
+    <w:p>
+      <w:pPr>
+        <w:spacing w:line="278" w:lineRule="auto"/>
+      </w:pPr>
+    </w:p>
+    <w:p/>
+    <w:tbl>
+      <w:tblPr>
+        <w:tblW w:w="0" w:type="auto"/>
+        <w:tblLook w:val="01E0" w:firstRow="1" w:lastRow="1" w:firstColumn="1" w:lastColumn="1" w:noHBand="0" w:noVBand="0"/>
+      </w:tblPr>
+      <w:tblGrid>
+        <w:gridCol w:w="2130"/>
+        <w:gridCol w:w="6392"/>
+      </w:tblGrid>
+      <w:tr>
+        <w:tc>
+          <w:tcPr>
+            <w:tcW w:w="2130" w:type="dxa"/>
+          </w:tcPr>
+          <w:p>
+            <w:pPr>
+              <w:rPr>
+                <w:b/>
+              </w:rPr>
+            </w:pPr>
+          </w:p>
+          <w:p>
+            <w:pPr>
+              <w:rPr>
+                <w:b/>
+              </w:rPr>
+            </w:pPr>
+            <w:r>
+              <w:rPr>
+                <w:b/>
+              </w:rPr>
+              <w:t>Signature:</w:t>
+            </w:r>
+          </w:p>
+        </w:tc>
+        <w:tc>
+          <w:tcPr>
+            <w:tcW w:w="6392" w:type="dxa"/>
+          </w:tcPr>
+          <w:p/>
+          <w:p>
+            <w:r>
+              <w:t>Eoin Fitzsimons</w:t>
+            </w:r>
+          </w:p>
+        </w:tc>
+      </w:tr>
+      <w:tr>
+        <w:tc>
+          <w:tcPr>
+            <w:tcW w:w="2130" w:type="dxa"/>
+          </w:tcPr>
+          <w:p>
+            <w:pPr>
+              <w:rPr>
+                <w:b/>
+              </w:rPr>
+            </w:pPr>
+          </w:p>
+          <w:p>
+            <w:pPr>
+              <w:rPr>
+                <w:b/>
+              </w:rPr>
+            </w:pPr>
+            <w:r>
+              <w:rPr>
+                <w:b/>
+              </w:rPr>
+              <w:t>Date:</w:t>
+            </w:r>
+          </w:p>
+        </w:tc>
+        <w:tc>
+          <w:tcPr>
+            <w:tcW w:w="6392" w:type="dxa"/>
+          </w:tcPr>
+          <w:p/>
+          <w:p>
+            <w:r>
+              <w:t>00/00/0000</w:t>
+            </w:r>
+          </w:p>
+        </w:tc>
+      </w:tr>
+    </w:tbl>
+    <w:p/>
+    <w:p/>
+    <w:p>
+      <w:pPr>
+        <w:rPr>
+          <w:b/>
+        </w:rPr>
+      </w:pPr>
+      <w:r>
+        <w:rPr>
+          <w:b/>
+        </w:rPr>
+        <w:t>PLEASE READ THE FOLLOWING INSTRUCTIONS:</w:t>
+      </w:r>
+    </w:p>
+    <w:p/>
+    <w:p>
+      <w:pPr>
+        <w:ind w:left="720" w:hanging="720"/>
+        <w:jc w:val="both"/>
+      </w:pPr>
+      <w:r>
+        <w:t>1.</w:t>
+      </w:r>
+      <w:r>
+        <w:tab/>
+        <w:t>Please attach a completed copy of this sheet to each project (including multiple copies).</w:t>
+      </w:r>
+    </w:p>
+    <w:p>
+      <w:pPr>
+        <w:jc w:val="both"/>
+      </w:pPr>
+      <w:r>
+        <w:t>2.</w:t>
+      </w:r>
+      <w:r>
+        <w:tab/>
+        <w:t>Projects should be submitted to your Programme Coordinator.</w:t>
+      </w:r>
+    </w:p>
+    <w:p>
+      <w:pPr>
+        <w:ind w:left="720" w:hanging="720"/>
+        <w:jc w:val="both"/>
+      </w:pPr>
+      <w:r>
+        <w:t>3.</w:t>
+      </w:r>
+      <w:r>
+        <w:tab/>
+      </w:r>
+      <w:r>
+        <w:rPr>
+          <w:b/>
+        </w:rPr>
+        <w:t>You must ensure that you retain a HARD COPY of ALL projects</w:t>
+      </w:r>
+      <w:r>
+        <w:t>, both for your own reference and in case a project is lost or mislaid.  It is not sufficient to keep a copy on computer.  Please do not bind projects or place in covers unless specifically requested.</w:t>
+      </w:r>
+    </w:p>
+    <w:p>
+      <w:pPr>
+        <w:ind w:left="720" w:hanging="720"/>
+        <w:jc w:val="both"/>
+        <w:rPr>
+          <w:b/>
+        </w:rPr>
+      </w:pPr>
+      <w:r>
+        <w:t>4.</w:t>
+      </w:r>
+      <w:r>
+        <w:tab/>
+        <w:t xml:space="preserve">You must ensure that all projects are submitted to your Programme Coordinator on or before the required submission date.  </w:t>
+      </w:r>
+      <w:r>
+        <w:rPr>
+          <w:b/>
+        </w:rPr>
+        <w:t>Late submissions will incur penalties.</w:t>
+      </w:r>
+    </w:p>
+    <w:p>
+      <w:pPr>
+        <w:ind w:left="720" w:hanging="720"/>
+        <w:jc w:val="both"/>
+        <w:rPr>
+          <w:b/>
+        </w:rPr>
+      </w:pPr>
+      <w:r>
+        <w:t>5.</w:t>
+      </w:r>
+      <w:r>
+        <w:tab/>
+        <w:t xml:space="preserve">All projects must be submitted and passed in order to successfully complete the year.  </w:t>
+      </w:r>
+      <w:r>
+        <w:rPr>
+          <w:b/>
+        </w:rPr>
+        <w:t xml:space="preserve">Any project/assignment not submitted will be marked as a </w:t>
+      </w:r>
+      <w:proofErr w:type="gramStart"/>
+      <w:r>
+        <w:rPr>
+          <w:b/>
+        </w:rPr>
+        <w:t>fail</w:t>
+      </w:r>
+      <w:proofErr w:type="gramEnd"/>
+      <w:r>
+        <w:rPr>
+          <w:b/>
+        </w:rPr>
+        <w:t>.</w:t>
+      </w:r>
+    </w:p>
+    <w:p>
+      <w:pPr>
+        <w:ind w:left="720" w:hanging="720"/>
+        <w:jc w:val="both"/>
+      </w:pPr>
+      <w:r>
+        <w:rPr>
+          <w:bCs/>
+        </w:rPr>
+        <w:t>6.</w:t>
+      </w:r>
+      <w:r>
+        <w:rPr>
+          <w:b/>
+        </w:rPr>
+        <w:tab/>
+      </w:r>
+      <w:r>
+        <w:rPr>
+          <w:b/>
+        </w:rPr>
+        <w:t xml:space="preserve">Please check that you read AI and Academic Integrity Acknowledgement </w:t>
+      </w:r>
+      <w:proofErr w:type="spellStart"/>
+      <w:r>
+        <w:rPr>
+          <w:b/>
+        </w:rPr>
+        <w:t>Supplments</w:t>
+      </w:r>
+      <w:proofErr w:type="spellEnd"/>
+      <w:r>
+        <w:rPr>
+          <w:b/>
+        </w:rPr>
+        <w:t xml:space="preserve"> in this document</w:t>
+      </w:r>
+    </w:p>
+    <w:p/>
+    <w:p/>
+    <w:p/>
+    <w:p/>
+    <w:tbl>
+      <w:tblPr>
+        <w:tblW w:w="0" w:type="auto"/>
+        <w:tblBorders>
+          <w:top w:val="dotted" w:sz="4" w:space="0" w:color="auto"/>
+          <w:left w:val="dotted" w:sz="4" w:space="0" w:color="auto"/>
+          <w:bottom w:val="dotted" w:sz="4" w:space="0" w:color="auto"/>
+          <w:right w:val="dotted" w:sz="4" w:space="0" w:color="auto"/>
+          <w:insideH w:val="dotted" w:sz="4" w:space="0" w:color="auto"/>
+          <w:insideV w:val="dotted" w:sz="4" w:space="0" w:color="auto"/>
+        </w:tblBorders>
+        <w:tblLook w:val="01E0" w:firstRow="1" w:lastRow="1" w:firstColumn="1" w:lastColumn="1" w:noHBand="0" w:noVBand="0"/>
+      </w:tblPr>
+      <w:tblGrid>
+        <w:gridCol w:w="3348"/>
+        <w:gridCol w:w="5174"/>
+      </w:tblGrid>
+      <w:tr>
+        <w:tc>
+          <w:tcPr>
+            <w:tcW w:w="8522" w:type="dxa"/>
+            <w:gridSpan w:val="2"/>
+          </w:tcPr>
+          <w:p>
+            <w:pPr>
+              <w:rPr>
+                <w:b/>
+              </w:rPr>
+            </w:pPr>
+            <w:r>
+              <w:rPr>
+                <w:b/>
+              </w:rPr>
+              <w:t>Office Use Only</w:t>
+            </w:r>
+          </w:p>
+        </w:tc>
+      </w:tr>
+      <w:tr>
+        <w:tc>
+          <w:tcPr>
+            <w:tcW w:w="3348" w:type="dxa"/>
+          </w:tcPr>
+          <w:p>
+            <w:r>
+              <w:t>Signature:</w:t>
+            </w:r>
+          </w:p>
+        </w:tc>
+        <w:tc>
+          <w:tcPr>
+            <w:tcW w:w="5174" w:type="dxa"/>
+          </w:tcPr>
+          <w:p/>
+        </w:tc>
+      </w:tr>
+      <w:tr>
+        <w:tc>
+          <w:tcPr>
+            <w:tcW w:w="3348" w:type="dxa"/>
+          </w:tcPr>
+          <w:p>
+            <w:r>
+              <w:t>Date:</w:t>
+            </w:r>
+          </w:p>
+        </w:tc>
+        <w:tc>
+          <w:tcPr>
+            <w:tcW w:w="5174" w:type="dxa"/>
+          </w:tcPr>
+          <w:p/>
+        </w:tc>
+      </w:tr>
+      <w:tr>
+        <w:tc>
+          <w:tcPr>
+            <w:tcW w:w="3348" w:type="dxa"/>
+          </w:tcPr>
+          <w:p>
+            <w:r>
+              <w:t>Penalty Applied (if applicable):</w:t>
+            </w:r>
+          </w:p>
+        </w:tc>
+        <w:tc>
+          <w:tcPr>
+            <w:tcW w:w="5174" w:type="dxa"/>
+          </w:tcPr>
+          <w:p/>
+        </w:tc>
+      </w:tr>
+    </w:tbl>
+    <w:p>
+      <w:pPr>
+        <w:pStyle w:val="Title"/>
+        <w:rPr>
+          <w:rFonts w:ascii="Segoe UI" w:hAnsi="Segoe UI" w:cs="Segoe UI"/>
+          <w:lang w:val="en-US"/>
+        </w:rPr>
+      </w:pPr>
+      <w:r>
+        <w:rPr>
+          <w:lang w:val="en-US"/>
+        </w:rPr>
+        <w:t>AI Acknowledgement Supplement</w:t>
+      </w:r>
+    </w:p>
+    <w:p>
+      <w:pPr>
+        <w:rPr>
+          <w:lang w:val="en-US"/>
+        </w:rPr>
+      </w:pPr>
+      <w:r>
+        <w:rPr>
+          <w:lang w:val="en-US"/>
+        </w:rPr>
+        <w:t>[</w:t>
+      </w:r>
+      <w:r>
+        <w:rPr>
+          <w:lang w:val="en-US"/>
+        </w:rPr>
+        <w:t xml:space="preserve">Insert </w:t>
+      </w:r>
+      <w:r>
+        <w:rPr>
+          <w:lang w:val="en-US"/>
+        </w:rPr>
+        <w:t>Module Name]</w:t>
+      </w:r>
+    </w:p>
+    <w:p>
+      <w:pPr>
+        <w:rPr>
+          <w:lang w:val="en-US"/>
+        </w:rPr>
+      </w:pPr>
+      <w:r>
+        <w:rPr>
+          <w:lang w:val="en-US"/>
+        </w:rPr>
+        <w:t>[</w:t>
+      </w:r>
+      <w:r>
+        <w:rPr>
+          <w:lang w:val="en-US"/>
+        </w:rPr>
+        <w:t xml:space="preserve">Insert </w:t>
+      </w:r>
+      <w:r>
+        <w:rPr>
+          <w:lang w:val="en-US"/>
+        </w:rPr>
+        <w:t>Title of your assignment] </w:t>
+      </w:r>
+    </w:p>
+    <w:p>
+      <w:pPr>
+        <w:textAlignment w:val="baseline"/>
+        <w:rPr>
+          <w:rFonts w:ascii="Segoe UI" w:hAnsi="Segoe UI" w:cs="Segoe UI"/>
+          <w:color w:val="5066DB"/>
+          <w:sz w:val="44"/>
+          <w:szCs w:val="44"/>
+          <w:lang w:val="en-US"/>
+        </w:rPr>
+      </w:pPr>
+    </w:p>
+    <w:tbl>
+      <w:tblPr>
+        <w:tblW w:w="0" w:type="dxa"/>
+        <w:tblBorders>
+          <w:top w:val="outset" w:sz="6" w:space="0" w:color="auto"/>
+          <w:left w:val="outset" w:sz="6" w:space="0" w:color="auto"/>
+          <w:bottom w:val="outset" w:sz="6" w:space="0" w:color="auto"/>
+          <w:right w:val="outset" w:sz="6" w:space="0" w:color="auto"/>
+        </w:tblBorders>
+        <w:tblCellMar>
+          <w:left w:w="0" w:type="dxa"/>
+          <w:right w:w="0" w:type="dxa"/>
+        </w:tblCellMar>
+        <w:tblLook w:val="04A0" w:firstRow="1" w:lastRow="0" w:firstColumn="1" w:lastColumn="0" w:noHBand="0" w:noVBand="1"/>
+      </w:tblPr>
+      <w:tblGrid>
+        <w:gridCol w:w="3222"/>
+        <w:gridCol w:w="2933"/>
+        <w:gridCol w:w="2855"/>
+      </w:tblGrid>
+      <w:tr>
+        <w:trPr>
+          <w:trHeight w:val="300"/>
+        </w:trPr>
+        <w:tc>
+          <w:tcPr>
+            <w:tcW w:w="4305" w:type="dxa"/>
+            <w:tcBorders>
+              <w:top w:val="single" w:sz="6" w:space="0" w:color="4472C4"/>
+              <w:left w:val="single" w:sz="6" w:space="0" w:color="4472C4"/>
+              <w:bottom w:val="single" w:sz="6" w:space="0" w:color="4472C4"/>
+              <w:right w:val="nil"/>
+            </w:tcBorders>
+            <w:shd w:val="clear" w:color="auto" w:fill="4472C4"/>
+            <w:hideMark/>
+          </w:tcPr>
+          <w:p>
+            <w:pPr>
+              <w:jc w:val="both"/>
+              <w:textAlignment w:val="baseline"/>
+              <w:rPr>
+                <w:rFonts w:ascii="Times New Roman" w:hAnsi="Times New Roman"/>
+                <w:b/>
+                <w:bCs/>
+                <w:color w:val="FFFFFF"/>
+                <w:sz w:val="24"/>
+                <w:szCs w:val="24"/>
+                <w:lang w:val="en-US"/>
+              </w:rPr>
+            </w:pPr>
+            <w:r>
+              <w:rPr>
+                <w:rFonts w:ascii="Calibri" w:hAnsi="Calibri" w:cs="Calibri"/>
+                <w:b/>
+                <w:bCs/>
+                <w:color w:val="FFFFFF"/>
+                <w:sz w:val="24"/>
+                <w:szCs w:val="24"/>
+                <w:lang w:val="en-US"/>
+              </w:rPr>
+              <w:t>Your Name/Student Number</w:t>
+            </w:r>
+            <w:r>
+              <w:rPr>
+                <w:rFonts w:ascii="Calibri" w:hAnsi="Calibri" w:cs="Calibri"/>
+                <w:b/>
+                <w:bCs/>
+                <w:color w:val="FFFFFF"/>
+                <w:sz w:val="24"/>
+                <w:szCs w:val="24"/>
+                <w:lang w:val="en-US"/>
+              </w:rPr>
+              <w:t> </w:t>
+            </w:r>
+          </w:p>
+        </w:tc>
+        <w:tc>
+          <w:tcPr>
+            <w:tcW w:w="4305" w:type="dxa"/>
+            <w:tcBorders>
+              <w:top w:val="single" w:sz="6" w:space="0" w:color="4472C4"/>
+              <w:left w:val="nil"/>
+              <w:bottom w:val="single" w:sz="6" w:space="0" w:color="4472C4"/>
+              <w:right w:val="nil"/>
+            </w:tcBorders>
+            <w:shd w:val="clear" w:color="auto" w:fill="4472C4"/>
+            <w:hideMark/>
+          </w:tcPr>
+          <w:p>
+            <w:pPr>
+              <w:jc w:val="both"/>
+              <w:textAlignment w:val="baseline"/>
+              <w:rPr>
+                <w:rFonts w:ascii="Times New Roman" w:hAnsi="Times New Roman"/>
+                <w:b/>
+                <w:bCs/>
+                <w:color w:val="FFFFFF"/>
+                <w:sz w:val="24"/>
+                <w:szCs w:val="24"/>
+                <w:lang w:val="en-US"/>
+              </w:rPr>
+            </w:pPr>
+            <w:r>
+              <w:rPr>
+                <w:rFonts w:ascii="Calibri" w:hAnsi="Calibri" w:cs="Calibri"/>
+                <w:b/>
+                <w:bCs/>
+                <w:color w:val="FFFFFF"/>
+                <w:sz w:val="24"/>
+                <w:szCs w:val="24"/>
+                <w:lang w:val="en-US"/>
+              </w:rPr>
+              <w:t>Course</w:t>
+            </w:r>
+            <w:r>
+              <w:rPr>
+                <w:rFonts w:ascii="Calibri" w:hAnsi="Calibri" w:cs="Calibri"/>
+                <w:b/>
+                <w:bCs/>
+                <w:color w:val="FFFFFF"/>
+                <w:sz w:val="24"/>
+                <w:szCs w:val="24"/>
+                <w:lang w:val="en-US"/>
+              </w:rPr>
+              <w:t> </w:t>
+            </w:r>
+          </w:p>
+        </w:tc>
+        <w:tc>
+          <w:tcPr>
+            <w:tcW w:w="4305" w:type="dxa"/>
+            <w:tcBorders>
+              <w:top w:val="single" w:sz="6" w:space="0" w:color="4472C4"/>
+              <w:left w:val="nil"/>
+              <w:bottom w:val="single" w:sz="6" w:space="0" w:color="4472C4"/>
+              <w:right w:val="single" w:sz="6" w:space="0" w:color="4472C4"/>
+            </w:tcBorders>
+            <w:shd w:val="clear" w:color="auto" w:fill="4472C4"/>
+            <w:hideMark/>
+          </w:tcPr>
+          <w:p>
+            <w:pPr>
+              <w:jc w:val="both"/>
+              <w:textAlignment w:val="baseline"/>
+              <w:rPr>
+                <w:rFonts w:ascii="Times New Roman" w:hAnsi="Times New Roman"/>
+                <w:b/>
+                <w:bCs/>
+                <w:color w:val="FFFFFF"/>
+                <w:sz w:val="24"/>
+                <w:szCs w:val="24"/>
+                <w:lang w:val="en-US"/>
+              </w:rPr>
+            </w:pPr>
+            <w:r>
+              <w:rPr>
+                <w:rFonts w:ascii="Calibri" w:hAnsi="Calibri" w:cs="Calibri"/>
+                <w:b/>
+                <w:bCs/>
+                <w:color w:val="FFFFFF"/>
+                <w:sz w:val="24"/>
+                <w:szCs w:val="24"/>
+                <w:lang w:val="en-US"/>
+              </w:rPr>
+              <w:t>Date</w:t>
+            </w:r>
+            <w:r>
+              <w:rPr>
+                <w:rFonts w:ascii="Calibri" w:hAnsi="Calibri" w:cs="Calibri"/>
+                <w:b/>
+                <w:bCs/>
+                <w:color w:val="FFFFFF"/>
+                <w:sz w:val="24"/>
+                <w:szCs w:val="24"/>
+                <w:lang w:val="en-US"/>
+              </w:rPr>
+              <w:t> </w:t>
+            </w:r>
+          </w:p>
+        </w:tc>
+      </w:tr>
+      <w:tr>
+        <w:trPr>
+          <w:trHeight w:val="300"/>
+        </w:trPr>
+        <w:tc>
+          <w:tcPr>
+            <w:tcW w:w="4305" w:type="dxa"/>
+            <w:tcBorders>
+              <w:top w:val="single" w:sz="6" w:space="0" w:color="8EAADB"/>
+              <w:left w:val="single" w:sz="6" w:space="0" w:color="8EAADB"/>
+              <w:bottom w:val="single" w:sz="6" w:space="0" w:color="8EAADB"/>
+              <w:right w:val="single" w:sz="6" w:space="0" w:color="8EAADB"/>
+            </w:tcBorders>
+            <w:shd w:val="clear" w:color="auto" w:fill="D9E2F3"/>
+            <w:hideMark/>
+          </w:tcPr>
+          <w:p>
+            <w:pPr>
+              <w:jc w:val="both"/>
+              <w:textAlignment w:val="baseline"/>
+              <w:rPr>
+                <w:rFonts w:ascii="Times New Roman" w:hAnsi="Times New Roman"/>
+                <w:b/>
+                <w:bCs/>
+                <w:sz w:val="24"/>
+                <w:szCs w:val="24"/>
+                <w:lang w:val="en-US"/>
+              </w:rPr>
+            </w:pPr>
+            <w:r>
+              <w:rPr>
+                <w:rFonts w:ascii="Calibri" w:hAnsi="Calibri" w:cs="Calibri"/>
+                <w:b/>
+                <w:bCs/>
+                <w:sz w:val="24"/>
+                <w:szCs w:val="24"/>
+                <w:lang w:val="en-US"/>
+              </w:rPr>
+              <w:t> </w:t>
+            </w:r>
+          </w:p>
+        </w:tc>
+        <w:tc>
+          <w:tcPr>
+            <w:tcW w:w="4305" w:type="dxa"/>
+            <w:tcBorders>
+              <w:top w:val="single" w:sz="6" w:space="0" w:color="8EAADB"/>
+              <w:left w:val="single" w:sz="6" w:space="0" w:color="8EAADB"/>
+              <w:bottom w:val="single" w:sz="6" w:space="0" w:color="8EAADB"/>
+              <w:right w:val="single" w:sz="6" w:space="0" w:color="8EAADB"/>
+            </w:tcBorders>
+            <w:shd w:val="clear" w:color="auto" w:fill="D9E2F3"/>
+            <w:hideMark/>
+          </w:tcPr>
+          <w:p>
+            <w:pPr>
+              <w:jc w:val="both"/>
+              <w:textAlignment w:val="baseline"/>
+              <w:rPr>
+                <w:rFonts w:ascii="Times New Roman" w:hAnsi="Times New Roman"/>
+                <w:sz w:val="24"/>
+                <w:szCs w:val="24"/>
+                <w:lang w:val="en-US"/>
+              </w:rPr>
+            </w:pPr>
+            <w:r>
+              <w:rPr>
+                <w:rFonts w:ascii="Calibri" w:hAnsi="Calibri" w:cs="Calibri"/>
+                <w:sz w:val="24"/>
+                <w:szCs w:val="24"/>
+                <w:lang w:val="en-US"/>
+              </w:rPr>
+              <w:t> </w:t>
+            </w:r>
+          </w:p>
+        </w:tc>
+        <w:tc>
+          <w:tcPr>
+            <w:tcW w:w="4305" w:type="dxa"/>
+            <w:tcBorders>
+              <w:top w:val="single" w:sz="6" w:space="0" w:color="8EAADB"/>
+              <w:left w:val="single" w:sz="6" w:space="0" w:color="8EAADB"/>
+              <w:bottom w:val="single" w:sz="6" w:space="0" w:color="8EAADB"/>
+              <w:right w:val="single" w:sz="6" w:space="0" w:color="8EAADB"/>
+            </w:tcBorders>
+            <w:shd w:val="clear" w:color="auto" w:fill="D9E2F3"/>
+            <w:hideMark/>
+          </w:tcPr>
+          <w:p>
+            <w:pPr>
+              <w:jc w:val="both"/>
+              <w:textAlignment w:val="baseline"/>
+              <w:rPr>
+                <w:rFonts w:ascii="Times New Roman" w:hAnsi="Times New Roman"/>
+                <w:sz w:val="24"/>
+                <w:szCs w:val="24"/>
+                <w:lang w:val="en-US"/>
+              </w:rPr>
+            </w:pPr>
+            <w:r>
+              <w:rPr>
+                <w:rFonts w:ascii="Calibri" w:hAnsi="Calibri" w:cs="Calibri"/>
+                <w:sz w:val="24"/>
+                <w:szCs w:val="24"/>
+                <w:lang w:val="en-US"/>
+              </w:rPr>
+              <w:t> </w:t>
+            </w:r>
+          </w:p>
+        </w:tc>
+      </w:tr>
+    </w:tbl>
+    <w:p>
+      <w:pPr>
+        <w:jc w:val="both"/>
+        <w:textAlignment w:val="baseline"/>
+        <w:rPr>
+          <w:rFonts w:ascii="Segoe UI" w:hAnsi="Segoe UI" w:cs="Segoe UI"/>
+          <w:lang w:val="en-US"/>
+        </w:rPr>
+      </w:pPr>
+      <w:r>
+        <w:rPr>
+          <w:rFonts w:ascii="Calibri" w:hAnsi="Calibri" w:cs="Calibri"/>
+          <w:sz w:val="24"/>
+          <w:szCs w:val="24"/>
+          <w:lang w:val="en-US"/>
+        </w:rPr>
+        <w:t> </w:t>
+      </w:r>
+    </w:p>
+    <w:p>
+      <w:pPr>
+        <w:jc w:val="both"/>
+        <w:textAlignment w:val="baseline"/>
+        <w:rPr>
+          <w:rFonts w:ascii="Segoe UI" w:hAnsi="Segoe UI" w:cs="Segoe UI"/>
+          <w:lang w:val="en-US"/>
+        </w:rPr>
+      </w:pPr>
+      <w:r>
+        <w:rPr>
+          <w:rFonts w:ascii="Calibri" w:hAnsi="Calibri" w:cs="Calibri"/>
+          <w:sz w:val="24"/>
+          <w:szCs w:val="24"/>
+          <w:lang w:val="en-US"/>
+        </w:rPr>
+        <w:t xml:space="preserve">This </w:t>
+      </w:r>
+      <w:r>
+        <w:rPr>
+          <w:rFonts w:ascii="Calibri" w:hAnsi="Calibri" w:cs="Calibri"/>
+          <w:sz w:val="24"/>
+          <w:szCs w:val="24"/>
+          <w:lang w:val="en-US"/>
+        </w:rPr>
+        <w:t>section</w:t>
+      </w:r>
+      <w:r>
+        <w:rPr>
+          <w:rFonts w:ascii="Calibri" w:hAnsi="Calibri" w:cs="Calibri"/>
+          <w:sz w:val="24"/>
+          <w:szCs w:val="24"/>
+          <w:lang w:val="en-US"/>
+        </w:rPr>
+        <w:t xml:space="preserve"> is a supplement to the main assignment,</w:t>
+      </w:r>
+      <w:r>
+        <w:rPr>
+          <w:rFonts w:ascii="Calibri" w:hAnsi="Calibri" w:cs="Calibri"/>
+          <w:sz w:val="24"/>
+          <w:szCs w:val="24"/>
+          <w:lang w:val="en-US"/>
+        </w:rPr>
+        <w:t xml:space="preserve"> to be used if AI was used in any capacity in the creation of your assignment</w:t>
+      </w:r>
+      <w:r>
+        <w:rPr>
+          <w:rFonts w:ascii="Calibri" w:hAnsi="Calibri" w:cs="Calibri"/>
+          <w:sz w:val="24"/>
+          <w:szCs w:val="24"/>
+          <w:lang w:val="en-US"/>
+        </w:rPr>
+        <w:t>; if you have queries about how to do this, please contact your lecturer. </w:t>
+      </w:r>
+      <w:r>
+        <w:rPr>
+          <w:rFonts w:ascii="Calibri" w:hAnsi="Calibri" w:cs="Calibri"/>
+          <w:sz w:val="24"/>
+          <w:szCs w:val="24"/>
+          <w:lang w:val="en-US"/>
+        </w:rPr>
+        <w:t xml:space="preserve">For an example of how to fill these sections out, please click </w:t>
+      </w:r>
+      <w:hyperlink r:id="rId12" w:history="1">
+        <w:r>
+          <w:rPr>
+            <w:rStyle w:val="Hyperlink"/>
+            <w:rFonts w:ascii="Calibri" w:hAnsi="Calibri" w:cs="Calibri"/>
+            <w:sz w:val="24"/>
+            <w:szCs w:val="24"/>
+            <w:lang w:val="en-US"/>
+          </w:rPr>
+          <w:t>here</w:t>
+        </w:r>
+      </w:hyperlink>
+      <w:r>
+        <w:rPr>
+          <w:rFonts w:ascii="Calibri" w:hAnsi="Calibri" w:cs="Calibri"/>
+          <w:sz w:val="24"/>
+          <w:szCs w:val="24"/>
+          <w:lang w:val="en-US"/>
+        </w:rPr>
+        <w:t>.</w:t>
+      </w:r>
+    </w:p>
+    <w:p>
+      <w:pPr>
+        <w:rPr>
+          <w:rFonts w:ascii="Segoe UI" w:hAnsi="Segoe UI" w:cs="Segoe UI"/>
+          <w:lang w:val="en-US"/>
+        </w:rPr>
+      </w:pPr>
+      <w:r>
+        <w:rPr>
+          <w:lang w:val="en-US"/>
+        </w:rPr>
+        <w:t>AI Acknowledgment </w:t>
+      </w:r>
+    </w:p>
+    <w:p>
+      <w:pPr>
+        <w:jc w:val="both"/>
+        <w:textAlignment w:val="baseline"/>
+        <w:rPr>
+          <w:rFonts w:ascii="Segoe UI" w:hAnsi="Segoe UI" w:cs="Segoe UI"/>
+          <w:lang w:val="en-US"/>
+        </w:rPr>
+      </w:pPr>
+      <w:r>
+        <w:rPr>
+          <w:rFonts w:ascii="Calibri" w:hAnsi="Calibri" w:cs="Calibri"/>
+          <w:sz w:val="24"/>
+          <w:szCs w:val="24"/>
+          <w:lang w:val="en-US"/>
+        </w:rPr>
+        <w:t>This section acknowledges the AI tools that were utilized in the process of completing this assignment. </w:t>
+      </w:r>
+    </w:p>
+    <w:tbl>
+      <w:tblPr>
+        <w:tblW w:w="0" w:type="dxa"/>
+        <w:tblBorders>
+          <w:top w:val="outset" w:sz="6" w:space="0" w:color="auto"/>
+          <w:left w:val="outset" w:sz="6" w:space="0" w:color="auto"/>
+          <w:bottom w:val="outset" w:sz="6" w:space="0" w:color="auto"/>
+          <w:right w:val="outset" w:sz="6" w:space="0" w:color="auto"/>
+        </w:tblBorders>
+        <w:tblCellMar>
+          <w:left w:w="0" w:type="dxa"/>
+          <w:right w:w="0" w:type="dxa"/>
+        </w:tblCellMar>
+        <w:tblLook w:val="04A0" w:firstRow="1" w:lastRow="0" w:firstColumn="1" w:lastColumn="0" w:noHBand="0" w:noVBand="1"/>
+      </w:tblPr>
+      <w:tblGrid>
+        <w:gridCol w:w="1576"/>
+        <w:gridCol w:w="4548"/>
+        <w:gridCol w:w="2886"/>
+      </w:tblGrid>
+      <w:tr>
+        <w:trPr>
+          <w:trHeight w:val="300"/>
+        </w:trPr>
+        <w:tc>
+          <w:tcPr>
+            <w:tcW w:w="2115" w:type="dxa"/>
+            <w:tcBorders>
+              <w:top w:val="single" w:sz="6" w:space="0" w:color="4472C4"/>
+              <w:left w:val="single" w:sz="6" w:space="0" w:color="4472C4"/>
+              <w:bottom w:val="single" w:sz="6" w:space="0" w:color="4472C4"/>
+              <w:right w:val="nil"/>
+            </w:tcBorders>
+            <w:shd w:val="clear" w:color="auto" w:fill="4472C4"/>
+            <w:hideMark/>
+          </w:tcPr>
+          <w:p>
+            <w:pPr>
+              <w:jc w:val="both"/>
+              <w:textAlignment w:val="baseline"/>
+              <w:rPr>
+                <w:rFonts w:ascii="Times New Roman" w:hAnsi="Times New Roman"/>
+                <w:b/>
+                <w:bCs/>
+                <w:color w:val="FFFFFF"/>
+                <w:sz w:val="24"/>
+                <w:szCs w:val="24"/>
+                <w:lang w:val="en-US"/>
+              </w:rPr>
+            </w:pPr>
+            <w:r>
+              <w:rPr>
+                <w:rFonts w:ascii="Calibri" w:hAnsi="Calibri" w:cs="Calibri"/>
+                <w:b/>
+                <w:bCs/>
+                <w:color w:val="FFFFFF"/>
+                <w:sz w:val="24"/>
+                <w:szCs w:val="24"/>
+                <w:lang w:val="en-US"/>
+              </w:rPr>
+              <w:t>Tool Name</w:t>
+            </w:r>
+            <w:r>
+              <w:rPr>
+                <w:rFonts w:ascii="Calibri" w:hAnsi="Calibri" w:cs="Calibri"/>
+                <w:b/>
+                <w:bCs/>
+                <w:color w:val="FFFFFF"/>
+                <w:sz w:val="24"/>
+                <w:szCs w:val="24"/>
+                <w:lang w:val="en-US"/>
+              </w:rPr>
+              <w:t> </w:t>
+            </w:r>
+          </w:p>
+        </w:tc>
+        <w:tc>
+          <w:tcPr>
+            <w:tcW w:w="6510" w:type="dxa"/>
+            <w:tcBorders>
+              <w:top w:val="single" w:sz="6" w:space="0" w:color="4472C4"/>
+              <w:left w:val="nil"/>
+              <w:bottom w:val="single" w:sz="6" w:space="0" w:color="4472C4"/>
+              <w:right w:val="nil"/>
+            </w:tcBorders>
+            <w:shd w:val="clear" w:color="auto" w:fill="4472C4"/>
+            <w:hideMark/>
+          </w:tcPr>
+          <w:p>
+            <w:pPr>
+              <w:jc w:val="both"/>
+              <w:textAlignment w:val="baseline"/>
+              <w:rPr>
+                <w:rFonts w:ascii="Times New Roman" w:hAnsi="Times New Roman"/>
+                <w:b/>
+                <w:bCs/>
+                <w:color w:val="FFFFFF"/>
+                <w:sz w:val="24"/>
+                <w:szCs w:val="24"/>
+                <w:lang w:val="en-US"/>
+              </w:rPr>
+            </w:pPr>
+            <w:r>
+              <w:rPr>
+                <w:rFonts w:ascii="Calibri" w:hAnsi="Calibri" w:cs="Calibri"/>
+                <w:b/>
+                <w:bCs/>
+                <w:color w:val="FFFFFF"/>
+                <w:sz w:val="24"/>
+                <w:szCs w:val="24"/>
+                <w:lang w:val="en-US"/>
+              </w:rPr>
+              <w:t>Brief Description</w:t>
+            </w:r>
+            <w:r>
+              <w:rPr>
+                <w:rFonts w:ascii="Calibri" w:hAnsi="Calibri" w:cs="Calibri"/>
+                <w:b/>
+                <w:bCs/>
+                <w:color w:val="FFFFFF"/>
+                <w:sz w:val="24"/>
+                <w:szCs w:val="24"/>
+                <w:lang w:val="en-US"/>
+              </w:rPr>
+              <w:t> </w:t>
+            </w:r>
+          </w:p>
+        </w:tc>
+        <w:tc>
+          <w:tcPr>
+            <w:tcW w:w="4305" w:type="dxa"/>
+            <w:tcBorders>
+              <w:top w:val="single" w:sz="6" w:space="0" w:color="4472C4"/>
+              <w:left w:val="nil"/>
+              <w:bottom w:val="single" w:sz="6" w:space="0" w:color="4472C4"/>
+              <w:right w:val="single" w:sz="6" w:space="0" w:color="4472C4"/>
+            </w:tcBorders>
+            <w:shd w:val="clear" w:color="auto" w:fill="4472C4"/>
+            <w:hideMark/>
+          </w:tcPr>
+          <w:p>
+            <w:pPr>
+              <w:jc w:val="both"/>
+              <w:textAlignment w:val="baseline"/>
+              <w:rPr>
+                <w:rFonts w:ascii="Times New Roman" w:hAnsi="Times New Roman"/>
+                <w:b/>
+                <w:bCs/>
+                <w:color w:val="FFFFFF"/>
+                <w:sz w:val="24"/>
+                <w:szCs w:val="24"/>
+                <w:lang w:val="en-US"/>
+              </w:rPr>
+            </w:pPr>
+            <w:r>
+              <w:rPr>
+                <w:rFonts w:ascii="Calibri" w:hAnsi="Calibri" w:cs="Calibri"/>
+                <w:b/>
+                <w:bCs/>
+                <w:color w:val="FFFFFF"/>
+                <w:sz w:val="24"/>
+                <w:szCs w:val="24"/>
+                <w:lang w:val="en-US"/>
+              </w:rPr>
+              <w:t>Link to tool</w:t>
+            </w:r>
+            <w:r>
+              <w:rPr>
+                <w:rFonts w:ascii="Calibri" w:hAnsi="Calibri" w:cs="Calibri"/>
+                <w:b/>
+                <w:bCs/>
+                <w:color w:val="FFFFFF"/>
+                <w:sz w:val="24"/>
+                <w:szCs w:val="24"/>
+                <w:lang w:val="en-US"/>
+              </w:rPr>
+              <w:t> </w:t>
+            </w:r>
+          </w:p>
+        </w:tc>
+      </w:tr>
+      <w:tr>
+        <w:trPr>
+          <w:trHeight w:val="300"/>
+        </w:trPr>
+        <w:tc>
+          <w:tcPr>
+            <w:tcW w:w="2115" w:type="dxa"/>
+            <w:tcBorders>
+              <w:top w:val="single" w:sz="6" w:space="0" w:color="8EAADB"/>
+              <w:left w:val="single" w:sz="6" w:space="0" w:color="8EAADB"/>
+              <w:bottom w:val="single" w:sz="6" w:space="0" w:color="8EAADB"/>
+              <w:right w:val="single" w:sz="6" w:space="0" w:color="8EAADB"/>
+            </w:tcBorders>
+            <w:shd w:val="clear" w:color="auto" w:fill="D9E2F3"/>
+            <w:hideMark/>
+          </w:tcPr>
+          <w:p>
+            <w:pPr>
+              <w:jc w:val="both"/>
+              <w:textAlignment w:val="baseline"/>
+              <w:rPr>
+                <w:rFonts w:ascii="Times New Roman" w:hAnsi="Times New Roman"/>
+                <w:b/>
+                <w:bCs/>
+                <w:sz w:val="24"/>
+                <w:szCs w:val="24"/>
+                <w:lang w:val="en-US"/>
+              </w:rPr>
+            </w:pPr>
+            <w:r>
+              <w:rPr>
+                <w:rFonts w:ascii="Calibri" w:hAnsi="Calibri" w:cs="Calibri"/>
+                <w:b/>
+                <w:bCs/>
+                <w:sz w:val="24"/>
+                <w:szCs w:val="24"/>
+                <w:lang w:val="en-US"/>
+              </w:rPr>
+              <w:t> </w:t>
+            </w:r>
+          </w:p>
+        </w:tc>
+        <w:tc>
+          <w:tcPr>
+            <w:tcW w:w="6510" w:type="dxa"/>
+            <w:tcBorders>
+              <w:top w:val="single" w:sz="6" w:space="0" w:color="8EAADB"/>
+              <w:left w:val="single" w:sz="6" w:space="0" w:color="8EAADB"/>
+              <w:bottom w:val="single" w:sz="6" w:space="0" w:color="8EAADB"/>
+              <w:right w:val="single" w:sz="6" w:space="0" w:color="8EAADB"/>
+            </w:tcBorders>
+            <w:shd w:val="clear" w:color="auto" w:fill="D9E2F3"/>
+            <w:hideMark/>
+          </w:tcPr>
+          <w:p>
+            <w:pPr>
+              <w:jc w:val="both"/>
+              <w:textAlignment w:val="baseline"/>
+              <w:rPr>
+                <w:rFonts w:ascii="Times New Roman" w:hAnsi="Times New Roman"/>
+                <w:sz w:val="24"/>
+                <w:szCs w:val="24"/>
+                <w:lang w:val="en-US"/>
+              </w:rPr>
+            </w:pPr>
+            <w:r>
+              <w:rPr>
+                <w:rFonts w:ascii="Calibri" w:hAnsi="Calibri" w:cs="Calibri"/>
+                <w:sz w:val="24"/>
+                <w:szCs w:val="24"/>
+                <w:lang w:val="en-US"/>
+              </w:rPr>
+              <w:t> </w:t>
+            </w:r>
+          </w:p>
+        </w:tc>
+        <w:tc>
+          <w:tcPr>
+            <w:tcW w:w="4305" w:type="dxa"/>
+            <w:tcBorders>
+              <w:top w:val="single" w:sz="6" w:space="0" w:color="8EAADB"/>
+              <w:left w:val="single" w:sz="6" w:space="0" w:color="8EAADB"/>
+              <w:bottom w:val="single" w:sz="6" w:space="0" w:color="8EAADB"/>
+              <w:right w:val="single" w:sz="6" w:space="0" w:color="8EAADB"/>
+            </w:tcBorders>
+            <w:shd w:val="clear" w:color="auto" w:fill="D9E2F3"/>
+            <w:hideMark/>
+          </w:tcPr>
+          <w:p>
+            <w:pPr>
+              <w:jc w:val="both"/>
+              <w:textAlignment w:val="baseline"/>
+              <w:rPr>
+                <w:rFonts w:ascii="Times New Roman" w:hAnsi="Times New Roman"/>
+                <w:sz w:val="24"/>
+                <w:szCs w:val="24"/>
+                <w:lang w:val="en-US"/>
+              </w:rPr>
+            </w:pPr>
+            <w:r>
+              <w:rPr>
+                <w:rFonts w:ascii="Calibri" w:hAnsi="Calibri" w:cs="Calibri"/>
+                <w:sz w:val="24"/>
+                <w:szCs w:val="24"/>
+                <w:lang w:val="en-US"/>
+              </w:rPr>
+              <w:t> </w:t>
+            </w:r>
+          </w:p>
+        </w:tc>
+      </w:tr>
+      <w:tr>
+        <w:trPr>
+          <w:trHeight w:val="300"/>
+        </w:trPr>
+        <w:tc>
+          <w:tcPr>
+            <w:tcW w:w="2115" w:type="dxa"/>
+            <w:tcBorders>
+              <w:top w:val="single" w:sz="6" w:space="0" w:color="8EAADB"/>
+              <w:left w:val="single" w:sz="6" w:space="0" w:color="8EAADB"/>
+              <w:bottom w:val="single" w:sz="6" w:space="0" w:color="8EAADB"/>
+              <w:right w:val="single" w:sz="6" w:space="0" w:color="8EAADB"/>
+            </w:tcBorders>
+            <w:hideMark/>
+          </w:tcPr>
+          <w:p>
+            <w:pPr>
+              <w:jc w:val="both"/>
+              <w:textAlignment w:val="baseline"/>
+              <w:rPr>
+                <w:rFonts w:ascii="Times New Roman" w:hAnsi="Times New Roman"/>
+                <w:b/>
+                <w:bCs/>
+                <w:sz w:val="24"/>
+                <w:szCs w:val="24"/>
+                <w:lang w:val="en-US"/>
+              </w:rPr>
+            </w:pPr>
+            <w:r>
+              <w:rPr>
+                <w:rFonts w:ascii="Calibri" w:hAnsi="Calibri" w:cs="Calibri"/>
+                <w:b/>
+                <w:bCs/>
+                <w:sz w:val="24"/>
+                <w:szCs w:val="24"/>
+                <w:lang w:val="en-US"/>
+              </w:rPr>
+              <w:t> </w:t>
+            </w:r>
+          </w:p>
+        </w:tc>
+        <w:tc>
+          <w:tcPr>
+            <w:tcW w:w="6510" w:type="dxa"/>
+            <w:tcBorders>
+              <w:top w:val="single" w:sz="6" w:space="0" w:color="8EAADB"/>
+              <w:left w:val="single" w:sz="6" w:space="0" w:color="8EAADB"/>
+              <w:bottom w:val="single" w:sz="6" w:space="0" w:color="8EAADB"/>
+              <w:right w:val="single" w:sz="6" w:space="0" w:color="8EAADB"/>
+            </w:tcBorders>
+            <w:hideMark/>
+          </w:tcPr>
+          <w:p>
+            <w:pPr>
+              <w:jc w:val="both"/>
+              <w:textAlignment w:val="baseline"/>
+              <w:rPr>
+                <w:rFonts w:ascii="Times New Roman" w:hAnsi="Times New Roman"/>
+                <w:sz w:val="24"/>
+                <w:szCs w:val="24"/>
+                <w:lang w:val="en-US"/>
+              </w:rPr>
+            </w:pPr>
+            <w:r>
+              <w:rPr>
+                <w:rFonts w:ascii="Calibri" w:hAnsi="Calibri" w:cs="Calibri"/>
+                <w:sz w:val="24"/>
+                <w:szCs w:val="24"/>
+                <w:lang w:val="en-US"/>
+              </w:rPr>
+              <w:t> </w:t>
+            </w:r>
+          </w:p>
+        </w:tc>
+        <w:tc>
+          <w:tcPr>
+            <w:tcW w:w="4305" w:type="dxa"/>
+            <w:tcBorders>
+              <w:top w:val="single" w:sz="6" w:space="0" w:color="8EAADB"/>
+              <w:left w:val="single" w:sz="6" w:space="0" w:color="8EAADB"/>
+              <w:bottom w:val="single" w:sz="6" w:space="0" w:color="8EAADB"/>
+              <w:right w:val="single" w:sz="6" w:space="0" w:color="8EAADB"/>
+            </w:tcBorders>
+            <w:hideMark/>
+          </w:tcPr>
+          <w:p>
+            <w:pPr>
+              <w:jc w:val="both"/>
+              <w:textAlignment w:val="baseline"/>
+              <w:rPr>
+                <w:rFonts w:ascii="Times New Roman" w:hAnsi="Times New Roman"/>
+                <w:sz w:val="24"/>
+                <w:szCs w:val="24"/>
+                <w:lang w:val="en-US"/>
+              </w:rPr>
+            </w:pPr>
+            <w:r>
+              <w:rPr>
+                <w:rFonts w:ascii="Calibri" w:hAnsi="Calibri" w:cs="Calibri"/>
+                <w:sz w:val="24"/>
+                <w:szCs w:val="24"/>
+                <w:lang w:val="en-US"/>
+              </w:rPr>
+              <w:t> </w:t>
+            </w:r>
+          </w:p>
+        </w:tc>
+      </w:tr>
+    </w:tbl>
+    <w:p>
+      <w:pPr>
+        <w:jc w:val="both"/>
+        <w:textAlignment w:val="baseline"/>
+        <w:rPr>
+          <w:rFonts w:ascii="Segoe UI" w:hAnsi="Segoe UI" w:cs="Segoe UI"/>
+          <w:lang w:val="en-US"/>
+        </w:rPr>
+      </w:pPr>
+      <w:r>
+        <w:rPr>
+          <w:rFonts w:ascii="Calibri" w:hAnsi="Calibri" w:cs="Calibri"/>
+          <w:sz w:val="24"/>
+          <w:szCs w:val="24"/>
+          <w:lang w:val="en-US"/>
+        </w:rPr>
+        <w:t> </w:t>
+      </w:r>
+    </w:p>
+    <w:p>
+      <w:pPr>
+        <w:rPr>
+          <w:rFonts w:ascii="Segoe UI" w:hAnsi="Segoe UI" w:cs="Segoe UI"/>
+          <w:lang w:val="en-US"/>
+        </w:rPr>
+      </w:pPr>
+      <w:r>
+        <w:rPr>
+          <w:lang w:val="en-US"/>
+        </w:rPr>
+        <w:t>Description of AI Usage </w:t>
+      </w:r>
+    </w:p>
+    <w:p>
+      <w:pPr>
+        <w:jc w:val="both"/>
+        <w:textAlignment w:val="baseline"/>
+        <w:rPr>
+          <w:rFonts w:ascii="Segoe UI" w:hAnsi="Segoe UI" w:cs="Segoe UI"/>
+          <w:lang w:val="en-US"/>
+        </w:rPr>
+      </w:pPr>
+      <w:r>
+        <w:rPr>
+          <w:rFonts w:ascii="Calibri" w:hAnsi="Calibri" w:cs="Calibri"/>
+          <w:sz w:val="24"/>
+          <w:szCs w:val="24"/>
+          <w:lang w:val="en-US"/>
+        </w:rPr>
+        <w:t xml:space="preserve">This section provides a </w:t>
+      </w:r>
+      <w:r>
+        <w:rPr>
+          <w:rFonts w:ascii="Calibri" w:hAnsi="Calibri" w:cs="Calibri"/>
+          <w:sz w:val="24"/>
+          <w:szCs w:val="24"/>
+          <w:lang w:val="en-US"/>
+        </w:rPr>
+        <w:t xml:space="preserve">more </w:t>
+      </w:r>
+      <w:r>
+        <w:rPr>
+          <w:rFonts w:ascii="Calibri" w:hAnsi="Calibri" w:cs="Calibri"/>
+          <w:sz w:val="24"/>
+          <w:szCs w:val="24"/>
+          <w:lang w:val="en-US"/>
+        </w:rPr>
+        <w:t xml:space="preserve">detailed description of how the AI tools were used in the assignment. It includes information about the prompts given to the AI tool, the responses received, and how these responses were utilized or modified in the assignment. </w:t>
+      </w:r>
+      <w:r>
+        <w:rPr>
+          <w:rFonts w:ascii="Calibri" w:hAnsi="Calibri" w:cs="Calibri"/>
+          <w:b/>
+          <w:bCs/>
+          <w:sz w:val="24"/>
+          <w:szCs w:val="24"/>
+          <w:lang w:val="en-US"/>
+        </w:rPr>
+        <w:t>One table should be used for each tool used</w:t>
+      </w:r>
+      <w:r>
+        <w:rPr>
+          <w:rFonts w:ascii="Calibri" w:hAnsi="Calibri" w:cs="Calibri"/>
+          <w:sz w:val="24"/>
+          <w:szCs w:val="24"/>
+          <w:lang w:val="en-US"/>
+        </w:rPr>
+        <w:t>. </w:t>
+      </w:r>
+    </w:p>
+    <w:tbl>
+      <w:tblPr>
+        <w:tblW w:w="0" w:type="dxa"/>
+        <w:tblBorders>
+          <w:top w:val="outset" w:sz="6" w:space="0" w:color="auto"/>
+          <w:left w:val="outset" w:sz="6" w:space="0" w:color="auto"/>
+          <w:bottom w:val="outset" w:sz="6" w:space="0" w:color="auto"/>
+          <w:right w:val="outset" w:sz="6" w:space="0" w:color="auto"/>
+        </w:tblBorders>
+        <w:tblCellMar>
+          <w:left w:w="0" w:type="dxa"/>
+          <w:right w:w="0" w:type="dxa"/>
+        </w:tblCellMar>
+        <w:tblLook w:val="04A0" w:firstRow="1" w:lastRow="0" w:firstColumn="1" w:lastColumn="0" w:noHBand="0" w:noVBand="1"/>
+      </w:tblPr>
+      <w:tblGrid>
+        <w:gridCol w:w="4473"/>
+        <w:gridCol w:w="4537"/>
+      </w:tblGrid>
+      <w:tr>
+        <w:trPr>
+          <w:trHeight w:val="300"/>
+        </w:trPr>
+        <w:tc>
+          <w:tcPr>
+            <w:tcW w:w="12945" w:type="dxa"/>
+            <w:gridSpan w:val="2"/>
+            <w:tcBorders>
+              <w:top w:val="single" w:sz="6" w:space="0" w:color="4472C4"/>
+              <w:left w:val="single" w:sz="6" w:space="0" w:color="4472C4"/>
+              <w:bottom w:val="single" w:sz="6" w:space="0" w:color="4472C4"/>
+              <w:right w:val="single" w:sz="6" w:space="0" w:color="8EAADB"/>
+            </w:tcBorders>
+            <w:shd w:val="clear" w:color="auto" w:fill="4472C4"/>
+            <w:hideMark/>
+          </w:tcPr>
+          <w:p>
+            <w:pPr>
+              <w:jc w:val="both"/>
+              <w:textAlignment w:val="baseline"/>
+              <w:rPr>
+                <w:rFonts w:ascii="Times New Roman" w:hAnsi="Times New Roman"/>
+                <w:b/>
+                <w:bCs/>
+                <w:color w:val="FFFFFF"/>
+                <w:sz w:val="24"/>
+                <w:szCs w:val="24"/>
+                <w:lang w:val="en-US"/>
+              </w:rPr>
+            </w:pPr>
+            <w:r>
+              <w:rPr>
+                <w:rFonts w:ascii="Calibri" w:hAnsi="Calibri" w:cs="Calibri"/>
+                <w:b/>
+                <w:bCs/>
+                <w:color w:val="FFFFFF"/>
+                <w:sz w:val="24"/>
+                <w:szCs w:val="24"/>
+                <w:lang w:val="en-US"/>
+              </w:rPr>
+              <w:t>[</w:t>
+            </w:r>
+            <w:r>
+              <w:rPr>
+                <w:rFonts w:ascii="Calibri" w:hAnsi="Calibri" w:cs="Calibri"/>
+                <w:b/>
+                <w:bCs/>
+                <w:color w:val="FFFFFF"/>
+                <w:sz w:val="24"/>
+                <w:szCs w:val="24"/>
+                <w:lang w:val="en-US"/>
+              </w:rPr>
+              <w:t xml:space="preserve">Insert </w:t>
+            </w:r>
+            <w:r>
+              <w:rPr>
+                <w:rFonts w:ascii="Calibri" w:hAnsi="Calibri" w:cs="Calibri"/>
+                <w:b/>
+                <w:bCs/>
+                <w:color w:val="FFFFFF"/>
+                <w:sz w:val="24"/>
+                <w:szCs w:val="24"/>
+                <w:lang w:val="en-US"/>
+              </w:rPr>
+              <w:t>Tool Name]</w:t>
+            </w:r>
+            <w:r>
+              <w:rPr>
+                <w:rFonts w:ascii="Calibri" w:hAnsi="Calibri" w:cs="Calibri"/>
+                <w:b/>
+                <w:bCs/>
+                <w:color w:val="FFFFFF"/>
+                <w:sz w:val="24"/>
+                <w:szCs w:val="24"/>
+                <w:lang w:val="en-US"/>
+              </w:rPr>
+              <w:t> </w:t>
+            </w:r>
+          </w:p>
+        </w:tc>
+      </w:tr>
+      <w:tr>
+        <w:trPr>
+          <w:trHeight w:val="300"/>
+        </w:trPr>
+        <w:tc>
+          <w:tcPr>
+            <w:tcW w:w="12945" w:type="dxa"/>
+            <w:gridSpan w:val="2"/>
+            <w:tcBorders>
+              <w:top w:val="single" w:sz="6" w:space="0" w:color="8EAADB"/>
+              <w:left w:val="single" w:sz="6" w:space="0" w:color="8EAADB"/>
+              <w:bottom w:val="single" w:sz="6" w:space="0" w:color="8EAADB"/>
+              <w:right w:val="single" w:sz="6" w:space="0" w:color="8EAADB"/>
+            </w:tcBorders>
+            <w:shd w:val="clear" w:color="auto" w:fill="D9E2F3"/>
+            <w:hideMark/>
+          </w:tcPr>
+          <w:p>
+            <w:pPr>
+              <w:jc w:val="both"/>
+              <w:textAlignment w:val="baseline"/>
+              <w:rPr>
+                <w:rFonts w:ascii="Times New Roman" w:hAnsi="Times New Roman"/>
+                <w:b/>
+                <w:bCs/>
+                <w:sz w:val="24"/>
+                <w:szCs w:val="24"/>
+                <w:lang w:val="en-US"/>
+              </w:rPr>
+            </w:pPr>
+            <w:r>
+              <w:rPr>
+                <w:rFonts w:ascii="Calibri" w:hAnsi="Calibri" w:cs="Calibri"/>
+                <w:sz w:val="24"/>
+                <w:szCs w:val="24"/>
+                <w:lang w:val="en-US"/>
+              </w:rPr>
+              <w:t>[Insert Description of use]</w:t>
+            </w:r>
+            <w:r>
+              <w:rPr>
+                <w:rFonts w:ascii="Calibri" w:hAnsi="Calibri" w:cs="Calibri"/>
+                <w:b/>
+                <w:bCs/>
+                <w:sz w:val="24"/>
+                <w:szCs w:val="24"/>
+                <w:lang w:val="en-US"/>
+              </w:rPr>
+              <w:t> </w:t>
+            </w:r>
+          </w:p>
+        </w:tc>
+      </w:tr>
+      <w:tr>
+        <w:trPr>
+          <w:trHeight w:val="300"/>
+        </w:trPr>
+        <w:tc>
+          <w:tcPr>
+            <w:tcW w:w="6465" w:type="dxa"/>
+            <w:tcBorders>
+              <w:top w:val="single" w:sz="6" w:space="0" w:color="8EAADB"/>
+              <w:left w:val="single" w:sz="6" w:space="0" w:color="8EAADB"/>
+              <w:bottom w:val="single" w:sz="6" w:space="0" w:color="8EAADB"/>
+              <w:right w:val="single" w:sz="6" w:space="0" w:color="8EAADB"/>
+            </w:tcBorders>
+            <w:hideMark/>
+          </w:tcPr>
+          <w:p>
+            <w:pPr>
+              <w:jc w:val="both"/>
+              <w:textAlignment w:val="baseline"/>
+              <w:rPr>
+                <w:rFonts w:ascii="Times New Roman" w:hAnsi="Times New Roman"/>
+                <w:b/>
+                <w:bCs/>
+                <w:sz w:val="24"/>
+                <w:szCs w:val="24"/>
+                <w:lang w:val="en-US"/>
+              </w:rPr>
+            </w:pPr>
+            <w:r>
+              <w:rPr>
+                <w:rFonts w:ascii="Calibri" w:hAnsi="Calibri" w:cs="Calibri"/>
+                <w:sz w:val="24"/>
+                <w:szCs w:val="24"/>
+                <w:lang w:val="en-US"/>
+              </w:rPr>
+              <w:t>[Insert Sample prompt]</w:t>
+            </w:r>
+            <w:r>
+              <w:rPr>
+                <w:rFonts w:ascii="Calibri" w:hAnsi="Calibri" w:cs="Calibri"/>
+                <w:b/>
+                <w:bCs/>
+                <w:sz w:val="24"/>
+                <w:szCs w:val="24"/>
+                <w:lang w:val="en-US"/>
+              </w:rPr>
+              <w:t> </w:t>
+            </w:r>
+          </w:p>
+        </w:tc>
+        <w:tc>
+          <w:tcPr>
+            <w:tcW w:w="6465" w:type="dxa"/>
+            <w:tcBorders>
+              <w:top w:val="single" w:sz="6" w:space="0" w:color="8EAADB"/>
+              <w:left w:val="single" w:sz="6" w:space="0" w:color="8EAADB"/>
+              <w:bottom w:val="single" w:sz="6" w:space="0" w:color="8EAADB"/>
+              <w:right w:val="single" w:sz="6" w:space="0" w:color="8EAADB"/>
+            </w:tcBorders>
+            <w:hideMark/>
+          </w:tcPr>
+          <w:p>
+            <w:pPr>
+              <w:jc w:val="both"/>
+              <w:textAlignment w:val="baseline"/>
+              <w:rPr>
+                <w:rFonts w:ascii="Times New Roman" w:hAnsi="Times New Roman"/>
+                <w:sz w:val="24"/>
+                <w:szCs w:val="24"/>
+                <w:lang w:val="en-US"/>
+              </w:rPr>
+            </w:pPr>
+            <w:r>
+              <w:rPr>
+                <w:rFonts w:ascii="Calibri" w:hAnsi="Calibri" w:cs="Calibri"/>
+                <w:sz w:val="24"/>
+                <w:szCs w:val="24"/>
+                <w:lang w:val="en-US"/>
+              </w:rPr>
+              <w:t>[Insert Sample response]</w:t>
+            </w:r>
+            <w:r>
+              <w:rPr>
+                <w:rFonts w:ascii="Calibri" w:hAnsi="Calibri" w:cs="Calibri"/>
+                <w:sz w:val="24"/>
+                <w:szCs w:val="24"/>
+                <w:lang w:val="en-US"/>
+              </w:rPr>
+              <w:t> </w:t>
+            </w:r>
+          </w:p>
+        </w:tc>
+      </w:tr>
+    </w:tbl>
+    <w:p>
+      <w:pPr>
+        <w:jc w:val="both"/>
+        <w:textAlignment w:val="baseline"/>
+        <w:rPr>
+          <w:rFonts w:ascii="Segoe UI" w:hAnsi="Segoe UI" w:cs="Segoe UI"/>
+          <w:lang w:val="en-US"/>
+        </w:rPr>
+      </w:pPr>
+      <w:r>
+        <w:rPr>
+          <w:rFonts w:ascii="Calibri" w:hAnsi="Calibri" w:cs="Calibri"/>
+          <w:sz w:val="24"/>
+          <w:szCs w:val="24"/>
+          <w:lang w:val="en-US"/>
+        </w:rPr>
+        <w:lastRenderedPageBreak/>
+        <w:t> </w:t>
+      </w:r>
+    </w:p>
+    <w:p>
+      <w:pPr>
+        <w:rPr>
+          <w:rFonts w:ascii="Segoe UI" w:hAnsi="Segoe UI" w:cs="Segoe UI"/>
+          <w:lang w:val="en-US"/>
+        </w:rPr>
+      </w:pPr>
+      <w:r>
+        <w:rPr>
+          <w:lang w:val="en-US"/>
+        </w:rPr>
+        <w:t>Evidence of AI Usage </w:t>
+      </w:r>
+    </w:p>
+    <w:p>
+      <w:pPr>
+        <w:jc w:val="both"/>
+        <w:textAlignment w:val="baseline"/>
+        <w:rPr>
+          <w:rFonts w:ascii="Segoe UI" w:hAnsi="Segoe UI" w:cs="Segoe UI"/>
+          <w:lang w:val="en-US"/>
+        </w:rPr>
+      </w:pPr>
+      <w:r>
+        <w:rPr>
+          <w:rFonts w:ascii="Calibri" w:hAnsi="Calibri" w:cs="Calibri"/>
+          <w:sz w:val="24"/>
+          <w:szCs w:val="24"/>
+          <w:lang w:val="en-US"/>
+        </w:rPr>
+        <w:t>This section includes evidence of significant prompts and responses used or generated through the AI tool. It should provide a clear understanding of the extent to which the AI tool was used in the assignment. Evidence may be attached via screenshots or text. </w:t>
+      </w:r>
+    </w:p>
+    <w:p>
+      <w:pPr>
+        <w:rPr>
+          <w:rFonts w:ascii="Segoe UI" w:hAnsi="Segoe UI" w:cs="Segoe UI"/>
+          <w:lang w:val="en-US"/>
+        </w:rPr>
+      </w:pPr>
+      <w:r>
+        <w:rPr>
+          <w:lang w:val="en-US"/>
+        </w:rPr>
+        <w:t>Additional Evidence</w:t>
+      </w:r>
+      <w:r>
+        <w:rPr>
+          <w:lang w:val="en-US"/>
+        </w:rPr>
+        <w:t>: </w:t>
+      </w:r>
+    </w:p>
+    <w:p>
+      <w:pPr>
+        <w:jc w:val="both"/>
+        <w:textAlignment w:val="baseline"/>
+        <w:rPr>
+          <w:rFonts w:ascii="Segoe UI" w:hAnsi="Segoe UI" w:cs="Segoe UI"/>
+          <w:sz w:val="18"/>
+          <w:szCs w:val="18"/>
+          <w:lang w:val="en-US"/>
+        </w:rPr>
+      </w:pPr>
+      <w:r>
+        <w:rPr>
+          <w:rFonts w:ascii="Calibri" w:hAnsi="Calibri" w:cs="Calibri"/>
+          <w:sz w:val="24"/>
+          <w:szCs w:val="24"/>
+          <w:lang w:val="en-US"/>
+        </w:rPr>
+        <w:t>[Place evidence here] </w:t>
+      </w:r>
+    </w:p>
+    <w:p>
+      <w:pPr>
+        <w:jc w:val="center"/>
+        <w:rPr>
+          <w:b/>
+          <w:bCs/>
+          <w:sz w:val="24"/>
+          <w:szCs w:val="24"/>
+          <w:lang w:val="en-US"/>
+        </w:rPr>
+      </w:pPr>
+    </w:p>
+    <w:p/>
+    <w:p>
+      <w:r>
+        <w:br w:type="page"/>
+      </w:r>
+    </w:p>
+    <w:p>
+      <w:pPr>
+        <w:jc w:val="right"/>
+      </w:pPr>
+      <w:r>
+        <w:rPr>
+          <w:noProof/>
+        </w:rPr>
+        <w:lastRenderedPageBreak/>
         <w:drawing>
           <wp:inline distT="0" distB="0" distL="0" distR="0" wp14:anchorId="08D26F47" wp14:editId="798526C0">
             <wp:extent cx="1618015" cy="1155700"/>
@@ -26,7 +2548,7 @@
                     <pic:cNvPicPr/>
                   </pic:nvPicPr>
                   <pic:blipFill>
-                    <a:blip r:embed="rId11" cstate="print">
+                    <a:blip r:embed="rId13" cstate="print">
                       <a:extLst>
                         <a:ext uri="{28A0092B-C50C-407E-A947-70E740481C1C}">
                           <a14:useLocalDpi xmlns:a14="http://schemas.microsoft.com/office/drawing/2010/main" val="0"/>
@@ -177,14 +2699,7 @@
           <w:sz w:val="36"/>
           <w:szCs w:val="36"/>
         </w:rPr>
-        <w:t>X23151374</w:t>
-      </w:r>
-      <w:r>
-        <w:rPr>
-          <w:sz w:val="36"/>
-          <w:szCs w:val="36"/>
-        </w:rPr>
-        <w:t>@student.ncirl.ie</w:t>
+        <w:t>X23151374@student.ncirl.ie</w:t>
       </w:r>
     </w:p>
     <w:p>
@@ -300,7 +2815,6 @@
           <w:pPr>
             <w:pStyle w:val="TOC1"/>
             <w:tabs>
-              <w:tab w:val="left" w:pos="480"/>
               <w:tab w:val="right" w:leader="dot" w:pos="9016"/>
             </w:tabs>
             <w:rPr>
@@ -321,41 +2835,23 @@
           <w:r>
             <w:fldChar w:fldCharType="separate"/>
           </w:r>
-          <w:hyperlink w:anchor="_Toc232419747" w:history="1">
+          <w:hyperlink w:anchor="_Toc232424671" w:history="1">
             <w:r>
               <w:rPr>
                 <w:rStyle w:val="Hyperlink"/>
                 <w:noProof/>
               </w:rPr>
-              <w:t>2</w:t>
-            </w:r>
-            <w:r>
-              <w:rPr>
-                <w:noProof/>
-                <w:kern w:val="2"/>
-                <w:sz w:val="24"/>
-                <w:szCs w:val="24"/>
-                <w:lang w:eastAsia="en-IE"/>
-                <w14:ligatures w14:val="standardContextual"/>
+              <w:t>Executive Summary</w:t>
+            </w:r>
+            <w:r>
+              <w:rPr>
+                <w:noProof/>
+                <w:webHidden/>
               </w:rPr>
               <w:tab/>
             </w:r>
             <w:r>
               <w:rPr>
-                <w:rStyle w:val="Hyperlink"/>
-                <w:noProof/>
-              </w:rPr>
-              <w:t>Executive Summary</w:t>
-            </w:r>
-            <w:r>
-              <w:rPr>
-                <w:noProof/>
-                <w:webHidden/>
-              </w:rPr>
-              <w:tab/>
-            </w:r>
-            <w:r>
-              <w:rPr>
                 <w:noProof/>
                 <w:webHidden/>
               </w:rPr>
@@ -366,7 +2862,7 @@
                 <w:noProof/>
                 <w:webHidden/>
               </w:rPr>
-              <w:instrText xml:space="preserve"> PAGEREF _Toc232419747 \h </w:instrText>
+              <w:instrText xml:space="preserve"> PAGEREF _Toc232424671 \h </w:instrText>
             </w:r>
             <w:r>
               <w:rPr>
@@ -386,7 +2882,7 @@
                 <w:noProof/>
                 <w:webHidden/>
               </w:rPr>
-              <w:t>2</w:t>
+              <w:t>5</w:t>
             </w:r>
             <w:r>
               <w:rPr>
@@ -401,7 +2897,7 @@
           <w:pPr>
             <w:pStyle w:val="TOC1"/>
             <w:tabs>
-              <w:tab w:val="left" w:pos="720"/>
+              <w:tab w:val="left" w:pos="480"/>
               <w:tab w:val="right" w:leader="dot" w:pos="9016"/>
             </w:tabs>
             <w:rPr>
@@ -413,13 +2909,13 @@
               <w14:ligatures w14:val="standardContextual"/>
             </w:rPr>
           </w:pPr>
-          <w:hyperlink w:anchor="_Toc232419748" w:history="1">
+          <w:hyperlink w:anchor="_Toc232424672" w:history="1">
             <w:r>
               <w:rPr>
                 <w:rStyle w:val="Hyperlink"/>
                 <w:noProof/>
               </w:rPr>
-              <w:t>1.0</w:t>
+              <w:t>1</w:t>
             </w:r>
             <w:r>
               <w:rPr>
@@ -458,7 +2954,7 @@
                 <w:noProof/>
                 <w:webHidden/>
               </w:rPr>
-              <w:instrText xml:space="preserve"> PAGEREF _Toc232419748 \h </w:instrText>
+              <w:instrText xml:space="preserve"> PAGEREF _Toc232424672 \h </w:instrText>
             </w:r>
             <w:r>
               <w:rPr>
@@ -478,7 +2974,7 @@
                 <w:noProof/>
                 <w:webHidden/>
               </w:rPr>
-              <w:t>2</w:t>
+              <w:t>6</w:t>
             </w:r>
             <w:r>
               <w:rPr>
@@ -505,13 +3001,13 @@
               <w14:ligatures w14:val="standardContextual"/>
             </w:rPr>
           </w:pPr>
-          <w:hyperlink w:anchor="_Toc232419749" w:history="1">
+          <w:hyperlink w:anchor="_Toc232424673" w:history="1">
             <w:r>
               <w:rPr>
                 <w:rStyle w:val="Hyperlink"/>
                 <w:noProof/>
               </w:rPr>
-              <w:t>1.1.</w:t>
+              <w:t>1.1</w:t>
             </w:r>
             <w:r>
               <w:rPr>
@@ -550,7 +3046,7 @@
                 <w:noProof/>
                 <w:webHidden/>
               </w:rPr>
-              <w:instrText xml:space="preserve"> PAGEREF _Toc232419749 \h </w:instrText>
+              <w:instrText xml:space="preserve"> PAGEREF _Toc232424673 \h </w:instrText>
             </w:r>
             <w:r>
               <w:rPr>
@@ -570,7 +3066,7 @@
                 <w:noProof/>
                 <w:webHidden/>
               </w:rPr>
-              <w:t>2</w:t>
+              <w:t>6</w:t>
             </w:r>
             <w:r>
               <w:rPr>
@@ -597,13 +3093,13 @@
               <w14:ligatures w14:val="standardContextual"/>
             </w:rPr>
           </w:pPr>
-          <w:hyperlink w:anchor="_Toc232419750" w:history="1">
+          <w:hyperlink w:anchor="_Toc232424674" w:history="1">
             <w:r>
               <w:rPr>
                 <w:rStyle w:val="Hyperlink"/>
                 <w:noProof/>
               </w:rPr>
-              <w:t>1.2.</w:t>
+              <w:t>1.2</w:t>
             </w:r>
             <w:r>
               <w:rPr>
@@ -642,7 +3138,7 @@
                 <w:noProof/>
                 <w:webHidden/>
               </w:rPr>
-              <w:instrText xml:space="preserve"> PAGEREF _Toc232419750 \h </w:instrText>
+              <w:instrText xml:space="preserve"> PAGEREF _Toc232424674 \h </w:instrText>
             </w:r>
             <w:r>
               <w:rPr>
@@ -662,7 +3158,7 @@
                 <w:noProof/>
                 <w:webHidden/>
               </w:rPr>
-              <w:t>2</w:t>
+              <w:t>6</w:t>
             </w:r>
             <w:r>
               <w:rPr>
@@ -689,13 +3185,13 @@
               <w14:ligatures w14:val="standardContextual"/>
             </w:rPr>
           </w:pPr>
-          <w:hyperlink w:anchor="_Toc232419751" w:history="1">
+          <w:hyperlink w:anchor="_Toc232424675" w:history="1">
             <w:r>
               <w:rPr>
                 <w:rStyle w:val="Hyperlink"/>
                 <w:noProof/>
               </w:rPr>
-              <w:t>1.3.</w:t>
+              <w:t>1.3</w:t>
             </w:r>
             <w:r>
               <w:rPr>
@@ -734,7 +3230,7 @@
                 <w:noProof/>
                 <w:webHidden/>
               </w:rPr>
-              <w:instrText xml:space="preserve"> PAGEREF _Toc232419751 \h </w:instrText>
+              <w:instrText xml:space="preserve"> PAGEREF _Toc232424675 \h </w:instrText>
             </w:r>
             <w:r>
               <w:rPr>
@@ -754,7 +3250,7 @@
                 <w:noProof/>
                 <w:webHidden/>
               </w:rPr>
-              <w:t>2</w:t>
+              <w:t>6</w:t>
             </w:r>
             <w:r>
               <w:rPr>
@@ -781,13 +3277,13 @@
               <w14:ligatures w14:val="standardContextual"/>
             </w:rPr>
           </w:pPr>
-          <w:hyperlink w:anchor="_Toc232419752" w:history="1">
+          <w:hyperlink w:anchor="_Toc232424676" w:history="1">
             <w:r>
               <w:rPr>
                 <w:rStyle w:val="Hyperlink"/>
                 <w:noProof/>
               </w:rPr>
-              <w:t>1.4.</w:t>
+              <w:t>1.4</w:t>
             </w:r>
             <w:r>
               <w:rPr>
@@ -826,7 +3322,7 @@
                 <w:noProof/>
                 <w:webHidden/>
               </w:rPr>
-              <w:instrText xml:space="preserve"> PAGEREF _Toc232419752 \h </w:instrText>
+              <w:instrText xml:space="preserve"> PAGEREF _Toc232424676 \h </w:instrText>
             </w:r>
             <w:r>
               <w:rPr>
@@ -846,7 +3342,7 @@
                 <w:noProof/>
                 <w:webHidden/>
               </w:rPr>
-              <w:t>2</w:t>
+              <w:t>6</w:t>
             </w:r>
             <w:r>
               <w:rPr>
@@ -861,7 +3357,7 @@
           <w:pPr>
             <w:pStyle w:val="TOC1"/>
             <w:tabs>
-              <w:tab w:val="left" w:pos="720"/>
+              <w:tab w:val="left" w:pos="480"/>
               <w:tab w:val="right" w:leader="dot" w:pos="9016"/>
             </w:tabs>
             <w:rPr>
@@ -873,13 +3369,13 @@
               <w14:ligatures w14:val="standardContextual"/>
             </w:rPr>
           </w:pPr>
-          <w:hyperlink w:anchor="_Toc232419753" w:history="1">
+          <w:hyperlink w:anchor="_Toc232424677" w:history="1">
             <w:r>
               <w:rPr>
                 <w:rStyle w:val="Hyperlink"/>
                 <w:noProof/>
               </w:rPr>
-              <w:t>2.0</w:t>
+              <w:t>2</w:t>
             </w:r>
             <w:r>
               <w:rPr>
@@ -918,7 +3414,7 @@
                 <w:noProof/>
                 <w:webHidden/>
               </w:rPr>
-              <w:instrText xml:space="preserve"> PAGEREF _Toc232419753 \h </w:instrText>
+              <w:instrText xml:space="preserve"> PAGEREF _Toc232424677 \h </w:instrText>
             </w:r>
             <w:r>
               <w:rPr>
@@ -938,7 +3434,7 @@
                 <w:noProof/>
                 <w:webHidden/>
               </w:rPr>
-              <w:t>2</w:t>
+              <w:t>6</w:t>
             </w:r>
             <w:r>
               <w:rPr>
@@ -965,13 +3461,13 @@
               <w14:ligatures w14:val="standardContextual"/>
             </w:rPr>
           </w:pPr>
-          <w:hyperlink w:anchor="_Toc232419754" w:history="1">
+          <w:hyperlink w:anchor="_Toc232424678" w:history="1">
             <w:r>
               <w:rPr>
                 <w:rStyle w:val="Hyperlink"/>
                 <w:noProof/>
               </w:rPr>
-              <w:t>2.1.</w:t>
+              <w:t>2.1</w:t>
             </w:r>
             <w:r>
               <w:rPr>
@@ -1010,7 +3506,7 @@
                 <w:noProof/>
                 <w:webHidden/>
               </w:rPr>
-              <w:instrText xml:space="preserve"> PAGEREF _Toc232419754 \h </w:instrText>
+              <w:instrText xml:space="preserve"> PAGEREF _Toc232424678 \h </w:instrText>
             </w:r>
             <w:r>
               <w:rPr>
@@ -1030,7 +3526,7 @@
                 <w:noProof/>
                 <w:webHidden/>
               </w:rPr>
-              <w:t>2</w:t>
+              <w:t>6</w:t>
             </w:r>
             <w:r>
               <w:rPr>
@@ -1043,36 +3539,26 @@
         </w:p>
         <w:p>
           <w:pPr>
-            <w:pStyle w:val="TOC2"/>
+            <w:pStyle w:val="TOC3"/>
             <w:tabs>
-              <w:tab w:val="left" w:pos="1200"/>
+              <w:tab w:val="left" w:pos="1440"/>
               <w:tab w:val="right" w:leader="dot" w:pos="9016"/>
             </w:tabs>
             <w:rPr>
               <w:noProof/>
-              <w:kern w:val="2"/>
-              <w:sz w:val="24"/>
-              <w:szCs w:val="24"/>
-              <w:lang w:eastAsia="en-IE"/>
-              <w14:ligatures w14:val="standardContextual"/>
             </w:rPr>
           </w:pPr>
-          <w:hyperlink w:anchor="_Toc232419755" w:history="1">
+          <w:hyperlink w:anchor="_Toc232424679" w:history="1">
             <w:r>
               <w:rPr>
                 <w:rStyle w:val="Hyperlink"/>
                 <w:noProof/>
               </w:rPr>
-              <w:t>2.1.1.</w:t>
-            </w:r>
-            <w:r>
-              <w:rPr>
-                <w:noProof/>
-                <w:kern w:val="2"/>
-                <w:sz w:val="24"/>
-                <w:szCs w:val="24"/>
-                <w:lang w:eastAsia="en-IE"/>
-                <w14:ligatures w14:val="standardContextual"/>
+              <w:t>2.1.1</w:t>
+            </w:r>
+            <w:r>
+              <w:rPr>
+                <w:noProof/>
               </w:rPr>
               <w:tab/>
             </w:r>
@@ -1102,7 +3588,7 @@
                 <w:noProof/>
                 <w:webHidden/>
               </w:rPr>
-              <w:instrText xml:space="preserve"> PAGEREF _Toc232419755 \h </w:instrText>
+              <w:instrText xml:space="preserve"> PAGEREF _Toc232424679 \h </w:instrText>
             </w:r>
             <w:r>
               <w:rPr>
@@ -1122,7 +3608,7 @@
                 <w:noProof/>
                 <w:webHidden/>
               </w:rPr>
-              <w:t>2</w:t>
+              <w:t>6</w:t>
             </w:r>
             <w:r>
               <w:rPr>
@@ -1135,36 +3621,26 @@
         </w:p>
         <w:p>
           <w:pPr>
-            <w:pStyle w:val="TOC2"/>
+            <w:pStyle w:val="TOC3"/>
             <w:tabs>
-              <w:tab w:val="left" w:pos="1200"/>
+              <w:tab w:val="left" w:pos="1440"/>
               <w:tab w:val="right" w:leader="dot" w:pos="9016"/>
             </w:tabs>
             <w:rPr>
               <w:noProof/>
-              <w:kern w:val="2"/>
-              <w:sz w:val="24"/>
-              <w:szCs w:val="24"/>
-              <w:lang w:eastAsia="en-IE"/>
-              <w14:ligatures w14:val="standardContextual"/>
             </w:rPr>
           </w:pPr>
-          <w:hyperlink w:anchor="_Toc232419756" w:history="1">
+          <w:hyperlink w:anchor="_Toc232424680" w:history="1">
             <w:r>
               <w:rPr>
                 <w:rStyle w:val="Hyperlink"/>
                 <w:noProof/>
               </w:rPr>
-              <w:t>2.1.1.1.</w:t>
-            </w:r>
-            <w:r>
-              <w:rPr>
-                <w:noProof/>
-                <w:kern w:val="2"/>
-                <w:sz w:val="24"/>
-                <w:szCs w:val="24"/>
-                <w:lang w:eastAsia="en-IE"/>
-                <w14:ligatures w14:val="standardContextual"/>
+              <w:t>2.1.2</w:t>
+            </w:r>
+            <w:r>
+              <w:rPr>
+                <w:noProof/>
               </w:rPr>
               <w:tab/>
             </w:r>
@@ -1173,7 +3649,7 @@
                 <w:rStyle w:val="Hyperlink"/>
                 <w:noProof/>
               </w:rPr>
-              <w:t>Use Case Diagram</w:t>
+              <w:t>Data Requirements</w:t>
             </w:r>
             <w:r>
               <w:rPr>
@@ -1194,7 +3670,7 @@
                 <w:noProof/>
                 <w:webHidden/>
               </w:rPr>
-              <w:instrText xml:space="preserve"> PAGEREF _Toc232419756 \h </w:instrText>
+              <w:instrText xml:space="preserve"> PAGEREF _Toc232424680 \h </w:instrText>
             </w:r>
             <w:r>
               <w:rPr>
@@ -1214,7 +3690,7 @@
                 <w:noProof/>
                 <w:webHidden/>
               </w:rPr>
-              <w:t>3</w:t>
+              <w:t>8</w:t>
             </w:r>
             <w:r>
               <w:rPr>
@@ -1227,36 +3703,26 @@
         </w:p>
         <w:p>
           <w:pPr>
-            <w:pStyle w:val="TOC2"/>
+            <w:pStyle w:val="TOC3"/>
             <w:tabs>
-              <w:tab w:val="left" w:pos="1200"/>
+              <w:tab w:val="left" w:pos="1440"/>
               <w:tab w:val="right" w:leader="dot" w:pos="9016"/>
             </w:tabs>
             <w:rPr>
               <w:noProof/>
-              <w:kern w:val="2"/>
-              <w:sz w:val="24"/>
-              <w:szCs w:val="24"/>
-              <w:lang w:eastAsia="en-IE"/>
-              <w14:ligatures w14:val="standardContextual"/>
             </w:rPr>
           </w:pPr>
-          <w:hyperlink w:anchor="_Toc232419757" w:history="1">
+          <w:hyperlink w:anchor="_Toc232424681" w:history="1">
             <w:r>
               <w:rPr>
                 <w:rStyle w:val="Hyperlink"/>
                 <w:noProof/>
               </w:rPr>
-              <w:t>2.1.1.2.</w:t>
-            </w:r>
-            <w:r>
-              <w:rPr>
-                <w:noProof/>
-                <w:kern w:val="2"/>
-                <w:sz w:val="24"/>
-                <w:szCs w:val="24"/>
-                <w:lang w:eastAsia="en-IE"/>
-                <w14:ligatures w14:val="standardContextual"/>
+              <w:t>2.1.3</w:t>
+            </w:r>
+            <w:r>
+              <w:rPr>
+                <w:noProof/>
               </w:rPr>
               <w:tab/>
             </w:r>
@@ -1265,15 +3731,7 @@
                 <w:rStyle w:val="Hyperlink"/>
                 <w:noProof/>
               </w:rPr>
-              <w:t xml:space="preserve">Requirement 1 </w:t>
-            </w:r>
-            <w:r>
-              <w:rPr>
-                <w:rStyle w:val="Hyperlink"/>
-                <w:noProof/>
-                <w:highlight w:val="yellow"/>
-              </w:rPr>
-              <w:t>&lt;Name of requirement in a few words&gt;</w:t>
+              <w:t>User Requirements</w:t>
             </w:r>
             <w:r>
               <w:rPr>
@@ -1294,7 +3752,7 @@
                 <w:noProof/>
                 <w:webHidden/>
               </w:rPr>
-              <w:instrText xml:space="preserve"> PAGEREF _Toc232419757 \h </w:instrText>
+              <w:instrText xml:space="preserve"> PAGEREF _Toc232424681 \h </w:instrText>
             </w:r>
             <w:r>
               <w:rPr>
@@ -1314,7 +3772,7 @@
                 <w:noProof/>
                 <w:webHidden/>
               </w:rPr>
-              <w:t>3</w:t>
+              <w:t>8</w:t>
             </w:r>
             <w:r>
               <w:rPr>
@@ -1327,36 +3785,26 @@
         </w:p>
         <w:p>
           <w:pPr>
-            <w:pStyle w:val="TOC2"/>
+            <w:pStyle w:val="TOC3"/>
             <w:tabs>
-              <w:tab w:val="left" w:pos="1200"/>
+              <w:tab w:val="left" w:pos="1440"/>
               <w:tab w:val="right" w:leader="dot" w:pos="9016"/>
             </w:tabs>
             <w:rPr>
               <w:noProof/>
-              <w:kern w:val="2"/>
-              <w:sz w:val="24"/>
-              <w:szCs w:val="24"/>
-              <w:lang w:eastAsia="en-IE"/>
-              <w14:ligatures w14:val="standardContextual"/>
             </w:rPr>
           </w:pPr>
-          <w:hyperlink w:anchor="_Toc232419758" w:history="1">
+          <w:hyperlink w:anchor="_Toc232424682" w:history="1">
             <w:r>
               <w:rPr>
                 <w:rStyle w:val="Hyperlink"/>
                 <w:noProof/>
               </w:rPr>
-              <w:t>2.1.1.3.</w:t>
-            </w:r>
-            <w:r>
-              <w:rPr>
-                <w:noProof/>
-                <w:kern w:val="2"/>
-                <w:sz w:val="24"/>
-                <w:szCs w:val="24"/>
-                <w:lang w:eastAsia="en-IE"/>
-                <w14:ligatures w14:val="standardContextual"/>
+              <w:t>2.1.4</w:t>
+            </w:r>
+            <w:r>
+              <w:rPr>
+                <w:noProof/>
               </w:rPr>
               <w:tab/>
             </w:r>
@@ -1365,7 +3813,7 @@
                 <w:rStyle w:val="Hyperlink"/>
                 <w:noProof/>
               </w:rPr>
-              <w:t>Description &amp; Priority</w:t>
+              <w:t>Environmental Requirements</w:t>
             </w:r>
             <w:r>
               <w:rPr>
@@ -1386,7 +3834,7 @@
                 <w:noProof/>
                 <w:webHidden/>
               </w:rPr>
-              <w:instrText xml:space="preserve"> PAGEREF _Toc232419758 \h </w:instrText>
+              <w:instrText xml:space="preserve"> PAGEREF _Toc232424682 \h </w:instrText>
             </w:r>
             <w:r>
               <w:rPr>
@@ -1406,7 +3854,7 @@
                 <w:noProof/>
                 <w:webHidden/>
               </w:rPr>
-              <w:t>3</w:t>
+              <w:t>8</w:t>
             </w:r>
             <w:r>
               <w:rPr>
@@ -1419,36 +3867,26 @@
         </w:p>
         <w:p>
           <w:pPr>
-            <w:pStyle w:val="TOC2"/>
+            <w:pStyle w:val="TOC3"/>
             <w:tabs>
-              <w:tab w:val="left" w:pos="1200"/>
+              <w:tab w:val="left" w:pos="1440"/>
               <w:tab w:val="right" w:leader="dot" w:pos="9016"/>
             </w:tabs>
             <w:rPr>
               <w:noProof/>
-              <w:kern w:val="2"/>
-              <w:sz w:val="24"/>
-              <w:szCs w:val="24"/>
-              <w:lang w:eastAsia="en-IE"/>
-              <w14:ligatures w14:val="standardContextual"/>
             </w:rPr>
           </w:pPr>
-          <w:hyperlink w:anchor="_Toc232419759" w:history="1">
+          <w:hyperlink w:anchor="_Toc232424683" w:history="1">
             <w:r>
               <w:rPr>
                 <w:rStyle w:val="Hyperlink"/>
                 <w:noProof/>
               </w:rPr>
-              <w:t>2.1.1.4.</w:t>
-            </w:r>
-            <w:r>
-              <w:rPr>
-                <w:noProof/>
-                <w:kern w:val="2"/>
-                <w:sz w:val="24"/>
-                <w:szCs w:val="24"/>
-                <w:lang w:eastAsia="en-IE"/>
-                <w14:ligatures w14:val="standardContextual"/>
+              <w:t>2.1.5</w:t>
+            </w:r>
+            <w:r>
+              <w:rPr>
+                <w:noProof/>
               </w:rPr>
               <w:tab/>
             </w:r>
@@ -1457,7 +3895,7 @@
                 <w:rStyle w:val="Hyperlink"/>
                 <w:noProof/>
               </w:rPr>
-              <w:t>Use Case</w:t>
+              <w:t>Usability Requirements</w:t>
             </w:r>
             <w:r>
               <w:rPr>
@@ -1478,7 +3916,7 @@
                 <w:noProof/>
                 <w:webHidden/>
               </w:rPr>
-              <w:instrText xml:space="preserve"> PAGEREF _Toc232419759 \h </w:instrText>
+              <w:instrText xml:space="preserve"> PAGEREF _Toc232424683 \h </w:instrText>
             </w:r>
             <w:r>
               <w:rPr>
@@ -1498,375 +3936,7 @@
                 <w:noProof/>
                 <w:webHidden/>
               </w:rPr>
-              <w:t>3</w:t>
-            </w:r>
-            <w:r>
-              <w:rPr>
-                <w:noProof/>
-                <w:webHidden/>
-              </w:rPr>
-              <w:fldChar w:fldCharType="end"/>
-            </w:r>
-          </w:hyperlink>
-        </w:p>
-        <w:p>
-          <w:pPr>
-            <w:pStyle w:val="TOC2"/>
-            <w:tabs>
-              <w:tab w:val="left" w:pos="1200"/>
-              <w:tab w:val="right" w:leader="dot" w:pos="9016"/>
-            </w:tabs>
-            <w:rPr>
-              <w:noProof/>
-              <w:kern w:val="2"/>
-              <w:sz w:val="24"/>
-              <w:szCs w:val="24"/>
-              <w:lang w:eastAsia="en-IE"/>
-              <w14:ligatures w14:val="standardContextual"/>
-            </w:rPr>
-          </w:pPr>
-          <w:hyperlink w:anchor="_Toc232419760" w:history="1">
-            <w:r>
-              <w:rPr>
-                <w:rStyle w:val="Hyperlink"/>
-                <w:noProof/>
-              </w:rPr>
-              <w:t>2.1.2.</w:t>
-            </w:r>
-            <w:r>
-              <w:rPr>
-                <w:noProof/>
-                <w:kern w:val="2"/>
-                <w:sz w:val="24"/>
-                <w:szCs w:val="24"/>
-                <w:lang w:eastAsia="en-IE"/>
-                <w14:ligatures w14:val="standardContextual"/>
-              </w:rPr>
-              <w:tab/>
-            </w:r>
-            <w:r>
-              <w:rPr>
-                <w:rStyle w:val="Hyperlink"/>
-                <w:noProof/>
-              </w:rPr>
-              <w:t>Data Requirements</w:t>
-            </w:r>
-            <w:r>
-              <w:rPr>
-                <w:noProof/>
-                <w:webHidden/>
-              </w:rPr>
-              <w:tab/>
-            </w:r>
-            <w:r>
-              <w:rPr>
-                <w:noProof/>
-                <w:webHidden/>
-              </w:rPr>
-              <w:fldChar w:fldCharType="begin"/>
-            </w:r>
-            <w:r>
-              <w:rPr>
-                <w:noProof/>
-                <w:webHidden/>
-              </w:rPr>
-              <w:instrText xml:space="preserve"> PAGEREF _Toc232419760 \h </w:instrText>
-            </w:r>
-            <w:r>
-              <w:rPr>
-                <w:noProof/>
-                <w:webHidden/>
-              </w:rPr>
-            </w:r>
-            <w:r>
-              <w:rPr>
-                <w:noProof/>
-                <w:webHidden/>
-              </w:rPr>
-              <w:fldChar w:fldCharType="separate"/>
-            </w:r>
-            <w:r>
-              <w:rPr>
-                <w:noProof/>
-                <w:webHidden/>
-              </w:rPr>
-              <w:t>4</w:t>
-            </w:r>
-            <w:r>
-              <w:rPr>
-                <w:noProof/>
-                <w:webHidden/>
-              </w:rPr>
-              <w:fldChar w:fldCharType="end"/>
-            </w:r>
-          </w:hyperlink>
-        </w:p>
-        <w:p>
-          <w:pPr>
-            <w:pStyle w:val="TOC2"/>
-            <w:tabs>
-              <w:tab w:val="left" w:pos="1200"/>
-              <w:tab w:val="right" w:leader="dot" w:pos="9016"/>
-            </w:tabs>
-            <w:rPr>
-              <w:noProof/>
-              <w:kern w:val="2"/>
-              <w:sz w:val="24"/>
-              <w:szCs w:val="24"/>
-              <w:lang w:eastAsia="en-IE"/>
-              <w14:ligatures w14:val="standardContextual"/>
-            </w:rPr>
-          </w:pPr>
-          <w:hyperlink w:anchor="_Toc232419761" w:history="1">
-            <w:r>
-              <w:rPr>
-                <w:rStyle w:val="Hyperlink"/>
-                <w:noProof/>
-              </w:rPr>
-              <w:t>2.1.3.</w:t>
-            </w:r>
-            <w:r>
-              <w:rPr>
-                <w:noProof/>
-                <w:kern w:val="2"/>
-                <w:sz w:val="24"/>
-                <w:szCs w:val="24"/>
-                <w:lang w:eastAsia="en-IE"/>
-                <w14:ligatures w14:val="standardContextual"/>
-              </w:rPr>
-              <w:tab/>
-            </w:r>
-            <w:r>
-              <w:rPr>
-                <w:rStyle w:val="Hyperlink"/>
-                <w:noProof/>
-              </w:rPr>
-              <w:t>User Requirements</w:t>
-            </w:r>
-            <w:r>
-              <w:rPr>
-                <w:noProof/>
-                <w:webHidden/>
-              </w:rPr>
-              <w:tab/>
-            </w:r>
-            <w:r>
-              <w:rPr>
-                <w:noProof/>
-                <w:webHidden/>
-              </w:rPr>
-              <w:fldChar w:fldCharType="begin"/>
-            </w:r>
-            <w:r>
-              <w:rPr>
-                <w:noProof/>
-                <w:webHidden/>
-              </w:rPr>
-              <w:instrText xml:space="preserve"> PAGEREF _Toc232419761 \h </w:instrText>
-            </w:r>
-            <w:r>
-              <w:rPr>
-                <w:noProof/>
-                <w:webHidden/>
-              </w:rPr>
-            </w:r>
-            <w:r>
-              <w:rPr>
-                <w:noProof/>
-                <w:webHidden/>
-              </w:rPr>
-              <w:fldChar w:fldCharType="separate"/>
-            </w:r>
-            <w:r>
-              <w:rPr>
-                <w:noProof/>
-                <w:webHidden/>
-              </w:rPr>
-              <w:t>4</w:t>
-            </w:r>
-            <w:r>
-              <w:rPr>
-                <w:noProof/>
-                <w:webHidden/>
-              </w:rPr>
-              <w:fldChar w:fldCharType="end"/>
-            </w:r>
-          </w:hyperlink>
-        </w:p>
-        <w:p>
-          <w:pPr>
-            <w:pStyle w:val="TOC2"/>
-            <w:tabs>
-              <w:tab w:val="left" w:pos="1200"/>
-              <w:tab w:val="right" w:leader="dot" w:pos="9016"/>
-            </w:tabs>
-            <w:rPr>
-              <w:noProof/>
-              <w:kern w:val="2"/>
-              <w:sz w:val="24"/>
-              <w:szCs w:val="24"/>
-              <w:lang w:eastAsia="en-IE"/>
-              <w14:ligatures w14:val="standardContextual"/>
-            </w:rPr>
-          </w:pPr>
-          <w:hyperlink w:anchor="_Toc232419762" w:history="1">
-            <w:r>
-              <w:rPr>
-                <w:rStyle w:val="Hyperlink"/>
-                <w:noProof/>
-              </w:rPr>
-              <w:t>2.1.4.</w:t>
-            </w:r>
-            <w:r>
-              <w:rPr>
-                <w:noProof/>
-                <w:kern w:val="2"/>
-                <w:sz w:val="24"/>
-                <w:szCs w:val="24"/>
-                <w:lang w:eastAsia="en-IE"/>
-                <w14:ligatures w14:val="standardContextual"/>
-              </w:rPr>
-              <w:tab/>
-            </w:r>
-            <w:r>
-              <w:rPr>
-                <w:rStyle w:val="Hyperlink"/>
-                <w:noProof/>
-              </w:rPr>
-              <w:t>Environmental Requirements</w:t>
-            </w:r>
-            <w:r>
-              <w:rPr>
-                <w:noProof/>
-                <w:webHidden/>
-              </w:rPr>
-              <w:tab/>
-            </w:r>
-            <w:r>
-              <w:rPr>
-                <w:noProof/>
-                <w:webHidden/>
-              </w:rPr>
-              <w:fldChar w:fldCharType="begin"/>
-            </w:r>
-            <w:r>
-              <w:rPr>
-                <w:noProof/>
-                <w:webHidden/>
-              </w:rPr>
-              <w:instrText xml:space="preserve"> PAGEREF _Toc232419762 \h </w:instrText>
-            </w:r>
-            <w:r>
-              <w:rPr>
-                <w:noProof/>
-                <w:webHidden/>
-              </w:rPr>
-            </w:r>
-            <w:r>
-              <w:rPr>
-                <w:noProof/>
-                <w:webHidden/>
-              </w:rPr>
-              <w:fldChar w:fldCharType="separate"/>
-            </w:r>
-            <w:r>
-              <w:rPr>
-                <w:noProof/>
-                <w:webHidden/>
-              </w:rPr>
-              <w:t>4</w:t>
-            </w:r>
-            <w:r>
-              <w:rPr>
-                <w:noProof/>
-                <w:webHidden/>
-              </w:rPr>
-              <w:fldChar w:fldCharType="end"/>
-            </w:r>
-          </w:hyperlink>
-        </w:p>
-        <w:p>
-          <w:pPr>
-            <w:pStyle w:val="TOC2"/>
-            <w:tabs>
-              <w:tab w:val="left" w:pos="1200"/>
-              <w:tab w:val="right" w:leader="dot" w:pos="9016"/>
-            </w:tabs>
-            <w:rPr>
-              <w:noProof/>
-              <w:kern w:val="2"/>
-              <w:sz w:val="24"/>
-              <w:szCs w:val="24"/>
-              <w:lang w:eastAsia="en-IE"/>
-              <w14:ligatures w14:val="standardContextual"/>
-            </w:rPr>
-          </w:pPr>
-          <w:hyperlink w:anchor="_Toc232419763" w:history="1">
-            <w:r>
-              <w:rPr>
-                <w:rStyle w:val="Hyperlink"/>
-                <w:noProof/>
-              </w:rPr>
-              <w:t>2.1.5.</w:t>
-            </w:r>
-            <w:r>
-              <w:rPr>
-                <w:noProof/>
-                <w:kern w:val="2"/>
-                <w:sz w:val="24"/>
-                <w:szCs w:val="24"/>
-                <w:lang w:eastAsia="en-IE"/>
-                <w14:ligatures w14:val="standardContextual"/>
-              </w:rPr>
-              <w:tab/>
-            </w:r>
-            <w:r>
-              <w:rPr>
-                <w:rStyle w:val="Hyperlink"/>
-                <w:noProof/>
-              </w:rPr>
-              <w:t>Usability Requirements</w:t>
-            </w:r>
-            <w:r>
-              <w:rPr>
-                <w:noProof/>
-                <w:webHidden/>
-              </w:rPr>
-              <w:tab/>
-            </w:r>
-            <w:r>
-              <w:rPr>
-                <w:noProof/>
-                <w:webHidden/>
-              </w:rPr>
-              <w:fldChar w:fldCharType="begin"/>
-            </w:r>
-            <w:r>
-              <w:rPr>
-                <w:noProof/>
-                <w:webHidden/>
-              </w:rPr>
-              <w:instrText xml:space="preserve"> PAGEREF _Toc232419763 \h </w:instrText>
-            </w:r>
-            <w:r>
-              <w:rPr>
-                <w:noProof/>
-                <w:webHidden/>
-              </w:rPr>
-            </w:r>
-            <w:r>
-              <w:rPr>
-                <w:noProof/>
-                <w:webHidden/>
-              </w:rPr>
-              <w:fldChar w:fldCharType="separate"/>
-            </w:r>
-            <w:r>
-              <w:rPr>
-                <w:noProof/>
-                <w:webHidden/>
-              </w:rPr>
-              <w:t>4</w:t>
+              <w:t>8</w:t>
             </w:r>
             <w:r>
               <w:rPr>
@@ -1893,13 +3963,13 @@
               <w14:ligatures w14:val="standardContextual"/>
             </w:rPr>
           </w:pPr>
-          <w:hyperlink w:anchor="_Toc232419764" w:history="1">
+          <w:hyperlink w:anchor="_Toc232424684" w:history="1">
             <w:r>
               <w:rPr>
                 <w:rStyle w:val="Hyperlink"/>
                 <w:noProof/>
               </w:rPr>
-              <w:t>2.1</w:t>
+              <w:t>2.2</w:t>
             </w:r>
             <w:r>
               <w:rPr>
@@ -1938,7 +4008,7 @@
                 <w:noProof/>
                 <w:webHidden/>
               </w:rPr>
-              <w:instrText xml:space="preserve"> PAGEREF _Toc232419764 \h </w:instrText>
+              <w:instrText xml:space="preserve"> PAGEREF _Toc232424684 \h </w:instrText>
             </w:r>
             <w:r>
               <w:rPr>
@@ -1958,7 +4028,7 @@
                 <w:noProof/>
                 <w:webHidden/>
               </w:rPr>
-              <w:t>5</w:t>
+              <w:t>9</w:t>
             </w:r>
             <w:r>
               <w:rPr>
@@ -1985,13 +4055,13 @@
               <w14:ligatures w14:val="standardContextual"/>
             </w:rPr>
           </w:pPr>
-          <w:hyperlink w:anchor="_Toc232419765" w:history="1">
+          <w:hyperlink w:anchor="_Toc232424685" w:history="1">
             <w:r>
               <w:rPr>
                 <w:rStyle w:val="Hyperlink"/>
                 <w:noProof/>
               </w:rPr>
-              <w:t>2.2.</w:t>
+              <w:t>2.3</w:t>
             </w:r>
             <w:r>
               <w:rPr>
@@ -2030,7 +4100,7 @@
                 <w:noProof/>
                 <w:webHidden/>
               </w:rPr>
-              <w:instrText xml:space="preserve"> PAGEREF _Toc232419765 \h </w:instrText>
+              <w:instrText xml:space="preserve"> PAGEREF _Toc232424685 \h </w:instrText>
             </w:r>
             <w:r>
               <w:rPr>
@@ -2050,7 +4120,7 @@
                 <w:noProof/>
                 <w:webHidden/>
               </w:rPr>
-              <w:t>6</w:t>
+              <w:t>10</w:t>
             </w:r>
             <w:r>
               <w:rPr>
@@ -2077,13 +4147,13 @@
               <w14:ligatures w14:val="standardContextual"/>
             </w:rPr>
           </w:pPr>
-          <w:hyperlink w:anchor="_Toc232419766" w:history="1">
+          <w:hyperlink w:anchor="_Toc232424686" w:history="1">
             <w:r>
               <w:rPr>
                 <w:rStyle w:val="Hyperlink"/>
                 <w:noProof/>
               </w:rPr>
-              <w:t>2.2</w:t>
+              <w:t>2.4</w:t>
             </w:r>
             <w:r>
               <w:rPr>
@@ -2122,7 +4192,7 @@
                 <w:noProof/>
                 <w:webHidden/>
               </w:rPr>
-              <w:instrText xml:space="preserve"> PAGEREF _Toc232419766 \h </w:instrText>
+              <w:instrText xml:space="preserve"> PAGEREF _Toc232424686 \h </w:instrText>
             </w:r>
             <w:r>
               <w:rPr>
@@ -2142,7 +4212,7 @@
                 <w:noProof/>
                 <w:webHidden/>
               </w:rPr>
-              <w:t>7</w:t>
+              <w:t>11</w:t>
             </w:r>
             <w:r>
               <w:rPr>
@@ -2169,13 +4239,13 @@
               <w14:ligatures w14:val="standardContextual"/>
             </w:rPr>
           </w:pPr>
-          <w:hyperlink w:anchor="_Toc232419767" w:history="1">
+          <w:hyperlink w:anchor="_Toc232424687" w:history="1">
             <w:r>
               <w:rPr>
                 <w:rStyle w:val="Hyperlink"/>
                 <w:noProof/>
               </w:rPr>
-              <w:t>2.3</w:t>
+              <w:t>2.5</w:t>
             </w:r>
             <w:r>
               <w:rPr>
@@ -2214,7 +4284,7 @@
                 <w:noProof/>
                 <w:webHidden/>
               </w:rPr>
-              <w:instrText xml:space="preserve"> PAGEREF _Toc232419767 \h </w:instrText>
+              <w:instrText xml:space="preserve"> PAGEREF _Toc232424687 \h </w:instrText>
             </w:r>
             <w:r>
               <w:rPr>
@@ -2234,7 +4304,7 @@
                 <w:noProof/>
                 <w:webHidden/>
               </w:rPr>
-              <w:t>8</w:t>
+              <w:t>12</w:t>
             </w:r>
             <w:r>
               <w:rPr>
@@ -2261,13 +4331,13 @@
               <w14:ligatures w14:val="standardContextual"/>
             </w:rPr>
           </w:pPr>
-          <w:hyperlink w:anchor="_Toc232419768" w:history="1">
+          <w:hyperlink w:anchor="_Toc232424688" w:history="1">
             <w:r>
               <w:rPr>
                 <w:rStyle w:val="Hyperlink"/>
                 <w:noProof/>
               </w:rPr>
-              <w:t>2.4</w:t>
+              <w:t>2.6</w:t>
             </w:r>
             <w:r>
               <w:rPr>
@@ -2306,7 +4376,7 @@
                 <w:noProof/>
                 <w:webHidden/>
               </w:rPr>
-              <w:instrText xml:space="preserve"> PAGEREF _Toc232419768 \h </w:instrText>
+              <w:instrText xml:space="preserve"> PAGEREF _Toc232424688 \h </w:instrText>
             </w:r>
             <w:r>
               <w:rPr>
@@ -2326,7 +4396,7 @@
                 <w:noProof/>
                 <w:webHidden/>
               </w:rPr>
-              <w:t>9</w:t>
+              <w:t>13</w:t>
             </w:r>
             <w:r>
               <w:rPr>
@@ -2341,7 +4411,7 @@
           <w:pPr>
             <w:pStyle w:val="TOC1"/>
             <w:tabs>
-              <w:tab w:val="left" w:pos="720"/>
+              <w:tab w:val="left" w:pos="440"/>
               <w:tab w:val="right" w:leader="dot" w:pos="9016"/>
             </w:tabs>
             <w:rPr>
@@ -2353,13 +4423,13 @@
               <w14:ligatures w14:val="standardContextual"/>
             </w:rPr>
           </w:pPr>
-          <w:hyperlink w:anchor="_Toc232419769" w:history="1">
+          <w:hyperlink w:anchor="_Toc232424689" w:history="1">
             <w:r>
               <w:rPr>
                 <w:rStyle w:val="Hyperlink"/>
                 <w:noProof/>
               </w:rPr>
-              <w:t>3.0</w:t>
+              <w:t>3</w:t>
             </w:r>
             <w:r>
               <w:rPr>
@@ -2398,7 +4468,7 @@
                 <w:noProof/>
                 <w:webHidden/>
               </w:rPr>
-              <w:instrText xml:space="preserve"> PAGEREF _Toc232419769 \h </w:instrText>
+              <w:instrText xml:space="preserve"> PAGEREF _Toc232424689 \h </w:instrText>
             </w:r>
             <w:r>
               <w:rPr>
@@ -2418,7 +4488,7 @@
                 <w:noProof/>
                 <w:webHidden/>
               </w:rPr>
-              <w:t>10</w:t>
+              <w:t>14</w:t>
             </w:r>
             <w:r>
               <w:rPr>
@@ -2433,7 +4503,7 @@
           <w:pPr>
             <w:pStyle w:val="TOC1"/>
             <w:tabs>
-              <w:tab w:val="left" w:pos="720"/>
+              <w:tab w:val="left" w:pos="440"/>
               <w:tab w:val="right" w:leader="dot" w:pos="9016"/>
             </w:tabs>
             <w:rPr>
@@ -2445,13 +4515,13 @@
               <w14:ligatures w14:val="standardContextual"/>
             </w:rPr>
           </w:pPr>
-          <w:hyperlink w:anchor="_Toc232419770" w:history="1">
+          <w:hyperlink w:anchor="_Toc232424690" w:history="1">
             <w:r>
               <w:rPr>
                 <w:rStyle w:val="Hyperlink"/>
                 <w:noProof/>
               </w:rPr>
-              <w:t>4.0</w:t>
+              <w:t>4</w:t>
             </w:r>
             <w:r>
               <w:rPr>
@@ -2490,7 +4560,7 @@
                 <w:noProof/>
                 <w:webHidden/>
               </w:rPr>
-              <w:instrText xml:space="preserve"> PAGEREF _Toc232419770 \h </w:instrText>
+              <w:instrText xml:space="preserve"> PAGEREF _Toc232424690 \h </w:instrText>
             </w:r>
             <w:r>
               <w:rPr>
@@ -2510,7 +4580,7 @@
                 <w:noProof/>
                 <w:webHidden/>
               </w:rPr>
-              <w:t>11</w:t>
+              <w:t>15</w:t>
             </w:r>
             <w:r>
               <w:rPr>
@@ -2525,7 +4595,7 @@
           <w:pPr>
             <w:pStyle w:val="TOC1"/>
             <w:tabs>
-              <w:tab w:val="left" w:pos="720"/>
+              <w:tab w:val="left" w:pos="440"/>
               <w:tab w:val="right" w:leader="dot" w:pos="9016"/>
             </w:tabs>
             <w:rPr>
@@ -2537,13 +4607,13 @@
               <w14:ligatures w14:val="standardContextual"/>
             </w:rPr>
           </w:pPr>
-          <w:hyperlink w:anchor="_Toc232419771" w:history="1">
+          <w:hyperlink w:anchor="_Toc232424691" w:history="1">
             <w:r>
               <w:rPr>
                 <w:rStyle w:val="Hyperlink"/>
                 <w:noProof/>
               </w:rPr>
-              <w:t>5.0</w:t>
+              <w:t>5</w:t>
             </w:r>
             <w:r>
               <w:rPr>
@@ -2582,7 +4652,7 @@
                 <w:noProof/>
                 <w:webHidden/>
               </w:rPr>
-              <w:instrText xml:space="preserve"> PAGEREF _Toc232419771 \h </w:instrText>
+              <w:instrText xml:space="preserve"> PAGEREF _Toc232424691 \h </w:instrText>
             </w:r>
             <w:r>
               <w:rPr>
@@ -2602,7 +4672,7 @@
                 <w:noProof/>
                 <w:webHidden/>
               </w:rPr>
-              <w:t>12</w:t>
+              <w:t>16</w:t>
             </w:r>
             <w:r>
               <w:rPr>
@@ -2617,7 +4687,7 @@
           <w:pPr>
             <w:pStyle w:val="TOC1"/>
             <w:tabs>
-              <w:tab w:val="left" w:pos="720"/>
+              <w:tab w:val="left" w:pos="440"/>
               <w:tab w:val="right" w:leader="dot" w:pos="9016"/>
             </w:tabs>
             <w:rPr>
@@ -2629,13 +4699,13 @@
               <w14:ligatures w14:val="standardContextual"/>
             </w:rPr>
           </w:pPr>
-          <w:hyperlink w:anchor="_Toc232419772" w:history="1">
+          <w:hyperlink w:anchor="_Toc232424692" w:history="1">
             <w:r>
               <w:rPr>
                 <w:rStyle w:val="Hyperlink"/>
                 <w:noProof/>
               </w:rPr>
-              <w:t>6.0</w:t>
+              <w:t>6</w:t>
             </w:r>
             <w:r>
               <w:rPr>
@@ -2674,7 +4744,7 @@
                 <w:noProof/>
                 <w:webHidden/>
               </w:rPr>
-              <w:instrText xml:space="preserve"> PAGEREF _Toc232419772 \h </w:instrText>
+              <w:instrText xml:space="preserve"> PAGEREF _Toc232424692 \h </w:instrText>
             </w:r>
             <w:r>
               <w:rPr>
@@ -2694,7 +4764,7 @@
                 <w:noProof/>
                 <w:webHidden/>
               </w:rPr>
-              <w:t>13</w:t>
+              <w:t>17</w:t>
             </w:r>
             <w:r>
               <w:rPr>
@@ -2721,13 +4791,13 @@
               <w14:ligatures w14:val="standardContextual"/>
             </w:rPr>
           </w:pPr>
-          <w:hyperlink w:anchor="_Toc232419773" w:history="1">
+          <w:hyperlink w:anchor="_Toc232424693" w:history="1">
             <w:r>
               <w:rPr>
                 <w:rStyle w:val="Hyperlink"/>
                 <w:noProof/>
               </w:rPr>
-              <w:t>6.1.</w:t>
+              <w:t>6.1</w:t>
             </w:r>
             <w:r>
               <w:rPr>
@@ -2766,7 +4836,7 @@
                 <w:noProof/>
                 <w:webHidden/>
               </w:rPr>
-              <w:instrText xml:space="preserve"> PAGEREF _Toc232419773 \h </w:instrText>
+              <w:instrText xml:space="preserve"> PAGEREF _Toc232424693 \h </w:instrText>
             </w:r>
             <w:r>
               <w:rPr>
@@ -2786,7 +4856,7 @@
                 <w:noProof/>
                 <w:webHidden/>
               </w:rPr>
-              <w:t>13</w:t>
+              <w:t>17</w:t>
             </w:r>
             <w:r>
               <w:rPr>
@@ -2813,13 +4883,13 @@
               <w14:ligatures w14:val="standardContextual"/>
             </w:rPr>
           </w:pPr>
-          <w:hyperlink w:anchor="_Toc232419774" w:history="1">
+          <w:hyperlink w:anchor="_Toc232424694" w:history="1">
             <w:r>
               <w:rPr>
                 <w:rStyle w:val="Hyperlink"/>
                 <w:noProof/>
               </w:rPr>
-              <w:t>6.1.</w:t>
+              <w:t>6.2</w:t>
             </w:r>
             <w:r>
               <w:rPr>
@@ -2837,7 +4907,7 @@
                 <w:rStyle w:val="Hyperlink"/>
                 <w:noProof/>
               </w:rPr>
-              <w:t>Ethics Approval Application (only if required)</w:t>
+              <w:t>Reflective Journals</w:t>
             </w:r>
             <w:r>
               <w:rPr>
@@ -2858,7 +4928,7 @@
                 <w:noProof/>
                 <w:webHidden/>
               </w:rPr>
-              <w:instrText xml:space="preserve"> PAGEREF _Toc232419774 \h </w:instrText>
+              <w:instrText xml:space="preserve"> PAGEREF _Toc232424694 \h </w:instrText>
             </w:r>
             <w:r>
               <w:rPr>
@@ -2878,7 +4948,7 @@
                 <w:noProof/>
                 <w:webHidden/>
               </w:rPr>
-              <w:t>13</w:t>
+              <w:t>17</w:t>
             </w:r>
             <w:r>
               <w:rPr>
@@ -2905,13 +4975,13 @@
               <w14:ligatures w14:val="standardContextual"/>
             </w:rPr>
           </w:pPr>
-          <w:hyperlink w:anchor="_Toc232419775" w:history="1">
+          <w:hyperlink w:anchor="_Toc232424695" w:history="1">
             <w:r>
               <w:rPr>
                 <w:rStyle w:val="Hyperlink"/>
                 <w:noProof/>
               </w:rPr>
-              <w:t>6.2.</w:t>
+              <w:t>6.3</w:t>
             </w:r>
             <w:r>
               <w:rPr>
@@ -2929,7 +4999,7 @@
                 <w:rStyle w:val="Hyperlink"/>
                 <w:noProof/>
               </w:rPr>
-              <w:t>Reflective Journals</w:t>
+              <w:t>Other materials used</w:t>
             </w:r>
             <w:r>
               <w:rPr>
@@ -2950,7 +5020,7 @@
                 <w:noProof/>
                 <w:webHidden/>
               </w:rPr>
-              <w:instrText xml:space="preserve"> PAGEREF _Toc232419775 \h </w:instrText>
+              <w:instrText xml:space="preserve"> PAGEREF _Toc232424695 \h </w:instrText>
             </w:r>
             <w:r>
               <w:rPr>
@@ -2970,99 +5040,7 @@
                 <w:noProof/>
                 <w:webHidden/>
               </w:rPr>
-              <w:t>13</w:t>
-            </w:r>
-            <w:r>
-              <w:rPr>
-                <w:noProof/>
-                <w:webHidden/>
-              </w:rPr>
-              <w:fldChar w:fldCharType="end"/>
-            </w:r>
-          </w:hyperlink>
-        </w:p>
-        <w:p>
-          <w:pPr>
-            <w:pStyle w:val="TOC2"/>
-            <w:tabs>
-              <w:tab w:val="left" w:pos="960"/>
-              <w:tab w:val="right" w:leader="dot" w:pos="9016"/>
-            </w:tabs>
-            <w:rPr>
-              <w:noProof/>
-              <w:kern w:val="2"/>
-              <w:sz w:val="24"/>
-              <w:szCs w:val="24"/>
-              <w:lang w:eastAsia="en-IE"/>
-              <w14:ligatures w14:val="standardContextual"/>
-            </w:rPr>
-          </w:pPr>
-          <w:hyperlink w:anchor="_Toc232419776" w:history="1">
-            <w:r>
-              <w:rPr>
-                <w:rStyle w:val="Hyperlink"/>
-                <w:noProof/>
-              </w:rPr>
-              <w:t>6.3.</w:t>
-            </w:r>
-            <w:r>
-              <w:rPr>
-                <w:noProof/>
-                <w:kern w:val="2"/>
-                <w:sz w:val="24"/>
-                <w:szCs w:val="24"/>
-                <w:lang w:eastAsia="en-IE"/>
-                <w14:ligatures w14:val="standardContextual"/>
-              </w:rPr>
-              <w:tab/>
-            </w:r>
-            <w:r>
-              <w:rPr>
-                <w:rStyle w:val="Hyperlink"/>
-                <w:noProof/>
-              </w:rPr>
-              <w:t>Other materials used</w:t>
-            </w:r>
-            <w:r>
-              <w:rPr>
-                <w:noProof/>
-                <w:webHidden/>
-              </w:rPr>
-              <w:tab/>
-            </w:r>
-            <w:r>
-              <w:rPr>
-                <w:noProof/>
-                <w:webHidden/>
-              </w:rPr>
-              <w:fldChar w:fldCharType="begin"/>
-            </w:r>
-            <w:r>
-              <w:rPr>
-                <w:noProof/>
-                <w:webHidden/>
-              </w:rPr>
-              <w:instrText xml:space="preserve"> PAGEREF _Toc232419776 \h </w:instrText>
-            </w:r>
-            <w:r>
-              <w:rPr>
-                <w:noProof/>
-                <w:webHidden/>
-              </w:rPr>
-            </w:r>
-            <w:r>
-              <w:rPr>
-                <w:noProof/>
-                <w:webHidden/>
-              </w:rPr>
-              <w:fldChar w:fldCharType="separate"/>
-            </w:r>
-            <w:r>
-              <w:rPr>
-                <w:noProof/>
-                <w:webHidden/>
-              </w:rPr>
-              <w:t>13</w:t>
+              <w:t>17</w:t>
             </w:r>
             <w:r>
               <w:rPr>
@@ -3092,6 +5070,23 @@
     </w:sdt>
     <w:p>
       <w:pPr>
+        <w:rPr>
+          <w:rFonts w:asciiTheme="majorHAnsi" w:eastAsiaTheme="majorEastAsia" w:hAnsiTheme="majorHAnsi" w:cstheme="majorBidi"/>
+          <w:b/>
+          <w:bCs/>
+          <w:smallCaps/>
+          <w:color w:val="000000" w:themeColor="text1"/>
+          <w:sz w:val="36"/>
+          <w:szCs w:val="36"/>
+        </w:rPr>
+      </w:pPr>
+      <w:bookmarkStart w:id="0" w:name="_Toc232424671"/>
+      <w:r>
+        <w:br w:type="page"/>
+      </w:r>
+    </w:p>
+    <w:p>
+      <w:pPr>
         <w:pStyle w:val="Heading1"/>
         <w:numPr>
           <w:ilvl w:val="0"/>
@@ -3099,7 +5094,6 @@
         </w:numPr>
         <w:ind w:left="432"/>
       </w:pPr>
-      <w:bookmarkStart w:id="0" w:name="_Toc232419747"/>
       <w:r>
         <w:lastRenderedPageBreak/>
         <w:t>Executive Summary</w:t>
@@ -3139,7 +5133,7 @@
       <w:pPr>
         <w:pStyle w:val="Heading1"/>
       </w:pPr>
-      <w:bookmarkStart w:id="1" w:name="_Toc232419748"/>
+      <w:bookmarkStart w:id="1" w:name="_Toc232424672"/>
       <w:r>
         <w:t>Introduction</w:t>
       </w:r>
@@ -3149,7 +5143,7 @@
       <w:pPr>
         <w:pStyle w:val="Heading2"/>
       </w:pPr>
-      <w:bookmarkStart w:id="2" w:name="_Toc232419749"/>
+      <w:bookmarkStart w:id="2" w:name="_Toc232424673"/>
       <w:r>
         <w:t>Background</w:t>
       </w:r>
@@ -3176,7 +5170,7 @@
       <w:pPr>
         <w:pStyle w:val="Heading2"/>
       </w:pPr>
-      <w:bookmarkStart w:id="3" w:name="_Toc232419750"/>
+      <w:bookmarkStart w:id="3" w:name="_Toc232424674"/>
       <w:r>
         <w:t>Aims</w:t>
       </w:r>
@@ -3203,7 +5197,7 @@
       <w:pPr>
         <w:pStyle w:val="Heading2"/>
       </w:pPr>
-      <w:bookmarkStart w:id="4" w:name="_Toc232419751"/>
+      <w:bookmarkStart w:id="4" w:name="_Toc232424675"/>
       <w:r>
         <w:t>Technology</w:t>
       </w:r>
@@ -3230,7 +5224,7 @@
       <w:pPr>
         <w:pStyle w:val="Heading2"/>
       </w:pPr>
-      <w:bookmarkStart w:id="5" w:name="_Toc232419752"/>
+      <w:bookmarkStart w:id="5" w:name="_Toc232424676"/>
       <w:r>
         <w:t>Structure</w:t>
       </w:r>
@@ -3257,7 +5251,7 @@
       <w:pPr>
         <w:pStyle w:val="Heading1"/>
       </w:pPr>
-      <w:bookmarkStart w:id="6" w:name="_Toc232419753"/>
+      <w:bookmarkStart w:id="6" w:name="_Toc232424677"/>
       <w:r>
         <w:t>System</w:t>
       </w:r>
@@ -3267,7 +5261,7 @@
       <w:pPr>
         <w:pStyle w:val="Heading2"/>
       </w:pPr>
-      <w:bookmarkStart w:id="7" w:name="_Toc232419754"/>
+      <w:bookmarkStart w:id="7" w:name="_Toc232424678"/>
       <w:r>
         <w:t>Requirements</w:t>
       </w:r>
@@ -3295,7 +5289,7 @@
       <w:pPr>
         <w:pStyle w:val="Heading3"/>
       </w:pPr>
-      <w:bookmarkStart w:id="8" w:name="_Toc232419755"/>
+      <w:bookmarkStart w:id="8" w:name="_Toc232424679"/>
       <w:r>
         <w:t>Functional Requirements</w:t>
       </w:r>
@@ -3391,18 +5385,15 @@
       <w:pPr>
         <w:pStyle w:val="Heading4"/>
       </w:pPr>
-      <w:bookmarkStart w:id="9" w:name="_Toc232419756"/>
       <w:r>
         <w:lastRenderedPageBreak/>
         <w:t>Use Case Diagram</w:t>
       </w:r>
-      <w:bookmarkEnd w:id="9"/>
     </w:p>
     <w:p>
       <w:pPr>
         <w:pStyle w:val="Heading4"/>
       </w:pPr>
-      <w:bookmarkStart w:id="10" w:name="_Toc232419757"/>
       <w:r>
         <w:t xml:space="preserve">Requirement 1 </w:t>
       </w:r>
@@ -3412,7 +5403,6 @@
         </w:rPr>
         <w:t>&lt;Name of requirement in a few words&gt;</w:t>
       </w:r>
-      <w:bookmarkEnd w:id="10"/>
     </w:p>
     <w:p>
       <w:pPr>
@@ -3435,11 +5425,9 @@
       <w:pPr>
         <w:pStyle w:val="Heading4"/>
       </w:pPr>
-      <w:bookmarkStart w:id="11" w:name="_Toc232419758"/>
       <w:r>
         <w:t>Description &amp; Priority</w:t>
       </w:r>
-      <w:bookmarkEnd w:id="11"/>
     </w:p>
     <w:p>
       <w:pPr>
@@ -3454,18 +5442,11 @@
     </w:p>
     <w:p>
       <w:pPr>
-        <w:ind w:left="720"/>
-      </w:pPr>
-    </w:p>
-    <w:p>
-      <w:pPr>
         <w:pStyle w:val="Heading4"/>
       </w:pPr>
-      <w:bookmarkStart w:id="12" w:name="_Toc232419759"/>
       <w:r>
         <w:t>Use Case</w:t>
       </w:r>
-      <w:bookmarkEnd w:id="12"/>
     </w:p>
     <w:p>
       <w:pPr>
@@ -4117,6 +6098,7 @@
         <w:pStyle w:val="Heading6"/>
       </w:pPr>
       <w:r>
+        <w:lastRenderedPageBreak/>
         <w:t>Termination</w:t>
       </w:r>
     </w:p>
@@ -4195,44 +6177,44 @@
       <w:pPr>
         <w:pStyle w:val="Heading3"/>
       </w:pPr>
-      <w:bookmarkStart w:id="13" w:name="_Toc232419760"/>
+      <w:bookmarkStart w:id="9" w:name="_Toc232424680"/>
       <w:r>
         <w:t>Data Requirements</w:t>
       </w:r>
-      <w:bookmarkEnd w:id="13"/>
+      <w:bookmarkEnd w:id="9"/>
     </w:p>
     <w:p/>
     <w:p>
       <w:pPr>
         <w:pStyle w:val="Heading3"/>
       </w:pPr>
-      <w:bookmarkStart w:id="14" w:name="_Toc232419761"/>
+      <w:bookmarkStart w:id="10" w:name="_Toc232424681"/>
       <w:r>
         <w:t>User Requirements</w:t>
       </w:r>
-      <w:bookmarkEnd w:id="14"/>
+      <w:bookmarkEnd w:id="10"/>
     </w:p>
     <w:p/>
     <w:p>
       <w:pPr>
         <w:pStyle w:val="Heading3"/>
       </w:pPr>
-      <w:bookmarkStart w:id="15" w:name="_Toc232419762"/>
+      <w:bookmarkStart w:id="11" w:name="_Toc232424682"/>
       <w:r>
         <w:t>Environmental Requirements</w:t>
       </w:r>
-      <w:bookmarkEnd w:id="15"/>
+      <w:bookmarkEnd w:id="11"/>
     </w:p>
     <w:p/>
     <w:p>
       <w:pPr>
         <w:pStyle w:val="Heading3"/>
       </w:pPr>
-      <w:bookmarkStart w:id="16" w:name="_Toc232419763"/>
+      <w:bookmarkStart w:id="12" w:name="_Toc232424683"/>
       <w:r>
         <w:t>Usability Requirements</w:t>
       </w:r>
-      <w:bookmarkEnd w:id="16"/>
+      <w:bookmarkEnd w:id="12"/>
     </w:p>
     <w:p/>
     <w:p>
@@ -4256,12 +6238,12 @@
       <w:pPr>
         <w:pStyle w:val="Heading2"/>
       </w:pPr>
-      <w:bookmarkStart w:id="17" w:name="_Toc232419764"/>
+      <w:bookmarkStart w:id="13" w:name="_Toc232424684"/>
       <w:r>
         <w:lastRenderedPageBreak/>
         <w:t>Design &amp; Architecture</w:t>
       </w:r>
-      <w:bookmarkEnd w:id="17"/>
+      <w:bookmarkEnd w:id="13"/>
     </w:p>
     <w:p>
       <w:pPr>
@@ -4322,12 +6304,12 @@
       <w:pPr>
         <w:pStyle w:val="Heading2"/>
       </w:pPr>
-      <w:bookmarkStart w:id="18" w:name="_Toc232419765"/>
+      <w:bookmarkStart w:id="14" w:name="_Toc232424685"/>
       <w:r>
         <w:lastRenderedPageBreak/>
         <w:t>Implementation</w:t>
       </w:r>
-      <w:bookmarkEnd w:id="18"/>
+      <w:bookmarkEnd w:id="14"/>
     </w:p>
     <w:p>
       <w:pPr>
@@ -4391,7 +6373,7 @@
                     </pic:cNvPicPr>
                   </pic:nvPicPr>
                   <pic:blipFill>
-                    <a:blip r:embed="rId12">
+                    <a:blip r:embed="rId14">
                       <a:extLst>
                         <a:ext uri="{28A0092B-C50C-407E-A947-70E740481C1C}">
                           <a14:useLocalDpi xmlns:a14="http://schemas.microsoft.com/office/drawing/2010/main" val="0"/>
@@ -4444,12 +6426,12 @@
       <w:pPr>
         <w:pStyle w:val="Heading2"/>
       </w:pPr>
-      <w:bookmarkStart w:id="19" w:name="_Toc232419766"/>
+      <w:bookmarkStart w:id="15" w:name="_Toc232424686"/>
       <w:r>
         <w:lastRenderedPageBreak/>
         <w:t>Graphical User Interface (GUI)</w:t>
       </w:r>
-      <w:bookmarkEnd w:id="19"/>
+      <w:bookmarkEnd w:id="15"/>
     </w:p>
     <w:p>
       <w:pPr>
@@ -4494,12 +6476,12 @@
       <w:pPr>
         <w:pStyle w:val="Heading2"/>
       </w:pPr>
-      <w:bookmarkStart w:id="20" w:name="_Toc232419767"/>
+      <w:bookmarkStart w:id="16" w:name="_Toc232424687"/>
       <w:r>
         <w:lastRenderedPageBreak/>
         <w:t>Testing</w:t>
       </w:r>
-      <w:bookmarkEnd w:id="20"/>
+      <w:bookmarkEnd w:id="16"/>
     </w:p>
     <w:p>
       <w:pPr>
@@ -4539,12 +6521,12 @@
       <w:pPr>
         <w:pStyle w:val="Heading2"/>
       </w:pPr>
-      <w:bookmarkStart w:id="21" w:name="_Toc232419768"/>
+      <w:bookmarkStart w:id="17" w:name="_Toc232424688"/>
       <w:r>
         <w:lastRenderedPageBreak/>
         <w:t>Evaluation</w:t>
       </w:r>
-      <w:bookmarkEnd w:id="21"/>
+      <w:bookmarkEnd w:id="17"/>
     </w:p>
     <w:p>
       <w:pPr>
@@ -4614,12 +6596,12 @@
       <w:pPr>
         <w:pStyle w:val="Heading1"/>
       </w:pPr>
-      <w:bookmarkStart w:id="22" w:name="_Toc232419769"/>
+      <w:bookmarkStart w:id="18" w:name="_Toc232424689"/>
       <w:r>
         <w:lastRenderedPageBreak/>
         <w:t>Conclusions</w:t>
       </w:r>
-      <w:bookmarkEnd w:id="22"/>
+      <w:bookmarkEnd w:id="18"/>
     </w:p>
     <w:p>
       <w:pPr>
@@ -4670,12 +6652,12 @@
       <w:pPr>
         <w:pStyle w:val="Heading1"/>
       </w:pPr>
-      <w:bookmarkStart w:id="23" w:name="_Toc232419770"/>
+      <w:bookmarkStart w:id="19" w:name="_Toc232424690"/>
       <w:r>
         <w:lastRenderedPageBreak/>
         <w:t>Further Development or Research</w:t>
       </w:r>
-      <w:bookmarkEnd w:id="23"/>
+      <w:bookmarkEnd w:id="19"/>
     </w:p>
     <w:p>
       <w:pPr>
@@ -4710,12 +6692,12 @@
       <w:pPr>
         <w:pStyle w:val="Heading1"/>
       </w:pPr>
-      <w:bookmarkStart w:id="24" w:name="_Toc232419771"/>
+      <w:bookmarkStart w:id="20" w:name="_Toc232424691"/>
       <w:r>
         <w:lastRenderedPageBreak/>
         <w:t>References</w:t>
       </w:r>
-      <w:bookmarkEnd w:id="24"/>
+      <w:bookmarkEnd w:id="20"/>
     </w:p>
     <w:p>
       <w:pPr>
@@ -4732,7 +6714,7 @@
         </w:rPr>
         <w:t xml:space="preserve">Please include references throughout your document where appropriate. See </w:t>
       </w:r>
-      <w:hyperlink r:id="rId13" w:history="1">
+      <w:hyperlink r:id="rId15" w:history="1">
         <w:r>
           <w:rPr>
             <w:rStyle w:val="Hyperlink"/>
@@ -4769,57 +6751,57 @@
       <w:pPr>
         <w:pStyle w:val="Heading1"/>
       </w:pPr>
-      <w:bookmarkStart w:id="25" w:name="_Toc232419772"/>
+      <w:bookmarkStart w:id="21" w:name="_Toc232424692"/>
       <w:r>
         <w:lastRenderedPageBreak/>
         <w:t>Appendices</w:t>
       </w:r>
+      <w:bookmarkEnd w:id="21"/>
+    </w:p>
+    <w:p>
+      <w:r>
+        <w:rPr>
+          <w:highlight w:val="yellow"/>
+        </w:rPr>
+        <w:t>This section should contain information that is supplementary to the main body of the report.</w:t>
+      </w:r>
+      <w:r>
+        <w:t xml:space="preserve">  </w:t>
+      </w:r>
+    </w:p>
+    <w:p>
+      <w:pPr>
+        <w:pStyle w:val="Heading2"/>
+      </w:pPr>
+      <w:bookmarkStart w:id="22" w:name="_Toc232424693"/>
+      <w:r>
+        <w:t>Project Proposal</w:t>
+      </w:r>
+      <w:bookmarkEnd w:id="22"/>
+    </w:p>
+    <w:p>
+      <w:pPr>
+        <w:pStyle w:val="Heading2"/>
+      </w:pPr>
+      <w:bookmarkStart w:id="23" w:name="_Toc232424694"/>
+      <w:r>
+        <w:t>Reflective Journals</w:t>
+      </w:r>
+      <w:bookmarkStart w:id="24" w:name="_Toc51711499"/>
+      <w:bookmarkEnd w:id="23"/>
+    </w:p>
+    <w:p>
+      <w:pPr>
+        <w:pStyle w:val="Heading2"/>
+      </w:pPr>
+      <w:bookmarkStart w:id="25" w:name="_Toc232424695"/>
+      <w:bookmarkEnd w:id="24"/>
+      <w:r>
+        <w:t>Other materials used</w:t>
+      </w:r>
       <w:bookmarkEnd w:id="25"/>
     </w:p>
     <w:p>
-      <w:r>
-        <w:rPr>
-          <w:highlight w:val="yellow"/>
-        </w:rPr>
-        <w:t>This section should contain information that is supplementary to the main body of the report.</w:t>
-      </w:r>
-      <w:r>
-        <w:t xml:space="preserve">  </w:t>
-      </w:r>
-    </w:p>
-    <w:p>
-      <w:pPr>
-        <w:pStyle w:val="Heading2"/>
-      </w:pPr>
-      <w:bookmarkStart w:id="26" w:name="_Toc232419773"/>
-      <w:r>
-        <w:t>Project Proposal</w:t>
-      </w:r>
-      <w:bookmarkEnd w:id="26"/>
-    </w:p>
-    <w:p>
-      <w:pPr>
-        <w:pStyle w:val="Heading2"/>
-      </w:pPr>
-      <w:bookmarkStart w:id="27" w:name="_Toc232419775"/>
-      <w:r>
-        <w:t>Reflective Journals</w:t>
-      </w:r>
-      <w:bookmarkStart w:id="28" w:name="_Toc51711499"/>
-      <w:bookmarkEnd w:id="27"/>
-    </w:p>
-    <w:p>
-      <w:pPr>
-        <w:pStyle w:val="Heading2"/>
-      </w:pPr>
-      <w:bookmarkStart w:id="29" w:name="_Toc232419776"/>
-      <w:bookmarkEnd w:id="28"/>
-      <w:r>
-        <w:t>Other materials used</w:t>
-      </w:r>
-      <w:bookmarkEnd w:id="29"/>
-    </w:p>
-    <w:p>
       <w:pPr>
         <w:ind w:firstLine="360"/>
         <w:rPr>
@@ -4836,7 +6818,7 @@
       </w:r>
     </w:p>
     <w:sectPr>
-      <w:footerReference w:type="default" r:id="rId14"/>
+      <w:footerReference w:type="default" r:id="rId16"/>
       <w:pgSz w:w="11906" w:h="16838" w:code="9"/>
       <w:pgMar w:top="1440" w:right="1440" w:bottom="1440" w:left="1440" w:header="709" w:footer="709" w:gutter="0"/>
       <w:pgNumType w:start="0"/>
@@ -5902,7 +7884,7 @@
     <w:lsdException w:name="List Number 3" w:semiHidden="1" w:unhideWhenUsed="1"/>
     <w:lsdException w:name="List Number 4" w:semiHidden="1" w:unhideWhenUsed="1"/>
     <w:lsdException w:name="List Number 5" w:semiHidden="1" w:unhideWhenUsed="1"/>
-    <w:lsdException w:name="Title" w:uiPriority="10" w:qFormat="1"/>
+    <w:lsdException w:name="Title" w:uiPriority="0" w:qFormat="1"/>
     <w:lsdException w:name="Closing" w:semiHidden="1" w:unhideWhenUsed="1"/>
     <w:lsdException w:name="Signature" w:semiHidden="1" w:unhideWhenUsed="1"/>
     <w:lsdException w:name="Default Paragraph Font" w:semiHidden="1" w:uiPriority="1" w:unhideWhenUsed="1"/>
@@ -6823,7 +8805,6 @@
     <w:basedOn w:val="Normal"/>
     <w:next w:val="Normal"/>
     <w:link w:val="TitleChar"/>
-    <w:uiPriority w:val="10"/>
     <w:qFormat/>
     <w:rsid w:val="00D7483C"/>
     <w:pPr>
@@ -6841,7 +8822,6 @@
     <w:name w:val="Title Char"/>
     <w:basedOn w:val="DefaultParagraphFont"/>
     <w:link w:val="Title"/>
-    <w:uiPriority w:val="10"/>
     <w:rsid w:val="00D7483C"/>
     <w:rPr>
       <w:rFonts w:asciiTheme="majorHAnsi" w:eastAsiaTheme="majorEastAsia" w:hAnsiTheme="majorHAnsi" w:cstheme="majorBidi"/>
@@ -7026,6 +9006,39 @@
       <w:smallCaps/>
       <w:spacing w:val="5"/>
     </w:rPr>
+  </w:style>
+  <w:style w:type="paragraph" w:styleId="BodyText">
+    <w:name w:val="Body Text"/>
+    <w:basedOn w:val="Normal"/>
+    <w:link w:val="BodyTextChar"/>
+    <w:uiPriority w:val="99"/>
+    <w:semiHidden/>
+    <w:unhideWhenUsed/>
+    <w:rsid w:val="000D08EE"/>
+    <w:pPr>
+      <w:spacing w:after="120"/>
+    </w:pPr>
+  </w:style>
+  <w:style w:type="character" w:customStyle="1" w:styleId="BodyTextChar">
+    <w:name w:val="Body Text Char"/>
+    <w:basedOn w:val="DefaultParagraphFont"/>
+    <w:link w:val="BodyText"/>
+    <w:uiPriority w:val="99"/>
+    <w:semiHidden/>
+    <w:rsid w:val="000D08EE"/>
+  </w:style>
+  <w:style w:type="paragraph" w:styleId="TOC3">
+    <w:name w:val="toc 3"/>
+    <w:basedOn w:val="Normal"/>
+    <w:next w:val="Normal"/>
+    <w:autoRedefine/>
+    <w:uiPriority w:val="39"/>
+    <w:unhideWhenUsed/>
+    <w:rsid w:val="00AF1EDA"/>
+    <w:pPr>
+      <w:spacing w:after="100"/>
+      <w:ind w:left="440"/>
+    </w:pPr>
   </w:style>
 </w:styles>
 </file>
@@ -7326,19 +9339,6 @@
 </file>
 
 <file path=customXml/item1.xml><?xml version="1.0" encoding="utf-8"?>
-<?mso-contentType ?>
-<FormTemplates xmlns="http://schemas.microsoft.com/sharepoint/v3/contenttype/forms">
-  <Display>DocumentLibraryForm</Display>
-  <Edit>DocumentLibraryForm</Edit>
-  <New>DocumentLibraryForm</New>
-</FormTemplates>
-</file>
-
-<file path=customXml/item2.xml><?xml version="1.0" encoding="utf-8"?>
-<b:Sources xmlns:b="http://schemas.openxmlformats.org/officeDocument/2006/bibliography" xmlns="http://schemas.openxmlformats.org/officeDocument/2006/bibliography" SelectedStyle="\HarvardAnglia2008OfficeOnline.xsl" StyleName="Harvard - Anglia" Version="2008"/>
-</file>
-
-<file path=customXml/item3.xml><?xml version="1.0" encoding="utf-8"?>
 <p:properties xmlns:p="http://schemas.microsoft.com/office/2006/metadata/properties" xmlns:xsi="http://www.w3.org/2001/XMLSchema-instance" xmlns:pc="http://schemas.microsoft.com/office/infopath/2007/PartnerControls">
   <documentManagement>
     <Teams_Channel_Section_Location xmlns="ac56161a-35a2-4bac-99b6-8739237dc4f6" xsi:nil="true"/>
@@ -7388,6 +9388,19 @@
     <Templates xmlns="ac56161a-35a2-4bac-99b6-8739237dc4f6" xsi:nil="true"/>
   </documentManagement>
 </p:properties>
+</file>
+
+<file path=customXml/item2.xml><?xml version="1.0" encoding="utf-8"?>
+<b:Sources xmlns:b="http://schemas.openxmlformats.org/officeDocument/2006/bibliography" xmlns="http://schemas.openxmlformats.org/officeDocument/2006/bibliography" SelectedStyle="\HarvardAnglia2008OfficeOnline.xsl" StyleName="Harvard - Anglia" Version="2008"/>
+</file>
+
+<file path=customXml/item3.xml><?xml version="1.0" encoding="utf-8"?>
+<?mso-contentType ?>
+<FormTemplates xmlns="http://schemas.microsoft.com/sharepoint/v3/contenttype/forms">
+  <Display>DocumentLibraryForm</Display>
+  <Edit>DocumentLibraryForm</Edit>
+  <New>DocumentLibraryForm</New>
+</FormTemplates>
 </file>
 
 <file path=customXml/item4.xml><?xml version="1.0" encoding="utf-8"?>
@@ -7808,9 +9821,11 @@
 </file>
 
 <file path=customXml/itemProps1.xml><?xml version="1.0" encoding="utf-8"?>
-<ds:datastoreItem xmlns:ds="http://schemas.openxmlformats.org/officeDocument/2006/customXml" ds:itemID="{9B975280-634C-49AE-9293-B75FDC4277EB}">
+<ds:datastoreItem xmlns:ds="http://schemas.openxmlformats.org/officeDocument/2006/customXml" ds:itemID="{5C51FF54-1CBD-43E8-9B2A-B56F20CDF09A}">
   <ds:schemaRefs>
-    <ds:schemaRef ds:uri="http://schemas.microsoft.com/sharepoint/v3/contenttype/forms"/>
+    <ds:schemaRef ds:uri="http://schemas.microsoft.com/office/2006/metadata/properties"/>
+    <ds:schemaRef ds:uri="http://schemas.microsoft.com/office/infopath/2007/PartnerControls"/>
+    <ds:schemaRef ds:uri="ac56161a-35a2-4bac-99b6-8739237dc4f6"/>
   </ds:schemaRefs>
 </ds:datastoreItem>
 </file>
@@ -7824,11 +9839,9 @@
 </file>
 
 <file path=customXml/itemProps3.xml><?xml version="1.0" encoding="utf-8"?>
-<ds:datastoreItem xmlns:ds="http://schemas.openxmlformats.org/officeDocument/2006/customXml" ds:itemID="{5C51FF54-1CBD-43E8-9B2A-B56F20CDF09A}">
+<ds:datastoreItem xmlns:ds="http://schemas.openxmlformats.org/officeDocument/2006/customXml" ds:itemID="{9B975280-634C-49AE-9293-B75FDC4277EB}">
   <ds:schemaRefs>
-    <ds:schemaRef ds:uri="http://schemas.microsoft.com/office/2006/metadata/properties"/>
-    <ds:schemaRef ds:uri="http://schemas.microsoft.com/office/infopath/2007/PartnerControls"/>
-    <ds:schemaRef ds:uri="ac56161a-35a2-4bac-99b6-8739237dc4f6"/>
+    <ds:schemaRef ds:uri="http://schemas.microsoft.com/sharepoint/v3/contenttype/forms"/>
   </ds:schemaRefs>
 </ds:datastoreItem>
 </file>

</xml_diff>

<commit_message>
Change scope to pure simulation without user interference & start putting basic draft of tech report in
</commit_message>
<xml_diff>
--- a/docs/Technical Report Eoin Fitzsimons.docx
+++ b/docs/Technical Report Eoin Fitzsimons.docx
@@ -660,7 +660,25 @@
           <w:bCs/>
           <w:highlight w:val="yellow"/>
         </w:rPr>
-        <w:t>successfully complete the Epigeum Academic Integrity Course</w:t>
+        <w:t xml:space="preserve">successfully complete the </w:t>
+      </w:r>
+      <w:proofErr w:type="spellStart"/>
+      <w:r>
+        <w:rPr>
+          <w:b/>
+          <w:bCs/>
+          <w:highlight w:val="yellow"/>
+        </w:rPr>
+        <w:t>Epigeum</w:t>
+      </w:r>
+      <w:proofErr w:type="spellEnd"/>
+      <w:r>
+        <w:rPr>
+          <w:b/>
+          <w:bCs/>
+          <w:highlight w:val="yellow"/>
+        </w:rPr>
+        <w:t xml:space="preserve"> Academic Integrity Course</w:t>
       </w:r>
       <w:r>
         <w:rPr>
@@ -1007,7 +1025,21 @@
         <w:rPr>
           <w:b/>
         </w:rPr>
-        <w:t>Please check that you read AI and Academic Integrity Acknowledgement Supplments in this document</w:t>
+        <w:t xml:space="preserve">Please check that you read AI and Academic Integrity Acknowledgement </w:t>
+      </w:r>
+      <w:proofErr w:type="spellStart"/>
+      <w:r>
+        <w:rPr>
+          <w:b/>
+        </w:rPr>
+        <w:t>Supplments</w:t>
+      </w:r>
+      <w:proofErr w:type="spellEnd"/>
+      <w:r>
+        <w:rPr>
+          <w:b/>
+        </w:rPr>
+        <w:t xml:space="preserve"> in this document</w:t>
       </w:r>
     </w:p>
     <w:p/>
@@ -5160,6 +5192,22 @@
     </w:p>
     <w:p>
       <w:pPr>
+        <w:ind w:firstLine="360"/>
+        <w:rPr>
+          <w:sz w:val="24"/>
+          <w:szCs w:val="24"/>
+        </w:rPr>
+      </w:pPr>
+      <w:r>
+        <w:rPr>
+          <w:sz w:val="24"/>
+          <w:szCs w:val="24"/>
+        </w:rPr>
+        <w:t>Interest in motorsport and simulation games, felt like existing games have too much going on for a user to fully envelop themselves in the simulation part, I wanted to take it back to the barebones of what it takes for drivers to race each other around a circuit.</w:t>
+      </w:r>
+    </w:p>
+    <w:p>
+      <w:pPr>
         <w:pStyle w:val="Heading2"/>
       </w:pPr>
       <w:bookmarkStart w:id="3" w:name="_Toc234073567"/>
@@ -5187,6 +5235,22 @@
     </w:p>
     <w:p>
       <w:pPr>
+        <w:ind w:left="360"/>
+        <w:rPr>
+          <w:sz w:val="24"/>
+          <w:szCs w:val="24"/>
+        </w:rPr>
+      </w:pPr>
+      <w:r>
+        <w:rPr>
+          <w:sz w:val="24"/>
+          <w:szCs w:val="24"/>
+        </w:rPr>
+        <w:t>To visualise a motorsport race in clear terms, be able to see why a driver makes a decision based on their surrounds, capabilities, and mentality.</w:t>
+      </w:r>
+    </w:p>
+    <w:p>
+      <w:pPr>
         <w:pStyle w:val="Heading2"/>
       </w:pPr>
       <w:bookmarkStart w:id="4" w:name="_Toc234073568"/>
@@ -5214,10 +5278,234 @@
     </w:p>
     <w:p>
       <w:pPr>
+        <w:ind w:left="360"/>
+        <w:rPr>
+          <w:sz w:val="24"/>
+          <w:szCs w:val="24"/>
+        </w:rPr>
+      </w:pPr>
+      <w:r>
+        <w:rPr>
+          <w:sz w:val="24"/>
+          <w:szCs w:val="24"/>
+        </w:rPr>
+        <w:t>GitHub, GitHub Desktop, GitHub Project</w:t>
+      </w:r>
+    </w:p>
+    <w:p>
+      <w:pPr>
+        <w:ind w:left="360"/>
+        <w:rPr>
+          <w:sz w:val="24"/>
+          <w:szCs w:val="24"/>
+        </w:rPr>
+      </w:pPr>
+      <w:r>
+        <w:rPr>
+          <w:sz w:val="24"/>
+          <w:szCs w:val="24"/>
+        </w:rPr>
+        <w:t>Python</w:t>
+      </w:r>
+    </w:p>
+    <w:p>
+      <w:pPr>
+        <w:ind w:left="360"/>
+        <w:rPr>
+          <w:sz w:val="24"/>
+          <w:szCs w:val="24"/>
+        </w:rPr>
+      </w:pPr>
+      <w:r>
+        <w:rPr>
+          <w:sz w:val="24"/>
+          <w:szCs w:val="24"/>
+        </w:rPr>
+        <w:t>PyQt6</w:t>
+      </w:r>
+    </w:p>
+    <w:p>
+      <w:pPr>
+        <w:ind w:left="360"/>
+        <w:rPr>
+          <w:sz w:val="24"/>
+          <w:szCs w:val="24"/>
+        </w:rPr>
+      </w:pPr>
+      <w:proofErr w:type="spellStart"/>
+      <w:r>
+        <w:rPr>
+          <w:sz w:val="24"/>
+          <w:szCs w:val="24"/>
+        </w:rPr>
+        <w:t>pathlib</w:t>
+      </w:r>
+      <w:proofErr w:type="spellEnd"/>
+      <w:r>
+        <w:rPr>
+          <w:sz w:val="24"/>
+          <w:szCs w:val="24"/>
+        </w:rPr>
+        <w:t xml:space="preserve"> – Path</w:t>
+      </w:r>
+    </w:p>
+    <w:p>
+      <w:pPr>
+        <w:ind w:left="360"/>
+        <w:rPr>
+          <w:sz w:val="24"/>
+          <w:szCs w:val="24"/>
+        </w:rPr>
+      </w:pPr>
+      <w:r>
+        <w:rPr>
+          <w:sz w:val="24"/>
+          <w:szCs w:val="24"/>
+        </w:rPr>
+        <w:t>sys</w:t>
+      </w:r>
+    </w:p>
+    <w:p>
+      <w:pPr>
+        <w:ind w:left="360"/>
+        <w:rPr>
+          <w:sz w:val="24"/>
+          <w:szCs w:val="24"/>
+        </w:rPr>
+      </w:pPr>
+      <w:r>
+        <w:rPr>
+          <w:sz w:val="24"/>
+          <w:szCs w:val="24"/>
+        </w:rPr>
+        <w:t>math – cos, sin, pi</w:t>
+      </w:r>
+    </w:p>
+    <w:p>
+      <w:pPr>
+        <w:ind w:left="360"/>
+        <w:rPr>
+          <w:sz w:val="24"/>
+          <w:szCs w:val="24"/>
+        </w:rPr>
+      </w:pPr>
+      <w:r>
+        <w:rPr>
+          <w:sz w:val="24"/>
+          <w:szCs w:val="24"/>
+        </w:rPr>
+        <w:t xml:space="preserve">typing – List, </w:t>
+      </w:r>
+      <w:proofErr w:type="spellStart"/>
+      <w:r>
+        <w:rPr>
+          <w:sz w:val="24"/>
+          <w:szCs w:val="24"/>
+        </w:rPr>
+        <w:t>Dict</w:t>
+      </w:r>
+      <w:proofErr w:type="spellEnd"/>
+      <w:r>
+        <w:rPr>
+          <w:sz w:val="24"/>
+          <w:szCs w:val="24"/>
+        </w:rPr>
+        <w:t>, Tuple</w:t>
+      </w:r>
+    </w:p>
+    <w:p>
+      <w:pPr>
+        <w:ind w:left="360"/>
+        <w:rPr>
+          <w:sz w:val="24"/>
+          <w:szCs w:val="24"/>
+        </w:rPr>
+      </w:pPr>
+      <w:proofErr w:type="spellStart"/>
+      <w:r>
+        <w:rPr>
+          <w:sz w:val="24"/>
+          <w:szCs w:val="24"/>
+        </w:rPr>
+        <w:t>json</w:t>
+      </w:r>
+      <w:proofErr w:type="spellEnd"/>
+    </w:p>
+    <w:p>
+      <w:pPr>
+        <w:ind w:left="360"/>
+        <w:rPr>
+          <w:sz w:val="24"/>
+          <w:szCs w:val="24"/>
+        </w:rPr>
+      </w:pPr>
+      <w:proofErr w:type="spellStart"/>
+      <w:r>
+        <w:rPr>
+          <w:sz w:val="24"/>
+          <w:szCs w:val="24"/>
+        </w:rPr>
+        <w:t>dataclasses</w:t>
+      </w:r>
+      <w:proofErr w:type="spellEnd"/>
+    </w:p>
+    <w:p>
+      <w:pPr>
+        <w:ind w:left="360"/>
+        <w:rPr>
+          <w:sz w:val="24"/>
+          <w:szCs w:val="24"/>
+        </w:rPr>
+      </w:pPr>
+      <w:r>
+        <w:rPr>
+          <w:sz w:val="24"/>
+          <w:szCs w:val="24"/>
+        </w:rPr>
+        <w:t>random</w:t>
+      </w:r>
+      <w:r>
+        <w:rPr>
+          <w:sz w:val="24"/>
+          <w:szCs w:val="24"/>
+        </w:rPr>
+        <w:t xml:space="preserve"> - </w:t>
+      </w:r>
+      <w:proofErr w:type="spellStart"/>
+      <w:r>
+        <w:rPr>
+          <w:sz w:val="24"/>
+          <w:szCs w:val="24"/>
+        </w:rPr>
+        <w:t>SystemRandom</w:t>
+      </w:r>
+      <w:proofErr w:type="spellEnd"/>
+    </w:p>
+    <w:p>
+      <w:pPr>
+        <w:ind w:left="360"/>
+        <w:rPr>
+          <w:sz w:val="24"/>
+          <w:szCs w:val="24"/>
+        </w:rPr>
+      </w:pPr>
+      <w:proofErr w:type="spellStart"/>
+      <w:r>
+        <w:rPr>
+          <w:sz w:val="24"/>
+          <w:szCs w:val="24"/>
+        </w:rPr>
+        <w:t>os</w:t>
+      </w:r>
+      <w:proofErr w:type="spellEnd"/>
+    </w:p>
+    <w:p>
+      <w:pPr>
         <w:pStyle w:val="Heading2"/>
       </w:pPr>
       <w:bookmarkStart w:id="5" w:name="_Toc234073569"/>
       <w:r>
+        <w:lastRenderedPageBreak/>
         <w:t>Structure</w:t>
       </w:r>
       <w:bookmarkEnd w:id="5"/>
@@ -5378,7 +5666,6 @@
         <w:pStyle w:val="Heading4"/>
       </w:pPr>
       <w:r>
-        <w:lastRenderedPageBreak/>
         <w:t>Use Case Diagram</w:t>
       </w:r>
     </w:p>
@@ -5575,6 +5862,7 @@
         <w:rPr>
           <w:lang w:val="en-GB"/>
         </w:rPr>
+        <w:lastRenderedPageBreak/>
         <w:t>Flow Description</w:t>
       </w:r>
     </w:p>
@@ -6015,7 +6303,6 @@
         <w:pStyle w:val="Heading6"/>
       </w:pPr>
       <w:r>
-        <w:lastRenderedPageBreak/>
         <w:t>Termination</w:t>
       </w:r>
     </w:p>
@@ -6457,7 +6744,25 @@
           <w:szCs w:val="24"/>
           <w:highlight w:val="yellow"/>
         </w:rPr>
-        <w:t>. It may also include performance evaluations, scalability, correctness, etc. depending on the focus of the project.  Quantative results may be reported in tables or figures.</w:t>
+        <w:t xml:space="preserve">. It may also include performance evaluations, scalability, correctness, etc. depending on the focus of the project.  </w:t>
+      </w:r>
+      <w:proofErr w:type="spellStart"/>
+      <w:r>
+        <w:rPr>
+          <w:sz w:val="24"/>
+          <w:szCs w:val="24"/>
+          <w:highlight w:val="yellow"/>
+        </w:rPr>
+        <w:t>Quantative</w:t>
+      </w:r>
+      <w:proofErr w:type="spellEnd"/>
+      <w:r>
+        <w:rPr>
+          <w:sz w:val="24"/>
+          <w:szCs w:val="24"/>
+          <w:highlight w:val="yellow"/>
+        </w:rPr>
+        <w:t xml:space="preserve"> results may be reported in tables or figures.</w:t>
       </w:r>
     </w:p>
     <w:p>
@@ -9220,6 +9525,10 @@
 </file>
 
 <file path=customXml/item1.xml><?xml version="1.0" encoding="utf-8"?>
+<b:Sources xmlns:b="http://schemas.openxmlformats.org/officeDocument/2006/bibliography" xmlns="http://schemas.openxmlformats.org/officeDocument/2006/bibliography" SelectedStyle="\HarvardAnglia2008OfficeOnline.xsl" StyleName="Harvard - Anglia" Version="2008"/>
+</file>
+
+<file path=customXml/item2.xml><?xml version="1.0" encoding="utf-8"?>
 <p:properties xmlns:p="http://schemas.microsoft.com/office/2006/metadata/properties" xmlns:xsi="http://www.w3.org/2001/XMLSchema-instance" xmlns:pc="http://schemas.microsoft.com/office/infopath/2007/PartnerControls">
   <documentManagement>
     <Teams_Channel_Section_Location xmlns="ac56161a-35a2-4bac-99b6-8739237dc4f6" xsi:nil="true"/>
@@ -9271,20 +9580,7 @@
 </p:properties>
 </file>
 
-<file path=customXml/item2.xml><?xml version="1.0" encoding="utf-8"?>
-<b:Sources xmlns:b="http://schemas.openxmlformats.org/officeDocument/2006/bibliography" xmlns="http://schemas.openxmlformats.org/officeDocument/2006/bibliography" SelectedStyle="\HarvardAnglia2008OfficeOnline.xsl" StyleName="Harvard - Anglia" Version="2008"/>
-</file>
-
 <file path=customXml/item3.xml><?xml version="1.0" encoding="utf-8"?>
-<?mso-contentType ?>
-<FormTemplates xmlns="http://schemas.microsoft.com/sharepoint/v3/contenttype/forms">
-  <Display>DocumentLibraryForm</Display>
-  <Edit>DocumentLibraryForm</Edit>
-  <New>DocumentLibraryForm</New>
-</FormTemplates>
-</file>
-
-<file path=customXml/item4.xml><?xml version="1.0" encoding="utf-8"?>
 <ct:contentTypeSchema xmlns:ct="http://schemas.microsoft.com/office/2006/metadata/contentType" xmlns:ma="http://schemas.microsoft.com/office/2006/metadata/properties/metaAttributes" ct:_="" ma:_="" ma:contentTypeName="Document" ma:contentTypeID="0x0101003EE04D916D7611488AA759BAA9A37716" ma:contentTypeVersion="34" ma:contentTypeDescription="Create a new document." ma:contentTypeScope="" ma:versionID="da43fd5ae1f7ae53ffd28d894363bfb4">
   <xsd:schema xmlns:xsd="http://www.w3.org/2001/XMLSchema" xmlns:xs="http://www.w3.org/2001/XMLSchema" xmlns:p="http://schemas.microsoft.com/office/2006/metadata/properties" xmlns:ns3="05ee331b-510f-4173-a5cc-a06d55a316fd" xmlns:ns4="ac56161a-35a2-4bac-99b6-8739237dc4f6" targetNamespace="http://schemas.microsoft.com/office/2006/metadata/properties" ma:root="true" ma:fieldsID="0e753ad016b352eaafbd0268c41c2a23" ns3:_="" ns4:_="">
     <xsd:import namespace="05ee331b-510f-4173-a5cc-a06d55a316fd"/>
@@ -9701,7 +9997,24 @@
 </ct:contentTypeSchema>
 </file>
 
+<file path=customXml/item4.xml><?xml version="1.0" encoding="utf-8"?>
+<?mso-contentType ?>
+<FormTemplates xmlns="http://schemas.microsoft.com/sharepoint/v3/contenttype/forms">
+  <Display>DocumentLibraryForm</Display>
+  <Edit>DocumentLibraryForm</Edit>
+  <New>DocumentLibraryForm</New>
+</FormTemplates>
+</file>
+
 <file path=customXml/itemProps1.xml><?xml version="1.0" encoding="utf-8"?>
+<ds:datastoreItem xmlns:ds="http://schemas.openxmlformats.org/officeDocument/2006/customXml" ds:itemID="{6C95B990-55DE-4564-83E5-DFE2C07FF9DD}">
+  <ds:schemaRefs>
+    <ds:schemaRef ds:uri="http://schemas.openxmlformats.org/officeDocument/2006/bibliography"/>
+  </ds:schemaRefs>
+</ds:datastoreItem>
+</file>
+
+<file path=customXml/itemProps2.xml><?xml version="1.0" encoding="utf-8"?>
 <ds:datastoreItem xmlns:ds="http://schemas.openxmlformats.org/officeDocument/2006/customXml" ds:itemID="{5C51FF54-1CBD-43E8-9B2A-B56F20CDF09A}">
   <ds:schemaRefs>
     <ds:schemaRef ds:uri="http://schemas.microsoft.com/office/2006/metadata/properties"/>
@@ -9711,23 +10024,7 @@
 </ds:datastoreItem>
 </file>
 
-<file path=customXml/itemProps2.xml><?xml version="1.0" encoding="utf-8"?>
-<ds:datastoreItem xmlns:ds="http://schemas.openxmlformats.org/officeDocument/2006/customXml" ds:itemID="{6C95B990-55DE-4564-83E5-DFE2C07FF9DD}">
-  <ds:schemaRefs>
-    <ds:schemaRef ds:uri="http://schemas.openxmlformats.org/officeDocument/2006/bibliography"/>
-  </ds:schemaRefs>
-</ds:datastoreItem>
-</file>
-
 <file path=customXml/itemProps3.xml><?xml version="1.0" encoding="utf-8"?>
-<ds:datastoreItem xmlns:ds="http://schemas.openxmlformats.org/officeDocument/2006/customXml" ds:itemID="{9B975280-634C-49AE-9293-B75FDC4277EB}">
-  <ds:schemaRefs>
-    <ds:schemaRef ds:uri="http://schemas.microsoft.com/sharepoint/v3/contenttype/forms"/>
-  </ds:schemaRefs>
-</ds:datastoreItem>
-</file>
-
-<file path=customXml/itemProps4.xml><?xml version="1.0" encoding="utf-8"?>
 <ds:datastoreItem xmlns:ds="http://schemas.openxmlformats.org/officeDocument/2006/customXml" ds:itemID="{3B693098-FF00-4095-9757-18FD92BDA8E2}">
   <ds:schemaRefs>
     <ds:schemaRef ds:uri="http://schemas.microsoft.com/office/2006/metadata/contentType"/>
@@ -9744,4 +10041,12 @@
     <ds:schemaRef ds:uri="http://schemas.microsoft.com/internal/obd"/>
   </ds:schemaRefs>
 </ds:datastoreItem>
+</file>
+
+<file path=customXml/itemProps4.xml><?xml version="1.0" encoding="utf-8"?>
+<ds:datastoreItem xmlns:ds="http://schemas.openxmlformats.org/officeDocument/2006/customXml" ds:itemID="{9B975280-634C-49AE-9293-B75FDC4277EB}">
+  <ds:schemaRefs>
+    <ds:schemaRef ds:uri="http://schemas.microsoft.com/sharepoint/v3/contenttype/forms"/>
+  </ds:schemaRefs>
+</ds:datastoreItem>
 </file>
</xml_diff>

<commit_message>
Cleaning up driver file
Separation of pseudocode, fixing a duplicate name error, tightening up the test.
</commit_message>
<xml_diff>
--- a/docs/Technical Report Eoin Fitzsimons.docx
+++ b/docs/Technical Report Eoin Fitzsimons.docx
@@ -660,7 +660,25 @@
           <w:bCs/>
           <w:highlight w:val="yellow"/>
         </w:rPr>
-        <w:t>successfully complete the Epigeum Academic Integrity Course</w:t>
+        <w:t xml:space="preserve">successfully complete the </w:t>
+      </w:r>
+      <w:proofErr w:type="spellStart"/>
+      <w:r>
+        <w:rPr>
+          <w:b/>
+          <w:bCs/>
+          <w:highlight w:val="yellow"/>
+        </w:rPr>
+        <w:t>Epigeum</w:t>
+      </w:r>
+      <w:proofErr w:type="spellEnd"/>
+      <w:r>
+        <w:rPr>
+          <w:b/>
+          <w:bCs/>
+          <w:highlight w:val="yellow"/>
+        </w:rPr>
+        <w:t xml:space="preserve"> Academic Integrity Course</w:t>
       </w:r>
       <w:r>
         <w:rPr>
@@ -1007,7 +1025,21 @@
         <w:rPr>
           <w:b/>
         </w:rPr>
-        <w:t>Please check that you read AI and Academic Integrity Acknowledgement Supplments in this document</w:t>
+        <w:t xml:space="preserve">Please check that you read AI and Academic Integrity Acknowledgement </w:t>
+      </w:r>
+      <w:proofErr w:type="spellStart"/>
+      <w:r>
+        <w:rPr>
+          <w:b/>
+        </w:rPr>
+        <w:t>Supplments</w:t>
+      </w:r>
+      <w:proofErr w:type="spellEnd"/>
+      <w:r>
+        <w:rPr>
+          <w:b/>
+        </w:rPr>
+        <w:t xml:space="preserve"> in this document</w:t>
       </w:r>
     </w:p>
     <w:p/>
@@ -5230,8 +5262,13 @@
       </w:r>
     </w:p>
     <w:p>
-      <w:r>
-        <w:t>pathlib – Path</w:t>
+      <w:proofErr w:type="spellStart"/>
+      <w:r>
+        <w:t>pathlib</w:t>
+      </w:r>
+      <w:proofErr w:type="spellEnd"/>
+      <w:r>
+        <w:t xml:space="preserve"> – Path</w:t>
       </w:r>
     </w:p>
     <w:p>
@@ -5246,18 +5283,30 @@
     </w:p>
     <w:p>
       <w:r>
-        <w:t>typing – List, Dict, Tuple</w:t>
-      </w:r>
-    </w:p>
-    <w:p>
+        <w:t xml:space="preserve">typing – List, </w:t>
+      </w:r>
+      <w:proofErr w:type="spellStart"/>
+      <w:r>
+        <w:t>Dict</w:t>
+      </w:r>
+      <w:proofErr w:type="spellEnd"/>
+      <w:r>
+        <w:t>, Tuple</w:t>
+      </w:r>
+    </w:p>
+    <w:p>
+      <w:proofErr w:type="spellStart"/>
       <w:r>
         <w:t>json</w:t>
       </w:r>
-    </w:p>
-    <w:p>
+      <w:proofErr w:type="spellEnd"/>
+    </w:p>
+    <w:p>
+      <w:proofErr w:type="spellStart"/>
       <w:r>
         <w:t>dataclasses</w:t>
       </w:r>
+      <w:proofErr w:type="spellEnd"/>
     </w:p>
     <w:p>
       <w:r>
@@ -5266,14 +5315,18 @@
       <w:r>
         <w:t xml:space="preserve"> - </w:t>
       </w:r>
+      <w:proofErr w:type="spellStart"/>
       <w:r>
         <w:t>SystemRandom</w:t>
       </w:r>
-    </w:p>
-    <w:p>
+      <w:proofErr w:type="spellEnd"/>
+    </w:p>
+    <w:p>
+      <w:proofErr w:type="spellStart"/>
       <w:r>
         <w:t>os</w:t>
       </w:r>
+      <w:proofErr w:type="spellEnd"/>
     </w:p>
     <w:p>
       <w:pPr>
@@ -5557,7 +5610,15 @@
     </w:p>
     <w:p>
       <w:r>
-        <w:t>The MoSCoW prioritisation method was used to classify functional requirements according to their importance. Core functionality required for the successful completion of a race simulation was classified as Must Have, features that improve the user experience but are not essential to the simulation were classified as Should Have or Could Have, while functionality outside the scope of the minimum viable product (MVP) was classified as Won't Have</w:t>
+        <w:t xml:space="preserve">The </w:t>
+      </w:r>
+      <w:proofErr w:type="spellStart"/>
+      <w:r>
+        <w:t>MoSCoW</w:t>
+      </w:r>
+      <w:proofErr w:type="spellEnd"/>
+      <w:r>
+        <w:t xml:space="preserve"> prioritisation method was used to classify functional requirements according to their importance. Core functionality required for the successful completion of a race simulation was classified as Must Have, features that improve the user experience but are not essential to the simulation were classified as Should Have or Could Have, while functionality outside the scope of the minimum viable product (MVP) was classified as Won't Have</w:t>
       </w:r>
       <w:r>
         <w:t>.</w:t>
@@ -9002,6 +9063,7 @@
         </w:sdtContent>
       </w:sdt>
     </w:p>
+    <w:p/>
     <w:p>
       <w:pPr>
         <w:pStyle w:val="Heading3"/>
@@ -9319,14 +9381,24 @@
                             <w:r>
                               <w:t xml:space="preserve">Telemetry </w:t>
                             </w:r>
-                            <w:fldSimple w:instr=" SEQ Telemetry \* ARABIC ">
-                              <w:r>
-                                <w:rPr>
-                                  <w:noProof/>
-                                </w:rPr>
-                                <w:t>1</w:t>
-                              </w:r>
-                            </w:fldSimple>
+                            <w:r>
+                              <w:fldChar w:fldCharType="begin"/>
+                            </w:r>
+                            <w:r>
+                              <w:instrText xml:space="preserve"> SEQ Telemetry \* ARABIC </w:instrText>
+                            </w:r>
+                            <w:r>
+                              <w:fldChar w:fldCharType="separate"/>
+                            </w:r>
+                            <w:r>
+                              <w:rPr>
+                                <w:noProof/>
+                              </w:rPr>
+                              <w:t>1</w:t>
+                            </w:r>
+                            <w:r>
+                              <w:fldChar w:fldCharType="end"/>
+                            </w:r>
                           </w:p>
                         </w:txbxContent>
                       </wps:txbx>
@@ -9363,14 +9435,24 @@
                       <w:r>
                         <w:t xml:space="preserve">Telemetry </w:t>
                       </w:r>
-                      <w:fldSimple w:instr=" SEQ Telemetry \* ARABIC ">
-                        <w:r>
-                          <w:rPr>
-                            <w:noProof/>
-                          </w:rPr>
-                          <w:t>1</w:t>
-                        </w:r>
-                      </w:fldSimple>
+                      <w:r>
+                        <w:fldChar w:fldCharType="begin"/>
+                      </w:r>
+                      <w:r>
+                        <w:instrText xml:space="preserve"> SEQ Telemetry \* ARABIC </w:instrText>
+                      </w:r>
+                      <w:r>
+                        <w:fldChar w:fldCharType="separate"/>
+                      </w:r>
+                      <w:r>
+                        <w:rPr>
+                          <w:noProof/>
+                        </w:rPr>
+                        <w:t>1</w:t>
+                      </w:r>
+                      <w:r>
+                        <w:fldChar w:fldCharType="end"/>
+                      </w:r>
                     </w:p>
                   </w:txbxContent>
                 </v:textbox>
@@ -9593,18 +9675,36 @@
       <w:r>
         <w:t xml:space="preserve">Telemetry </w:t>
       </w:r>
-      <w:fldSimple w:instr=" SEQ Telemetry \* ARABIC ">
-        <w:r>
-          <w:rPr>
-            <w:noProof/>
-          </w:rPr>
-          <w:t>2</w:t>
-        </w:r>
-      </w:fldSimple>
-    </w:p>
-    <w:p>
-      <w:r>
-        <w:t xml:space="preserve">As seen in Telemetry 2, I create the tables using QHBoxLayout, this lines up widgets horizontally without additional need for manually </w:t>
+      <w:r>
+        <w:fldChar w:fldCharType="begin"/>
+      </w:r>
+      <w:r>
+        <w:instrText xml:space="preserve"> SEQ Telemetry \* ARABIC </w:instrText>
+      </w:r>
+      <w:r>
+        <w:fldChar w:fldCharType="separate"/>
+      </w:r>
+      <w:r>
+        <w:rPr>
+          <w:noProof/>
+        </w:rPr>
+        <w:t>2</w:t>
+      </w:r>
+      <w:r>
+        <w:fldChar w:fldCharType="end"/>
+      </w:r>
+    </w:p>
+    <w:p>
+      <w:r>
+        <w:t xml:space="preserve">As seen in Telemetry 2, I create the tables using </w:t>
+      </w:r>
+      <w:proofErr w:type="spellStart"/>
+      <w:r>
+        <w:t>QHBoxLayout</w:t>
+      </w:r>
+      <w:proofErr w:type="spellEnd"/>
+      <w:r>
+        <w:t xml:space="preserve">, this lines up widgets horizontally without additional need for manually </w:t>
       </w:r>
       <w:r>
         <w:t>placing</w:t>
@@ -9715,21 +9815,39 @@
       <w:r>
         <w:t xml:space="preserve">Telemetry </w:t>
       </w:r>
-      <w:fldSimple w:instr=" SEQ Telemetry \* ARABIC ">
-        <w:r>
-          <w:rPr>
-            <w:noProof/>
-          </w:rPr>
-          <w:t>3</w:t>
-        </w:r>
-      </w:fldSimple>
+      <w:r>
+        <w:fldChar w:fldCharType="begin"/>
+      </w:r>
+      <w:r>
+        <w:instrText xml:space="preserve"> SEQ Telemetry \* ARABIC </w:instrText>
+      </w:r>
+      <w:r>
+        <w:fldChar w:fldCharType="separate"/>
+      </w:r>
+      <w:r>
+        <w:rPr>
+          <w:noProof/>
+        </w:rPr>
+        <w:t>3</w:t>
+      </w:r>
+      <w:r>
+        <w:fldChar w:fldCharType="end"/>
+      </w:r>
     </w:p>
     <w:p>
       <w:r>
         <w:t xml:space="preserve">As seen in Telemetry 3, I have an attribute error stemming from line 64 - </w:t>
       </w:r>
       <w:r>
-        <w:t>self._publish_telemetry()</w:t>
+        <w:t>self._</w:t>
+      </w:r>
+      <w:proofErr w:type="spellStart"/>
+      <w:r>
+        <w:t>publish_telemetry</w:t>
+      </w:r>
+      <w:proofErr w:type="spellEnd"/>
+      <w:r>
+        <w:t>()</w:t>
       </w:r>
       <w:r>
         <w:t>. The root cause of this is the telemetry is being called prior to the creation of tables, Telemetry 2 above shows I do have the creation of these tables within my code. This in an architecture issue rather than a</w:t>
@@ -9741,6 +9859,496 @@
         <w:t xml:space="preserve"> mere typo. I have to consider when elements are called and created. I will now work on initialising all elements before calling upon said elements.</w:t>
       </w:r>
     </w:p>
+    <w:p>
+      <w:pPr>
+        <w:pStyle w:val="Heading4"/>
+      </w:pPr>
+      <w:r>
+        <w:lastRenderedPageBreak/>
+        <w:t>Fix</w:t>
+      </w:r>
+    </w:p>
+    <w:p>
+      <w:pPr>
+        <w:keepNext/>
+      </w:pPr>
+      <w:r>
+        <w:drawing>
+          <wp:inline distT="0" distB="0" distL="0" distR="0" wp14:anchorId="55E6CECE" wp14:editId="580330D5">
+            <wp:extent cx="5731510" cy="4835525"/>
+            <wp:effectExtent l="0" t="0" r="2540" b="3175"/>
+            <wp:docPr id="874041886" name="Picture 1"/>
+            <wp:cNvGraphicFramePr>
+              <a:graphicFrameLocks xmlns:a="http://schemas.openxmlformats.org/drawingml/2006/main" noChangeAspect="1"/>
+            </wp:cNvGraphicFramePr>
+            <a:graphic xmlns:a="http://schemas.openxmlformats.org/drawingml/2006/main">
+              <a:graphicData uri="http://schemas.openxmlformats.org/drawingml/2006/picture">
+                <pic:pic xmlns:pic="http://schemas.openxmlformats.org/drawingml/2006/picture">
+                  <pic:nvPicPr>
+                    <pic:cNvPr id="874041886" name=""/>
+                    <pic:cNvPicPr/>
+                  </pic:nvPicPr>
+                  <pic:blipFill>
+                    <a:blip r:embed="rId23"/>
+                    <a:stretch>
+                      <a:fillRect/>
+                    </a:stretch>
+                  </pic:blipFill>
+                  <pic:spPr>
+                    <a:xfrm>
+                      <a:off x="0" y="0"/>
+                      <a:ext cx="5731510" cy="4835525"/>
+                    </a:xfrm>
+                    <a:prstGeom prst="rect">
+                      <a:avLst/>
+                    </a:prstGeom>
+                  </pic:spPr>
+                </pic:pic>
+              </a:graphicData>
+            </a:graphic>
+          </wp:inline>
+        </w:drawing>
+      </w:r>
+    </w:p>
+    <w:p>
+      <w:pPr>
+        <w:pStyle w:val="Caption"/>
+      </w:pPr>
+      <w:r>
+        <w:t xml:space="preserve">Telemetry </w:t>
+      </w:r>
+      <w:r>
+        <w:fldChar w:fldCharType="begin"/>
+      </w:r>
+      <w:r>
+        <w:instrText xml:space="preserve"> SEQ Telemetry \* ARABIC </w:instrText>
+      </w:r>
+      <w:r>
+        <w:fldChar w:fldCharType="separate"/>
+      </w:r>
+      <w:r>
+        <w:rPr>
+          <w:noProof/>
+        </w:rPr>
+        <w:t>4</w:t>
+      </w:r>
+      <w:r>
+        <w:fldChar w:fldCharType="end"/>
+      </w:r>
+    </w:p>
+    <w:p>
+      <w:r>
+        <w:t>The offending line is highlighted</w:t>
+      </w:r>
+      <w:r>
+        <w:t>, I merely had to remove it from the initialisation, I already had a line to populate the tables once they exist.</w:t>
+      </w:r>
+    </w:p>
+    <w:p>
+      <w:pPr>
+        <w:rPr>
+          <w:rFonts w:asciiTheme="majorHAnsi" w:eastAsiaTheme="majorEastAsia" w:hAnsiTheme="majorHAnsi" w:cstheme="majorBidi"/>
+          <w:b/>
+          <w:bCs/>
+          <w:color w:val="353839" w:themeColor="text1"/>
+        </w:rPr>
+      </w:pPr>
+      <w:r>
+        <w:br w:type="page"/>
+      </w:r>
+    </w:p>
+    <w:p>
+      <w:pPr>
+        <w:pStyle w:val="Heading3"/>
+      </w:pPr>
+      <w:r>
+        <w:lastRenderedPageBreak/>
+        <w:t>Driver Creation</w:t>
+      </w:r>
+    </w:p>
+    <w:p>
+      <w:pPr>
+        <w:pStyle w:val="Heading4"/>
+      </w:pPr>
+      <w:r>
+        <w:t>Pseudocode</w:t>
+      </w:r>
+    </w:p>
+    <w:p>
+      <w:r>
+        <w:rPr>
+          <w:noProof/>
+        </w:rPr>
+        <mc:AlternateContent>
+          <mc:Choice Requires="wps">
+            <w:drawing>
+              <wp:anchor distT="0" distB="0" distL="114300" distR="114300" simplePos="0" relativeHeight="251663360" behindDoc="0" locked="0" layoutInCell="1" allowOverlap="1" wp14:anchorId="43DCAA3E" wp14:editId="0D52DDB9">
+                <wp:simplePos x="0" y="0"/>
+                <wp:positionH relativeFrom="column">
+                  <wp:posOffset>0</wp:posOffset>
+                </wp:positionH>
+                <wp:positionV relativeFrom="paragraph">
+                  <wp:posOffset>5983605</wp:posOffset>
+                </wp:positionV>
+                <wp:extent cx="4171950" cy="635"/>
+                <wp:effectExtent l="0" t="0" r="0" b="0"/>
+                <wp:wrapSquare wrapText="bothSides"/>
+                <wp:docPr id="2102568501" name="Text Box 1"/>
+                <wp:cNvGraphicFramePr/>
+                <a:graphic xmlns:a="http://schemas.openxmlformats.org/drawingml/2006/main">
+                  <a:graphicData uri="http://schemas.microsoft.com/office/word/2010/wordprocessingShape">
+                    <wps:wsp>
+                      <wps:cNvSpPr txBox="1"/>
+                      <wps:spPr>
+                        <a:xfrm>
+                          <a:off x="0" y="0"/>
+                          <a:ext cx="4171950" cy="635"/>
+                        </a:xfrm>
+                        <a:prstGeom prst="rect">
+                          <a:avLst/>
+                        </a:prstGeom>
+                        <a:solidFill>
+                          <a:prstClr val="white"/>
+                        </a:solidFill>
+                        <a:ln>
+                          <a:noFill/>
+                        </a:ln>
+                      </wps:spPr>
+                      <wps:txbx>
+                        <w:txbxContent>
+                          <w:p>
+                            <w:pPr>
+                              <w:pStyle w:val="Caption"/>
+                            </w:pPr>
+                            <w:r>
+                              <w:t xml:space="preserve">Driver </w:t>
+                            </w:r>
+                            <w:r>
+                              <w:fldChar w:fldCharType="begin"/>
+                            </w:r>
+                            <w:r>
+                              <w:instrText xml:space="preserve"> SEQ Driver \* ARABIC </w:instrText>
+                            </w:r>
+                            <w:r>
+                              <w:fldChar w:fldCharType="separate"/>
+                            </w:r>
+                            <w:r>
+                              <w:rPr>
+                                <w:noProof/>
+                              </w:rPr>
+                              <w:t>1</w:t>
+                            </w:r>
+                            <w:r>
+                              <w:fldChar w:fldCharType="end"/>
+                            </w:r>
+                          </w:p>
+                        </w:txbxContent>
+                      </wps:txbx>
+                      <wps:bodyPr rot="0" spcFirstLastPara="0" vertOverflow="overflow" horzOverflow="overflow" vert="horz" wrap="square" lIns="0" tIns="0" rIns="0" bIns="0" numCol="1" spcCol="0" rtlCol="0" fromWordArt="0" anchor="t" anchorCtr="0" forceAA="0" compatLnSpc="1">
+                        <a:prstTxWarp prst="textNoShape">
+                          <a:avLst/>
+                        </a:prstTxWarp>
+                        <a:spAutoFit/>
+                      </wps:bodyPr>
+                    </wps:wsp>
+                  </a:graphicData>
+                </a:graphic>
+              </wp:anchor>
+            </w:drawing>
+          </mc:Choice>
+          <mc:Fallback>
+            <w:pict>
+              <v:shape w14:anchorId="43DCAA3E" id="_x0000_s1027" type="#_x0000_t202" style="position:absolute;margin-left:0;margin-top:471.15pt;width:328.5pt;height:.05pt;z-index:251663360;visibility:visible;mso-wrap-style:square;mso-wrap-distance-left:9pt;mso-wrap-distance-top:0;mso-wrap-distance-right:9pt;mso-wrap-distance-bottom:0;mso-position-horizontal:absolute;mso-position-horizontal-relative:text;mso-position-vertical:absolute;mso-position-vertical-relative:text;v-text-anchor:top" o:gfxdata="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" stroked="f">
+                <v:textbox style="mso-fit-shape-to-text:t" inset="0,0,0,0">
+                  <w:txbxContent>
+                    <w:p>
+                      <w:pPr>
+                        <w:pStyle w:val="Caption"/>
+                      </w:pPr>
+                      <w:r>
+                        <w:t xml:space="preserve">Driver </w:t>
+                      </w:r>
+                      <w:r>
+                        <w:fldChar w:fldCharType="begin"/>
+                      </w:r>
+                      <w:r>
+                        <w:instrText xml:space="preserve"> SEQ Driver \* ARABIC </w:instrText>
+                      </w:r>
+                      <w:r>
+                        <w:fldChar w:fldCharType="separate"/>
+                      </w:r>
+                      <w:r>
+                        <w:rPr>
+                          <w:noProof/>
+                        </w:rPr>
+                        <w:t>1</w:t>
+                      </w:r>
+                      <w:r>
+                        <w:fldChar w:fldCharType="end"/>
+                      </w:r>
+                    </w:p>
+                  </w:txbxContent>
+                </v:textbox>
+                <w10:wrap type="square"/>
+              </v:shape>
+            </w:pict>
+          </mc:Fallback>
+        </mc:AlternateContent>
+      </w:r>
+      <w:r>
+        <w:drawing>
+          <wp:anchor distT="0" distB="0" distL="114300" distR="114300" simplePos="0" relativeHeight="251661312" behindDoc="0" locked="0" layoutInCell="1" allowOverlap="1" wp14:anchorId="0DC49A5D" wp14:editId="25A7F86A">
+            <wp:simplePos x="0" y="0"/>
+            <wp:positionH relativeFrom="column">
+              <wp:posOffset>0</wp:posOffset>
+            </wp:positionH>
+            <wp:positionV relativeFrom="paragraph">
+              <wp:posOffset>1314</wp:posOffset>
+            </wp:positionV>
+            <wp:extent cx="4172532" cy="5925377"/>
+            <wp:effectExtent l="0" t="0" r="0" b="0"/>
+            <wp:wrapSquare wrapText="bothSides"/>
+            <wp:docPr id="542422467" name="Picture 1"/>
+            <wp:cNvGraphicFramePr>
+              <a:graphicFrameLocks xmlns:a="http://schemas.openxmlformats.org/drawingml/2006/main" noChangeAspect="1"/>
+            </wp:cNvGraphicFramePr>
+            <a:graphic xmlns:a="http://schemas.openxmlformats.org/drawingml/2006/main">
+              <a:graphicData uri="http://schemas.openxmlformats.org/drawingml/2006/picture">
+                <pic:pic xmlns:pic="http://schemas.openxmlformats.org/drawingml/2006/picture">
+                  <pic:nvPicPr>
+                    <pic:cNvPr id="542422467" name=""/>
+                    <pic:cNvPicPr/>
+                  </pic:nvPicPr>
+                  <pic:blipFill>
+                    <a:blip r:embed="rId24">
+                      <a:extLst>
+                        <a:ext uri="{28A0092B-C50C-407E-A947-70E740481C1C}">
+                          <a14:useLocalDpi xmlns:a14="http://schemas.microsoft.com/office/drawing/2010/main" val="0"/>
+                        </a:ext>
+                      </a:extLst>
+                    </a:blip>
+                    <a:stretch>
+                      <a:fillRect/>
+                    </a:stretch>
+                  </pic:blipFill>
+                  <pic:spPr>
+                    <a:xfrm>
+                      <a:off x="0" y="0"/>
+                      <a:ext cx="4172532" cy="5925377"/>
+                    </a:xfrm>
+                    <a:prstGeom prst="rect">
+                      <a:avLst/>
+                    </a:prstGeom>
+                  </pic:spPr>
+                </pic:pic>
+              </a:graphicData>
+            </a:graphic>
+          </wp:anchor>
+        </w:drawing>
+      </w:r>
+      <w:r>
+        <w:t>I wanted drivers to follow a pattern rather than a truly random set of attributes; I came up with 4 attributes I wanted and 10 driver personas I could apply the ranges to. Age is something also affected by the persona.</w:t>
+      </w:r>
+    </w:p>
+    <w:p>
+      <w:r>
+        <w:br w:type="page"/>
+      </w:r>
+    </w:p>
+    <w:p>
+      <w:pPr>
+        <w:pStyle w:val="Heading4"/>
+      </w:pPr>
+      <w:r>
+        <w:lastRenderedPageBreak/>
+        <w:t>Error</w:t>
+      </w:r>
+    </w:p>
+    <w:p>
+      <w:pPr>
+        <w:keepNext/>
+      </w:pPr>
+      <w:r>
+        <w:rPr>
+          <w:noProof/>
+        </w:rPr>
+        <w:drawing>
+          <wp:inline distT="0" distB="0" distL="0" distR="0" wp14:anchorId="3E366B2F" wp14:editId="5D7C7CFD">
+            <wp:extent cx="3420745" cy="2701290"/>
+            <wp:effectExtent l="0" t="0" r="8255" b="3810"/>
+            <wp:docPr id="2099332849" name="Picture 1"/>
+            <wp:cNvGraphicFramePr>
+              <a:graphicFrameLocks xmlns:a="http://schemas.openxmlformats.org/drawingml/2006/main" noChangeAspect="1"/>
+            </wp:cNvGraphicFramePr>
+            <a:graphic xmlns:a="http://schemas.openxmlformats.org/drawingml/2006/main">
+              <a:graphicData uri="http://schemas.openxmlformats.org/drawingml/2006/picture">
+                <pic:pic xmlns:pic="http://schemas.openxmlformats.org/drawingml/2006/picture">
+                  <pic:nvPicPr>
+                    <pic:cNvPr id="2099332849" name=""/>
+                    <pic:cNvPicPr/>
+                  </pic:nvPicPr>
+                  <pic:blipFill rotWithShape="1">
+                    <a:blip r:embed="rId25">
+                      <a:extLst>
+                        <a:ext uri="{28A0092B-C50C-407E-A947-70E740481C1C}">
+                          <a14:useLocalDpi xmlns:a14="http://schemas.microsoft.com/office/drawing/2010/main" val="0"/>
+                        </a:ext>
+                      </a:extLst>
+                    </a:blip>
+                    <a:srcRect t="68464" r="76894"/>
+                    <a:stretch>
+                      <a:fillRect/>
+                    </a:stretch>
+                  </pic:blipFill>
+                  <pic:spPr bwMode="auto">
+                    <a:xfrm>
+                      <a:off x="0" y="0"/>
+                      <a:ext cx="3420745" cy="2701290"/>
+                    </a:xfrm>
+                    <a:prstGeom prst="rect">
+                      <a:avLst/>
+                    </a:prstGeom>
+                    <a:ln>
+                      <a:noFill/>
+                    </a:ln>
+                    <a:extLst>
+                      <a:ext uri="{53640926-AAD7-44D8-BBD7-CCE9431645EC}">
+                        <a14:shadowObscured xmlns:a14="http://schemas.microsoft.com/office/drawing/2010/main"/>
+                      </a:ext>
+                    </a:extLst>
+                  </pic:spPr>
+                </pic:pic>
+              </a:graphicData>
+            </a:graphic>
+          </wp:inline>
+        </w:drawing>
+      </w:r>
+    </w:p>
+    <w:p>
+      <w:pPr>
+        <w:pStyle w:val="Caption"/>
+      </w:pPr>
+      <w:r>
+        <w:t xml:space="preserve">Driver </w:t>
+      </w:r>
+      <w:r>
+        <w:fldChar w:fldCharType="begin"/>
+      </w:r>
+      <w:r>
+        <w:instrText xml:space="preserve"> SEQ Driver \* ARABIC </w:instrText>
+      </w:r>
+      <w:r>
+        <w:fldChar w:fldCharType="separate"/>
+      </w:r>
+      <w:r>
+        <w:rPr>
+          <w:noProof/>
+        </w:rPr>
+        <w:t>2</w:t>
+      </w:r>
+      <w:r>
+        <w:fldChar w:fldCharType="end"/>
+      </w:r>
+    </w:p>
+    <w:p>
+      <w:r>
+        <w:t xml:space="preserve">As shown in Driver </w:t>
+      </w:r>
+      <w:r>
+        <w:t>2</w:t>
+      </w:r>
+      <w:r>
+        <w:t xml:space="preserve">, duplicate names arise as an issue, this was a quick fix, I added a variable for used names </w:t>
+      </w:r>
+      <w:r>
+        <w:t>then added the selected name.</w:t>
+      </w:r>
+    </w:p>
+    <w:p>
+      <w:pPr>
+        <w:pStyle w:val="Heading4"/>
+      </w:pPr>
+      <w:r>
+        <w:t>Code Snippet</w:t>
+      </w:r>
+    </w:p>
+    <w:p>
+      <w:pPr>
+        <w:keepNext/>
+      </w:pPr>
+      <w:r>
+        <w:drawing>
+          <wp:inline distT="0" distB="0" distL="0" distR="0" wp14:anchorId="5C38C0BF" wp14:editId="08474D3C">
+            <wp:extent cx="5553850" cy="3162741"/>
+            <wp:effectExtent l="0" t="0" r="8890" b="0"/>
+            <wp:docPr id="1288812030" name="Picture 1"/>
+            <wp:cNvGraphicFramePr>
+              <a:graphicFrameLocks xmlns:a="http://schemas.openxmlformats.org/drawingml/2006/main" noChangeAspect="1"/>
+            </wp:cNvGraphicFramePr>
+            <a:graphic xmlns:a="http://schemas.openxmlformats.org/drawingml/2006/main">
+              <a:graphicData uri="http://schemas.openxmlformats.org/drawingml/2006/picture">
+                <pic:pic xmlns:pic="http://schemas.openxmlformats.org/drawingml/2006/picture">
+                  <pic:nvPicPr>
+                    <pic:cNvPr id="1288812030" name=""/>
+                    <pic:cNvPicPr/>
+                  </pic:nvPicPr>
+                  <pic:blipFill>
+                    <a:blip r:embed="rId26"/>
+                    <a:stretch>
+                      <a:fillRect/>
+                    </a:stretch>
+                  </pic:blipFill>
+                  <pic:spPr>
+                    <a:xfrm>
+                      <a:off x="0" y="0"/>
+                      <a:ext cx="5553850" cy="3162741"/>
+                    </a:xfrm>
+                    <a:prstGeom prst="rect">
+                      <a:avLst/>
+                    </a:prstGeom>
+                  </pic:spPr>
+                </pic:pic>
+              </a:graphicData>
+            </a:graphic>
+          </wp:inline>
+        </w:drawing>
+      </w:r>
+    </w:p>
+    <w:p>
+      <w:pPr>
+        <w:pStyle w:val="Caption"/>
+      </w:pPr>
+      <w:r>
+        <w:t xml:space="preserve">Driver </w:t>
+      </w:r>
+      <w:r>
+        <w:fldChar w:fldCharType="begin"/>
+      </w:r>
+      <w:r>
+        <w:instrText xml:space="preserve"> SEQ Driver \* ARABIC </w:instrText>
+      </w:r>
+      <w:r>
+        <w:fldChar w:fldCharType="separate"/>
+      </w:r>
+      <w:r>
+        <w:rPr>
+          <w:noProof/>
+        </w:rPr>
+        <w:t>3</w:t>
+      </w:r>
+      <w:r>
+        <w:fldChar w:fldCharType="end"/>
+      </w:r>
+    </w:p>
+    <w:p>
+      <w:r>
+        <w:t>In Driver 3 you can see how names are assigned by nationality groups to make the simulation more immersive.</w:t>
+      </w:r>
+      <w:r>
+        <w:t xml:space="preserve"> This and the archetypes give some personification to the drivers to keep users’ attention.</w:t>
+      </w:r>
+    </w:p>
+    <w:p/>
     <w:p/>
     <w:p>
       <w:pPr>
@@ -9894,7 +10502,25 @@
           <w:szCs w:val="24"/>
           <w:highlight w:val="yellow"/>
         </w:rPr>
-        <w:t>. It may also include performance evaluations, scalability, correctness, etc. depending on the focus of the project.  Quantative results may be reported in tables or figures.</w:t>
+        <w:t xml:space="preserve">. It may also include performance evaluations, scalability, correctness, etc. depending on the focus of the project.  </w:t>
+      </w:r>
+      <w:proofErr w:type="spellStart"/>
+      <w:r>
+        <w:rPr>
+          <w:sz w:val="24"/>
+          <w:szCs w:val="24"/>
+          <w:highlight w:val="yellow"/>
+        </w:rPr>
+        <w:t>Quantative</w:t>
+      </w:r>
+      <w:proofErr w:type="spellEnd"/>
+      <w:r>
+        <w:rPr>
+          <w:sz w:val="24"/>
+          <w:szCs w:val="24"/>
+          <w:highlight w:val="yellow"/>
+        </w:rPr>
+        <w:t xml:space="preserve"> results may be reported in tables or figures.</w:t>
       </w:r>
     </w:p>
     <w:p>
@@ -10283,7 +10909,7 @@
       </w:r>
     </w:p>
     <w:sectPr>
-      <w:footerReference w:type="default" r:id="rId23"/>
+      <w:footerReference w:type="default" r:id="rId27"/>
       <w:pgSz w:w="11906" w:h="16838" w:code="9"/>
       <w:pgMar w:top="1440" w:right="1440" w:bottom="1440" w:left="1440" w:header="709" w:footer="709" w:gutter="0"/>
       <w:pgNumType w:start="0"/>

</xml_diff>

<commit_message>
Design & Arch Start
</commit_message>
<xml_diff>
--- a/docs/Technical Report Eoin Fitzsimons.docx
+++ b/docs/Technical Report Eoin Fitzsimons.docx
@@ -593,7 +593,25 @@
           <w:sz w:val="18"/>
           <w:szCs w:val="18"/>
         </w:rPr>
-        <w:t>supplied by the Library.  To use other author's written or electronic work is illegal (plagiarism) and may result in disciplinary action.  Students may be required to undergo a viva (oral examination) if there is suspicion about the validity of their submitted work.</w:t>
+        <w:t xml:space="preserve">supplied by the </w:t>
+      </w:r>
+      <w:proofErr w:type="gramStart"/>
+      <w:r>
+        <w:rPr>
+          <w:rFonts w:ascii="Verdana" w:hAnsi="Verdana"/>
+          <w:sz w:val="18"/>
+          <w:szCs w:val="18"/>
+        </w:rPr>
+        <w:t>Library</w:t>
+      </w:r>
+      <w:proofErr w:type="gramEnd"/>
+      <w:r>
+        <w:rPr>
+          <w:rFonts w:ascii="Verdana" w:hAnsi="Verdana"/>
+          <w:sz w:val="18"/>
+          <w:szCs w:val="18"/>
+        </w:rPr>
+        <w:t>.  To use other author's written or electronic work is illegal (plagiarism) and may result in disciplinary action.  Students may be required to undergo a viva (oral examination) if there is suspicion about the validity of their submitted work.</w:t>
       </w:r>
     </w:p>
     <w:p/>
@@ -1001,7 +1019,21 @@
         <w:rPr>
           <w:b/>
         </w:rPr>
-        <w:t>Any project/assignment not submitted will be marked as a fail.</w:t>
+        <w:t xml:space="preserve">Any project/assignment not submitted will be marked as a </w:t>
+      </w:r>
+      <w:proofErr w:type="gramStart"/>
+      <w:r>
+        <w:rPr>
+          <w:b/>
+        </w:rPr>
+        <w:t>fail</w:t>
+      </w:r>
+      <w:proofErr w:type="gramEnd"/>
+      <w:r>
+        <w:rPr>
+          <w:b/>
+        </w:rPr>
+        <w:t>.</w:t>
       </w:r>
     </w:p>
     <w:p>
@@ -9247,46 +9279,233 @@
     </w:p>
     <w:p>
       <w:pPr>
-        <w:ind w:left="360"/>
-        <w:rPr>
-          <w:sz w:val="24"/>
-          <w:szCs w:val="24"/>
-          <w:highlight w:val="yellow"/>
-        </w:rPr>
-      </w:pPr>
-      <w:r>
-        <w:rPr>
-          <w:sz w:val="24"/>
-          <w:szCs w:val="24"/>
-          <w:highlight w:val="yellow"/>
-        </w:rPr>
-        <w:t>Describe the design, system architecture and components used. Describe the main algorithms used in the project. (Note use standard mathematical notations if applicable).</w:t>
-      </w:r>
-    </w:p>
-    <w:p>
-      <w:pPr>
-        <w:ind w:left="360"/>
-        <w:rPr>
-          <w:sz w:val="24"/>
-          <w:szCs w:val="24"/>
-        </w:rPr>
-      </w:pPr>
-      <w:r>
-        <w:rPr>
-          <w:sz w:val="24"/>
-          <w:szCs w:val="24"/>
-          <w:highlight w:val="yellow"/>
-        </w:rPr>
-        <w:t>An architecture diagram may be useful. In case of a distributed system, it may be useful to describe functions and/or data structures in each component separately.</w:t>
-      </w:r>
-      <w:r>
-        <w:rPr>
-          <w:sz w:val="24"/>
-          <w:szCs w:val="24"/>
-        </w:rPr>
-        <w:t xml:space="preserve">  </w:t>
-      </w:r>
-    </w:p>
+        <w:pStyle w:val="Heading3"/>
+      </w:pPr>
+      <w:r>
+        <w:t>Container Diagram</w:t>
+      </w:r>
+    </w:p>
+    <w:p>
+      <w:r>
+        <w:drawing>
+          <wp:anchor distT="0" distB="0" distL="114300" distR="114300" simplePos="0" relativeHeight="251664384" behindDoc="0" locked="0" layoutInCell="1" allowOverlap="1" wp14:anchorId="2C93BCC7" wp14:editId="785C04A9">
+            <wp:simplePos x="0" y="0"/>
+            <wp:positionH relativeFrom="column">
+              <wp:posOffset>0</wp:posOffset>
+            </wp:positionH>
+            <wp:positionV relativeFrom="paragraph">
+              <wp:posOffset>-1555</wp:posOffset>
+            </wp:positionV>
+            <wp:extent cx="2343477" cy="7630590"/>
+            <wp:effectExtent l="0" t="0" r="0" b="8890"/>
+            <wp:wrapSquare wrapText="bothSides"/>
+            <wp:docPr id="959775510" name="Picture 1"/>
+            <wp:cNvGraphicFramePr>
+              <a:graphicFrameLocks xmlns:a="http://schemas.openxmlformats.org/drawingml/2006/main" noChangeAspect="1"/>
+            </wp:cNvGraphicFramePr>
+            <a:graphic xmlns:a="http://schemas.openxmlformats.org/drawingml/2006/main">
+              <a:graphicData uri="http://schemas.openxmlformats.org/drawingml/2006/picture">
+                <pic:pic xmlns:pic="http://schemas.openxmlformats.org/drawingml/2006/picture">
+                  <pic:nvPicPr>
+                    <pic:cNvPr id="959775510" name=""/>
+                    <pic:cNvPicPr/>
+                  </pic:nvPicPr>
+                  <pic:blipFill>
+                    <a:blip r:embed="rId20">
+                      <a:extLst>
+                        <a:ext uri="{28A0092B-C50C-407E-A947-70E740481C1C}">
+                          <a14:useLocalDpi xmlns:a14="http://schemas.microsoft.com/office/drawing/2010/main" val="0"/>
+                        </a:ext>
+                      </a:extLst>
+                    </a:blip>
+                    <a:stretch>
+                      <a:fillRect/>
+                    </a:stretch>
+                  </pic:blipFill>
+                  <pic:spPr>
+                    <a:xfrm>
+                      <a:off x="0" y="0"/>
+                      <a:ext cx="2343477" cy="7630590"/>
+                    </a:xfrm>
+                    <a:prstGeom prst="rect">
+                      <a:avLst/>
+                    </a:prstGeom>
+                  </pic:spPr>
+                </pic:pic>
+              </a:graphicData>
+            </a:graphic>
+          </wp:anchor>
+        </w:drawing>
+      </w:r>
+      <w:r>
+        <w:t>The container diagram shows the high-level shape of the software architecture and how responsibilities are distributed across it. It also shows the major technology choices and how the containers communicate with one another. It’s a simple, high-level technology focussed diagram that is useful for software developers</w:t>
+      </w:r>
+      <w:r>
+        <w:t xml:space="preserve">. </w:t>
+      </w:r>
+      <w:sdt>
+        <w:sdtPr>
+          <w:id w:val="1415046410"/>
+          <w:citation/>
+        </w:sdtPr>
+        <w:sdtContent>
+          <w:r>
+            <w:fldChar w:fldCharType="begin"/>
+          </w:r>
+          <w:r>
+            <w:rPr>
+              <w:lang w:val="en-GB"/>
+            </w:rPr>
+            <w:instrText xml:space="preserve"> CITATION C4M26 \l 2057 </w:instrText>
+          </w:r>
+          <w:r>
+            <w:fldChar w:fldCharType="separate"/>
+          </w:r>
+          <w:r>
+            <w:rPr>
+              <w:noProof/>
+              <w:lang w:val="en-GB"/>
+            </w:rPr>
+            <w:t>(C4 Model, n.d.)</w:t>
+          </w:r>
+          <w:r>
+            <w:fldChar w:fldCharType="end"/>
+          </w:r>
+        </w:sdtContent>
+      </w:sdt>
+    </w:p>
+    <w:p>
+      <w:r>
+        <w:t xml:space="preserve">It is a simple diagram that shows the user </w:t>
+      </w:r>
+      <w:r>
+        <w:t>interacts</w:t>
+      </w:r>
+      <w:r>
+        <w:t xml:space="preserve"> only with the UI and the database only with the </w:t>
+      </w:r>
+      <w:r>
+        <w:t xml:space="preserve">simulation </w:t>
+      </w:r>
+      <w:r>
+        <w:t xml:space="preserve">and so on, no </w:t>
+      </w:r>
+      <w:r>
+        <w:t>stage can bypass one it is directly connected with, everything is linear.</w:t>
+      </w:r>
+    </w:p>
+    <w:p>
+      <w:r>
+        <w:br w:type="page"/>
+      </w:r>
+    </w:p>
+    <w:p>
+      <w:pPr>
+        <w:pStyle w:val="Heading3"/>
+      </w:pPr>
+      <w:r>
+        <w:lastRenderedPageBreak/>
+        <w:t>Component Diagram</w:t>
+      </w:r>
+    </w:p>
+    <w:p>
+      <w:r>
+        <w:drawing>
+          <wp:inline distT="0" distB="0" distL="0" distR="0" wp14:anchorId="6C5E96DA" wp14:editId="52D8D4FC">
+            <wp:extent cx="5731510" cy="4700270"/>
+            <wp:effectExtent l="0" t="0" r="2540" b="5080"/>
+            <wp:docPr id="161336779" name="Picture 1"/>
+            <wp:cNvGraphicFramePr>
+              <a:graphicFrameLocks xmlns:a="http://schemas.openxmlformats.org/drawingml/2006/main" noChangeAspect="1"/>
+            </wp:cNvGraphicFramePr>
+            <a:graphic xmlns:a="http://schemas.openxmlformats.org/drawingml/2006/main">
+              <a:graphicData uri="http://schemas.openxmlformats.org/drawingml/2006/picture">
+                <pic:pic xmlns:pic="http://schemas.openxmlformats.org/drawingml/2006/picture">
+                  <pic:nvPicPr>
+                    <pic:cNvPr id="161336779" name=""/>
+                    <pic:cNvPicPr/>
+                  </pic:nvPicPr>
+                  <pic:blipFill>
+                    <a:blip r:embed="rId21"/>
+                    <a:stretch>
+                      <a:fillRect/>
+                    </a:stretch>
+                  </pic:blipFill>
+                  <pic:spPr>
+                    <a:xfrm>
+                      <a:off x="0" y="0"/>
+                      <a:ext cx="5731510" cy="4700270"/>
+                    </a:xfrm>
+                    <a:prstGeom prst="rect">
+                      <a:avLst/>
+                    </a:prstGeom>
+                  </pic:spPr>
+                </pic:pic>
+              </a:graphicData>
+            </a:graphic>
+          </wp:inline>
+        </w:drawing>
+      </w:r>
+    </w:p>
+    <w:p>
+      <w:r>
+        <w:t xml:space="preserve">A Component-Based Diagram is a Unified </w:t>
+      </w:r>
+      <w:r>
+        <w:t>Modelling</w:t>
+      </w:r>
+      <w:r>
+        <w:t xml:space="preserve"> Language (UML) structural diagram used to represent the organization of a system into modular components and their relationships. It helps visualize how different parts of a system interact and work together to form the overall architecture.</w:t>
+      </w:r>
+    </w:p>
+    <w:p>
+      <w:r>
+        <w:t>Components encapsulate specific functionality and expose interfaces for communication with other components.</w:t>
+      </w:r>
+    </w:p>
+    <w:p>
+      <w:r>
+        <w:t>Shows dependencies and interactions between components, making complex systems easier to understand and maintain.</w:t>
+      </w:r>
+      <w:sdt>
+        <w:sdtPr>
+          <w:id w:val="-1852715061"/>
+          <w:citation/>
+        </w:sdtPr>
+        <w:sdtContent>
+          <w:r>
+            <w:fldChar w:fldCharType="begin"/>
+          </w:r>
+          <w:r>
+            <w:rPr>
+              <w:lang w:val="en-GB"/>
+            </w:rPr>
+            <w:instrText xml:space="preserve"> CITATION Gee26 \l 2057 </w:instrText>
+          </w:r>
+          <w:r>
+            <w:fldChar w:fldCharType="separate"/>
+          </w:r>
+          <w:r>
+            <w:rPr>
+              <w:noProof/>
+              <w:lang w:val="en-GB"/>
+            </w:rPr>
+            <w:t xml:space="preserve"> </w:t>
+          </w:r>
+          <w:r>
+            <w:rPr>
+              <w:noProof/>
+              <w:lang w:val="en-GB"/>
+            </w:rPr>
+            <w:t>(Geeks for Geeks, 2026)</w:t>
+          </w:r>
+          <w:r>
+            <w:fldChar w:fldCharType="end"/>
+          </w:r>
+        </w:sdtContent>
+      </w:sdt>
+    </w:p>
+    <w:p/>
     <w:p>
       <w:pPr>
         <w:rPr>
@@ -9490,7 +9709,7 @@
                     <pic:cNvPicPr/>
                   </pic:nvPicPr>
                   <pic:blipFill>
-                    <a:blip r:embed="rId20">
+                    <a:blip r:embed="rId22">
                       <a:extLst>
                         <a:ext uri="{28A0092B-C50C-407E-A947-70E740481C1C}">
                           <a14:useLocalDpi xmlns:a14="http://schemas.microsoft.com/office/drawing/2010/main" val="0"/>
@@ -9605,7 +9824,15 @@
         <w:t xml:space="preserve"> This feature exists both in backend and frontend.</w:t>
       </w:r>
       <w:r>
-        <w:t xml:space="preserve"> To not overburden the page with screenshots, this is merely the backend section, I wrote more for the frontend but it is very similar, the only differences being references to physical space.</w:t>
+        <w:t xml:space="preserve"> To not overburden the page with screenshots, this is merely the backend section, I wrote more for the </w:t>
+      </w:r>
+      <w:proofErr w:type="gramStart"/>
+      <w:r>
+        <w:t>frontend</w:t>
+      </w:r>
+      <w:proofErr w:type="gramEnd"/>
+      <w:r>
+        <w:t xml:space="preserve"> but it is very similar, the only differences being references to physical space.</w:t>
       </w:r>
     </w:p>
     <w:p>
@@ -9647,7 +9874,7 @@
                     <pic:cNvPicPr/>
                   </pic:nvPicPr>
                   <pic:blipFill>
-                    <a:blip r:embed="rId21"/>
+                    <a:blip r:embed="rId23"/>
                     <a:stretch>
                       <a:fillRect/>
                     </a:stretch>
@@ -9778,7 +10005,7 @@
                     <pic:cNvPicPr/>
                   </pic:nvPicPr>
                   <pic:blipFill rotWithShape="1">
-                    <a:blip r:embed="rId22"/>
+                    <a:blip r:embed="rId24"/>
                     <a:srcRect t="6374" r="34809"/>
                     <a:stretch>
                       <a:fillRect/>
@@ -9889,7 +10116,7 @@
                     <pic:cNvPicPr/>
                   </pic:nvPicPr>
                   <pic:blipFill>
-                    <a:blip r:embed="rId23"/>
+                    <a:blip r:embed="rId25"/>
                     <a:stretch>
                       <a:fillRect/>
                     </a:stretch>
@@ -10120,7 +10347,7 @@
                     <pic:cNvPicPr/>
                   </pic:nvPicPr>
                   <pic:blipFill>
-                    <a:blip r:embed="rId24">
+                    <a:blip r:embed="rId26">
                       <a:extLst>
                         <a:ext uri="{28A0092B-C50C-407E-A947-70E740481C1C}">
                           <a14:useLocalDpi xmlns:a14="http://schemas.microsoft.com/office/drawing/2010/main" val="0"/>
@@ -10188,7 +10415,7 @@
                     <pic:cNvPicPr/>
                   </pic:nvPicPr>
                   <pic:blipFill rotWithShape="1">
-                    <a:blip r:embed="rId25">
+                    <a:blip r:embed="rId27">
                       <a:extLst>
                         <a:ext uri="{28A0092B-C50C-407E-A947-70E740481C1C}">
                           <a14:useLocalDpi xmlns:a14="http://schemas.microsoft.com/office/drawing/2010/main" val="0"/>
@@ -10293,7 +10520,7 @@
                     <pic:cNvPicPr/>
                   </pic:nvPicPr>
                   <pic:blipFill>
-                    <a:blip r:embed="rId26"/>
+                    <a:blip r:embed="rId28"/>
                     <a:stretch>
                       <a:fillRect/>
                     </a:stretch>
@@ -10348,6 +10575,53 @@
         <w:t xml:space="preserve"> This and the archetypes give some personification to the drivers to keep users’ attention.</w:t>
       </w:r>
     </w:p>
+    <w:p>
+      <w:r>
+        <w:br w:type="page"/>
+      </w:r>
+    </w:p>
+    <w:p>
+      <w:pPr>
+        <w:pStyle w:val="Heading3"/>
+      </w:pPr>
+      <w:r>
+        <w:lastRenderedPageBreak/>
+        <w:t>Something</w:t>
+      </w:r>
+    </w:p>
+    <w:p>
+      <w:pPr>
+        <w:pStyle w:val="Heading4"/>
+      </w:pPr>
+      <w:r>
+        <w:t>Pseudocode</w:t>
+      </w:r>
+    </w:p>
+    <w:p>
+      <w:pPr>
+        <w:pStyle w:val="Heading4"/>
+      </w:pPr>
+      <w:r>
+        <w:t>Code Snippet</w:t>
+      </w:r>
+    </w:p>
+    <w:p>
+      <w:pPr>
+        <w:pStyle w:val="Heading4"/>
+      </w:pPr>
+      <w:r>
+        <w:t>Error</w:t>
+      </w:r>
+    </w:p>
+    <w:p>
+      <w:pPr>
+        <w:pStyle w:val="Heading4"/>
+      </w:pPr>
+      <w:r>
+        <w:t>Fix</w:t>
+      </w:r>
+    </w:p>
+    <w:p/>
     <w:p/>
     <w:p/>
     <w:p>
@@ -10909,7 +11183,7 @@
       </w:r>
     </w:p>
     <w:sectPr>
-      <w:footerReference w:type="default" r:id="rId27"/>
+      <w:footerReference w:type="default" r:id="rId29"/>
       <w:pgSz w:w="11906" w:h="16838" w:code="9"/>
       <w:pgMar w:top="1440" w:right="1440" w:bottom="1440" w:left="1440" w:header="709" w:footer="709" w:gutter="0"/>
       <w:pgNumType w:start="0"/>
@@ -14062,7 +14336,6 @@
   <w:style w:type="character" w:default="1" w:styleId="DefaultParagraphFont">
     <w:name w:val="Default Paragraph Font"/>
     <w:uiPriority w:val="1"/>
-    <w:semiHidden/>
     <w:unhideWhenUsed/>
   </w:style>
   <w:style w:type="table" w:default="1" w:styleId="TableNormal">
@@ -15409,96 +15682,6 @@
 </file>
 
 <file path=customXml/item3.xml><?xml version="1.0" encoding="utf-8"?>
-<b:Sources xmlns:b="http://schemas.openxmlformats.org/officeDocument/2006/bibliography" xmlns="http://schemas.openxmlformats.org/officeDocument/2006/bibliography" SelectedStyle="\HarvardAnglia2008OfficeOnline.xsl" StyleName="Harvard - Anglia" Version="2008">
-  <b:Source>
-    <b:Tag>Agi26</b:Tag>
-    <b:SourceType>InternetSite</b:SourceType>
-    <b:Guid>{78CC74B3-71D7-445A-BD1E-7DB0B7A44B13}</b:Guid>
-    <b:Title>What is MoSCoW Prioritization?</b:Title>
-    <b:Year>2026</b:Year>
-    <b:Author>
-      <b:Author>
-        <b:Corporate>Agile Business Consortium</b:Corporate>
-      </b:Author>
-    </b:Author>
-    <b:YearAccessed>2026</b:YearAccessed>
-    <b:MonthAccessed>July</b:MonthAccessed>
-    <b:DayAccessed>16</b:DayAccessed>
-    <b:URL>https://www.agilebusiness.org/resource/what-is-moscow-prioritization/</b:URL>
-    <b:RefOrder>1</b:RefOrder>
-  </b:Source>
-  <b:Source>
-    <b:Tag>Emb16</b:Tag>
-    <b:SourceType>InternetSite</b:SourceType>
-    <b:Guid>{96EC25F5-613B-41F7-9370-01F376E5A07F}</b:Guid>
-    <b:Author>
-      <b:Author>
-        <b:Corporate>Embarcadero</b:Corporate>
-      </b:Author>
-    </b:Author>
-    <b:Title>UML 1.5 Use Case Diagram Definition</b:Title>
-    <b:Year>2016</b:Year>
-    <b:YearAccessed>2026</b:YearAccessed>
-    <b:MonthAccessed>July</b:MonthAccessed>
-    <b:DayAccessed>17</b:DayAccessed>
-    <b:URL>https://docwiki.embarcadero.com/RADStudio/Athens/en/UML_1.5_Use_Case_Diagram_Definition</b:URL>
-    <b:RefOrder>2</b:RefOrder>
-  </b:Source>
-  <b:Source>
-    <b:Tag>Usa15</b:Tag>
-    <b:SourceType>InternetSite</b:SourceType>
-    <b:Guid>{B4141139-B38C-4554-A59F-ED8FEB6AA9B9}</b:Guid>
-    <b:Author>
-      <b:Author>
-        <b:Corporate>Usability First</b:Corporate>
-      </b:Author>
-    </b:Author>
-    <b:Title>Usability First - About Usability - Requirements Specification | Usability First</b:Title>
-    <b:Year>2015</b:Year>
-    <b:YearAccessed>2026</b:YearAccessed>
-    <b:MonthAccessed>July</b:MonthAccessed>
-    <b:DayAccessed>17</b:DayAccessed>
-    <b:URL>https://www.usabilityfirst.com/about-usability/requirements-specification/index.html</b:URL>
-    <b:RefOrder>3</b:RefOrder>
-  </b:Source>
-  <b:Source>
-    <b:Tag>For26</b:Tag>
-    <b:SourceType>InternetSite</b:SourceType>
-    <b:Guid>{E1E283C5-F393-4ABB-A75E-53D4BAF2D5B9}</b:Guid>
-    <b:Author>
-      <b:Author>
-        <b:Corporate>Formula One</b:Corporate>
-      </b:Author>
-    </b:Author>
-    <b:Title>F1 Glossary (P-T)</b:Title>
-    <b:Year>2026</b:Year>
-    <b:YearAccessed>2026</b:YearAccessed>
-    <b:MonthAccessed>July</b:MonthAccessed>
-    <b:DayAccessed>22</b:DayAccessed>
-    <b:URL>https://www.formula1.com/en/latest/article/f1-glossary-p-t.GBhLQtpeu9b8LrK5VM0F1</b:URL>
-    <b:RefOrder>4</b:RefOrder>
-  </b:Source>
-  <b:Source>
-    <b:Tag>QtG26</b:Tag>
-    <b:SourceType>InternetSite</b:SourceType>
-    <b:Guid>{A17225CA-ECDB-458F-837A-C1DE58C494CE}</b:Guid>
-    <b:Author>
-      <b:Author>
-        <b:Corporate>Qt Group</b:Corporate>
-      </b:Author>
-    </b:Author>
-    <b:Title>Qt Group Documentation</b:Title>
-    <b:Year>2026</b:Year>
-    <b:YearAccessed>2026</b:YearAccessed>
-    <b:MonthAccessed>July</b:MonthAccessed>
-    <b:DayAccessed>24</b:DayAccessed>
-    <b:URL>https://doc.qt.io/qt-6/qhboxlayout.html</b:URL>
-    <b:RefOrder>5</b:RefOrder>
-  </b:Source>
-</b:Sources>
-</file>
-
-<file path=customXml/item4.xml><?xml version="1.0" encoding="utf-8"?>
 <ct:contentTypeSchema xmlns:ct="http://schemas.microsoft.com/office/2006/metadata/contentType" xmlns:ma="http://schemas.microsoft.com/office/2006/metadata/properties/metaAttributes" ct:_="" ma:_="" ma:contentTypeName="Document" ma:contentTypeID="0x0101003EE04D916D7611488AA759BAA9A37716" ma:contentTypeVersion="34" ma:contentTypeDescription="Create a new document." ma:contentTypeScope="" ma:versionID="da43fd5ae1f7ae53ffd28d894363bfb4">
   <xsd:schema xmlns:xsd="http://www.w3.org/2001/XMLSchema" xmlns:xs="http://www.w3.org/2001/XMLSchema" xmlns:p="http://schemas.microsoft.com/office/2006/metadata/properties" xmlns:ns3="05ee331b-510f-4173-a5cc-a06d55a316fd" xmlns:ns4="ac56161a-35a2-4bac-99b6-8739237dc4f6" targetNamespace="http://schemas.microsoft.com/office/2006/metadata/properties" ma:root="true" ma:fieldsID="0e753ad016b352eaafbd0268c41c2a23" ns3:_="" ns4:_="">
     <xsd:import namespace="05ee331b-510f-4173-a5cc-a06d55a316fd"/>
@@ -15915,6 +16098,129 @@
 </ct:contentTypeSchema>
 </file>
 
+<file path=customXml/item4.xml><?xml version="1.0" encoding="utf-8"?>
+<b:Sources xmlns:b="http://schemas.openxmlformats.org/officeDocument/2006/bibliography" xmlns="http://schemas.openxmlformats.org/officeDocument/2006/bibliography" SelectedStyle="\HarvardAnglia2008OfficeOnline.xsl" StyleName="Harvard - Anglia" Version="2008">
+  <b:Source>
+    <b:Tag>Agi26</b:Tag>
+    <b:SourceType>InternetSite</b:SourceType>
+    <b:Guid>{78CC74B3-71D7-445A-BD1E-7DB0B7A44B13}</b:Guid>
+    <b:Title>What is MoSCoW Prioritization?</b:Title>
+    <b:Year>2026</b:Year>
+    <b:Author>
+      <b:Author>
+        <b:Corporate>Agile Business Consortium</b:Corporate>
+      </b:Author>
+    </b:Author>
+    <b:YearAccessed>2026</b:YearAccessed>
+    <b:MonthAccessed>July</b:MonthAccessed>
+    <b:DayAccessed>16</b:DayAccessed>
+    <b:URL>https://www.agilebusiness.org/resource/what-is-moscow-prioritization/</b:URL>
+    <b:RefOrder>1</b:RefOrder>
+  </b:Source>
+  <b:Source>
+    <b:Tag>Emb16</b:Tag>
+    <b:SourceType>InternetSite</b:SourceType>
+    <b:Guid>{96EC25F5-613B-41F7-9370-01F376E5A07F}</b:Guid>
+    <b:Author>
+      <b:Author>
+        <b:Corporate>Embarcadero</b:Corporate>
+      </b:Author>
+    </b:Author>
+    <b:Title>UML 1.5 Use Case Diagram Definition</b:Title>
+    <b:Year>2016</b:Year>
+    <b:YearAccessed>2026</b:YearAccessed>
+    <b:MonthAccessed>July</b:MonthAccessed>
+    <b:DayAccessed>17</b:DayAccessed>
+    <b:URL>https://docwiki.embarcadero.com/RADStudio/Athens/en/UML_1.5_Use_Case_Diagram_Definition</b:URL>
+    <b:RefOrder>2</b:RefOrder>
+  </b:Source>
+  <b:Source>
+    <b:Tag>Usa15</b:Tag>
+    <b:SourceType>InternetSite</b:SourceType>
+    <b:Guid>{B4141139-B38C-4554-A59F-ED8FEB6AA9B9}</b:Guid>
+    <b:Author>
+      <b:Author>
+        <b:Corporate>Usability First</b:Corporate>
+      </b:Author>
+    </b:Author>
+    <b:Title>Usability First - About Usability - Requirements Specification | Usability First</b:Title>
+    <b:Year>2015</b:Year>
+    <b:YearAccessed>2026</b:YearAccessed>
+    <b:MonthAccessed>July</b:MonthAccessed>
+    <b:DayAccessed>17</b:DayAccessed>
+    <b:URL>https://www.usabilityfirst.com/about-usability/requirements-specification/index.html</b:URL>
+    <b:RefOrder>3</b:RefOrder>
+  </b:Source>
+  <b:Source>
+    <b:Tag>For26</b:Tag>
+    <b:SourceType>InternetSite</b:SourceType>
+    <b:Guid>{E1E283C5-F393-4ABB-A75E-53D4BAF2D5B9}</b:Guid>
+    <b:Author>
+      <b:Author>
+        <b:Corporate>Formula One</b:Corporate>
+      </b:Author>
+    </b:Author>
+    <b:Title>F1 Glossary (P-T)</b:Title>
+    <b:Year>2026</b:Year>
+    <b:YearAccessed>2026</b:YearAccessed>
+    <b:MonthAccessed>July</b:MonthAccessed>
+    <b:DayAccessed>22</b:DayAccessed>
+    <b:URL>https://www.formula1.com/en/latest/article/f1-glossary-p-t.GBhLQtpeu9b8LrK5VM0F1</b:URL>
+    <b:RefOrder>6</b:RefOrder>
+  </b:Source>
+  <b:Source>
+    <b:Tag>QtG26</b:Tag>
+    <b:SourceType>InternetSite</b:SourceType>
+    <b:Guid>{A17225CA-ECDB-458F-837A-C1DE58C494CE}</b:Guid>
+    <b:Author>
+      <b:Author>
+        <b:Corporate>Qt Group</b:Corporate>
+      </b:Author>
+    </b:Author>
+    <b:Title>Qt Group Documentation</b:Title>
+    <b:Year>2026</b:Year>
+    <b:YearAccessed>2026</b:YearAccessed>
+    <b:MonthAccessed>July</b:MonthAccessed>
+    <b:DayAccessed>24</b:DayAccessed>
+    <b:URL>https://doc.qt.io/qt-6/qhboxlayout.html</b:URL>
+    <b:RefOrder>7</b:RefOrder>
+  </b:Source>
+  <b:Source>
+    <b:Tag>C4M26</b:Tag>
+    <b:SourceType>InternetSite</b:SourceType>
+    <b:Guid>{061F5457-C62E-4BE4-B8E4-1D67A8E249A3}</b:Guid>
+    <b:Author>
+      <b:Author>
+        <b:Corporate>C4 Model</b:Corporate>
+      </b:Author>
+    </b:Author>
+    <b:Title>Container diagram | C4 model</b:Title>
+    <b:YearAccessed>2026</b:YearAccessed>
+    <b:MonthAccessed>July</b:MonthAccessed>
+    <b:DayAccessed>25</b:DayAccessed>
+    <b:URL>https://c4model.com/diagrams/container</b:URL>
+    <b:RefOrder>4</b:RefOrder>
+  </b:Source>
+  <b:Source>
+    <b:Tag>Gee26</b:Tag>
+    <b:SourceType>InternetSite</b:SourceType>
+    <b:Guid>{0F3FA388-D9C8-413E-BAB0-142FA5CF2BD1}</b:Guid>
+    <b:Author>
+      <b:Author>
+        <b:Corporate>Geeks for Geeks</b:Corporate>
+      </b:Author>
+    </b:Author>
+    <b:Title>Component Based Diagram - Unified Modeling Language (UML)</b:Title>
+    <b:Year>2026</b:Year>
+    <b:YearAccessed>2026</b:YearAccessed>
+    <b:MonthAccessed>July</b:MonthAccessed>
+    <b:DayAccessed>25</b:DayAccessed>
+    <b:URL>https://www.geeksforgeeks.org/software-engineering/component-based-diagram/</b:URL>
+    <b:RefOrder>5</b:RefOrder>
+  </b:Source>
+</b:Sources>
+</file>
+
 <file path=customXml/itemProps1.xml><?xml version="1.0" encoding="utf-8"?>
 <ds:datastoreItem xmlns:ds="http://schemas.openxmlformats.org/officeDocument/2006/customXml" ds:itemID="{5C51FF54-1CBD-43E8-9B2A-B56F20CDF09A}">
   <ds:schemaRefs>
@@ -15934,14 +16240,6 @@
 </file>
 
 <file path=customXml/itemProps3.xml><?xml version="1.0" encoding="utf-8"?>
-<ds:datastoreItem xmlns:ds="http://schemas.openxmlformats.org/officeDocument/2006/customXml" ds:itemID="{71211F0F-0407-4A06-B625-E2020ACD9E37}">
-  <ds:schemaRefs>
-    <ds:schemaRef ds:uri="http://schemas.openxmlformats.org/officeDocument/2006/bibliography"/>
-  </ds:schemaRefs>
-</ds:datastoreItem>
-</file>
-
-<file path=customXml/itemProps4.xml><?xml version="1.0" encoding="utf-8"?>
 <ds:datastoreItem xmlns:ds="http://schemas.openxmlformats.org/officeDocument/2006/customXml" ds:itemID="{3B693098-FF00-4095-9757-18FD92BDA8E2}">
   <ds:schemaRefs>
     <ds:schemaRef ds:uri="http://schemas.microsoft.com/office/2006/metadata/contentType"/>
@@ -15958,4 +16256,12 @@
     <ds:schemaRef ds:uri="http://schemas.microsoft.com/internal/obd"/>
   </ds:schemaRefs>
 </ds:datastoreItem>
+</file>
+
+<file path=customXml/itemProps4.xml><?xml version="1.0" encoding="utf-8"?>
+<ds:datastoreItem xmlns:ds="http://schemas.openxmlformats.org/officeDocument/2006/customXml" ds:itemID="{36F9463C-3B57-4F39-8688-609D8413C2A6}">
+  <ds:schemaRefs>
+    <ds:schemaRef ds:uri="http://schemas.openxmlformats.org/officeDocument/2006/bibliography"/>
+  </ds:schemaRefs>
+</ds:datastoreItem>
 </file>
</xml_diff>

<commit_message>
Adding Lap counter and stop race button.
</commit_message>
<xml_diff>
--- a/docs/Technical Report Eoin Fitzsimons.docx
+++ b/docs/Technical Report Eoin Fitzsimons.docx
@@ -1,6 +1,6 @@
 
 <file path=word/document.xml><?xml version="1.0" encoding="utf-8"?>
-<w:document xmlns:wpc="http://schemas.microsoft.com/office/word/2010/wordprocessingCanvas" xmlns:cx="http://schemas.microsoft.com/office/drawing/2014/chartex" xmlns:cx1="http://schemas.microsoft.com/office/drawing/2015/9/8/chartex" xmlns:cx2="http://schemas.microsoft.com/office/drawing/2015/10/21/chartex" xmlns:cx3="http://schemas.microsoft.com/office/drawing/2016/5/9/chartex" xmlns:cx4="http://schemas.microsoft.com/office/drawing/2016/5/10/chartex" xmlns:cx5="http://schemas.microsoft.com/office/drawing/2016/5/11/chartex" xmlns:cx6="http://schemas.microsoft.com/office/drawing/2016/5/12/chartex" xmlns:cx7="http://schemas.microsoft.com/office/drawing/2016/5/13/chartex" xmlns:cx8="http://schemas.microsoft.com/office/drawing/2016/5/14/chartex" xmlns:mc="http://schemas.openxmlformats.org/markup-compatibility/2006" xmlns:aink="http://schemas.microsoft.com/office/drawing/2016/ink" xmlns:am3d="http://schemas.microsoft.com/office/drawing/2017/model3d" xmlns:o="urn:schemas-microsoft-com:office:office" xmlns:oel="http://schemas.microsoft.com/office/2019/extlst" xmlns:r="http://schemas.openxmlformats.org/officeDocument/2006/relationships" xmlns:m="http://schemas.openxmlformats.org/officeDocument/2006/math" xmlns:v="urn:schemas-microsoft-com:vml" xmlns:wp14="http://schemas.microsoft.com/office/word/2010/wordprocessingDrawing" xmlns:wp="http://schemas.openxmlformats.org/drawingml/2006/wordprocessingDrawing" xmlns:w10="urn:schemas-microsoft-com:office:word" xmlns:w="http://schemas.openxmlformats.org/wordprocessingml/2006/main" xmlns:w14="http://schemas.microsoft.com/office/word/2010/wordml" xmlns:w15="http://schemas.microsoft.com/office/word/2012/wordml" xmlns:w16cex="http://schemas.microsoft.com/office/word/2018/wordml/cex" xmlns:w16cid="http://schemas.microsoft.com/office/word/2016/wordml/cid" xmlns:w16="http://schemas.microsoft.com/office/word/2018/wordml" xmlns:w16du="http://schemas.microsoft.com/office/word/2023/wordml/word16du" xmlns:w16sdtdh="http://schemas.microsoft.com/office/word/2020/wordml/sdtdatahash" xmlns:w16sdtfl="http://schemas.microsoft.com/office/word/2024/wordml/sdtformatlock" xmlns:w16se="http://schemas.microsoft.com/office/word/2015/wordml/symex" xmlns:wpg="http://schemas.microsoft.com/office/word/2010/wordprocessingGroup" xmlns:wpi="http://schemas.microsoft.com/office/word/2010/wordprocessingInk" xmlns:wne="http://schemas.microsoft.com/office/word/2006/wordml" xmlns:wps="http://schemas.microsoft.com/office/word/2010/wordprocessingShape" mc:Ignorable="w14 w15 w16se w16cid w16 w16cex w16sdtdh w16sdtfl w16du wp14">
+<w:document xmlns:wpc="http://schemas.microsoft.com/office/word/2010/wordprocessingCanvas" xmlns:cx="http://schemas.microsoft.com/office/drawing/2014/chartex" xmlns:cx1="http://schemas.microsoft.com/office/drawing/2015/9/8/chartex" xmlns:cx2="http://schemas.microsoft.com/office/drawing/2015/10/21/chartex" xmlns:cx3="http://schemas.microsoft.com/office/drawing/2016/5/9/chartex" xmlns:cx4="http://schemas.microsoft.com/office/drawing/2016/5/10/chartex" xmlns:cx5="http://schemas.microsoft.com/office/drawing/2016/5/11/chartex" xmlns:cx6="http://schemas.microsoft.com/office/drawing/2016/5/12/chartex" xmlns:cx7="http://schemas.microsoft.com/office/drawing/2016/5/13/chartex" xmlns:cx8="http://schemas.microsoft.com/office/drawing/2016/5/14/chartex" xmlns:mc="http://schemas.openxmlformats.org/markup-compatibility/2006" xmlns:aink="http://schemas.microsoft.com/office/drawing/2016/ink" xmlns:am3d="http://schemas.microsoft.com/office/drawing/2017/model3d" xmlns:o="urn:schemas-microsoft-com:office:office" xmlns:oel="http://schemas.microsoft.com/office/2019/extlst" xmlns:r="http://schemas.openxmlformats.org/officeDocument/2006/relationships" xmlns:m="http://schemas.openxmlformats.org/officeDocument/2006/math" xmlns:v="urn:schemas-microsoft-com:vml" xmlns:wp14="http://schemas.microsoft.com/office/word/2010/wordprocessingDrawing" xmlns:wp="http://schemas.openxmlformats.org/drawingml/2006/wordprocessingDrawing" xmlns:w10="urn:schemas-microsoft-com:office:word" xmlns:w="http://schemas.openxmlformats.org/wordprocessingml/2006/main" xmlns:w14="http://schemas.microsoft.com/office/word/2010/wordml" xmlns:w15="http://schemas.microsoft.com/office/word/2012/wordml" xmlns:w16cei="http://schemas.microsoft.com/office/word/2026/wordml/cei" xmlns:w16cex="http://schemas.microsoft.com/office/word/2018/wordml/cex" xmlns:w16cid="http://schemas.microsoft.com/office/word/2016/wordml/cid" xmlns:w16="http://schemas.microsoft.com/office/word/2018/wordml" xmlns:w16du="http://schemas.microsoft.com/office/word/2023/wordml/word16du" xmlns:w16sdtdh="http://schemas.microsoft.com/office/word/2020/wordml/sdtdatahash" xmlns:w16sdtfl="http://schemas.microsoft.com/office/word/2024/wordml/sdtformatlock" xmlns:w16se="http://schemas.microsoft.com/office/word/2015/wordml/symex" xmlns:wpg="http://schemas.microsoft.com/office/word/2010/wordprocessingGroup" xmlns:wpi="http://schemas.microsoft.com/office/word/2010/wordprocessingInk" xmlns:wne="http://schemas.microsoft.com/office/word/2006/wordml" xmlns:wps="http://schemas.microsoft.com/office/word/2010/wordprocessingShape" mc:Ignorable="w14 w15 w16se w16cid w16 w16cex w16sdtdh w16sdtfl w16du wp14">
   <w:body>
     <w:p>
       <w:pPr>
@@ -593,25 +593,7 @@
           <w:sz w:val="18"/>
           <w:szCs w:val="18"/>
         </w:rPr>
-        <w:t xml:space="preserve">supplied by the </w:t>
-      </w:r>
-      <w:proofErr w:type="gramStart"/>
-      <w:r>
-        <w:rPr>
-          <w:rFonts w:ascii="Verdana" w:hAnsi="Verdana"/>
-          <w:sz w:val="18"/>
-          <w:szCs w:val="18"/>
-        </w:rPr>
-        <w:t>Library</w:t>
-      </w:r>
-      <w:proofErr w:type="gramEnd"/>
-      <w:r>
-        <w:rPr>
-          <w:rFonts w:ascii="Verdana" w:hAnsi="Verdana"/>
-          <w:sz w:val="18"/>
-          <w:szCs w:val="18"/>
-        </w:rPr>
-        <w:t>.  To use other author's written or electronic work is illegal (plagiarism) and may result in disciplinary action.  Students may be required to undergo a viva (oral examination) if there is suspicion about the validity of their submitted work.</w:t>
+        <w:t>supplied by the Library.  To use other author's written or electronic work is illegal (plagiarism) and may result in disciplinary action.  Students may be required to undergo a viva (oral examination) if there is suspicion about the validity of their submitted work.</w:t>
       </w:r>
     </w:p>
     <w:p/>
@@ -678,25 +660,7 @@
           <w:bCs/>
           <w:highlight w:val="yellow"/>
         </w:rPr>
-        <w:t xml:space="preserve">successfully complete the </w:t>
-      </w:r>
-      <w:proofErr w:type="spellStart"/>
-      <w:r>
-        <w:rPr>
-          <w:b/>
-          <w:bCs/>
-          <w:highlight w:val="yellow"/>
-        </w:rPr>
-        <w:t>Epigeum</w:t>
-      </w:r>
-      <w:proofErr w:type="spellEnd"/>
-      <w:r>
-        <w:rPr>
-          <w:b/>
-          <w:bCs/>
-          <w:highlight w:val="yellow"/>
-        </w:rPr>
-        <w:t xml:space="preserve"> Academic Integrity Course</w:t>
+        <w:t>successfully complete the Epigeum Academic Integrity Course</w:t>
       </w:r>
       <w:r>
         <w:rPr>
@@ -1031,21 +995,7 @@
         <w:rPr>
           <w:b/>
         </w:rPr>
-        <w:t xml:space="preserve">Any project/assignment not submitted will be marked as a </w:t>
-      </w:r>
-      <w:proofErr w:type="gramStart"/>
-      <w:r>
-        <w:rPr>
-          <w:b/>
-        </w:rPr>
-        <w:t>fail</w:t>
-      </w:r>
-      <w:proofErr w:type="gramEnd"/>
-      <w:r>
-        <w:rPr>
-          <w:b/>
-        </w:rPr>
-        <w:t>.</w:t>
+        <w:t>Any project/assignment not submitted will be marked as a fail.</w:t>
       </w:r>
     </w:p>
     <w:p>
@@ -1069,21 +1019,7 @@
         <w:rPr>
           <w:b/>
         </w:rPr>
-        <w:t xml:space="preserve">Please check that you read AI and Academic Integrity Acknowledgement </w:t>
-      </w:r>
-      <w:proofErr w:type="spellStart"/>
-      <w:r>
-        <w:rPr>
-          <w:b/>
-        </w:rPr>
-        <w:t>Supplments</w:t>
-      </w:r>
-      <w:proofErr w:type="spellEnd"/>
-      <w:r>
-        <w:rPr>
-          <w:b/>
-        </w:rPr>
-        <w:t xml:space="preserve"> in this document</w:t>
+        <w:t>Please check that you read AI and Academic Integrity Acknowledgement Supplments in this document</w:t>
       </w:r>
     </w:p>
     <w:p/>
@@ -5766,13 +5702,8 @@
       </w:r>
     </w:p>
     <w:p>
-      <w:proofErr w:type="spellStart"/>
-      <w:r>
-        <w:t>pathlib</w:t>
-      </w:r>
-      <w:proofErr w:type="spellEnd"/>
-      <w:r>
-        <w:t xml:space="preserve"> – Path</w:t>
+      <w:r>
+        <w:t>pathlib – Path</w:t>
       </w:r>
     </w:p>
     <w:p>
@@ -5787,30 +5718,18 @@
     </w:p>
     <w:p>
       <w:r>
-        <w:t xml:space="preserve">typing – List, </w:t>
-      </w:r>
-      <w:proofErr w:type="spellStart"/>
-      <w:r>
-        <w:t>Dict</w:t>
-      </w:r>
-      <w:proofErr w:type="spellEnd"/>
-      <w:r>
-        <w:t>, Tuple</w:t>
-      </w:r>
-    </w:p>
-    <w:p>
-      <w:proofErr w:type="spellStart"/>
+        <w:t>typing – List, Dict, Tuple</w:t>
+      </w:r>
+    </w:p>
+    <w:p>
       <w:r>
         <w:t>json</w:t>
       </w:r>
-      <w:proofErr w:type="spellEnd"/>
-    </w:p>
-    <w:p>
-      <w:proofErr w:type="spellStart"/>
+    </w:p>
+    <w:p>
       <w:r>
         <w:t>dataclasses</w:t>
       </w:r>
-      <w:proofErr w:type="spellEnd"/>
     </w:p>
     <w:p>
       <w:r>
@@ -5819,18 +5738,14 @@
       <w:r>
         <w:t xml:space="preserve"> - </w:t>
       </w:r>
-      <w:proofErr w:type="spellStart"/>
       <w:r>
         <w:t>SystemRandom</w:t>
       </w:r>
-      <w:proofErr w:type="spellEnd"/>
-    </w:p>
-    <w:p>
-      <w:proofErr w:type="spellStart"/>
+    </w:p>
+    <w:p>
       <w:r>
         <w:t>os</w:t>
       </w:r>
-      <w:proofErr w:type="spellEnd"/>
     </w:p>
     <w:p>
       <w:pPr>
@@ -6114,15 +6029,7 @@
     </w:p>
     <w:p>
       <w:r>
-        <w:t xml:space="preserve">The </w:t>
-      </w:r>
-      <w:proofErr w:type="spellStart"/>
-      <w:r>
-        <w:t>MoSCoW</w:t>
-      </w:r>
-      <w:proofErr w:type="spellEnd"/>
-      <w:r>
-        <w:t xml:space="preserve"> prioritisation method was used to classify functional requirements according to their importance. Core functionality required for the successful completion of a race simulation was classified as Must Have, features that improve the user experience but are not essential to the simulation were classified as Should Have or Could Have, while functionality outside the scope of the minimum viable product (MVP) was classified as Won't Have</w:t>
+        <w:t>The MoSCoW prioritisation method was used to classify functional requirements according to their importance. Core functionality required for the successful completion of a race simulation was classified as Must Have, features that improve the user experience but are not essential to the simulation were classified as Should Have or Could Have, while functionality outside the scope of the minimum viable product (MVP) was classified as Won't Have</w:t>
       </w:r>
       <w:r>
         <w:t>.</w:t>
@@ -10279,15 +10186,7 @@
         <w:t xml:space="preserve"> This feature exists both in backend and frontend.</w:t>
       </w:r>
       <w:r>
-        <w:t xml:space="preserve"> To not overburden the page with screenshots, this is merely the backend section, I wrote more for the </w:t>
-      </w:r>
-      <w:proofErr w:type="gramStart"/>
-      <w:r>
-        <w:t>frontend</w:t>
-      </w:r>
-      <w:proofErr w:type="gramEnd"/>
-      <w:r>
-        <w:t xml:space="preserve"> but it is very similar, the only differences being references to physical space.</w:t>
+        <w:t xml:space="preserve"> To not overburden the page with screenshots, this is merely the backend section, I wrote more for the frontend but it is very similar, the only differences being references to physical space.</w:t>
       </w:r>
     </w:p>
     <w:p>
@@ -10368,15 +10267,7 @@
     </w:p>
     <w:p>
       <w:r>
-        <w:t xml:space="preserve">As seen in Telemetry 2, I create the tables using </w:t>
-      </w:r>
-      <w:proofErr w:type="spellStart"/>
-      <w:r>
-        <w:t>QHBoxLayout</w:t>
-      </w:r>
-      <w:proofErr w:type="spellEnd"/>
-      <w:r>
-        <w:t xml:space="preserve">, this lines up widgets horizontally without additional need for manually </w:t>
+        <w:t xml:space="preserve">As seen in Telemetry 2, I create the tables using QHBoxLayout, this lines up widgets horizontally without additional need for manually </w:t>
       </w:r>
       <w:r>
         <w:t>placing</w:t>
@@ -10501,15 +10392,7 @@
         <w:t xml:space="preserve">As seen in Telemetry 3, I have an attribute error stemming from line 64 - </w:t>
       </w:r>
       <w:r>
-        <w:t>self._</w:t>
-      </w:r>
-      <w:proofErr w:type="spellStart"/>
-      <w:r>
-        <w:t>publish_telemetry</w:t>
-      </w:r>
-      <w:proofErr w:type="spellEnd"/>
-      <w:r>
-        <w:t>()</w:t>
+        <w:t>self._publish_telemetry()</w:t>
       </w:r>
       <w:r>
         <w:t>. The root cause of this is the telemetry is being called prior to the creation of tables, Telemetry 2 above shows I do have the creation of these tables within my code. This in an architecture issue rather than a</w:t>
@@ -10787,7 +10670,16 @@
         </w:drawing>
       </w:r>
       <w:r>
-        <w:t>I wanted drivers to follow a pattern rather than a truly random set of attributes; I came up with 4 attributes I wanted and 10 driver personas I could apply the ranges to. Age is something also affected by the persona.</w:t>
+        <w:t>Drivers</w:t>
+      </w:r>
+      <w:r>
+        <w:t xml:space="preserve"> follow a pattern rather than a truly random set of attributes; </w:t>
+      </w:r>
+      <w:r>
+        <w:t>There are</w:t>
+      </w:r>
+      <w:r>
+        <w:t xml:space="preserve"> 4 attributes and 10 driver personas. Age is affected by the persona.</w:t>
       </w:r>
     </w:p>
     <w:p>
@@ -10892,6 +10784,9 @@
       </w:r>
       <w:r>
         <w:t>then added the selected name.</w:t>
+      </w:r>
+      <w:r>
+        <w:t xml:space="preserve"> There was also an issue with cars and drivers not being assigned in a 1 to 1 relationship.</w:t>
       </w:r>
     </w:p>
     <w:p>
@@ -11170,16 +11065,68 @@
       </w:r>
     </w:p>
     <w:p>
-      <w:r>
-        <w:t xml:space="preserve">I wanted there to be a GUI of a race taking place before your eyes, not just timing screens and telemetry, but cars visually on a track. For that I needed to code my own racetrack, and in keeping with the scalability and modularity of the simulation, I had to coming up with a base idea of a track and then I also considered making it so it could be procedurally generated. </w:t>
-      </w:r>
-      <w:proofErr w:type="gramStart"/>
-      <w:r>
-        <w:t>Unfortunately</w:t>
-      </w:r>
-      <w:proofErr w:type="gramEnd"/>
-      <w:r>
-        <w:t xml:space="preserve"> I did not have the time to create this, and within the code there exists a basic ovalish loop.</w:t>
+      <w:pPr>
+        <w:rPr>
+          <w:sz w:val="24"/>
+          <w:szCs w:val="24"/>
+        </w:rPr>
+      </w:pPr>
+      <w:r>
+        <w:t>The graphical user interface is intended to show</w:t>
+      </w:r>
+      <w:r>
+        <w:t xml:space="preserve"> a race taking place </w:t>
+      </w:r>
+      <w:r>
+        <w:t xml:space="preserve">visually, rather than relying only on </w:t>
+      </w:r>
+      <w:r>
+        <w:t>timing screens and telemetry</w:t>
+      </w:r>
+      <w:r>
+        <w:t>. Cars are displayed</w:t>
+      </w:r>
+      <w:r>
+        <w:t xml:space="preserve"> on a track</w:t>
+      </w:r>
+      <w:r>
+        <w:t xml:space="preserve"> so </w:t>
+      </w:r>
+      <w:r>
+        <w:t xml:space="preserve">that </w:t>
+      </w:r>
+      <w:r>
+        <w:t>the progress of the race can be observed directly. To support this, a custom racetrack</w:t>
+      </w:r>
+      <w:r>
+        <w:t xml:space="preserve"> needed to </w:t>
+      </w:r>
+      <w:r>
+        <w:t>be implemented. In line</w:t>
+      </w:r>
+      <w:r>
+        <w:t xml:space="preserve"> with the scalability and modularity </w:t>
+      </w:r>
+      <w:r>
+        <w:t xml:space="preserve">goals </w:t>
+      </w:r>
+      <w:r>
+        <w:t xml:space="preserve">of the simulation, </w:t>
+      </w:r>
+      <w:r>
+        <w:t>the track design began</w:t>
+      </w:r>
+      <w:r>
+        <w:t xml:space="preserve"> with a </w:t>
+      </w:r>
+      <w:r>
+        <w:t>basic reusable structure, with procedural generation</w:t>
+      </w:r>
+      <w:r>
+        <w:t xml:space="preserve"> also considered </w:t>
+      </w:r>
+      <w:r>
+        <w:t>as a possible extension. However, due to time constraints, procedural track generation was not completed, and the current implementation uses a basic oval-style loop within the code.</w:t>
       </w:r>
     </w:p>
     <w:p>
@@ -12279,25 +12226,7 @@
           <w:szCs w:val="24"/>
           <w:highlight w:val="yellow"/>
         </w:rPr>
-        <w:t xml:space="preserve">. It may also include performance evaluations, scalability, correctness, etc. depending on the focus of the project.  </w:t>
-      </w:r>
-      <w:proofErr w:type="spellStart"/>
-      <w:r>
-        <w:rPr>
-          <w:sz w:val="24"/>
-          <w:szCs w:val="24"/>
-          <w:highlight w:val="yellow"/>
-        </w:rPr>
-        <w:t>Quantative</w:t>
-      </w:r>
-      <w:proofErr w:type="spellEnd"/>
-      <w:r>
-        <w:rPr>
-          <w:sz w:val="24"/>
-          <w:szCs w:val="24"/>
-          <w:highlight w:val="yellow"/>
-        </w:rPr>
-        <w:t xml:space="preserve"> results may be reported in tables or figures.</w:t>
+        <w:t>. It may also include performance evaluations, scalability, correctness, etc. depending on the focus of the project.  Quantative results may be reported in tables or figures.</w:t>
       </w:r>
     </w:p>
     <w:p>
@@ -12855,7 +12784,7 @@
           <w:noProof/>
         </w:rPr>
         <w:drawing>
-          <wp:inline distT="0" distB="0" distL="0" distR="0" wp14:anchorId="15905F45" wp14:editId="7D07CC84">
+          <wp:inline distT="0" distB="0" distL="0" distR="0" wp14:anchorId="15905F45" wp14:editId="4C508048">
             <wp:extent cx="1724025" cy="1228725"/>
             <wp:effectExtent l="0" t="0" r="0" b="0"/>
             <wp:docPr id="1287158093" name="Picture 4" descr="A blue and white logo&#10;&#10;AI-generated content may be incorrect."/>
@@ -13202,15 +13131,7 @@
     </w:p>
     <w:p>
       <w:r>
-        <w:t xml:space="preserve">Momentum uses Python for both the front-end dashboards and the back-end simulation logic and database management. The system relies on NumPy for fast calculations, Pandas for handling data, and SciPy for advanced statistics. The database uses SQLite to store all the information about drivers, teams, tracks, and championships, making it easy to save and load multi-season histories. All content creation and generation </w:t>
-      </w:r>
-      <w:proofErr w:type="gramStart"/>
-      <w:r>
-        <w:t>is</w:t>
-      </w:r>
-      <w:proofErr w:type="gramEnd"/>
-      <w:r>
-        <w:t xml:space="preserve"> handled by the database management system.</w:t>
+        <w:t>Momentum uses Python for both the front-end dashboards and the back-end simulation logic and database management. The system relies on NumPy for fast calculations, Pandas for handling data, and SciPy for advanced statistics. The database uses SQLite to store all the information about drivers, teams, tracks, and championships, making it easy to save and load multi-season histories. All content creation and generation is handled by the database management system.</w:t>
       </w:r>
     </w:p>
     <w:p>
@@ -13227,23 +13148,7 @@
     </w:p>
     <w:p>
       <w:r>
-        <w:t xml:space="preserve">Race results are produced by a real-time, </w:t>
-      </w:r>
-      <w:proofErr w:type="gramStart"/>
-      <w:r>
-        <w:t>agent based</w:t>
-      </w:r>
-      <w:proofErr w:type="gramEnd"/>
-      <w:r>
-        <w:t xml:space="preserve"> engine. Each driver is modelled as an autonomous AI agent that makes decisions on every simulation tick, targeting a frame rate of about 30 ticks per second. Agents consider their attributes, car condition, tyre state, fuel, nearby rivals, team orders and track conditions when choosing actions such as attack, defend, overtake or conserve. Discipline specific rules are applied by the engine to reflect differences between single seater, rally, endurance and other formats. Randomness is retained for low probability events such as mechanical failures or </w:t>
-      </w:r>
-      <w:proofErr w:type="gramStart"/>
-      <w:r>
-        <w:t>incidents</w:t>
-      </w:r>
-      <w:proofErr w:type="gramEnd"/>
-      <w:r>
-        <w:t xml:space="preserve"> so outcomes remain unpredictable, but most race behaviour emerges from agent interactions rather than repeated sampling. Performance sensitive results are cached where appropriate to keep leaderboards and UI queries responsive.</w:t>
+        <w:t>Race results are produced by a real-time, agent based engine. Each driver is modelled as an autonomous AI agent that makes decisions on every simulation tick, targeting a frame rate of about 30 ticks per second. Agents consider their attributes, car condition, tyre state, fuel, nearby rivals, team orders and track conditions when choosing actions such as attack, defend, overtake or conserve. Discipline specific rules are applied by the engine to reflect differences between single seater, rally, endurance and other formats. Randomness is retained for low probability events such as mechanical failures or incidents so outcomes remain unpredictable, but most race behaviour emerges from agent interactions rather than repeated sampling. Performance sensitive results are cached where appropriate to keep leaderboards and UI queries responsive.</w:t>
       </w:r>
     </w:p>
     <w:p>
@@ -13633,7 +13538,7 @@
           <w:noProof/>
         </w:rPr>
         <w:drawing>
-          <wp:inline distT="0" distB="0" distL="0" distR="0" wp14:anchorId="4440363F" wp14:editId="3C53FC6E">
+          <wp:inline distT="0" distB="0" distL="0" distR="0" wp14:anchorId="4440363F" wp14:editId="0126E5F4">
             <wp:extent cx="5486400" cy="3838575"/>
             <wp:effectExtent l="0" t="0" r="0" b="9525"/>
             <wp:docPr id="383730404" name="Picture 3" descr="A screenshot of a computer program&#10;&#10;AI-generated content may be incorrect."/>
@@ -14485,15 +14390,7 @@
               <w:jc w:val="both"/>
             </w:pPr>
             <w:r>
-              <w:t xml:space="preserve">I started building a Python prototype for my game. I began work on </w:t>
-            </w:r>
-            <w:proofErr w:type="gramStart"/>
-            <w:r>
-              <w:t>the team</w:t>
-            </w:r>
-            <w:proofErr w:type="gramEnd"/>
-            <w:r>
-              <w:t xml:space="preserve"> management, car development, financial management, and the race weekend structure and connected them through a basic Python GUI. The current version is only a prototype. None of the systems are fully finished, and the race simulation is not yet implemented. The main goal was to test ideas and system integration before moving to a more advanced platform.</w:t>
+              <w:t>I started building a Python prototype for my game. I began work on the team management, car development, financial management, and the race weekend structure and connected them through a basic Python GUI. The current version is only a prototype. None of the systems are fully finished, and the race simulation is not yet implemented. The main goal was to test ideas and system integration before moving to a more advanced platform.</w:t>
             </w:r>
           </w:p>
         </w:tc>
@@ -14935,15 +14832,7 @@
               <w:jc w:val="both"/>
             </w:pPr>
             <w:r>
-              <w:t xml:space="preserve">Reflect on what </w:t>
-            </w:r>
-            <w:proofErr w:type="gramStart"/>
-            <w:r>
-              <w:t>has happened</w:t>
-            </w:r>
-            <w:proofErr w:type="gramEnd"/>
-            <w:r>
-              <w:t xml:space="preserve"> in your project this month?</w:t>
+              <w:t>Reflect on what has happened in your project this month?</w:t>
             </w:r>
           </w:p>
           <w:p>
@@ -14966,13 +14855,8 @@
             <w:pPr>
               <w:jc w:val="both"/>
             </w:pPr>
-            <w:proofErr w:type="gramStart"/>
-            <w:r>
-              <w:t>mostly</w:t>
-            </w:r>
-            <w:proofErr w:type="gramEnd"/>
-            <w:r>
-              <w:t xml:space="preserve"> planning stuff</w:t>
+            <w:r>
+              <w:t>mostly planning stuff</w:t>
             </w:r>
           </w:p>
         </w:tc>
@@ -15009,37 +14893,16 @@
               <w:jc w:val="both"/>
             </w:pPr>
             <w:r>
-              <w:t xml:space="preserve">Consider what that meant for your project progress.  What were your successes? What challenges </w:t>
-            </w:r>
-            <w:proofErr w:type="gramStart"/>
-            <w:r>
-              <w:t>still remain</w:t>
-            </w:r>
-            <w:proofErr w:type="gramEnd"/>
-            <w:r>
-              <w:t xml:space="preserve">? </w:t>
+              <w:t xml:space="preserve">Consider what that meant for your project progress.  What were your successes? What challenges still remain? </w:t>
             </w:r>
           </w:p>
           <w:p>
             <w:pPr>
               <w:jc w:val="both"/>
             </w:pPr>
-            <w:proofErr w:type="gramStart"/>
             <w:r>
               <w:lastRenderedPageBreak/>
-              <w:t>Certainly</w:t>
-            </w:r>
-            <w:proofErr w:type="gramEnd"/>
-            <w:r>
-              <w:t xml:space="preserve"> helped give a direction with use cases and priorities, </w:t>
-            </w:r>
-            <w:proofErr w:type="spellStart"/>
-            <w:r>
-              <w:t>realised</w:t>
-            </w:r>
-            <w:proofErr w:type="spellEnd"/>
-            <w:r>
-              <w:t xml:space="preserve"> initial proposal was just plain stupid, overly ambitious, and unrealistic for a college project.</w:t>
+              <w:t>Certainly helped give a direction with use cases and priorities, realised initial proposal was just plain stupid, overly ambitious, and unrealistic for a college project.</w:t>
             </w:r>
           </w:p>
         </w:tc>
@@ -15424,15 +15287,7 @@
               <w:jc w:val="both"/>
             </w:pPr>
             <w:r>
-              <w:t xml:space="preserve">Reflect on what </w:t>
-            </w:r>
-            <w:proofErr w:type="gramStart"/>
-            <w:r>
-              <w:t>has happened</w:t>
-            </w:r>
-            <w:proofErr w:type="gramEnd"/>
-            <w:r>
-              <w:t xml:space="preserve"> in your project this month?</w:t>
+              <w:t>Reflect on what has happened in your project this month?</w:t>
             </w:r>
           </w:p>
           <w:p>
@@ -15484,15 +15339,7 @@
               <w:jc w:val="both"/>
             </w:pPr>
             <w:r>
-              <w:t xml:space="preserve">Consider what that meant for your project progress.  What were your successes? What challenges </w:t>
-            </w:r>
-            <w:proofErr w:type="gramStart"/>
-            <w:r>
-              <w:t>still remain</w:t>
-            </w:r>
-            <w:proofErr w:type="gramEnd"/>
-            <w:r>
-              <w:t xml:space="preserve">? </w:t>
+              <w:t xml:space="preserve">Consider what that meant for your project progress.  What were your successes? What challenges still remain? </w:t>
             </w:r>
           </w:p>
           <w:p>
@@ -15502,23 +15349,7 @@
           </w:p>
           <w:p>
             <w:r>
-              <w:t xml:space="preserve">This change gives </w:t>
-            </w:r>
-            <w:proofErr w:type="gramStart"/>
-            <w:r>
-              <w:t>visible,</w:t>
-            </w:r>
-            <w:proofErr w:type="gramEnd"/>
-            <w:r>
-              <w:t xml:space="preserve"> </w:t>
-            </w:r>
-            <w:proofErr w:type="spellStart"/>
-            <w:r>
-              <w:t>behaviour</w:t>
-            </w:r>
-            <w:proofErr w:type="spellEnd"/>
-            <w:r>
-              <w:t xml:space="preserve"> for demos, but some docs still describe the old Monte Carlo approach.</w:t>
+              <w:t>This change gives visible, behaviour for demos, but some docs still describe the old Monte Carlo approach.</w:t>
             </w:r>
           </w:p>
           <w:p>
@@ -15654,7 +15485,12 @@
       </w:r>
     </w:p>
     <w:sectPr>
-      <w:footerReference w:type="default" r:id="rId37"/>
+      <w:headerReference w:type="even" r:id="rId37"/>
+      <w:headerReference w:type="default" r:id="rId38"/>
+      <w:footerReference w:type="even" r:id="rId39"/>
+      <w:footerReference w:type="default" r:id="rId40"/>
+      <w:headerReference w:type="first" r:id="rId41"/>
+      <w:footerReference w:type="first" r:id="rId42"/>
       <w:pgSz w:w="11906" w:h="16838" w:code="9"/>
       <w:pgMar w:top="1440" w:right="1440" w:bottom="1440" w:left="1440" w:header="709" w:footer="709" w:gutter="0"/>
       <w:pgNumType w:start="0"/>
@@ -15667,7 +15503,7 @@
 </file>
 
 <file path=word/endnotes.xml><?xml version="1.0" encoding="utf-8"?>
-<w:endnotes xmlns:wpc="http://schemas.microsoft.com/office/word/2010/wordprocessingCanvas" xmlns:cx="http://schemas.microsoft.com/office/drawing/2014/chartex" xmlns:cx1="http://schemas.microsoft.com/office/drawing/2015/9/8/chartex" xmlns:cx2="http://schemas.microsoft.com/office/drawing/2015/10/21/chartex" xmlns:cx3="http://schemas.microsoft.com/office/drawing/2016/5/9/chartex" xmlns:cx4="http://schemas.microsoft.com/office/drawing/2016/5/10/chartex" xmlns:cx5="http://schemas.microsoft.com/office/drawing/2016/5/11/chartex" xmlns:cx6="http://schemas.microsoft.com/office/drawing/2016/5/12/chartex" xmlns:cx7="http://schemas.microsoft.com/office/drawing/2016/5/13/chartex" xmlns:cx8="http://schemas.microsoft.com/office/drawing/2016/5/14/chartex" xmlns:mc="http://schemas.openxmlformats.org/markup-compatibility/2006" xmlns:aink="http://schemas.microsoft.com/office/drawing/2016/ink" xmlns:am3d="http://schemas.microsoft.com/office/drawing/2017/model3d" xmlns:o="urn:schemas-microsoft-com:office:office" xmlns:oel="http://schemas.microsoft.com/office/2019/extlst" xmlns:r="http://schemas.openxmlformats.org/officeDocument/2006/relationships" xmlns:m="http://schemas.openxmlformats.org/officeDocument/2006/math" xmlns:v="urn:schemas-microsoft-com:vml" xmlns:wp14="http://schemas.microsoft.com/office/word/2010/wordprocessingDrawing" xmlns:wp="http://schemas.openxmlformats.org/drawingml/2006/wordprocessingDrawing" xmlns:w10="urn:schemas-microsoft-com:office:word" xmlns:w="http://schemas.openxmlformats.org/wordprocessingml/2006/main" xmlns:w14="http://schemas.microsoft.com/office/word/2010/wordml" xmlns:w15="http://schemas.microsoft.com/office/word/2012/wordml" xmlns:w16cex="http://schemas.microsoft.com/office/word/2018/wordml/cex" xmlns:w16cid="http://schemas.microsoft.com/office/word/2016/wordml/cid" xmlns:w16="http://schemas.microsoft.com/office/word/2018/wordml" xmlns:w16du="http://schemas.microsoft.com/office/word/2023/wordml/word16du" xmlns:w16sdtdh="http://schemas.microsoft.com/office/word/2020/wordml/sdtdatahash" xmlns:w16sdtfl="http://schemas.microsoft.com/office/word/2024/wordml/sdtformatlock" xmlns:w16se="http://schemas.microsoft.com/office/word/2015/wordml/symex" xmlns:wpg="http://schemas.microsoft.com/office/word/2010/wordprocessingGroup" xmlns:wpi="http://schemas.microsoft.com/office/word/2010/wordprocessingInk" xmlns:wne="http://schemas.microsoft.com/office/word/2006/wordml" xmlns:wps="http://schemas.microsoft.com/office/word/2010/wordprocessingShape" mc:Ignorable="w14 w15 w16se w16cid w16 w16cex w16sdtdh w16sdtfl w16du wp14">
+<w:endnotes xmlns:wpc="http://schemas.microsoft.com/office/word/2010/wordprocessingCanvas" xmlns:cx="http://schemas.microsoft.com/office/drawing/2014/chartex" xmlns:cx1="http://schemas.microsoft.com/office/drawing/2015/9/8/chartex" xmlns:cx2="http://schemas.microsoft.com/office/drawing/2015/10/21/chartex" xmlns:cx3="http://schemas.microsoft.com/office/drawing/2016/5/9/chartex" xmlns:cx4="http://schemas.microsoft.com/office/drawing/2016/5/10/chartex" xmlns:cx5="http://schemas.microsoft.com/office/drawing/2016/5/11/chartex" xmlns:cx6="http://schemas.microsoft.com/office/drawing/2016/5/12/chartex" xmlns:cx7="http://schemas.microsoft.com/office/drawing/2016/5/13/chartex" xmlns:cx8="http://schemas.microsoft.com/office/drawing/2016/5/14/chartex" xmlns:mc="http://schemas.openxmlformats.org/markup-compatibility/2006" xmlns:aink="http://schemas.microsoft.com/office/drawing/2016/ink" xmlns:am3d="http://schemas.microsoft.com/office/drawing/2017/model3d" xmlns:o="urn:schemas-microsoft-com:office:office" xmlns:oel="http://schemas.microsoft.com/office/2019/extlst" xmlns:r="http://schemas.openxmlformats.org/officeDocument/2006/relationships" xmlns:m="http://schemas.openxmlformats.org/officeDocument/2006/math" xmlns:v="urn:schemas-microsoft-com:vml" xmlns:wp14="http://schemas.microsoft.com/office/word/2010/wordprocessingDrawing" xmlns:wp="http://schemas.openxmlformats.org/drawingml/2006/wordprocessingDrawing" xmlns:w10="urn:schemas-microsoft-com:office:word" xmlns:w="http://schemas.openxmlformats.org/wordprocessingml/2006/main" xmlns:w14="http://schemas.microsoft.com/office/word/2010/wordml" xmlns:w15="http://schemas.microsoft.com/office/word/2012/wordml" xmlns:w16cei="http://schemas.microsoft.com/office/word/2026/wordml/cei" xmlns:w16cex="http://schemas.microsoft.com/office/word/2018/wordml/cex" xmlns:w16cid="http://schemas.microsoft.com/office/word/2016/wordml/cid" xmlns:w16="http://schemas.microsoft.com/office/word/2018/wordml" xmlns:w16du="http://schemas.microsoft.com/office/word/2023/wordml/word16du" xmlns:w16sdtdh="http://schemas.microsoft.com/office/word/2020/wordml/sdtdatahash" xmlns:w16sdtfl="http://schemas.microsoft.com/office/word/2024/wordml/sdtformatlock" xmlns:w16se="http://schemas.microsoft.com/office/word/2015/wordml/symex" xmlns:wpg="http://schemas.microsoft.com/office/word/2010/wordprocessingGroup" xmlns:wpi="http://schemas.microsoft.com/office/word/2010/wordprocessingInk" xmlns:wne="http://schemas.microsoft.com/office/word/2006/wordml" xmlns:wps="http://schemas.microsoft.com/office/word/2010/wordprocessingShape" mc:Ignorable="w14 w15 w16se w16cid w16 w16cex w16sdtdh w16sdtfl w16du wp14">
   <w:endnote w:type="separator" w:id="-1">
     <w:p>
       <w:pPr>
@@ -15692,7 +15528,17 @@
 </file>
 
 <file path=word/footer1.xml><?xml version="1.0" encoding="utf-8"?>
-<w:ftr xmlns:wpc="http://schemas.microsoft.com/office/word/2010/wordprocessingCanvas" xmlns:cx="http://schemas.microsoft.com/office/drawing/2014/chartex" xmlns:cx1="http://schemas.microsoft.com/office/drawing/2015/9/8/chartex" xmlns:cx2="http://schemas.microsoft.com/office/drawing/2015/10/21/chartex" xmlns:cx3="http://schemas.microsoft.com/office/drawing/2016/5/9/chartex" xmlns:cx4="http://schemas.microsoft.com/office/drawing/2016/5/10/chartex" xmlns:cx5="http://schemas.microsoft.com/office/drawing/2016/5/11/chartex" xmlns:cx6="http://schemas.microsoft.com/office/drawing/2016/5/12/chartex" xmlns:cx7="http://schemas.microsoft.com/office/drawing/2016/5/13/chartex" xmlns:cx8="http://schemas.microsoft.com/office/drawing/2016/5/14/chartex" xmlns:mc="http://schemas.openxmlformats.org/markup-compatibility/2006" xmlns:aink="http://schemas.microsoft.com/office/drawing/2016/ink" xmlns:am3d="http://schemas.microsoft.com/office/drawing/2017/model3d" xmlns:o="urn:schemas-microsoft-com:office:office" xmlns:oel="http://schemas.microsoft.com/office/2019/extlst" xmlns:r="http://schemas.openxmlformats.org/officeDocument/2006/relationships" xmlns:m="http://schemas.openxmlformats.org/officeDocument/2006/math" xmlns:v="urn:schemas-microsoft-com:vml" xmlns:wp14="http://schemas.microsoft.com/office/word/2010/wordprocessingDrawing" xmlns:wp="http://schemas.openxmlformats.org/drawingml/2006/wordprocessingDrawing" xmlns:w10="urn:schemas-microsoft-com:office:word" xmlns:w="http://schemas.openxmlformats.org/wordprocessingml/2006/main" xmlns:w14="http://schemas.microsoft.com/office/word/2010/wordml" xmlns:w15="http://schemas.microsoft.com/office/word/2012/wordml" xmlns:w16cex="http://schemas.microsoft.com/office/word/2018/wordml/cex" xmlns:w16cid="http://schemas.microsoft.com/office/word/2016/wordml/cid" xmlns:w16="http://schemas.microsoft.com/office/word/2018/wordml" xmlns:w16du="http://schemas.microsoft.com/office/word/2023/wordml/word16du" xmlns:w16sdtdh="http://schemas.microsoft.com/office/word/2020/wordml/sdtdatahash" xmlns:w16sdtfl="http://schemas.microsoft.com/office/word/2024/wordml/sdtformatlock" xmlns:w16se="http://schemas.microsoft.com/office/word/2015/wordml/symex" xmlns:wpg="http://schemas.microsoft.com/office/word/2010/wordprocessingGroup" xmlns:wpi="http://schemas.microsoft.com/office/word/2010/wordprocessingInk" xmlns:wne="http://schemas.microsoft.com/office/word/2006/wordml" xmlns:wps="http://schemas.microsoft.com/office/word/2010/wordprocessingShape" mc:Ignorable="w14 w15 w16se w16cid w16 w16cex w16sdtdh w16sdtfl w16du wp14">
+<w:ftr xmlns:wpc="http://schemas.microsoft.com/office/word/2010/wordprocessingCanvas" xmlns:cx="http://schemas.microsoft.com/office/drawing/2014/chartex" xmlns:cx1="http://schemas.microsoft.com/office/drawing/2015/9/8/chartex" xmlns:cx2="http://schemas.microsoft.com/office/drawing/2015/10/21/chartex" xmlns:cx3="http://schemas.microsoft.com/office/drawing/2016/5/9/chartex" xmlns:cx4="http://schemas.microsoft.com/office/drawing/2016/5/10/chartex" xmlns:cx5="http://schemas.microsoft.com/office/drawing/2016/5/11/chartex" xmlns:cx6="http://schemas.microsoft.com/office/drawing/2016/5/12/chartex" xmlns:cx7="http://schemas.microsoft.com/office/drawing/2016/5/13/chartex" xmlns:cx8="http://schemas.microsoft.com/office/drawing/2016/5/14/chartex" xmlns:mc="http://schemas.openxmlformats.org/markup-compatibility/2006" xmlns:aink="http://schemas.microsoft.com/office/drawing/2016/ink" xmlns:am3d="http://schemas.microsoft.com/office/drawing/2017/model3d" xmlns:o="urn:schemas-microsoft-com:office:office" xmlns:oel="http://schemas.microsoft.com/office/2019/extlst" xmlns:r="http://schemas.openxmlformats.org/officeDocument/2006/relationships" xmlns:m="http://schemas.openxmlformats.org/officeDocument/2006/math" xmlns:v="urn:schemas-microsoft-com:vml" xmlns:wp14="http://schemas.microsoft.com/office/word/2010/wordprocessingDrawing" xmlns:wp="http://schemas.openxmlformats.org/drawingml/2006/wordprocessingDrawing" xmlns:w10="urn:schemas-microsoft-com:office:word" xmlns:w="http://schemas.openxmlformats.org/wordprocessingml/2006/main" xmlns:w14="http://schemas.microsoft.com/office/word/2010/wordml" xmlns:w15="http://schemas.microsoft.com/office/word/2012/wordml" xmlns:w16cei="http://schemas.microsoft.com/office/word/2026/wordml/cei" xmlns:w16cex="http://schemas.microsoft.com/office/word/2018/wordml/cex" xmlns:w16cid="http://schemas.microsoft.com/office/word/2016/wordml/cid" xmlns:w16="http://schemas.microsoft.com/office/word/2018/wordml" xmlns:w16du="http://schemas.microsoft.com/office/word/2023/wordml/word16du" xmlns:w16sdtdh="http://schemas.microsoft.com/office/word/2020/wordml/sdtdatahash" xmlns:w16sdtfl="http://schemas.microsoft.com/office/word/2024/wordml/sdtformatlock" xmlns:w16se="http://schemas.microsoft.com/office/word/2015/wordml/symex" xmlns:wpg="http://schemas.microsoft.com/office/word/2010/wordprocessingGroup" xmlns:wpi="http://schemas.microsoft.com/office/word/2010/wordprocessingInk" xmlns:wne="http://schemas.microsoft.com/office/word/2006/wordml" xmlns:wps="http://schemas.microsoft.com/office/word/2010/wordprocessingShape" mc:Ignorable="w14 w15 w16se w16cid w16 w16cex w16sdtdh w16sdtfl w16du wp14">
+  <w:p>
+    <w:pPr>
+      <w:pStyle w:val="Footer"/>
+    </w:pPr>
+  </w:p>
+</w:ftr>
+</file>
+
+<file path=word/footer2.xml><?xml version="1.0" encoding="utf-8"?>
+<w:ftr xmlns:wpc="http://schemas.microsoft.com/office/word/2010/wordprocessingCanvas" xmlns:cx="http://schemas.microsoft.com/office/drawing/2014/chartex" xmlns:cx1="http://schemas.microsoft.com/office/drawing/2015/9/8/chartex" xmlns:cx2="http://schemas.microsoft.com/office/drawing/2015/10/21/chartex" xmlns:cx3="http://schemas.microsoft.com/office/drawing/2016/5/9/chartex" xmlns:cx4="http://schemas.microsoft.com/office/drawing/2016/5/10/chartex" xmlns:cx5="http://schemas.microsoft.com/office/drawing/2016/5/11/chartex" xmlns:cx6="http://schemas.microsoft.com/office/drawing/2016/5/12/chartex" xmlns:cx7="http://schemas.microsoft.com/office/drawing/2016/5/13/chartex" xmlns:cx8="http://schemas.microsoft.com/office/drawing/2016/5/14/chartex" xmlns:mc="http://schemas.openxmlformats.org/markup-compatibility/2006" xmlns:aink="http://schemas.microsoft.com/office/drawing/2016/ink" xmlns:am3d="http://schemas.microsoft.com/office/drawing/2017/model3d" xmlns:o="urn:schemas-microsoft-com:office:office" xmlns:oel="http://schemas.microsoft.com/office/2019/extlst" xmlns:r="http://schemas.openxmlformats.org/officeDocument/2006/relationships" xmlns:m="http://schemas.openxmlformats.org/officeDocument/2006/math" xmlns:v="urn:schemas-microsoft-com:vml" xmlns:wp14="http://schemas.microsoft.com/office/word/2010/wordprocessingDrawing" xmlns:wp="http://schemas.openxmlformats.org/drawingml/2006/wordprocessingDrawing" xmlns:w10="urn:schemas-microsoft-com:office:word" xmlns:w="http://schemas.openxmlformats.org/wordprocessingml/2006/main" xmlns:w14="http://schemas.microsoft.com/office/word/2010/wordml" xmlns:w15="http://schemas.microsoft.com/office/word/2012/wordml" xmlns:w16cei="http://schemas.microsoft.com/office/word/2026/wordml/cei" xmlns:w16cex="http://schemas.microsoft.com/office/word/2018/wordml/cex" xmlns:w16cid="http://schemas.microsoft.com/office/word/2016/wordml/cid" xmlns:w16="http://schemas.microsoft.com/office/word/2018/wordml" xmlns:w16du="http://schemas.microsoft.com/office/word/2023/wordml/word16du" xmlns:w16sdtdh="http://schemas.microsoft.com/office/word/2020/wordml/sdtdatahash" xmlns:w16sdtfl="http://schemas.microsoft.com/office/word/2024/wordml/sdtformatlock" xmlns:w16se="http://schemas.microsoft.com/office/word/2015/wordml/symex" xmlns:wpg="http://schemas.microsoft.com/office/word/2010/wordprocessingGroup" xmlns:wpi="http://schemas.microsoft.com/office/word/2010/wordprocessingInk" xmlns:wne="http://schemas.microsoft.com/office/word/2006/wordml" xmlns:wps="http://schemas.microsoft.com/office/word/2010/wordprocessingShape" mc:Ignorable="w14 w15 w16se w16cid w16 w16cex w16sdtdh w16sdtfl w16du wp14">
   <w:sdt>
     <w:sdtPr>
       <w:id w:val="-1310550233"/>
@@ -15744,8 +15590,18 @@
 </w:ftr>
 </file>
 
+<file path=word/footer3.xml><?xml version="1.0" encoding="utf-8"?>
+<w:ftr xmlns:wpc="http://schemas.microsoft.com/office/word/2010/wordprocessingCanvas" xmlns:cx="http://schemas.microsoft.com/office/drawing/2014/chartex" xmlns:cx1="http://schemas.microsoft.com/office/drawing/2015/9/8/chartex" xmlns:cx2="http://schemas.microsoft.com/office/drawing/2015/10/21/chartex" xmlns:cx3="http://schemas.microsoft.com/office/drawing/2016/5/9/chartex" xmlns:cx4="http://schemas.microsoft.com/office/drawing/2016/5/10/chartex" xmlns:cx5="http://schemas.microsoft.com/office/drawing/2016/5/11/chartex" xmlns:cx6="http://schemas.microsoft.com/office/drawing/2016/5/12/chartex" xmlns:cx7="http://schemas.microsoft.com/office/drawing/2016/5/13/chartex" xmlns:cx8="http://schemas.microsoft.com/office/drawing/2016/5/14/chartex" xmlns:mc="http://schemas.openxmlformats.org/markup-compatibility/2006" xmlns:aink="http://schemas.microsoft.com/office/drawing/2016/ink" xmlns:am3d="http://schemas.microsoft.com/office/drawing/2017/model3d" xmlns:o="urn:schemas-microsoft-com:office:office" xmlns:oel="http://schemas.microsoft.com/office/2019/extlst" xmlns:r="http://schemas.openxmlformats.org/officeDocument/2006/relationships" xmlns:m="http://schemas.openxmlformats.org/officeDocument/2006/math" xmlns:v="urn:schemas-microsoft-com:vml" xmlns:wp14="http://schemas.microsoft.com/office/word/2010/wordprocessingDrawing" xmlns:wp="http://schemas.openxmlformats.org/drawingml/2006/wordprocessingDrawing" xmlns:w10="urn:schemas-microsoft-com:office:word" xmlns:w="http://schemas.openxmlformats.org/wordprocessingml/2006/main" xmlns:w14="http://schemas.microsoft.com/office/word/2010/wordml" xmlns:w15="http://schemas.microsoft.com/office/word/2012/wordml" xmlns:w16cei="http://schemas.microsoft.com/office/word/2026/wordml/cei" xmlns:w16cex="http://schemas.microsoft.com/office/word/2018/wordml/cex" xmlns:w16cid="http://schemas.microsoft.com/office/word/2016/wordml/cid" xmlns:w16="http://schemas.microsoft.com/office/word/2018/wordml" xmlns:w16du="http://schemas.microsoft.com/office/word/2023/wordml/word16du" xmlns:w16sdtdh="http://schemas.microsoft.com/office/word/2020/wordml/sdtdatahash" xmlns:w16sdtfl="http://schemas.microsoft.com/office/word/2024/wordml/sdtformatlock" xmlns:w16se="http://schemas.microsoft.com/office/word/2015/wordml/symex" xmlns:wpg="http://schemas.microsoft.com/office/word/2010/wordprocessingGroup" xmlns:wpi="http://schemas.microsoft.com/office/word/2010/wordprocessingInk" xmlns:wne="http://schemas.microsoft.com/office/word/2006/wordml" xmlns:wps="http://schemas.microsoft.com/office/word/2010/wordprocessingShape" mc:Ignorable="w14 w15 w16se w16cid w16 w16cex w16sdtdh w16sdtfl w16du wp14">
+  <w:p>
+    <w:pPr>
+      <w:pStyle w:val="Footer"/>
+    </w:pPr>
+  </w:p>
+</w:ftr>
+</file>
+
 <file path=word/footnotes.xml><?xml version="1.0" encoding="utf-8"?>
-<w:footnotes xmlns:wpc="http://schemas.microsoft.com/office/word/2010/wordprocessingCanvas" xmlns:cx="http://schemas.microsoft.com/office/drawing/2014/chartex" xmlns:cx1="http://schemas.microsoft.com/office/drawing/2015/9/8/chartex" xmlns:cx2="http://schemas.microsoft.com/office/drawing/2015/10/21/chartex" xmlns:cx3="http://schemas.microsoft.com/office/drawing/2016/5/9/chartex" xmlns:cx4="http://schemas.microsoft.com/office/drawing/2016/5/10/chartex" xmlns:cx5="http://schemas.microsoft.com/office/drawing/2016/5/11/chartex" xmlns:cx6="http://schemas.microsoft.com/office/drawing/2016/5/12/chartex" xmlns:cx7="http://schemas.microsoft.com/office/drawing/2016/5/13/chartex" xmlns:cx8="http://schemas.microsoft.com/office/drawing/2016/5/14/chartex" xmlns:mc="http://schemas.openxmlformats.org/markup-compatibility/2006" xmlns:aink="http://schemas.microsoft.com/office/drawing/2016/ink" xmlns:am3d="http://schemas.microsoft.com/office/drawing/2017/model3d" xmlns:o="urn:schemas-microsoft-com:office:office" xmlns:oel="http://schemas.microsoft.com/office/2019/extlst" xmlns:r="http://schemas.openxmlformats.org/officeDocument/2006/relationships" xmlns:m="http://schemas.openxmlformats.org/officeDocument/2006/math" xmlns:v="urn:schemas-microsoft-com:vml" xmlns:wp14="http://schemas.microsoft.com/office/word/2010/wordprocessingDrawing" xmlns:wp="http://schemas.openxmlformats.org/drawingml/2006/wordprocessingDrawing" xmlns:w10="urn:schemas-microsoft-com:office:word" xmlns:w="http://schemas.openxmlformats.org/wordprocessingml/2006/main" xmlns:w14="http://schemas.microsoft.com/office/word/2010/wordml" xmlns:w15="http://schemas.microsoft.com/office/word/2012/wordml" xmlns:w16cex="http://schemas.microsoft.com/office/word/2018/wordml/cex" xmlns:w16cid="http://schemas.microsoft.com/office/word/2016/wordml/cid" xmlns:w16="http://schemas.microsoft.com/office/word/2018/wordml" xmlns:w16du="http://schemas.microsoft.com/office/word/2023/wordml/word16du" xmlns:w16sdtdh="http://schemas.microsoft.com/office/word/2020/wordml/sdtdatahash" xmlns:w16sdtfl="http://schemas.microsoft.com/office/word/2024/wordml/sdtformatlock" xmlns:w16se="http://schemas.microsoft.com/office/word/2015/wordml/symex" xmlns:wpg="http://schemas.microsoft.com/office/word/2010/wordprocessingGroup" xmlns:wpi="http://schemas.microsoft.com/office/word/2010/wordprocessingInk" xmlns:wne="http://schemas.microsoft.com/office/word/2006/wordml" xmlns:wps="http://schemas.microsoft.com/office/word/2010/wordprocessingShape" mc:Ignorable="w14 w15 w16se w16cid w16 w16cex w16sdtdh w16sdtfl w16du wp14">
+<w:footnotes xmlns:wpc="http://schemas.microsoft.com/office/word/2010/wordprocessingCanvas" xmlns:cx="http://schemas.microsoft.com/office/drawing/2014/chartex" xmlns:cx1="http://schemas.microsoft.com/office/drawing/2015/9/8/chartex" xmlns:cx2="http://schemas.microsoft.com/office/drawing/2015/10/21/chartex" xmlns:cx3="http://schemas.microsoft.com/office/drawing/2016/5/9/chartex" xmlns:cx4="http://schemas.microsoft.com/office/drawing/2016/5/10/chartex" xmlns:cx5="http://schemas.microsoft.com/office/drawing/2016/5/11/chartex" xmlns:cx6="http://schemas.microsoft.com/office/drawing/2016/5/12/chartex" xmlns:cx7="http://schemas.microsoft.com/office/drawing/2016/5/13/chartex" xmlns:cx8="http://schemas.microsoft.com/office/drawing/2016/5/14/chartex" xmlns:mc="http://schemas.openxmlformats.org/markup-compatibility/2006" xmlns:aink="http://schemas.microsoft.com/office/drawing/2016/ink" xmlns:am3d="http://schemas.microsoft.com/office/drawing/2017/model3d" xmlns:o="urn:schemas-microsoft-com:office:office" xmlns:oel="http://schemas.microsoft.com/office/2019/extlst" xmlns:r="http://schemas.openxmlformats.org/officeDocument/2006/relationships" xmlns:m="http://schemas.openxmlformats.org/officeDocument/2006/math" xmlns:v="urn:schemas-microsoft-com:vml" xmlns:wp14="http://schemas.microsoft.com/office/word/2010/wordprocessingDrawing" xmlns:wp="http://schemas.openxmlformats.org/drawingml/2006/wordprocessingDrawing" xmlns:w10="urn:schemas-microsoft-com:office:word" xmlns:w="http://schemas.openxmlformats.org/wordprocessingml/2006/main" xmlns:w14="http://schemas.microsoft.com/office/word/2010/wordml" xmlns:w15="http://schemas.microsoft.com/office/word/2012/wordml" xmlns:w16cei="http://schemas.microsoft.com/office/word/2026/wordml/cei" xmlns:w16cex="http://schemas.microsoft.com/office/word/2018/wordml/cex" xmlns:w16cid="http://schemas.microsoft.com/office/word/2016/wordml/cid" xmlns:w16="http://schemas.microsoft.com/office/word/2018/wordml" xmlns:w16du="http://schemas.microsoft.com/office/word/2023/wordml/word16du" xmlns:w16sdtdh="http://schemas.microsoft.com/office/word/2020/wordml/sdtdatahash" xmlns:w16sdtfl="http://schemas.microsoft.com/office/word/2024/wordml/sdtformatlock" xmlns:w16se="http://schemas.microsoft.com/office/word/2015/wordml/symex" xmlns:wpg="http://schemas.microsoft.com/office/word/2010/wordprocessingGroup" xmlns:wpi="http://schemas.microsoft.com/office/word/2010/wordprocessingInk" xmlns:wne="http://schemas.microsoft.com/office/word/2006/wordml" xmlns:wps="http://schemas.microsoft.com/office/word/2010/wordprocessingShape" mc:Ignorable="w14 w15 w16se w16cid w16 w16cex w16sdtdh w16sdtfl w16du wp14">
   <w:footnote w:type="separator" w:id="-1">
     <w:p>
       <w:pPr>
@@ -15769,8 +15625,38 @@
 </w:footnotes>
 </file>
 
+<file path=word/header1.xml><?xml version="1.0" encoding="utf-8"?>
+<w:hdr xmlns:wpc="http://schemas.microsoft.com/office/word/2010/wordprocessingCanvas" xmlns:cx="http://schemas.microsoft.com/office/drawing/2014/chartex" xmlns:cx1="http://schemas.microsoft.com/office/drawing/2015/9/8/chartex" xmlns:cx2="http://schemas.microsoft.com/office/drawing/2015/10/21/chartex" xmlns:cx3="http://schemas.microsoft.com/office/drawing/2016/5/9/chartex" xmlns:cx4="http://schemas.microsoft.com/office/drawing/2016/5/10/chartex" xmlns:cx5="http://schemas.microsoft.com/office/drawing/2016/5/11/chartex" xmlns:cx6="http://schemas.microsoft.com/office/drawing/2016/5/12/chartex" xmlns:cx7="http://schemas.microsoft.com/office/drawing/2016/5/13/chartex" xmlns:cx8="http://schemas.microsoft.com/office/drawing/2016/5/14/chartex" xmlns:mc="http://schemas.openxmlformats.org/markup-compatibility/2006" xmlns:aink="http://schemas.microsoft.com/office/drawing/2016/ink" xmlns:am3d="http://schemas.microsoft.com/office/drawing/2017/model3d" xmlns:o="urn:schemas-microsoft-com:office:office" xmlns:oel="http://schemas.microsoft.com/office/2019/extlst" xmlns:r="http://schemas.openxmlformats.org/officeDocument/2006/relationships" xmlns:m="http://schemas.openxmlformats.org/officeDocument/2006/math" xmlns:v="urn:schemas-microsoft-com:vml" xmlns:wp14="http://schemas.microsoft.com/office/word/2010/wordprocessingDrawing" xmlns:wp="http://schemas.openxmlformats.org/drawingml/2006/wordprocessingDrawing" xmlns:w10="urn:schemas-microsoft-com:office:word" xmlns:w="http://schemas.openxmlformats.org/wordprocessingml/2006/main" xmlns:w14="http://schemas.microsoft.com/office/word/2010/wordml" xmlns:w15="http://schemas.microsoft.com/office/word/2012/wordml" xmlns:w16cei="http://schemas.microsoft.com/office/word/2026/wordml/cei" xmlns:w16cex="http://schemas.microsoft.com/office/word/2018/wordml/cex" xmlns:w16cid="http://schemas.microsoft.com/office/word/2016/wordml/cid" xmlns:w16="http://schemas.microsoft.com/office/word/2018/wordml" xmlns:w16du="http://schemas.microsoft.com/office/word/2023/wordml/word16du" xmlns:w16sdtdh="http://schemas.microsoft.com/office/word/2020/wordml/sdtdatahash" xmlns:w16sdtfl="http://schemas.microsoft.com/office/word/2024/wordml/sdtformatlock" xmlns:w16se="http://schemas.microsoft.com/office/word/2015/wordml/symex" xmlns:wpg="http://schemas.microsoft.com/office/word/2010/wordprocessingGroup" xmlns:wpi="http://schemas.microsoft.com/office/word/2010/wordprocessingInk" xmlns:wne="http://schemas.microsoft.com/office/word/2006/wordml" xmlns:wps="http://schemas.microsoft.com/office/word/2010/wordprocessingShape" mc:Ignorable="w14 w15 w16se w16cid w16 w16cex w16sdtdh w16sdtfl w16du wp14">
+  <w:p>
+    <w:pPr>
+      <w:pStyle w:val="Header"/>
+    </w:pPr>
+  </w:p>
+</w:hdr>
+</file>
+
+<file path=word/header2.xml><?xml version="1.0" encoding="utf-8"?>
+<w:hdr xmlns:wpc="http://schemas.microsoft.com/office/word/2010/wordprocessingCanvas" xmlns:cx="http://schemas.microsoft.com/office/drawing/2014/chartex" xmlns:cx1="http://schemas.microsoft.com/office/drawing/2015/9/8/chartex" xmlns:cx2="http://schemas.microsoft.com/office/drawing/2015/10/21/chartex" xmlns:cx3="http://schemas.microsoft.com/office/drawing/2016/5/9/chartex" xmlns:cx4="http://schemas.microsoft.com/office/drawing/2016/5/10/chartex" xmlns:cx5="http://schemas.microsoft.com/office/drawing/2016/5/11/chartex" xmlns:cx6="http://schemas.microsoft.com/office/drawing/2016/5/12/chartex" xmlns:cx7="http://schemas.microsoft.com/office/drawing/2016/5/13/chartex" xmlns:cx8="http://schemas.microsoft.com/office/drawing/2016/5/14/chartex" xmlns:mc="http://schemas.openxmlformats.org/markup-compatibility/2006" xmlns:aink="http://schemas.microsoft.com/office/drawing/2016/ink" xmlns:am3d="http://schemas.microsoft.com/office/drawing/2017/model3d" xmlns:o="urn:schemas-microsoft-com:office:office" xmlns:oel="http://schemas.microsoft.com/office/2019/extlst" xmlns:r="http://schemas.openxmlformats.org/officeDocument/2006/relationships" xmlns:m="http://schemas.openxmlformats.org/officeDocument/2006/math" xmlns:v="urn:schemas-microsoft-com:vml" xmlns:wp14="http://schemas.microsoft.com/office/word/2010/wordprocessingDrawing" xmlns:wp="http://schemas.openxmlformats.org/drawingml/2006/wordprocessingDrawing" xmlns:w10="urn:schemas-microsoft-com:office:word" xmlns:w="http://schemas.openxmlformats.org/wordprocessingml/2006/main" xmlns:w14="http://schemas.microsoft.com/office/word/2010/wordml" xmlns:w15="http://schemas.microsoft.com/office/word/2012/wordml" xmlns:w16cei="http://schemas.microsoft.com/office/word/2026/wordml/cei" xmlns:w16cex="http://schemas.microsoft.com/office/word/2018/wordml/cex" xmlns:w16cid="http://schemas.microsoft.com/office/word/2016/wordml/cid" xmlns:w16="http://schemas.microsoft.com/office/word/2018/wordml" xmlns:w16du="http://schemas.microsoft.com/office/word/2023/wordml/word16du" xmlns:w16sdtdh="http://schemas.microsoft.com/office/word/2020/wordml/sdtdatahash" xmlns:w16sdtfl="http://schemas.microsoft.com/office/word/2024/wordml/sdtformatlock" xmlns:w16se="http://schemas.microsoft.com/office/word/2015/wordml/symex" xmlns:wpg="http://schemas.microsoft.com/office/word/2010/wordprocessingGroup" xmlns:wpi="http://schemas.microsoft.com/office/word/2010/wordprocessingInk" xmlns:wne="http://schemas.microsoft.com/office/word/2006/wordml" xmlns:wps="http://schemas.microsoft.com/office/word/2010/wordprocessingShape" mc:Ignorable="w14 w15 w16se w16cid w16 w16cex w16sdtdh w16sdtfl w16du wp14">
+  <w:p>
+    <w:pPr>
+      <w:pStyle w:val="Header"/>
+    </w:pPr>
+  </w:p>
+</w:hdr>
+</file>
+
+<file path=word/header3.xml><?xml version="1.0" encoding="utf-8"?>
+<w:hdr xmlns:wpc="http://schemas.microsoft.com/office/word/2010/wordprocessingCanvas" xmlns:cx="http://schemas.microsoft.com/office/drawing/2014/chartex" xmlns:cx1="http://schemas.microsoft.com/office/drawing/2015/9/8/chartex" xmlns:cx2="http://schemas.microsoft.com/office/drawing/2015/10/21/chartex" xmlns:cx3="http://schemas.microsoft.com/office/drawing/2016/5/9/chartex" xmlns:cx4="http://schemas.microsoft.com/office/drawing/2016/5/10/chartex" xmlns:cx5="http://schemas.microsoft.com/office/drawing/2016/5/11/chartex" xmlns:cx6="http://schemas.microsoft.com/office/drawing/2016/5/12/chartex" xmlns:cx7="http://schemas.microsoft.com/office/drawing/2016/5/13/chartex" xmlns:cx8="http://schemas.microsoft.com/office/drawing/2016/5/14/chartex" xmlns:mc="http://schemas.openxmlformats.org/markup-compatibility/2006" xmlns:aink="http://schemas.microsoft.com/office/drawing/2016/ink" xmlns:am3d="http://schemas.microsoft.com/office/drawing/2017/model3d" xmlns:o="urn:schemas-microsoft-com:office:office" xmlns:oel="http://schemas.microsoft.com/office/2019/extlst" xmlns:r="http://schemas.openxmlformats.org/officeDocument/2006/relationships" xmlns:m="http://schemas.openxmlformats.org/officeDocument/2006/math" xmlns:v="urn:schemas-microsoft-com:vml" xmlns:wp14="http://schemas.microsoft.com/office/word/2010/wordprocessingDrawing" xmlns:wp="http://schemas.openxmlformats.org/drawingml/2006/wordprocessingDrawing" xmlns:w10="urn:schemas-microsoft-com:office:word" xmlns:w="http://schemas.openxmlformats.org/wordprocessingml/2006/main" xmlns:w14="http://schemas.microsoft.com/office/word/2010/wordml" xmlns:w15="http://schemas.microsoft.com/office/word/2012/wordml" xmlns:w16cei="http://schemas.microsoft.com/office/word/2026/wordml/cei" xmlns:w16cex="http://schemas.microsoft.com/office/word/2018/wordml/cex" xmlns:w16cid="http://schemas.microsoft.com/office/word/2016/wordml/cid" xmlns:w16="http://schemas.microsoft.com/office/word/2018/wordml" xmlns:w16du="http://schemas.microsoft.com/office/word/2023/wordml/word16du" xmlns:w16sdtdh="http://schemas.microsoft.com/office/word/2020/wordml/sdtdatahash" xmlns:w16sdtfl="http://schemas.microsoft.com/office/word/2024/wordml/sdtformatlock" xmlns:w16se="http://schemas.microsoft.com/office/word/2015/wordml/symex" xmlns:wpg="http://schemas.microsoft.com/office/word/2010/wordprocessingGroup" xmlns:wpi="http://schemas.microsoft.com/office/word/2010/wordprocessingInk" xmlns:wne="http://schemas.microsoft.com/office/word/2006/wordml" xmlns:wps="http://schemas.microsoft.com/office/word/2010/wordprocessingShape" mc:Ignorable="w14 w15 w16se w16cid w16 w16cex w16sdtdh w16sdtfl w16du wp14">
+  <w:p>
+    <w:pPr>
+      <w:pStyle w:val="Header"/>
+    </w:pPr>
+  </w:p>
+</w:hdr>
+</file>
+
 <file path=word/numbering.xml><?xml version="1.0" encoding="utf-8"?>
-<w:numbering xmlns:wpc="http://schemas.microsoft.com/office/word/2010/wordprocessingCanvas" xmlns:cx="http://schemas.microsoft.com/office/drawing/2014/chartex" xmlns:cx1="http://schemas.microsoft.com/office/drawing/2015/9/8/chartex" xmlns:cx2="http://schemas.microsoft.com/office/drawing/2015/10/21/chartex" xmlns:cx3="http://schemas.microsoft.com/office/drawing/2016/5/9/chartex" xmlns:cx4="http://schemas.microsoft.com/office/drawing/2016/5/10/chartex" xmlns:cx5="http://schemas.microsoft.com/office/drawing/2016/5/11/chartex" xmlns:cx6="http://schemas.microsoft.com/office/drawing/2016/5/12/chartex" xmlns:cx7="http://schemas.microsoft.com/office/drawing/2016/5/13/chartex" xmlns:cx8="http://schemas.microsoft.com/office/drawing/2016/5/14/chartex" xmlns:mc="http://schemas.openxmlformats.org/markup-compatibility/2006" xmlns:aink="http://schemas.microsoft.com/office/drawing/2016/ink" xmlns:am3d="http://schemas.microsoft.com/office/drawing/2017/model3d" xmlns:o="urn:schemas-microsoft-com:office:office" xmlns:oel="http://schemas.microsoft.com/office/2019/extlst" xmlns:r="http://schemas.openxmlformats.org/officeDocument/2006/relationships" xmlns:m="http://schemas.openxmlformats.org/officeDocument/2006/math" xmlns:v="urn:schemas-microsoft-com:vml" xmlns:wp14="http://schemas.microsoft.com/office/word/2010/wordprocessingDrawing" xmlns:wp="http://schemas.openxmlformats.org/drawingml/2006/wordprocessingDrawing" xmlns:w10="urn:schemas-microsoft-com:office:word" xmlns:w="http://schemas.openxmlformats.org/wordprocessingml/2006/main" xmlns:w14="http://schemas.microsoft.com/office/word/2010/wordml" xmlns:w15="http://schemas.microsoft.com/office/word/2012/wordml" xmlns:w16cex="http://schemas.microsoft.com/office/word/2018/wordml/cex" xmlns:w16cid="http://schemas.microsoft.com/office/word/2016/wordml/cid" xmlns:w16="http://schemas.microsoft.com/office/word/2018/wordml" xmlns:w16du="http://schemas.microsoft.com/office/word/2023/wordml/word16du" xmlns:w16sdtdh="http://schemas.microsoft.com/office/word/2020/wordml/sdtdatahash" xmlns:w16sdtfl="http://schemas.microsoft.com/office/word/2024/wordml/sdtformatlock" xmlns:w16se="http://schemas.microsoft.com/office/word/2015/wordml/symex" xmlns:wpg="http://schemas.microsoft.com/office/word/2010/wordprocessingGroup" xmlns:wpi="http://schemas.microsoft.com/office/word/2010/wordprocessingInk" xmlns:wne="http://schemas.microsoft.com/office/word/2006/wordml" xmlns:wps="http://schemas.microsoft.com/office/word/2010/wordprocessingShape" mc:Ignorable="w14 w15 w16se w16cid w16 w16cex w16sdtdh w16sdtfl w16du wp14">
+<w:numbering xmlns:wpc="http://schemas.microsoft.com/office/word/2010/wordprocessingCanvas" xmlns:cx="http://schemas.microsoft.com/office/drawing/2014/chartex" xmlns:cx1="http://schemas.microsoft.com/office/drawing/2015/9/8/chartex" xmlns:cx2="http://schemas.microsoft.com/office/drawing/2015/10/21/chartex" xmlns:cx3="http://schemas.microsoft.com/office/drawing/2016/5/9/chartex" xmlns:cx4="http://schemas.microsoft.com/office/drawing/2016/5/10/chartex" xmlns:cx5="http://schemas.microsoft.com/office/drawing/2016/5/11/chartex" xmlns:cx6="http://schemas.microsoft.com/office/drawing/2016/5/12/chartex" xmlns:cx7="http://schemas.microsoft.com/office/drawing/2016/5/13/chartex" xmlns:cx8="http://schemas.microsoft.com/office/drawing/2016/5/14/chartex" xmlns:mc="http://schemas.openxmlformats.org/markup-compatibility/2006" xmlns:aink="http://schemas.microsoft.com/office/drawing/2016/ink" xmlns:am3d="http://schemas.microsoft.com/office/drawing/2017/model3d" xmlns:o="urn:schemas-microsoft-com:office:office" xmlns:oel="http://schemas.microsoft.com/office/2019/extlst" xmlns:r="http://schemas.openxmlformats.org/officeDocument/2006/relationships" xmlns:m="http://schemas.openxmlformats.org/officeDocument/2006/math" xmlns:v="urn:schemas-microsoft-com:vml" xmlns:wp14="http://schemas.microsoft.com/office/word/2010/wordprocessingDrawing" xmlns:wp="http://schemas.openxmlformats.org/drawingml/2006/wordprocessingDrawing" xmlns:w10="urn:schemas-microsoft-com:office:word" xmlns:w="http://schemas.openxmlformats.org/wordprocessingml/2006/main" xmlns:w14="http://schemas.microsoft.com/office/word/2010/wordml" xmlns:w15="http://schemas.microsoft.com/office/word/2012/wordml" xmlns:w16cei="http://schemas.microsoft.com/office/word/2026/wordml/cei" xmlns:w16cex="http://schemas.microsoft.com/office/word/2018/wordml/cex" xmlns:w16cid="http://schemas.microsoft.com/office/word/2016/wordml/cid" xmlns:w16="http://schemas.microsoft.com/office/word/2018/wordml" xmlns:w16du="http://schemas.microsoft.com/office/word/2023/wordml/word16du" xmlns:w16sdtdh="http://schemas.microsoft.com/office/word/2020/wordml/sdtdatahash" xmlns:w16sdtfl="http://schemas.microsoft.com/office/word/2024/wordml/sdtformatlock" xmlns:w16se="http://schemas.microsoft.com/office/word/2015/wordml/symex" xmlns:wpg="http://schemas.microsoft.com/office/word/2010/wordprocessingGroup" xmlns:wpi="http://schemas.microsoft.com/office/word/2010/wordprocessingInk" xmlns:wne="http://schemas.microsoft.com/office/word/2006/wordml" xmlns:wps="http://schemas.microsoft.com/office/word/2010/wordprocessingShape" mc:Ignorable="w14 w15 w16se w16cid w16 w16cex w16sdtdh w16sdtfl w16du wp14">
   <w:abstractNum w:abstractNumId="0" w15:restartNumberingAfterBreak="0">
     <w:nsid w:val="02D60C06"/>
     <w:multiLevelType w:val="hybridMultilevel"/>
@@ -20384,15 +20270,6 @@
 </file>
 
 <file path=customXml/item1.xml><?xml version="1.0" encoding="utf-8"?>
-<?mso-contentType ?>
-<FormTemplates xmlns="http://schemas.microsoft.com/sharepoint/v3/contenttype/forms">
-  <Display>DocumentLibraryForm</Display>
-  <Edit>DocumentLibraryForm</Edit>
-  <New>DocumentLibraryForm</New>
-</FormTemplates>
-</file>
-
-<file path=customXml/item2.xml><?xml version="1.0" encoding="utf-8"?>
 <p:properties xmlns:p="http://schemas.microsoft.com/office/2006/metadata/properties" xmlns:xsi="http://www.w3.org/2001/XMLSchema-instance" xmlns:pc="http://schemas.microsoft.com/office/infopath/2007/PartnerControls">
   <documentManagement>
     <Teams_Channel_Section_Location xmlns="ac56161a-35a2-4bac-99b6-8739237dc4f6" xsi:nil="true"/>
@@ -20444,130 +20321,16 @@
 </p:properties>
 </file>
 
-<file path=customXml/item3.xml><?xml version="1.0" encoding="utf-8"?>
-<b:Sources xmlns:b="http://schemas.openxmlformats.org/officeDocument/2006/bibliography" xmlns="http://schemas.openxmlformats.org/officeDocument/2006/bibliography" SelectedStyle="\HarvardAnglia2008OfficeOnline.xsl" StyleName="Harvard - Anglia" Version="2008">
-  <b:Source>
-    <b:Tag>Agi26</b:Tag>
-    <b:SourceType>InternetSite</b:SourceType>
-    <b:Guid>{78CC74B3-71D7-445A-BD1E-7DB0B7A44B13}</b:Guid>
-    <b:Title>What is MoSCoW Prioritization?</b:Title>
-    <b:Year>2026</b:Year>
-    <b:Author>
-      <b:Author>
-        <b:Corporate>Agile Business Consortium</b:Corporate>
-      </b:Author>
-    </b:Author>
-    <b:YearAccessed>2026</b:YearAccessed>
-    <b:MonthAccessed>July</b:MonthAccessed>
-    <b:DayAccessed>16</b:DayAccessed>
-    <b:URL>https://www.agilebusiness.org/resource/what-is-moscow-prioritization/</b:URL>
-    <b:RefOrder>1</b:RefOrder>
-  </b:Source>
-  <b:Source>
-    <b:Tag>Emb16</b:Tag>
-    <b:SourceType>InternetSite</b:SourceType>
-    <b:Guid>{96EC25F5-613B-41F7-9370-01F376E5A07F}</b:Guid>
-    <b:Author>
-      <b:Author>
-        <b:Corporate>Embarcadero</b:Corporate>
-      </b:Author>
-    </b:Author>
-    <b:Title>UML 1.5 Use Case Diagram Definition</b:Title>
-    <b:Year>2016</b:Year>
-    <b:YearAccessed>2026</b:YearAccessed>
-    <b:MonthAccessed>July</b:MonthAccessed>
-    <b:DayAccessed>17</b:DayAccessed>
-    <b:URL>https://docwiki.embarcadero.com/RADStudio/Athens/en/UML_1.5_Use_Case_Diagram_Definition</b:URL>
-    <b:RefOrder>2</b:RefOrder>
-  </b:Source>
-  <b:Source>
-    <b:Tag>Usa15</b:Tag>
-    <b:SourceType>InternetSite</b:SourceType>
-    <b:Guid>{B4141139-B38C-4554-A59F-ED8FEB6AA9B9}</b:Guid>
-    <b:Author>
-      <b:Author>
-        <b:Corporate>Usability First</b:Corporate>
-      </b:Author>
-    </b:Author>
-    <b:Title>Usability First - About Usability - Requirements Specification | Usability First</b:Title>
-    <b:Year>2015</b:Year>
-    <b:YearAccessed>2026</b:YearAccessed>
-    <b:MonthAccessed>July</b:MonthAccessed>
-    <b:DayAccessed>17</b:DayAccessed>
-    <b:URL>https://www.usabilityfirst.com/about-usability/requirements-specification/index.html</b:URL>
-    <b:RefOrder>3</b:RefOrder>
-  </b:Source>
-  <b:Source>
-    <b:Tag>For26</b:Tag>
-    <b:SourceType>InternetSite</b:SourceType>
-    <b:Guid>{E1E283C5-F393-4ABB-A75E-53D4BAF2D5B9}</b:Guid>
-    <b:Author>
-      <b:Author>
-        <b:Corporate>Formula One</b:Corporate>
-      </b:Author>
-    </b:Author>
-    <b:Title>F1 Glossary (P-T)</b:Title>
-    <b:Year>2026</b:Year>
-    <b:YearAccessed>2026</b:YearAccessed>
-    <b:MonthAccessed>July</b:MonthAccessed>
-    <b:DayAccessed>22</b:DayAccessed>
-    <b:URL>https://www.formula1.com/en/latest/article/f1-glossary-p-t.GBhLQtpeu9b8LrK5VM0F1</b:URL>
-    <b:RefOrder>6</b:RefOrder>
-  </b:Source>
-  <b:Source>
-    <b:Tag>QtG26</b:Tag>
-    <b:SourceType>InternetSite</b:SourceType>
-    <b:Guid>{A17225CA-ECDB-458F-837A-C1DE58C494CE}</b:Guid>
-    <b:Author>
-      <b:Author>
-        <b:Corporate>Qt Group</b:Corporate>
-      </b:Author>
-    </b:Author>
-    <b:Title>Qt Group Documentation</b:Title>
-    <b:Year>2026</b:Year>
-    <b:YearAccessed>2026</b:YearAccessed>
-    <b:MonthAccessed>July</b:MonthAccessed>
-    <b:DayAccessed>24</b:DayAccessed>
-    <b:URL>https://doc.qt.io/qt-6/qhboxlayout.html</b:URL>
-    <b:RefOrder>7</b:RefOrder>
-  </b:Source>
-  <b:Source>
-    <b:Tag>C4M26</b:Tag>
-    <b:SourceType>InternetSite</b:SourceType>
-    <b:Guid>{061F5457-C62E-4BE4-B8E4-1D67A8E249A3}</b:Guid>
-    <b:Author>
-      <b:Author>
-        <b:Corporate>C4 Model</b:Corporate>
-      </b:Author>
-    </b:Author>
-    <b:Title>Container diagram | C4 model</b:Title>
-    <b:YearAccessed>2026</b:YearAccessed>
-    <b:MonthAccessed>July</b:MonthAccessed>
-    <b:DayAccessed>25</b:DayAccessed>
-    <b:URL>https://c4model.com/diagrams/container</b:URL>
-    <b:RefOrder>4</b:RefOrder>
-  </b:Source>
-  <b:Source>
-    <b:Tag>Gee26</b:Tag>
-    <b:SourceType>InternetSite</b:SourceType>
-    <b:Guid>{0F3FA388-D9C8-413E-BAB0-142FA5CF2BD1}</b:Guid>
-    <b:Author>
-      <b:Author>
-        <b:Corporate>Geeks for Geeks</b:Corporate>
-      </b:Author>
-    </b:Author>
-    <b:Title>Component Based Diagram - Unified Modeling Language (UML)</b:Title>
-    <b:Year>2026</b:Year>
-    <b:YearAccessed>2026</b:YearAccessed>
-    <b:MonthAccessed>July</b:MonthAccessed>
-    <b:DayAccessed>25</b:DayAccessed>
-    <b:URL>https://www.geeksforgeeks.org/software-engineering/component-based-diagram/</b:URL>
-    <b:RefOrder>5</b:RefOrder>
-  </b:Source>
-</b:Sources>
+<file path=customXml/item2.xml><?xml version="1.0" encoding="utf-8"?>
+<?mso-contentType ?>
+<FormTemplates xmlns="http://schemas.microsoft.com/sharepoint/v3/contenttype/forms">
+  <Display>DocumentLibraryForm</Display>
+  <Edit>DocumentLibraryForm</Edit>
+  <New>DocumentLibraryForm</New>
+</FormTemplates>
 </file>
 
-<file path=customXml/item4.xml><?xml version="1.0" encoding="utf-8"?>
+<file path=customXml/item3.xml><?xml version="1.0" encoding="utf-8"?>
 <ct:contentTypeSchema xmlns:ct="http://schemas.microsoft.com/office/2006/metadata/contentType" xmlns:ma="http://schemas.microsoft.com/office/2006/metadata/properties/metaAttributes" ct:_="" ma:_="" ma:contentTypeName="Document" ma:contentTypeID="0x0101003EE04D916D7611488AA759BAA9A37716" ma:contentTypeVersion="34" ma:contentTypeDescription="Create a new document." ma:contentTypeScope="" ma:versionID="da43fd5ae1f7ae53ffd28d894363bfb4">
   <xsd:schema xmlns:xsd="http://www.w3.org/2001/XMLSchema" xmlns:xs="http://www.w3.org/2001/XMLSchema" xmlns:p="http://schemas.microsoft.com/office/2006/metadata/properties" xmlns:ns3="05ee331b-510f-4173-a5cc-a06d55a316fd" xmlns:ns4="ac56161a-35a2-4bac-99b6-8739237dc4f6" targetNamespace="http://schemas.microsoft.com/office/2006/metadata/properties" ma:root="true" ma:fieldsID="0e753ad016b352eaafbd0268c41c2a23" ns3:_="" ns4:_="">
     <xsd:import namespace="05ee331b-510f-4173-a5cc-a06d55a316fd"/>
@@ -20984,15 +20747,130 @@
 </ct:contentTypeSchema>
 </file>
 
-<file path=customXml/itemProps1.xml><?xml version="1.0" encoding="utf-8"?>
-<ds:datastoreItem xmlns:ds="http://schemas.openxmlformats.org/officeDocument/2006/customXml" ds:itemID="{9B975280-634C-49AE-9293-B75FDC4277EB}">
-  <ds:schemaRefs>
-    <ds:schemaRef ds:uri="http://schemas.microsoft.com/sharepoint/v3/contenttype/forms"/>
-  </ds:schemaRefs>
-</ds:datastoreItem>
+<file path=customXml/item4.xml><?xml version="1.0" encoding="utf-8"?>
+<b:Sources xmlns:b="http://schemas.openxmlformats.org/officeDocument/2006/bibliography" xmlns="http://schemas.openxmlformats.org/officeDocument/2006/bibliography" SelectedStyle="\HarvardAnglia2008OfficeOnline.xsl" StyleName="Harvard - Anglia" Version="2008">
+  <b:Source>
+    <b:Tag>Agi26</b:Tag>
+    <b:SourceType>InternetSite</b:SourceType>
+    <b:Guid>{78CC74B3-71D7-445A-BD1E-7DB0B7A44B13}</b:Guid>
+    <b:Title>What is MoSCoW Prioritization?</b:Title>
+    <b:Year>2026</b:Year>
+    <b:Author>
+      <b:Author>
+        <b:Corporate>Agile Business Consortium</b:Corporate>
+      </b:Author>
+    </b:Author>
+    <b:YearAccessed>2026</b:YearAccessed>
+    <b:MonthAccessed>July</b:MonthAccessed>
+    <b:DayAccessed>16</b:DayAccessed>
+    <b:URL>https://www.agilebusiness.org/resource/what-is-moscow-prioritization/</b:URL>
+    <b:RefOrder>1</b:RefOrder>
+  </b:Source>
+  <b:Source>
+    <b:Tag>Emb16</b:Tag>
+    <b:SourceType>InternetSite</b:SourceType>
+    <b:Guid>{96EC25F5-613B-41F7-9370-01F376E5A07F}</b:Guid>
+    <b:Author>
+      <b:Author>
+        <b:Corporate>Embarcadero</b:Corporate>
+      </b:Author>
+    </b:Author>
+    <b:Title>UML 1.5 Use Case Diagram Definition</b:Title>
+    <b:Year>2016</b:Year>
+    <b:YearAccessed>2026</b:YearAccessed>
+    <b:MonthAccessed>July</b:MonthAccessed>
+    <b:DayAccessed>17</b:DayAccessed>
+    <b:URL>https://docwiki.embarcadero.com/RADStudio/Athens/en/UML_1.5_Use_Case_Diagram_Definition</b:URL>
+    <b:RefOrder>2</b:RefOrder>
+  </b:Source>
+  <b:Source>
+    <b:Tag>Usa15</b:Tag>
+    <b:SourceType>InternetSite</b:SourceType>
+    <b:Guid>{B4141139-B38C-4554-A59F-ED8FEB6AA9B9}</b:Guid>
+    <b:Author>
+      <b:Author>
+        <b:Corporate>Usability First</b:Corporate>
+      </b:Author>
+    </b:Author>
+    <b:Title>Usability First - About Usability - Requirements Specification | Usability First</b:Title>
+    <b:Year>2015</b:Year>
+    <b:YearAccessed>2026</b:YearAccessed>
+    <b:MonthAccessed>July</b:MonthAccessed>
+    <b:DayAccessed>17</b:DayAccessed>
+    <b:URL>https://www.usabilityfirst.com/about-usability/requirements-specification/index.html</b:URL>
+    <b:RefOrder>3</b:RefOrder>
+  </b:Source>
+  <b:Source>
+    <b:Tag>For26</b:Tag>
+    <b:SourceType>InternetSite</b:SourceType>
+    <b:Guid>{E1E283C5-F393-4ABB-A75E-53D4BAF2D5B9}</b:Guid>
+    <b:Author>
+      <b:Author>
+        <b:Corporate>Formula One</b:Corporate>
+      </b:Author>
+    </b:Author>
+    <b:Title>F1 Glossary (P-T)</b:Title>
+    <b:Year>2026</b:Year>
+    <b:YearAccessed>2026</b:YearAccessed>
+    <b:MonthAccessed>July</b:MonthAccessed>
+    <b:DayAccessed>22</b:DayAccessed>
+    <b:URL>https://www.formula1.com/en/latest/article/f1-glossary-p-t.GBhLQtpeu9b8LrK5VM0F1</b:URL>
+    <b:RefOrder>6</b:RefOrder>
+  </b:Source>
+  <b:Source>
+    <b:Tag>QtG26</b:Tag>
+    <b:SourceType>InternetSite</b:SourceType>
+    <b:Guid>{A17225CA-ECDB-458F-837A-C1DE58C494CE}</b:Guid>
+    <b:Author>
+      <b:Author>
+        <b:Corporate>Qt Group</b:Corporate>
+      </b:Author>
+    </b:Author>
+    <b:Title>Qt Group Documentation</b:Title>
+    <b:Year>2026</b:Year>
+    <b:YearAccessed>2026</b:YearAccessed>
+    <b:MonthAccessed>July</b:MonthAccessed>
+    <b:DayAccessed>24</b:DayAccessed>
+    <b:URL>https://doc.qt.io/qt-6/qhboxlayout.html</b:URL>
+    <b:RefOrder>7</b:RefOrder>
+  </b:Source>
+  <b:Source>
+    <b:Tag>C4M26</b:Tag>
+    <b:SourceType>InternetSite</b:SourceType>
+    <b:Guid>{061F5457-C62E-4BE4-B8E4-1D67A8E249A3}</b:Guid>
+    <b:Author>
+      <b:Author>
+        <b:Corporate>C4 Model</b:Corporate>
+      </b:Author>
+    </b:Author>
+    <b:Title>Container diagram | C4 model</b:Title>
+    <b:YearAccessed>2026</b:YearAccessed>
+    <b:MonthAccessed>July</b:MonthAccessed>
+    <b:DayAccessed>25</b:DayAccessed>
+    <b:URL>https://c4model.com/diagrams/container</b:URL>
+    <b:RefOrder>4</b:RefOrder>
+  </b:Source>
+  <b:Source>
+    <b:Tag>Gee26</b:Tag>
+    <b:SourceType>InternetSite</b:SourceType>
+    <b:Guid>{0F3FA388-D9C8-413E-BAB0-142FA5CF2BD1}</b:Guid>
+    <b:Author>
+      <b:Author>
+        <b:Corporate>Geeks for Geeks</b:Corporate>
+      </b:Author>
+    </b:Author>
+    <b:Title>Component Based Diagram - Unified Modeling Language (UML)</b:Title>
+    <b:Year>2026</b:Year>
+    <b:YearAccessed>2026</b:YearAccessed>
+    <b:MonthAccessed>July</b:MonthAccessed>
+    <b:DayAccessed>25</b:DayAccessed>
+    <b:URL>https://www.geeksforgeeks.org/software-engineering/component-based-diagram/</b:URL>
+    <b:RefOrder>5</b:RefOrder>
+  </b:Source>
+</b:Sources>
 </file>
 
-<file path=customXml/itemProps2.xml><?xml version="1.0" encoding="utf-8"?>
+<file path=customXml/itemProps1.xml><?xml version="1.0" encoding="utf-8"?>
 <ds:datastoreItem xmlns:ds="http://schemas.openxmlformats.org/officeDocument/2006/customXml" ds:itemID="{5C51FF54-1CBD-43E8-9B2A-B56F20CDF09A}">
   <ds:schemaRefs>
     <ds:schemaRef ds:uri="http://schemas.microsoft.com/office/2006/metadata/properties"/>
@@ -21002,15 +20880,15 @@
 </ds:datastoreItem>
 </file>
 
-<file path=customXml/itemProps3.xml><?xml version="1.0" encoding="utf-8"?>
-<ds:datastoreItem xmlns:ds="http://schemas.openxmlformats.org/officeDocument/2006/customXml" ds:itemID="{36F9463C-3B57-4F39-8688-609D8413C2A6}">
+<file path=customXml/itemProps2.xml><?xml version="1.0" encoding="utf-8"?>
+<ds:datastoreItem xmlns:ds="http://schemas.openxmlformats.org/officeDocument/2006/customXml" ds:itemID="{9B975280-634C-49AE-9293-B75FDC4277EB}">
   <ds:schemaRefs>
-    <ds:schemaRef ds:uri="http://schemas.openxmlformats.org/officeDocument/2006/bibliography"/>
+    <ds:schemaRef ds:uri="http://schemas.microsoft.com/sharepoint/v3/contenttype/forms"/>
   </ds:schemaRefs>
 </ds:datastoreItem>
 </file>
 
-<file path=customXml/itemProps4.xml><?xml version="1.0" encoding="utf-8"?>
+<file path=customXml/itemProps3.xml><?xml version="1.0" encoding="utf-8"?>
 <ds:datastoreItem xmlns:ds="http://schemas.openxmlformats.org/officeDocument/2006/customXml" ds:itemID="{3B693098-FF00-4095-9757-18FD92BDA8E2}">
   <ds:schemaRefs>
     <ds:schemaRef ds:uri="http://schemas.microsoft.com/office/2006/metadata/contentType"/>
@@ -21027,4 +20905,12 @@
     <ds:schemaRef ds:uri="http://schemas.microsoft.com/internal/obd"/>
   </ds:schemaRefs>
 </ds:datastoreItem>
+</file>
+
+<file path=customXml/itemProps4.xml><?xml version="1.0" encoding="utf-8"?>
+<ds:datastoreItem xmlns:ds="http://schemas.openxmlformats.org/officeDocument/2006/customXml" ds:itemID="{36F9463C-3B57-4F39-8688-609D8413C2A6}">
+  <ds:schemaRefs>
+    <ds:schemaRef ds:uri="http://schemas.openxmlformats.org/officeDocument/2006/bibliography"/>
+  </ds:schemaRefs>
+</ds:datastoreItem>
 </file>
</xml_diff>

<commit_message>
Setting up pytest to be able to retrieve files without path workarounds and also added a class test suite
</commit_message>
<xml_diff>
--- a/docs/Technical Report Eoin Fitzsimons.docx
+++ b/docs/Technical Report Eoin Fitzsimons.docx
@@ -593,25 +593,7 @@
           <w:sz w:val="18"/>
           <w:szCs w:val="18"/>
         </w:rPr>
-        <w:t xml:space="preserve">supplied by the </w:t>
-      </w:r>
-      <w:proofErr w:type="gramStart"/>
-      <w:r>
-        <w:rPr>
-          <w:rFonts w:ascii="Verdana" w:hAnsi="Verdana"/>
-          <w:sz w:val="18"/>
-          <w:szCs w:val="18"/>
-        </w:rPr>
-        <w:t>Library</w:t>
-      </w:r>
-      <w:proofErr w:type="gramEnd"/>
-      <w:r>
-        <w:rPr>
-          <w:rFonts w:ascii="Verdana" w:hAnsi="Verdana"/>
-          <w:sz w:val="18"/>
-          <w:szCs w:val="18"/>
-        </w:rPr>
-        <w:t>.  To use other author's written or electronic work is illegal (plagiarism) and may result in disciplinary action.  Students may be required to undergo a viva (oral examination) if there is suspicion about the validity of their submitted work.</w:t>
+        <w:t>supplied by the Library.  To use other author's written or electronic work is illegal (plagiarism) and may result in disciplinary action.  Students may be required to undergo a viva (oral examination) if there is suspicion about the validity of their submitted work.</w:t>
       </w:r>
     </w:p>
     <w:p/>
@@ -1031,21 +1013,7 @@
         <w:rPr>
           <w:b/>
         </w:rPr>
-        <w:t xml:space="preserve">Any project/assignment not submitted will be marked as a </w:t>
-      </w:r>
-      <w:proofErr w:type="gramStart"/>
-      <w:r>
-        <w:rPr>
-          <w:b/>
-        </w:rPr>
-        <w:t>fail</w:t>
-      </w:r>
-      <w:proofErr w:type="gramEnd"/>
-      <w:r>
-        <w:rPr>
-          <w:b/>
-        </w:rPr>
-        <w:t>.</w:t>
+        <w:t>Any project/assignment not submitted will be marked as a fail.</w:t>
       </w:r>
     </w:p>
     <w:p>
@@ -5685,7 +5653,36 @@
         <w:t xml:space="preserve"> I found that other projects that exist in this area</w:t>
       </w:r>
       <w:r>
-        <w:t>.</w:t>
+        <w:t>, such as motorsport manager and f1 manager focus too much on graphical fidelity and immersion to the race that you don’t always get the full picture. They are focused on control of one team whereas I wanted to give the full overview.</w:t>
+      </w:r>
+    </w:p>
+    <w:p>
+      <w:pPr>
+        <w:pStyle w:val="Heading2"/>
+      </w:pPr>
+      <w:bookmarkStart w:id="3" w:name="_Toc236031525"/>
+      <w:r>
+        <w:t>Aims</w:t>
+      </w:r>
+      <w:bookmarkEnd w:id="3"/>
+    </w:p>
+    <w:p>
+      <w:r>
+        <w:rPr>
+          <w:highlight w:val="yellow"/>
+        </w:rPr>
+        <w:t>What does the project aim to achieve?</w:t>
+      </w:r>
+    </w:p>
+    <w:p>
+      <w:r>
+        <w:t xml:space="preserve">To visualise a motorsport race in clear terms, be able to see why a driver makes a decision based on their </w:t>
+      </w:r>
+      <w:r>
+        <w:t>surroundings</w:t>
+      </w:r>
+      <w:r>
+        <w:t>, capabilities, and mentality.</w:t>
       </w:r>
       <w:r>
         <w:t xml:space="preserve"> </w:t>
@@ -5695,158 +5692,137 @@
       <w:pPr>
         <w:pStyle w:val="Heading2"/>
       </w:pPr>
-      <w:bookmarkStart w:id="3" w:name="_Toc236031525"/>
-      <w:r>
-        <w:t>Aims</w:t>
-      </w:r>
-      <w:bookmarkEnd w:id="3"/>
+      <w:bookmarkStart w:id="4" w:name="_Toc236031526"/>
+      <w:r>
+        <w:t>Technology</w:t>
+      </w:r>
+      <w:bookmarkEnd w:id="4"/>
     </w:p>
     <w:p>
       <w:r>
         <w:rPr>
           <w:highlight w:val="yellow"/>
         </w:rPr>
-        <w:t>What does the project aim to achieve?</w:t>
-      </w:r>
-    </w:p>
-    <w:p>
-      <w:r>
-        <w:t xml:space="preserve">To visualise a motorsport race in clear terms, be able to see why a driver makes a decision based on their </w:t>
-      </w:r>
-      <w:r>
-        <w:t>surroundings</w:t>
-      </w:r>
-      <w:r>
-        <w:t>, capabilities, and mentality.</w:t>
-      </w:r>
+        <w:t>What technology will you use to achieve what you have set out to do</w:t>
+      </w:r>
+      <w:r>
+        <w:rPr>
+          <w:highlight w:val="yellow"/>
+        </w:rPr>
+        <w:t>,</w:t>
+      </w:r>
+      <w:r>
+        <w:rPr>
+          <w:highlight w:val="yellow"/>
+        </w:rPr>
+        <w:t xml:space="preserve"> and how will you use it?</w:t>
+      </w:r>
+    </w:p>
+    <w:p>
+      <w:r>
+        <w:t>GitHub, GitHub Desktop, GitHub Project</w:t>
+      </w:r>
+    </w:p>
+    <w:p>
+      <w:proofErr w:type="spellStart"/>
+      <w:r>
+        <w:t>VSCode</w:t>
+      </w:r>
+      <w:proofErr w:type="spellEnd"/>
+    </w:p>
+    <w:p>
+      <w:r>
+        <w:t>Python</w:t>
+      </w:r>
+    </w:p>
+    <w:p>
+      <w:r>
+        <w:t>PyQt6</w:t>
+      </w:r>
+    </w:p>
+    <w:p>
+      <w:proofErr w:type="spellStart"/>
+      <w:r>
+        <w:t>pathlib</w:t>
+      </w:r>
+      <w:proofErr w:type="spellEnd"/>
+      <w:r>
+        <w:t xml:space="preserve"> – Path</w:t>
+      </w:r>
+    </w:p>
+    <w:p>
+      <w:r>
+        <w:t>sys</w:t>
+      </w:r>
+    </w:p>
+    <w:p>
+      <w:r>
+        <w:t>math – cos, sin, pi</w:t>
+      </w:r>
+    </w:p>
+    <w:p>
+      <w:r>
+        <w:t xml:space="preserve">typing – List, </w:t>
+      </w:r>
+      <w:proofErr w:type="spellStart"/>
+      <w:r>
+        <w:t>Dict</w:t>
+      </w:r>
+      <w:proofErr w:type="spellEnd"/>
+      <w:r>
+        <w:t>, Tuple</w:t>
+      </w:r>
+    </w:p>
+    <w:p>
+      <w:proofErr w:type="spellStart"/>
+      <w:r>
+        <w:t>json</w:t>
+      </w:r>
+      <w:proofErr w:type="spellEnd"/>
+    </w:p>
+    <w:p>
+      <w:proofErr w:type="spellStart"/>
+      <w:r>
+        <w:t>dataclasses</w:t>
+      </w:r>
+      <w:proofErr w:type="spellEnd"/>
+    </w:p>
+    <w:p>
+      <w:r>
+        <w:t>random</w:t>
+      </w:r>
+      <w:r>
+        <w:t xml:space="preserve"> - </w:t>
+      </w:r>
+      <w:proofErr w:type="spellStart"/>
+      <w:r>
+        <w:t>SystemRandom</w:t>
+      </w:r>
+      <w:proofErr w:type="spellEnd"/>
+    </w:p>
+    <w:p>
+      <w:proofErr w:type="spellStart"/>
+      <w:r>
+        <w:t>os</w:t>
+      </w:r>
+      <w:proofErr w:type="spellEnd"/>
     </w:p>
     <w:p>
       <w:pPr>
         <w:pStyle w:val="Heading2"/>
       </w:pPr>
-      <w:bookmarkStart w:id="4" w:name="_Toc236031526"/>
-      <w:r>
-        <w:t>Technology</w:t>
-      </w:r>
-      <w:bookmarkEnd w:id="4"/>
+      <w:bookmarkStart w:id="5" w:name="_Toc236031527"/>
+      <w:r>
+        <w:lastRenderedPageBreak/>
+        <w:t>Structure</w:t>
+      </w:r>
+      <w:bookmarkEnd w:id="5"/>
     </w:p>
     <w:p>
       <w:r>
         <w:rPr>
           <w:highlight w:val="yellow"/>
         </w:rPr>
-        <w:t>What technology will you use to achieve what you have set out to do</w:t>
-      </w:r>
-      <w:r>
-        <w:rPr>
-          <w:highlight w:val="yellow"/>
-        </w:rPr>
-        <w:t>,</w:t>
-      </w:r>
-      <w:r>
-        <w:rPr>
-          <w:highlight w:val="yellow"/>
-        </w:rPr>
-        <w:t xml:space="preserve"> and how will you use it?</w:t>
-      </w:r>
-    </w:p>
-    <w:p>
-      <w:r>
-        <w:t>GitHub, GitHub Desktop, GitHub Project</w:t>
-      </w:r>
-    </w:p>
-    <w:p>
-      <w:r>
-        <w:t>Python</w:t>
-      </w:r>
-    </w:p>
-    <w:p>
-      <w:r>
-        <w:t>PyQt6</w:t>
-      </w:r>
-    </w:p>
-    <w:p>
-      <w:proofErr w:type="spellStart"/>
-      <w:r>
-        <w:t>pathlib</w:t>
-      </w:r>
-      <w:proofErr w:type="spellEnd"/>
-      <w:r>
-        <w:t xml:space="preserve"> – Path</w:t>
-      </w:r>
-    </w:p>
-    <w:p>
-      <w:r>
-        <w:t>sys</w:t>
-      </w:r>
-    </w:p>
-    <w:p>
-      <w:r>
-        <w:t>math – cos, sin, pi</w:t>
-      </w:r>
-    </w:p>
-    <w:p>
-      <w:r>
-        <w:t xml:space="preserve">typing – List, </w:t>
-      </w:r>
-      <w:proofErr w:type="spellStart"/>
-      <w:r>
-        <w:t>Dict</w:t>
-      </w:r>
-      <w:proofErr w:type="spellEnd"/>
-      <w:r>
-        <w:t>, Tuple</w:t>
-      </w:r>
-    </w:p>
-    <w:p>
-      <w:proofErr w:type="spellStart"/>
-      <w:r>
-        <w:t>json</w:t>
-      </w:r>
-      <w:proofErr w:type="spellEnd"/>
-    </w:p>
-    <w:p>
-      <w:proofErr w:type="spellStart"/>
-      <w:r>
-        <w:t>dataclasses</w:t>
-      </w:r>
-      <w:proofErr w:type="spellEnd"/>
-    </w:p>
-    <w:p>
-      <w:r>
-        <w:t>random</w:t>
-      </w:r>
-      <w:r>
-        <w:t xml:space="preserve"> - </w:t>
-      </w:r>
-      <w:proofErr w:type="spellStart"/>
-      <w:r>
-        <w:t>SystemRandom</w:t>
-      </w:r>
-      <w:proofErr w:type="spellEnd"/>
-    </w:p>
-    <w:p>
-      <w:proofErr w:type="spellStart"/>
-      <w:r>
-        <w:t>os</w:t>
-      </w:r>
-      <w:proofErr w:type="spellEnd"/>
-    </w:p>
-    <w:p>
-      <w:pPr>
-        <w:pStyle w:val="Heading2"/>
-      </w:pPr>
-      <w:bookmarkStart w:id="5" w:name="_Toc236031527"/>
-      <w:r>
-        <w:t>Structure</w:t>
-      </w:r>
-      <w:bookmarkEnd w:id="5"/>
-    </w:p>
-    <w:p>
-      <w:r>
-        <w:rPr>
-          <w:highlight w:val="yellow"/>
-        </w:rPr>
         <w:t>Provide a brief overview of the structure of the document and what is addressed in each section.</w:t>
       </w:r>
     </w:p>
@@ -5856,7 +5832,6 @@
       </w:pPr>
       <w:bookmarkStart w:id="6" w:name="_Toc236031528"/>
       <w:r>
-        <w:lastRenderedPageBreak/>
         <w:t>System</w:t>
       </w:r>
       <w:bookmarkEnd w:id="6"/>
@@ -10075,14 +10050,27 @@
                             <w:r>
                               <w:t xml:space="preserve">Telemetry </w:t>
                             </w:r>
-                            <w:fldSimple w:instr=" SEQ Telemetry \* ARABIC ">
-                              <w:r>
-                                <w:rPr>
-                                  <w:noProof/>
-                                </w:rPr>
-                                <w:t>1</w:t>
-                              </w:r>
-                            </w:fldSimple>
+                            <w:r>
+                              <w:fldChar w:fldCharType="begin"/>
+                            </w:r>
+                            <w:r>
+                              <w:instrText xml:space="preserve"> SEQ Telemetry \* ARABIC </w:instrText>
+                            </w:r>
+                            <w:r>
+                              <w:fldChar w:fldCharType="separate"/>
+                            </w:r>
+                            <w:r>
+                              <w:rPr>
+                                <w:noProof/>
+                              </w:rPr>
+                              <w:t>1</w:t>
+                            </w:r>
+                            <w:r>
+                              <w:rPr>
+                                <w:noProof/>
+                              </w:rPr>
+                              <w:fldChar w:fldCharType="end"/>
+                            </w:r>
                           </w:p>
                         </w:txbxContent>
                       </wps:txbx>
@@ -10119,14 +10107,27 @@
                       <w:r>
                         <w:t xml:space="preserve">Telemetry </w:t>
                       </w:r>
-                      <w:fldSimple w:instr=" SEQ Telemetry \* ARABIC ">
-                        <w:r>
-                          <w:rPr>
-                            <w:noProof/>
-                          </w:rPr>
-                          <w:t>1</w:t>
-                        </w:r>
-                      </w:fldSimple>
+                      <w:r>
+                        <w:fldChar w:fldCharType="begin"/>
+                      </w:r>
+                      <w:r>
+                        <w:instrText xml:space="preserve"> SEQ Telemetry \* ARABIC </w:instrText>
+                      </w:r>
+                      <w:r>
+                        <w:fldChar w:fldCharType="separate"/>
+                      </w:r>
+                      <w:r>
+                        <w:rPr>
+                          <w:noProof/>
+                        </w:rPr>
+                        <w:t>1</w:t>
+                      </w:r>
+                      <w:r>
+                        <w:rPr>
+                          <w:noProof/>
+                        </w:rPr>
+                        <w:fldChar w:fldCharType="end"/>
+                      </w:r>
                     </w:p>
                   </w:txbxContent>
                 </v:textbox>
@@ -10279,15 +10280,7 @@
         <w:t xml:space="preserve"> This feature exists both in backend and frontend.</w:t>
       </w:r>
       <w:r>
-        <w:t xml:space="preserve"> To not overburden the page with screenshots, this is merely the backend section, I wrote more for the </w:t>
-      </w:r>
-      <w:proofErr w:type="gramStart"/>
-      <w:r>
-        <w:t>frontend</w:t>
-      </w:r>
-      <w:proofErr w:type="gramEnd"/>
-      <w:r>
-        <w:t xml:space="preserve"> but it is very similar, the only differences being references to physical space.</w:t>
+        <w:t xml:space="preserve"> To not overburden the page with screenshots, this is merely the backend section, I wrote more for the frontend but it is very similar, the only differences being references to physical space.</w:t>
       </w:r>
     </w:p>
     <w:p>
@@ -10357,14 +10350,27 @@
       <w:r>
         <w:t xml:space="preserve">Telemetry </w:t>
       </w:r>
-      <w:fldSimple w:instr=" SEQ Telemetry \* ARABIC ">
-        <w:r>
-          <w:rPr>
-            <w:noProof/>
-          </w:rPr>
-          <w:t>2</w:t>
-        </w:r>
-      </w:fldSimple>
+      <w:r>
+        <w:fldChar w:fldCharType="begin"/>
+      </w:r>
+      <w:r>
+        <w:instrText xml:space="preserve"> SEQ Telemetry \* ARABIC </w:instrText>
+      </w:r>
+      <w:r>
+        <w:fldChar w:fldCharType="separate"/>
+      </w:r>
+      <w:r>
+        <w:rPr>
+          <w:noProof/>
+        </w:rPr>
+        <w:t>2</w:t>
+      </w:r>
+      <w:r>
+        <w:rPr>
+          <w:noProof/>
+        </w:rPr>
+        <w:fldChar w:fldCharType="end"/>
+      </w:r>
     </w:p>
     <w:p>
       <w:r>
@@ -10487,14 +10493,27 @@
       <w:r>
         <w:t xml:space="preserve">Telemetry </w:t>
       </w:r>
-      <w:fldSimple w:instr=" SEQ Telemetry \* ARABIC ">
-        <w:r>
-          <w:rPr>
-            <w:noProof/>
-          </w:rPr>
-          <w:t>3</w:t>
-        </w:r>
-      </w:fldSimple>
+      <w:r>
+        <w:fldChar w:fldCharType="begin"/>
+      </w:r>
+      <w:r>
+        <w:instrText xml:space="preserve"> SEQ Telemetry \* ARABIC </w:instrText>
+      </w:r>
+      <w:r>
+        <w:fldChar w:fldCharType="separate"/>
+      </w:r>
+      <w:r>
+        <w:rPr>
+          <w:noProof/>
+        </w:rPr>
+        <w:t>3</w:t>
+      </w:r>
+      <w:r>
+        <w:rPr>
+          <w:noProof/>
+        </w:rPr>
+        <w:fldChar w:fldCharType="end"/>
+      </w:r>
     </w:p>
     <w:p>
       <w:r>
@@ -10582,14 +10601,27 @@
       <w:r>
         <w:t xml:space="preserve">Telemetry </w:t>
       </w:r>
-      <w:fldSimple w:instr=" SEQ Telemetry \* ARABIC ">
-        <w:r>
-          <w:rPr>
-            <w:noProof/>
-          </w:rPr>
-          <w:t>4</w:t>
-        </w:r>
-      </w:fldSimple>
+      <w:r>
+        <w:fldChar w:fldCharType="begin"/>
+      </w:r>
+      <w:r>
+        <w:instrText xml:space="preserve"> SEQ Telemetry \* ARABIC </w:instrText>
+      </w:r>
+      <w:r>
+        <w:fldChar w:fldCharType="separate"/>
+      </w:r>
+      <w:r>
+        <w:rPr>
+          <w:noProof/>
+        </w:rPr>
+        <w:t>4</w:t>
+      </w:r>
+      <w:r>
+        <w:rPr>
+          <w:noProof/>
+        </w:rPr>
+        <w:fldChar w:fldCharType="end"/>
+      </w:r>
     </w:p>
     <w:p>
       <w:r>
@@ -10680,14 +10712,27 @@
                             <w:r>
                               <w:t xml:space="preserve">Driver </w:t>
                             </w:r>
-                            <w:fldSimple w:instr=" SEQ Driver \* ARABIC ">
-                              <w:r>
-                                <w:rPr>
-                                  <w:noProof/>
-                                </w:rPr>
-                                <w:t>1</w:t>
-                              </w:r>
-                            </w:fldSimple>
+                            <w:r>
+                              <w:fldChar w:fldCharType="begin"/>
+                            </w:r>
+                            <w:r>
+                              <w:instrText xml:space="preserve"> SEQ Driver \* ARABIC </w:instrText>
+                            </w:r>
+                            <w:r>
+                              <w:fldChar w:fldCharType="separate"/>
+                            </w:r>
+                            <w:r>
+                              <w:rPr>
+                                <w:noProof/>
+                              </w:rPr>
+                              <w:t>1</w:t>
+                            </w:r>
+                            <w:r>
+                              <w:rPr>
+                                <w:noProof/>
+                              </w:rPr>
+                              <w:fldChar w:fldCharType="end"/>
+                            </w:r>
                           </w:p>
                         </w:txbxContent>
                       </wps:txbx>
@@ -10715,14 +10760,27 @@
                       <w:r>
                         <w:t xml:space="preserve">Driver </w:t>
                       </w:r>
-                      <w:fldSimple w:instr=" SEQ Driver \* ARABIC ">
-                        <w:r>
-                          <w:rPr>
-                            <w:noProof/>
-                          </w:rPr>
-                          <w:t>1</w:t>
-                        </w:r>
-                      </w:fldSimple>
+                      <w:r>
+                        <w:fldChar w:fldCharType="begin"/>
+                      </w:r>
+                      <w:r>
+                        <w:instrText xml:space="preserve"> SEQ Driver \* ARABIC </w:instrText>
+                      </w:r>
+                      <w:r>
+                        <w:fldChar w:fldCharType="separate"/>
+                      </w:r>
+                      <w:r>
+                        <w:rPr>
+                          <w:noProof/>
+                        </w:rPr>
+                        <w:t>1</w:t>
+                      </w:r>
+                      <w:r>
+                        <w:rPr>
+                          <w:noProof/>
+                        </w:rPr>
+                        <w:fldChar w:fldCharType="end"/>
+                      </w:r>
                     </w:p>
                   </w:txbxContent>
                 </v:textbox>
@@ -10880,14 +10938,27 @@
       <w:r>
         <w:t xml:space="preserve">Driver </w:t>
       </w:r>
-      <w:fldSimple w:instr=" SEQ Driver \* ARABIC ">
-        <w:r>
-          <w:rPr>
-            <w:noProof/>
-          </w:rPr>
-          <w:t>2</w:t>
-        </w:r>
-      </w:fldSimple>
+      <w:r>
+        <w:fldChar w:fldCharType="begin"/>
+      </w:r>
+      <w:r>
+        <w:instrText xml:space="preserve"> SEQ Driver \* ARABIC </w:instrText>
+      </w:r>
+      <w:r>
+        <w:fldChar w:fldCharType="separate"/>
+      </w:r>
+      <w:r>
+        <w:rPr>
+          <w:noProof/>
+        </w:rPr>
+        <w:t>2</w:t>
+      </w:r>
+      <w:r>
+        <w:rPr>
+          <w:noProof/>
+        </w:rPr>
+        <w:fldChar w:fldCharType="end"/>
+      </w:r>
     </w:p>
     <w:p>
       <w:r>
@@ -10966,14 +11037,27 @@
       <w:r>
         <w:t xml:space="preserve">Driver </w:t>
       </w:r>
-      <w:fldSimple w:instr=" SEQ Driver \* ARABIC ">
-        <w:r>
-          <w:rPr>
-            <w:noProof/>
-          </w:rPr>
-          <w:t>3</w:t>
-        </w:r>
-      </w:fldSimple>
+      <w:r>
+        <w:fldChar w:fldCharType="begin"/>
+      </w:r>
+      <w:r>
+        <w:instrText xml:space="preserve"> SEQ Driver \* ARABIC </w:instrText>
+      </w:r>
+      <w:r>
+        <w:fldChar w:fldCharType="separate"/>
+      </w:r>
+      <w:r>
+        <w:rPr>
+          <w:noProof/>
+        </w:rPr>
+        <w:t>3</w:t>
+      </w:r>
+      <w:r>
+        <w:rPr>
+          <w:noProof/>
+        </w:rPr>
+        <w:fldChar w:fldCharType="end"/>
+      </w:r>
     </w:p>
     <w:p>
       <w:r>
@@ -11057,14 +11141,27 @@
                             <w:r>
                               <w:t xml:space="preserve">Track </w:t>
                             </w:r>
-                            <w:fldSimple w:instr=" SEQ Track \* ARABIC ">
-                              <w:r>
-                                <w:rPr>
-                                  <w:noProof/>
-                                </w:rPr>
-                                <w:t>1</w:t>
-                              </w:r>
-                            </w:fldSimple>
+                            <w:r>
+                              <w:fldChar w:fldCharType="begin"/>
+                            </w:r>
+                            <w:r>
+                              <w:instrText xml:space="preserve"> SEQ Track \* ARABIC </w:instrText>
+                            </w:r>
+                            <w:r>
+                              <w:fldChar w:fldCharType="separate"/>
+                            </w:r>
+                            <w:r>
+                              <w:rPr>
+                                <w:noProof/>
+                              </w:rPr>
+                              <w:t>1</w:t>
+                            </w:r>
+                            <w:r>
+                              <w:rPr>
+                                <w:noProof/>
+                              </w:rPr>
+                              <w:fldChar w:fldCharType="end"/>
+                            </w:r>
                           </w:p>
                         </w:txbxContent>
                       </wps:txbx>
@@ -11100,14 +11197,27 @@
                       <w:r>
                         <w:t xml:space="preserve">Track </w:t>
                       </w:r>
-                      <w:fldSimple w:instr=" SEQ Track \* ARABIC ">
-                        <w:r>
-                          <w:rPr>
-                            <w:noProof/>
-                          </w:rPr>
-                          <w:t>1</w:t>
-                        </w:r>
-                      </w:fldSimple>
+                      <w:r>
+                        <w:fldChar w:fldCharType="begin"/>
+                      </w:r>
+                      <w:r>
+                        <w:instrText xml:space="preserve"> SEQ Track \* ARABIC </w:instrText>
+                      </w:r>
+                      <w:r>
+                        <w:fldChar w:fldCharType="separate"/>
+                      </w:r>
+                      <w:r>
+                        <w:rPr>
+                          <w:noProof/>
+                        </w:rPr>
+                        <w:t>1</w:t>
+                      </w:r>
+                      <w:r>
+                        <w:rPr>
+                          <w:noProof/>
+                        </w:rPr>
+                        <w:fldChar w:fldCharType="end"/>
+                      </w:r>
                     </w:p>
                   </w:txbxContent>
                 </v:textbox>
@@ -11404,14 +11514,27 @@
                             <w:r>
                               <w:t xml:space="preserve">Track </w:t>
                             </w:r>
-                            <w:fldSimple w:instr=" SEQ Track \* ARABIC ">
-                              <w:r>
-                                <w:rPr>
-                                  <w:noProof/>
-                                </w:rPr>
-                                <w:t>2</w:t>
-                              </w:r>
-                            </w:fldSimple>
+                            <w:r>
+                              <w:fldChar w:fldCharType="begin"/>
+                            </w:r>
+                            <w:r>
+                              <w:instrText xml:space="preserve"> SEQ Track \* ARABIC </w:instrText>
+                            </w:r>
+                            <w:r>
+                              <w:fldChar w:fldCharType="separate"/>
+                            </w:r>
+                            <w:r>
+                              <w:rPr>
+                                <w:noProof/>
+                              </w:rPr>
+                              <w:t>2</w:t>
+                            </w:r>
+                            <w:r>
+                              <w:rPr>
+                                <w:noProof/>
+                              </w:rPr>
+                              <w:fldChar w:fldCharType="end"/>
+                            </w:r>
                           </w:p>
                         </w:txbxContent>
                       </wps:txbx>
@@ -11443,14 +11566,27 @@
                       <w:r>
                         <w:t xml:space="preserve">Track </w:t>
                       </w:r>
-                      <w:fldSimple w:instr=" SEQ Track \* ARABIC ">
-                        <w:r>
-                          <w:rPr>
-                            <w:noProof/>
-                          </w:rPr>
-                          <w:t>2</w:t>
-                        </w:r>
-                      </w:fldSimple>
+                      <w:r>
+                        <w:fldChar w:fldCharType="begin"/>
+                      </w:r>
+                      <w:r>
+                        <w:instrText xml:space="preserve"> SEQ Track \* ARABIC </w:instrText>
+                      </w:r>
+                      <w:r>
+                        <w:fldChar w:fldCharType="separate"/>
+                      </w:r>
+                      <w:r>
+                        <w:rPr>
+                          <w:noProof/>
+                        </w:rPr>
+                        <w:t>2</w:t>
+                      </w:r>
+                      <w:r>
+                        <w:rPr>
+                          <w:noProof/>
+                        </w:rPr>
+                        <w:fldChar w:fldCharType="end"/>
+                      </w:r>
                     </w:p>
                   </w:txbxContent>
                 </v:textbox>
@@ -11526,14 +11662,27 @@
                             <w:r>
                               <w:t xml:space="preserve">Track </w:t>
                             </w:r>
-                            <w:fldSimple w:instr=" SEQ Track \* ARABIC ">
-                              <w:r>
-                                <w:rPr>
-                                  <w:noProof/>
-                                </w:rPr>
-                                <w:t>3</w:t>
-                              </w:r>
-                            </w:fldSimple>
+                            <w:r>
+                              <w:fldChar w:fldCharType="begin"/>
+                            </w:r>
+                            <w:r>
+                              <w:instrText xml:space="preserve"> SEQ Track \* ARABIC </w:instrText>
+                            </w:r>
+                            <w:r>
+                              <w:fldChar w:fldCharType="separate"/>
+                            </w:r>
+                            <w:r>
+                              <w:rPr>
+                                <w:noProof/>
+                              </w:rPr>
+                              <w:t>3</w:t>
+                            </w:r>
+                            <w:r>
+                              <w:rPr>
+                                <w:noProof/>
+                              </w:rPr>
+                              <w:fldChar w:fldCharType="end"/>
+                            </w:r>
                           </w:p>
                         </w:txbxContent>
                       </wps:txbx>
@@ -11565,14 +11714,27 @@
                       <w:r>
                         <w:t xml:space="preserve">Track </w:t>
                       </w:r>
-                      <w:fldSimple w:instr=" SEQ Track \* ARABIC ">
-                        <w:r>
-                          <w:rPr>
-                            <w:noProof/>
-                          </w:rPr>
-                          <w:t>3</w:t>
-                        </w:r>
-                      </w:fldSimple>
+                      <w:r>
+                        <w:fldChar w:fldCharType="begin"/>
+                      </w:r>
+                      <w:r>
+                        <w:instrText xml:space="preserve"> SEQ Track \* ARABIC </w:instrText>
+                      </w:r>
+                      <w:r>
+                        <w:fldChar w:fldCharType="separate"/>
+                      </w:r>
+                      <w:r>
+                        <w:rPr>
+                          <w:noProof/>
+                        </w:rPr>
+                        <w:t>3</w:t>
+                      </w:r>
+                      <w:r>
+                        <w:rPr>
+                          <w:noProof/>
+                        </w:rPr>
+                        <w:fldChar w:fldCharType="end"/>
+                      </w:r>
                     </w:p>
                   </w:txbxContent>
                 </v:textbox>
@@ -11687,14 +11849,27 @@
       <w:r>
         <w:t xml:space="preserve">Track </w:t>
       </w:r>
-      <w:fldSimple w:instr=" SEQ Track \* ARABIC ">
-        <w:r>
-          <w:rPr>
-            <w:noProof/>
-          </w:rPr>
-          <w:t>4</w:t>
-        </w:r>
-      </w:fldSimple>
+      <w:r>
+        <w:fldChar w:fldCharType="begin"/>
+      </w:r>
+      <w:r>
+        <w:instrText xml:space="preserve"> SEQ Track \* ARABIC </w:instrText>
+      </w:r>
+      <w:r>
+        <w:fldChar w:fldCharType="separate"/>
+      </w:r>
+      <w:r>
+        <w:rPr>
+          <w:noProof/>
+        </w:rPr>
+        <w:t>4</w:t>
+      </w:r>
+      <w:r>
+        <w:rPr>
+          <w:noProof/>
+        </w:rPr>
+        <w:fldChar w:fldCharType="end"/>
+      </w:r>
     </w:p>
     <w:p>
       <w:r>
@@ -11783,14 +11958,27 @@
                             <w:r>
                               <w:t xml:space="preserve">Track </w:t>
                             </w:r>
-                            <w:fldSimple w:instr=" SEQ Track \* ARABIC ">
-                              <w:r>
-                                <w:rPr>
-                                  <w:noProof/>
-                                </w:rPr>
-                                <w:t>5</w:t>
-                              </w:r>
-                            </w:fldSimple>
+                            <w:r>
+                              <w:fldChar w:fldCharType="begin"/>
+                            </w:r>
+                            <w:r>
+                              <w:instrText xml:space="preserve"> SEQ Track \* ARABIC </w:instrText>
+                            </w:r>
+                            <w:r>
+                              <w:fldChar w:fldCharType="separate"/>
+                            </w:r>
+                            <w:r>
+                              <w:rPr>
+                                <w:noProof/>
+                              </w:rPr>
+                              <w:t>5</w:t>
+                            </w:r>
+                            <w:r>
+                              <w:rPr>
+                                <w:noProof/>
+                              </w:rPr>
+                              <w:fldChar w:fldCharType="end"/>
+                            </w:r>
                           </w:p>
                         </w:txbxContent>
                       </wps:txbx>
@@ -11822,14 +12010,27 @@
                       <w:r>
                         <w:t xml:space="preserve">Track </w:t>
                       </w:r>
-                      <w:fldSimple w:instr=" SEQ Track \* ARABIC ">
-                        <w:r>
-                          <w:rPr>
-                            <w:noProof/>
-                          </w:rPr>
-                          <w:t>5</w:t>
-                        </w:r>
-                      </w:fldSimple>
+                      <w:r>
+                        <w:fldChar w:fldCharType="begin"/>
+                      </w:r>
+                      <w:r>
+                        <w:instrText xml:space="preserve"> SEQ Track \* ARABIC </w:instrText>
+                      </w:r>
+                      <w:r>
+                        <w:fldChar w:fldCharType="separate"/>
+                      </w:r>
+                      <w:r>
+                        <w:rPr>
+                          <w:noProof/>
+                        </w:rPr>
+                        <w:t>5</w:t>
+                      </w:r>
+                      <w:r>
+                        <w:rPr>
+                          <w:noProof/>
+                        </w:rPr>
+                        <w:fldChar w:fldCharType="end"/>
+                      </w:r>
                     </w:p>
                   </w:txbxContent>
                 </v:textbox>
@@ -12123,14 +12324,27 @@
                             <w:r>
                               <w:t xml:space="preserve">Track </w:t>
                             </w:r>
-                            <w:fldSimple w:instr=" SEQ Track \* ARABIC ">
-                              <w:r>
-                                <w:rPr>
-                                  <w:noProof/>
-                                </w:rPr>
-                                <w:t>6</w:t>
-                              </w:r>
-                            </w:fldSimple>
+                            <w:r>
+                              <w:fldChar w:fldCharType="begin"/>
+                            </w:r>
+                            <w:r>
+                              <w:instrText xml:space="preserve"> SEQ Track \* ARABIC </w:instrText>
+                            </w:r>
+                            <w:r>
+                              <w:fldChar w:fldCharType="separate"/>
+                            </w:r>
+                            <w:r>
+                              <w:rPr>
+                                <w:noProof/>
+                              </w:rPr>
+                              <w:t>6</w:t>
+                            </w:r>
+                            <w:r>
+                              <w:rPr>
+                                <w:noProof/>
+                              </w:rPr>
+                              <w:fldChar w:fldCharType="end"/>
+                            </w:r>
                           </w:p>
                         </w:txbxContent>
                       </wps:txbx>
@@ -12163,14 +12377,27 @@
                       <w:r>
                         <w:t xml:space="preserve">Track </w:t>
                       </w:r>
-                      <w:fldSimple w:instr=" SEQ Track \* ARABIC ">
-                        <w:r>
-                          <w:rPr>
-                            <w:noProof/>
-                          </w:rPr>
-                          <w:t>6</w:t>
-                        </w:r>
-                      </w:fldSimple>
+                      <w:r>
+                        <w:fldChar w:fldCharType="begin"/>
+                      </w:r>
+                      <w:r>
+                        <w:instrText xml:space="preserve"> SEQ Track \* ARABIC </w:instrText>
+                      </w:r>
+                      <w:r>
+                        <w:fldChar w:fldCharType="separate"/>
+                      </w:r>
+                      <w:r>
+                        <w:rPr>
+                          <w:noProof/>
+                        </w:rPr>
+                        <w:t>6</w:t>
+                      </w:r>
+                      <w:r>
+                        <w:rPr>
+                          <w:noProof/>
+                        </w:rPr>
+                        <w:fldChar w:fldCharType="end"/>
+                      </w:r>
                     </w:p>
                   </w:txbxContent>
                 </v:textbox>
@@ -12231,6 +12458,9 @@
         <w:ind w:left="360"/>
       </w:pPr>
       <w:r>
+        <w:rPr>
+          <w:noProof/>
+        </w:rPr>
         <w:drawing>
           <wp:inline distT="0" distB="0" distL="0" distR="0" wp14:anchorId="760AE5FC" wp14:editId="6F6EA6A0">
             <wp:extent cx="2976504" cy="7614745"/>
@@ -12279,6 +12509,9 @@
     </w:p>
     <w:p>
       <w:r>
+        <w:rPr>
+          <w:noProof/>
+        </w:rPr>
         <w:drawing>
           <wp:inline distT="0" distB="0" distL="0" distR="0" wp14:anchorId="5826AC03" wp14:editId="5F95DB6C">
             <wp:extent cx="5731510" cy="1828165"/>
@@ -12326,6 +12559,9 @@
     </w:p>
     <w:p>
       <w:r>
+        <w:rPr>
+          <w:noProof/>
+        </w:rPr>
         <w:drawing>
           <wp:inline distT="0" distB="0" distL="0" distR="0" wp14:anchorId="12E4CAE4" wp14:editId="4D8EC81F">
             <wp:extent cx="5731510" cy="2084705"/>
@@ -12365,6 +12601,9 @@
     </w:p>
     <w:p>
       <w:r>
+        <w:rPr>
+          <w:noProof/>
+        </w:rPr>
         <w:drawing>
           <wp:inline distT="0" distB="0" distL="0" distR="0" wp14:anchorId="6F717627" wp14:editId="495B507D">
             <wp:extent cx="5731510" cy="2035810"/>
@@ -12413,6 +12652,9 @@
     </w:p>
     <w:p>
       <w:r>
+        <w:rPr>
+          <w:noProof/>
+        </w:rPr>
         <w:drawing>
           <wp:inline distT="0" distB="0" distL="0" distR="0" wp14:anchorId="04121532" wp14:editId="44C3E1ED">
             <wp:extent cx="5401429" cy="3124636"/>
@@ -12480,19 +12722,1408 @@
     </w:p>
     <w:p>
       <w:pPr>
-        <w:ind w:left="360"/>
-        <w:rPr>
-          <w:sz w:val="24"/>
-          <w:szCs w:val="24"/>
-        </w:rPr>
-      </w:pPr>
-      <w:r>
-        <w:rPr>
-          <w:sz w:val="24"/>
-          <w:szCs w:val="24"/>
-          <w:highlight w:val="yellow"/>
-        </w:rPr>
-        <w:t>Describe any testing tools, test plans and test specifications used in the project.  Provide evidence for and results of all Unit, Integration and End User testing that is carried out.</w:t>
+        <w:pStyle w:val="Heading3"/>
+      </w:pPr>
+      <w:r>
+        <w:t>Tools</w:t>
+      </w:r>
+    </w:p>
+    <w:p>
+      <w:r>
+        <w:t>pytest was used as the automated testing framework for Momentum. The framework was selected because it provides automatic test discovery, simple assertion-based testing, and clear reporting of successful and failed test cases.</w:t>
+      </w:r>
+    </w:p>
+    <w:p>
+      <w:r>
+        <w:t>The project was configured as a Python package to allow test files to import source modules correctly during execution.</w:t>
+      </w:r>
+    </w:p>
+    <w:p>
+      <w:r>
+        <w:t xml:space="preserve">The </w:t>
+      </w:r>
+      <w:proofErr w:type="spellStart"/>
+      <w:r>
+        <w:t>src</w:t>
+      </w:r>
+      <w:proofErr w:type="spellEnd"/>
+      <w:r>
+        <w:t xml:space="preserve"> directory was converted into a Python package by adding __init__.py files. These files were added to the main source directory and relevant subdirectories, including:</w:t>
+      </w:r>
+    </w:p>
+    <w:p>
+      <w:pPr>
+        <w:numPr>
+          <w:ilvl w:val="0"/>
+          <w:numId w:val="37"/>
+        </w:numPr>
+      </w:pPr>
+      <w:r>
+        <w:t>src/</w:t>
+      </w:r>
+      <w:r>
+        <w:rPr>
+          <w:b/>
+          <w:bCs/>
+        </w:rPr>
+        <w:t>init</w:t>
+      </w:r>
+      <w:r>
+        <w:t xml:space="preserve">.py </w:t>
+      </w:r>
+    </w:p>
+    <w:p>
+      <w:pPr>
+        <w:numPr>
+          <w:ilvl w:val="0"/>
+          <w:numId w:val="37"/>
+        </w:numPr>
+      </w:pPr>
+      <w:r>
+        <w:t>src/core/</w:t>
+      </w:r>
+      <w:r>
+        <w:rPr>
+          <w:b/>
+          <w:bCs/>
+        </w:rPr>
+        <w:t>init</w:t>
+      </w:r>
+      <w:r>
+        <w:t xml:space="preserve">.py </w:t>
+      </w:r>
+    </w:p>
+    <w:p>
+      <w:pPr>
+        <w:numPr>
+          <w:ilvl w:val="0"/>
+          <w:numId w:val="37"/>
+        </w:numPr>
+      </w:pPr>
+      <w:r>
+        <w:t>src/models/</w:t>
+      </w:r>
+      <w:r>
+        <w:rPr>
+          <w:b/>
+          <w:bCs/>
+        </w:rPr>
+        <w:t>init</w:t>
+      </w:r>
+      <w:r>
+        <w:t xml:space="preserve">.py </w:t>
+      </w:r>
+    </w:p>
+    <w:p>
+      <w:r>
+        <w:t>The presence of these files allows Python to recognise the directories as packages and enables standard module imports within test files.</w:t>
+      </w:r>
+    </w:p>
+    <w:p>
+      <w:r>
+        <w:t>A pytest.ini configuration file was created in the project root directory. This file configures pytest to include the project root in the Python import path:</w:t>
+      </w:r>
+    </w:p>
+    <w:p>
+      <w:r>
+        <w:t>[pytest]</w:t>
+      </w:r>
+    </w:p>
+    <w:p>
+      <w:proofErr w:type="spellStart"/>
+      <w:r>
+        <w:t>pythonpath</w:t>
+      </w:r>
+      <w:proofErr w:type="spellEnd"/>
+      <w:r>
+        <w:t xml:space="preserve"> = .</w:t>
+      </w:r>
+    </w:p>
+    <w:p>
+      <w:r>
+        <w:t>This configuration allows test files to import project modules directly, for example:</w:t>
+      </w:r>
+    </w:p>
+    <w:p>
+      <w:r>
+        <w:t xml:space="preserve">from </w:t>
+      </w:r>
+      <w:proofErr w:type="spellStart"/>
+      <w:r>
+        <w:t>src.core.race_controller</w:t>
+      </w:r>
+      <w:proofErr w:type="spellEnd"/>
+      <w:r>
+        <w:t xml:space="preserve"> import </w:t>
+      </w:r>
+      <w:proofErr w:type="spellStart"/>
+      <w:r>
+        <w:t>RaceController</w:t>
+      </w:r>
+      <w:proofErr w:type="spellEnd"/>
+    </w:p>
+    <w:p>
+      <w:r>
+        <w:t>without requiring manual modification of the Python system path.</w:t>
+      </w:r>
+    </w:p>
+    <w:p>
+      <w:r>
+        <w:t xml:space="preserve">Tests were organised using </w:t>
+      </w:r>
+      <w:proofErr w:type="spellStart"/>
+      <w:r>
+        <w:t>pytest's</w:t>
+      </w:r>
+      <w:proofErr w:type="spellEnd"/>
+      <w:r>
+        <w:t xml:space="preserve"> default naming conventions. Test files must begin with test_ or end with _test.py to be automatically detected by the pytest test discovery system.</w:t>
+      </w:r>
+    </w:p>
+    <w:p>
+      <w:r>
+        <w:t>The testing directory was organised into separate categories:</w:t>
+      </w:r>
+    </w:p>
+    <w:p>
+      <w:r>
+        <w:t>tests/</w:t>
+      </w:r>
+    </w:p>
+    <w:p>
+      <w:pPr>
+        <w:numPr>
+          <w:ilvl w:val="0"/>
+          <w:numId w:val="38"/>
+        </w:numPr>
+      </w:pPr>
+      <w:r>
+        <w:t xml:space="preserve">unit/ </w:t>
+      </w:r>
+    </w:p>
+    <w:p>
+      <w:pPr>
+        <w:numPr>
+          <w:ilvl w:val="1"/>
+          <w:numId w:val="38"/>
+        </w:numPr>
+      </w:pPr>
+      <w:r>
+        <w:t xml:space="preserve">test_driver_generate.py </w:t>
+      </w:r>
+    </w:p>
+    <w:p>
+      <w:pPr>
+        <w:numPr>
+          <w:ilvl w:val="0"/>
+          <w:numId w:val="38"/>
+        </w:numPr>
+      </w:pPr>
+      <w:r>
+        <w:t xml:space="preserve">class/ </w:t>
+      </w:r>
+    </w:p>
+    <w:p>
+      <w:pPr>
+        <w:numPr>
+          <w:ilvl w:val="1"/>
+          <w:numId w:val="38"/>
+        </w:numPr>
+      </w:pPr>
+      <w:r>
+        <w:t xml:space="preserve">test_race_controller_class.py </w:t>
+      </w:r>
+    </w:p>
+    <w:p>
+      <w:pPr>
+        <w:numPr>
+          <w:ilvl w:val="0"/>
+          <w:numId w:val="38"/>
+        </w:numPr>
+      </w:pPr>
+      <w:r>
+        <w:t xml:space="preserve">integration/ </w:t>
+      </w:r>
+    </w:p>
+    <w:p>
+      <w:pPr>
+        <w:numPr>
+          <w:ilvl w:val="0"/>
+          <w:numId w:val="38"/>
+        </w:numPr>
+      </w:pPr>
+      <w:r>
+        <w:t xml:space="preserve">system/ </w:t>
+      </w:r>
+    </w:p>
+    <w:p>
+      <w:r>
+        <w:t>Unit tests were stored in the unit directory, class-level tests were stored in the class directory, and additional directories were created for future integration and system testing.</w:t>
+      </w:r>
+    </w:p>
+    <w:p>
+      <w:r>
+        <w:t>Tests were executed from the project root directory using the command:</w:t>
+      </w:r>
+    </w:p>
+    <w:p>
+      <w:r>
+        <w:lastRenderedPageBreak/>
+        <w:t>pytest</w:t>
+      </w:r>
+    </w:p>
+    <w:p>
+      <w:r>
+        <w:t>When executed, pytest automatically searches the test directories, identifies correctly named test files, runs each test function, and provides a summary showing the number of passed and failed tests.</w:t>
+      </w:r>
+    </w:p>
+    <w:p/>
+    <w:p>
+      <w:pPr>
+        <w:pStyle w:val="Heading3"/>
+      </w:pPr>
+      <w:r>
+        <w:t>Unit</w:t>
+      </w:r>
+    </w:p>
+    <w:p>
+      <w:r>
+        <w:t>Unit testing is testing method that pays specific attention to an individual component (unit) of code.</w:t>
+      </w:r>
+      <w:sdt>
+        <w:sdtPr>
+          <w:id w:val="-1297912567"/>
+          <w:citation/>
+        </w:sdtPr>
+        <w:sdtContent>
+          <w:r>
+            <w:fldChar w:fldCharType="begin"/>
+          </w:r>
+          <w:r>
+            <w:rPr>
+              <w:lang w:val="en-GB"/>
+            </w:rPr>
+            <w:instrText xml:space="preserve"> CITATION Pow25 \l 2057 </w:instrText>
+          </w:r>
+          <w:r>
+            <w:fldChar w:fldCharType="separate"/>
+          </w:r>
+          <w:r>
+            <w:rPr>
+              <w:noProof/>
+              <w:lang w:val="en-GB"/>
+            </w:rPr>
+            <w:t xml:space="preserve"> </w:t>
+          </w:r>
+          <w:r>
+            <w:rPr>
+              <w:noProof/>
+              <w:lang w:val="en-GB"/>
+            </w:rPr>
+            <w:t>(Powell &amp; Smalley, 2025)</w:t>
+          </w:r>
+          <w:r>
+            <w:fldChar w:fldCharType="end"/>
+          </w:r>
+        </w:sdtContent>
+      </w:sdt>
+    </w:p>
+    <w:p>
+      <w:r>
+        <w:t>The idea is you have working code committed to the codebase instead of figuring out what works and what doesn’t right at the end, this concept is known as “shift left”.</w:t>
+      </w:r>
+    </w:p>
+    <w:p>
+      <w:pPr>
+        <w:pStyle w:val="Heading4"/>
+      </w:pPr>
+      <w:r>
+        <w:t>Plan</w:t>
+      </w:r>
+    </w:p>
+    <w:p>
+      <w:r>
+        <w:t>Unit testing was performed using pytest. The primary focus of automated unit testing was the driver generation module, ensuring that randomly generated drivers satisfied the constraints defined by the simulation design. Each test was designed to verify a specific requirement of the driver generation system.</w:t>
+      </w:r>
+    </w:p>
+    <w:tbl>
+      <w:tblPr>
+        <w:tblStyle w:val="GridTable3-Accent1"/>
+        <w:tblW w:w="0" w:type="auto"/>
+        <w:tblLook w:val="0620" w:firstRow="1" w:lastRow="0" w:firstColumn="0" w:lastColumn="0" w:noHBand="1" w:noVBand="1"/>
+      </w:tblPr>
+      <w:tblGrid>
+        <w:gridCol w:w="678"/>
+        <w:gridCol w:w="2402"/>
+        <w:gridCol w:w="1499"/>
+        <w:gridCol w:w="1545"/>
+        <w:gridCol w:w="2902"/>
+      </w:tblGrid>
+      <w:tr>
+        <w:trPr>
+          <w:cnfStyle w:val="100000000000" w:firstRow="1" w:lastRow="0" w:firstColumn="0" w:lastColumn="0" w:oddVBand="0" w:evenVBand="0" w:oddHBand="0" w:evenHBand="0" w:firstRowFirstColumn="0" w:firstRowLastColumn="0" w:lastRowFirstColumn="0" w:lastRowLastColumn="0"/>
+        </w:trPr>
+        <w:tc>
+          <w:tcPr>
+            <w:tcW w:w="0" w:type="auto"/>
+            <w:vAlign w:val="center"/>
+            <w:hideMark/>
+          </w:tcPr>
+          <w:p>
+            <w:pPr>
+              <w:spacing w:after="160" w:line="259" w:lineRule="auto"/>
+              <w:jc w:val="center"/>
+            </w:pPr>
+            <w:r>
+              <w:t>Test ID</w:t>
+            </w:r>
+          </w:p>
+        </w:tc>
+        <w:tc>
+          <w:tcPr>
+            <w:tcW w:w="0" w:type="auto"/>
+            <w:vAlign w:val="center"/>
+            <w:hideMark/>
+          </w:tcPr>
+          <w:p>
+            <w:pPr>
+              <w:spacing w:after="160" w:line="259" w:lineRule="auto"/>
+              <w:jc w:val="center"/>
+            </w:pPr>
+            <w:r>
+              <w:t>Test Description</w:t>
+            </w:r>
+          </w:p>
+        </w:tc>
+        <w:tc>
+          <w:tcPr>
+            <w:tcW w:w="0" w:type="auto"/>
+            <w:vAlign w:val="center"/>
+            <w:hideMark/>
+          </w:tcPr>
+          <w:p>
+            <w:pPr>
+              <w:spacing w:after="160" w:line="259" w:lineRule="auto"/>
+              <w:jc w:val="center"/>
+            </w:pPr>
+            <w:r>
+              <w:t>Component</w:t>
+            </w:r>
+            <w:r>
+              <w:t xml:space="preserve"> </w:t>
+            </w:r>
+            <w:r>
+              <w:t>Tested</w:t>
+            </w:r>
+          </w:p>
+        </w:tc>
+        <w:tc>
+          <w:tcPr>
+            <w:tcW w:w="0" w:type="auto"/>
+            <w:vAlign w:val="center"/>
+            <w:hideMark/>
+          </w:tcPr>
+          <w:p>
+            <w:pPr>
+              <w:spacing w:after="160" w:line="259" w:lineRule="auto"/>
+              <w:jc w:val="center"/>
+            </w:pPr>
+            <w:r>
+              <w:t>Test Method</w:t>
+            </w:r>
+          </w:p>
+        </w:tc>
+        <w:tc>
+          <w:tcPr>
+            <w:tcW w:w="0" w:type="auto"/>
+            <w:vAlign w:val="center"/>
+            <w:hideMark/>
+          </w:tcPr>
+          <w:p>
+            <w:pPr>
+              <w:spacing w:after="160" w:line="259" w:lineRule="auto"/>
+              <w:jc w:val="center"/>
+            </w:pPr>
+            <w:r>
+              <w:t>Expected Result</w:t>
+            </w:r>
+          </w:p>
+        </w:tc>
+      </w:tr>
+      <w:tr>
+        <w:tc>
+          <w:tcPr>
+            <w:tcW w:w="0" w:type="auto"/>
+            <w:vAlign w:val="center"/>
+            <w:hideMark/>
+          </w:tcPr>
+          <w:p>
+            <w:pPr>
+              <w:spacing w:after="160" w:line="259" w:lineRule="auto"/>
+              <w:jc w:val="center"/>
+            </w:pPr>
+            <w:r>
+              <w:t>UT-01</w:t>
+            </w:r>
+          </w:p>
+        </w:tc>
+        <w:tc>
+          <w:tcPr>
+            <w:tcW w:w="0" w:type="auto"/>
+            <w:vAlign w:val="center"/>
+            <w:hideMark/>
+          </w:tcPr>
+          <w:p>
+            <w:pPr>
+              <w:spacing w:after="160" w:line="259" w:lineRule="auto"/>
+              <w:jc w:val="center"/>
+            </w:pPr>
+            <w:r>
+              <w:t>Verify the correct number of drivers are generated</w:t>
+            </w:r>
+          </w:p>
+        </w:tc>
+        <w:tc>
+          <w:tcPr>
+            <w:tcW w:w="0" w:type="auto"/>
+            <w:vAlign w:val="center"/>
+            <w:hideMark/>
+          </w:tcPr>
+          <w:p>
+            <w:pPr>
+              <w:spacing w:after="160" w:line="259" w:lineRule="auto"/>
+              <w:jc w:val="center"/>
+            </w:pPr>
+            <w:r>
+              <w:t>Driver generation</w:t>
+            </w:r>
+          </w:p>
+        </w:tc>
+        <w:tc>
+          <w:tcPr>
+            <w:tcW w:w="0" w:type="auto"/>
+            <w:vAlign w:val="center"/>
+            <w:hideMark/>
+          </w:tcPr>
+          <w:p>
+            <w:pPr>
+              <w:spacing w:after="160" w:line="259" w:lineRule="auto"/>
+              <w:jc w:val="center"/>
+            </w:pPr>
+            <w:r>
+              <w:t>Automated pytest test</w:t>
+            </w:r>
+          </w:p>
+        </w:tc>
+        <w:tc>
+          <w:tcPr>
+            <w:tcW w:w="0" w:type="auto"/>
+            <w:vAlign w:val="center"/>
+            <w:hideMark/>
+          </w:tcPr>
+          <w:p>
+            <w:pPr>
+              <w:spacing w:after="160" w:line="259" w:lineRule="auto"/>
+              <w:jc w:val="center"/>
+            </w:pPr>
+            <w:r>
+              <w:t>The function generates 10 driver objects, matching the race grid size</w:t>
+            </w:r>
+          </w:p>
+        </w:tc>
+      </w:tr>
+      <w:tr>
+        <w:tc>
+          <w:tcPr>
+            <w:tcW w:w="0" w:type="auto"/>
+            <w:vAlign w:val="center"/>
+            <w:hideMark/>
+          </w:tcPr>
+          <w:p>
+            <w:pPr>
+              <w:spacing w:after="160" w:line="259" w:lineRule="auto"/>
+              <w:jc w:val="center"/>
+            </w:pPr>
+            <w:r>
+              <w:t>UT-02</w:t>
+            </w:r>
+          </w:p>
+        </w:tc>
+        <w:tc>
+          <w:tcPr>
+            <w:tcW w:w="0" w:type="auto"/>
+            <w:vAlign w:val="center"/>
+            <w:hideMark/>
+          </w:tcPr>
+          <w:p>
+            <w:pPr>
+              <w:spacing w:after="160" w:line="259" w:lineRule="auto"/>
+              <w:jc w:val="center"/>
+            </w:pPr>
+            <w:r>
+              <w:t>Verify generated drivers have assigned names</w:t>
+            </w:r>
+          </w:p>
+        </w:tc>
+        <w:tc>
+          <w:tcPr>
+            <w:tcW w:w="0" w:type="auto"/>
+            <w:vAlign w:val="center"/>
+            <w:hideMark/>
+          </w:tcPr>
+          <w:p>
+            <w:pPr>
+              <w:spacing w:after="160" w:line="259" w:lineRule="auto"/>
+              <w:jc w:val="center"/>
+            </w:pPr>
+            <w:r>
+              <w:t>Driver generation</w:t>
+            </w:r>
+          </w:p>
+        </w:tc>
+        <w:tc>
+          <w:tcPr>
+            <w:tcW w:w="0" w:type="auto"/>
+            <w:vAlign w:val="center"/>
+            <w:hideMark/>
+          </w:tcPr>
+          <w:p>
+            <w:pPr>
+              <w:spacing w:after="160" w:line="259" w:lineRule="auto"/>
+              <w:jc w:val="center"/>
+            </w:pPr>
+            <w:r>
+              <w:t>Automated pytest test</w:t>
+            </w:r>
+          </w:p>
+        </w:tc>
+        <w:tc>
+          <w:tcPr>
+            <w:tcW w:w="0" w:type="auto"/>
+            <w:vAlign w:val="center"/>
+            <w:hideMark/>
+          </w:tcPr>
+          <w:p>
+            <w:pPr>
+              <w:spacing w:after="160" w:line="259" w:lineRule="auto"/>
+              <w:jc w:val="center"/>
+            </w:pPr>
+            <w:r>
+              <w:t>Every generated driver contains a non-empty name</w:t>
+            </w:r>
+          </w:p>
+        </w:tc>
+      </w:tr>
+      <w:tr>
+        <w:tc>
+          <w:tcPr>
+            <w:tcW w:w="0" w:type="auto"/>
+            <w:vAlign w:val="center"/>
+            <w:hideMark/>
+          </w:tcPr>
+          <w:p>
+            <w:pPr>
+              <w:spacing w:after="160" w:line="259" w:lineRule="auto"/>
+              <w:jc w:val="center"/>
+            </w:pPr>
+            <w:r>
+              <w:t>UT-03</w:t>
+            </w:r>
+          </w:p>
+        </w:tc>
+        <w:tc>
+          <w:tcPr>
+            <w:tcW w:w="0" w:type="auto"/>
+            <w:vAlign w:val="center"/>
+            <w:hideMark/>
+          </w:tcPr>
+          <w:p>
+            <w:pPr>
+              <w:spacing w:after="160" w:line="259" w:lineRule="auto"/>
+              <w:jc w:val="center"/>
+            </w:pPr>
+            <w:r>
+              <w:t>Verify generated nationalities are valid</w:t>
+            </w:r>
+          </w:p>
+        </w:tc>
+        <w:tc>
+          <w:tcPr>
+            <w:tcW w:w="0" w:type="auto"/>
+            <w:vAlign w:val="center"/>
+            <w:hideMark/>
+          </w:tcPr>
+          <w:p>
+            <w:pPr>
+              <w:spacing w:after="160" w:line="259" w:lineRule="auto"/>
+              <w:jc w:val="center"/>
+            </w:pPr>
+            <w:r>
+              <w:t>Driver generation</w:t>
+            </w:r>
+          </w:p>
+        </w:tc>
+        <w:tc>
+          <w:tcPr>
+            <w:tcW w:w="0" w:type="auto"/>
+            <w:vAlign w:val="center"/>
+            <w:hideMark/>
+          </w:tcPr>
+          <w:p>
+            <w:pPr>
+              <w:spacing w:after="160" w:line="259" w:lineRule="auto"/>
+              <w:jc w:val="center"/>
+            </w:pPr>
+            <w:r>
+              <w:t>Automated pytest test</w:t>
+            </w:r>
+          </w:p>
+        </w:tc>
+        <w:tc>
+          <w:tcPr>
+            <w:tcW w:w="0" w:type="auto"/>
+            <w:vAlign w:val="center"/>
+            <w:hideMark/>
+          </w:tcPr>
+          <w:p>
+            <w:pPr>
+              <w:spacing w:after="160" w:line="259" w:lineRule="auto"/>
+              <w:jc w:val="center"/>
+            </w:pPr>
+            <w:r>
+              <w:t>All driver nationalities exist within the predefined nationality list</w:t>
+            </w:r>
+          </w:p>
+        </w:tc>
+      </w:tr>
+      <w:tr>
+        <w:tc>
+          <w:tcPr>
+            <w:tcW w:w="0" w:type="auto"/>
+            <w:vAlign w:val="center"/>
+            <w:hideMark/>
+          </w:tcPr>
+          <w:p>
+            <w:pPr>
+              <w:spacing w:after="160" w:line="259" w:lineRule="auto"/>
+              <w:jc w:val="center"/>
+            </w:pPr>
+            <w:r>
+              <w:t>UT-04</w:t>
+            </w:r>
+          </w:p>
+        </w:tc>
+        <w:tc>
+          <w:tcPr>
+            <w:tcW w:w="0" w:type="auto"/>
+            <w:vAlign w:val="center"/>
+            <w:hideMark/>
+          </w:tcPr>
+          <w:p>
+            <w:pPr>
+              <w:spacing w:after="160" w:line="259" w:lineRule="auto"/>
+              <w:jc w:val="center"/>
+            </w:pPr>
+            <w:r>
+              <w:t>Verify generated racing archetypes are valid</w:t>
+            </w:r>
+          </w:p>
+        </w:tc>
+        <w:tc>
+          <w:tcPr>
+            <w:tcW w:w="0" w:type="auto"/>
+            <w:vAlign w:val="center"/>
+            <w:hideMark/>
+          </w:tcPr>
+          <w:p>
+            <w:pPr>
+              <w:spacing w:after="160" w:line="259" w:lineRule="auto"/>
+              <w:jc w:val="center"/>
+            </w:pPr>
+            <w:r>
+              <w:t>Driver generation</w:t>
+            </w:r>
+          </w:p>
+        </w:tc>
+        <w:tc>
+          <w:tcPr>
+            <w:tcW w:w="0" w:type="auto"/>
+            <w:vAlign w:val="center"/>
+            <w:hideMark/>
+          </w:tcPr>
+          <w:p>
+            <w:pPr>
+              <w:spacing w:after="160" w:line="259" w:lineRule="auto"/>
+              <w:jc w:val="center"/>
+            </w:pPr>
+            <w:r>
+              <w:t>Automated pytest test</w:t>
+            </w:r>
+          </w:p>
+        </w:tc>
+        <w:tc>
+          <w:tcPr>
+            <w:tcW w:w="0" w:type="auto"/>
+            <w:vAlign w:val="center"/>
+            <w:hideMark/>
+          </w:tcPr>
+          <w:p>
+            <w:pPr>
+              <w:spacing w:after="160" w:line="259" w:lineRule="auto"/>
+              <w:jc w:val="center"/>
+            </w:pPr>
+            <w:r>
+              <w:t>All driver archetypes exist within the predefined archetype list</w:t>
+            </w:r>
+          </w:p>
+        </w:tc>
+      </w:tr>
+      <w:tr>
+        <w:tc>
+          <w:tcPr>
+            <w:tcW w:w="0" w:type="auto"/>
+            <w:vAlign w:val="center"/>
+            <w:hideMark/>
+          </w:tcPr>
+          <w:p>
+            <w:pPr>
+              <w:spacing w:after="160" w:line="259" w:lineRule="auto"/>
+              <w:jc w:val="center"/>
+            </w:pPr>
+            <w:r>
+              <w:t>UT-05</w:t>
+            </w:r>
+          </w:p>
+        </w:tc>
+        <w:tc>
+          <w:tcPr>
+            <w:tcW w:w="0" w:type="auto"/>
+            <w:vAlign w:val="center"/>
+            <w:hideMark/>
+          </w:tcPr>
+          <w:p>
+            <w:pPr>
+              <w:spacing w:after="160" w:line="259" w:lineRule="auto"/>
+              <w:jc w:val="center"/>
+            </w:pPr>
+            <w:r>
+              <w:t>Verify driver age constraints</w:t>
+            </w:r>
+          </w:p>
+        </w:tc>
+        <w:tc>
+          <w:tcPr>
+            <w:tcW w:w="0" w:type="auto"/>
+            <w:vAlign w:val="center"/>
+            <w:hideMark/>
+          </w:tcPr>
+          <w:p>
+            <w:pPr>
+              <w:spacing w:after="160" w:line="259" w:lineRule="auto"/>
+              <w:jc w:val="center"/>
+            </w:pPr>
+            <w:r>
+              <w:t>Driver generation</w:t>
+            </w:r>
+          </w:p>
+        </w:tc>
+        <w:tc>
+          <w:tcPr>
+            <w:tcW w:w="0" w:type="auto"/>
+            <w:vAlign w:val="center"/>
+            <w:hideMark/>
+          </w:tcPr>
+          <w:p>
+            <w:pPr>
+              <w:spacing w:after="160" w:line="259" w:lineRule="auto"/>
+              <w:jc w:val="center"/>
+            </w:pPr>
+            <w:r>
+              <w:t>Automated pytest test</w:t>
+            </w:r>
+          </w:p>
+        </w:tc>
+        <w:tc>
+          <w:tcPr>
+            <w:tcW w:w="0" w:type="auto"/>
+            <w:vAlign w:val="center"/>
+            <w:hideMark/>
+          </w:tcPr>
+          <w:p>
+            <w:pPr>
+              <w:spacing w:after="160" w:line="259" w:lineRule="auto"/>
+              <w:jc w:val="center"/>
+            </w:pPr>
+            <w:r>
+              <w:t xml:space="preserve">All generated drivers </w:t>
+            </w:r>
+            <w:r>
+              <w:t>are</w:t>
+            </w:r>
+            <w:r>
+              <w:t xml:space="preserve"> an age between 16 and 50</w:t>
+            </w:r>
+          </w:p>
+        </w:tc>
+      </w:tr>
+      <w:tr>
+        <w:tc>
+          <w:tcPr>
+            <w:tcW w:w="0" w:type="auto"/>
+            <w:vAlign w:val="center"/>
+            <w:hideMark/>
+          </w:tcPr>
+          <w:p>
+            <w:pPr>
+              <w:spacing w:after="160" w:line="259" w:lineRule="auto"/>
+              <w:jc w:val="center"/>
+            </w:pPr>
+            <w:r>
+              <w:t>UT-06</w:t>
+            </w:r>
+          </w:p>
+        </w:tc>
+        <w:tc>
+          <w:tcPr>
+            <w:tcW w:w="0" w:type="auto"/>
+            <w:vAlign w:val="center"/>
+            <w:hideMark/>
+          </w:tcPr>
+          <w:p>
+            <w:pPr>
+              <w:spacing w:after="160" w:line="259" w:lineRule="auto"/>
+              <w:jc w:val="center"/>
+            </w:pPr>
+            <w:r>
+              <w:t>Verify driver speed attribute range</w:t>
+            </w:r>
+          </w:p>
+        </w:tc>
+        <w:tc>
+          <w:tcPr>
+            <w:tcW w:w="0" w:type="auto"/>
+            <w:vAlign w:val="center"/>
+            <w:hideMark/>
+          </w:tcPr>
+          <w:p>
+            <w:pPr>
+              <w:spacing w:after="160" w:line="259" w:lineRule="auto"/>
+              <w:jc w:val="center"/>
+            </w:pPr>
+            <w:r>
+              <w:t>Driver statistics</w:t>
+            </w:r>
+          </w:p>
+        </w:tc>
+        <w:tc>
+          <w:tcPr>
+            <w:tcW w:w="0" w:type="auto"/>
+            <w:vAlign w:val="center"/>
+            <w:hideMark/>
+          </w:tcPr>
+          <w:p>
+            <w:pPr>
+              <w:spacing w:after="160" w:line="259" w:lineRule="auto"/>
+              <w:jc w:val="center"/>
+            </w:pPr>
+            <w:r>
+              <w:t>Automated pytest test</w:t>
+            </w:r>
+          </w:p>
+        </w:tc>
+        <w:tc>
+          <w:tcPr>
+            <w:tcW w:w="0" w:type="auto"/>
+            <w:vAlign w:val="center"/>
+            <w:hideMark/>
+          </w:tcPr>
+          <w:p>
+            <w:pPr>
+              <w:spacing w:after="160" w:line="259" w:lineRule="auto"/>
+              <w:jc w:val="center"/>
+            </w:pPr>
+            <w:r>
+              <w:t>Speed values are between 0 and 100</w:t>
+            </w:r>
+          </w:p>
+        </w:tc>
+      </w:tr>
+      <w:tr>
+        <w:tc>
+          <w:tcPr>
+            <w:tcW w:w="0" w:type="auto"/>
+            <w:vAlign w:val="center"/>
+            <w:hideMark/>
+          </w:tcPr>
+          <w:p>
+            <w:pPr>
+              <w:spacing w:after="160" w:line="259" w:lineRule="auto"/>
+              <w:jc w:val="center"/>
+            </w:pPr>
+            <w:r>
+              <w:t>UT-07</w:t>
+            </w:r>
+          </w:p>
+        </w:tc>
+        <w:tc>
+          <w:tcPr>
+            <w:tcW w:w="0" w:type="auto"/>
+            <w:vAlign w:val="center"/>
+            <w:hideMark/>
+          </w:tcPr>
+          <w:p>
+            <w:pPr>
+              <w:spacing w:after="160" w:line="259" w:lineRule="auto"/>
+              <w:jc w:val="center"/>
+            </w:pPr>
+            <w:r>
+              <w:t>Verify driver handling attribute range</w:t>
+            </w:r>
+          </w:p>
+        </w:tc>
+        <w:tc>
+          <w:tcPr>
+            <w:tcW w:w="0" w:type="auto"/>
+            <w:vAlign w:val="center"/>
+            <w:hideMark/>
+          </w:tcPr>
+          <w:p>
+            <w:pPr>
+              <w:spacing w:after="160" w:line="259" w:lineRule="auto"/>
+              <w:jc w:val="center"/>
+            </w:pPr>
+            <w:r>
+              <w:t>Driver statistics</w:t>
+            </w:r>
+          </w:p>
+        </w:tc>
+        <w:tc>
+          <w:tcPr>
+            <w:tcW w:w="0" w:type="auto"/>
+            <w:vAlign w:val="center"/>
+            <w:hideMark/>
+          </w:tcPr>
+          <w:p>
+            <w:pPr>
+              <w:spacing w:after="160" w:line="259" w:lineRule="auto"/>
+              <w:jc w:val="center"/>
+            </w:pPr>
+            <w:r>
+              <w:t>Automated pytest test</w:t>
+            </w:r>
+          </w:p>
+        </w:tc>
+        <w:tc>
+          <w:tcPr>
+            <w:tcW w:w="0" w:type="auto"/>
+            <w:vAlign w:val="center"/>
+            <w:hideMark/>
+          </w:tcPr>
+          <w:p>
+            <w:pPr>
+              <w:spacing w:after="160" w:line="259" w:lineRule="auto"/>
+              <w:jc w:val="center"/>
+            </w:pPr>
+            <w:r>
+              <w:t>Handling values are between 0 and 100</w:t>
+            </w:r>
+          </w:p>
+        </w:tc>
+      </w:tr>
+      <w:tr>
+        <w:tc>
+          <w:tcPr>
+            <w:tcW w:w="0" w:type="auto"/>
+            <w:vAlign w:val="center"/>
+            <w:hideMark/>
+          </w:tcPr>
+          <w:p>
+            <w:pPr>
+              <w:spacing w:after="160" w:line="259" w:lineRule="auto"/>
+              <w:jc w:val="center"/>
+            </w:pPr>
+            <w:r>
+              <w:t>UT-08</w:t>
+            </w:r>
+          </w:p>
+        </w:tc>
+        <w:tc>
+          <w:tcPr>
+            <w:tcW w:w="0" w:type="auto"/>
+            <w:vAlign w:val="center"/>
+            <w:hideMark/>
+          </w:tcPr>
+          <w:p>
+            <w:pPr>
+              <w:spacing w:after="160" w:line="259" w:lineRule="auto"/>
+              <w:jc w:val="center"/>
+            </w:pPr>
+            <w:r>
+              <w:t>Verify driver aggression attribute range</w:t>
+            </w:r>
+          </w:p>
+        </w:tc>
+        <w:tc>
+          <w:tcPr>
+            <w:tcW w:w="0" w:type="auto"/>
+            <w:vAlign w:val="center"/>
+            <w:hideMark/>
+          </w:tcPr>
+          <w:p>
+            <w:pPr>
+              <w:spacing w:after="160" w:line="259" w:lineRule="auto"/>
+              <w:jc w:val="center"/>
+            </w:pPr>
+            <w:r>
+              <w:t>Driver statistics</w:t>
+            </w:r>
+          </w:p>
+        </w:tc>
+        <w:tc>
+          <w:tcPr>
+            <w:tcW w:w="0" w:type="auto"/>
+            <w:vAlign w:val="center"/>
+            <w:hideMark/>
+          </w:tcPr>
+          <w:p>
+            <w:pPr>
+              <w:spacing w:after="160" w:line="259" w:lineRule="auto"/>
+              <w:jc w:val="center"/>
+            </w:pPr>
+            <w:r>
+              <w:t>Automated pytest test</w:t>
+            </w:r>
+          </w:p>
+        </w:tc>
+        <w:tc>
+          <w:tcPr>
+            <w:tcW w:w="0" w:type="auto"/>
+            <w:vAlign w:val="center"/>
+            <w:hideMark/>
+          </w:tcPr>
+          <w:p>
+            <w:pPr>
+              <w:spacing w:after="160" w:line="259" w:lineRule="auto"/>
+              <w:jc w:val="center"/>
+            </w:pPr>
+            <w:r>
+              <w:t>Aggression values are between 0 and 100</w:t>
+            </w:r>
+          </w:p>
+        </w:tc>
+      </w:tr>
+      <w:tr>
+        <w:tc>
+          <w:tcPr>
+            <w:tcW w:w="0" w:type="auto"/>
+            <w:vAlign w:val="center"/>
+            <w:hideMark/>
+          </w:tcPr>
+          <w:p>
+            <w:pPr>
+              <w:spacing w:after="160" w:line="259" w:lineRule="auto"/>
+              <w:jc w:val="center"/>
+            </w:pPr>
+            <w:r>
+              <w:lastRenderedPageBreak/>
+              <w:t>UT-09</w:t>
+            </w:r>
+          </w:p>
+        </w:tc>
+        <w:tc>
+          <w:tcPr>
+            <w:tcW w:w="0" w:type="auto"/>
+            <w:vAlign w:val="center"/>
+            <w:hideMark/>
+          </w:tcPr>
+          <w:p>
+            <w:pPr>
+              <w:spacing w:after="160" w:line="259" w:lineRule="auto"/>
+              <w:jc w:val="center"/>
+            </w:pPr>
+            <w:r>
+              <w:t>Verify driver consistency attribute range</w:t>
+            </w:r>
+          </w:p>
+        </w:tc>
+        <w:tc>
+          <w:tcPr>
+            <w:tcW w:w="0" w:type="auto"/>
+            <w:vAlign w:val="center"/>
+            <w:hideMark/>
+          </w:tcPr>
+          <w:p>
+            <w:pPr>
+              <w:spacing w:after="160" w:line="259" w:lineRule="auto"/>
+              <w:jc w:val="center"/>
+            </w:pPr>
+            <w:r>
+              <w:t>Driver statistics</w:t>
+            </w:r>
+          </w:p>
+        </w:tc>
+        <w:tc>
+          <w:tcPr>
+            <w:tcW w:w="0" w:type="auto"/>
+            <w:vAlign w:val="center"/>
+            <w:hideMark/>
+          </w:tcPr>
+          <w:p>
+            <w:pPr>
+              <w:spacing w:after="160" w:line="259" w:lineRule="auto"/>
+              <w:jc w:val="center"/>
+            </w:pPr>
+            <w:r>
+              <w:t>Automated pytest test</w:t>
+            </w:r>
+          </w:p>
+        </w:tc>
+        <w:tc>
+          <w:tcPr>
+            <w:tcW w:w="0" w:type="auto"/>
+            <w:vAlign w:val="center"/>
+            <w:hideMark/>
+          </w:tcPr>
+          <w:p>
+            <w:pPr>
+              <w:spacing w:after="160" w:line="259" w:lineRule="auto"/>
+              <w:jc w:val="center"/>
+            </w:pPr>
+            <w:r>
+              <w:t>Consistency values are between 0 and 100</w:t>
+            </w:r>
+          </w:p>
+        </w:tc>
+      </w:tr>
+      <w:tr>
+        <w:tc>
+          <w:tcPr>
+            <w:tcW w:w="0" w:type="auto"/>
+            <w:vAlign w:val="center"/>
+            <w:hideMark/>
+          </w:tcPr>
+          <w:p>
+            <w:pPr>
+              <w:spacing w:after="160" w:line="259" w:lineRule="auto"/>
+              <w:jc w:val="center"/>
+            </w:pPr>
+            <w:r>
+              <w:t>UT-10</w:t>
+            </w:r>
+          </w:p>
+        </w:tc>
+        <w:tc>
+          <w:tcPr>
+            <w:tcW w:w="0" w:type="auto"/>
+            <w:vAlign w:val="center"/>
+            <w:hideMark/>
+          </w:tcPr>
+          <w:p>
+            <w:pPr>
+              <w:spacing w:after="160" w:line="259" w:lineRule="auto"/>
+              <w:jc w:val="center"/>
+            </w:pPr>
+            <w:r>
+              <w:t>Verify driver ID uniqueness</w:t>
+            </w:r>
+          </w:p>
+        </w:tc>
+        <w:tc>
+          <w:tcPr>
+            <w:tcW w:w="0" w:type="auto"/>
+            <w:vAlign w:val="center"/>
+            <w:hideMark/>
+          </w:tcPr>
+          <w:p>
+            <w:pPr>
+              <w:spacing w:after="160" w:line="259" w:lineRule="auto"/>
+              <w:jc w:val="center"/>
+            </w:pPr>
+            <w:r>
+              <w:t>Driver generation</w:t>
+            </w:r>
+          </w:p>
+        </w:tc>
+        <w:tc>
+          <w:tcPr>
+            <w:tcW w:w="0" w:type="auto"/>
+            <w:vAlign w:val="center"/>
+            <w:hideMark/>
+          </w:tcPr>
+          <w:p>
+            <w:pPr>
+              <w:spacing w:after="160" w:line="259" w:lineRule="auto"/>
+              <w:jc w:val="center"/>
+            </w:pPr>
+            <w:r>
+              <w:t>Automated pytest test</w:t>
+            </w:r>
+          </w:p>
+        </w:tc>
+        <w:tc>
+          <w:tcPr>
+            <w:tcW w:w="0" w:type="auto"/>
+            <w:vAlign w:val="center"/>
+            <w:hideMark/>
+          </w:tcPr>
+          <w:p>
+            <w:pPr>
+              <w:spacing w:after="160" w:line="259" w:lineRule="auto"/>
+              <w:jc w:val="center"/>
+            </w:pPr>
+            <w:r>
+              <w:t>No duplicate driver IDs are generated</w:t>
+            </w:r>
+          </w:p>
+        </w:tc>
+      </w:tr>
+      <w:tr>
+        <w:tc>
+          <w:tcPr>
+            <w:tcW w:w="0" w:type="auto"/>
+            <w:vAlign w:val="center"/>
+            <w:hideMark/>
+          </w:tcPr>
+          <w:p>
+            <w:pPr>
+              <w:spacing w:after="160" w:line="259" w:lineRule="auto"/>
+              <w:jc w:val="center"/>
+            </w:pPr>
+            <w:r>
+              <w:t>UT-11</w:t>
+            </w:r>
+          </w:p>
+        </w:tc>
+        <w:tc>
+          <w:tcPr>
+            <w:tcW w:w="0" w:type="auto"/>
+            <w:vAlign w:val="center"/>
+            <w:hideMark/>
+          </w:tcPr>
+          <w:p>
+            <w:pPr>
+              <w:spacing w:after="160" w:line="259" w:lineRule="auto"/>
+              <w:jc w:val="center"/>
+            </w:pPr>
+            <w:r>
+              <w:t>Verify driver name uniqueness</w:t>
+            </w:r>
+          </w:p>
+        </w:tc>
+        <w:tc>
+          <w:tcPr>
+            <w:tcW w:w="0" w:type="auto"/>
+            <w:vAlign w:val="center"/>
+            <w:hideMark/>
+          </w:tcPr>
+          <w:p>
+            <w:pPr>
+              <w:spacing w:after="160" w:line="259" w:lineRule="auto"/>
+              <w:jc w:val="center"/>
+            </w:pPr>
+            <w:r>
+              <w:t>Driver generation</w:t>
+            </w:r>
+          </w:p>
+        </w:tc>
+        <w:tc>
+          <w:tcPr>
+            <w:tcW w:w="0" w:type="auto"/>
+            <w:vAlign w:val="center"/>
+            <w:hideMark/>
+          </w:tcPr>
+          <w:p>
+            <w:pPr>
+              <w:spacing w:after="160" w:line="259" w:lineRule="auto"/>
+              <w:jc w:val="center"/>
+            </w:pPr>
+            <w:r>
+              <w:t>Automated pytest test</w:t>
+            </w:r>
+          </w:p>
+        </w:tc>
+        <w:tc>
+          <w:tcPr>
+            <w:tcW w:w="0" w:type="auto"/>
+            <w:vAlign w:val="center"/>
+            <w:hideMark/>
+          </w:tcPr>
+          <w:p>
+            <w:pPr>
+              <w:spacing w:after="160" w:line="259" w:lineRule="auto"/>
+              <w:jc w:val="center"/>
+            </w:pPr>
+            <w:r>
+              <w:t>No duplicate driver names are generated</w:t>
+            </w:r>
+          </w:p>
+        </w:tc>
+      </w:tr>
+    </w:tbl>
+    <w:p>
+      <w:pPr>
+        <w:pStyle w:val="Heading4"/>
+      </w:pPr>
+      <w:r>
+        <w:t>Results</w:t>
+      </w:r>
+    </w:p>
+    <w:p>
+      <w:r>
+        <w:rPr>
+          <w:noProof/>
+        </w:rPr>
+        <w:drawing>
+          <wp:inline distT="0" distB="0" distL="0" distR="0" wp14:anchorId="07B1DBCB" wp14:editId="4D49AFF2">
+            <wp:extent cx="5257143" cy="2580952"/>
+            <wp:effectExtent l="0" t="0" r="1270" b="0"/>
+            <wp:docPr id="501502439" name="Picture 1"/>
+            <wp:cNvGraphicFramePr>
+              <a:graphicFrameLocks xmlns:a="http://schemas.openxmlformats.org/drawingml/2006/main" noChangeAspect="1"/>
+            </wp:cNvGraphicFramePr>
+            <a:graphic xmlns:a="http://schemas.openxmlformats.org/drawingml/2006/main">
+              <a:graphicData uri="http://schemas.openxmlformats.org/drawingml/2006/picture">
+                <pic:pic xmlns:pic="http://schemas.openxmlformats.org/drawingml/2006/picture">
+                  <pic:nvPicPr>
+                    <pic:cNvPr id="501502439" name=""/>
+                    <pic:cNvPicPr/>
+                  </pic:nvPicPr>
+                  <pic:blipFill>
+                    <a:blip r:embed="rId40"/>
+                    <a:stretch>
+                      <a:fillRect/>
+                    </a:stretch>
+                  </pic:blipFill>
+                  <pic:spPr>
+                    <a:xfrm>
+                      <a:off x="0" y="0"/>
+                      <a:ext cx="5257143" cy="2580952"/>
+                    </a:xfrm>
+                    <a:prstGeom prst="rect">
+                      <a:avLst/>
+                    </a:prstGeom>
+                  </pic:spPr>
+                </pic:pic>
+              </a:graphicData>
+            </a:graphic>
+          </wp:inline>
+        </w:drawing>
+      </w:r>
+    </w:p>
+    <w:p>
+      <w:pPr>
+        <w:pStyle w:val="Heading3"/>
+      </w:pPr>
+      <w:r>
+        <w:t>System</w:t>
+      </w:r>
+    </w:p>
+    <w:p>
+      <w:pPr>
+        <w:pStyle w:val="Heading3"/>
+      </w:pPr>
+      <w:r>
+        <w:t>Integration</w:t>
       </w:r>
     </w:p>
     <w:p>
@@ -13129,7 +14760,7 @@
           <w:noProof/>
         </w:rPr>
         <w:drawing>
-          <wp:inline distT="0" distB="0" distL="0" distR="0" wp14:anchorId="15905F45" wp14:editId="4C508048">
+          <wp:inline distT="0" distB="0" distL="0" distR="0" wp14:anchorId="15905F45" wp14:editId="4CB2F944">
             <wp:extent cx="1724025" cy="1228725"/>
             <wp:effectExtent l="0" t="0" r="0" b="0"/>
             <wp:docPr id="1287158093" name="Picture 4" descr="A blue and white logo&#10;&#10;AI-generated content may be incorrect."/>
@@ -13146,7 +14777,7 @@
                     </pic:cNvPicPr>
                   </pic:nvPicPr>
                   <pic:blipFill>
-                    <a:blip r:embed="rId40" cstate="print">
+                    <a:blip r:embed="rId41" cstate="print">
                       <a:extLst>
                         <a:ext uri="{28A0092B-C50C-407E-A947-70E740481C1C}">
                           <a14:useLocalDpi xmlns:a14="http://schemas.microsoft.com/office/drawing/2010/main" val="0"/>
@@ -13476,15 +15107,7 @@
     </w:p>
     <w:p>
       <w:r>
-        <w:t xml:space="preserve">Momentum uses Python for both the front-end dashboards and the back-end simulation logic and database management. The system relies on NumPy for fast calculations, Pandas for handling data, and SciPy for advanced statistics. The database uses SQLite to store all the information about drivers, teams, tracks, and championships, making it easy to save and load multi-season histories. All content creation and generation </w:t>
-      </w:r>
-      <w:proofErr w:type="gramStart"/>
-      <w:r>
-        <w:t>is</w:t>
-      </w:r>
-      <w:proofErr w:type="gramEnd"/>
-      <w:r>
-        <w:t xml:space="preserve"> handled by the database management system.</w:t>
+        <w:t>Momentum uses Python for both the front-end dashboards and the back-end simulation logic and database management. The system relies on NumPy for fast calculations, Pandas for handling data, and SciPy for advanced statistics. The database uses SQLite to store all the information about drivers, teams, tracks, and championships, making it easy to save and load multi-season histories. All content creation and generation is handled by the database management system.</w:t>
       </w:r>
     </w:p>
     <w:p>
@@ -13501,23 +15124,7 @@
     </w:p>
     <w:p>
       <w:r>
-        <w:t xml:space="preserve">Race results are produced by a real-time, </w:t>
-      </w:r>
-      <w:proofErr w:type="gramStart"/>
-      <w:r>
-        <w:t>agent based</w:t>
-      </w:r>
-      <w:proofErr w:type="gramEnd"/>
-      <w:r>
-        <w:t xml:space="preserve"> engine. Each driver is modelled as an autonomous AI agent that makes decisions on every simulation tick, targeting a frame rate of about 30 ticks per second. Agents consider their attributes, car condition, tyre state, fuel, nearby rivals, team orders and track conditions when choosing actions such as attack, defend, overtake or conserve. Discipline specific rules are applied by the engine to reflect differences between single seater, rally, endurance and other formats. Randomness is retained for low probability events such as mechanical failures or </w:t>
-      </w:r>
-      <w:proofErr w:type="gramStart"/>
-      <w:r>
-        <w:t>incidents</w:t>
-      </w:r>
-      <w:proofErr w:type="gramEnd"/>
-      <w:r>
-        <w:t xml:space="preserve"> so outcomes remain unpredictable, but most race behaviour emerges from agent interactions rather than repeated sampling. Performance sensitive results are cached where appropriate to keep leaderboards and UI queries responsive.</w:t>
+        <w:t>Race results are produced by a real-time, agent based engine. Each driver is modelled as an autonomous AI agent that makes decisions on every simulation tick, targeting a frame rate of about 30 ticks per second. Agents consider their attributes, car condition, tyre state, fuel, nearby rivals, team orders and track conditions when choosing actions such as attack, defend, overtake or conserve. Discipline specific rules are applied by the engine to reflect differences between single seater, rally, endurance and other formats. Randomness is retained for low probability events such as mechanical failures or incidents so outcomes remain unpredictable, but most race behaviour emerges from agent interactions rather than repeated sampling. Performance sensitive results are cached where appropriate to keep leaderboards and UI queries responsive.</w:t>
       </w:r>
     </w:p>
     <w:p>
@@ -13907,7 +15514,7 @@
           <w:noProof/>
         </w:rPr>
         <w:drawing>
-          <wp:inline distT="0" distB="0" distL="0" distR="0" wp14:anchorId="4440363F" wp14:editId="0126E5F4">
+          <wp:inline distT="0" distB="0" distL="0" distR="0" wp14:anchorId="4440363F" wp14:editId="1F4C49AB">
             <wp:extent cx="5486400" cy="3838575"/>
             <wp:effectExtent l="0" t="0" r="0" b="9525"/>
             <wp:docPr id="383730404" name="Picture 3" descr="A screenshot of a computer program&#10;&#10;AI-generated content may be incorrect."/>
@@ -13924,7 +15531,7 @@
                     </pic:cNvPicPr>
                   </pic:nvPicPr>
                   <pic:blipFill>
-                    <a:blip r:embed="rId41" cstate="print">
+                    <a:blip r:embed="rId42" cstate="print">
                       <a:extLst>
                         <a:ext uri="{28A0092B-C50C-407E-A947-70E740481C1C}">
                           <a14:useLocalDpi xmlns:a14="http://schemas.microsoft.com/office/drawing/2010/main" val="0"/>
@@ -14759,15 +16366,7 @@
               <w:jc w:val="both"/>
             </w:pPr>
             <w:r>
-              <w:t xml:space="preserve">I started building a Python prototype for my game. I began work on </w:t>
-            </w:r>
-            <w:proofErr w:type="gramStart"/>
-            <w:r>
-              <w:t>the team</w:t>
-            </w:r>
-            <w:proofErr w:type="gramEnd"/>
-            <w:r>
-              <w:t xml:space="preserve"> management, car development, financial management, and the race weekend structure and connected them through a basic Python GUI. The current version is only a prototype. None of the systems are fully finished, and the race simulation is not yet implemented. The main goal was to test ideas and system integration before moving to a more advanced platform.</w:t>
+              <w:t>I started building a Python prototype for my game. I began work on the team management, car development, financial management, and the race weekend structure and connected them through a basic Python GUI. The current version is only a prototype. None of the systems are fully finished, and the race simulation is not yet implemented. The main goal was to test ideas and system integration before moving to a more advanced platform.</w:t>
             </w:r>
           </w:p>
         </w:tc>
@@ -15209,15 +16808,7 @@
               <w:jc w:val="both"/>
             </w:pPr>
             <w:r>
-              <w:t xml:space="preserve">Reflect on what </w:t>
-            </w:r>
-            <w:proofErr w:type="gramStart"/>
-            <w:r>
-              <w:t>has happened</w:t>
-            </w:r>
-            <w:proofErr w:type="gramEnd"/>
-            <w:r>
-              <w:t xml:space="preserve"> in your project this month?</w:t>
+              <w:t>Reflect on what has happened in your project this month?</w:t>
             </w:r>
           </w:p>
           <w:p>
@@ -15240,13 +16831,8 @@
             <w:pPr>
               <w:jc w:val="both"/>
             </w:pPr>
-            <w:proofErr w:type="gramStart"/>
-            <w:r>
-              <w:t>mostly</w:t>
-            </w:r>
-            <w:proofErr w:type="gramEnd"/>
-            <w:r>
-              <w:t xml:space="preserve"> planning stuff</w:t>
+            <w:r>
+              <w:t>mostly planning stuff</w:t>
             </w:r>
           </w:p>
         </w:tc>
@@ -15283,29 +16869,16 @@
               <w:jc w:val="both"/>
             </w:pPr>
             <w:r>
-              <w:t xml:space="preserve">Consider what that meant for your project progress.  What were your successes? What challenges </w:t>
-            </w:r>
-            <w:proofErr w:type="gramStart"/>
-            <w:r>
-              <w:t>still remain</w:t>
-            </w:r>
-            <w:proofErr w:type="gramEnd"/>
-            <w:r>
-              <w:t xml:space="preserve">? </w:t>
+              <w:t xml:space="preserve">Consider what that meant for your project progress.  What were your successes? What challenges still remain? </w:t>
             </w:r>
           </w:p>
           <w:p>
             <w:pPr>
               <w:jc w:val="both"/>
             </w:pPr>
-            <w:proofErr w:type="gramStart"/>
             <w:r>
               <w:lastRenderedPageBreak/>
-              <w:t>Certainly</w:t>
-            </w:r>
-            <w:proofErr w:type="gramEnd"/>
-            <w:r>
-              <w:t xml:space="preserve"> helped give a direction with use cases and priorities, </w:t>
+              <w:t xml:space="preserve">Certainly helped give a direction with use cases and priorities, </w:t>
             </w:r>
             <w:proofErr w:type="spellStart"/>
             <w:r>
@@ -15698,15 +17271,7 @@
               <w:jc w:val="both"/>
             </w:pPr>
             <w:r>
-              <w:t xml:space="preserve">Reflect on what </w:t>
-            </w:r>
-            <w:proofErr w:type="gramStart"/>
-            <w:r>
-              <w:t>has happened</w:t>
-            </w:r>
-            <w:proofErr w:type="gramEnd"/>
-            <w:r>
-              <w:t xml:space="preserve"> in your project this month?</w:t>
+              <w:t>Reflect on what has happened in your project this month?</w:t>
             </w:r>
           </w:p>
           <w:p>
@@ -15758,15 +17323,7 @@
               <w:jc w:val="both"/>
             </w:pPr>
             <w:r>
-              <w:t xml:space="preserve">Consider what that meant for your project progress.  What were your successes? What challenges </w:t>
-            </w:r>
-            <w:proofErr w:type="gramStart"/>
-            <w:r>
-              <w:t>still remain</w:t>
-            </w:r>
-            <w:proofErr w:type="gramEnd"/>
-            <w:r>
-              <w:t xml:space="preserve">? </w:t>
+              <w:t xml:space="preserve">Consider what that meant for your project progress.  What were your successes? What challenges still remain? </w:t>
             </w:r>
           </w:p>
           <w:p>
@@ -15776,15 +17333,7 @@
           </w:p>
           <w:p>
             <w:r>
-              <w:t xml:space="preserve">This change gives </w:t>
-            </w:r>
-            <w:proofErr w:type="gramStart"/>
-            <w:r>
-              <w:t>visible,</w:t>
-            </w:r>
-            <w:proofErr w:type="gramEnd"/>
-            <w:r>
-              <w:t xml:space="preserve"> </w:t>
+              <w:t xml:space="preserve">This change gives visible, </w:t>
             </w:r>
             <w:proofErr w:type="spellStart"/>
             <w:r>
@@ -15928,12 +17477,12 @@
       </w:r>
     </w:p>
     <w:sectPr>
-      <w:headerReference w:type="even" r:id="rId42"/>
-      <w:headerReference w:type="default" r:id="rId43"/>
-      <w:footerReference w:type="even" r:id="rId44"/>
-      <w:footerReference w:type="default" r:id="rId45"/>
-      <w:headerReference w:type="first" r:id="rId46"/>
-      <w:footerReference w:type="first" r:id="rId47"/>
+      <w:headerReference w:type="even" r:id="rId43"/>
+      <w:headerReference w:type="default" r:id="rId44"/>
+      <w:footerReference w:type="even" r:id="rId45"/>
+      <w:footerReference w:type="default" r:id="rId46"/>
+      <w:headerReference w:type="first" r:id="rId47"/>
+      <w:footerReference w:type="first" r:id="rId48"/>
       <w:pgSz w:w="11906" w:h="16838" w:code="9"/>
       <w:pgMar w:top="1440" w:right="1440" w:bottom="1440" w:left="1440" w:header="709" w:footer="709" w:gutter="0"/>
       <w:pgNumType w:start="0"/>
@@ -17374,6 +18923,155 @@
     </w:lvl>
   </w:abstractNum>
   <w:abstractNum w:abstractNumId="14" w15:restartNumberingAfterBreak="0">
+    <w:nsid w:val="32DB29B8"/>
+    <w:multiLevelType w:val="multilevel"/>
+    <w:tmpl w:val="707823F6"/>
+    <w:lvl w:ilvl="0">
+      <w:start w:val="1"/>
+      <w:numFmt w:val="bullet"/>
+      <w:lvlText w:val=""/>
+      <w:lvlJc w:val="left"/>
+      <w:pPr>
+        <w:tabs>
+          <w:tab w:val="num" w:pos="720"/>
+        </w:tabs>
+        <w:ind w:left="720" w:hanging="360"/>
+      </w:pPr>
+      <w:rPr>
+        <w:rFonts w:ascii="Symbol" w:hAnsi="Symbol" w:hint="default"/>
+        <w:sz w:val="20"/>
+      </w:rPr>
+    </w:lvl>
+    <w:lvl w:ilvl="1" w:tentative="1">
+      <w:start w:val="1"/>
+      <w:numFmt w:val="bullet"/>
+      <w:lvlText w:val="o"/>
+      <w:lvlJc w:val="left"/>
+      <w:pPr>
+        <w:tabs>
+          <w:tab w:val="num" w:pos="1440"/>
+        </w:tabs>
+        <w:ind w:left="1440" w:hanging="360"/>
+      </w:pPr>
+      <w:rPr>
+        <w:rFonts w:ascii="Courier New" w:hAnsi="Courier New" w:hint="default"/>
+        <w:sz w:val="20"/>
+      </w:rPr>
+    </w:lvl>
+    <w:lvl w:ilvl="2" w:tentative="1">
+      <w:start w:val="1"/>
+      <w:numFmt w:val="bullet"/>
+      <w:lvlText w:val=""/>
+      <w:lvlJc w:val="left"/>
+      <w:pPr>
+        <w:tabs>
+          <w:tab w:val="num" w:pos="2160"/>
+        </w:tabs>
+        <w:ind w:left="2160" w:hanging="360"/>
+      </w:pPr>
+      <w:rPr>
+        <w:rFonts w:ascii="Wingdings" w:hAnsi="Wingdings" w:hint="default"/>
+        <w:sz w:val="20"/>
+      </w:rPr>
+    </w:lvl>
+    <w:lvl w:ilvl="3" w:tentative="1">
+      <w:start w:val="1"/>
+      <w:numFmt w:val="bullet"/>
+      <w:lvlText w:val=""/>
+      <w:lvlJc w:val="left"/>
+      <w:pPr>
+        <w:tabs>
+          <w:tab w:val="num" w:pos="2880"/>
+        </w:tabs>
+        <w:ind w:left="2880" w:hanging="360"/>
+      </w:pPr>
+      <w:rPr>
+        <w:rFonts w:ascii="Wingdings" w:hAnsi="Wingdings" w:hint="default"/>
+        <w:sz w:val="20"/>
+      </w:rPr>
+    </w:lvl>
+    <w:lvl w:ilvl="4" w:tentative="1">
+      <w:start w:val="1"/>
+      <w:numFmt w:val="bullet"/>
+      <w:lvlText w:val=""/>
+      <w:lvlJc w:val="left"/>
+      <w:pPr>
+        <w:tabs>
+          <w:tab w:val="num" w:pos="3600"/>
+        </w:tabs>
+        <w:ind w:left="3600" w:hanging="360"/>
+      </w:pPr>
+      <w:rPr>
+        <w:rFonts w:ascii="Wingdings" w:hAnsi="Wingdings" w:hint="default"/>
+        <w:sz w:val="20"/>
+      </w:rPr>
+    </w:lvl>
+    <w:lvl w:ilvl="5" w:tentative="1">
+      <w:start w:val="1"/>
+      <w:numFmt w:val="bullet"/>
+      <w:lvlText w:val=""/>
+      <w:lvlJc w:val="left"/>
+      <w:pPr>
+        <w:tabs>
+          <w:tab w:val="num" w:pos="4320"/>
+        </w:tabs>
+        <w:ind w:left="4320" w:hanging="360"/>
+      </w:pPr>
+      <w:rPr>
+        <w:rFonts w:ascii="Wingdings" w:hAnsi="Wingdings" w:hint="default"/>
+        <w:sz w:val="20"/>
+      </w:rPr>
+    </w:lvl>
+    <w:lvl w:ilvl="6" w:tentative="1">
+      <w:start w:val="1"/>
+      <w:numFmt w:val="bullet"/>
+      <w:lvlText w:val=""/>
+      <w:lvlJc w:val="left"/>
+      <w:pPr>
+        <w:tabs>
+          <w:tab w:val="num" w:pos="5040"/>
+        </w:tabs>
+        <w:ind w:left="5040" w:hanging="360"/>
+      </w:pPr>
+      <w:rPr>
+        <w:rFonts w:ascii="Wingdings" w:hAnsi="Wingdings" w:hint="default"/>
+        <w:sz w:val="20"/>
+      </w:rPr>
+    </w:lvl>
+    <w:lvl w:ilvl="7" w:tentative="1">
+      <w:start w:val="1"/>
+      <w:numFmt w:val="bullet"/>
+      <w:lvlText w:val=""/>
+      <w:lvlJc w:val="left"/>
+      <w:pPr>
+        <w:tabs>
+          <w:tab w:val="num" w:pos="5760"/>
+        </w:tabs>
+        <w:ind w:left="5760" w:hanging="360"/>
+      </w:pPr>
+      <w:rPr>
+        <w:rFonts w:ascii="Wingdings" w:hAnsi="Wingdings" w:hint="default"/>
+        <w:sz w:val="20"/>
+      </w:rPr>
+    </w:lvl>
+    <w:lvl w:ilvl="8" w:tentative="1">
+      <w:start w:val="1"/>
+      <w:numFmt w:val="bullet"/>
+      <w:lvlText w:val=""/>
+      <w:lvlJc w:val="left"/>
+      <w:pPr>
+        <w:tabs>
+          <w:tab w:val="num" w:pos="6480"/>
+        </w:tabs>
+        <w:ind w:left="6480" w:hanging="360"/>
+      </w:pPr>
+      <w:rPr>
+        <w:rFonts w:ascii="Wingdings" w:hAnsi="Wingdings" w:hint="default"/>
+        <w:sz w:val="20"/>
+      </w:rPr>
+    </w:lvl>
+  </w:abstractNum>
+  <w:abstractNum w:abstractNumId="15" w15:restartNumberingAfterBreak="0">
     <w:nsid w:val="3416640C"/>
     <w:multiLevelType w:val="hybridMultilevel"/>
     <w:tmpl w:val="EC7AC9E0"/>
@@ -17459,7 +19157,7 @@
       </w:pPr>
     </w:lvl>
   </w:abstractNum>
-  <w:abstractNum w:abstractNumId="15" w15:restartNumberingAfterBreak="0">
+  <w:abstractNum w:abstractNumId="16" w15:restartNumberingAfterBreak="0">
     <w:nsid w:val="3CE26087"/>
     <w:multiLevelType w:val="hybridMultilevel"/>
     <w:tmpl w:val="E0F6ED1C"/>
@@ -17545,7 +19243,7 @@
       </w:pPr>
     </w:lvl>
   </w:abstractNum>
-  <w:abstractNum w:abstractNumId="16" w15:restartNumberingAfterBreak="0">
+  <w:abstractNum w:abstractNumId="17" w15:restartNumberingAfterBreak="0">
     <w:nsid w:val="48B460ED"/>
     <w:multiLevelType w:val="multilevel"/>
     <w:tmpl w:val="7C2AF9A8"/>
@@ -17678,7 +19376,7 @@
       </w:pPr>
     </w:lvl>
   </w:abstractNum>
-  <w:abstractNum w:abstractNumId="17" w15:restartNumberingAfterBreak="0">
+  <w:abstractNum w:abstractNumId="18" w15:restartNumberingAfterBreak="0">
     <w:nsid w:val="49224F5E"/>
     <w:multiLevelType w:val="hybridMultilevel"/>
     <w:tmpl w:val="3EF25212"/>
@@ -17795,7 +19493,156 @@
       </w:pPr>
     </w:lvl>
   </w:abstractNum>
-  <w:abstractNum w:abstractNumId="18" w15:restartNumberingAfterBreak="0">
+  <w:abstractNum w:abstractNumId="19" w15:restartNumberingAfterBreak="0">
+    <w:nsid w:val="4A2779C4"/>
+    <w:multiLevelType w:val="multilevel"/>
+    <w:tmpl w:val="5518E24A"/>
+    <w:lvl w:ilvl="0">
+      <w:start w:val="1"/>
+      <w:numFmt w:val="bullet"/>
+      <w:lvlText w:val=""/>
+      <w:lvlJc w:val="left"/>
+      <w:pPr>
+        <w:tabs>
+          <w:tab w:val="num" w:pos="720"/>
+        </w:tabs>
+        <w:ind w:left="720" w:hanging="360"/>
+      </w:pPr>
+      <w:rPr>
+        <w:rFonts w:ascii="Symbol" w:hAnsi="Symbol" w:hint="default"/>
+        <w:sz w:val="20"/>
+      </w:rPr>
+    </w:lvl>
+    <w:lvl w:ilvl="1">
+      <w:start w:val="1"/>
+      <w:numFmt w:val="bullet"/>
+      <w:lvlText w:val="o"/>
+      <w:lvlJc w:val="left"/>
+      <w:pPr>
+        <w:tabs>
+          <w:tab w:val="num" w:pos="1440"/>
+        </w:tabs>
+        <w:ind w:left="1440" w:hanging="360"/>
+      </w:pPr>
+      <w:rPr>
+        <w:rFonts w:ascii="Courier New" w:hAnsi="Courier New" w:hint="default"/>
+        <w:sz w:val="20"/>
+      </w:rPr>
+    </w:lvl>
+    <w:lvl w:ilvl="2" w:tentative="1">
+      <w:start w:val="1"/>
+      <w:numFmt w:val="bullet"/>
+      <w:lvlText w:val=""/>
+      <w:lvlJc w:val="left"/>
+      <w:pPr>
+        <w:tabs>
+          <w:tab w:val="num" w:pos="2160"/>
+        </w:tabs>
+        <w:ind w:left="2160" w:hanging="360"/>
+      </w:pPr>
+      <w:rPr>
+        <w:rFonts w:ascii="Wingdings" w:hAnsi="Wingdings" w:hint="default"/>
+        <w:sz w:val="20"/>
+      </w:rPr>
+    </w:lvl>
+    <w:lvl w:ilvl="3" w:tentative="1">
+      <w:start w:val="1"/>
+      <w:numFmt w:val="bullet"/>
+      <w:lvlText w:val=""/>
+      <w:lvlJc w:val="left"/>
+      <w:pPr>
+        <w:tabs>
+          <w:tab w:val="num" w:pos="2880"/>
+        </w:tabs>
+        <w:ind w:left="2880" w:hanging="360"/>
+      </w:pPr>
+      <w:rPr>
+        <w:rFonts w:ascii="Wingdings" w:hAnsi="Wingdings" w:hint="default"/>
+        <w:sz w:val="20"/>
+      </w:rPr>
+    </w:lvl>
+    <w:lvl w:ilvl="4" w:tentative="1">
+      <w:start w:val="1"/>
+      <w:numFmt w:val="bullet"/>
+      <w:lvlText w:val=""/>
+      <w:lvlJc w:val="left"/>
+      <w:pPr>
+        <w:tabs>
+          <w:tab w:val="num" w:pos="3600"/>
+        </w:tabs>
+        <w:ind w:left="3600" w:hanging="360"/>
+      </w:pPr>
+      <w:rPr>
+        <w:rFonts w:ascii="Wingdings" w:hAnsi="Wingdings" w:hint="default"/>
+        <w:sz w:val="20"/>
+      </w:rPr>
+    </w:lvl>
+    <w:lvl w:ilvl="5" w:tentative="1">
+      <w:start w:val="1"/>
+      <w:numFmt w:val="bullet"/>
+      <w:lvlText w:val=""/>
+      <w:lvlJc w:val="left"/>
+      <w:pPr>
+        <w:tabs>
+          <w:tab w:val="num" w:pos="4320"/>
+        </w:tabs>
+        <w:ind w:left="4320" w:hanging="360"/>
+      </w:pPr>
+      <w:rPr>
+        <w:rFonts w:ascii="Wingdings" w:hAnsi="Wingdings" w:hint="default"/>
+        <w:sz w:val="20"/>
+      </w:rPr>
+    </w:lvl>
+    <w:lvl w:ilvl="6" w:tentative="1">
+      <w:start w:val="1"/>
+      <w:numFmt w:val="bullet"/>
+      <w:lvlText w:val=""/>
+      <w:lvlJc w:val="left"/>
+      <w:pPr>
+        <w:tabs>
+          <w:tab w:val="num" w:pos="5040"/>
+        </w:tabs>
+        <w:ind w:left="5040" w:hanging="360"/>
+      </w:pPr>
+      <w:rPr>
+        <w:rFonts w:ascii="Wingdings" w:hAnsi="Wingdings" w:hint="default"/>
+        <w:sz w:val="20"/>
+      </w:rPr>
+    </w:lvl>
+    <w:lvl w:ilvl="7" w:tentative="1">
+      <w:start w:val="1"/>
+      <w:numFmt w:val="bullet"/>
+      <w:lvlText w:val=""/>
+      <w:lvlJc w:val="left"/>
+      <w:pPr>
+        <w:tabs>
+          <w:tab w:val="num" w:pos="5760"/>
+        </w:tabs>
+        <w:ind w:left="5760" w:hanging="360"/>
+      </w:pPr>
+      <w:rPr>
+        <w:rFonts w:ascii="Wingdings" w:hAnsi="Wingdings" w:hint="default"/>
+        <w:sz w:val="20"/>
+      </w:rPr>
+    </w:lvl>
+    <w:lvl w:ilvl="8" w:tentative="1">
+      <w:start w:val="1"/>
+      <w:numFmt w:val="bullet"/>
+      <w:lvlText w:val=""/>
+      <w:lvlJc w:val="left"/>
+      <w:pPr>
+        <w:tabs>
+          <w:tab w:val="num" w:pos="6480"/>
+        </w:tabs>
+        <w:ind w:left="6480" w:hanging="360"/>
+      </w:pPr>
+      <w:rPr>
+        <w:rFonts w:ascii="Wingdings" w:hAnsi="Wingdings" w:hint="default"/>
+        <w:sz w:val="20"/>
+      </w:rPr>
+    </w:lvl>
+  </w:abstractNum>
+  <w:abstractNum w:abstractNumId="20" w15:restartNumberingAfterBreak="0">
     <w:nsid w:val="4D6E4153"/>
     <w:multiLevelType w:val="hybridMultilevel"/>
     <w:tmpl w:val="BDACEDB0"/>
@@ -17881,7 +19728,7 @@
       </w:pPr>
     </w:lvl>
   </w:abstractNum>
-  <w:abstractNum w:abstractNumId="19" w15:restartNumberingAfterBreak="0">
+  <w:abstractNum w:abstractNumId="21" w15:restartNumberingAfterBreak="0">
     <w:nsid w:val="4F692764"/>
     <w:multiLevelType w:val="multilevel"/>
     <w:tmpl w:val="C930DE6A"/>
@@ -18014,7 +19861,7 @@
       </w:pPr>
     </w:lvl>
   </w:abstractNum>
-  <w:abstractNum w:abstractNumId="20" w15:restartNumberingAfterBreak="0">
+  <w:abstractNum w:abstractNumId="22" w15:restartNumberingAfterBreak="0">
     <w:nsid w:val="5470089E"/>
     <w:multiLevelType w:val="multilevel"/>
     <w:tmpl w:val="8EE46A0C"/>
@@ -18163,7 +20010,7 @@
       </w:rPr>
     </w:lvl>
   </w:abstractNum>
-  <w:abstractNum w:abstractNumId="21" w15:restartNumberingAfterBreak="0">
+  <w:abstractNum w:abstractNumId="23" w15:restartNumberingAfterBreak="0">
     <w:nsid w:val="63AA42EC"/>
     <w:multiLevelType w:val="hybridMultilevel"/>
     <w:tmpl w:val="7802567C"/>
@@ -18276,7 +20123,7 @@
       </w:rPr>
     </w:lvl>
   </w:abstractNum>
-  <w:abstractNum w:abstractNumId="22" w15:restartNumberingAfterBreak="0">
+  <w:abstractNum w:abstractNumId="24" w15:restartNumberingAfterBreak="0">
     <w:nsid w:val="66C279BB"/>
     <w:multiLevelType w:val="hybridMultilevel"/>
     <w:tmpl w:val="B234F54E"/>
@@ -18362,7 +20209,7 @@
       </w:pPr>
     </w:lvl>
   </w:abstractNum>
-  <w:abstractNum w:abstractNumId="23" w15:restartNumberingAfterBreak="0">
+  <w:abstractNum w:abstractNumId="25" w15:restartNumberingAfterBreak="0">
     <w:nsid w:val="68A009D5"/>
     <w:multiLevelType w:val="hybridMultilevel"/>
     <w:tmpl w:val="84D20734"/>
@@ -18451,7 +20298,7 @@
       </w:pPr>
     </w:lvl>
   </w:abstractNum>
-  <w:abstractNum w:abstractNumId="24" w15:restartNumberingAfterBreak="0">
+  <w:abstractNum w:abstractNumId="26" w15:restartNumberingAfterBreak="0">
     <w:nsid w:val="6C925FD8"/>
     <w:multiLevelType w:val="hybridMultilevel"/>
     <w:tmpl w:val="3DD6CFB2"/>
@@ -18537,7 +20384,7 @@
       </w:pPr>
     </w:lvl>
   </w:abstractNum>
-  <w:abstractNum w:abstractNumId="25" w15:restartNumberingAfterBreak="0">
+  <w:abstractNum w:abstractNumId="27" w15:restartNumberingAfterBreak="0">
     <w:nsid w:val="7BDA386A"/>
     <w:multiLevelType w:val="hybridMultilevel"/>
     <w:tmpl w:val="C7A4887E"/>
@@ -18651,7 +20498,7 @@
     </w:lvl>
   </w:abstractNum>
   <w:num w:numId="1" w16cid:durableId="1979412930">
-    <w:abstractNumId w:val="17"/>
+    <w:abstractNumId w:val="18"/>
   </w:num>
   <w:num w:numId="2" w16cid:durableId="634263790">
     <w:abstractNumId w:val="6"/>
@@ -18660,10 +20507,10 @@
     <w:abstractNumId w:val="13"/>
   </w:num>
   <w:num w:numId="4" w16cid:durableId="1315724028">
-    <w:abstractNumId w:val="15"/>
+    <w:abstractNumId w:val="16"/>
   </w:num>
   <w:num w:numId="5" w16cid:durableId="1319530745">
-    <w:abstractNumId w:val="18"/>
+    <w:abstractNumId w:val="20"/>
   </w:num>
   <w:num w:numId="6" w16cid:durableId="174268885">
     <w:abstractNumId w:val="4"/>
@@ -18693,7 +20540,7 @@
     <w:abstractNumId w:val="5"/>
   </w:num>
   <w:num w:numId="15" w16cid:durableId="15618285">
-    <w:abstractNumId w:val="25"/>
+    <w:abstractNumId w:val="27"/>
   </w:num>
   <w:num w:numId="16" w16cid:durableId="216287957">
     <w:abstractNumId w:val="2"/>
@@ -18702,25 +20549,25 @@
     <w:abstractNumId w:val="0"/>
   </w:num>
   <w:num w:numId="18" w16cid:durableId="752973630">
-    <w:abstractNumId w:val="21"/>
+    <w:abstractNumId w:val="23"/>
   </w:num>
   <w:num w:numId="19" w16cid:durableId="1919554416">
-    <w:abstractNumId w:val="22"/>
+    <w:abstractNumId w:val="24"/>
   </w:num>
   <w:num w:numId="20" w16cid:durableId="1763603534">
-    <w:abstractNumId w:val="14"/>
+    <w:abstractNumId w:val="15"/>
   </w:num>
   <w:num w:numId="21" w16cid:durableId="1105883196">
     <w:abstractNumId w:val="12"/>
   </w:num>
   <w:num w:numId="22" w16cid:durableId="1081488339">
-    <w:abstractNumId w:val="24"/>
+    <w:abstractNumId w:val="26"/>
   </w:num>
   <w:num w:numId="23" w16cid:durableId="1783986655">
-    <w:abstractNumId w:val="23"/>
+    <w:abstractNumId w:val="25"/>
   </w:num>
   <w:num w:numId="24" w16cid:durableId="1650936525">
-    <w:abstractNumId w:val="20"/>
+    <w:abstractNumId w:val="22"/>
   </w:num>
   <w:num w:numId="25" w16cid:durableId="1766457783">
     <w:abstractNumId w:val="6"/>
@@ -18753,9 +20600,15 @@
     <w:abstractNumId w:val="6"/>
   </w:num>
   <w:num w:numId="35" w16cid:durableId="1794395859">
-    <w:abstractNumId w:val="16"/>
+    <w:abstractNumId w:val="17"/>
   </w:num>
   <w:num w:numId="36" w16cid:durableId="2134782294">
+    <w:abstractNumId w:val="21"/>
+  </w:num>
+  <w:num w:numId="37" w16cid:durableId="1993095279">
+    <w:abstractNumId w:val="14"/>
+  </w:num>
+  <w:num w:numId="38" w16cid:durableId="2051103382">
     <w:abstractNumId w:val="19"/>
   </w:num>
   <w:numIdMacAtCleanup w:val="24"/>
@@ -19405,7 +21258,6 @@
   <w:style w:type="character" w:default="1" w:styleId="DefaultParagraphFont">
     <w:name w:val="Default Paragraph Font"/>
     <w:uiPriority w:val="1"/>
-    <w:semiHidden/>
     <w:unhideWhenUsed/>
   </w:style>
   <w:style w:type="table" w:default="1" w:styleId="TableNormal">
@@ -20713,58 +22565,6 @@
 </file>
 
 <file path=customXml/item1.xml><?xml version="1.0" encoding="utf-8"?>
-<p:properties xmlns:p="http://schemas.microsoft.com/office/2006/metadata/properties" xmlns:xsi="http://www.w3.org/2001/XMLSchema-instance" xmlns:pc="http://schemas.microsoft.com/office/infopath/2007/PartnerControls">
-  <documentManagement>
-    <Teams_Channel_Section_Location xmlns="ac56161a-35a2-4bac-99b6-8739237dc4f6" xsi:nil="true"/>
-    <Invited_Students xmlns="ac56161a-35a2-4bac-99b6-8739237dc4f6" xsi:nil="true"/>
-    <Distribution_Groups xmlns="ac56161a-35a2-4bac-99b6-8739237dc4f6" xsi:nil="true"/>
-    <Math_Settings xmlns="ac56161a-35a2-4bac-99b6-8739237dc4f6" xsi:nil="true"/>
-    <FolderType xmlns="ac56161a-35a2-4bac-99b6-8739237dc4f6" xsi:nil="true"/>
-    <Teachers xmlns="ac56161a-35a2-4bac-99b6-8739237dc4f6">
-      <UserInfo>
-        <DisplayName/>
-        <AccountId xsi:nil="true"/>
-        <AccountType/>
-      </UserInfo>
-    </Teachers>
-    <Student_Groups xmlns="ac56161a-35a2-4bac-99b6-8739237dc4f6">
-      <UserInfo>
-        <DisplayName/>
-        <AccountId xsi:nil="true"/>
-        <AccountType/>
-      </UserInfo>
-    </Student_Groups>
-    <Self_Registration_Enabled xmlns="ac56161a-35a2-4bac-99b6-8739237dc4f6" xsi:nil="true"/>
-    <CultureName xmlns="ac56161a-35a2-4bac-99b6-8739237dc4f6" xsi:nil="true"/>
-    <Students xmlns="ac56161a-35a2-4bac-99b6-8739237dc4f6">
-      <UserInfo>
-        <DisplayName/>
-        <AccountId xsi:nil="true"/>
-        <AccountType/>
-      </UserInfo>
-    </Students>
-    <Is_Collaboration_Space_Locked xmlns="ac56161a-35a2-4bac-99b6-8739237dc4f6" xsi:nil="true"/>
-    <LMS_Mappings xmlns="ac56161a-35a2-4bac-99b6-8739237dc4f6" xsi:nil="true"/>
-    <IsNotebookLocked xmlns="ac56161a-35a2-4bac-99b6-8739237dc4f6" xsi:nil="true"/>
-    <Owner xmlns="ac56161a-35a2-4bac-99b6-8739237dc4f6">
-      <UserInfo>
-        <DisplayName/>
-        <AccountId xsi:nil="true"/>
-        <AccountType/>
-      </UserInfo>
-    </Owner>
-    <Has_Teacher_Only_SectionGroup xmlns="ac56161a-35a2-4bac-99b6-8739237dc4f6" xsi:nil="true"/>
-    <DefaultSectionNames xmlns="ac56161a-35a2-4bac-99b6-8739237dc4f6" xsi:nil="true"/>
-    <AppVersion xmlns="ac56161a-35a2-4bac-99b6-8739237dc4f6" xsi:nil="true"/>
-    <TeamsChannelId xmlns="ac56161a-35a2-4bac-99b6-8739237dc4f6" xsi:nil="true"/>
-    <Invited_Teachers xmlns="ac56161a-35a2-4bac-99b6-8739237dc4f6" xsi:nil="true"/>
-    <NotebookType xmlns="ac56161a-35a2-4bac-99b6-8739237dc4f6" xsi:nil="true"/>
-    <Templates xmlns="ac56161a-35a2-4bac-99b6-8739237dc4f6" xsi:nil="true"/>
-  </documentManagement>
-</p:properties>
-</file>
-
-<file path=customXml/item2.xml><?xml version="1.0" encoding="utf-8"?>
 <?mso-contentType ?>
 <FormTemplates xmlns="http://schemas.microsoft.com/sharepoint/v3/contenttype/forms">
   <Display>DocumentLibraryForm</Display>
@@ -20773,7 +22573,7 @@
 </FormTemplates>
 </file>
 
-<file path=customXml/item3.xml><?xml version="1.0" encoding="utf-8"?>
+<file path=customXml/item2.xml><?xml version="1.0" encoding="utf-8"?>
 <ct:contentTypeSchema xmlns:ct="http://schemas.microsoft.com/office/2006/metadata/contentType" xmlns:ma="http://schemas.microsoft.com/office/2006/metadata/properties/metaAttributes" ct:_="" ma:_="" ma:contentTypeName="Document" ma:contentTypeID="0x0101003EE04D916D7611488AA759BAA9A37716" ma:contentTypeVersion="34" ma:contentTypeDescription="Create a new document." ma:contentTypeScope="" ma:versionID="da43fd5ae1f7ae53ffd28d894363bfb4">
   <xsd:schema xmlns:xsd="http://www.w3.org/2001/XMLSchema" xmlns:xs="http://www.w3.org/2001/XMLSchema" xmlns:p="http://schemas.microsoft.com/office/2006/metadata/properties" xmlns:ns3="05ee331b-510f-4173-a5cc-a06d55a316fd" xmlns:ns4="ac56161a-35a2-4bac-99b6-8739237dc4f6" targetNamespace="http://schemas.microsoft.com/office/2006/metadata/properties" ma:root="true" ma:fieldsID="0e753ad016b352eaafbd0268c41c2a23" ns3:_="" ns4:_="">
     <xsd:import namespace="05ee331b-510f-4173-a5cc-a06d55a316fd"/>
@@ -21190,6 +22990,58 @@
 </ct:contentTypeSchema>
 </file>
 
+<file path=customXml/item3.xml><?xml version="1.0" encoding="utf-8"?>
+<p:properties xmlns:p="http://schemas.microsoft.com/office/2006/metadata/properties" xmlns:xsi="http://www.w3.org/2001/XMLSchema-instance" xmlns:pc="http://schemas.microsoft.com/office/infopath/2007/PartnerControls">
+  <documentManagement>
+    <Teams_Channel_Section_Location xmlns="ac56161a-35a2-4bac-99b6-8739237dc4f6" xsi:nil="true"/>
+    <Invited_Students xmlns="ac56161a-35a2-4bac-99b6-8739237dc4f6" xsi:nil="true"/>
+    <Distribution_Groups xmlns="ac56161a-35a2-4bac-99b6-8739237dc4f6" xsi:nil="true"/>
+    <Math_Settings xmlns="ac56161a-35a2-4bac-99b6-8739237dc4f6" xsi:nil="true"/>
+    <FolderType xmlns="ac56161a-35a2-4bac-99b6-8739237dc4f6" xsi:nil="true"/>
+    <Teachers xmlns="ac56161a-35a2-4bac-99b6-8739237dc4f6">
+      <UserInfo>
+        <DisplayName/>
+        <AccountId xsi:nil="true"/>
+        <AccountType/>
+      </UserInfo>
+    </Teachers>
+    <Student_Groups xmlns="ac56161a-35a2-4bac-99b6-8739237dc4f6">
+      <UserInfo>
+        <DisplayName/>
+        <AccountId xsi:nil="true"/>
+        <AccountType/>
+      </UserInfo>
+    </Student_Groups>
+    <Self_Registration_Enabled xmlns="ac56161a-35a2-4bac-99b6-8739237dc4f6" xsi:nil="true"/>
+    <CultureName xmlns="ac56161a-35a2-4bac-99b6-8739237dc4f6" xsi:nil="true"/>
+    <Students xmlns="ac56161a-35a2-4bac-99b6-8739237dc4f6">
+      <UserInfo>
+        <DisplayName/>
+        <AccountId xsi:nil="true"/>
+        <AccountType/>
+      </UserInfo>
+    </Students>
+    <Is_Collaboration_Space_Locked xmlns="ac56161a-35a2-4bac-99b6-8739237dc4f6" xsi:nil="true"/>
+    <LMS_Mappings xmlns="ac56161a-35a2-4bac-99b6-8739237dc4f6" xsi:nil="true"/>
+    <IsNotebookLocked xmlns="ac56161a-35a2-4bac-99b6-8739237dc4f6" xsi:nil="true"/>
+    <Owner xmlns="ac56161a-35a2-4bac-99b6-8739237dc4f6">
+      <UserInfo>
+        <DisplayName/>
+        <AccountId xsi:nil="true"/>
+        <AccountType/>
+      </UserInfo>
+    </Owner>
+    <Has_Teacher_Only_SectionGroup xmlns="ac56161a-35a2-4bac-99b6-8739237dc4f6" xsi:nil="true"/>
+    <DefaultSectionNames xmlns="ac56161a-35a2-4bac-99b6-8739237dc4f6" xsi:nil="true"/>
+    <AppVersion xmlns="ac56161a-35a2-4bac-99b6-8739237dc4f6" xsi:nil="true"/>
+    <TeamsChannelId xmlns="ac56161a-35a2-4bac-99b6-8739237dc4f6" xsi:nil="true"/>
+    <Invited_Teachers xmlns="ac56161a-35a2-4bac-99b6-8739237dc4f6" xsi:nil="true"/>
+    <NotebookType xmlns="ac56161a-35a2-4bac-99b6-8739237dc4f6" xsi:nil="true"/>
+    <Templates xmlns="ac56161a-35a2-4bac-99b6-8739237dc4f6" xsi:nil="true"/>
+  </documentManagement>
+</p:properties>
+</file>
+
 <file path=customXml/item4.xml><?xml version="1.0" encoding="utf-8"?>
 <b:Sources xmlns:b="http://schemas.openxmlformats.org/officeDocument/2006/bibliography" xmlns="http://schemas.openxmlformats.org/officeDocument/2006/bibliography" SelectedStyle="\HarvardAnglia2008OfficeOnline.xsl" StyleName="Harvard - Anglia" Version="2008">
   <b:Source>
@@ -21310,20 +23162,36 @@
     <b:URL>https://www.geeksforgeeks.org/software-engineering/component-based-diagram/</b:URL>
     <b:RefOrder>5</b:RefOrder>
   </b:Source>
+  <b:Source>
+    <b:Tag>Pow25</b:Tag>
+    <b:SourceType>InternetSite</b:SourceType>
+    <b:Guid>{F687B3CA-FD64-486C-A68C-66994D66FC40}</b:Guid>
+    <b:Title>What is unit testing?</b:Title>
+    <b:Year>2025</b:Year>
+    <b:YearAccessed>2026</b:YearAccessed>
+    <b:MonthAccessed>July</b:MonthAccessed>
+    <b:DayAccessed>29</b:DayAccessed>
+    <b:URL>https://www.ibm.com/think/topics/unit-testing</b:URL>
+    <b:Author>
+      <b:Author>
+        <b:NameList>
+          <b:Person>
+            <b:Last>Powell</b:Last>
+            <b:First>Phil</b:First>
+          </b:Person>
+          <b:Person>
+            <b:Last>Smalley</b:Last>
+            <b:First>Ian</b:First>
+          </b:Person>
+        </b:NameList>
+      </b:Author>
+    </b:Author>
+    <b:RefOrder>8</b:RefOrder>
+  </b:Source>
 </b:Sources>
 </file>
 
 <file path=customXml/itemProps1.xml><?xml version="1.0" encoding="utf-8"?>
-<ds:datastoreItem xmlns:ds="http://schemas.openxmlformats.org/officeDocument/2006/customXml" ds:itemID="{5C51FF54-1CBD-43E8-9B2A-B56F20CDF09A}">
-  <ds:schemaRefs>
-    <ds:schemaRef ds:uri="http://schemas.microsoft.com/office/2006/metadata/properties"/>
-    <ds:schemaRef ds:uri="http://schemas.microsoft.com/office/infopath/2007/PartnerControls"/>
-    <ds:schemaRef ds:uri="ac56161a-35a2-4bac-99b6-8739237dc4f6"/>
-  </ds:schemaRefs>
-</ds:datastoreItem>
-</file>
-
-<file path=customXml/itemProps2.xml><?xml version="1.0" encoding="utf-8"?>
 <ds:datastoreItem xmlns:ds="http://schemas.openxmlformats.org/officeDocument/2006/customXml" ds:itemID="{9B975280-634C-49AE-9293-B75FDC4277EB}">
   <ds:schemaRefs>
     <ds:schemaRef ds:uri="http://schemas.microsoft.com/sharepoint/v3/contenttype/forms"/>
@@ -21331,7 +23199,7 @@
 </ds:datastoreItem>
 </file>
 
-<file path=customXml/itemProps3.xml><?xml version="1.0" encoding="utf-8"?>
+<file path=customXml/itemProps2.xml><?xml version="1.0" encoding="utf-8"?>
 <ds:datastoreItem xmlns:ds="http://schemas.openxmlformats.org/officeDocument/2006/customXml" ds:itemID="{3B693098-FF00-4095-9757-18FD92BDA8E2}">
   <ds:schemaRefs>
     <ds:schemaRef ds:uri="http://schemas.microsoft.com/office/2006/metadata/contentType"/>
@@ -21350,8 +23218,18 @@
 </ds:datastoreItem>
 </file>
 
+<file path=customXml/itemProps3.xml><?xml version="1.0" encoding="utf-8"?>
+<ds:datastoreItem xmlns:ds="http://schemas.openxmlformats.org/officeDocument/2006/customXml" ds:itemID="{5C51FF54-1CBD-43E8-9B2A-B56F20CDF09A}">
+  <ds:schemaRefs>
+    <ds:schemaRef ds:uri="http://schemas.microsoft.com/office/2006/metadata/properties"/>
+    <ds:schemaRef ds:uri="http://schemas.microsoft.com/office/infopath/2007/PartnerControls"/>
+    <ds:schemaRef ds:uri="ac56161a-35a2-4bac-99b6-8739237dc4f6"/>
+  </ds:schemaRefs>
+</ds:datastoreItem>
+</file>
+
 <file path=customXml/itemProps4.xml><?xml version="1.0" encoding="utf-8"?>
-<ds:datastoreItem xmlns:ds="http://schemas.openxmlformats.org/officeDocument/2006/customXml" ds:itemID="{36F9463C-3B57-4F39-8688-609D8413C2A6}">
+<ds:datastoreItem xmlns:ds="http://schemas.openxmlformats.org/officeDocument/2006/customXml" ds:itemID="{6BA21DA5-21D1-44D2-A7F9-DE675CA49F8B}">
   <ds:schemaRefs>
     <ds:schemaRef ds:uri="http://schemas.openxmlformats.org/officeDocument/2006/bibliography"/>
   </ds:schemaRefs>

</xml_diff>

<commit_message>
System Testing & Bug
When drivers finished, the final standings didn't always correctly show the finishing order. This aims to fix that.
</commit_message>
<xml_diff>
--- a/docs/Technical Report Eoin Fitzsimons.docx
+++ b/docs/Technical Report Eoin Fitzsimons.docx
@@ -678,25 +678,7 @@
           <w:bCs/>
           <w:highlight w:val="yellow"/>
         </w:rPr>
-        <w:t xml:space="preserve">successfully complete the </w:t>
-      </w:r>
-      <w:proofErr w:type="spellStart"/>
-      <w:r>
-        <w:rPr>
-          <w:b/>
-          <w:bCs/>
-          <w:highlight w:val="yellow"/>
-        </w:rPr>
-        <w:t>Epigeum</w:t>
-      </w:r>
-      <w:proofErr w:type="spellEnd"/>
-      <w:r>
-        <w:rPr>
-          <w:b/>
-          <w:bCs/>
-          <w:highlight w:val="yellow"/>
-        </w:rPr>
-        <w:t xml:space="preserve"> Academic Integrity Course</w:t>
+        <w:t>successfully complete the Epigeum Academic Integrity Course</w:t>
       </w:r>
       <w:r>
         <w:rPr>
@@ -1069,21 +1051,7 @@
         <w:rPr>
           <w:b/>
         </w:rPr>
-        <w:t xml:space="preserve">Please check that you read AI and Academic Integrity Acknowledgement </w:t>
-      </w:r>
-      <w:proofErr w:type="spellStart"/>
-      <w:r>
-        <w:rPr>
-          <w:b/>
-        </w:rPr>
-        <w:t>Supplments</w:t>
-      </w:r>
-      <w:proofErr w:type="spellEnd"/>
-      <w:r>
-        <w:rPr>
-          <w:b/>
-        </w:rPr>
-        <w:t xml:space="preserve"> in this document</w:t>
+        <w:t>Please check that you read AI and Academic Integrity Acknowledgement Supplments in this document</w:t>
       </w:r>
     </w:p>
     <w:p/>
@@ -5756,11 +5724,9 @@
       </w:r>
     </w:p>
     <w:p>
-      <w:proofErr w:type="spellStart"/>
       <w:r>
         <w:t>VSCode</w:t>
       </w:r>
-      <w:proofErr w:type="spellEnd"/>
     </w:p>
     <w:p>
       <w:r>
@@ -5773,13 +5739,8 @@
       </w:r>
     </w:p>
     <w:p>
-      <w:proofErr w:type="spellStart"/>
-      <w:r>
-        <w:t>pathlib</w:t>
-      </w:r>
-      <w:proofErr w:type="spellEnd"/>
-      <w:r>
-        <w:t xml:space="preserve"> – Path</w:t>
+      <w:r>
+        <w:t>pathlib – Path</w:t>
       </w:r>
     </w:p>
     <w:p>
@@ -5794,30 +5755,18 @@
     </w:p>
     <w:p>
       <w:r>
-        <w:t xml:space="preserve">typing – List, </w:t>
-      </w:r>
-      <w:proofErr w:type="spellStart"/>
-      <w:r>
-        <w:t>Dict</w:t>
-      </w:r>
-      <w:proofErr w:type="spellEnd"/>
-      <w:r>
-        <w:t>, Tuple</w:t>
-      </w:r>
-    </w:p>
-    <w:p>
-      <w:proofErr w:type="spellStart"/>
+        <w:t>typing – List, Dict, Tuple</w:t>
+      </w:r>
+    </w:p>
+    <w:p>
       <w:r>
         <w:t>json</w:t>
       </w:r>
-      <w:proofErr w:type="spellEnd"/>
-    </w:p>
-    <w:p>
-      <w:proofErr w:type="spellStart"/>
+    </w:p>
+    <w:p>
       <w:r>
         <w:t>dataclasses</w:t>
       </w:r>
-      <w:proofErr w:type="spellEnd"/>
     </w:p>
     <w:p>
       <w:r>
@@ -5826,18 +5775,14 @@
       <w:r>
         <w:t xml:space="preserve"> - </w:t>
       </w:r>
-      <w:proofErr w:type="spellStart"/>
       <w:r>
         <w:t>SystemRandom</w:t>
       </w:r>
-      <w:proofErr w:type="spellEnd"/>
-    </w:p>
-    <w:p>
-      <w:proofErr w:type="spellStart"/>
+    </w:p>
+    <w:p>
       <w:r>
         <w:t>os</w:t>
       </w:r>
-      <w:proofErr w:type="spellEnd"/>
     </w:p>
     <w:p>
       <w:pPr>
@@ -6122,15 +6067,7 @@
     </w:p>
     <w:p>
       <w:r>
-        <w:t xml:space="preserve">The </w:t>
-      </w:r>
-      <w:proofErr w:type="spellStart"/>
-      <w:r>
-        <w:t>MoSCoW</w:t>
-      </w:r>
-      <w:proofErr w:type="spellEnd"/>
-      <w:r>
-        <w:t xml:space="preserve"> prioritisation method was used to classify functional requirements according to their importance. Core functionality required for the successful completion of a race simulation was classified as Must Have, features that improve the user experience but are not essential to the simulation were classified as Should Have or Could Have, while functionality outside the scope of the minimum viable product (MVP) was classified as Won't Have</w:t>
+        <w:t>The MoSCoW prioritisation method was used to classify functional requirements according to their importance. Core functionality required for the successful completion of a race simulation was classified as Must Have, features that improve the user experience but are not essential to the simulation were classified as Should Have or Could Have, while functionality outside the scope of the minimum viable product (MVP) was classified as Won't Have</w:t>
       </w:r>
       <w:r>
         <w:t>.</w:t>
@@ -10547,15 +10484,7 @@
     </w:p>
     <w:p>
       <w:r>
-        <w:t xml:space="preserve">As seen in Telemetry 2, I create the tables using </w:t>
-      </w:r>
-      <w:proofErr w:type="spellStart"/>
-      <w:r>
-        <w:t>QHBoxLayout</w:t>
-      </w:r>
-      <w:proofErr w:type="spellEnd"/>
-      <w:r>
-        <w:t xml:space="preserve">, this lines up widgets horizontally without additional need for manually </w:t>
+        <w:t xml:space="preserve">As seen in Telemetry 2, I create the tables using QHBoxLayout, this lines up widgets horizontally without additional need for manually </w:t>
       </w:r>
       <w:r>
         <w:t>placing</w:t>
@@ -10693,15 +10622,7 @@
         <w:t xml:space="preserve">As seen in Telemetry 3, I have an attribute error stemming from line 64 - </w:t>
       </w:r>
       <w:r>
-        <w:t>self._</w:t>
-      </w:r>
-      <w:proofErr w:type="spellStart"/>
-      <w:r>
-        <w:t>publish_telemetry</w:t>
-      </w:r>
-      <w:proofErr w:type="spellEnd"/>
-      <w:r>
-        <w:t>()</w:t>
+        <w:t>self._publish_telemetry()</w:t>
       </w:r>
       <w:r>
         <w:t>. The root cause of this is the telemetry is being called prior to the creation of tables, Telemetry 2 above shows I do have the creation of these tables within my code. This in an architecture issue rather than a</w:t>
@@ -11163,6 +11084,9 @@
       </w:r>
       <w:r>
         <w:t xml:space="preserve"> </w:t>
+      </w:r>
+      <w:r>
+        <w:t>Changing from assigning from a pool each time to assigning by index solved that issue.</w:t>
       </w:r>
     </w:p>
     <w:p>
@@ -12443,7 +12367,19 @@
         <w:rPr>
           <w:noProof/>
         </w:rPr>
-        <w:t xml:space="preserve">In Track 6, you can see I changed it from being less than to less than or equal to. </w:t>
+        <w:t xml:space="preserve">In Track 6, you can see </w:t>
+      </w:r>
+      <w:r>
+        <w:rPr>
+          <w:noProof/>
+        </w:rPr>
+        <w:t xml:space="preserve">the change </w:t>
+      </w:r>
+      <w:r>
+        <w:rPr>
+          <w:noProof/>
+        </w:rPr>
+        <w:t xml:space="preserve">from being less than to less than or equal to. </w:t>
       </w:r>
     </w:p>
     <w:p>
@@ -12602,6 +12538,12 @@
           <w:noProof/>
         </w:rPr>
       </w:pPr>
+      <w:r>
+        <w:rPr>
+          <w:noProof/>
+        </w:rPr>
+        <w:t>The solution to this problem was found through trial and error. Setting the check to position &lt; 0.24 was tried but then the checkpoint was offset by a minimal but noticable distance.</w:t>
+      </w:r>
     </w:p>
     <w:p/>
     <w:p/>
@@ -12649,10 +12591,148 @@
         <w:rPr>
           <w:noProof/>
         </w:rPr>
+        <mc:AlternateContent>
+          <mc:Choice Requires="wps">
+            <w:drawing>
+              <wp:anchor distT="0" distB="0" distL="114300" distR="114300" simplePos="0" relativeHeight="251688960" behindDoc="0" locked="0" layoutInCell="1" allowOverlap="1" wp14:anchorId="35EA4329" wp14:editId="16426004">
+                <wp:simplePos x="0" y="0"/>
+                <wp:positionH relativeFrom="column">
+                  <wp:posOffset>228600</wp:posOffset>
+                </wp:positionH>
+                <wp:positionV relativeFrom="paragraph">
+                  <wp:posOffset>7670165</wp:posOffset>
+                </wp:positionV>
+                <wp:extent cx="2976245" cy="635"/>
+                <wp:effectExtent l="0" t="0" r="0" b="0"/>
+                <wp:wrapSquare wrapText="bothSides"/>
+                <wp:docPr id="386921513" name="Text Box 1"/>
+                <wp:cNvGraphicFramePr/>
+                <a:graphic xmlns:a="http://schemas.openxmlformats.org/drawingml/2006/main">
+                  <a:graphicData uri="http://schemas.microsoft.com/office/word/2010/wordprocessingShape">
+                    <wps:wsp>
+                      <wps:cNvSpPr txBox="1"/>
+                      <wps:spPr>
+                        <a:xfrm>
+                          <a:off x="0" y="0"/>
+                          <a:ext cx="2976245" cy="635"/>
+                        </a:xfrm>
+                        <a:prstGeom prst="rect">
+                          <a:avLst/>
+                        </a:prstGeom>
+                        <a:solidFill>
+                          <a:prstClr val="white"/>
+                        </a:solidFill>
+                        <a:ln>
+                          <a:noFill/>
+                        </a:ln>
+                      </wps:spPr>
+                      <wps:txbx>
+                        <w:txbxContent>
+                          <w:p>
+                            <w:pPr>
+                              <w:pStyle w:val="Caption"/>
+                              <w:rPr>
+                                <w:noProof/>
+                                <w:sz w:val="22"/>
+                                <w:szCs w:val="22"/>
+                              </w:rPr>
+                            </w:pPr>
+                            <w:r>
+                              <w:t xml:space="preserve">GUI </w:t>
+                            </w:r>
+                            <w:r>
+                              <w:fldChar w:fldCharType="begin"/>
+                            </w:r>
+                            <w:r>
+                              <w:instrText xml:space="preserve"> SEQ GUI \* ARABIC </w:instrText>
+                            </w:r>
+                            <w:r>
+                              <w:fldChar w:fldCharType="separate"/>
+                            </w:r>
+                            <w:r>
+                              <w:rPr>
+                                <w:noProof/>
+                              </w:rPr>
+                              <w:t>1</w:t>
+                            </w:r>
+                            <w:r>
+                              <w:fldChar w:fldCharType="end"/>
+                            </w:r>
+                          </w:p>
+                        </w:txbxContent>
+                      </wps:txbx>
+                      <wps:bodyPr rot="0" spcFirstLastPara="0" vertOverflow="overflow" horzOverflow="overflow" vert="horz" wrap="square" lIns="0" tIns="0" rIns="0" bIns="0" numCol="1" spcCol="0" rtlCol="0" fromWordArt="0" anchor="t" anchorCtr="0" forceAA="0" compatLnSpc="1">
+                        <a:prstTxWarp prst="textNoShape">
+                          <a:avLst/>
+                        </a:prstTxWarp>
+                        <a:spAutoFit/>
+                      </wps:bodyPr>
+                    </wps:wsp>
+                  </a:graphicData>
+                </a:graphic>
+              </wp:anchor>
+            </w:drawing>
+          </mc:Choice>
+          <mc:Fallback>
+            <w:pict>
+              <v:shape w14:anchorId="35EA4329" id="_x0000_s1033" type="#_x0000_t202" style="position:absolute;left:0;text-align:left;margin-left:18pt;margin-top:603.95pt;width:234.35pt;height:.05pt;z-index:251688960;visibility:visible;mso-wrap-style:square;mso-wrap-distance-left:9pt;mso-wrap-distance-top:0;mso-wrap-distance-right:9pt;mso-wrap-distance-bottom:0;mso-position-horizontal:absolute;mso-position-horizontal-relative:text;mso-position-vertical:absolute;mso-position-vertical-relative:text;v-text-anchor:top" o:gfxdata="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" stroked="f">
+                <v:textbox style="mso-fit-shape-to-text:t" inset="0,0,0,0">
+                  <w:txbxContent>
+                    <w:p>
+                      <w:pPr>
+                        <w:pStyle w:val="Caption"/>
+                        <w:rPr>
+                          <w:noProof/>
+                          <w:sz w:val="22"/>
+                          <w:szCs w:val="22"/>
+                        </w:rPr>
+                      </w:pPr>
+                      <w:r>
+                        <w:t xml:space="preserve">GUI </w:t>
+                      </w:r>
+                      <w:r>
+                        <w:fldChar w:fldCharType="begin"/>
+                      </w:r>
+                      <w:r>
+                        <w:instrText xml:space="preserve"> SEQ GUI \* ARABIC </w:instrText>
+                      </w:r>
+                      <w:r>
+                        <w:fldChar w:fldCharType="separate"/>
+                      </w:r>
+                      <w:r>
+                        <w:rPr>
+                          <w:noProof/>
+                        </w:rPr>
+                        <w:t>1</w:t>
+                      </w:r>
+                      <w:r>
+                        <w:fldChar w:fldCharType="end"/>
+                      </w:r>
+                    </w:p>
+                  </w:txbxContent>
+                </v:textbox>
+                <w10:wrap type="square"/>
+              </v:shape>
+            </w:pict>
+          </mc:Fallback>
+        </mc:AlternateContent>
+      </w:r>
+      <w:r>
+        <w:rPr>
+          <w:noProof/>
+        </w:rPr>
         <w:drawing>
-          <wp:inline distT="0" distB="0" distL="0" distR="0" wp14:anchorId="760AE5FC" wp14:editId="6F6EA6A0">
+          <wp:anchor distT="0" distB="0" distL="114300" distR="114300" simplePos="0" relativeHeight="251686912" behindDoc="0" locked="0" layoutInCell="1" allowOverlap="1" wp14:anchorId="760AE5FC" wp14:editId="49E8FB1D">
+            <wp:simplePos x="0" y="0"/>
+            <wp:positionH relativeFrom="column">
+              <wp:posOffset>228600</wp:posOffset>
+            </wp:positionH>
+            <wp:positionV relativeFrom="paragraph">
+              <wp:posOffset>-1555</wp:posOffset>
+            </wp:positionV>
             <wp:extent cx="2976504" cy="7614745"/>
             <wp:effectExtent l="0" t="0" r="0" b="5715"/>
+            <wp:wrapSquare wrapText="bothSides"/>
             <wp:docPr id="1476714120" name="Picture 1"/>
             <wp:cNvGraphicFramePr>
               <a:graphicFrameLocks xmlns:a="http://schemas.openxmlformats.org/drawingml/2006/main" noChangeAspect="1"/>
@@ -12665,7 +12745,13 @@
                     <pic:cNvPicPr/>
                   </pic:nvPicPr>
                   <pic:blipFill>
-                    <a:blip r:embed="rId35"/>
+                    <a:blip r:embed="rId35">
+                      <a:extLst>
+                        <a:ext uri="{28A0092B-C50C-407E-A947-70E740481C1C}">
+                          <a14:useLocalDpi xmlns:a14="http://schemas.microsoft.com/office/drawing/2010/main" val="0"/>
+                        </a:ext>
+                      </a:extLst>
+                    </a:blip>
                     <a:stretch>
                       <a:fillRect/>
                     </a:stretch>
@@ -12673,7 +12759,82 @@
                   <pic:spPr>
                     <a:xfrm>
                       <a:off x="0" y="0"/>
-                      <a:ext cx="2978909" cy="7620898"/>
+                      <a:ext cx="2976504" cy="7614745"/>
+                    </a:xfrm>
+                    <a:prstGeom prst="rect">
+                      <a:avLst/>
+                    </a:prstGeom>
+                  </pic:spPr>
+                </pic:pic>
+              </a:graphicData>
+            </a:graphic>
+          </wp:anchor>
+        </w:drawing>
+      </w:r>
+      <w:r>
+        <w:t>GUI 1 is the main menu. Here the user can see the drivers and all their information; colour, nationality, age, and attributes.</w:t>
+      </w:r>
+    </w:p>
+    <w:p>
+      <w:pPr>
+        <w:ind w:left="360"/>
+      </w:pPr>
+      <w:r>
+        <w:t>The user can also adjust accessibility settings.</w:t>
+      </w:r>
+    </w:p>
+    <w:p>
+      <w:pPr>
+        <w:rPr>
+          <w:rFonts w:asciiTheme="majorHAnsi" w:eastAsiaTheme="majorEastAsia" w:hAnsiTheme="majorHAnsi" w:cstheme="majorBidi"/>
+          <w:b/>
+          <w:bCs/>
+          <w:color w:val="353839" w:themeColor="text1"/>
+        </w:rPr>
+      </w:pPr>
+      <w:r>
+        <w:br w:type="page"/>
+      </w:r>
+    </w:p>
+    <w:p>
+      <w:pPr>
+        <w:pStyle w:val="Heading3"/>
+      </w:pPr>
+      <w:r>
+        <w:lastRenderedPageBreak/>
+        <w:t>Accessibility</w:t>
+      </w:r>
+    </w:p>
+    <w:p>
+      <w:pPr>
+        <w:keepNext/>
+      </w:pPr>
+      <w:r>
+        <w:drawing>
+          <wp:inline distT="0" distB="0" distL="0" distR="0" wp14:anchorId="20694F71" wp14:editId="03196830">
+            <wp:extent cx="1924319" cy="2038635"/>
+            <wp:effectExtent l="0" t="0" r="0" b="0"/>
+            <wp:docPr id="2063892507" name="Picture 1"/>
+            <wp:cNvGraphicFramePr>
+              <a:graphicFrameLocks xmlns:a="http://schemas.openxmlformats.org/drawingml/2006/main" noChangeAspect="1"/>
+            </wp:cNvGraphicFramePr>
+            <a:graphic xmlns:a="http://schemas.openxmlformats.org/drawingml/2006/main">
+              <a:graphicData uri="http://schemas.openxmlformats.org/drawingml/2006/picture">
+                <pic:pic xmlns:pic="http://schemas.openxmlformats.org/drawingml/2006/picture">
+                  <pic:nvPicPr>
+                    <pic:cNvPr id="2063892507" name=""/>
+                    <pic:cNvPicPr/>
+                  </pic:nvPicPr>
+                  <pic:blipFill>
+                    <a:blip r:embed="rId36"/>
+                    <a:stretch>
+                      <a:fillRect/>
+                    </a:stretch>
+                  </pic:blipFill>
+                  <pic:spPr>
+                    <a:xfrm>
+                      <a:off x="0" y="0"/>
+                      <a:ext cx="1924319" cy="2038635"/>
                     </a:xfrm>
                     <a:prstGeom prst="rect">
                       <a:avLst/>
@@ -12688,6 +12849,120 @@
     </w:p>
     <w:p>
       <w:pPr>
+        <w:pStyle w:val="Caption"/>
+      </w:pPr>
+      <w:r>
+        <w:t xml:space="preserve">GUI </w:t>
+      </w:r>
+      <w:r>
+        <w:fldChar w:fldCharType="begin"/>
+      </w:r>
+      <w:r>
+        <w:instrText xml:space="preserve"> SEQ GUI \* ARABIC </w:instrText>
+      </w:r>
+      <w:r>
+        <w:fldChar w:fldCharType="separate"/>
+      </w:r>
+      <w:r>
+        <w:rPr>
+          <w:noProof/>
+        </w:rPr>
+        <w:t>2</w:t>
+      </w:r>
+      <w:r>
+        <w:fldChar w:fldCharType="end"/>
+      </w:r>
+    </w:p>
+    <w:p>
+      <w:r>
+        <w:t>In GUI the accessibility settings are viewable. There are three themes and UI scales, default, high contrast, and colourblind, as well as 100%, 125% and 150%.</w:t>
+      </w:r>
+    </w:p>
+    <w:p/>
+    <w:p>
+      <w:pPr>
+        <w:pStyle w:val="Heading3"/>
+      </w:pPr>
+      <w:r>
+        <w:lastRenderedPageBreak/>
+        <w:t>Accessibility in action</w:t>
+      </w:r>
+    </w:p>
+    <w:p>
+      <w:pPr>
+        <w:keepNext/>
+      </w:pPr>
+      <w:r>
+        <w:drawing>
+          <wp:inline distT="0" distB="0" distL="0" distR="0" wp14:anchorId="5E8B9AFF" wp14:editId="2CC61582">
+            <wp:extent cx="3197499" cy="6069724"/>
+            <wp:effectExtent l="0" t="0" r="3175" b="7620"/>
+            <wp:docPr id="191415894" name="Picture 1"/>
+            <wp:cNvGraphicFramePr>
+              <a:graphicFrameLocks xmlns:a="http://schemas.openxmlformats.org/drawingml/2006/main" noChangeAspect="1"/>
+            </wp:cNvGraphicFramePr>
+            <a:graphic xmlns:a="http://schemas.openxmlformats.org/drawingml/2006/main">
+              <a:graphicData uri="http://schemas.openxmlformats.org/drawingml/2006/picture">
+                <pic:pic xmlns:pic="http://schemas.openxmlformats.org/drawingml/2006/picture">
+                  <pic:nvPicPr>
+                    <pic:cNvPr id="191415894" name=""/>
+                    <pic:cNvPicPr/>
+                  </pic:nvPicPr>
+                  <pic:blipFill>
+                    <a:blip r:embed="rId37"/>
+                    <a:stretch>
+                      <a:fillRect/>
+                    </a:stretch>
+                  </pic:blipFill>
+                  <pic:spPr>
+                    <a:xfrm>
+                      <a:off x="0" y="0"/>
+                      <a:ext cx="3205838" cy="6085553"/>
+                    </a:xfrm>
+                    <a:prstGeom prst="rect">
+                      <a:avLst/>
+                    </a:prstGeom>
+                  </pic:spPr>
+                </pic:pic>
+              </a:graphicData>
+            </a:graphic>
+          </wp:inline>
+        </w:drawing>
+      </w:r>
+    </w:p>
+    <w:p>
+      <w:pPr>
+        <w:pStyle w:val="Caption"/>
+      </w:pPr>
+      <w:r>
+        <w:t xml:space="preserve">GUI </w:t>
+      </w:r>
+      <w:r>
+        <w:fldChar w:fldCharType="begin"/>
+      </w:r>
+      <w:r>
+        <w:instrText xml:space="preserve"> SEQ GUI \* ARABIC </w:instrText>
+      </w:r>
+      <w:r>
+        <w:fldChar w:fldCharType="separate"/>
+      </w:r>
+      <w:r>
+        <w:rPr>
+          <w:noProof/>
+        </w:rPr>
+        <w:t>3</w:t>
+      </w:r>
+      <w:r>
+        <w:fldChar w:fldCharType="end"/>
+      </w:r>
+    </w:p>
+    <w:p>
+      <w:r>
+        <w:t>GUI 3 shows the main menu under the high contrast setting and 150% UI scale. This carries through to all screens and windows.</w:t>
+      </w:r>
+    </w:p>
+    <w:p>
+      <w:pPr>
         <w:pStyle w:val="Heading3"/>
       </w:pPr>
       <w:r>
@@ -12696,6 +12971,9 @@
       </w:r>
     </w:p>
     <w:p>
+      <w:pPr>
+        <w:keepNext/>
+      </w:pPr>
       <w:r>
         <w:rPr>
           <w:noProof/>
@@ -12716,7 +12994,7 @@
                     <pic:cNvPicPr/>
                   </pic:nvPicPr>
                   <pic:blipFill>
-                    <a:blip r:embed="rId36"/>
+                    <a:blip r:embed="rId38"/>
                     <a:stretch>
                       <a:fillRect/>
                     </a:stretch>
@@ -12739,6 +13017,40 @@
     </w:p>
     <w:p>
       <w:pPr>
+        <w:pStyle w:val="Caption"/>
+      </w:pPr>
+      <w:r>
+        <w:t xml:space="preserve">GUI </w:t>
+      </w:r>
+      <w:r>
+        <w:fldChar w:fldCharType="begin"/>
+      </w:r>
+      <w:r>
+        <w:instrText xml:space="preserve"> SEQ GUI \* ARABIC </w:instrText>
+      </w:r>
+      <w:r>
+        <w:fldChar w:fldCharType="separate"/>
+      </w:r>
+      <w:r>
+        <w:rPr>
+          <w:noProof/>
+        </w:rPr>
+        <w:t>4</w:t>
+      </w:r>
+      <w:r>
+        <w:fldChar w:fldCharType="end"/>
+      </w:r>
+    </w:p>
+    <w:p>
+      <w:r>
+        <w:t xml:space="preserve">GUI 3 demonstrates the racetrack with the cars matching the names and colours </w:t>
+      </w:r>
+      <w:r>
+        <w:t>from the main menu. The driver labels on track use their first names.</w:t>
+      </w:r>
+    </w:p>
+    <w:p>
+      <w:pPr>
         <w:pStyle w:val="Heading3"/>
       </w:pPr>
       <w:r>
@@ -12746,6 +13058,9 @@
       </w:r>
     </w:p>
     <w:p>
+      <w:pPr>
+        <w:keepNext/>
+      </w:pPr>
       <w:r>
         <w:rPr>
           <w:noProof/>
@@ -12766,7 +13081,7 @@
                     <pic:cNvPicPr/>
                   </pic:nvPicPr>
                   <pic:blipFill>
-                    <a:blip r:embed="rId37"/>
+                    <a:blip r:embed="rId39"/>
                     <a:stretch>
                       <a:fillRect/>
                     </a:stretch>
@@ -12788,6 +13103,35 @@
       </w:r>
     </w:p>
     <w:p>
+      <w:pPr>
+        <w:pStyle w:val="Caption"/>
+      </w:pPr>
+      <w:r>
+        <w:t xml:space="preserve">GUI </w:t>
+      </w:r>
+      <w:r>
+        <w:fldChar w:fldCharType="begin"/>
+      </w:r>
+      <w:r>
+        <w:instrText xml:space="preserve"> SEQ GUI \* ARABIC </w:instrText>
+      </w:r>
+      <w:r>
+        <w:fldChar w:fldCharType="separate"/>
+      </w:r>
+      <w:r>
+        <w:rPr>
+          <w:noProof/>
+        </w:rPr>
+        <w:t>5</w:t>
+      </w:r>
+      <w:r>
+        <w:fldChar w:fldCharType="end"/>
+      </w:r>
+    </w:p>
+    <w:p>
+      <w:pPr>
+        <w:keepNext/>
+      </w:pPr>
       <w:r>
         <w:rPr>
           <w:noProof/>
@@ -12808,7 +13152,7 @@
                     <pic:cNvPicPr/>
                   </pic:nvPicPr>
                   <pic:blipFill>
-                    <a:blip r:embed="rId38"/>
+                    <a:blip r:embed="rId40"/>
                     <a:stretch>
                       <a:fillRect/>
                     </a:stretch>
@@ -12831,6 +13175,40 @@
     </w:p>
     <w:p>
       <w:pPr>
+        <w:pStyle w:val="Caption"/>
+      </w:pPr>
+      <w:r>
+        <w:t xml:space="preserve">GUI </w:t>
+      </w:r>
+      <w:r>
+        <w:fldChar w:fldCharType="begin"/>
+      </w:r>
+      <w:r>
+        <w:instrText xml:space="preserve"> SEQ GUI \* ARABIC </w:instrText>
+      </w:r>
+      <w:r>
+        <w:fldChar w:fldCharType="separate"/>
+      </w:r>
+      <w:r>
+        <w:rPr>
+          <w:noProof/>
+        </w:rPr>
+        <w:t>6</w:t>
+      </w:r>
+      <w:r>
+        <w:fldChar w:fldCharType="end"/>
+      </w:r>
+    </w:p>
+    <w:p>
+      <w:r>
+        <w:t xml:space="preserve">GUI 5 and GUI 6 </w:t>
+      </w:r>
+      <w:r>
+        <w:t>show the telemetry of the drivers. Name, gap, lap, status, progress, speed, tyres, and fuel are the categories tracked.</w:t>
+      </w:r>
+    </w:p>
+    <w:p>
+      <w:pPr>
         <w:pStyle w:val="Heading3"/>
       </w:pPr>
       <w:r>
@@ -12839,6 +13217,9 @@
       </w:r>
     </w:p>
     <w:p>
+      <w:pPr>
+        <w:keepNext/>
+      </w:pPr>
       <w:r>
         <w:rPr>
           <w:noProof/>
@@ -12859,7 +13240,7 @@
                     <pic:cNvPicPr/>
                   </pic:nvPicPr>
                   <pic:blipFill>
-                    <a:blip r:embed="rId39"/>
+                    <a:blip r:embed="rId41"/>
                     <a:stretch>
                       <a:fillRect/>
                     </a:stretch>
@@ -12878,6 +13259,37 @@
             </a:graphic>
           </wp:inline>
         </w:drawing>
+      </w:r>
+    </w:p>
+    <w:p>
+      <w:pPr>
+        <w:pStyle w:val="Caption"/>
+      </w:pPr>
+      <w:r>
+        <w:t xml:space="preserve">GUI </w:t>
+      </w:r>
+      <w:r>
+        <w:fldChar w:fldCharType="begin"/>
+      </w:r>
+      <w:r>
+        <w:instrText xml:space="preserve"> SEQ GUI \* ARABIC </w:instrText>
+      </w:r>
+      <w:r>
+        <w:fldChar w:fldCharType="separate"/>
+      </w:r>
+      <w:r>
+        <w:rPr>
+          <w:noProof/>
+        </w:rPr>
+        <w:t>7</w:t>
+      </w:r>
+      <w:r>
+        <w:fldChar w:fldCharType="end"/>
+      </w:r>
+    </w:p>
+    <w:p>
+      <w:r>
+        <w:t>At the end of the race, you see the standings as shown in GUI 7. It shows the lap times of every driver for each lap and is sorted by finishing position.</w:t>
       </w:r>
     </w:p>
     <w:p>
@@ -12979,15 +13391,7 @@
     </w:p>
     <w:p>
       <w:r>
-        <w:t xml:space="preserve">The </w:t>
-      </w:r>
-      <w:proofErr w:type="spellStart"/>
-      <w:r>
-        <w:t>src</w:t>
-      </w:r>
-      <w:proofErr w:type="spellEnd"/>
-      <w:r>
-        <w:t xml:space="preserve"> directory was converted into a Python package by adding __init__.py files. These files were added to the main source directory and relevant subdirectories, including:</w:t>
+        <w:t>The src directory was converted into a Python package by adding __init__.py files. These files were added to the main source directory and relevant subdirectories, including:</w:t>
       </w:r>
     </w:p>
     <w:p>
@@ -12997,13 +13401,8 @@
           <w:numId w:val="37"/>
         </w:numPr>
       </w:pPr>
-      <w:proofErr w:type="spellStart"/>
-      <w:r>
-        <w:t>src</w:t>
-      </w:r>
-      <w:proofErr w:type="spellEnd"/>
-      <w:r>
-        <w:t>/</w:t>
+      <w:r>
+        <w:t>src/</w:t>
       </w:r>
       <w:r>
         <w:t xml:space="preserve"> __init__.py</w:t>
@@ -13019,13 +13418,8 @@
           <w:numId w:val="37"/>
         </w:numPr>
       </w:pPr>
-      <w:proofErr w:type="spellStart"/>
-      <w:r>
-        <w:t>src</w:t>
-      </w:r>
-      <w:proofErr w:type="spellEnd"/>
-      <w:r>
-        <w:t>/core/</w:t>
+      <w:r>
+        <w:t>src/core/</w:t>
       </w:r>
       <w:r>
         <w:t xml:space="preserve"> __init__.py</w:t>
@@ -13041,13 +13435,8 @@
           <w:numId w:val="37"/>
         </w:numPr>
       </w:pPr>
-      <w:proofErr w:type="spellStart"/>
-      <w:r>
-        <w:t>src</w:t>
-      </w:r>
-      <w:proofErr w:type="spellEnd"/>
-      <w:r>
-        <w:t>/models/</w:t>
+      <w:r>
+        <w:t>src/models/</w:t>
       </w:r>
       <w:r>
         <w:t xml:space="preserve"> __init__.py</w:t>
@@ -13072,13 +13461,8 @@
       </w:r>
     </w:p>
     <w:p>
-      <w:proofErr w:type="spellStart"/>
-      <w:r>
-        <w:t>pythonpath</w:t>
-      </w:r>
-      <w:proofErr w:type="spellEnd"/>
-      <w:r>
-        <w:t xml:space="preserve"> = .</w:t>
+      <w:r>
+        <w:t>pythonpath = .</w:t>
       </w:r>
     </w:p>
     <w:p>
@@ -13089,21 +13473,8 @@
         <w:t xml:space="preserve"> </w:t>
       </w:r>
       <w:r>
-        <w:t xml:space="preserve">from </w:t>
-      </w:r>
-      <w:proofErr w:type="spellStart"/>
-      <w:r>
-        <w:t>src.core.race_controller</w:t>
-      </w:r>
-      <w:proofErr w:type="spellEnd"/>
-      <w:r>
-        <w:t xml:space="preserve"> import </w:t>
-      </w:r>
-      <w:proofErr w:type="spellStart"/>
-      <w:r>
-        <w:t>RaceController</w:t>
-      </w:r>
-      <w:proofErr w:type="spellEnd"/>
+        <w:t>from src.core.race_controller import RaceController</w:t>
+      </w:r>
       <w:r>
         <w:t xml:space="preserve"> </w:t>
       </w:r>
@@ -13113,15 +13484,7 @@
     </w:p>
     <w:p>
       <w:r>
-        <w:t xml:space="preserve">Tests were organised using </w:t>
-      </w:r>
-      <w:proofErr w:type="spellStart"/>
-      <w:r>
-        <w:t>pytest's</w:t>
-      </w:r>
-      <w:proofErr w:type="spellEnd"/>
-      <w:r>
-        <w:t xml:space="preserve"> default naming conventions. Test files must begin with test_ or end with _test.py to be automatically detected by the pytest test discovery system.</w:t>
+        <w:t>Tests were organised using pytest's default naming conventions. Test files must begin with test_ or end with _test.py to be automatically detected by the pytest test discovery system.</w:t>
       </w:r>
     </w:p>
     <w:p>
@@ -13321,7 +13684,7 @@
           </mc:Choice>
           <mc:Fallback>
             <w:pict>
-              <v:shape w14:anchorId="4B4FE340" id="_x0000_s1033" type="#_x0000_t202" style="position:absolute;margin-left:-61.45pt;margin-top:116.2pt;width:576.9pt;height:.05pt;z-index:251682816;visibility:visible;mso-wrap-style:square;mso-wrap-distance-left:9pt;mso-wrap-distance-top:0;mso-wrap-distance-right:9pt;mso-wrap-distance-bottom:0;mso-position-horizontal:absolute;mso-position-horizontal-relative:text;mso-position-vertical:absolute;mso-position-vertical-relative:text;v-text-anchor:top" o:gfxdata="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" stroked="f">
+              <v:shape w14:anchorId="4B4FE340" id="_x0000_s1034" type="#_x0000_t202" style="position:absolute;margin-left:-61.45pt;margin-top:116.2pt;width:576.9pt;height:.05pt;z-index:251682816;visibility:visible;mso-wrap-style:square;mso-wrap-distance-left:9pt;mso-wrap-distance-top:0;mso-wrap-distance-right:9pt;mso-wrap-distance-bottom:0;mso-position-horizontal:absolute;mso-position-horizontal-relative:text;mso-position-vertical:absolute;mso-position-vertical-relative:text;v-text-anchor:top" o:gfxdata="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" stroked="f">
                 <v:textbox style="mso-fit-shape-to-text:t" inset="0,0,0,0">
                   <w:txbxContent>
                     <w:p>
@@ -13390,7 +13753,7 @@
                     <pic:cNvPicPr/>
                   </pic:nvPicPr>
                   <pic:blipFill>
-                    <a:blip r:embed="rId40">
+                    <a:blip r:embed="rId42">
                       <a:extLst>
                         <a:ext uri="{28A0092B-C50C-407E-A947-70E740481C1C}">
                           <a14:useLocalDpi xmlns:a14="http://schemas.microsoft.com/office/drawing/2010/main" val="0"/>
@@ -13472,15 +13835,7 @@
         <w:t>manages</w:t>
       </w:r>
       <w:r>
-        <w:t xml:space="preserve"> </w:t>
-      </w:r>
-      <w:proofErr w:type="spellStart"/>
-      <w:r>
-        <w:t>qApp</w:t>
-      </w:r>
-      <w:proofErr w:type="spellEnd"/>
-      <w:r>
-        <w:t xml:space="preserve"> creation </w:t>
+        <w:t xml:space="preserve"> qApp creation </w:t>
       </w:r>
       <w:r>
         <w:t>when required</w:t>
@@ -13517,13 +13872,8 @@
       <w:r>
         <w:t xml:space="preserve">, </w:t>
       </w:r>
-      <w:proofErr w:type="spellStart"/>
-      <w:r>
-        <w:t>qt_api</w:t>
-      </w:r>
-      <w:proofErr w:type="spellEnd"/>
-      <w:r>
-        <w:t>=pyqt6</w:t>
+      <w:r>
+        <w:t>qt_api=pyqt6</w:t>
       </w:r>
       <w:r>
         <w:t xml:space="preserve"> needs to be placed in the pytest.ini file.</w:t>
@@ -14703,7 +15053,7 @@
                     <pic:cNvPicPr/>
                   </pic:nvPicPr>
                   <pic:blipFill>
-                    <a:blip r:embed="rId41"/>
+                    <a:blip r:embed="rId43"/>
                     <a:stretch>
                       <a:fillRect/>
                     </a:stretch>
@@ -14832,31 +15182,7 @@
         <w:t xml:space="preserve">This </w:t>
       </w:r>
       <w:r>
-        <w:t xml:space="preserve">phase primarily focused on the </w:t>
-      </w:r>
-      <w:proofErr w:type="spellStart"/>
-      <w:r>
-        <w:t>RaceController</w:t>
-      </w:r>
-      <w:proofErr w:type="spellEnd"/>
-      <w:r>
-        <w:t xml:space="preserve"> class. The tests validated the behaviour of its methods and internal state management. Dependent classes, including Driver, Car, </w:t>
-      </w:r>
-      <w:proofErr w:type="spellStart"/>
-      <w:r>
-        <w:t>RaceTelemetry</w:t>
-      </w:r>
-      <w:proofErr w:type="spellEnd"/>
-      <w:r>
-        <w:t xml:space="preserve">, and </w:t>
-      </w:r>
-      <w:proofErr w:type="spellStart"/>
-      <w:r>
-        <w:t>RaceResult</w:t>
-      </w:r>
-      <w:proofErr w:type="spellEnd"/>
-      <w:r>
-        <w:t>, were used during execution to provide the required objects and verify that the controller operated correctly within the simulation environment.</w:t>
+        <w:t>phase primarily focused on the RaceController class. The tests validated the behaviour of its methods and internal state management. Dependent classes, including Driver, Car, RaceTelemetry, and RaceResult, were used during execution to provide the required objects and verify that the controller operated correctly within the simulation environment.</w:t>
       </w:r>
     </w:p>
     <w:tbl>
@@ -15000,11 +15326,9 @@
             <w:pPr>
               <w:spacing w:after="160" w:line="259" w:lineRule="auto"/>
             </w:pPr>
-            <w:proofErr w:type="spellStart"/>
             <w:r>
               <w:t>RaceController</w:t>
             </w:r>
-            <w:proofErr w:type="spellEnd"/>
           </w:p>
         </w:tc>
         <w:tc>
@@ -15016,11 +15340,9 @@
             <w:pPr>
               <w:spacing w:after="160" w:line="259" w:lineRule="auto"/>
             </w:pPr>
-            <w:proofErr w:type="spellStart"/>
             <w:r>
               <w:t>TrackDefinition</w:t>
             </w:r>
-            <w:proofErr w:type="spellEnd"/>
           </w:p>
         </w:tc>
         <w:tc>
@@ -15090,11 +15412,9 @@
             <w:pPr>
               <w:spacing w:after="160" w:line="259" w:lineRule="auto"/>
             </w:pPr>
-            <w:proofErr w:type="spellStart"/>
             <w:r>
               <w:t>RaceController</w:t>
             </w:r>
-            <w:proofErr w:type="spellEnd"/>
           </w:p>
         </w:tc>
         <w:tc>
@@ -15178,11 +15498,9 @@
             <w:pPr>
               <w:spacing w:after="160" w:line="259" w:lineRule="auto"/>
             </w:pPr>
-            <w:proofErr w:type="spellStart"/>
             <w:r>
               <w:t>RaceController</w:t>
             </w:r>
-            <w:proofErr w:type="spellEnd"/>
           </w:p>
         </w:tc>
         <w:tc>
@@ -15266,11 +15584,9 @@
             <w:pPr>
               <w:spacing w:after="160" w:line="259" w:lineRule="auto"/>
             </w:pPr>
-            <w:proofErr w:type="spellStart"/>
             <w:r>
               <w:t>RaceController</w:t>
             </w:r>
-            <w:proofErr w:type="spellEnd"/>
           </w:p>
         </w:tc>
         <w:tc>
@@ -15354,11 +15670,9 @@
             <w:pPr>
               <w:spacing w:after="160" w:line="259" w:lineRule="auto"/>
             </w:pPr>
-            <w:proofErr w:type="spellStart"/>
             <w:r>
               <w:t>RaceController</w:t>
             </w:r>
-            <w:proofErr w:type="spellEnd"/>
           </w:p>
         </w:tc>
         <w:tc>
@@ -15371,13 +15685,8 @@
               <w:spacing w:after="160" w:line="259" w:lineRule="auto"/>
             </w:pPr>
             <w:r>
-              <w:t xml:space="preserve">Driver, Car, </w:t>
-            </w:r>
-            <w:proofErr w:type="spellStart"/>
-            <w:r>
-              <w:t>RaceTelemetry</w:t>
-            </w:r>
-            <w:proofErr w:type="spellEnd"/>
+              <w:t>Driver, Car, RaceTelemetry</w:t>
+            </w:r>
           </w:p>
         </w:tc>
         <w:tc>
@@ -15447,11 +15756,9 @@
             <w:pPr>
               <w:spacing w:after="160" w:line="259" w:lineRule="auto"/>
             </w:pPr>
-            <w:proofErr w:type="spellStart"/>
             <w:r>
               <w:t>RaceController</w:t>
             </w:r>
-            <w:proofErr w:type="spellEnd"/>
           </w:p>
         </w:tc>
         <w:tc>
@@ -15535,11 +15842,9 @@
             <w:pPr>
               <w:spacing w:after="160" w:line="259" w:lineRule="auto"/>
             </w:pPr>
-            <w:proofErr w:type="spellStart"/>
             <w:r>
               <w:t>RaceController</w:t>
             </w:r>
-            <w:proofErr w:type="spellEnd"/>
           </w:p>
         </w:tc>
         <w:tc>
@@ -15552,13 +15857,8 @@
               <w:spacing w:after="160" w:line="259" w:lineRule="auto"/>
             </w:pPr>
             <w:r>
-              <w:t xml:space="preserve">Car, </w:t>
-            </w:r>
-            <w:proofErr w:type="spellStart"/>
-            <w:r>
-              <w:t>RaceResult</w:t>
-            </w:r>
-            <w:proofErr w:type="spellEnd"/>
+              <w:t>Car, RaceResult</w:t>
+            </w:r>
           </w:p>
         </w:tc>
         <w:tc>
@@ -15625,7 +15925,7 @@
                     <pic:cNvPicPr/>
                   </pic:nvPicPr>
                   <pic:blipFill>
-                    <a:blip r:embed="rId42"/>
+                    <a:blip r:embed="rId44"/>
                     <a:stretch>
                       <a:fillRect/>
                     </a:stretch>
@@ -15755,23 +16055,7 @@
     </w:p>
     <w:p>
       <w:r>
-        <w:t xml:space="preserve">The integration testing phase focused on the interaction between the </w:t>
-      </w:r>
-      <w:proofErr w:type="spellStart"/>
-      <w:r>
-        <w:t>RaceController</w:t>
-      </w:r>
-      <w:proofErr w:type="spellEnd"/>
-      <w:r>
-        <w:t xml:space="preserve"> and the </w:t>
-      </w:r>
-      <w:proofErr w:type="spellStart"/>
-      <w:r>
-        <w:t>MainMenu</w:t>
-      </w:r>
-      <w:proofErr w:type="spellEnd"/>
-      <w:r>
-        <w:t xml:space="preserve"> interface. The test verified that race data generated by the controller was successfully passed to the user interface, that the driver roster was populated correctly, and that the Start Race control triggered the connected race start callback.</w:t>
+        <w:t>The integration testing phase focused on the interaction between the RaceController and the MainMenu interface. The test verified that race data generated by the controller was successfully passed to the user interface, that the driver roster was populated correctly, and that the Start Race control triggered the connected race start callback.</w:t>
       </w:r>
     </w:p>
     <w:tbl>
@@ -15900,27 +16184,9 @@
             <w:pPr>
               <w:spacing w:after="160" w:line="259" w:lineRule="auto"/>
             </w:pPr>
-            <w:proofErr w:type="spellStart"/>
-            <w:r>
-              <w:t>RaceController</w:t>
-            </w:r>
-            <w:proofErr w:type="spellEnd"/>
-            <w:r>
-              <w:t xml:space="preserve">, </w:t>
-            </w:r>
-            <w:proofErr w:type="spellStart"/>
-            <w:r>
-              <w:t>MainMenu</w:t>
-            </w:r>
-            <w:proofErr w:type="spellEnd"/>
-            <w:r>
-              <w:t xml:space="preserve">, </w:t>
-            </w:r>
-            <w:proofErr w:type="spellStart"/>
-            <w:r>
-              <w:t>DriverRosterWidget</w:t>
-            </w:r>
-            <w:proofErr w:type="spellEnd"/>
+            <w:r>
+              <w:t>RaceController, MainMenu, DriverRosterWidget</w:t>
+            </w:r>
           </w:p>
         </w:tc>
         <w:tc>
@@ -15983,7 +16249,7 @@
                     <pic:cNvPicPr/>
                   </pic:nvPicPr>
                   <pic:blipFill>
-                    <a:blip r:embed="rId43"/>
+                    <a:blip r:embed="rId45"/>
                     <a:stretch>
                       <a:fillRect/>
                     </a:stretch>
@@ -16065,24 +16331,1032 @@
         <w:t>System</w:t>
       </w:r>
     </w:p>
+    <w:p>
+      <w:r>
+        <w:t>System testing is an end-to-end testing approach used to evaluate an entire software system rather than individual components. It verifies that all integrated parts of the application work together correctly and that the system satisfies user and business requirements.</w:t>
+      </w:r>
+      <w:sdt>
+        <w:sdtPr>
+          <w:id w:val="-1005207272"/>
+          <w:citation/>
+        </w:sdtPr>
+        <w:sdtContent>
+          <w:r>
+            <w:fldChar w:fldCharType="begin"/>
+          </w:r>
+          <w:r>
+            <w:rPr>
+              <w:lang w:val="en-GB"/>
+            </w:rPr>
+            <w:instrText xml:space="preserve"> CITATION IBM26 \l 2057 </w:instrText>
+          </w:r>
+          <w:r>
+            <w:fldChar w:fldCharType="separate"/>
+          </w:r>
+          <w:r>
+            <w:rPr>
+              <w:noProof/>
+              <w:lang w:val="en-GB"/>
+            </w:rPr>
+            <w:t xml:space="preserve"> </w:t>
+          </w:r>
+          <w:r>
+            <w:rPr>
+              <w:noProof/>
+              <w:lang w:val="en-GB"/>
+            </w:rPr>
+            <w:t>(IBM, n.d.)</w:t>
+          </w:r>
+          <w:r>
+            <w:fldChar w:fldCharType="end"/>
+          </w:r>
+        </w:sdtContent>
+      </w:sdt>
+    </w:p>
+    <w:p>
+      <w:pPr>
+        <w:pStyle w:val="Heading4"/>
+      </w:pPr>
+      <w:r>
+        <w:t>Plan</w:t>
+      </w:r>
+    </w:p>
+    <w:tbl>
+      <w:tblPr>
+        <w:tblStyle w:val="GridTable3-Accent1"/>
+        <w:tblW w:w="0" w:type="auto"/>
+        <w:tblLook w:val="0620" w:firstRow="1" w:lastRow="0" w:firstColumn="0" w:lastColumn="0" w:noHBand="1" w:noVBand="1"/>
+      </w:tblPr>
+      <w:tblGrid>
+        <w:gridCol w:w="644"/>
+        <w:gridCol w:w="1773"/>
+        <w:gridCol w:w="2490"/>
+        <w:gridCol w:w="1130"/>
+        <w:gridCol w:w="2989"/>
+      </w:tblGrid>
+      <w:tr>
+        <w:trPr>
+          <w:cnfStyle w:val="100000000000" w:firstRow="1" w:lastRow="0" w:firstColumn="0" w:lastColumn="0" w:oddVBand="0" w:evenVBand="0" w:oddHBand="0" w:evenHBand="0" w:firstRowFirstColumn="0" w:firstRowLastColumn="0" w:lastRowFirstColumn="0" w:lastRowLastColumn="0"/>
+        </w:trPr>
+        <w:tc>
+          <w:tcPr>
+            <w:tcW w:w="0" w:type="auto"/>
+            <w:hideMark/>
+          </w:tcPr>
+          <w:p>
+            <w:pPr>
+              <w:spacing w:after="160" w:line="259" w:lineRule="auto"/>
+            </w:pPr>
+            <w:r>
+              <w:t>Test ID</w:t>
+            </w:r>
+          </w:p>
+        </w:tc>
+        <w:tc>
+          <w:tcPr>
+            <w:tcW w:w="0" w:type="auto"/>
+            <w:hideMark/>
+          </w:tcPr>
+          <w:p>
+            <w:pPr>
+              <w:spacing w:after="160" w:line="259" w:lineRule="auto"/>
+            </w:pPr>
+            <w:r>
+              <w:t>Requirement Tested</w:t>
+            </w:r>
+          </w:p>
+        </w:tc>
+        <w:tc>
+          <w:tcPr>
+            <w:tcW w:w="0" w:type="auto"/>
+            <w:hideMark/>
+          </w:tcPr>
+          <w:p>
+            <w:pPr>
+              <w:spacing w:after="160" w:line="259" w:lineRule="auto"/>
+            </w:pPr>
+            <w:r>
+              <w:t>Test Description</w:t>
+            </w:r>
+          </w:p>
+        </w:tc>
+        <w:tc>
+          <w:tcPr>
+            <w:tcW w:w="0" w:type="auto"/>
+            <w:hideMark/>
+          </w:tcPr>
+          <w:p>
+            <w:pPr>
+              <w:spacing w:after="160" w:line="259" w:lineRule="auto"/>
+            </w:pPr>
+            <w:r>
+              <w:t>Test Method</w:t>
+            </w:r>
+          </w:p>
+        </w:tc>
+        <w:tc>
+          <w:tcPr>
+            <w:tcW w:w="0" w:type="auto"/>
+            <w:hideMark/>
+          </w:tcPr>
+          <w:p>
+            <w:pPr>
+              <w:spacing w:after="160" w:line="259" w:lineRule="auto"/>
+            </w:pPr>
+            <w:r>
+              <w:t>Expected Result</w:t>
+            </w:r>
+          </w:p>
+        </w:tc>
+      </w:tr>
+      <w:tr>
+        <w:tc>
+          <w:tcPr>
+            <w:tcW w:w="0" w:type="auto"/>
+            <w:hideMark/>
+          </w:tcPr>
+          <w:p>
+            <w:pPr>
+              <w:spacing w:after="160" w:line="259" w:lineRule="auto"/>
+            </w:pPr>
+            <w:r>
+              <w:t>ST-01</w:t>
+            </w:r>
+          </w:p>
+        </w:tc>
+        <w:tc>
+          <w:tcPr>
+            <w:tcW w:w="0" w:type="auto"/>
+            <w:hideMark/>
+          </w:tcPr>
+          <w:p>
+            <w:pPr>
+              <w:spacing w:after="160" w:line="259" w:lineRule="auto"/>
+            </w:pPr>
+            <w:r>
+              <w:t>FR1 - View race results</w:t>
+            </w:r>
+          </w:p>
+        </w:tc>
+        <w:tc>
+          <w:tcPr>
+            <w:tcW w:w="0" w:type="auto"/>
+            <w:hideMark/>
+          </w:tcPr>
+          <w:p>
+            <w:pPr>
+              <w:spacing w:after="160" w:line="259" w:lineRule="auto"/>
+            </w:pPr>
+            <w:r>
+              <w:t>Complete a race simulation and view the final classification</w:t>
+            </w:r>
+          </w:p>
+        </w:tc>
+        <w:tc>
+          <w:tcPr>
+            <w:tcW w:w="0" w:type="auto"/>
+            <w:hideMark/>
+          </w:tcPr>
+          <w:p>
+            <w:pPr>
+              <w:spacing w:after="160" w:line="259" w:lineRule="auto"/>
+            </w:pPr>
+            <w:r>
+              <w:t>Manual system test</w:t>
+            </w:r>
+          </w:p>
+        </w:tc>
+        <w:tc>
+          <w:tcPr>
+            <w:tcW w:w="0" w:type="auto"/>
+            <w:hideMark/>
+          </w:tcPr>
+          <w:p>
+            <w:pPr>
+              <w:spacing w:after="160" w:line="259" w:lineRule="auto"/>
+            </w:pPr>
+            <w:r>
+              <w:t>The application displays the finishing order and race information for all participating drivers</w:t>
+            </w:r>
+          </w:p>
+        </w:tc>
+      </w:tr>
+      <w:tr>
+        <w:tc>
+          <w:tcPr>
+            <w:tcW w:w="0" w:type="auto"/>
+            <w:hideMark/>
+          </w:tcPr>
+          <w:p>
+            <w:pPr>
+              <w:spacing w:after="160" w:line="259" w:lineRule="auto"/>
+            </w:pPr>
+            <w:r>
+              <w:t>ST-02</w:t>
+            </w:r>
+          </w:p>
+        </w:tc>
+        <w:tc>
+          <w:tcPr>
+            <w:tcW w:w="0" w:type="auto"/>
+            <w:hideMark/>
+          </w:tcPr>
+          <w:p>
+            <w:pPr>
+              <w:spacing w:after="160" w:line="259" w:lineRule="auto"/>
+            </w:pPr>
+            <w:r>
+              <w:t>FR2 - Simulate race progression</w:t>
+            </w:r>
+          </w:p>
+        </w:tc>
+        <w:tc>
+          <w:tcPr>
+            <w:tcW w:w="0" w:type="auto"/>
+            <w:hideMark/>
+          </w:tcPr>
+          <w:p>
+            <w:pPr>
+              <w:spacing w:after="160" w:line="259" w:lineRule="auto"/>
+            </w:pPr>
+            <w:r>
+              <w:t>Start a race simulation and observe race progression</w:t>
+            </w:r>
+          </w:p>
+        </w:tc>
+        <w:tc>
+          <w:tcPr>
+            <w:tcW w:w="0" w:type="auto"/>
+            <w:hideMark/>
+          </w:tcPr>
+          <w:p>
+            <w:pPr>
+              <w:spacing w:after="160" w:line="259" w:lineRule="auto"/>
+            </w:pPr>
+            <w:r>
+              <w:t>Manual system test</w:t>
+            </w:r>
+          </w:p>
+        </w:tc>
+        <w:tc>
+          <w:tcPr>
+            <w:tcW w:w="0" w:type="auto"/>
+            <w:hideMark/>
+          </w:tcPr>
+          <w:p>
+            <w:pPr>
+              <w:spacing w:after="160" w:line="259" w:lineRule="auto"/>
+            </w:pPr>
+            <w:r>
+              <w:t>The race progresses using the implemented simulation logic until all cars complete the required race distance</w:t>
+            </w:r>
+          </w:p>
+        </w:tc>
+      </w:tr>
+      <w:tr>
+        <w:tc>
+          <w:tcPr>
+            <w:tcW w:w="0" w:type="auto"/>
+            <w:hideMark/>
+          </w:tcPr>
+          <w:p>
+            <w:pPr>
+              <w:spacing w:after="160" w:line="259" w:lineRule="auto"/>
+            </w:pPr>
+            <w:r>
+              <w:t>ST-03</w:t>
+            </w:r>
+          </w:p>
+        </w:tc>
+        <w:tc>
+          <w:tcPr>
+            <w:tcW w:w="0" w:type="auto"/>
+            <w:hideMark/>
+          </w:tcPr>
+          <w:p>
+            <w:pPr>
+              <w:spacing w:after="160" w:line="259" w:lineRule="auto"/>
+            </w:pPr>
+            <w:r>
+              <w:t>FR3 - View live race</w:t>
+            </w:r>
+          </w:p>
+        </w:tc>
+        <w:tc>
+          <w:tcPr>
+            <w:tcW w:w="0" w:type="auto"/>
+            <w:hideMark/>
+          </w:tcPr>
+          <w:p>
+            <w:pPr>
+              <w:spacing w:after="160" w:line="259" w:lineRule="auto"/>
+            </w:pPr>
+            <w:r>
+              <w:t>Launch a race and observe the live race interface</w:t>
+            </w:r>
+          </w:p>
+        </w:tc>
+        <w:tc>
+          <w:tcPr>
+            <w:tcW w:w="0" w:type="auto"/>
+            <w:hideMark/>
+          </w:tcPr>
+          <w:p>
+            <w:pPr>
+              <w:spacing w:after="160" w:line="259" w:lineRule="auto"/>
+            </w:pPr>
+            <w:r>
+              <w:t>Manual system test</w:t>
+            </w:r>
+          </w:p>
+        </w:tc>
+        <w:tc>
+          <w:tcPr>
+            <w:tcW w:w="0" w:type="auto"/>
+            <w:hideMark/>
+          </w:tcPr>
+          <w:p>
+            <w:pPr>
+              <w:spacing w:after="160" w:line="259" w:lineRule="auto"/>
+            </w:pPr>
+            <w:r>
+              <w:t>The user can view the ongoing race, including car positions and telemetry information</w:t>
+            </w:r>
+          </w:p>
+        </w:tc>
+      </w:tr>
+      <w:tr>
+        <w:tc>
+          <w:tcPr>
+            <w:tcW w:w="0" w:type="auto"/>
+            <w:hideMark/>
+          </w:tcPr>
+          <w:p>
+            <w:pPr>
+              <w:spacing w:after="160" w:line="259" w:lineRule="auto"/>
+            </w:pPr>
+            <w:r>
+              <w:t>ST-04</w:t>
+            </w:r>
+          </w:p>
+        </w:tc>
+        <w:tc>
+          <w:tcPr>
+            <w:tcW w:w="0" w:type="auto"/>
+            <w:hideMark/>
+          </w:tcPr>
+          <w:p>
+            <w:pPr>
+              <w:spacing w:after="160" w:line="259" w:lineRule="auto"/>
+            </w:pPr>
+            <w:r>
+              <w:t>FR4 - Configure race settings</w:t>
+            </w:r>
+          </w:p>
+        </w:tc>
+        <w:tc>
+          <w:tcPr>
+            <w:tcW w:w="0" w:type="auto"/>
+            <w:hideMark/>
+          </w:tcPr>
+          <w:p>
+            <w:pPr>
+              <w:spacing w:after="160" w:line="259" w:lineRule="auto"/>
+            </w:pPr>
+            <w:r>
+              <w:t>Load a race using the configured track data, including the predefined number of laps</w:t>
+            </w:r>
+          </w:p>
+        </w:tc>
+        <w:tc>
+          <w:tcPr>
+            <w:tcW w:w="0" w:type="auto"/>
+            <w:hideMark/>
+          </w:tcPr>
+          <w:p>
+            <w:pPr>
+              <w:spacing w:after="160" w:line="259" w:lineRule="auto"/>
+            </w:pPr>
+            <w:r>
+              <w:t>Manual system test</w:t>
+            </w:r>
+          </w:p>
+        </w:tc>
+        <w:tc>
+          <w:tcPr>
+            <w:tcW w:w="0" w:type="auto"/>
+            <w:hideMark/>
+          </w:tcPr>
+          <w:p>
+            <w:pPr>
+              <w:spacing w:after="160" w:line="259" w:lineRule="auto"/>
+            </w:pPr>
+            <w:r>
+              <w:t>The application correctly applies the configured race settings and completes the race using the specified distance</w:t>
+            </w:r>
+          </w:p>
+        </w:tc>
+      </w:tr>
+      <w:tr>
+        <w:tc>
+          <w:tcPr>
+            <w:tcW w:w="0" w:type="auto"/>
+            <w:hideMark/>
+          </w:tcPr>
+          <w:p>
+            <w:pPr>
+              <w:spacing w:after="160" w:line="259" w:lineRule="auto"/>
+            </w:pPr>
+            <w:r>
+              <w:t>ST-05</w:t>
+            </w:r>
+          </w:p>
+        </w:tc>
+        <w:tc>
+          <w:tcPr>
+            <w:tcW w:w="0" w:type="auto"/>
+            <w:hideMark/>
+          </w:tcPr>
+          <w:p>
+            <w:pPr>
+              <w:spacing w:after="160" w:line="259" w:lineRule="auto"/>
+            </w:pPr>
+            <w:r>
+              <w:t>FR5 - View driver information</w:t>
+            </w:r>
+          </w:p>
+        </w:tc>
+        <w:tc>
+          <w:tcPr>
+            <w:tcW w:w="0" w:type="auto"/>
+            <w:hideMark/>
+          </w:tcPr>
+          <w:p>
+            <w:pPr>
+              <w:spacing w:after="160" w:line="259" w:lineRule="auto"/>
+            </w:pPr>
+            <w:r>
+              <w:t>View the driver roster before starting a race</w:t>
+            </w:r>
+          </w:p>
+        </w:tc>
+        <w:tc>
+          <w:tcPr>
+            <w:tcW w:w="0" w:type="auto"/>
+            <w:hideMark/>
+          </w:tcPr>
+          <w:p>
+            <w:pPr>
+              <w:spacing w:after="160" w:line="259" w:lineRule="auto"/>
+            </w:pPr>
+            <w:r>
+              <w:t>Manual system test</w:t>
+            </w:r>
+          </w:p>
+        </w:tc>
+        <w:tc>
+          <w:tcPr>
+            <w:tcW w:w="0" w:type="auto"/>
+            <w:hideMark/>
+          </w:tcPr>
+          <w:p>
+            <w:pPr>
+              <w:spacing w:after="160" w:line="259" w:lineRule="auto"/>
+            </w:pPr>
+            <w:r>
+              <w:t>The application displays generated driver information, including names, archetypes and statistics</w:t>
+            </w:r>
+          </w:p>
+        </w:tc>
+      </w:tr>
+      <w:tr>
+        <w:tc>
+          <w:tcPr>
+            <w:tcW w:w="0" w:type="auto"/>
+            <w:hideMark/>
+          </w:tcPr>
+          <w:p>
+            <w:pPr>
+              <w:spacing w:after="160" w:line="259" w:lineRule="auto"/>
+            </w:pPr>
+            <w:r>
+              <w:t>ST-06</w:t>
+            </w:r>
+          </w:p>
+        </w:tc>
+        <w:tc>
+          <w:tcPr>
+            <w:tcW w:w="0" w:type="auto"/>
+            <w:hideMark/>
+          </w:tcPr>
+          <w:p>
+            <w:pPr>
+              <w:spacing w:after="160" w:line="259" w:lineRule="auto"/>
+            </w:pPr>
+            <w:r>
+              <w:t>FR6 - Configure accessibility settings</w:t>
+            </w:r>
+          </w:p>
+        </w:tc>
+        <w:tc>
+          <w:tcPr>
+            <w:tcW w:w="0" w:type="auto"/>
+            <w:hideMark/>
+          </w:tcPr>
+          <w:p>
+            <w:pPr>
+              <w:spacing w:after="160" w:line="259" w:lineRule="auto"/>
+            </w:pPr>
+            <w:r>
+              <w:t>Change accessibility options through the settings menu</w:t>
+            </w:r>
+          </w:p>
+        </w:tc>
+        <w:tc>
+          <w:tcPr>
+            <w:tcW w:w="0" w:type="auto"/>
+            <w:hideMark/>
+          </w:tcPr>
+          <w:p>
+            <w:pPr>
+              <w:spacing w:after="160" w:line="259" w:lineRule="auto"/>
+            </w:pPr>
+            <w:r>
+              <w:t>Manual system test</w:t>
+            </w:r>
+          </w:p>
+        </w:tc>
+        <w:tc>
+          <w:tcPr>
+            <w:tcW w:w="0" w:type="auto"/>
+            <w:hideMark/>
+          </w:tcPr>
+          <w:p>
+            <w:pPr>
+              <w:spacing w:after="160" w:line="259" w:lineRule="auto"/>
+            </w:pPr>
+            <w:r>
+              <w:t>The selected theme and interface scaling options are saved and applied correctly</w:t>
+            </w:r>
+          </w:p>
+        </w:tc>
+      </w:tr>
+    </w:tbl>
     <w:p/>
     <w:p>
       <w:pPr>
         <w:pStyle w:val="Heading4"/>
       </w:pPr>
       <w:r>
-        <w:t>Plan</w:t>
+        <w:lastRenderedPageBreak/>
+        <w:t>Results</w:t>
+      </w:r>
+    </w:p>
+    <w:p>
+      <w:pPr>
+        <w:pStyle w:val="Heading5"/>
+      </w:pPr>
+      <w:r>
+        <w:t>Race Results</w:t>
+      </w:r>
+    </w:p>
+    <w:p>
+      <w:r>
+        <w:rPr>
+          <w:noProof/>
+        </w:rPr>
+        <w:drawing>
+          <wp:inline distT="0" distB="0" distL="0" distR="0" wp14:anchorId="74D1C107" wp14:editId="2DE720C1">
+            <wp:extent cx="5401429" cy="3124636"/>
+            <wp:effectExtent l="0" t="0" r="8890" b="0"/>
+            <wp:docPr id="1995727668" name="Picture 1"/>
+            <wp:cNvGraphicFramePr>
+              <a:graphicFrameLocks xmlns:a="http://schemas.openxmlformats.org/drawingml/2006/main" noChangeAspect="1"/>
+            </wp:cNvGraphicFramePr>
+            <a:graphic xmlns:a="http://schemas.openxmlformats.org/drawingml/2006/main">
+              <a:graphicData uri="http://schemas.openxmlformats.org/drawingml/2006/picture">
+                <pic:pic xmlns:pic="http://schemas.openxmlformats.org/drawingml/2006/picture">
+                  <pic:nvPicPr>
+                    <pic:cNvPr id="1413962715" name=""/>
+                    <pic:cNvPicPr/>
+                  </pic:nvPicPr>
+                  <pic:blipFill>
+                    <a:blip r:embed="rId41"/>
+                    <a:stretch>
+                      <a:fillRect/>
+                    </a:stretch>
+                  </pic:blipFill>
+                  <pic:spPr>
+                    <a:xfrm>
+                      <a:off x="0" y="0"/>
+                      <a:ext cx="5401429" cy="3124636"/>
+                    </a:xfrm>
+                    <a:prstGeom prst="rect">
+                      <a:avLst/>
+                    </a:prstGeom>
+                  </pic:spPr>
+                </pic:pic>
+              </a:graphicData>
+            </a:graphic>
+          </wp:inline>
+        </w:drawing>
+      </w:r>
+    </w:p>
+    <w:p>
+      <w:r>
+        <w:t>There is information for every driver.</w:t>
+      </w:r>
+    </w:p>
+    <w:p>
+      <w:pPr>
+        <w:pStyle w:val="Heading5"/>
+      </w:pPr>
+      <w:r>
+        <w:t>Race Progression</w:t>
+      </w:r>
+    </w:p>
+    <w:p>
+      <w:r>
+        <w:drawing>
+          <wp:inline distT="0" distB="0" distL="0" distR="0" wp14:anchorId="050A250F" wp14:editId="0F3F2A99">
+            <wp:extent cx="6187481" cy="3006944"/>
+            <wp:effectExtent l="0" t="0" r="3810" b="3175"/>
+            <wp:docPr id="650845095" name="Picture 1"/>
+            <wp:cNvGraphicFramePr>
+              <a:graphicFrameLocks xmlns:a="http://schemas.openxmlformats.org/drawingml/2006/main" noChangeAspect="1"/>
+            </wp:cNvGraphicFramePr>
+            <a:graphic xmlns:a="http://schemas.openxmlformats.org/drawingml/2006/main">
+              <a:graphicData uri="http://schemas.openxmlformats.org/drawingml/2006/picture">
+                <pic:pic xmlns:pic="http://schemas.openxmlformats.org/drawingml/2006/picture">
+                  <pic:nvPicPr>
+                    <pic:cNvPr id="650845095" name=""/>
+                    <pic:cNvPicPr/>
+                  </pic:nvPicPr>
+                  <pic:blipFill rotWithShape="1">
+                    <a:blip r:embed="rId46"/>
+                    <a:srcRect l="32266" t="68702" r="30473"/>
+                    <a:stretch>
+                      <a:fillRect/>
+                    </a:stretch>
+                  </pic:blipFill>
+                  <pic:spPr bwMode="auto">
+                    <a:xfrm>
+                      <a:off x="0" y="0"/>
+                      <a:ext cx="6242863" cy="3033858"/>
+                    </a:xfrm>
+                    <a:prstGeom prst="rect">
+                      <a:avLst/>
+                    </a:prstGeom>
+                    <a:ln>
+                      <a:noFill/>
+                    </a:ln>
+                    <a:extLst>
+                      <a:ext uri="{53640926-AAD7-44D8-BBD7-CCE9431645EC}">
+                        <a14:shadowObscured xmlns:a14="http://schemas.microsoft.com/office/drawing/2010/main"/>
+                      </a:ext>
+                    </a:extLst>
+                  </pic:spPr>
+                </pic:pic>
+              </a:graphicData>
+            </a:graphic>
+          </wp:inline>
+        </w:drawing>
+      </w:r>
+    </w:p>
+    <w:p>
+      <w:r>
+        <w:t>There is the current lap, whether the driver finished or not, and what their last checkpoint was.</w:t>
+      </w:r>
+    </w:p>
+    <w:p>
+      <w:pPr>
+        <w:pStyle w:val="Heading5"/>
+      </w:pPr>
+      <w:r>
+        <w:lastRenderedPageBreak/>
+        <w:t>Live Race</w:t>
+      </w:r>
+    </w:p>
+    <w:p>
+      <w:r>
+        <w:drawing>
+          <wp:inline distT="0" distB="0" distL="0" distR="0" wp14:anchorId="3FE137BB" wp14:editId="3FEF5426">
+            <wp:extent cx="6130303" cy="1726324"/>
+            <wp:effectExtent l="0" t="0" r="3810" b="7620"/>
+            <wp:docPr id="713313540" name="Picture 1"/>
+            <wp:cNvGraphicFramePr>
+              <a:graphicFrameLocks xmlns:a="http://schemas.openxmlformats.org/drawingml/2006/main" noChangeAspect="1"/>
+            </wp:cNvGraphicFramePr>
+            <a:graphic xmlns:a="http://schemas.openxmlformats.org/drawingml/2006/main">
+              <a:graphicData uri="http://schemas.openxmlformats.org/drawingml/2006/picture">
+                <pic:pic xmlns:pic="http://schemas.openxmlformats.org/drawingml/2006/picture">
+                  <pic:nvPicPr>
+                    <pic:cNvPr id="713313540" name=""/>
+                    <pic:cNvPicPr/>
+                  </pic:nvPicPr>
+                  <pic:blipFill rotWithShape="1">
+                    <a:blip r:embed="rId46"/>
+                    <a:srcRect l="11415" t="19493" r="11415" b="42945"/>
+                    <a:stretch>
+                      <a:fillRect/>
+                    </a:stretch>
+                  </pic:blipFill>
+                  <pic:spPr bwMode="auto">
+                    <a:xfrm>
+                      <a:off x="0" y="0"/>
+                      <a:ext cx="6153802" cy="1732942"/>
+                    </a:xfrm>
+                    <a:prstGeom prst="rect">
+                      <a:avLst/>
+                    </a:prstGeom>
+                    <a:ln>
+                      <a:noFill/>
+                    </a:ln>
+                    <a:extLst>
+                      <a:ext uri="{53640926-AAD7-44D8-BBD7-CCE9431645EC}">
+                        <a14:shadowObscured xmlns:a14="http://schemas.microsoft.com/office/drawing/2010/main"/>
+                      </a:ext>
+                    </a:extLst>
+                  </pic:spPr>
+                </pic:pic>
+              </a:graphicData>
+            </a:graphic>
+          </wp:inline>
+        </w:drawing>
+      </w:r>
+    </w:p>
+    <w:p>
+      <w:r>
+        <w:t>The cars move around on a circuit that the user can see.</w:t>
+      </w:r>
+    </w:p>
+    <w:p>
+      <w:pPr>
+        <w:pStyle w:val="Heading5"/>
+      </w:pPr>
+      <w:r>
+        <w:t>Race Settings</w:t>
+      </w:r>
+    </w:p>
+    <w:p>
+      <w:r>
+        <w:drawing>
+          <wp:inline distT="0" distB="0" distL="0" distR="0" wp14:anchorId="703EA664" wp14:editId="2E8239D3">
+            <wp:extent cx="2095792" cy="2248214"/>
+            <wp:effectExtent l="0" t="0" r="0" b="0"/>
+            <wp:docPr id="1090311613" name="Picture 1"/>
+            <wp:cNvGraphicFramePr>
+              <a:graphicFrameLocks xmlns:a="http://schemas.openxmlformats.org/drawingml/2006/main" noChangeAspect="1"/>
+            </wp:cNvGraphicFramePr>
+            <a:graphic xmlns:a="http://schemas.openxmlformats.org/drawingml/2006/main">
+              <a:graphicData uri="http://schemas.openxmlformats.org/drawingml/2006/picture">
+                <pic:pic xmlns:pic="http://schemas.openxmlformats.org/drawingml/2006/picture">
+                  <pic:nvPicPr>
+                    <pic:cNvPr id="1090311613" name=""/>
+                    <pic:cNvPicPr/>
+                  </pic:nvPicPr>
+                  <pic:blipFill>
+                    <a:blip r:embed="rId47"/>
+                    <a:stretch>
+                      <a:fillRect/>
+                    </a:stretch>
+                  </pic:blipFill>
+                  <pic:spPr>
+                    <a:xfrm>
+                      <a:off x="0" y="0"/>
+                      <a:ext cx="2095792" cy="2248214"/>
+                    </a:xfrm>
+                    <a:prstGeom prst="rect">
+                      <a:avLst/>
+                    </a:prstGeom>
+                  </pic:spPr>
+                </pic:pic>
+              </a:graphicData>
+            </a:graphic>
+          </wp:inline>
+        </w:drawing>
+      </w:r>
+      <w:r>
+        <w:drawing>
+          <wp:inline distT="0" distB="0" distL="0" distR="0" wp14:anchorId="7553A379" wp14:editId="24B34501">
+            <wp:extent cx="2172003" cy="2229161"/>
+            <wp:effectExtent l="0" t="0" r="0" b="0"/>
+            <wp:docPr id="466194562" name="Picture 1"/>
+            <wp:cNvGraphicFramePr>
+              <a:graphicFrameLocks xmlns:a="http://schemas.openxmlformats.org/drawingml/2006/main" noChangeAspect="1"/>
+            </wp:cNvGraphicFramePr>
+            <a:graphic xmlns:a="http://schemas.openxmlformats.org/drawingml/2006/main">
+              <a:graphicData uri="http://schemas.openxmlformats.org/drawingml/2006/picture">
+                <pic:pic xmlns:pic="http://schemas.openxmlformats.org/drawingml/2006/picture">
+                  <pic:nvPicPr>
+                    <pic:cNvPr id="466194562" name=""/>
+                    <pic:cNvPicPr/>
+                  </pic:nvPicPr>
+                  <pic:blipFill>
+                    <a:blip r:embed="rId48"/>
+                    <a:stretch>
+                      <a:fillRect/>
+                    </a:stretch>
+                  </pic:blipFill>
+                  <pic:spPr>
+                    <a:xfrm>
+                      <a:off x="0" y="0"/>
+                      <a:ext cx="2172003" cy="2229161"/>
+                    </a:xfrm>
+                    <a:prstGeom prst="rect">
+                      <a:avLst/>
+                    </a:prstGeom>
+                  </pic:spPr>
+                </pic:pic>
+              </a:graphicData>
+            </a:graphic>
+          </wp:inline>
+        </w:drawing>
+      </w:r>
+    </w:p>
+    <w:p>
+      <w:r>
+        <w:drawing>
+          <wp:inline distT="0" distB="0" distL="0" distR="0" wp14:anchorId="5E1ED623" wp14:editId="32C3A517">
+            <wp:extent cx="2081048" cy="629155"/>
+            <wp:effectExtent l="0" t="0" r="0" b="0"/>
+            <wp:docPr id="37188938" name="Picture 1"/>
+            <wp:cNvGraphicFramePr>
+              <a:graphicFrameLocks xmlns:a="http://schemas.openxmlformats.org/drawingml/2006/main" noChangeAspect="1"/>
+            </wp:cNvGraphicFramePr>
+            <a:graphic xmlns:a="http://schemas.openxmlformats.org/drawingml/2006/main">
+              <a:graphicData uri="http://schemas.openxmlformats.org/drawingml/2006/picture">
+                <pic:pic xmlns:pic="http://schemas.openxmlformats.org/drawingml/2006/picture">
+                  <pic:nvPicPr>
+                    <pic:cNvPr id="37188938" name=""/>
+                    <pic:cNvPicPr/>
+                  </pic:nvPicPr>
+                  <pic:blipFill>
+                    <a:blip r:embed="rId49"/>
+                    <a:stretch>
+                      <a:fillRect/>
+                    </a:stretch>
+                  </pic:blipFill>
+                  <pic:spPr>
+                    <a:xfrm>
+                      <a:off x="0" y="0"/>
+                      <a:ext cx="2137086" cy="646097"/>
+                    </a:xfrm>
+                    <a:prstGeom prst="rect">
+                      <a:avLst/>
+                    </a:prstGeom>
+                  </pic:spPr>
+                </pic:pic>
+              </a:graphicData>
+            </a:graphic>
+          </wp:inline>
+        </w:drawing>
+      </w:r>
+      <w:r>
+        <w:drawing>
+          <wp:inline distT="0" distB="0" distL="0" distR="0" wp14:anchorId="33DA037B" wp14:editId="2F816990">
+            <wp:extent cx="1943162" cy="616125"/>
+            <wp:effectExtent l="0" t="0" r="0" b="0"/>
+            <wp:docPr id="797008397" name="Picture 1"/>
+            <wp:cNvGraphicFramePr>
+              <a:graphicFrameLocks xmlns:a="http://schemas.openxmlformats.org/drawingml/2006/main" noChangeAspect="1"/>
+            </wp:cNvGraphicFramePr>
+            <a:graphic xmlns:a="http://schemas.openxmlformats.org/drawingml/2006/main">
+              <a:graphicData uri="http://schemas.openxmlformats.org/drawingml/2006/picture">
+                <pic:pic xmlns:pic="http://schemas.openxmlformats.org/drawingml/2006/picture">
+                  <pic:nvPicPr>
+                    <pic:cNvPr id="797008397" name=""/>
+                    <pic:cNvPicPr/>
+                  </pic:nvPicPr>
+                  <pic:blipFill>
+                    <a:blip r:embed="rId50"/>
+                    <a:stretch>
+                      <a:fillRect/>
+                    </a:stretch>
+                  </pic:blipFill>
+                  <pic:spPr>
+                    <a:xfrm>
+                      <a:off x="0" y="0"/>
+                      <a:ext cx="1977356" cy="626967"/>
+                    </a:xfrm>
+                    <a:prstGeom prst="rect">
+                      <a:avLst/>
+                    </a:prstGeom>
+                  </pic:spPr>
+                </pic:pic>
+              </a:graphicData>
+            </a:graphic>
+          </wp:inline>
+        </w:drawing>
+      </w:r>
+    </w:p>
+    <w:p>
+      <w:r>
+        <w:t xml:space="preserve">The laps set in the JSON are used for the race. </w:t>
+      </w:r>
+    </w:p>
+    <w:p>
+      <w:pPr>
+        <w:pStyle w:val="Heading5"/>
+      </w:pPr>
+      <w:r>
+        <w:lastRenderedPageBreak/>
+        <w:t>Driver Information</w:t>
+      </w:r>
+    </w:p>
+    <w:p>
+      <w:r>
+        <w:drawing>
+          <wp:inline distT="0" distB="0" distL="0" distR="0" wp14:anchorId="230AA90A" wp14:editId="6B0399C1">
+            <wp:extent cx="3791479" cy="3191320"/>
+            <wp:effectExtent l="0" t="0" r="0" b="9525"/>
+            <wp:docPr id="1996867254" name="Picture 1"/>
+            <wp:cNvGraphicFramePr>
+              <a:graphicFrameLocks xmlns:a="http://schemas.openxmlformats.org/drawingml/2006/main" noChangeAspect="1"/>
+            </wp:cNvGraphicFramePr>
+            <a:graphic xmlns:a="http://schemas.openxmlformats.org/drawingml/2006/main">
+              <a:graphicData uri="http://schemas.openxmlformats.org/drawingml/2006/picture">
+                <pic:pic xmlns:pic="http://schemas.openxmlformats.org/drawingml/2006/picture">
+                  <pic:nvPicPr>
+                    <pic:cNvPr id="1996867254" name=""/>
+                    <pic:cNvPicPr/>
+                  </pic:nvPicPr>
+                  <pic:blipFill>
+                    <a:blip r:embed="rId51"/>
+                    <a:stretch>
+                      <a:fillRect/>
+                    </a:stretch>
+                  </pic:blipFill>
+                  <pic:spPr>
+                    <a:xfrm>
+                      <a:off x="0" y="0"/>
+                      <a:ext cx="3791479" cy="3191320"/>
+                    </a:xfrm>
+                    <a:prstGeom prst="rect">
+                      <a:avLst/>
+                    </a:prstGeom>
+                  </pic:spPr>
+                </pic:pic>
+              </a:graphicData>
+            </a:graphic>
+          </wp:inline>
+        </w:drawing>
+      </w:r>
+    </w:p>
+    <w:p>
+      <w:r>
+        <w:t>Viewable in the main menu.</w:t>
+      </w:r>
+    </w:p>
+    <w:p>
+      <w:pPr>
+        <w:pStyle w:val="Heading5"/>
+      </w:pPr>
+      <w:r>
+        <w:t>Accessibility Settings</w:t>
+      </w:r>
+    </w:p>
+    <w:p>
+      <w:r>
+        <w:drawing>
+          <wp:inline distT="0" distB="0" distL="0" distR="0" wp14:anchorId="30697391" wp14:editId="58835B4A">
+            <wp:extent cx="1924319" cy="2038635"/>
+            <wp:effectExtent l="0" t="0" r="0" b="0"/>
+            <wp:docPr id="1662187474" name="Picture 1"/>
+            <wp:cNvGraphicFramePr>
+              <a:graphicFrameLocks xmlns:a="http://schemas.openxmlformats.org/drawingml/2006/main" noChangeAspect="1"/>
+            </wp:cNvGraphicFramePr>
+            <a:graphic xmlns:a="http://schemas.openxmlformats.org/drawingml/2006/main">
+              <a:graphicData uri="http://schemas.openxmlformats.org/drawingml/2006/picture">
+                <pic:pic xmlns:pic="http://schemas.openxmlformats.org/drawingml/2006/picture">
+                  <pic:nvPicPr>
+                    <pic:cNvPr id="2063892507" name=""/>
+                    <pic:cNvPicPr/>
+                  </pic:nvPicPr>
+                  <pic:blipFill>
+                    <a:blip r:embed="rId36"/>
+                    <a:stretch>
+                      <a:fillRect/>
+                    </a:stretch>
+                  </pic:blipFill>
+                  <pic:spPr>
+                    <a:xfrm>
+                      <a:off x="0" y="0"/>
+                      <a:ext cx="1924319" cy="2038635"/>
+                    </a:xfrm>
+                    <a:prstGeom prst="rect">
+                      <a:avLst/>
+                    </a:prstGeom>
+                  </pic:spPr>
+                </pic:pic>
+              </a:graphicData>
+            </a:graphic>
+          </wp:inline>
+        </w:drawing>
       </w:r>
     </w:p>
     <w:p/>
-    <w:p>
-      <w:pPr>
-        <w:pStyle w:val="Heading4"/>
-      </w:pPr>
-      <w:r>
-        <w:t>Results</w:t>
-      </w:r>
-    </w:p>
+    <w:p/>
     <w:p/>
     <w:p>
       <w:pPr>
@@ -16138,25 +17412,7 @@
           <w:szCs w:val="24"/>
           <w:highlight w:val="yellow"/>
         </w:rPr>
-        <w:t xml:space="preserve">. It may also include performance evaluations, scalability, correctness, etc. depending on the focus of the project.  </w:t>
-      </w:r>
-      <w:proofErr w:type="spellStart"/>
-      <w:r>
-        <w:rPr>
-          <w:sz w:val="24"/>
-          <w:szCs w:val="24"/>
-          <w:highlight w:val="yellow"/>
-        </w:rPr>
-        <w:t>Quantative</w:t>
-      </w:r>
-      <w:proofErr w:type="spellEnd"/>
-      <w:r>
-        <w:rPr>
-          <w:sz w:val="24"/>
-          <w:szCs w:val="24"/>
-          <w:highlight w:val="yellow"/>
-        </w:rPr>
-        <w:t xml:space="preserve"> results may be reported in tables or figures.</w:t>
+        <w:t>. It may also include performance evaluations, scalability, correctness, etc. depending on the focus of the project.  Quantative results may be reported in tables or figures.</w:t>
       </w:r>
     </w:p>
     <w:p>
@@ -16858,7 +18114,7 @@
                     </pic:cNvPicPr>
                   </pic:nvPicPr>
                   <pic:blipFill>
-                    <a:blip r:embed="rId44" cstate="print">
+                    <a:blip r:embed="rId52" cstate="print">
                       <a:extLst>
                         <a:ext uri="{28A0092B-C50C-407E-A947-70E740481C1C}">
                           <a14:useLocalDpi xmlns:a14="http://schemas.microsoft.com/office/drawing/2010/main" val="0"/>
@@ -17047,15 +18303,7 @@
     </w:p>
     <w:p>
       <w:r>
-        <w:t xml:space="preserve">Current motorsport management titles include Motorsport Manager (2016) and F1 Manager (2022–2024). These games present detailed races and authentic visuals, but their simulation depth is fundamentally limited. Driver development is linear and predetermined, making long-term play predictable. Once a player has learned the optimal strategies, the outcomes become repetitive. In contrast, Football Manager maintains </w:t>
-      </w:r>
-      <w:proofErr w:type="spellStart"/>
-      <w:r>
-        <w:t>replayability</w:t>
-      </w:r>
-      <w:proofErr w:type="spellEnd"/>
-      <w:r>
-        <w:t xml:space="preserve"> by simulating an immense global ecosystem of leagues, players, and staff, where no two careers are the same. This difference highlights the gap between motorsport management games and the broader standard of emergent sports simulations.</w:t>
+        <w:t>Current motorsport management titles include Motorsport Manager (2016) and F1 Manager (2022–2024). These games present detailed races and authentic visuals, but their simulation depth is fundamentally limited. Driver development is linear and predetermined, making long-term play predictable. Once a player has learned the optimal strategies, the outcomes become repetitive. In contrast, Football Manager maintains replayability by simulating an immense global ecosystem of leagues, players, and staff, where no two careers are the same. This difference highlights the gap between motorsport management games and the broader standard of emergent sports simulations.</w:t>
       </w:r>
     </w:p>
     <w:p>
@@ -17644,7 +18892,7 @@
                     </pic:cNvPicPr>
                   </pic:nvPicPr>
                   <pic:blipFill>
-                    <a:blip r:embed="rId45" cstate="print">
+                    <a:blip r:embed="rId53" cstate="print">
                       <a:extLst>
                         <a:ext uri="{28A0092B-C50C-407E-A947-70E740481C1C}">
                           <a14:useLocalDpi xmlns:a14="http://schemas.microsoft.com/office/drawing/2010/main" val="0"/>
@@ -19025,15 +20273,7 @@
             </w:r>
             <w:proofErr w:type="gramEnd"/>
             <w:r>
-              <w:t xml:space="preserve"> helped give a direction with use cases and priorities, </w:t>
-            </w:r>
-            <w:proofErr w:type="spellStart"/>
-            <w:r>
-              <w:t>realised</w:t>
-            </w:r>
-            <w:proofErr w:type="spellEnd"/>
-            <w:r>
-              <w:t xml:space="preserve"> initial proposal was just plain stupid, overly ambitious, and unrealistic for a college project.</w:t>
+              <w:t xml:space="preserve"> helped give a direction with use cases and priorities, realised initial proposal was just plain stupid, overly ambitious, and unrealistic for a college project.</w:t>
             </w:r>
           </w:p>
         </w:tc>
@@ -19504,15 +20744,7 @@
             </w:r>
             <w:proofErr w:type="gramEnd"/>
             <w:r>
-              <w:t xml:space="preserve"> </w:t>
-            </w:r>
-            <w:proofErr w:type="spellStart"/>
-            <w:r>
-              <w:t>behaviour</w:t>
-            </w:r>
-            <w:proofErr w:type="spellEnd"/>
-            <w:r>
-              <w:t xml:space="preserve"> for demos, but some docs still describe the old Monte Carlo approach.</w:t>
+              <w:t xml:space="preserve"> behaviour for demos, but some docs still describe the old Monte Carlo approach.</w:t>
             </w:r>
           </w:p>
           <w:p>
@@ -19648,12 +20880,12 @@
       </w:r>
     </w:p>
     <w:sectPr>
-      <w:headerReference w:type="even" r:id="rId46"/>
-      <w:headerReference w:type="default" r:id="rId47"/>
-      <w:footerReference w:type="even" r:id="rId48"/>
-      <w:footerReference w:type="default" r:id="rId49"/>
-      <w:headerReference w:type="first" r:id="rId50"/>
-      <w:footerReference w:type="first" r:id="rId51"/>
+      <w:headerReference w:type="even" r:id="rId54"/>
+      <w:headerReference w:type="default" r:id="rId55"/>
+      <w:footerReference w:type="even" r:id="rId56"/>
+      <w:footerReference w:type="default" r:id="rId57"/>
+      <w:headerReference w:type="first" r:id="rId58"/>
+      <w:footerReference w:type="first" r:id="rId59"/>
       <w:pgSz w:w="11906" w:h="16838" w:code="9"/>
       <w:pgMar w:top="1440" w:right="1440" w:bottom="1440" w:left="1440" w:header="709" w:footer="709" w:gutter="0"/>
       <w:pgNumType w:start="0"/>
@@ -25331,7 +26563,7 @@
     <b:MonthAccessed>July</b:MonthAccessed>
     <b:DayAccessed>25</b:DayAccessed>
     <b:URL>https://www.geeksforgeeks.org/software-engineering/component-based-diagram/</b:URL>
-    <b:RefOrder>12</b:RefOrder>
+    <b:RefOrder>13</b:RefOrder>
   </b:Source>
   <b:Source>
     <b:Tag>Pow25</b:Tag>
@@ -25444,6 +26676,22 @@
     <b:URL>https://pypi.org/project/pytest-qt/</b:URL>
     <b:RefOrder>8</b:RefOrder>
   </b:Source>
+  <b:Source>
+    <b:Tag>IBM26</b:Tag>
+    <b:SourceType>InternetSite</b:SourceType>
+    <b:Guid>{6214B1DE-1BE9-45C7-AE9C-8E3EA26F50CB}</b:Guid>
+    <b:Author>
+      <b:Author>
+        <b:Corporate>IBM</b:Corporate>
+      </b:Author>
+    </b:Author>
+    <b:Title>What is system testing?</b:Title>
+    <b:YearAccessed>2026</b:YearAccessed>
+    <b:MonthAccessed>July</b:MonthAccessed>
+    <b:DayAccessed>30</b:DayAccessed>
+    <b:URL>https://www.ibm.com/think/topics/system-testing</b:URL>
+    <b:RefOrder>12</b:RefOrder>
+  </b:Source>
 </b:Sources>
 </file>
 
@@ -25485,7 +26733,7 @@
 </file>
 
 <file path=customXml/itemProps4.xml><?xml version="1.0" encoding="utf-8"?>
-<ds:datastoreItem xmlns:ds="http://schemas.openxmlformats.org/officeDocument/2006/customXml" ds:itemID="{8065C84F-60DF-45F7-838A-BC8B062DA0BA}">
+<ds:datastoreItem xmlns:ds="http://schemas.openxmlformats.org/officeDocument/2006/customXml" ds:itemID="{761053B2-9B03-426D-B693-4CC6D9861216}">
   <ds:schemaRefs>
     <ds:schemaRef ds:uri="http://schemas.openxmlformats.org/officeDocument/2006/bibliography"/>
   </ds:schemaRefs>

</xml_diff>

<commit_message>
Deleted unused SQL tables
</commit_message>
<xml_diff>
--- a/docs/Technical Report Eoin Fitzsimons.docx
+++ b/docs/Technical Report Eoin Fitzsimons.docx
@@ -593,25 +593,7 @@
           <w:sz w:val="18"/>
           <w:szCs w:val="18"/>
         </w:rPr>
-        <w:t xml:space="preserve">supplied by the </w:t>
-      </w:r>
-      <w:proofErr w:type="gramStart"/>
-      <w:r>
-        <w:rPr>
-          <w:rFonts w:ascii="Verdana" w:hAnsi="Verdana"/>
-          <w:sz w:val="18"/>
-          <w:szCs w:val="18"/>
-        </w:rPr>
-        <w:t>Library</w:t>
-      </w:r>
-      <w:proofErr w:type="gramEnd"/>
-      <w:r>
-        <w:rPr>
-          <w:rFonts w:ascii="Verdana" w:hAnsi="Verdana"/>
-          <w:sz w:val="18"/>
-          <w:szCs w:val="18"/>
-        </w:rPr>
-        <w:t>.  To use other author's written or electronic work is illegal (plagiarism) and may result in disciplinary action.  Students may be required to undergo a viva (oral examination) if there is suspicion about the validity of their submitted work.</w:t>
+        <w:t>supplied by the Library.  To use other author's written or electronic work is illegal (plagiarism) and may result in disciplinary action.  Students may be required to undergo a viva (oral examination) if there is suspicion about the validity of their submitted work.</w:t>
       </w:r>
     </w:p>
     <w:p/>
@@ -1013,21 +995,7 @@
         <w:rPr>
           <w:b/>
         </w:rPr>
-        <w:t xml:space="preserve">Any project/assignment not submitted will be marked as a </w:t>
-      </w:r>
-      <w:proofErr w:type="gramStart"/>
-      <w:r>
-        <w:rPr>
-          <w:b/>
-        </w:rPr>
-        <w:t>fail</w:t>
-      </w:r>
-      <w:proofErr w:type="gramEnd"/>
-      <w:r>
-        <w:rPr>
-          <w:b/>
-        </w:rPr>
-        <w:t>.</w:t>
+        <w:t>Any project/assignment not submitted will be marked as a fail.</w:t>
       </w:r>
     </w:p>
     <w:p>
@@ -5797,13 +5765,29 @@
     </w:p>
     <w:p>
       <w:r>
-        <w:rPr>
-          <w:highlight w:val="yellow"/>
-        </w:rPr>
-        <w:t>Provide a brief overview of the structure of the document and what is addressed in each section.</w:t>
-      </w:r>
-    </w:p>
-    <w:p/>
+        <w:t>This report is structured into five main sections. Section 1 introduces the project by describing the background, aims, technology choices, and overall structure of the report.</w:t>
+      </w:r>
+    </w:p>
+    <w:p>
+      <w:r>
+        <w:t>Section 2 describes the system implementation. This includes the functional requirements, data requirements, user requirements, environmental requirements, usability requirements, system architecture, implementation details, graphical user interface, testing approach, and evaluation of the completed system.</w:t>
+      </w:r>
+    </w:p>
+    <w:p>
+      <w:r>
+        <w:t>Section 3 provides the conclusion of the project. It discusses the advantages and disadvantages of the system, the strengths of the implementation, and the limitations identified during development.</w:t>
+      </w:r>
+    </w:p>
+    <w:p>
+      <w:r>
+        <w:t>Section 4 discusses further development opportunities. This section describes possible improvements and extensions that could be implemented with additional time and resources.</w:t>
+      </w:r>
+    </w:p>
+    <w:p>
+      <w:r>
+        <w:t>Section 5 contains the references used throughout the report, while Section 6 contains supporting material including the original project proposal, reflective journals, and additional project resources.</w:t>
+      </w:r>
+    </w:p>
     <w:p>
       <w:pPr>
         <w:pStyle w:val="Heading1"/>
@@ -6395,7 +6379,13 @@
           </w:tcPr>
           <w:p>
             <w:r>
-              <w:t>A visual representation of a prefix logical race is more important than user set parameters.</w:t>
+              <w:t xml:space="preserve">A visual representation of a </w:t>
+            </w:r>
+            <w:r>
+              <w:t>predefined</w:t>
+            </w:r>
+            <w:r>
+              <w:t xml:space="preserve"> logical race is more important than user set parameters.</w:t>
             </w:r>
           </w:p>
         </w:tc>
@@ -6412,6 +6402,7 @@
           </w:tcPr>
           <w:p>
             <w:r>
+              <w:lastRenderedPageBreak/>
               <w:t>FR4</w:t>
             </w:r>
           </w:p>
@@ -6652,7 +6643,6 @@
         </w:rPr>
       </w:pPr>
       <w:r>
-        <w:lastRenderedPageBreak/>
         <w:br w:type="page"/>
       </w:r>
     </w:p>
@@ -6797,7 +6787,7 @@
         <w:rPr>
           <w:lang w:val="en-GB"/>
         </w:rPr>
-        <w:t xml:space="preserve"> takes all the events that took place within a race and presents </w:t>
+        <w:t xml:space="preserve"> takes events that took place within a race and presents </w:t>
       </w:r>
       <w:r>
         <w:rPr>
@@ -7009,7 +6999,21 @@
           <w:rFonts w:eastAsia="Times New Roman"/>
           <w:lang w:eastAsia="en-IE"/>
         </w:rPr>
-        <w:t xml:space="preserve">The system processes recorded race events and position changes. </w:t>
+        <w:t xml:space="preserve">The system processes recorded </w:t>
+      </w:r>
+      <w:r>
+        <w:rPr>
+          <w:rFonts w:eastAsia="Times New Roman"/>
+          <w:lang w:eastAsia="en-IE"/>
+        </w:rPr>
+        <w:t>telemetry data and driver states</w:t>
+      </w:r>
+      <w:r>
+        <w:rPr>
+          <w:rFonts w:eastAsia="Times New Roman"/>
+          <w:lang w:eastAsia="en-IE"/>
+        </w:rPr>
+        <w:t xml:space="preserve">. </w:t>
       </w:r>
     </w:p>
     <w:p>
@@ -9510,7 +9514,49 @@
         </w:sdtContent>
       </w:sdt>
     </w:p>
-    <w:p/>
+    <w:p>
+      <w:r>
+        <w:t>Momentum uses structured data to allow different parts of the system to communicate while keeping the simulation logic separate from the graphical interface.</w:t>
+      </w:r>
+      <w:r>
+        <w:t xml:space="preserve"> The system uses persistent JSON storage for track definition, while active simulation data is stored in memory during execution.</w:t>
+      </w:r>
+    </w:p>
+    <w:p>
+      <w:r>
+        <w:t>The primary data within the system consists of drivers, cars, tracks, race configuration, and telemetry information.</w:t>
+      </w:r>
+    </w:p>
+    <w:p>
+      <w:r>
+        <w:t>Driver data is used to represent the characteristics of each simulated driver. Each driver contains identifying information such as name, nationality, age, and racing archetype. Drivers also contain performance attributes including speed, handling, aggression, and consistency. These values influence how each driver behaves during simulation.</w:t>
+      </w:r>
+    </w:p>
+    <w:p>
+      <w:r>
+        <w:t>Car data represents the vehicle assigned to each driver. Each car is linked to one driver using a one-to-one relationship. This allows the race controller to track the performance of individual driver and car combinations throughout the race.</w:t>
+      </w:r>
+    </w:p>
+    <w:p>
+      <w:r>
+        <w:t>Track data defines the structure of the circuit used during simulation. Tracks are stored using JSON data, containing information such as the number of laps and checkpoint positions. Checkpoints are used by the simulation to determine race progress and calculate lap completion.</w:t>
+      </w:r>
+    </w:p>
+    <w:p>
+      <w:r>
+        <w:t>Telemetry data records the current state of the race while the simulation is running. This includes driver position, current lap, lap time, gap to leader, checkpoint progress, speed, tyre condition, fuel load, and race status. The telemetry system allows the user to understand the current state of the simulation rather than only viewing the final result.</w:t>
+      </w:r>
+    </w:p>
+    <w:p>
+      <w:r>
+        <w:t>Race configuration data stores user-selected settings before the simulation begins. This determines factors such as race distance and accessibility preferences.</w:t>
+      </w:r>
+    </w:p>
+    <w:p>
+      <w:r>
+        <w:t>The use of structured data allows the system to separate data storage from simulation logic. This improves maintainability and allows future development, such as additional tracks, drivers, and race features, without requiring major changes to the core system.</w:t>
+      </w:r>
+    </w:p>
     <w:p>
       <w:pPr>
         <w:pStyle w:val="Heading3"/>
@@ -9523,17 +9569,14 @@
     </w:p>
     <w:p>
       <w:r>
-        <w:t xml:space="preserve">User Requirements define how to meet the physical and cognitive needs of the intended users of </w:t>
-      </w:r>
-      <w:r>
-        <w:t>the</w:t>
-      </w:r>
-      <w:r>
-        <w:t xml:space="preserve"> application. Users should be able to comfortably and effectively use an interface to accomplish the goals that it has been designed to support.</w:t>
+        <w:t>User requirements describe the services and behaviours that users require from the system. These requirements are translated into functional requirements that define the observable behaviour the software must provide</w:t>
+      </w:r>
+      <w:r>
+        <w:t xml:space="preserve">. </w:t>
       </w:r>
       <w:sdt>
         <w:sdtPr>
-          <w:id w:val="-2042345610"/>
+          <w:id w:val="-1865120308"/>
           <w:citation/>
         </w:sdtPr>
         <w:sdtContent>
@@ -9544,7 +9587,116 @@
             <w:rPr>
               <w:lang w:val="en-GB"/>
             </w:rPr>
-            <w:instrText xml:space="preserve"> CITATION Usa15 \l 2057 </w:instrText>
+            <w:instrText xml:space="preserve"> CITATION Hir25 \l 2057 </w:instrText>
+          </w:r>
+          <w:r>
+            <w:fldChar w:fldCharType="separate"/>
+          </w:r>
+          <w:r>
+            <w:rPr>
+              <w:noProof/>
+              <w:lang w:val="en-GB"/>
+            </w:rPr>
+            <w:t>(Washizaki, 2025)</w:t>
+          </w:r>
+          <w:r>
+            <w:fldChar w:fldCharType="end"/>
+          </w:r>
+        </w:sdtContent>
+      </w:sdt>
+    </w:p>
+    <w:p>
+      <w:r>
+        <w:t>The intended users of Momentum are motorsport enthusiasts who are interested in understanding simulated race behaviour rather than directly controlling a vehicle. The system is designed to provide a clear overview of a race by presenting both visual information and numerical telemetry.</w:t>
+      </w:r>
+    </w:p>
+    <w:p>
+      <w:r>
+        <w:t>The main user requirements are:</w:t>
+      </w:r>
+    </w:p>
+    <w:p>
+      <w:r>
+        <w:t>• The user should be able to start and observe a simulated race without requiring technical knowledge of the underlying simulation.</w:t>
+      </w:r>
+    </w:p>
+    <w:p>
+      <w:r>
+        <w:t>• The user should be able to view driver information before a race begins to understand the characteristics of each participant.</w:t>
+      </w:r>
+    </w:p>
+    <w:p>
+      <w:r>
+        <w:lastRenderedPageBreak/>
+        <w:t>• The user should be able to observe live race progression through a graphical representation of the circuit.</w:t>
+      </w:r>
+    </w:p>
+    <w:p>
+      <w:r>
+        <w:t>• The user should be able to view telemetry information to understand changes occurring during the race.</w:t>
+      </w:r>
+    </w:p>
+    <w:p>
+      <w:r>
+        <w:t>• The user should be able to view the final race classification and statistics after completion.</w:t>
+      </w:r>
+    </w:p>
+    <w:p>
+      <w:r>
+        <w:t>• The user should be able to adjust accessibility settings to improve usability.</w:t>
+      </w:r>
+    </w:p>
+    <w:p>
+      <w:r>
+        <w:t>The system focuses on reducing complexity for the user by presenting the information required to understand the race in a clear and organised manner.</w:t>
+      </w:r>
+    </w:p>
+    <w:p>
+      <w:pPr>
+        <w:pStyle w:val="Heading3"/>
+      </w:pPr>
+      <w:bookmarkStart w:id="11" w:name="_Toc236031533"/>
+      <w:r>
+        <w:t>Environmental Requirements</w:t>
+      </w:r>
+      <w:bookmarkEnd w:id="11"/>
+    </w:p>
+    <w:p>
+      <w:r>
+        <w:t xml:space="preserve">Environmental requirements are represented within </w:t>
+      </w:r>
+      <w:r>
+        <w:t>IEEE Computer Society Software Engineering Body of Knowledge</w:t>
+      </w:r>
+      <w:r>
+        <w:t xml:space="preserve"> </w:t>
+      </w:r>
+      <w:r>
+        <w:t>(</w:t>
+      </w:r>
+      <w:r>
+        <w:t>SWEBOK</w:t>
+      </w:r>
+      <w:r>
+        <w:t>)</w:t>
+      </w:r>
+      <w:r>
+        <w:t xml:space="preserve"> as nonfunctional requirements, specifically technology constraints. These requirements define the hardware, software, and infrastructure conditions required for the system to operate. SWEBOK identifies constraints such as operating systems, programming languages, database engines, and computing platforms as technology constraints.</w:t>
+      </w:r>
+      <w:sdt>
+        <w:sdtPr>
+          <w:id w:val="-143123017"/>
+          <w:citation/>
+        </w:sdtPr>
+        <w:sdtContent>
+          <w:r>
+            <w:fldChar w:fldCharType="begin"/>
+          </w:r>
+          <w:r>
+            <w:rPr>
+              <w:lang w:val="en-GB"/>
+            </w:rPr>
+            <w:instrText xml:space="preserve"> CITATION Hir25 \l 2057 </w:instrText>
           </w:r>
           <w:r>
             <w:fldChar w:fldCharType="separate"/>
@@ -9561,7 +9713,7 @@
               <w:noProof/>
               <w:lang w:val="en-GB"/>
             </w:rPr>
-            <w:t>(Usability First, 2015)</w:t>
+            <w:t>(Washizaki, 2025)</w:t>
           </w:r>
           <w:r>
             <w:fldChar w:fldCharType="end"/>
@@ -9570,66 +9722,240 @@
       </w:sdt>
     </w:p>
     <w:p>
-      <w:pPr>
-        <w:pStyle w:val="Heading3"/>
-      </w:pPr>
-      <w:bookmarkStart w:id="11" w:name="_Toc236031533"/>
-      <w:r>
-        <w:t>Environmental Requirements</w:t>
-      </w:r>
-      <w:bookmarkEnd w:id="11"/>
-    </w:p>
-    <w:p>
-      <w:r>
-        <w:t>Keyboard and screen and stuff</w:t>
-      </w:r>
-    </w:p>
-    <w:p>
-      <w:pPr>
-        <w:pStyle w:val="Heading3"/>
-      </w:pPr>
-      <w:bookmarkStart w:id="12" w:name="_Toc236031534"/>
-      <w:r>
-        <w:t>Usability Requirements</w:t>
-      </w:r>
-      <w:bookmarkEnd w:id="12"/>
-    </w:p>
-    <w:p>
-      <w:r>
-        <w:t>Usability Requirements for an interface design should support the following from the perspective of its primary users:</w:t>
-      </w:r>
-    </w:p>
-    <w:p>
-      <w:pPr>
+      <w:r>
+        <w:t>The application is designed as a desktop application using Python and PyQt6. It does not require specialised hardware and can operate using standard consumer computer systems.</w:t>
+      </w:r>
+    </w:p>
+    <w:p>
+      <w:r>
+        <w:t>Minimum hardware requirements:</w:t>
+      </w:r>
+    </w:p>
+    <w:p>
+      <w:pPr>
+        <w:pStyle w:val="ListParagraph"/>
         <w:numPr>
           <w:ilvl w:val="0"/>
-          <w:numId w:val="24"/>
+          <w:numId w:val="43"/>
         </w:numPr>
       </w:pPr>
       <w:r>
-        <w:t>Efficiency of use:  goals are easy to accomplish quickly and with few or no user errors</w:t>
-      </w:r>
-    </w:p>
-    <w:p>
-      <w:pPr>
+        <w:t>Dual-core processor</w:t>
+      </w:r>
+    </w:p>
+    <w:p>
+      <w:pPr>
+        <w:pStyle w:val="ListParagraph"/>
         <w:numPr>
           <w:ilvl w:val="0"/>
-          <w:numId w:val="24"/>
+          <w:numId w:val="43"/>
         </w:numPr>
       </w:pPr>
       <w:r>
-        <w:t>Intuitiveness:  the interface is easy to learn and navigate; buttons, headings, and help/error messages are simple to understand</w:t>
-      </w:r>
-    </w:p>
-    <w:p>
-      <w:pPr>
+        <w:t>4GB RAM</w:t>
+      </w:r>
+    </w:p>
+    <w:p>
+      <w:pPr>
+        <w:pStyle w:val="ListParagraph"/>
         <w:numPr>
           <w:ilvl w:val="0"/>
-          <w:numId w:val="24"/>
+          <w:numId w:val="43"/>
         </w:numPr>
       </w:pPr>
       <w:r>
-        <w:t>Low perceived workload:  the interface appears easy to use, rather than intimidating, demanding and frustrating</w:t>
+        <w:t>500MB available storage</w:t>
+      </w:r>
+    </w:p>
+    <w:p>
+      <w:pPr>
+        <w:pStyle w:val="ListParagraph"/>
+        <w:numPr>
+          <w:ilvl w:val="0"/>
+          <w:numId w:val="43"/>
+        </w:numPr>
+      </w:pPr>
+      <w:r>
+        <w:t>Integrated graphics</w:t>
+      </w:r>
+    </w:p>
+    <w:p>
+      <w:pPr>
+        <w:pStyle w:val="ListParagraph"/>
+        <w:numPr>
+          <w:ilvl w:val="0"/>
+          <w:numId w:val="43"/>
+        </w:numPr>
+      </w:pPr>
+      <w:r>
+        <w:t>1366x768 display resolution</w:t>
+      </w:r>
+    </w:p>
+    <w:p>
+      <w:pPr>
+        <w:pStyle w:val="ListParagraph"/>
+        <w:numPr>
+          <w:ilvl w:val="0"/>
+          <w:numId w:val="43"/>
+        </w:numPr>
+      </w:pPr>
+      <w:r>
+        <w:t>Mouse</w:t>
+      </w:r>
+    </w:p>
+    <w:p>
+      <w:r>
+        <w:t>Recommended hardware requirements:</w:t>
+      </w:r>
+    </w:p>
+    <w:p>
+      <w:pPr>
+        <w:pStyle w:val="ListParagraph"/>
+        <w:numPr>
+          <w:ilvl w:val="0"/>
+          <w:numId w:val="43"/>
+        </w:numPr>
+      </w:pPr>
+      <w:r>
+        <w:t>Quad-core processor</w:t>
+      </w:r>
+    </w:p>
+    <w:p>
+      <w:pPr>
+        <w:pStyle w:val="ListParagraph"/>
+        <w:numPr>
+          <w:ilvl w:val="0"/>
+          <w:numId w:val="43"/>
+        </w:numPr>
+      </w:pPr>
+      <w:r>
+        <w:t>8GB RAM</w:t>
+      </w:r>
+    </w:p>
+    <w:p>
+      <w:pPr>
+        <w:pStyle w:val="ListParagraph"/>
+        <w:numPr>
+          <w:ilvl w:val="0"/>
+          <w:numId w:val="43"/>
+        </w:numPr>
+      </w:pPr>
+      <w:r>
+        <w:t>1GB available storage</w:t>
+      </w:r>
+    </w:p>
+    <w:p>
+      <w:pPr>
+        <w:pStyle w:val="ListParagraph"/>
+        <w:numPr>
+          <w:ilvl w:val="0"/>
+          <w:numId w:val="43"/>
+        </w:numPr>
+      </w:pPr>
+      <w:r>
+        <w:t>Integrated or basic dedicated graphics</w:t>
+      </w:r>
+    </w:p>
+    <w:p>
+      <w:pPr>
+        <w:pStyle w:val="ListParagraph"/>
+        <w:numPr>
+          <w:ilvl w:val="0"/>
+          <w:numId w:val="43"/>
+        </w:numPr>
+      </w:pPr>
+      <w:r>
+        <w:t>1920x1080 display resolution</w:t>
+      </w:r>
+    </w:p>
+    <w:p>
+      <w:pPr>
+        <w:pStyle w:val="ListParagraph"/>
+        <w:numPr>
+          <w:ilvl w:val="0"/>
+          <w:numId w:val="43"/>
+        </w:numPr>
+      </w:pPr>
+      <w:r>
+        <w:t>Mouse</w:t>
+      </w:r>
+    </w:p>
+    <w:p>
+      <w:r>
+        <w:t>Software requirements:</w:t>
+      </w:r>
+    </w:p>
+    <w:p>
+      <w:pPr>
+        <w:pStyle w:val="ListParagraph"/>
+        <w:numPr>
+          <w:ilvl w:val="0"/>
+          <w:numId w:val="46"/>
+        </w:numPr>
+      </w:pPr>
+      <w:r>
+        <w:t>Python 3.13</w:t>
+      </w:r>
+    </w:p>
+    <w:p>
+      <w:pPr>
+        <w:pStyle w:val="ListParagraph"/>
+        <w:numPr>
+          <w:ilvl w:val="0"/>
+          <w:numId w:val="46"/>
+        </w:numPr>
+      </w:pPr>
+      <w:r>
+        <w:t>PyQt6</w:t>
+      </w:r>
+    </w:p>
+    <w:p>
+      <w:pPr>
+        <w:pStyle w:val="ListParagraph"/>
+        <w:numPr>
+          <w:ilvl w:val="0"/>
+          <w:numId w:val="46"/>
+        </w:numPr>
+      </w:pPr>
+      <w:r>
+        <w:t>pytest for automated testing</w:t>
+      </w:r>
+    </w:p>
+    <w:p>
+      <w:pPr>
+        <w:pStyle w:val="ListParagraph"/>
+        <w:numPr>
+          <w:ilvl w:val="0"/>
+          <w:numId w:val="46"/>
+        </w:numPr>
+      </w:pPr>
+      <w:r>
+        <w:t>Operating system capable of running Python applications</w:t>
+      </w:r>
+    </w:p>
+    <w:p>
+      <w:pPr>
+        <w:pStyle w:val="Heading3"/>
+      </w:pPr>
+      <w:bookmarkStart w:id="12" w:name="_Toc236031534"/>
+      <w:r>
+        <w:t>Usability Requirements</w:t>
+      </w:r>
+      <w:bookmarkEnd w:id="12"/>
+    </w:p>
+    <w:p>
+      <w:pPr>
+        <w:rPr>
+          <w:sz w:val="24"/>
+          <w:szCs w:val="24"/>
+        </w:rPr>
+      </w:pPr>
+      <w:r>
+        <w:t xml:space="preserve">Usability requirements for interface design should support primary users by ensuring the interface is efficient, intuitive, and low effort to use. Users should be able to complete goals quickly with few or no errors, learn and navigate the interface easily through clear buttons, headings, and help or error </w:t>
+      </w:r>
+      <w:r>
+        <w:lastRenderedPageBreak/>
+        <w:t>messages, and experience the interface as simple and approachable rather than intimidating, demanding, or frustrating.</w:t>
       </w:r>
     </w:p>
     <w:p>
@@ -9664,6 +9990,67 @@
         </w:sdtContent>
       </w:sdt>
     </w:p>
+    <w:p>
+      <w:r>
+        <w:t>Based on these principles, Momentum has the following usability requirements:</w:t>
+      </w:r>
+    </w:p>
+    <w:p>
+      <w:pPr>
+        <w:numPr>
+          <w:ilvl w:val="0"/>
+          <w:numId w:val="42"/>
+        </w:numPr>
+      </w:pPr>
+      <w:r>
+        <w:t xml:space="preserve">The interface shall provide clear navigation between race configuration, simulation, telemetry, and results screens. </w:t>
+      </w:r>
+    </w:p>
+    <w:p>
+      <w:pPr>
+        <w:numPr>
+          <w:ilvl w:val="0"/>
+          <w:numId w:val="42"/>
+        </w:numPr>
+      </w:pPr>
+      <w:r>
+        <w:t xml:space="preserve">The user shall be able to understand race progression without requiring knowledge of the internal simulation algorithms. </w:t>
+      </w:r>
+    </w:p>
+    <w:p>
+      <w:pPr>
+        <w:numPr>
+          <w:ilvl w:val="0"/>
+          <w:numId w:val="42"/>
+        </w:numPr>
+      </w:pPr>
+      <w:r>
+        <w:t xml:space="preserve">Important race information such as current position, lap number, and driver status shall be displayed clearly. </w:t>
+      </w:r>
+    </w:p>
+    <w:p>
+      <w:pPr>
+        <w:numPr>
+          <w:ilvl w:val="0"/>
+          <w:numId w:val="42"/>
+        </w:numPr>
+      </w:pPr>
+      <w:r>
+        <w:t xml:space="preserve">Accessibility settings shall allow users to modify visual presentation options where required. </w:t>
+      </w:r>
+    </w:p>
+    <w:p>
+      <w:pPr>
+        <w:numPr>
+          <w:ilvl w:val="0"/>
+          <w:numId w:val="42"/>
+        </w:numPr>
+      </w:pPr>
+      <w:r>
+        <w:t>The application shall minimise unnecessary user interaction during simulation playback.</w:t>
+      </w:r>
+    </w:p>
+    <w:p/>
     <w:p>
       <w:pPr>
         <w:rPr>
@@ -17825,6 +18212,104 @@
                 <w:rPr>
                   <w:noProof/>
                 </w:rPr>
+                <w:t xml:space="preserve">IBM, n.d. </w:t>
+              </w:r>
+              <w:r>
+                <w:rPr>
+                  <w:i/>
+                  <w:iCs/>
+                  <w:noProof/>
+                </w:rPr>
+                <w:t xml:space="preserve">What is system testing?. </w:t>
+              </w:r>
+              <w:r>
+                <w:rPr>
+                  <w:noProof/>
+                </w:rPr>
+                <w:t xml:space="preserve">[Online] </w:t>
+              </w:r>
+              <w:r>
+                <w:rPr>
+                  <w:noProof/>
+                </w:rPr>
+                <w:br/>
+                <w:t xml:space="preserve">Available at: </w:t>
+              </w:r>
+              <w:r>
+                <w:rPr>
+                  <w:noProof/>
+                  <w:u w:val="single"/>
+                </w:rPr>
+                <w:t>https://www.ibm.com/think/topics/system-testing</w:t>
+              </w:r>
+              <w:r>
+                <w:rPr>
+                  <w:noProof/>
+                </w:rPr>
+                <w:br/>
+                <w:t>[Accessed 30 July 2026].</w:t>
+              </w:r>
+            </w:p>
+            <w:p>
+              <w:pPr>
+                <w:pStyle w:val="Bibliography"/>
+                <w:rPr>
+                  <w:noProof/>
+                </w:rPr>
+              </w:pPr>
+              <w:r>
+                <w:rPr>
+                  <w:noProof/>
+                </w:rPr>
+                <w:t xml:space="preserve">IEEE, n.d. </w:t>
+              </w:r>
+              <w:r>
+                <w:rPr>
+                  <w:i/>
+                  <w:iCs/>
+                  <w:noProof/>
+                </w:rPr>
+                <w:t xml:space="preserve">Software Requirements Specifications. </w:t>
+              </w:r>
+              <w:r>
+                <w:rPr>
+                  <w:noProof/>
+                </w:rPr>
+                <w:t xml:space="preserve">[Online] </w:t>
+              </w:r>
+              <w:r>
+                <w:rPr>
+                  <w:noProof/>
+                </w:rPr>
+                <w:br/>
+                <w:t xml:space="preserve">Available at: </w:t>
+              </w:r>
+              <w:r>
+                <w:rPr>
+                  <w:noProof/>
+                  <w:u w:val="single"/>
+                </w:rPr>
+                <w:t>https://www.computer.org/resources/software-requirements-specifications</w:t>
+              </w:r>
+              <w:r>
+                <w:rPr>
+                  <w:noProof/>
+                </w:rPr>
+                <w:br/>
+                <w:t>[Accessed 30 July 2026].</w:t>
+              </w:r>
+            </w:p>
+            <w:p>
+              <w:pPr>
+                <w:pStyle w:val="Bibliography"/>
+                <w:rPr>
+                  <w:noProof/>
+                </w:rPr>
+              </w:pPr>
+              <w:r>
+                <w:rPr>
+                  <w:noProof/>
+                </w:rPr>
                 <w:t xml:space="preserve">McGregor, J. D. &amp; Sykes, D. A., 2001. </w:t>
               </w:r>
               <w:r>
@@ -17889,6 +18374,104 @@
                 </w:rPr>
                 <w:br/>
                 <w:t>[Accessed 29 July 2026].</w:t>
+              </w:r>
+            </w:p>
+            <w:p>
+              <w:pPr>
+                <w:pStyle w:val="Bibliography"/>
+                <w:rPr>
+                  <w:noProof/>
+                </w:rPr>
+              </w:pPr>
+              <w:r>
+                <w:rPr>
+                  <w:noProof/>
+                </w:rPr>
+                <w:t xml:space="preserve">Powell, P. &amp; Smalley, I., n.d. </w:t>
+              </w:r>
+              <w:r>
+                <w:rPr>
+                  <w:i/>
+                  <w:iCs/>
+                  <w:noProof/>
+                </w:rPr>
+                <w:t xml:space="preserve">Integration testing, defined. </w:t>
+              </w:r>
+              <w:r>
+                <w:rPr>
+                  <w:noProof/>
+                </w:rPr>
+                <w:t xml:space="preserve">[Online] </w:t>
+              </w:r>
+              <w:r>
+                <w:rPr>
+                  <w:noProof/>
+                </w:rPr>
+                <w:br/>
+                <w:t xml:space="preserve">Available at: </w:t>
+              </w:r>
+              <w:r>
+                <w:rPr>
+                  <w:noProof/>
+                  <w:u w:val="single"/>
+                </w:rPr>
+                <w:t>https://www.ibm.com/think/topics/integration-testing</w:t>
+              </w:r>
+              <w:r>
+                <w:rPr>
+                  <w:noProof/>
+                </w:rPr>
+                <w:br/>
+                <w:t>[Accessed 29 July 2026].</w:t>
+              </w:r>
+            </w:p>
+            <w:p>
+              <w:pPr>
+                <w:pStyle w:val="Bibliography"/>
+                <w:rPr>
+                  <w:noProof/>
+                </w:rPr>
+              </w:pPr>
+              <w:r>
+                <w:rPr>
+                  <w:noProof/>
+                </w:rPr>
+                <w:t xml:space="preserve">pypi, 2025. </w:t>
+              </w:r>
+              <w:r>
+                <w:rPr>
+                  <w:i/>
+                  <w:iCs/>
+                  <w:noProof/>
+                </w:rPr>
+                <w:t xml:space="preserve">pytest-qt 4.5.0. </w:t>
+              </w:r>
+              <w:r>
+                <w:rPr>
+                  <w:noProof/>
+                </w:rPr>
+                <w:t xml:space="preserve">[Online] </w:t>
+              </w:r>
+              <w:r>
+                <w:rPr>
+                  <w:noProof/>
+                </w:rPr>
+                <w:br/>
+                <w:t xml:space="preserve">Available at: </w:t>
+              </w:r>
+              <w:r>
+                <w:rPr>
+                  <w:noProof/>
+                  <w:u w:val="single"/>
+                </w:rPr>
+                <w:t>https://pypi.org/project/pytest-qt/</w:t>
+              </w:r>
+              <w:r>
+                <w:rPr>
+                  <w:noProof/>
+                </w:rPr>
+                <w:br/>
+                <w:t>[Accessed 30 July 2026].</w:t>
               </w:r>
             </w:p>
             <w:p>
@@ -18000,6 +18583,7 @@
                 <w:rPr>
                   <w:noProof/>
                 </w:rPr>
+                <w:lastRenderedPageBreak/>
                 <w:t xml:space="preserve">Usability First, 2015. </w:t>
               </w:r>
               <w:r>
@@ -18039,6 +18623,34 @@
               </w:r>
             </w:p>
             <w:p>
+              <w:pPr>
+                <w:pStyle w:val="Bibliography"/>
+                <w:rPr>
+                  <w:noProof/>
+                </w:rPr>
+              </w:pPr>
+              <w:r>
+                <w:rPr>
+                  <w:noProof/>
+                </w:rPr>
+                <w:t xml:space="preserve">Washizaki, H., 2025. </w:t>
+              </w:r>
+              <w:r>
+                <w:rPr>
+                  <w:i/>
+                  <w:iCs/>
+                  <w:noProof/>
+                </w:rPr>
+                <w:t xml:space="preserve">Guide to the Software Engineering Body of Knowledge. </w:t>
+              </w:r>
+              <w:r>
+                <w:rPr>
+                  <w:noProof/>
+                </w:rPr>
+                <w:t>4.0a ed. s.l.:IEEE.</w:t>
+              </w:r>
+            </w:p>
+            <w:p>
               <w:r>
                 <w:rPr>
                   <w:b/>
@@ -18085,7 +18697,6 @@
       <w:bookmarkStart w:id="26" w:name="_Toc87019691"/>
       <w:bookmarkStart w:id="27" w:name="_Toc216196486"/>
       <w:r>
-        <w:lastRenderedPageBreak/>
         <w:t>Project Proposal</w:t>
       </w:r>
       <w:bookmarkEnd w:id="26"/>
@@ -18210,6 +18821,7 @@
         </w:numPr>
       </w:pPr>
       <w:r>
+        <w:lastRenderedPageBreak/>
         <w:t>Objectives</w:t>
       </w:r>
     </w:p>
@@ -18225,7 +18837,6 @@
     </w:p>
     <w:p>
       <w:r>
-        <w:lastRenderedPageBreak/>
         <w:t>A further objective is to offer a high degree of customisation. Players will be able to modify or generate new teams, drivers, and competitions. Procedural generation will be a cornerstone, enabling large-scale fictional ecosystems that feel authentic while avoiding licensing restrictions.</w:t>
       </w:r>
     </w:p>
@@ -18274,6 +18885,7 @@
     </w:p>
     <w:p>
       <w:r>
+        <w:lastRenderedPageBreak/>
         <w:t>This project seeks to address this gap by exploring how the thematic appeal of motorsport can be combined with the systemic depth characteristic of Football Manager. The objectives outlined in Section 1.0 will be met by designing algorithms that support persistent multi-league simulation, driver development models, and financial/strategic systems. Procedural content generation will be used to overcome licensing limitations and create a fictional but believable motorsport ecosystem.</w:t>
       </w:r>
     </w:p>
@@ -18444,15 +19056,7 @@
     </w:p>
     <w:p>
       <w:r>
-        <w:t xml:space="preserve">Momentum uses Python for both the front-end dashboards and the back-end simulation logic and database management. The system relies on NumPy for fast calculations, Pandas for handling data, and SciPy for advanced statistics. The database uses SQLite to store all the information about drivers, teams, tracks, and championships, making it easy to save and load multi-season histories. All content creation and generation </w:t>
-      </w:r>
-      <w:proofErr w:type="gramStart"/>
-      <w:r>
-        <w:t>is</w:t>
-      </w:r>
-      <w:proofErr w:type="gramEnd"/>
-      <w:r>
-        <w:t xml:space="preserve"> handled by the database management system.</w:t>
+        <w:t>Momentum uses Python for both the front-end dashboards and the back-end simulation logic and database management. The system relies on NumPy for fast calculations, Pandas for handling data, and SciPy for advanced statistics. The database uses SQLite to store all the information about drivers, teams, tracks, and championships, making it easy to save and load multi-season histories. All content creation and generation is handled by the database management system.</w:t>
       </w:r>
     </w:p>
     <w:p>
@@ -18469,23 +19073,7 @@
     </w:p>
     <w:p>
       <w:r>
-        <w:t xml:space="preserve">Race results are produced by a real-time, </w:t>
-      </w:r>
-      <w:proofErr w:type="gramStart"/>
-      <w:r>
-        <w:t>agent based</w:t>
-      </w:r>
-      <w:proofErr w:type="gramEnd"/>
-      <w:r>
-        <w:t xml:space="preserve"> engine. Each driver is modelled as an autonomous AI agent that makes decisions on every simulation tick, targeting a frame rate of about 30 ticks per second. Agents consider their attributes, car condition, tyre state, fuel, nearby rivals, team orders and track conditions when choosing actions such as attack, defend, overtake or conserve. Discipline specific rules are applied by the engine to reflect differences between single seater, rally, endurance and other formats. Randomness is retained for low probability events such as mechanical failures or </w:t>
-      </w:r>
-      <w:proofErr w:type="gramStart"/>
-      <w:r>
-        <w:t>incidents</w:t>
-      </w:r>
-      <w:proofErr w:type="gramEnd"/>
-      <w:r>
-        <w:t xml:space="preserve"> so outcomes remain unpredictable, but most race behaviour emerges from agent interactions rather than repeated sampling. Performance sensitive results are cached where appropriate to keep leaderboards and UI queries responsive.</w:t>
+        <w:t>Race results are produced by a real-time, agent based engine. Each driver is modelled as an autonomous AI agent that makes decisions on every simulation tick, targeting a frame rate of about 30 ticks per second. Agents consider their attributes, car condition, tyre state, fuel, nearby rivals, team orders and track conditions when choosing actions such as attack, defend, overtake or conserve. Discipline specific rules are applied by the engine to reflect differences between single seater, rally, endurance and other formats. Randomness is retained for low probability events such as mechanical failures or incidents so outcomes remain unpredictable, but most race behaviour emerges from agent interactions rather than repeated sampling. Performance sensitive results are cached where appropriate to keep leaderboards and UI queries responsive.</w:t>
       </w:r>
     </w:p>
     <w:p>
@@ -19727,15 +20315,7 @@
               <w:jc w:val="both"/>
             </w:pPr>
             <w:r>
-              <w:t xml:space="preserve">I started building a Python prototype for my game. I began work on </w:t>
-            </w:r>
-            <w:proofErr w:type="gramStart"/>
-            <w:r>
-              <w:t>the team</w:t>
-            </w:r>
-            <w:proofErr w:type="gramEnd"/>
-            <w:r>
-              <w:t xml:space="preserve"> management, car development, financial management, and the race weekend structure and connected them through a basic Python GUI. The current version is only a prototype. None of the systems are fully finished, and the race simulation is not yet implemented. The main goal was to test ideas and system integration before moving to a more advanced platform.</w:t>
+              <w:t>I started building a Python prototype for my game. I began work on the team management, car development, financial management, and the race weekend structure and connected them through a basic Python GUI. The current version is only a prototype. None of the systems are fully finished, and the race simulation is not yet implemented. The main goal was to test ideas and system integration before moving to a more advanced platform.</w:t>
             </w:r>
           </w:p>
         </w:tc>
@@ -20177,15 +20757,7 @@
               <w:jc w:val="both"/>
             </w:pPr>
             <w:r>
-              <w:t xml:space="preserve">Reflect on what </w:t>
-            </w:r>
-            <w:proofErr w:type="gramStart"/>
-            <w:r>
-              <w:t>has happened</w:t>
-            </w:r>
-            <w:proofErr w:type="gramEnd"/>
-            <w:r>
-              <w:t xml:space="preserve"> in your project this month?</w:t>
+              <w:t>Reflect on what has happened in your project this month?</w:t>
             </w:r>
           </w:p>
           <w:p>
@@ -20208,13 +20780,8 @@
             <w:pPr>
               <w:jc w:val="both"/>
             </w:pPr>
-            <w:proofErr w:type="gramStart"/>
-            <w:r>
-              <w:t>mostly</w:t>
-            </w:r>
-            <w:proofErr w:type="gramEnd"/>
-            <w:r>
-              <w:t xml:space="preserve"> planning stuff</w:t>
+            <w:r>
+              <w:t>mostly planning stuff</w:t>
             </w:r>
           </w:p>
         </w:tc>
@@ -20251,29 +20818,16 @@
               <w:jc w:val="both"/>
             </w:pPr>
             <w:r>
-              <w:t xml:space="preserve">Consider what that meant for your project progress.  What were your successes? What challenges </w:t>
-            </w:r>
-            <w:proofErr w:type="gramStart"/>
-            <w:r>
-              <w:t>still remain</w:t>
-            </w:r>
-            <w:proofErr w:type="gramEnd"/>
-            <w:r>
-              <w:t xml:space="preserve">? </w:t>
+              <w:t xml:space="preserve">Consider what that meant for your project progress.  What were your successes? What challenges still remain? </w:t>
             </w:r>
           </w:p>
           <w:p>
             <w:pPr>
               <w:jc w:val="both"/>
             </w:pPr>
-            <w:proofErr w:type="gramStart"/>
             <w:r>
               <w:lastRenderedPageBreak/>
-              <w:t>Certainly</w:t>
-            </w:r>
-            <w:proofErr w:type="gramEnd"/>
-            <w:r>
-              <w:t xml:space="preserve"> helped give a direction with use cases and priorities, realised initial proposal was just plain stupid, overly ambitious, and unrealistic for a college project.</w:t>
+              <w:t>Certainly helped give a direction with use cases and priorities, realised initial proposal was just plain stupid, overly ambitious, and unrealistic for a college project.</w:t>
             </w:r>
           </w:p>
         </w:tc>
@@ -20658,15 +21212,7 @@
               <w:jc w:val="both"/>
             </w:pPr>
             <w:r>
-              <w:t xml:space="preserve">Reflect on what </w:t>
-            </w:r>
-            <w:proofErr w:type="gramStart"/>
-            <w:r>
-              <w:t>has happened</w:t>
-            </w:r>
-            <w:proofErr w:type="gramEnd"/>
-            <w:r>
-              <w:t xml:space="preserve"> in your project this month?</w:t>
+              <w:t>Reflect on what has happened in your project this month?</w:t>
             </w:r>
           </w:p>
           <w:p>
@@ -20718,15 +21264,7 @@
               <w:jc w:val="both"/>
             </w:pPr>
             <w:r>
-              <w:t xml:space="preserve">Consider what that meant for your project progress.  What were your successes? What challenges </w:t>
-            </w:r>
-            <w:proofErr w:type="gramStart"/>
-            <w:r>
-              <w:t>still remain</w:t>
-            </w:r>
-            <w:proofErr w:type="gramEnd"/>
-            <w:r>
-              <w:t xml:space="preserve">? </w:t>
+              <w:t xml:space="preserve">Consider what that meant for your project progress.  What were your successes? What challenges still remain? </w:t>
             </w:r>
           </w:p>
           <w:p>
@@ -20736,15 +21274,7 @@
           </w:p>
           <w:p>
             <w:r>
-              <w:t xml:space="preserve">This change gives </w:t>
-            </w:r>
-            <w:proofErr w:type="gramStart"/>
-            <w:r>
-              <w:t>visible,</w:t>
-            </w:r>
-            <w:proofErr w:type="gramEnd"/>
-            <w:r>
-              <w:t xml:space="preserve"> behaviour for demos, but some docs still describe the old Monte Carlo approach.</w:t>
+              <w:t>This change gives visible, behaviour for demos, but some docs still describe the old Monte Carlo approach.</w:t>
             </w:r>
           </w:p>
           <w:p>
@@ -22213,6 +22743,155 @@
     </w:lvl>
   </w:abstractNum>
   <w:abstractNum w:abstractNumId="13" w15:restartNumberingAfterBreak="0">
+    <w:nsid w:val="310125E9"/>
+    <w:multiLevelType w:val="multilevel"/>
+    <w:tmpl w:val="3AE6E694"/>
+    <w:lvl w:ilvl="0">
+      <w:start w:val="1"/>
+      <w:numFmt w:val="bullet"/>
+      <w:lvlText w:val=""/>
+      <w:lvlJc w:val="left"/>
+      <w:pPr>
+        <w:tabs>
+          <w:tab w:val="num" w:pos="720"/>
+        </w:tabs>
+        <w:ind w:left="720" w:hanging="360"/>
+      </w:pPr>
+      <w:rPr>
+        <w:rFonts w:ascii="Symbol" w:hAnsi="Symbol" w:hint="default"/>
+        <w:sz w:val="20"/>
+      </w:rPr>
+    </w:lvl>
+    <w:lvl w:ilvl="1" w:tentative="1">
+      <w:start w:val="1"/>
+      <w:numFmt w:val="bullet"/>
+      <w:lvlText w:val="o"/>
+      <w:lvlJc w:val="left"/>
+      <w:pPr>
+        <w:tabs>
+          <w:tab w:val="num" w:pos="1440"/>
+        </w:tabs>
+        <w:ind w:left="1440" w:hanging="360"/>
+      </w:pPr>
+      <w:rPr>
+        <w:rFonts w:ascii="Courier New" w:hAnsi="Courier New" w:hint="default"/>
+        <w:sz w:val="20"/>
+      </w:rPr>
+    </w:lvl>
+    <w:lvl w:ilvl="2" w:tentative="1">
+      <w:start w:val="1"/>
+      <w:numFmt w:val="bullet"/>
+      <w:lvlText w:val=""/>
+      <w:lvlJc w:val="left"/>
+      <w:pPr>
+        <w:tabs>
+          <w:tab w:val="num" w:pos="2160"/>
+        </w:tabs>
+        <w:ind w:left="2160" w:hanging="360"/>
+      </w:pPr>
+      <w:rPr>
+        <w:rFonts w:ascii="Wingdings" w:hAnsi="Wingdings" w:hint="default"/>
+        <w:sz w:val="20"/>
+      </w:rPr>
+    </w:lvl>
+    <w:lvl w:ilvl="3" w:tentative="1">
+      <w:start w:val="1"/>
+      <w:numFmt w:val="bullet"/>
+      <w:lvlText w:val=""/>
+      <w:lvlJc w:val="left"/>
+      <w:pPr>
+        <w:tabs>
+          <w:tab w:val="num" w:pos="2880"/>
+        </w:tabs>
+        <w:ind w:left="2880" w:hanging="360"/>
+      </w:pPr>
+      <w:rPr>
+        <w:rFonts w:ascii="Wingdings" w:hAnsi="Wingdings" w:hint="default"/>
+        <w:sz w:val="20"/>
+      </w:rPr>
+    </w:lvl>
+    <w:lvl w:ilvl="4" w:tentative="1">
+      <w:start w:val="1"/>
+      <w:numFmt w:val="bullet"/>
+      <w:lvlText w:val=""/>
+      <w:lvlJc w:val="left"/>
+      <w:pPr>
+        <w:tabs>
+          <w:tab w:val="num" w:pos="3600"/>
+        </w:tabs>
+        <w:ind w:left="3600" w:hanging="360"/>
+      </w:pPr>
+      <w:rPr>
+        <w:rFonts w:ascii="Wingdings" w:hAnsi="Wingdings" w:hint="default"/>
+        <w:sz w:val="20"/>
+      </w:rPr>
+    </w:lvl>
+    <w:lvl w:ilvl="5" w:tentative="1">
+      <w:start w:val="1"/>
+      <w:numFmt w:val="bullet"/>
+      <w:lvlText w:val=""/>
+      <w:lvlJc w:val="left"/>
+      <w:pPr>
+        <w:tabs>
+          <w:tab w:val="num" w:pos="4320"/>
+        </w:tabs>
+        <w:ind w:left="4320" w:hanging="360"/>
+      </w:pPr>
+      <w:rPr>
+        <w:rFonts w:ascii="Wingdings" w:hAnsi="Wingdings" w:hint="default"/>
+        <w:sz w:val="20"/>
+      </w:rPr>
+    </w:lvl>
+    <w:lvl w:ilvl="6" w:tentative="1">
+      <w:start w:val="1"/>
+      <w:numFmt w:val="bullet"/>
+      <w:lvlText w:val=""/>
+      <w:lvlJc w:val="left"/>
+      <w:pPr>
+        <w:tabs>
+          <w:tab w:val="num" w:pos="5040"/>
+        </w:tabs>
+        <w:ind w:left="5040" w:hanging="360"/>
+      </w:pPr>
+      <w:rPr>
+        <w:rFonts w:ascii="Wingdings" w:hAnsi="Wingdings" w:hint="default"/>
+        <w:sz w:val="20"/>
+      </w:rPr>
+    </w:lvl>
+    <w:lvl w:ilvl="7" w:tentative="1">
+      <w:start w:val="1"/>
+      <w:numFmt w:val="bullet"/>
+      <w:lvlText w:val=""/>
+      <w:lvlJc w:val="left"/>
+      <w:pPr>
+        <w:tabs>
+          <w:tab w:val="num" w:pos="5760"/>
+        </w:tabs>
+        <w:ind w:left="5760" w:hanging="360"/>
+      </w:pPr>
+      <w:rPr>
+        <w:rFonts w:ascii="Wingdings" w:hAnsi="Wingdings" w:hint="default"/>
+        <w:sz w:val="20"/>
+      </w:rPr>
+    </w:lvl>
+    <w:lvl w:ilvl="8" w:tentative="1">
+      <w:start w:val="1"/>
+      <w:numFmt w:val="bullet"/>
+      <w:lvlText w:val=""/>
+      <w:lvlJc w:val="left"/>
+      <w:pPr>
+        <w:tabs>
+          <w:tab w:val="num" w:pos="6480"/>
+        </w:tabs>
+        <w:ind w:left="6480" w:hanging="360"/>
+      </w:pPr>
+      <w:rPr>
+        <w:rFonts w:ascii="Wingdings" w:hAnsi="Wingdings" w:hint="default"/>
+        <w:sz w:val="20"/>
+      </w:rPr>
+    </w:lvl>
+  </w:abstractNum>
+  <w:abstractNum w:abstractNumId="14" w15:restartNumberingAfterBreak="0">
     <w:nsid w:val="32C72F0D"/>
     <w:multiLevelType w:val="hybridMultilevel"/>
     <w:tmpl w:val="941207FE"/>
@@ -22325,7 +23004,7 @@
       </w:rPr>
     </w:lvl>
   </w:abstractNum>
-  <w:abstractNum w:abstractNumId="14" w15:restartNumberingAfterBreak="0">
+  <w:abstractNum w:abstractNumId="15" w15:restartNumberingAfterBreak="0">
     <w:nsid w:val="32DB29B8"/>
     <w:multiLevelType w:val="multilevel"/>
     <w:tmpl w:val="707823F6"/>
@@ -22474,7 +23153,7 @@
       </w:rPr>
     </w:lvl>
   </w:abstractNum>
-  <w:abstractNum w:abstractNumId="15" w15:restartNumberingAfterBreak="0">
+  <w:abstractNum w:abstractNumId="16" w15:restartNumberingAfterBreak="0">
     <w:nsid w:val="3416640C"/>
     <w:multiLevelType w:val="hybridMultilevel"/>
     <w:tmpl w:val="EC7AC9E0"/>
@@ -22560,7 +23239,120 @@
       </w:pPr>
     </w:lvl>
   </w:abstractNum>
-  <w:abstractNum w:abstractNumId="16" w15:restartNumberingAfterBreak="0">
+  <w:abstractNum w:abstractNumId="17" w15:restartNumberingAfterBreak="0">
+    <w:nsid w:val="39F17F83"/>
+    <w:multiLevelType w:val="hybridMultilevel"/>
+    <w:tmpl w:val="2D00D872"/>
+    <w:lvl w:ilvl="0" w:tplc="18090001">
+      <w:start w:val="1"/>
+      <w:numFmt w:val="bullet"/>
+      <w:lvlText w:val=""/>
+      <w:lvlJc w:val="left"/>
+      <w:pPr>
+        <w:ind w:left="720" w:hanging="360"/>
+      </w:pPr>
+      <w:rPr>
+        <w:rFonts w:ascii="Symbol" w:hAnsi="Symbol" w:hint="default"/>
+      </w:rPr>
+    </w:lvl>
+    <w:lvl w:ilvl="1" w:tplc="18090003" w:tentative="1">
+      <w:start w:val="1"/>
+      <w:numFmt w:val="bullet"/>
+      <w:lvlText w:val="o"/>
+      <w:lvlJc w:val="left"/>
+      <w:pPr>
+        <w:ind w:left="1440" w:hanging="360"/>
+      </w:pPr>
+      <w:rPr>
+        <w:rFonts w:ascii="Courier New" w:hAnsi="Courier New" w:cs="Courier New" w:hint="default"/>
+      </w:rPr>
+    </w:lvl>
+    <w:lvl w:ilvl="2" w:tplc="18090005" w:tentative="1">
+      <w:start w:val="1"/>
+      <w:numFmt w:val="bullet"/>
+      <w:lvlText w:val=""/>
+      <w:lvlJc w:val="left"/>
+      <w:pPr>
+        <w:ind w:left="2160" w:hanging="360"/>
+      </w:pPr>
+      <w:rPr>
+        <w:rFonts w:ascii="Wingdings" w:hAnsi="Wingdings" w:hint="default"/>
+      </w:rPr>
+    </w:lvl>
+    <w:lvl w:ilvl="3" w:tplc="18090001" w:tentative="1">
+      <w:start w:val="1"/>
+      <w:numFmt w:val="bullet"/>
+      <w:lvlText w:val=""/>
+      <w:lvlJc w:val="left"/>
+      <w:pPr>
+        <w:ind w:left="2880" w:hanging="360"/>
+      </w:pPr>
+      <w:rPr>
+        <w:rFonts w:ascii="Symbol" w:hAnsi="Symbol" w:hint="default"/>
+      </w:rPr>
+    </w:lvl>
+    <w:lvl w:ilvl="4" w:tplc="18090003" w:tentative="1">
+      <w:start w:val="1"/>
+      <w:numFmt w:val="bullet"/>
+      <w:lvlText w:val="o"/>
+      <w:lvlJc w:val="left"/>
+      <w:pPr>
+        <w:ind w:left="3600" w:hanging="360"/>
+      </w:pPr>
+      <w:rPr>
+        <w:rFonts w:ascii="Courier New" w:hAnsi="Courier New" w:cs="Courier New" w:hint="default"/>
+      </w:rPr>
+    </w:lvl>
+    <w:lvl w:ilvl="5" w:tplc="18090005" w:tentative="1">
+      <w:start w:val="1"/>
+      <w:numFmt w:val="bullet"/>
+      <w:lvlText w:val=""/>
+      <w:lvlJc w:val="left"/>
+      <w:pPr>
+        <w:ind w:left="4320" w:hanging="360"/>
+      </w:pPr>
+      <w:rPr>
+        <w:rFonts w:ascii="Wingdings" w:hAnsi="Wingdings" w:hint="default"/>
+      </w:rPr>
+    </w:lvl>
+    <w:lvl w:ilvl="6" w:tplc="18090001" w:tentative="1">
+      <w:start w:val="1"/>
+      <w:numFmt w:val="bullet"/>
+      <w:lvlText w:val=""/>
+      <w:lvlJc w:val="left"/>
+      <w:pPr>
+        <w:ind w:left="5040" w:hanging="360"/>
+      </w:pPr>
+      <w:rPr>
+        <w:rFonts w:ascii="Symbol" w:hAnsi="Symbol" w:hint="default"/>
+      </w:rPr>
+    </w:lvl>
+    <w:lvl w:ilvl="7" w:tplc="18090003" w:tentative="1">
+      <w:start w:val="1"/>
+      <w:numFmt w:val="bullet"/>
+      <w:lvlText w:val="o"/>
+      <w:lvlJc w:val="left"/>
+      <w:pPr>
+        <w:ind w:left="5760" w:hanging="360"/>
+      </w:pPr>
+      <w:rPr>
+        <w:rFonts w:ascii="Courier New" w:hAnsi="Courier New" w:cs="Courier New" w:hint="default"/>
+      </w:rPr>
+    </w:lvl>
+    <w:lvl w:ilvl="8" w:tplc="18090005" w:tentative="1">
+      <w:start w:val="1"/>
+      <w:numFmt w:val="bullet"/>
+      <w:lvlText w:val=""/>
+      <w:lvlJc w:val="left"/>
+      <w:pPr>
+        <w:ind w:left="6480" w:hanging="360"/>
+      </w:pPr>
+      <w:rPr>
+        <w:rFonts w:ascii="Wingdings" w:hAnsi="Wingdings" w:hint="default"/>
+      </w:rPr>
+    </w:lvl>
+  </w:abstractNum>
+  <w:abstractNum w:abstractNumId="18" w15:restartNumberingAfterBreak="0">
     <w:nsid w:val="3CE26087"/>
     <w:multiLevelType w:val="hybridMultilevel"/>
     <w:tmpl w:val="E0F6ED1C"/>
@@ -22646,7 +23438,7 @@
       </w:pPr>
     </w:lvl>
   </w:abstractNum>
-  <w:abstractNum w:abstractNumId="17" w15:restartNumberingAfterBreak="0">
+  <w:abstractNum w:abstractNumId="19" w15:restartNumberingAfterBreak="0">
     <w:nsid w:val="48B460ED"/>
     <w:multiLevelType w:val="multilevel"/>
     <w:tmpl w:val="7C2AF9A8"/>
@@ -22779,7 +23571,7 @@
       </w:pPr>
     </w:lvl>
   </w:abstractNum>
-  <w:abstractNum w:abstractNumId="18" w15:restartNumberingAfterBreak="0">
+  <w:abstractNum w:abstractNumId="20" w15:restartNumberingAfterBreak="0">
     <w:nsid w:val="49224F5E"/>
     <w:multiLevelType w:val="hybridMultilevel"/>
     <w:tmpl w:val="3EF25212"/>
@@ -22896,7 +23688,7 @@
       </w:pPr>
     </w:lvl>
   </w:abstractNum>
-  <w:abstractNum w:abstractNumId="19" w15:restartNumberingAfterBreak="0">
+  <w:abstractNum w:abstractNumId="21" w15:restartNumberingAfterBreak="0">
     <w:nsid w:val="4A2779C4"/>
     <w:multiLevelType w:val="multilevel"/>
     <w:tmpl w:val="5518E24A"/>
@@ -23045,7 +23837,7 @@
       </w:rPr>
     </w:lvl>
   </w:abstractNum>
-  <w:abstractNum w:abstractNumId="20" w15:restartNumberingAfterBreak="0">
+  <w:abstractNum w:abstractNumId="22" w15:restartNumberingAfterBreak="0">
     <w:nsid w:val="4D6E4153"/>
     <w:multiLevelType w:val="hybridMultilevel"/>
     <w:tmpl w:val="BDACEDB0"/>
@@ -23131,7 +23923,7 @@
       </w:pPr>
     </w:lvl>
   </w:abstractNum>
-  <w:abstractNum w:abstractNumId="21" w15:restartNumberingAfterBreak="0">
+  <w:abstractNum w:abstractNumId="23" w15:restartNumberingAfterBreak="0">
     <w:nsid w:val="4F692764"/>
     <w:multiLevelType w:val="multilevel"/>
     <w:tmpl w:val="C930DE6A"/>
@@ -23264,7 +24056,360 @@
       </w:pPr>
     </w:lvl>
   </w:abstractNum>
-  <w:abstractNum w:abstractNumId="22" w15:restartNumberingAfterBreak="0">
+  <w:abstractNum w:abstractNumId="24" w15:restartNumberingAfterBreak="0">
+    <w:nsid w:val="53407879"/>
+    <w:multiLevelType w:val="hybridMultilevel"/>
+    <w:tmpl w:val="35044D6A"/>
+    <w:lvl w:ilvl="0" w:tplc="18090001">
+      <w:start w:val="1"/>
+      <w:numFmt w:val="bullet"/>
+      <w:lvlText w:val=""/>
+      <w:lvlJc w:val="left"/>
+      <w:pPr>
+        <w:ind w:left="720" w:hanging="360"/>
+      </w:pPr>
+      <w:rPr>
+        <w:rFonts w:ascii="Symbol" w:hAnsi="Symbol" w:hint="default"/>
+      </w:rPr>
+    </w:lvl>
+    <w:lvl w:ilvl="1" w:tplc="18090003" w:tentative="1">
+      <w:start w:val="1"/>
+      <w:numFmt w:val="bullet"/>
+      <w:lvlText w:val="o"/>
+      <w:lvlJc w:val="left"/>
+      <w:pPr>
+        <w:ind w:left="1440" w:hanging="360"/>
+      </w:pPr>
+      <w:rPr>
+        <w:rFonts w:ascii="Courier New" w:hAnsi="Courier New" w:cs="Courier New" w:hint="default"/>
+      </w:rPr>
+    </w:lvl>
+    <w:lvl w:ilvl="2" w:tplc="18090005" w:tentative="1">
+      <w:start w:val="1"/>
+      <w:numFmt w:val="bullet"/>
+      <w:lvlText w:val=""/>
+      <w:lvlJc w:val="left"/>
+      <w:pPr>
+        <w:ind w:left="2160" w:hanging="360"/>
+      </w:pPr>
+      <w:rPr>
+        <w:rFonts w:ascii="Wingdings" w:hAnsi="Wingdings" w:hint="default"/>
+      </w:rPr>
+    </w:lvl>
+    <w:lvl w:ilvl="3" w:tplc="18090001" w:tentative="1">
+      <w:start w:val="1"/>
+      <w:numFmt w:val="bullet"/>
+      <w:lvlText w:val=""/>
+      <w:lvlJc w:val="left"/>
+      <w:pPr>
+        <w:ind w:left="2880" w:hanging="360"/>
+      </w:pPr>
+      <w:rPr>
+        <w:rFonts w:ascii="Symbol" w:hAnsi="Symbol" w:hint="default"/>
+      </w:rPr>
+    </w:lvl>
+    <w:lvl w:ilvl="4" w:tplc="18090003" w:tentative="1">
+      <w:start w:val="1"/>
+      <w:numFmt w:val="bullet"/>
+      <w:lvlText w:val="o"/>
+      <w:lvlJc w:val="left"/>
+      <w:pPr>
+        <w:ind w:left="3600" w:hanging="360"/>
+      </w:pPr>
+      <w:rPr>
+        <w:rFonts w:ascii="Courier New" w:hAnsi="Courier New" w:cs="Courier New" w:hint="default"/>
+      </w:rPr>
+    </w:lvl>
+    <w:lvl w:ilvl="5" w:tplc="18090005" w:tentative="1">
+      <w:start w:val="1"/>
+      <w:numFmt w:val="bullet"/>
+      <w:lvlText w:val=""/>
+      <w:lvlJc w:val="left"/>
+      <w:pPr>
+        <w:ind w:left="4320" w:hanging="360"/>
+      </w:pPr>
+      <w:rPr>
+        <w:rFonts w:ascii="Wingdings" w:hAnsi="Wingdings" w:hint="default"/>
+      </w:rPr>
+    </w:lvl>
+    <w:lvl w:ilvl="6" w:tplc="18090001" w:tentative="1">
+      <w:start w:val="1"/>
+      <w:numFmt w:val="bullet"/>
+      <w:lvlText w:val=""/>
+      <w:lvlJc w:val="left"/>
+      <w:pPr>
+        <w:ind w:left="5040" w:hanging="360"/>
+      </w:pPr>
+      <w:rPr>
+        <w:rFonts w:ascii="Symbol" w:hAnsi="Symbol" w:hint="default"/>
+      </w:rPr>
+    </w:lvl>
+    <w:lvl w:ilvl="7" w:tplc="18090003" w:tentative="1">
+      <w:start w:val="1"/>
+      <w:numFmt w:val="bullet"/>
+      <w:lvlText w:val="o"/>
+      <w:lvlJc w:val="left"/>
+      <w:pPr>
+        <w:ind w:left="5760" w:hanging="360"/>
+      </w:pPr>
+      <w:rPr>
+        <w:rFonts w:ascii="Courier New" w:hAnsi="Courier New" w:cs="Courier New" w:hint="default"/>
+      </w:rPr>
+    </w:lvl>
+    <w:lvl w:ilvl="8" w:tplc="18090005" w:tentative="1">
+      <w:start w:val="1"/>
+      <w:numFmt w:val="bullet"/>
+      <w:lvlText w:val=""/>
+      <w:lvlJc w:val="left"/>
+      <w:pPr>
+        <w:ind w:left="6480" w:hanging="360"/>
+      </w:pPr>
+      <w:rPr>
+        <w:rFonts w:ascii="Wingdings" w:hAnsi="Wingdings" w:hint="default"/>
+      </w:rPr>
+    </w:lvl>
+  </w:abstractNum>
+  <w:abstractNum w:abstractNumId="25" w15:restartNumberingAfterBreak="0">
+    <w:nsid w:val="54283B40"/>
+    <w:multiLevelType w:val="hybridMultilevel"/>
+    <w:tmpl w:val="534AA008"/>
+    <w:lvl w:ilvl="0" w:tplc="18090001">
+      <w:start w:val="1"/>
+      <w:numFmt w:val="bullet"/>
+      <w:lvlText w:val=""/>
+      <w:lvlJc w:val="left"/>
+      <w:pPr>
+        <w:ind w:left="720" w:hanging="360"/>
+      </w:pPr>
+      <w:rPr>
+        <w:rFonts w:ascii="Symbol" w:hAnsi="Symbol" w:hint="default"/>
+      </w:rPr>
+    </w:lvl>
+    <w:lvl w:ilvl="1" w:tplc="FFFFFFFF">
+      <w:start w:val="1"/>
+      <w:numFmt w:val="lowerLetter"/>
+      <w:lvlText w:val="%2."/>
+      <w:lvlJc w:val="left"/>
+      <w:pPr>
+        <w:ind w:left="1440" w:hanging="360"/>
+      </w:pPr>
+    </w:lvl>
+    <w:lvl w:ilvl="2" w:tplc="FFFFFFFF">
+      <w:numFmt w:val="bullet"/>
+      <w:lvlText w:val="•"/>
+      <w:lvlJc w:val="left"/>
+      <w:pPr>
+        <w:ind w:left="2340" w:hanging="360"/>
+      </w:pPr>
+      <w:rPr>
+        <w:rFonts w:ascii="Calibri" w:eastAsiaTheme="minorEastAsia" w:hAnsi="Calibri" w:cs="Calibri" w:hint="default"/>
+      </w:rPr>
+    </w:lvl>
+    <w:lvl w:ilvl="3" w:tplc="FFFFFFFF" w:tentative="1">
+      <w:start w:val="1"/>
+      <w:numFmt w:val="decimal"/>
+      <w:lvlText w:val="%4."/>
+      <w:lvlJc w:val="left"/>
+      <w:pPr>
+        <w:ind w:left="2880" w:hanging="360"/>
+      </w:pPr>
+    </w:lvl>
+    <w:lvl w:ilvl="4" w:tplc="FFFFFFFF" w:tentative="1">
+      <w:start w:val="1"/>
+      <w:numFmt w:val="lowerLetter"/>
+      <w:lvlText w:val="%5."/>
+      <w:lvlJc w:val="left"/>
+      <w:pPr>
+        <w:ind w:left="3600" w:hanging="360"/>
+      </w:pPr>
+    </w:lvl>
+    <w:lvl w:ilvl="5" w:tplc="FFFFFFFF" w:tentative="1">
+      <w:start w:val="1"/>
+      <w:numFmt w:val="lowerRoman"/>
+      <w:lvlText w:val="%6."/>
+      <w:lvlJc w:val="right"/>
+      <w:pPr>
+        <w:ind w:left="4320" w:hanging="180"/>
+      </w:pPr>
+    </w:lvl>
+    <w:lvl w:ilvl="6" w:tplc="FFFFFFFF" w:tentative="1">
+      <w:start w:val="1"/>
+      <w:numFmt w:val="decimal"/>
+      <w:lvlText w:val="%7."/>
+      <w:lvlJc w:val="left"/>
+      <w:pPr>
+        <w:ind w:left="5040" w:hanging="360"/>
+      </w:pPr>
+    </w:lvl>
+    <w:lvl w:ilvl="7" w:tplc="FFFFFFFF" w:tentative="1">
+      <w:start w:val="1"/>
+      <w:numFmt w:val="lowerLetter"/>
+      <w:lvlText w:val="%8."/>
+      <w:lvlJc w:val="left"/>
+      <w:pPr>
+        <w:ind w:left="5760" w:hanging="360"/>
+      </w:pPr>
+    </w:lvl>
+    <w:lvl w:ilvl="8" w:tplc="FFFFFFFF" w:tentative="1">
+      <w:start w:val="1"/>
+      <w:numFmt w:val="lowerRoman"/>
+      <w:lvlText w:val="%9."/>
+      <w:lvlJc w:val="right"/>
+      <w:pPr>
+        <w:ind w:left="6480" w:hanging="180"/>
+      </w:pPr>
+    </w:lvl>
+  </w:abstractNum>
+  <w:abstractNum w:abstractNumId="26" w15:restartNumberingAfterBreak="0">
+    <w:nsid w:val="5445182A"/>
+    <w:multiLevelType w:val="multilevel"/>
+    <w:tmpl w:val="80D60572"/>
+    <w:lvl w:ilvl="0">
+      <w:start w:val="1"/>
+      <w:numFmt w:val="bullet"/>
+      <w:lvlText w:val=""/>
+      <w:lvlJc w:val="left"/>
+      <w:pPr>
+        <w:tabs>
+          <w:tab w:val="num" w:pos="720"/>
+        </w:tabs>
+        <w:ind w:left="720" w:hanging="360"/>
+      </w:pPr>
+      <w:rPr>
+        <w:rFonts w:ascii="Symbol" w:hAnsi="Symbol" w:hint="default"/>
+        <w:sz w:val="20"/>
+      </w:rPr>
+    </w:lvl>
+    <w:lvl w:ilvl="1" w:tentative="1">
+      <w:start w:val="1"/>
+      <w:numFmt w:val="bullet"/>
+      <w:lvlText w:val="o"/>
+      <w:lvlJc w:val="left"/>
+      <w:pPr>
+        <w:tabs>
+          <w:tab w:val="num" w:pos="1440"/>
+        </w:tabs>
+        <w:ind w:left="1440" w:hanging="360"/>
+      </w:pPr>
+      <w:rPr>
+        <w:rFonts w:ascii="Courier New" w:hAnsi="Courier New" w:hint="default"/>
+        <w:sz w:val="20"/>
+      </w:rPr>
+    </w:lvl>
+    <w:lvl w:ilvl="2" w:tentative="1">
+      <w:start w:val="1"/>
+      <w:numFmt w:val="bullet"/>
+      <w:lvlText w:val=""/>
+      <w:lvlJc w:val="left"/>
+      <w:pPr>
+        <w:tabs>
+          <w:tab w:val="num" w:pos="2160"/>
+        </w:tabs>
+        <w:ind w:left="2160" w:hanging="360"/>
+      </w:pPr>
+      <w:rPr>
+        <w:rFonts w:ascii="Wingdings" w:hAnsi="Wingdings" w:hint="default"/>
+        <w:sz w:val="20"/>
+      </w:rPr>
+    </w:lvl>
+    <w:lvl w:ilvl="3" w:tentative="1">
+      <w:start w:val="1"/>
+      <w:numFmt w:val="bullet"/>
+      <w:lvlText w:val=""/>
+      <w:lvlJc w:val="left"/>
+      <w:pPr>
+        <w:tabs>
+          <w:tab w:val="num" w:pos="2880"/>
+        </w:tabs>
+        <w:ind w:left="2880" w:hanging="360"/>
+      </w:pPr>
+      <w:rPr>
+        <w:rFonts w:ascii="Wingdings" w:hAnsi="Wingdings" w:hint="default"/>
+        <w:sz w:val="20"/>
+      </w:rPr>
+    </w:lvl>
+    <w:lvl w:ilvl="4" w:tentative="1">
+      <w:start w:val="1"/>
+      <w:numFmt w:val="bullet"/>
+      <w:lvlText w:val=""/>
+      <w:lvlJc w:val="left"/>
+      <w:pPr>
+        <w:tabs>
+          <w:tab w:val="num" w:pos="3600"/>
+        </w:tabs>
+        <w:ind w:left="3600" w:hanging="360"/>
+      </w:pPr>
+      <w:rPr>
+        <w:rFonts w:ascii="Wingdings" w:hAnsi="Wingdings" w:hint="default"/>
+        <w:sz w:val="20"/>
+      </w:rPr>
+    </w:lvl>
+    <w:lvl w:ilvl="5" w:tentative="1">
+      <w:start w:val="1"/>
+      <w:numFmt w:val="bullet"/>
+      <w:lvlText w:val=""/>
+      <w:lvlJc w:val="left"/>
+      <w:pPr>
+        <w:tabs>
+          <w:tab w:val="num" w:pos="4320"/>
+        </w:tabs>
+        <w:ind w:left="4320" w:hanging="360"/>
+      </w:pPr>
+      <w:rPr>
+        <w:rFonts w:ascii="Wingdings" w:hAnsi="Wingdings" w:hint="default"/>
+        <w:sz w:val="20"/>
+      </w:rPr>
+    </w:lvl>
+    <w:lvl w:ilvl="6" w:tentative="1">
+      <w:start w:val="1"/>
+      <w:numFmt w:val="bullet"/>
+      <w:lvlText w:val=""/>
+      <w:lvlJc w:val="left"/>
+      <w:pPr>
+        <w:tabs>
+          <w:tab w:val="num" w:pos="5040"/>
+        </w:tabs>
+        <w:ind w:left="5040" w:hanging="360"/>
+      </w:pPr>
+      <w:rPr>
+        <w:rFonts w:ascii="Wingdings" w:hAnsi="Wingdings" w:hint="default"/>
+        <w:sz w:val="20"/>
+      </w:rPr>
+    </w:lvl>
+    <w:lvl w:ilvl="7" w:tentative="1">
+      <w:start w:val="1"/>
+      <w:numFmt w:val="bullet"/>
+      <w:lvlText w:val=""/>
+      <w:lvlJc w:val="left"/>
+      <w:pPr>
+        <w:tabs>
+          <w:tab w:val="num" w:pos="5760"/>
+        </w:tabs>
+        <w:ind w:left="5760" w:hanging="360"/>
+      </w:pPr>
+      <w:rPr>
+        <w:rFonts w:ascii="Wingdings" w:hAnsi="Wingdings" w:hint="default"/>
+        <w:sz w:val="20"/>
+      </w:rPr>
+    </w:lvl>
+    <w:lvl w:ilvl="8" w:tentative="1">
+      <w:start w:val="1"/>
+      <w:numFmt w:val="bullet"/>
+      <w:lvlText w:val=""/>
+      <w:lvlJc w:val="left"/>
+      <w:pPr>
+        <w:tabs>
+          <w:tab w:val="num" w:pos="6480"/>
+        </w:tabs>
+        <w:ind w:left="6480" w:hanging="360"/>
+      </w:pPr>
+      <w:rPr>
+        <w:rFonts w:ascii="Wingdings" w:hAnsi="Wingdings" w:hint="default"/>
+        <w:sz w:val="20"/>
+      </w:rPr>
+    </w:lvl>
+  </w:abstractNum>
+  <w:abstractNum w:abstractNumId="27" w15:restartNumberingAfterBreak="0">
     <w:nsid w:val="5470089E"/>
     <w:multiLevelType w:val="multilevel"/>
     <w:tmpl w:val="8EE46A0C"/>
@@ -23413,16 +24558,165 @@
       </w:rPr>
     </w:lvl>
   </w:abstractNum>
-  <w:abstractNum w:abstractNumId="23" w15:restartNumberingAfterBreak="0">
-    <w:nsid w:val="63AA42EC"/>
-    <w:multiLevelType w:val="hybridMultilevel"/>
-    <w:tmpl w:val="7802567C"/>
-    <w:lvl w:ilvl="0" w:tplc="18090001">
+  <w:abstractNum w:abstractNumId="28" w15:restartNumberingAfterBreak="0">
+    <w:nsid w:val="63922606"/>
+    <w:multiLevelType w:val="multilevel"/>
+    <w:tmpl w:val="D8225180"/>
+    <w:lvl w:ilvl="0">
       <w:start w:val="1"/>
       <w:numFmt w:val="bullet"/>
       <w:lvlText w:val=""/>
       <w:lvlJc w:val="left"/>
       <w:pPr>
+        <w:tabs>
+          <w:tab w:val="num" w:pos="720"/>
+        </w:tabs>
+        <w:ind w:left="720" w:hanging="360"/>
+      </w:pPr>
+      <w:rPr>
+        <w:rFonts w:ascii="Symbol" w:hAnsi="Symbol" w:hint="default"/>
+        <w:sz w:val="20"/>
+      </w:rPr>
+    </w:lvl>
+    <w:lvl w:ilvl="1" w:tentative="1">
+      <w:start w:val="1"/>
+      <w:numFmt w:val="bullet"/>
+      <w:lvlText w:val="o"/>
+      <w:lvlJc w:val="left"/>
+      <w:pPr>
+        <w:tabs>
+          <w:tab w:val="num" w:pos="1440"/>
+        </w:tabs>
+        <w:ind w:left="1440" w:hanging="360"/>
+      </w:pPr>
+      <w:rPr>
+        <w:rFonts w:ascii="Courier New" w:hAnsi="Courier New" w:hint="default"/>
+        <w:sz w:val="20"/>
+      </w:rPr>
+    </w:lvl>
+    <w:lvl w:ilvl="2" w:tentative="1">
+      <w:start w:val="1"/>
+      <w:numFmt w:val="bullet"/>
+      <w:lvlText w:val=""/>
+      <w:lvlJc w:val="left"/>
+      <w:pPr>
+        <w:tabs>
+          <w:tab w:val="num" w:pos="2160"/>
+        </w:tabs>
+        <w:ind w:left="2160" w:hanging="360"/>
+      </w:pPr>
+      <w:rPr>
+        <w:rFonts w:ascii="Wingdings" w:hAnsi="Wingdings" w:hint="default"/>
+        <w:sz w:val="20"/>
+      </w:rPr>
+    </w:lvl>
+    <w:lvl w:ilvl="3" w:tentative="1">
+      <w:start w:val="1"/>
+      <w:numFmt w:val="bullet"/>
+      <w:lvlText w:val=""/>
+      <w:lvlJc w:val="left"/>
+      <w:pPr>
+        <w:tabs>
+          <w:tab w:val="num" w:pos="2880"/>
+        </w:tabs>
+        <w:ind w:left="2880" w:hanging="360"/>
+      </w:pPr>
+      <w:rPr>
+        <w:rFonts w:ascii="Wingdings" w:hAnsi="Wingdings" w:hint="default"/>
+        <w:sz w:val="20"/>
+      </w:rPr>
+    </w:lvl>
+    <w:lvl w:ilvl="4" w:tentative="1">
+      <w:start w:val="1"/>
+      <w:numFmt w:val="bullet"/>
+      <w:lvlText w:val=""/>
+      <w:lvlJc w:val="left"/>
+      <w:pPr>
+        <w:tabs>
+          <w:tab w:val="num" w:pos="3600"/>
+        </w:tabs>
+        <w:ind w:left="3600" w:hanging="360"/>
+      </w:pPr>
+      <w:rPr>
+        <w:rFonts w:ascii="Wingdings" w:hAnsi="Wingdings" w:hint="default"/>
+        <w:sz w:val="20"/>
+      </w:rPr>
+    </w:lvl>
+    <w:lvl w:ilvl="5" w:tentative="1">
+      <w:start w:val="1"/>
+      <w:numFmt w:val="bullet"/>
+      <w:lvlText w:val=""/>
+      <w:lvlJc w:val="left"/>
+      <w:pPr>
+        <w:tabs>
+          <w:tab w:val="num" w:pos="4320"/>
+        </w:tabs>
+        <w:ind w:left="4320" w:hanging="360"/>
+      </w:pPr>
+      <w:rPr>
+        <w:rFonts w:ascii="Wingdings" w:hAnsi="Wingdings" w:hint="default"/>
+        <w:sz w:val="20"/>
+      </w:rPr>
+    </w:lvl>
+    <w:lvl w:ilvl="6" w:tentative="1">
+      <w:start w:val="1"/>
+      <w:numFmt w:val="bullet"/>
+      <w:lvlText w:val=""/>
+      <w:lvlJc w:val="left"/>
+      <w:pPr>
+        <w:tabs>
+          <w:tab w:val="num" w:pos="5040"/>
+        </w:tabs>
+        <w:ind w:left="5040" w:hanging="360"/>
+      </w:pPr>
+      <w:rPr>
+        <w:rFonts w:ascii="Wingdings" w:hAnsi="Wingdings" w:hint="default"/>
+        <w:sz w:val="20"/>
+      </w:rPr>
+    </w:lvl>
+    <w:lvl w:ilvl="7" w:tentative="1">
+      <w:start w:val="1"/>
+      <w:numFmt w:val="bullet"/>
+      <w:lvlText w:val=""/>
+      <w:lvlJc w:val="left"/>
+      <w:pPr>
+        <w:tabs>
+          <w:tab w:val="num" w:pos="5760"/>
+        </w:tabs>
+        <w:ind w:left="5760" w:hanging="360"/>
+      </w:pPr>
+      <w:rPr>
+        <w:rFonts w:ascii="Wingdings" w:hAnsi="Wingdings" w:hint="default"/>
+        <w:sz w:val="20"/>
+      </w:rPr>
+    </w:lvl>
+    <w:lvl w:ilvl="8" w:tentative="1">
+      <w:start w:val="1"/>
+      <w:numFmt w:val="bullet"/>
+      <w:lvlText w:val=""/>
+      <w:lvlJc w:val="left"/>
+      <w:pPr>
+        <w:tabs>
+          <w:tab w:val="num" w:pos="6480"/>
+        </w:tabs>
+        <w:ind w:left="6480" w:hanging="360"/>
+      </w:pPr>
+      <w:rPr>
+        <w:rFonts w:ascii="Wingdings" w:hAnsi="Wingdings" w:hint="default"/>
+        <w:sz w:val="20"/>
+      </w:rPr>
+    </w:lvl>
+  </w:abstractNum>
+  <w:abstractNum w:abstractNumId="29" w15:restartNumberingAfterBreak="0">
+    <w:nsid w:val="63AA42EC"/>
+    <w:multiLevelType w:val="hybridMultilevel"/>
+    <w:tmpl w:val="0B3C82B6"/>
+    <w:lvl w:ilvl="0" w:tplc="18090001">
+      <w:start w:val="1"/>
+      <w:numFmt w:val="bullet"/>
+      <w:lvlText w:val=""/>
+      <w:lvlJc w:val="left"/>
+      <w:pPr>
         <w:ind w:left="720" w:hanging="360"/>
       </w:pPr>
       <w:rPr>
@@ -23526,7 +24820,156 @@
       </w:rPr>
     </w:lvl>
   </w:abstractNum>
-  <w:abstractNum w:abstractNumId="24" w15:restartNumberingAfterBreak="0">
+  <w:abstractNum w:abstractNumId="30" w15:restartNumberingAfterBreak="0">
+    <w:nsid w:val="65385E90"/>
+    <w:multiLevelType w:val="multilevel"/>
+    <w:tmpl w:val="1DA46506"/>
+    <w:lvl w:ilvl="0">
+      <w:start w:val="1"/>
+      <w:numFmt w:val="bullet"/>
+      <w:lvlText w:val=""/>
+      <w:lvlJc w:val="left"/>
+      <w:pPr>
+        <w:tabs>
+          <w:tab w:val="num" w:pos="720"/>
+        </w:tabs>
+        <w:ind w:left="720" w:hanging="360"/>
+      </w:pPr>
+      <w:rPr>
+        <w:rFonts w:ascii="Symbol" w:hAnsi="Symbol" w:hint="default"/>
+        <w:sz w:val="20"/>
+      </w:rPr>
+    </w:lvl>
+    <w:lvl w:ilvl="1" w:tentative="1">
+      <w:start w:val="1"/>
+      <w:numFmt w:val="bullet"/>
+      <w:lvlText w:val="o"/>
+      <w:lvlJc w:val="left"/>
+      <w:pPr>
+        <w:tabs>
+          <w:tab w:val="num" w:pos="1440"/>
+        </w:tabs>
+        <w:ind w:left="1440" w:hanging="360"/>
+      </w:pPr>
+      <w:rPr>
+        <w:rFonts w:ascii="Courier New" w:hAnsi="Courier New" w:hint="default"/>
+        <w:sz w:val="20"/>
+      </w:rPr>
+    </w:lvl>
+    <w:lvl w:ilvl="2" w:tentative="1">
+      <w:start w:val="1"/>
+      <w:numFmt w:val="bullet"/>
+      <w:lvlText w:val=""/>
+      <w:lvlJc w:val="left"/>
+      <w:pPr>
+        <w:tabs>
+          <w:tab w:val="num" w:pos="2160"/>
+        </w:tabs>
+        <w:ind w:left="2160" w:hanging="360"/>
+      </w:pPr>
+      <w:rPr>
+        <w:rFonts w:ascii="Wingdings" w:hAnsi="Wingdings" w:hint="default"/>
+        <w:sz w:val="20"/>
+      </w:rPr>
+    </w:lvl>
+    <w:lvl w:ilvl="3" w:tentative="1">
+      <w:start w:val="1"/>
+      <w:numFmt w:val="bullet"/>
+      <w:lvlText w:val=""/>
+      <w:lvlJc w:val="left"/>
+      <w:pPr>
+        <w:tabs>
+          <w:tab w:val="num" w:pos="2880"/>
+        </w:tabs>
+        <w:ind w:left="2880" w:hanging="360"/>
+      </w:pPr>
+      <w:rPr>
+        <w:rFonts w:ascii="Wingdings" w:hAnsi="Wingdings" w:hint="default"/>
+        <w:sz w:val="20"/>
+      </w:rPr>
+    </w:lvl>
+    <w:lvl w:ilvl="4" w:tentative="1">
+      <w:start w:val="1"/>
+      <w:numFmt w:val="bullet"/>
+      <w:lvlText w:val=""/>
+      <w:lvlJc w:val="left"/>
+      <w:pPr>
+        <w:tabs>
+          <w:tab w:val="num" w:pos="3600"/>
+        </w:tabs>
+        <w:ind w:left="3600" w:hanging="360"/>
+      </w:pPr>
+      <w:rPr>
+        <w:rFonts w:ascii="Wingdings" w:hAnsi="Wingdings" w:hint="default"/>
+        <w:sz w:val="20"/>
+      </w:rPr>
+    </w:lvl>
+    <w:lvl w:ilvl="5" w:tentative="1">
+      <w:start w:val="1"/>
+      <w:numFmt w:val="bullet"/>
+      <w:lvlText w:val=""/>
+      <w:lvlJc w:val="left"/>
+      <w:pPr>
+        <w:tabs>
+          <w:tab w:val="num" w:pos="4320"/>
+        </w:tabs>
+        <w:ind w:left="4320" w:hanging="360"/>
+      </w:pPr>
+      <w:rPr>
+        <w:rFonts w:ascii="Wingdings" w:hAnsi="Wingdings" w:hint="default"/>
+        <w:sz w:val="20"/>
+      </w:rPr>
+    </w:lvl>
+    <w:lvl w:ilvl="6" w:tentative="1">
+      <w:start w:val="1"/>
+      <w:numFmt w:val="bullet"/>
+      <w:lvlText w:val=""/>
+      <w:lvlJc w:val="left"/>
+      <w:pPr>
+        <w:tabs>
+          <w:tab w:val="num" w:pos="5040"/>
+        </w:tabs>
+        <w:ind w:left="5040" w:hanging="360"/>
+      </w:pPr>
+      <w:rPr>
+        <w:rFonts w:ascii="Wingdings" w:hAnsi="Wingdings" w:hint="default"/>
+        <w:sz w:val="20"/>
+      </w:rPr>
+    </w:lvl>
+    <w:lvl w:ilvl="7" w:tentative="1">
+      <w:start w:val="1"/>
+      <w:numFmt w:val="bullet"/>
+      <w:lvlText w:val=""/>
+      <w:lvlJc w:val="left"/>
+      <w:pPr>
+        <w:tabs>
+          <w:tab w:val="num" w:pos="5760"/>
+        </w:tabs>
+        <w:ind w:left="5760" w:hanging="360"/>
+      </w:pPr>
+      <w:rPr>
+        <w:rFonts w:ascii="Wingdings" w:hAnsi="Wingdings" w:hint="default"/>
+        <w:sz w:val="20"/>
+      </w:rPr>
+    </w:lvl>
+    <w:lvl w:ilvl="8" w:tentative="1">
+      <w:start w:val="1"/>
+      <w:numFmt w:val="bullet"/>
+      <w:lvlText w:val=""/>
+      <w:lvlJc w:val="left"/>
+      <w:pPr>
+        <w:tabs>
+          <w:tab w:val="num" w:pos="6480"/>
+        </w:tabs>
+        <w:ind w:left="6480" w:hanging="360"/>
+      </w:pPr>
+      <w:rPr>
+        <w:rFonts w:ascii="Wingdings" w:hAnsi="Wingdings" w:hint="default"/>
+        <w:sz w:val="20"/>
+      </w:rPr>
+    </w:lvl>
+  </w:abstractNum>
+  <w:abstractNum w:abstractNumId="31" w15:restartNumberingAfterBreak="0">
     <w:nsid w:val="66C279BB"/>
     <w:multiLevelType w:val="hybridMultilevel"/>
     <w:tmpl w:val="B234F54E"/>
@@ -23612,10 +25055,123 @@
       </w:pPr>
     </w:lvl>
   </w:abstractNum>
-  <w:abstractNum w:abstractNumId="25" w15:restartNumberingAfterBreak="0">
+  <w:abstractNum w:abstractNumId="32" w15:restartNumberingAfterBreak="0">
+    <w:nsid w:val="67D05E22"/>
+    <w:multiLevelType w:val="hybridMultilevel"/>
+    <w:tmpl w:val="FB186C84"/>
+    <w:lvl w:ilvl="0" w:tplc="18090001">
+      <w:start w:val="1"/>
+      <w:numFmt w:val="bullet"/>
+      <w:lvlText w:val=""/>
+      <w:lvlJc w:val="left"/>
+      <w:pPr>
+        <w:ind w:left="720" w:hanging="360"/>
+      </w:pPr>
+      <w:rPr>
+        <w:rFonts w:ascii="Symbol" w:hAnsi="Symbol" w:hint="default"/>
+      </w:rPr>
+    </w:lvl>
+    <w:lvl w:ilvl="1" w:tplc="18090003" w:tentative="1">
+      <w:start w:val="1"/>
+      <w:numFmt w:val="bullet"/>
+      <w:lvlText w:val="o"/>
+      <w:lvlJc w:val="left"/>
+      <w:pPr>
+        <w:ind w:left="1440" w:hanging="360"/>
+      </w:pPr>
+      <w:rPr>
+        <w:rFonts w:ascii="Courier New" w:hAnsi="Courier New" w:cs="Courier New" w:hint="default"/>
+      </w:rPr>
+    </w:lvl>
+    <w:lvl w:ilvl="2" w:tplc="18090005" w:tentative="1">
+      <w:start w:val="1"/>
+      <w:numFmt w:val="bullet"/>
+      <w:lvlText w:val=""/>
+      <w:lvlJc w:val="left"/>
+      <w:pPr>
+        <w:ind w:left="2160" w:hanging="360"/>
+      </w:pPr>
+      <w:rPr>
+        <w:rFonts w:ascii="Wingdings" w:hAnsi="Wingdings" w:hint="default"/>
+      </w:rPr>
+    </w:lvl>
+    <w:lvl w:ilvl="3" w:tplc="18090001" w:tentative="1">
+      <w:start w:val="1"/>
+      <w:numFmt w:val="bullet"/>
+      <w:lvlText w:val=""/>
+      <w:lvlJc w:val="left"/>
+      <w:pPr>
+        <w:ind w:left="2880" w:hanging="360"/>
+      </w:pPr>
+      <w:rPr>
+        <w:rFonts w:ascii="Symbol" w:hAnsi="Symbol" w:hint="default"/>
+      </w:rPr>
+    </w:lvl>
+    <w:lvl w:ilvl="4" w:tplc="18090003" w:tentative="1">
+      <w:start w:val="1"/>
+      <w:numFmt w:val="bullet"/>
+      <w:lvlText w:val="o"/>
+      <w:lvlJc w:val="left"/>
+      <w:pPr>
+        <w:ind w:left="3600" w:hanging="360"/>
+      </w:pPr>
+      <w:rPr>
+        <w:rFonts w:ascii="Courier New" w:hAnsi="Courier New" w:cs="Courier New" w:hint="default"/>
+      </w:rPr>
+    </w:lvl>
+    <w:lvl w:ilvl="5" w:tplc="18090005" w:tentative="1">
+      <w:start w:val="1"/>
+      <w:numFmt w:val="bullet"/>
+      <w:lvlText w:val=""/>
+      <w:lvlJc w:val="left"/>
+      <w:pPr>
+        <w:ind w:left="4320" w:hanging="360"/>
+      </w:pPr>
+      <w:rPr>
+        <w:rFonts w:ascii="Wingdings" w:hAnsi="Wingdings" w:hint="default"/>
+      </w:rPr>
+    </w:lvl>
+    <w:lvl w:ilvl="6" w:tplc="18090001" w:tentative="1">
+      <w:start w:val="1"/>
+      <w:numFmt w:val="bullet"/>
+      <w:lvlText w:val=""/>
+      <w:lvlJc w:val="left"/>
+      <w:pPr>
+        <w:ind w:left="5040" w:hanging="360"/>
+      </w:pPr>
+      <w:rPr>
+        <w:rFonts w:ascii="Symbol" w:hAnsi="Symbol" w:hint="default"/>
+      </w:rPr>
+    </w:lvl>
+    <w:lvl w:ilvl="7" w:tplc="18090003" w:tentative="1">
+      <w:start w:val="1"/>
+      <w:numFmt w:val="bullet"/>
+      <w:lvlText w:val="o"/>
+      <w:lvlJc w:val="left"/>
+      <w:pPr>
+        <w:ind w:left="5760" w:hanging="360"/>
+      </w:pPr>
+      <w:rPr>
+        <w:rFonts w:ascii="Courier New" w:hAnsi="Courier New" w:cs="Courier New" w:hint="default"/>
+      </w:rPr>
+    </w:lvl>
+    <w:lvl w:ilvl="8" w:tplc="18090005" w:tentative="1">
+      <w:start w:val="1"/>
+      <w:numFmt w:val="bullet"/>
+      <w:lvlText w:val=""/>
+      <w:lvlJc w:val="left"/>
+      <w:pPr>
+        <w:ind w:left="6480" w:hanging="360"/>
+      </w:pPr>
+      <w:rPr>
+        <w:rFonts w:ascii="Wingdings" w:hAnsi="Wingdings" w:hint="default"/>
+      </w:rPr>
+    </w:lvl>
+  </w:abstractNum>
+  <w:abstractNum w:abstractNumId="33" w15:restartNumberingAfterBreak="0">
     <w:nsid w:val="68A009D5"/>
     <w:multiLevelType w:val="hybridMultilevel"/>
-    <w:tmpl w:val="84D20734"/>
+    <w:tmpl w:val="EC28536E"/>
     <w:lvl w:ilvl="0" w:tplc="1809000F">
       <w:start w:val="1"/>
       <w:numFmt w:val="decimal"/>
@@ -23637,14 +25193,16 @@
         <w:ind w:left="1440" w:hanging="360"/>
       </w:pPr>
     </w:lvl>
-    <w:lvl w:ilvl="2" w:tplc="1809001B" w:tentative="1">
-      <w:start w:val="1"/>
-      <w:numFmt w:val="lowerRoman"/>
-      <w:lvlText w:val="%3."/>
-      <w:lvlJc w:val="right"/>
-      <w:pPr>
-        <w:ind w:left="2160" w:hanging="180"/>
-      </w:pPr>
+    <w:lvl w:ilvl="2" w:tplc="0AD04B28">
+      <w:numFmt w:val="bullet"/>
+      <w:lvlText w:val="•"/>
+      <w:lvlJc w:val="left"/>
+      <w:pPr>
+        <w:ind w:left="2340" w:hanging="360"/>
+      </w:pPr>
+      <w:rPr>
+        <w:rFonts w:ascii="Calibri" w:eastAsiaTheme="minorEastAsia" w:hAnsi="Calibri" w:cs="Calibri" w:hint="default"/>
+      </w:rPr>
     </w:lvl>
     <w:lvl w:ilvl="3" w:tplc="1809000F" w:tentative="1">
       <w:start w:val="1"/>
@@ -23701,7 +25259,7 @@
       </w:pPr>
     </w:lvl>
   </w:abstractNum>
-  <w:abstractNum w:abstractNumId="26" w15:restartNumberingAfterBreak="0">
+  <w:abstractNum w:abstractNumId="34" w15:restartNumberingAfterBreak="0">
     <w:nsid w:val="6C925FD8"/>
     <w:multiLevelType w:val="hybridMultilevel"/>
     <w:tmpl w:val="3DD6CFB2"/>
@@ -23787,7 +25345,7 @@
       </w:pPr>
     </w:lvl>
   </w:abstractNum>
-  <w:abstractNum w:abstractNumId="27" w15:restartNumberingAfterBreak="0">
+  <w:abstractNum w:abstractNumId="35" w15:restartNumberingAfterBreak="0">
     <w:nsid w:val="7BDA386A"/>
     <w:multiLevelType w:val="hybridMultilevel"/>
     <w:tmpl w:val="C7A4887E"/>
@@ -23901,19 +25459,19 @@
     </w:lvl>
   </w:abstractNum>
   <w:num w:numId="1" w16cid:durableId="1979412930">
-    <w:abstractNumId w:val="18"/>
+    <w:abstractNumId w:val="20"/>
   </w:num>
   <w:num w:numId="2" w16cid:durableId="634263790">
     <w:abstractNumId w:val="6"/>
   </w:num>
   <w:num w:numId="3" w16cid:durableId="1395543426">
-    <w:abstractNumId w:val="13"/>
+    <w:abstractNumId w:val="14"/>
   </w:num>
   <w:num w:numId="4" w16cid:durableId="1315724028">
-    <w:abstractNumId w:val="16"/>
+    <w:abstractNumId w:val="18"/>
   </w:num>
   <w:num w:numId="5" w16cid:durableId="1319530745">
-    <w:abstractNumId w:val="20"/>
+    <w:abstractNumId w:val="22"/>
   </w:num>
   <w:num w:numId="6" w16cid:durableId="174268885">
     <w:abstractNumId w:val="4"/>
@@ -23943,7 +25501,7 @@
     <w:abstractNumId w:val="5"/>
   </w:num>
   <w:num w:numId="15" w16cid:durableId="15618285">
-    <w:abstractNumId w:val="27"/>
+    <w:abstractNumId w:val="35"/>
   </w:num>
   <w:num w:numId="16" w16cid:durableId="216287957">
     <w:abstractNumId w:val="2"/>
@@ -23952,25 +25510,25 @@
     <w:abstractNumId w:val="0"/>
   </w:num>
   <w:num w:numId="18" w16cid:durableId="752973630">
-    <w:abstractNumId w:val="23"/>
+    <w:abstractNumId w:val="29"/>
   </w:num>
   <w:num w:numId="19" w16cid:durableId="1919554416">
-    <w:abstractNumId w:val="24"/>
+    <w:abstractNumId w:val="31"/>
   </w:num>
   <w:num w:numId="20" w16cid:durableId="1763603534">
-    <w:abstractNumId w:val="15"/>
+    <w:abstractNumId w:val="16"/>
   </w:num>
   <w:num w:numId="21" w16cid:durableId="1105883196">
     <w:abstractNumId w:val="12"/>
   </w:num>
   <w:num w:numId="22" w16cid:durableId="1081488339">
-    <w:abstractNumId w:val="26"/>
+    <w:abstractNumId w:val="34"/>
   </w:num>
   <w:num w:numId="23" w16cid:durableId="1783986655">
-    <w:abstractNumId w:val="25"/>
+    <w:abstractNumId w:val="33"/>
   </w:num>
   <w:num w:numId="24" w16cid:durableId="1650936525">
-    <w:abstractNumId w:val="22"/>
+    <w:abstractNumId w:val="27"/>
   </w:num>
   <w:num w:numId="25" w16cid:durableId="1766457783">
     <w:abstractNumId w:val="6"/>
@@ -24003,16 +25561,40 @@
     <w:abstractNumId w:val="6"/>
   </w:num>
   <w:num w:numId="35" w16cid:durableId="1794395859">
+    <w:abstractNumId w:val="19"/>
+  </w:num>
+  <w:num w:numId="36" w16cid:durableId="2134782294">
+    <w:abstractNumId w:val="23"/>
+  </w:num>
+  <w:num w:numId="37" w16cid:durableId="1993095279">
+    <w:abstractNumId w:val="15"/>
+  </w:num>
+  <w:num w:numId="38" w16cid:durableId="2051103382">
+    <w:abstractNumId w:val="21"/>
+  </w:num>
+  <w:num w:numId="39" w16cid:durableId="2120181144">
+    <w:abstractNumId w:val="28"/>
+  </w:num>
+  <w:num w:numId="40" w16cid:durableId="694039534">
+    <w:abstractNumId w:val="13"/>
+  </w:num>
+  <w:num w:numId="41" w16cid:durableId="160202146">
+    <w:abstractNumId w:val="30"/>
+  </w:num>
+  <w:num w:numId="42" w16cid:durableId="857619713">
+    <w:abstractNumId w:val="26"/>
+  </w:num>
+  <w:num w:numId="43" w16cid:durableId="1291664462">
+    <w:abstractNumId w:val="25"/>
+  </w:num>
+  <w:num w:numId="44" w16cid:durableId="772360081">
+    <w:abstractNumId w:val="24"/>
+  </w:num>
+  <w:num w:numId="45" w16cid:durableId="552959225">
     <w:abstractNumId w:val="17"/>
   </w:num>
-  <w:num w:numId="36" w16cid:durableId="2134782294">
-    <w:abstractNumId w:val="21"/>
-  </w:num>
-  <w:num w:numId="37" w16cid:durableId="1993095279">
-    <w:abstractNumId w:val="14"/>
-  </w:num>
-  <w:num w:numId="38" w16cid:durableId="2051103382">
-    <w:abstractNumId w:val="19"/>
+  <w:num w:numId="46" w16cid:durableId="1878351180">
+    <w:abstractNumId w:val="32"/>
   </w:num>
   <w:numIdMacAtCleanup w:val="24"/>
 </w:numbering>
@@ -26513,7 +28095,7 @@
     <b:MonthAccessed>July</b:MonthAccessed>
     <b:DayAccessed>22</b:DayAccessed>
     <b:URL>https://www.formula1.com/en/latest/article/f1-glossary-p-t.GBhLQtpeu9b8LrK5VM0F1</b:URL>
-    <b:RefOrder>5</b:RefOrder>
+    <b:RefOrder>6</b:RefOrder>
   </b:Source>
   <b:Source>
     <b:Tag>QtG26</b:Tag>
@@ -26530,7 +28112,7 @@
     <b:MonthAccessed>July</b:MonthAccessed>
     <b:DayAccessed>24</b:DayAccessed>
     <b:URL>https://doc.qt.io/qt-6/qhboxlayout.html</b:URL>
-    <b:RefOrder>6</b:RefOrder>
+    <b:RefOrder>7</b:RefOrder>
   </b:Source>
   <b:Source>
     <b:Tag>C4M26</b:Tag>
@@ -26546,7 +28128,7 @@
     <b:MonthAccessed>July</b:MonthAccessed>
     <b:DayAccessed>25</b:DayAccessed>
     <b:URL>https://c4model.com/diagrams/container</b:URL>
-    <b:RefOrder>4</b:RefOrder>
+    <b:RefOrder>5</b:RefOrder>
   </b:Source>
   <b:Source>
     <b:Tag>Gee26</b:Tag>
@@ -26563,7 +28145,7 @@
     <b:MonthAccessed>July</b:MonthAccessed>
     <b:DayAccessed>25</b:DayAccessed>
     <b:URL>https://www.geeksforgeeks.org/software-engineering/component-based-diagram/</b:URL>
-    <b:RefOrder>13</b:RefOrder>
+    <b:RefOrder>14</b:RefOrder>
   </b:Source>
   <b:Source>
     <b:Tag>Pow25</b:Tag>
@@ -26589,7 +28171,7 @@
         </b:NameList>
       </b:Author>
     </b:Author>
-    <b:RefOrder>9</b:RefOrder>
+    <b:RefOrder>10</b:RefOrder>
   </b:Source>
   <b:Source>
     <b:Tag>pyt</b:Tag>
@@ -26606,7 +28188,7 @@
     <b:YearAccessed>2026</b:YearAccessed>
     <b:MonthAccessed>July</b:MonthAccessed>
     <b:DayAccessed>29</b:DayAccessed>
-    <b:RefOrder>7</b:RefOrder>
+    <b:RefOrder>8</b:RefOrder>
   </b:Source>
   <b:Source>
     <b:Tag>McG01</b:Tag>
@@ -26632,7 +28214,7 @@
         </b:NameList>
       </b:Author>
     </b:Author>
-    <b:RefOrder>10</b:RefOrder>
+    <b:RefOrder>11</b:RefOrder>
   </b:Source>
   <b:Source>
     <b:Tag>Pow26</b:Tag>
@@ -26657,7 +28239,7 @@
         </b:NameList>
       </b:Author>
     </b:Author>
-    <b:RefOrder>11</b:RefOrder>
+    <b:RefOrder>12</b:RefOrder>
   </b:Source>
   <b:Source>
     <b:Tag>pyp25</b:Tag>
@@ -26674,7 +28256,7 @@
     <b:MonthAccessed>July</b:MonthAccessed>
     <b:DayAccessed>30</b:DayAccessed>
     <b:URL>https://pypi.org/project/pytest-qt/</b:URL>
-    <b:RefOrder>8</b:RefOrder>
+    <b:RefOrder>9</b:RefOrder>
   </b:Source>
   <b:Source>
     <b:Tag>IBM26</b:Tag>
@@ -26690,7 +28272,43 @@
     <b:MonthAccessed>July</b:MonthAccessed>
     <b:DayAccessed>30</b:DayAccessed>
     <b:URL>https://www.ibm.com/think/topics/system-testing</b:URL>
-    <b:RefOrder>12</b:RefOrder>
+    <b:RefOrder>13</b:RefOrder>
+  </b:Source>
+  <b:Source>
+    <b:Tag>IEE26</b:Tag>
+    <b:SourceType>InternetSite</b:SourceType>
+    <b:Guid>{D4A5AB50-9022-45E8-AA89-B344325421CF}</b:Guid>
+    <b:Author>
+      <b:Author>
+        <b:Corporate>IEEE</b:Corporate>
+      </b:Author>
+    </b:Author>
+    <b:Title>Software Requirements Specifications</b:Title>
+    <b:YearAccessed>2026</b:YearAccessed>
+    <b:MonthAccessed>July</b:MonthAccessed>
+    <b:DayAccessed>30</b:DayAccessed>
+    <b:URL>https://www.computer.org/resources/software-requirements-specifications</b:URL>
+    <b:RefOrder>15</b:RefOrder>
+  </b:Source>
+  <b:Source>
+    <b:Tag>Hir25</b:Tag>
+    <b:SourceType>Book</b:SourceType>
+    <b:Guid>{8C1A34A5-B651-4F7B-B102-F0C8EAFB82D9}</b:Guid>
+    <b:Title>Guide to the Software Engineering Body of Knowledge</b:Title>
+    <b:Year>2025</b:Year>
+    <b:Author>
+      <b:Author>
+        <b:NameList>
+          <b:Person>
+            <b:Last>Washizaki</b:Last>
+            <b:First>Hironori</b:First>
+          </b:Person>
+        </b:NameList>
+      </b:Author>
+    </b:Author>
+    <b:Publisher>IEEE</b:Publisher>
+    <b:Edition>4.0a</b:Edition>
+    <b:RefOrder>4</b:RefOrder>
   </b:Source>
 </b:Sources>
 </file>
@@ -26733,7 +28351,7 @@
 </file>
 
 <file path=customXml/itemProps4.xml><?xml version="1.0" encoding="utf-8"?>
-<ds:datastoreItem xmlns:ds="http://schemas.openxmlformats.org/officeDocument/2006/customXml" ds:itemID="{761053B2-9B03-426D-B693-4CC6D9861216}">
+<ds:datastoreItem xmlns:ds="http://schemas.openxmlformats.org/officeDocument/2006/customXml" ds:itemID="{BDD2CEE1-A355-4261-AE02-6E86C30BCFA1}">
   <ds:schemaRefs>
     <ds:schemaRef ds:uri="http://schemas.openxmlformats.org/officeDocument/2006/bibliography"/>
   </ds:schemaRefs>

</xml_diff>

<commit_message>
Change accessibility settings to save within the project space
While common to have this in appdata/roaming or the user directory, I felt more comfortable after thing about it to keep everything inside the project. For safety and ease of use.
</commit_message>
<xml_diff>
--- a/docs/Technical Report Eoin Fitzsimons.docx
+++ b/docs/Technical Report Eoin Fitzsimons.docx
@@ -593,7 +593,25 @@
           <w:sz w:val="18"/>
           <w:szCs w:val="18"/>
         </w:rPr>
-        <w:t>supplied by the Library.  To use other author's written or electronic work is illegal (plagiarism) and may result in disciplinary action.  Students may be required to undergo a viva (oral examination) if there is suspicion about the validity of their submitted work.</w:t>
+        <w:t xml:space="preserve">supplied by the </w:t>
+      </w:r>
+      <w:proofErr w:type="gramStart"/>
+      <w:r>
+        <w:rPr>
+          <w:rFonts w:ascii="Verdana" w:hAnsi="Verdana"/>
+          <w:sz w:val="18"/>
+          <w:szCs w:val="18"/>
+        </w:rPr>
+        <w:t>Library</w:t>
+      </w:r>
+      <w:proofErr w:type="gramEnd"/>
+      <w:r>
+        <w:rPr>
+          <w:rFonts w:ascii="Verdana" w:hAnsi="Verdana"/>
+          <w:sz w:val="18"/>
+          <w:szCs w:val="18"/>
+        </w:rPr>
+        <w:t>.  To use other author's written or electronic work is illegal (plagiarism) and may result in disciplinary action.  Students may be required to undergo a viva (oral examination) if there is suspicion about the validity of their submitted work.</w:t>
       </w:r>
     </w:p>
     <w:p/>
@@ -660,7 +678,25 @@
           <w:bCs/>
           <w:highlight w:val="yellow"/>
         </w:rPr>
-        <w:t>successfully complete the Epigeum Academic Integrity Course</w:t>
+        <w:t xml:space="preserve">successfully complete the </w:t>
+      </w:r>
+      <w:proofErr w:type="spellStart"/>
+      <w:r>
+        <w:rPr>
+          <w:b/>
+          <w:bCs/>
+          <w:highlight w:val="yellow"/>
+        </w:rPr>
+        <w:t>Epigeum</w:t>
+      </w:r>
+      <w:proofErr w:type="spellEnd"/>
+      <w:r>
+        <w:rPr>
+          <w:b/>
+          <w:bCs/>
+          <w:highlight w:val="yellow"/>
+        </w:rPr>
+        <w:t xml:space="preserve"> Academic Integrity Course</w:t>
       </w:r>
       <w:r>
         <w:rPr>
@@ -995,7 +1031,21 @@
         <w:rPr>
           <w:b/>
         </w:rPr>
-        <w:t>Any project/assignment not submitted will be marked as a fail.</w:t>
+        <w:t xml:space="preserve">Any project/assignment not submitted will be marked as a </w:t>
+      </w:r>
+      <w:proofErr w:type="gramStart"/>
+      <w:r>
+        <w:rPr>
+          <w:b/>
+        </w:rPr>
+        <w:t>fail</w:t>
+      </w:r>
+      <w:proofErr w:type="gramEnd"/>
+      <w:r>
+        <w:rPr>
+          <w:b/>
+        </w:rPr>
+        <w:t>.</w:t>
       </w:r>
     </w:p>
     <w:p>
@@ -1019,7 +1069,21 @@
         <w:rPr>
           <w:b/>
         </w:rPr>
-        <w:t>Please check that you read AI and Academic Integrity Acknowledgement Supplments in this document</w:t>
+        <w:t xml:space="preserve">Please check that you read AI and Academic Integrity Acknowledgement </w:t>
+      </w:r>
+      <w:proofErr w:type="spellStart"/>
+      <w:r>
+        <w:rPr>
+          <w:b/>
+        </w:rPr>
+        <w:t>Supplments</w:t>
+      </w:r>
+      <w:proofErr w:type="spellEnd"/>
+      <w:r>
+        <w:rPr>
+          <w:b/>
+        </w:rPr>
+        <w:t xml:space="preserve"> in this document</w:t>
       </w:r>
     </w:p>
     <w:p/>
@@ -5692,9 +5756,11 @@
       </w:r>
     </w:p>
     <w:p>
+      <w:proofErr w:type="spellStart"/>
       <w:r>
         <w:t>VSCode</w:t>
       </w:r>
+      <w:proofErr w:type="spellEnd"/>
     </w:p>
     <w:p>
       <w:r>
@@ -5707,8 +5773,13 @@
       </w:r>
     </w:p>
     <w:p>
-      <w:r>
-        <w:t>pathlib – Path</w:t>
+      <w:proofErr w:type="spellStart"/>
+      <w:r>
+        <w:t>pathlib</w:t>
+      </w:r>
+      <w:proofErr w:type="spellEnd"/>
+      <w:r>
+        <w:t xml:space="preserve"> – Path</w:t>
       </w:r>
     </w:p>
     <w:p>
@@ -5723,18 +5794,30 @@
     </w:p>
     <w:p>
       <w:r>
-        <w:t>typing – List, Dict, Tuple</w:t>
-      </w:r>
-    </w:p>
-    <w:p>
+        <w:t xml:space="preserve">typing – List, </w:t>
+      </w:r>
+      <w:proofErr w:type="spellStart"/>
+      <w:r>
+        <w:t>Dict</w:t>
+      </w:r>
+      <w:proofErr w:type="spellEnd"/>
+      <w:r>
+        <w:t>, Tuple</w:t>
+      </w:r>
+    </w:p>
+    <w:p>
+      <w:proofErr w:type="spellStart"/>
       <w:r>
         <w:t>json</w:t>
       </w:r>
-    </w:p>
-    <w:p>
+      <w:proofErr w:type="spellEnd"/>
+    </w:p>
+    <w:p>
+      <w:proofErr w:type="spellStart"/>
       <w:r>
         <w:t>dataclasses</w:t>
       </w:r>
+      <w:proofErr w:type="spellEnd"/>
     </w:p>
     <w:p>
       <w:r>
@@ -5743,14 +5826,18 @@
       <w:r>
         <w:t xml:space="preserve"> - </w:t>
       </w:r>
+      <w:proofErr w:type="spellStart"/>
       <w:r>
         <w:t>SystemRandom</w:t>
       </w:r>
-    </w:p>
-    <w:p>
+      <w:proofErr w:type="spellEnd"/>
+    </w:p>
+    <w:p>
+      <w:proofErr w:type="spellStart"/>
       <w:r>
         <w:t>os</w:t>
       </w:r>
+      <w:proofErr w:type="spellEnd"/>
     </w:p>
     <w:p>
       <w:pPr>
@@ -6051,7 +6138,15 @@
     </w:p>
     <w:p>
       <w:r>
-        <w:t>The MoSCoW prioritisation method was used to classify functional requirements according to their importance. Core functionality required for the successful completion of a race simulation was classified as Must Have, features that improve the user experience but are not essential to the simulation were classified as Should Have or Could Have, while functionality outside the scope of the minimum viable product (MVP) was classified as Won't Have</w:t>
+        <w:t xml:space="preserve">The </w:t>
+      </w:r>
+      <w:proofErr w:type="spellStart"/>
+      <w:r>
+        <w:t>MoSCoW</w:t>
+      </w:r>
+      <w:proofErr w:type="spellEnd"/>
+      <w:r>
+        <w:t xml:space="preserve"> prioritisation method was used to classify functional requirements according to their importance. Core functionality required for the successful completion of a race simulation was classified as Must Have, features that improve the user experience but are not essential to the simulation were classified as Should Have or Could Have, while functionality outside the scope of the minimum viable product (MVP) was classified as Won't Have</w:t>
       </w:r>
       <w:r>
         <w:t>.</w:t>
@@ -6239,6 +6334,12 @@
             <w:tcW w:w="5666" w:type="dxa"/>
           </w:tcPr>
           <w:p>
+            <w:pPr>
+              <w:rPr>
+                <w:sz w:val="24"/>
+                <w:szCs w:val="24"/>
+              </w:rPr>
+            </w:pPr>
             <w:r>
               <w:t xml:space="preserve">A race </w:t>
             </w:r>
@@ -6246,7 +6347,22 @@
               <w:t>may</w:t>
             </w:r>
             <w:r>
-              <w:t xml:space="preserve"> be predefined, what is most important in this project is the data presentation</w:t>
+              <w:t xml:space="preserve"> be predefined, </w:t>
+            </w:r>
+            <w:r>
+              <w:t xml:space="preserve">as the </w:t>
+            </w:r>
+            <w:r>
+              <w:t xml:space="preserve">project </w:t>
+            </w:r>
+            <w:r>
+              <w:t xml:space="preserve">focuses primarily on presenting race </w:t>
+            </w:r>
+            <w:r>
+              <w:t xml:space="preserve">data </w:t>
+            </w:r>
+            <w:r>
+              <w:t>clearly</w:t>
             </w:r>
             <w:r>
               <w:t>.</w:t>
@@ -6310,11 +6426,32 @@
             <w:tcW w:w="5666" w:type="dxa"/>
           </w:tcPr>
           <w:p>
-            <w:r>
-              <w:t xml:space="preserve">A race </w:t>
-            </w:r>
-            <w:r>
-              <w:t>carrying out using logic is more important than a graphical representation.</w:t>
+            <w:pPr>
+              <w:rPr>
+                <w:sz w:val="24"/>
+                <w:szCs w:val="24"/>
+              </w:rPr>
+            </w:pPr>
+            <w:r>
+              <w:t xml:space="preserve">A </w:t>
+            </w:r>
+            <w:r>
+              <w:t xml:space="preserve">logic-based </w:t>
+            </w:r>
+            <w:r>
+              <w:t xml:space="preserve">race </w:t>
+            </w:r>
+            <w:r>
+              <w:t>simulation</w:t>
+            </w:r>
+            <w:r>
+              <w:t xml:space="preserve"> is more important than a </w:t>
+            </w:r>
+            <w:r>
+              <w:t xml:space="preserve">detailed </w:t>
+            </w:r>
+            <w:r>
+              <w:t>graphical representation.</w:t>
             </w:r>
           </w:p>
         </w:tc>
@@ -6378,14 +6515,35 @@
             <w:tcW w:w="5666" w:type="dxa"/>
           </w:tcPr>
           <w:p>
-            <w:r>
-              <w:t xml:space="preserve">A visual representation of a </w:t>
-            </w:r>
-            <w:r>
-              <w:t>predefined</w:t>
-            </w:r>
-            <w:r>
-              <w:t xml:space="preserve"> logical race is more important than user set parameters.</w:t>
+            <w:pPr>
+              <w:rPr>
+                <w:sz w:val="24"/>
+                <w:szCs w:val="24"/>
+              </w:rPr>
+            </w:pPr>
+            <w:r>
+              <w:t xml:space="preserve">A visual </w:t>
+            </w:r>
+            <w:r>
+              <w:t>display</w:t>
+            </w:r>
+            <w:r>
+              <w:t xml:space="preserve"> of a </w:t>
+            </w:r>
+            <w:r>
+              <w:t>predefin</w:t>
+            </w:r>
+            <w:r>
+              <w:t>ed</w:t>
+            </w:r>
+            <w:r>
+              <w:t xml:space="preserve"> logical race is more important than </w:t>
+            </w:r>
+            <w:r>
+              <w:t>allowing users to</w:t>
+            </w:r>
+            <w:r>
+              <w:t xml:space="preserve"> set parameters.</w:t>
             </w:r>
           </w:p>
         </w:tc>
@@ -6438,7 +6596,7 @@
           </w:tcPr>
           <w:p>
             <w:r>
-              <w:t>Must</w:t>
+              <w:t>Should</w:t>
             </w:r>
           </w:p>
         </w:tc>
@@ -6447,8 +6605,26 @@
             <w:tcW w:w="5666" w:type="dxa"/>
           </w:tcPr>
           <w:p>
-            <w:r>
-              <w:t>User input is more important than being able to visualise the building blocks that go into a race.</w:t>
+            <w:pPr>
+              <w:rPr>
+                <w:sz w:val="24"/>
+                <w:szCs w:val="24"/>
+              </w:rPr>
+            </w:pPr>
+            <w:r>
+              <w:t xml:space="preserve">User input is more important than </w:t>
+            </w:r>
+            <w:r>
+              <w:t>visualising</w:t>
+            </w:r>
+            <w:r>
+              <w:t xml:space="preserve"> the </w:t>
+            </w:r>
+            <w:r>
+              <w:t>individual elements used to build</w:t>
+            </w:r>
+            <w:r>
+              <w:t xml:space="preserve"> a race.</w:t>
             </w:r>
           </w:p>
         </w:tc>
@@ -6509,8 +6685,14 @@
             <w:tcW w:w="5666" w:type="dxa"/>
           </w:tcPr>
           <w:p>
-            <w:r>
-              <w:t>The possibility of predicting the outcome prior to the race will help a user judge the predictiveness if the simulation.</w:t>
+            <w:pPr>
+              <w:rPr>
+                <w:sz w:val="24"/>
+                <w:szCs w:val="24"/>
+              </w:rPr>
+            </w:pPr>
+            <w:r>
+              <w:t>The ability to predict the race outcome beforehand helps users assess the simulation’s predictability.</w:t>
             </w:r>
           </w:p>
         </w:tc>
@@ -6571,8 +6753,35 @@
             <w:tcW w:w="5666" w:type="dxa"/>
           </w:tcPr>
           <w:p>
-            <w:r>
-              <w:t>The project should be designed to be accessible from the off through simplicity; however, it would be nice to have custom settings for rarer issues.</w:t>
+            <w:pPr>
+              <w:rPr>
+                <w:sz w:val="24"/>
+                <w:szCs w:val="24"/>
+              </w:rPr>
+            </w:pPr>
+            <w:r>
+              <w:t xml:space="preserve">The project should be </w:t>
+            </w:r>
+            <w:r>
+              <w:t xml:space="preserve">accessible from the </w:t>
+            </w:r>
+            <w:r>
+              <w:t>outset</w:t>
+            </w:r>
+            <w:r>
+              <w:t xml:space="preserve"> through simplicity</w:t>
+            </w:r>
+            <w:r>
+              <w:t>, with optional</w:t>
+            </w:r>
+            <w:r>
+              <w:t xml:space="preserve"> custom settings for </w:t>
+            </w:r>
+            <w:r>
+              <w:t>less common accessibility needs</w:t>
+            </w:r>
+            <w:r>
+              <w:t>.</w:t>
             </w:r>
           </w:p>
         </w:tc>
@@ -6939,7 +7148,21 @@
           <w:rFonts w:eastAsia="Times New Roman"/>
           <w:lang w:eastAsia="en-IE"/>
         </w:rPr>
-        <w:t xml:space="preserve">The system retrieves the final state of all participating drivers. </w:t>
+        <w:t>The system retrieves the final state of all participating drivers</w:t>
+      </w:r>
+      <w:r>
+        <w:rPr>
+          <w:rFonts w:eastAsia="Times New Roman"/>
+          <w:lang w:eastAsia="en-IE"/>
+        </w:rPr>
+        <w:t xml:space="preserve"> from runtime memory.</w:t>
+      </w:r>
+      <w:r>
+        <w:rPr>
+          <w:rFonts w:eastAsia="Times New Roman"/>
+          <w:lang w:eastAsia="en-IE"/>
+        </w:rPr>
+        <w:t xml:space="preserve"> </w:t>
       </w:r>
     </w:p>
     <w:p>
@@ -7432,7 +7655,10 @@
         </w:numPr>
       </w:pPr>
       <w:r>
-        <w:t>The system creates the initial race state.</w:t>
+        <w:t>The system creates the initial race state</w:t>
+      </w:r>
+      <w:r>
+        <w:t xml:space="preserve"> using track information from JSON.</w:t>
       </w:r>
     </w:p>
     <w:p>
@@ -7480,7 +7706,13 @@
         </w:numPr>
       </w:pPr>
       <w:r>
-        <w:t>The system updates driver positions, lap progress, and time gaps.</w:t>
+        <w:t>The system updates driver positions, lap progress, and time gaps</w:t>
+      </w:r>
+      <w:r>
+        <w:t xml:space="preserve"> within the simulation</w:t>
+      </w:r>
+      <w:r>
+        <w:t>.</w:t>
       </w:r>
     </w:p>
     <w:p>
@@ -7492,7 +7724,13 @@
         </w:numPr>
       </w:pPr>
       <w:r>
-        <w:t>The system records relevant race events and state changes.</w:t>
+        <w:t xml:space="preserve">The system </w:t>
+      </w:r>
+      <w:r>
+        <w:t>updates telemetry data and race state information during simulation execution</w:t>
+      </w:r>
+      <w:r>
+        <w:t>.</w:t>
       </w:r>
     </w:p>
     <w:p>
@@ -7560,7 +7798,13 @@
         </w:numPr>
       </w:pPr>
       <w:r>
-        <w:t>The system times out the unfinished cars and marks the, as DNF (Did not Finish)</w:t>
+        <w:t>The system times out the unfinished cars and marks the</w:t>
+      </w:r>
+      <w:r>
+        <w:t>m</w:t>
+      </w:r>
+      <w:r>
+        <w:t xml:space="preserve"> as DNF (Did not Finish)</w:t>
       </w:r>
     </w:p>
     <w:p>
@@ -8175,7 +8419,10 @@
         <w:t xml:space="preserve"> </w:t>
       </w:r>
       <w:r>
-        <w:t>- Must</w:t>
+        <w:t xml:space="preserve">- </w:t>
+      </w:r>
+      <w:r>
+        <w:t>Should</w:t>
       </w:r>
     </w:p>
     <w:p>
@@ -8192,10 +8439,10 @@
           <w:noProof/>
         </w:rPr>
         <w:drawing>
-          <wp:inline distT="0" distB="0" distL="0" distR="0" wp14:anchorId="2032EC6F" wp14:editId="44DC15FA">
-            <wp:extent cx="5731510" cy="4765040"/>
-            <wp:effectExtent l="0" t="0" r="2540" b="0"/>
-            <wp:docPr id="2023728785" name="Picture 1"/>
+          <wp:inline distT="0" distB="0" distL="0" distR="0" wp14:anchorId="608DB9B3" wp14:editId="5C723414">
+            <wp:extent cx="5730875" cy="4761230"/>
+            <wp:effectExtent l="0" t="0" r="3175" b="1270"/>
+            <wp:docPr id="719480283" name="Picture 9"/>
             <wp:cNvGraphicFramePr>
               <a:graphicFrameLocks xmlns:a="http://schemas.openxmlformats.org/drawingml/2006/main" noChangeAspect="1"/>
             </wp:cNvGraphicFramePr>
@@ -8203,23 +8450,36 @@
               <a:graphicData uri="http://schemas.openxmlformats.org/drawingml/2006/picture">
                 <pic:pic xmlns:pic="http://schemas.openxmlformats.org/drawingml/2006/picture">
                   <pic:nvPicPr>
-                    <pic:cNvPr id="2023728785" name=""/>
-                    <pic:cNvPicPr/>
+                    <pic:cNvPr id="0" name="Picture 1"/>
+                    <pic:cNvPicPr>
+                      <a:picLocks noChangeAspect="1" noChangeArrowheads="1"/>
+                    </pic:cNvPicPr>
                   </pic:nvPicPr>
                   <pic:blipFill>
-                    <a:blip r:embed="rId17"/>
+                    <a:blip r:embed="rId17">
+                      <a:extLst>
+                        <a:ext uri="{28A0092B-C50C-407E-A947-70E740481C1C}">
+                          <a14:useLocalDpi xmlns:a14="http://schemas.microsoft.com/office/drawing/2010/main" val="0"/>
+                        </a:ext>
+                      </a:extLst>
+                    </a:blip>
+                    <a:srcRect/>
                     <a:stretch>
                       <a:fillRect/>
                     </a:stretch>
                   </pic:blipFill>
-                  <pic:spPr>
+                  <pic:spPr bwMode="auto">
                     <a:xfrm>
                       <a:off x="0" y="0"/>
-                      <a:ext cx="5731510" cy="4765040"/>
+                      <a:ext cx="5730875" cy="4761230"/>
                     </a:xfrm>
                     <a:prstGeom prst="rect">
                       <a:avLst/>
                     </a:prstGeom>
+                    <a:noFill/>
+                    <a:ln>
+                      <a:noFill/>
+                    </a:ln>
                   </pic:spPr>
                 </pic:pic>
               </a:graphicData>
@@ -8244,7 +8504,7 @@
     </w:p>
     <w:p>
       <w:r>
-        <w:t>Allow the user to configure available race options before starting the simulation.</w:t>
+        <w:t>Allow race parameters to be configured before starting the simulation.</w:t>
       </w:r>
     </w:p>
     <w:p>
@@ -8272,7 +8532,7 @@
     </w:p>
     <w:p>
       <w:r>
-        <w:t>The system provides a configuration interface where the user can select available race parameters before execution. The selected configuration determines the conditions used by the simulation engine when creating and running the race.</w:t>
+        <w:t>The system supports configurable race parameters that determine the conditions used by the simulation engine when creating and running a race. Configuration values are provided through system settings before execution.</w:t>
       </w:r>
     </w:p>
     <w:p>
@@ -8282,7 +8542,10 @@
         </w:rPr>
       </w:pPr>
       <w:r>
-        <w:t>Priority: High</w:t>
+        <w:t xml:space="preserve">Priority: </w:t>
+      </w:r>
+      <w:r>
+        <w:t>Medium</w:t>
       </w:r>
     </w:p>
     <w:p>
@@ -8343,7 +8606,7 @@
           <w:rFonts w:eastAsia="Times New Roman"/>
           <w:lang w:eastAsia="en-IE"/>
         </w:rPr>
-        <w:t>Required configuration data has been loaded.</w:t>
+        <w:t>Required system configuration resources are available.</w:t>
       </w:r>
     </w:p>
     <w:p>
@@ -8356,7 +8619,19 @@
     </w:p>
     <w:p>
       <w:r>
-        <w:t>This use case begins when the user opens the race configuration interface.</w:t>
+        <w:t xml:space="preserve">This use case begins when the </w:t>
+      </w:r>
+      <w:r>
+        <w:t>developer</w:t>
+      </w:r>
+      <w:r>
+        <w:t xml:space="preserve"> opens the race configuration </w:t>
+      </w:r>
+      <w:r>
+        <w:t>code</w:t>
+      </w:r>
+      <w:r>
+        <w:t>.</w:t>
       </w:r>
     </w:p>
     <w:p>
@@ -8385,7 +8660,7 @@
           <w:rFonts w:eastAsia="Times New Roman"/>
           <w:lang w:eastAsia="en-IE"/>
         </w:rPr>
-        <w:t xml:space="preserve">The system displays available race settings. </w:t>
+        <w:t xml:space="preserve">The developer defines the required race parameters within the system configuration. </w:t>
       </w:r>
     </w:p>
     <w:p>
@@ -8405,7 +8680,7 @@
           <w:rFonts w:eastAsia="Times New Roman"/>
           <w:lang w:eastAsia="en-IE"/>
         </w:rPr>
-        <w:t xml:space="preserve">The user selects preferred race options. </w:t>
+        <w:t xml:space="preserve">The system loads the configured race parameters during initialisation. </w:t>
       </w:r>
     </w:p>
     <w:p>
@@ -8425,7 +8700,7 @@
           <w:rFonts w:eastAsia="Times New Roman"/>
           <w:lang w:eastAsia="en-IE"/>
         </w:rPr>
-        <w:t xml:space="preserve">The system validates the selected configuration. </w:t>
+        <w:t xml:space="preserve">The system validates the configured parameters. </w:t>
       </w:r>
     </w:p>
     <w:p>
@@ -8445,7 +8720,7 @@
           <w:rFonts w:eastAsia="Times New Roman"/>
           <w:lang w:eastAsia="en-IE"/>
         </w:rPr>
-        <w:t xml:space="preserve">The system stores the race configuration. </w:t>
+        <w:t xml:space="preserve">The system creates the race simulation using the validated configuration. </w:t>
       </w:r>
     </w:p>
     <w:p>
@@ -8484,10 +8759,13 @@
         <w:t>A1</w:t>
       </w:r>
       <w:r>
-        <w:t xml:space="preserve"> – The u</w:t>
-      </w:r>
-      <w:r>
-        <w:t>ser modifies configuration</w:t>
+        <w:t xml:space="preserve"> – The </w:t>
+      </w:r>
+      <w:r>
+        <w:t>developer</w:t>
+      </w:r>
+      <w:r>
+        <w:t xml:space="preserve"> modifies configuration</w:t>
       </w:r>
     </w:p>
     <w:p>
@@ -8499,7 +8777,13 @@
         </w:numPr>
       </w:pPr>
       <w:r>
-        <w:t xml:space="preserve">The user changes selected race options. </w:t>
+        <w:t xml:space="preserve">The </w:t>
+      </w:r>
+      <w:r>
+        <w:t>developer</w:t>
+      </w:r>
+      <w:r>
+        <w:t xml:space="preserve"> changes selected race options. </w:t>
       </w:r>
     </w:p>
     <w:p>
@@ -8585,7 +8869,13 @@
         </w:numPr>
       </w:pPr>
       <w:r>
-        <w:t>The user is prompted to select valid options.</w:t>
+        <w:t xml:space="preserve">The </w:t>
+      </w:r>
+      <w:r>
+        <w:t>developer</w:t>
+      </w:r>
+      <w:r>
+        <w:t xml:space="preserve"> is prompted to select valid options.</w:t>
       </w:r>
     </w:p>
     <w:p>
@@ -8598,7 +8888,19 @@
     </w:p>
     <w:p>
       <w:r>
-        <w:t>The race configuration interface closes.</w:t>
+        <w:t>The</w:t>
+      </w:r>
+      <w:r>
+        <w:t xml:space="preserve"> developer closes the</w:t>
+      </w:r>
+      <w:r>
+        <w:t xml:space="preserve"> race configuration </w:t>
+      </w:r>
+      <w:r>
+        <w:t>code</w:t>
+      </w:r>
+      <w:r>
+        <w:t>.</w:t>
       </w:r>
     </w:p>
     <w:p>
@@ -8793,7 +9095,13 @@
         </w:numPr>
       </w:pPr>
       <w:r>
-        <w:t>Driver data has been loaded successfully.</w:t>
+        <w:t xml:space="preserve">Driver data has been </w:t>
+      </w:r>
+      <w:r>
+        <w:t>generated</w:t>
+      </w:r>
+      <w:r>
+        <w:t xml:space="preserve"> successfully.</w:t>
       </w:r>
     </w:p>
     <w:p>
@@ -8841,7 +9149,21 @@
           <w:rFonts w:eastAsia="Times New Roman"/>
           <w:lang w:eastAsia="en-IE"/>
         </w:rPr>
-        <w:t xml:space="preserve">The system retrieves available driver information. </w:t>
+        <w:t xml:space="preserve">The system </w:t>
+      </w:r>
+      <w:r>
+        <w:rPr>
+          <w:rFonts w:eastAsia="Times New Roman"/>
+          <w:lang w:eastAsia="en-IE"/>
+        </w:rPr>
+        <w:t>retrieves from generated driver objects stored in memory</w:t>
+      </w:r>
+      <w:r>
+        <w:rPr>
+          <w:rFonts w:eastAsia="Times New Roman"/>
+          <w:lang w:eastAsia="en-IE"/>
+        </w:rPr>
+        <w:t xml:space="preserve">. </w:t>
       </w:r>
     </w:p>
     <w:p>
@@ -8987,7 +9309,13 @@
         </w:numPr>
       </w:pPr>
       <w:r>
-        <w:t>The system refetches the information.</w:t>
+        <w:t xml:space="preserve">The system </w:t>
+      </w:r>
+      <w:r>
+        <w:t>reloads</w:t>
+      </w:r>
+      <w:r>
+        <w:t xml:space="preserve"> the information.</w:t>
       </w:r>
     </w:p>
     <w:p>
@@ -9013,7 +9341,13 @@
     </w:p>
     <w:p>
       <w:r>
-        <w:t>The driver information is gone</w:t>
+        <w:t xml:space="preserve">The </w:t>
+      </w:r>
+      <w:r>
+        <w:t>d</w:t>
+      </w:r>
+      <w:r>
+        <w:t>river information has been displayed and is available for user review.</w:t>
       </w:r>
     </w:p>
     <w:p>
@@ -9260,7 +9594,14 @@
           <w:rFonts w:eastAsia="Times New Roman"/>
           <w:lang w:eastAsia="en-IE"/>
         </w:rPr>
-        <w:t xml:space="preserve">The user selects preferred settings. </w:t>
+        <w:t>The user selects preferred settings</w:t>
+      </w:r>
+      <w:r>
+        <w:rPr>
+          <w:rFonts w:eastAsia="Times New Roman"/>
+          <w:lang w:eastAsia="en-IE"/>
+        </w:rPr>
+        <w:t xml:space="preserve"> and saves.</w:t>
       </w:r>
     </w:p>
     <w:p>
@@ -9281,6 +9622,33 @@
           <w:lang w:eastAsia="en-IE"/>
         </w:rPr>
         <w:t xml:space="preserve">The system validates the selected settings. </w:t>
+      </w:r>
+    </w:p>
+    <w:p>
+      <w:pPr>
+        <w:pStyle w:val="ListParagraph"/>
+        <w:numPr>
+          <w:ilvl w:val="0"/>
+          <w:numId w:val="22"/>
+        </w:numPr>
+        <w:rPr>
+          <w:rFonts w:eastAsia="Times New Roman"/>
+          <w:lang w:eastAsia="en-IE"/>
+        </w:rPr>
+      </w:pPr>
+      <w:r>
+        <w:rPr>
+          <w:rFonts w:eastAsia="Times New Roman"/>
+          <w:lang w:eastAsia="en-IE"/>
+        </w:rPr>
+        <w:t>The system saves preferences to a JSON file</w:t>
+      </w:r>
+      <w:r>
+        <w:rPr>
+          <w:rFonts w:eastAsia="Times New Roman"/>
+          <w:lang w:eastAsia="en-IE"/>
+        </w:rPr>
+        <w:t xml:space="preserve">. </w:t>
       </w:r>
     </w:p>
     <w:p>
@@ -10871,7 +11239,15 @@
     </w:p>
     <w:p>
       <w:r>
-        <w:t xml:space="preserve">As seen in Telemetry 2, I create the tables using QHBoxLayout, this lines up widgets horizontally without additional need for manually </w:t>
+        <w:t xml:space="preserve">As seen in Telemetry 2, I create the tables using </w:t>
+      </w:r>
+      <w:proofErr w:type="spellStart"/>
+      <w:r>
+        <w:t>QHBoxLayout</w:t>
+      </w:r>
+      <w:proofErr w:type="spellEnd"/>
+      <w:r>
+        <w:t xml:space="preserve">, this lines up widgets horizontally without additional need for manually </w:t>
       </w:r>
       <w:r>
         <w:t>placing</w:t>
@@ -11009,7 +11385,15 @@
         <w:t xml:space="preserve">As seen in Telemetry 3, I have an attribute error stemming from line 64 - </w:t>
       </w:r>
       <w:r>
-        <w:t>self._publish_telemetry()</w:t>
+        <w:t>self._</w:t>
+      </w:r>
+      <w:proofErr w:type="spellStart"/>
+      <w:r>
+        <w:t>publish_telemetry</w:t>
+      </w:r>
+      <w:proofErr w:type="spellEnd"/>
+      <w:r>
+        <w:t>()</w:t>
       </w:r>
       <w:r>
         <w:t>. The root cause of this is the telemetry is being called prior to the creation of tables, Telemetry 2 above shows I do have the creation of these tables within my code. This in an architecture issue rather than a</w:t>
@@ -13778,7 +14162,15 @@
     </w:p>
     <w:p>
       <w:r>
-        <w:t>The src directory was converted into a Python package by adding __init__.py files. These files were added to the main source directory and relevant subdirectories, including:</w:t>
+        <w:t xml:space="preserve">The </w:t>
+      </w:r>
+      <w:proofErr w:type="spellStart"/>
+      <w:r>
+        <w:t>src</w:t>
+      </w:r>
+      <w:proofErr w:type="spellEnd"/>
+      <w:r>
+        <w:t xml:space="preserve"> directory was converted into a Python package by adding __init__.py files. These files were added to the main source directory and relevant subdirectories, including:</w:t>
       </w:r>
     </w:p>
     <w:p>
@@ -13788,8 +14180,13 @@
           <w:numId w:val="37"/>
         </w:numPr>
       </w:pPr>
-      <w:r>
-        <w:t>src/</w:t>
+      <w:proofErr w:type="spellStart"/>
+      <w:r>
+        <w:t>src</w:t>
+      </w:r>
+      <w:proofErr w:type="spellEnd"/>
+      <w:r>
+        <w:t>/</w:t>
       </w:r>
       <w:r>
         <w:t xml:space="preserve"> __init__.py</w:t>
@@ -13805,8 +14202,13 @@
           <w:numId w:val="37"/>
         </w:numPr>
       </w:pPr>
-      <w:r>
-        <w:t>src/core/</w:t>
+      <w:proofErr w:type="spellStart"/>
+      <w:r>
+        <w:t>src</w:t>
+      </w:r>
+      <w:proofErr w:type="spellEnd"/>
+      <w:r>
+        <w:t>/core/</w:t>
       </w:r>
       <w:r>
         <w:t xml:space="preserve"> __init__.py</w:t>
@@ -13822,8 +14224,13 @@
           <w:numId w:val="37"/>
         </w:numPr>
       </w:pPr>
-      <w:r>
-        <w:t>src/models/</w:t>
+      <w:proofErr w:type="spellStart"/>
+      <w:r>
+        <w:t>src</w:t>
+      </w:r>
+      <w:proofErr w:type="spellEnd"/>
+      <w:r>
+        <w:t>/models/</w:t>
       </w:r>
       <w:r>
         <w:t xml:space="preserve"> __init__.py</w:t>
@@ -13848,8 +14255,13 @@
       </w:r>
     </w:p>
     <w:p>
-      <w:r>
-        <w:t>pythonpath = .</w:t>
+      <w:proofErr w:type="spellStart"/>
+      <w:r>
+        <w:t>pythonpath</w:t>
+      </w:r>
+      <w:proofErr w:type="spellEnd"/>
+      <w:r>
+        <w:t xml:space="preserve"> = .</w:t>
       </w:r>
     </w:p>
     <w:p>
@@ -13860,8 +14272,21 @@
         <w:t xml:space="preserve"> </w:t>
       </w:r>
       <w:r>
-        <w:t>from src.core.race_controller import RaceController</w:t>
-      </w:r>
+        <w:t xml:space="preserve">from </w:t>
+      </w:r>
+      <w:proofErr w:type="spellStart"/>
+      <w:r>
+        <w:t>src.core.race_controller</w:t>
+      </w:r>
+      <w:proofErr w:type="spellEnd"/>
+      <w:r>
+        <w:t xml:space="preserve"> import </w:t>
+      </w:r>
+      <w:proofErr w:type="spellStart"/>
+      <w:r>
+        <w:t>RaceController</w:t>
+      </w:r>
+      <w:proofErr w:type="spellEnd"/>
       <w:r>
         <w:t xml:space="preserve"> </w:t>
       </w:r>
@@ -13871,7 +14296,15 @@
     </w:p>
     <w:p>
       <w:r>
-        <w:t>Tests were organised using pytest's default naming conventions. Test files must begin with test_ or end with _test.py to be automatically detected by the pytest test discovery system.</w:t>
+        <w:t xml:space="preserve">Tests were organised using </w:t>
+      </w:r>
+      <w:proofErr w:type="spellStart"/>
+      <w:r>
+        <w:t>pytest's</w:t>
+      </w:r>
+      <w:proofErr w:type="spellEnd"/>
+      <w:r>
+        <w:t xml:space="preserve"> default naming conventions. Test files must begin with test_ or end with _test.py to be automatically detected by the pytest test discovery system.</w:t>
       </w:r>
     </w:p>
     <w:p>
@@ -14222,7 +14655,15 @@
         <w:t>manages</w:t>
       </w:r>
       <w:r>
-        <w:t xml:space="preserve"> qApp creation </w:t>
+        <w:t xml:space="preserve"> </w:t>
+      </w:r>
+      <w:proofErr w:type="spellStart"/>
+      <w:r>
+        <w:t>qApp</w:t>
+      </w:r>
+      <w:proofErr w:type="spellEnd"/>
+      <w:r>
+        <w:t xml:space="preserve"> creation </w:t>
       </w:r>
       <w:r>
         <w:t>when required</w:t>
@@ -14259,8 +14700,13 @@
       <w:r>
         <w:t xml:space="preserve">, </w:t>
       </w:r>
-      <w:r>
-        <w:t>qt_api=pyqt6</w:t>
+      <w:proofErr w:type="spellStart"/>
+      <w:r>
+        <w:t>qt_api</w:t>
+      </w:r>
+      <w:proofErr w:type="spellEnd"/>
+      <w:r>
+        <w:t>=pyqt6</w:t>
       </w:r>
       <w:r>
         <w:t xml:space="preserve"> needs to be placed in the pytest.ini file.</w:t>
@@ -15569,7 +16015,31 @@
         <w:t xml:space="preserve">This </w:t>
       </w:r>
       <w:r>
-        <w:t>phase primarily focused on the RaceController class. The tests validated the behaviour of its methods and internal state management. Dependent classes, including Driver, Car, RaceTelemetry, and RaceResult, were used during execution to provide the required objects and verify that the controller operated correctly within the simulation environment.</w:t>
+        <w:t xml:space="preserve">phase primarily focused on the </w:t>
+      </w:r>
+      <w:proofErr w:type="spellStart"/>
+      <w:r>
+        <w:t>RaceController</w:t>
+      </w:r>
+      <w:proofErr w:type="spellEnd"/>
+      <w:r>
+        <w:t xml:space="preserve"> class. The tests validated the behaviour of its methods and internal state management. Dependent classes, including Driver, Car, </w:t>
+      </w:r>
+      <w:proofErr w:type="spellStart"/>
+      <w:r>
+        <w:t>RaceTelemetry</w:t>
+      </w:r>
+      <w:proofErr w:type="spellEnd"/>
+      <w:r>
+        <w:t xml:space="preserve">, and </w:t>
+      </w:r>
+      <w:proofErr w:type="spellStart"/>
+      <w:r>
+        <w:t>RaceResult</w:t>
+      </w:r>
+      <w:proofErr w:type="spellEnd"/>
+      <w:r>
+        <w:t>, were used during execution to provide the required objects and verify that the controller operated correctly within the simulation environment.</w:t>
       </w:r>
     </w:p>
     <w:tbl>
@@ -15713,9 +16183,11 @@
             <w:pPr>
               <w:spacing w:after="160" w:line="259" w:lineRule="auto"/>
             </w:pPr>
+            <w:proofErr w:type="spellStart"/>
             <w:r>
               <w:t>RaceController</w:t>
             </w:r>
+            <w:proofErr w:type="spellEnd"/>
           </w:p>
         </w:tc>
         <w:tc>
@@ -15727,9 +16199,11 @@
             <w:pPr>
               <w:spacing w:after="160" w:line="259" w:lineRule="auto"/>
             </w:pPr>
+            <w:proofErr w:type="spellStart"/>
             <w:r>
               <w:t>TrackDefinition</w:t>
             </w:r>
+            <w:proofErr w:type="spellEnd"/>
           </w:p>
         </w:tc>
         <w:tc>
@@ -15799,9 +16273,11 @@
             <w:pPr>
               <w:spacing w:after="160" w:line="259" w:lineRule="auto"/>
             </w:pPr>
+            <w:proofErr w:type="spellStart"/>
             <w:r>
               <w:t>RaceController</w:t>
             </w:r>
+            <w:proofErr w:type="spellEnd"/>
           </w:p>
         </w:tc>
         <w:tc>
@@ -15885,9 +16361,11 @@
             <w:pPr>
               <w:spacing w:after="160" w:line="259" w:lineRule="auto"/>
             </w:pPr>
+            <w:proofErr w:type="spellStart"/>
             <w:r>
               <w:t>RaceController</w:t>
             </w:r>
+            <w:proofErr w:type="spellEnd"/>
           </w:p>
         </w:tc>
         <w:tc>
@@ -15971,9 +16449,11 @@
             <w:pPr>
               <w:spacing w:after="160" w:line="259" w:lineRule="auto"/>
             </w:pPr>
+            <w:proofErr w:type="spellStart"/>
             <w:r>
               <w:t>RaceController</w:t>
             </w:r>
+            <w:proofErr w:type="spellEnd"/>
           </w:p>
         </w:tc>
         <w:tc>
@@ -16057,9 +16537,11 @@
             <w:pPr>
               <w:spacing w:after="160" w:line="259" w:lineRule="auto"/>
             </w:pPr>
+            <w:proofErr w:type="spellStart"/>
             <w:r>
               <w:t>RaceController</w:t>
             </w:r>
+            <w:proofErr w:type="spellEnd"/>
           </w:p>
         </w:tc>
         <w:tc>
@@ -16072,8 +16554,13 @@
               <w:spacing w:after="160" w:line="259" w:lineRule="auto"/>
             </w:pPr>
             <w:r>
-              <w:t>Driver, Car, RaceTelemetry</w:t>
-            </w:r>
+              <w:t xml:space="preserve">Driver, Car, </w:t>
+            </w:r>
+            <w:proofErr w:type="spellStart"/>
+            <w:r>
+              <w:t>RaceTelemetry</w:t>
+            </w:r>
+            <w:proofErr w:type="spellEnd"/>
           </w:p>
         </w:tc>
         <w:tc>
@@ -16143,9 +16630,11 @@
             <w:pPr>
               <w:spacing w:after="160" w:line="259" w:lineRule="auto"/>
             </w:pPr>
+            <w:proofErr w:type="spellStart"/>
             <w:r>
               <w:t>RaceController</w:t>
             </w:r>
+            <w:proofErr w:type="spellEnd"/>
           </w:p>
         </w:tc>
         <w:tc>
@@ -16229,9 +16718,11 @@
             <w:pPr>
               <w:spacing w:after="160" w:line="259" w:lineRule="auto"/>
             </w:pPr>
+            <w:proofErr w:type="spellStart"/>
             <w:r>
               <w:t>RaceController</w:t>
             </w:r>
+            <w:proofErr w:type="spellEnd"/>
           </w:p>
         </w:tc>
         <w:tc>
@@ -16244,8 +16735,13 @@
               <w:spacing w:after="160" w:line="259" w:lineRule="auto"/>
             </w:pPr>
             <w:r>
-              <w:t>Car, RaceResult</w:t>
-            </w:r>
+              <w:t xml:space="preserve">Car, </w:t>
+            </w:r>
+            <w:proofErr w:type="spellStart"/>
+            <w:r>
+              <w:t>RaceResult</w:t>
+            </w:r>
+            <w:proofErr w:type="spellEnd"/>
           </w:p>
         </w:tc>
         <w:tc>
@@ -16442,7 +16938,23 @@
     </w:p>
     <w:p>
       <w:r>
-        <w:t>The integration testing phase focused on the interaction between the RaceController and the MainMenu interface. The test verified that race data generated by the controller was successfully passed to the user interface, that the driver roster was populated correctly, and that the Start Race control triggered the connected race start callback.</w:t>
+        <w:t xml:space="preserve">The integration testing phase focused on the interaction between the </w:t>
+      </w:r>
+      <w:proofErr w:type="spellStart"/>
+      <w:r>
+        <w:t>RaceController</w:t>
+      </w:r>
+      <w:proofErr w:type="spellEnd"/>
+      <w:r>
+        <w:t xml:space="preserve"> and the </w:t>
+      </w:r>
+      <w:proofErr w:type="spellStart"/>
+      <w:r>
+        <w:t>MainMenu</w:t>
+      </w:r>
+      <w:proofErr w:type="spellEnd"/>
+      <w:r>
+        <w:t xml:space="preserve"> interface. The test verified that race data generated by the controller was successfully passed to the user interface, that the driver roster was populated correctly, and that the Start Race control triggered the connected race start callback.</w:t>
       </w:r>
     </w:p>
     <w:tbl>
@@ -16571,9 +17083,27 @@
             <w:pPr>
               <w:spacing w:after="160" w:line="259" w:lineRule="auto"/>
             </w:pPr>
-            <w:r>
-              <w:t>RaceController, MainMenu, DriverRosterWidget</w:t>
-            </w:r>
+            <w:proofErr w:type="spellStart"/>
+            <w:r>
+              <w:t>RaceController</w:t>
+            </w:r>
+            <w:proofErr w:type="spellEnd"/>
+            <w:r>
+              <w:t xml:space="preserve">, </w:t>
+            </w:r>
+            <w:proofErr w:type="spellStart"/>
+            <w:r>
+              <w:t>MainMenu</w:t>
+            </w:r>
+            <w:proofErr w:type="spellEnd"/>
+            <w:r>
+              <w:t xml:space="preserve">, </w:t>
+            </w:r>
+            <w:proofErr w:type="spellStart"/>
+            <w:r>
+              <w:t>DriverRosterWidget</w:t>
+            </w:r>
+            <w:proofErr w:type="spellEnd"/>
           </w:p>
         </w:tc>
         <w:tc>
@@ -17799,7 +18329,25 @@
           <w:szCs w:val="24"/>
           <w:highlight w:val="yellow"/>
         </w:rPr>
-        <w:t>. It may also include performance evaluations, scalability, correctness, etc. depending on the focus of the project.  Quantative results may be reported in tables or figures.</w:t>
+        <w:t xml:space="preserve">. It may also include performance evaluations, scalability, correctness, etc. depending on the focus of the project.  </w:t>
+      </w:r>
+      <w:proofErr w:type="spellStart"/>
+      <w:r>
+        <w:rPr>
+          <w:sz w:val="24"/>
+          <w:szCs w:val="24"/>
+          <w:highlight w:val="yellow"/>
+        </w:rPr>
+        <w:t>Quantative</w:t>
+      </w:r>
+      <w:proofErr w:type="spellEnd"/>
+      <w:r>
+        <w:rPr>
+          <w:sz w:val="24"/>
+          <w:szCs w:val="24"/>
+          <w:highlight w:val="yellow"/>
+        </w:rPr>
+        <w:t xml:space="preserve"> results may be reported in tables or figures.</w:t>
       </w:r>
     </w:p>
     <w:p>
@@ -18915,7 +19463,15 @@
     </w:p>
     <w:p>
       <w:r>
-        <w:t>Current motorsport management titles include Motorsport Manager (2016) and F1 Manager (2022–2024). These games present detailed races and authentic visuals, but their simulation depth is fundamentally limited. Driver development is linear and predetermined, making long-term play predictable. Once a player has learned the optimal strategies, the outcomes become repetitive. In contrast, Football Manager maintains replayability by simulating an immense global ecosystem of leagues, players, and staff, where no two careers are the same. This difference highlights the gap between motorsport management games and the broader standard of emergent sports simulations.</w:t>
+        <w:t xml:space="preserve">Current motorsport management titles include Motorsport Manager (2016) and F1 Manager (2022–2024). These games present detailed races and authentic visuals, but their simulation depth is fundamentally limited. Driver development is linear and predetermined, making long-term play predictable. Once a player has learned the optimal strategies, the outcomes become repetitive. In contrast, Football Manager maintains </w:t>
+      </w:r>
+      <w:proofErr w:type="spellStart"/>
+      <w:r>
+        <w:t>replayability</w:t>
+      </w:r>
+      <w:proofErr w:type="spellEnd"/>
+      <w:r>
+        <w:t xml:space="preserve"> by simulating an immense global ecosystem of leagues, players, and staff, where no two careers are the same. This difference highlights the gap between motorsport management games and the broader standard of emergent sports simulations.</w:t>
       </w:r>
     </w:p>
     <w:p>
@@ -19056,7 +19612,15 @@
     </w:p>
     <w:p>
       <w:r>
-        <w:t>Momentum uses Python for both the front-end dashboards and the back-end simulation logic and database management. The system relies on NumPy for fast calculations, Pandas for handling data, and SciPy for advanced statistics. The database uses SQLite to store all the information about drivers, teams, tracks, and championships, making it easy to save and load multi-season histories. All content creation and generation is handled by the database management system.</w:t>
+        <w:t xml:space="preserve">Momentum uses Python for both the front-end dashboards and the back-end simulation logic and database management. The system relies on NumPy for fast calculations, Pandas for handling data, and SciPy for advanced statistics. The database uses SQLite to store all the information about drivers, teams, tracks, and championships, making it easy to save and load multi-season histories. All content creation and generation </w:t>
+      </w:r>
+      <w:proofErr w:type="gramStart"/>
+      <w:r>
+        <w:t>is</w:t>
+      </w:r>
+      <w:proofErr w:type="gramEnd"/>
+      <w:r>
+        <w:t xml:space="preserve"> handled by the database management system.</w:t>
       </w:r>
     </w:p>
     <w:p>
@@ -19073,7 +19637,23 @@
     </w:p>
     <w:p>
       <w:r>
-        <w:t>Race results are produced by a real-time, agent based engine. Each driver is modelled as an autonomous AI agent that makes decisions on every simulation tick, targeting a frame rate of about 30 ticks per second. Agents consider their attributes, car condition, tyre state, fuel, nearby rivals, team orders and track conditions when choosing actions such as attack, defend, overtake or conserve. Discipline specific rules are applied by the engine to reflect differences between single seater, rally, endurance and other formats. Randomness is retained for low probability events such as mechanical failures or incidents so outcomes remain unpredictable, but most race behaviour emerges from agent interactions rather than repeated sampling. Performance sensitive results are cached where appropriate to keep leaderboards and UI queries responsive.</w:t>
+        <w:t xml:space="preserve">Race results are produced by a real-time, </w:t>
+      </w:r>
+      <w:proofErr w:type="gramStart"/>
+      <w:r>
+        <w:t>agent based</w:t>
+      </w:r>
+      <w:proofErr w:type="gramEnd"/>
+      <w:r>
+        <w:t xml:space="preserve"> engine. Each driver is modelled as an autonomous AI agent that makes decisions on every simulation tick, targeting a frame rate of about 30 ticks per second. Agents consider their attributes, car condition, tyre state, fuel, nearby rivals, team orders and track conditions when choosing actions such as attack, defend, overtake or conserve. Discipline specific rules are applied by the engine to reflect differences between single seater, rally, endurance and other formats. Randomness is retained for low probability events such as mechanical failures or </w:t>
+      </w:r>
+      <w:proofErr w:type="gramStart"/>
+      <w:r>
+        <w:t>incidents</w:t>
+      </w:r>
+      <w:proofErr w:type="gramEnd"/>
+      <w:r>
+        <w:t xml:space="preserve"> so outcomes remain unpredictable, but most race behaviour emerges from agent interactions rather than repeated sampling. Performance sensitive results are cached where appropriate to keep leaderboards and UI queries responsive.</w:t>
       </w:r>
     </w:p>
     <w:p>
@@ -20315,7 +20895,15 @@
               <w:jc w:val="both"/>
             </w:pPr>
             <w:r>
-              <w:t>I started building a Python prototype for my game. I began work on the team management, car development, financial management, and the race weekend structure and connected them through a basic Python GUI. The current version is only a prototype. None of the systems are fully finished, and the race simulation is not yet implemented. The main goal was to test ideas and system integration before moving to a more advanced platform.</w:t>
+              <w:t xml:space="preserve">I started building a Python prototype for my game. I began work on </w:t>
+            </w:r>
+            <w:proofErr w:type="gramStart"/>
+            <w:r>
+              <w:t>the team</w:t>
+            </w:r>
+            <w:proofErr w:type="gramEnd"/>
+            <w:r>
+              <w:t xml:space="preserve"> management, car development, financial management, and the race weekend structure and connected them through a basic Python GUI. The current version is only a prototype. None of the systems are fully finished, and the race simulation is not yet implemented. The main goal was to test ideas and system integration before moving to a more advanced platform.</w:t>
             </w:r>
           </w:p>
         </w:tc>
@@ -20757,7 +21345,15 @@
               <w:jc w:val="both"/>
             </w:pPr>
             <w:r>
-              <w:t>Reflect on what has happened in your project this month?</w:t>
+              <w:t xml:space="preserve">Reflect on what </w:t>
+            </w:r>
+            <w:proofErr w:type="gramStart"/>
+            <w:r>
+              <w:t>has happened</w:t>
+            </w:r>
+            <w:proofErr w:type="gramEnd"/>
+            <w:r>
+              <w:t xml:space="preserve"> in your project this month?</w:t>
             </w:r>
           </w:p>
           <w:p>
@@ -20780,8 +21376,13 @@
             <w:pPr>
               <w:jc w:val="both"/>
             </w:pPr>
-            <w:r>
-              <w:t>mostly planning stuff</w:t>
+            <w:proofErr w:type="gramStart"/>
+            <w:r>
+              <w:t>mostly</w:t>
+            </w:r>
+            <w:proofErr w:type="gramEnd"/>
+            <w:r>
+              <w:t xml:space="preserve"> planning stuff</w:t>
             </w:r>
           </w:p>
         </w:tc>
@@ -20818,16 +21419,37 @@
               <w:jc w:val="both"/>
             </w:pPr>
             <w:r>
-              <w:t xml:space="preserve">Consider what that meant for your project progress.  What were your successes? What challenges still remain? </w:t>
+              <w:t xml:space="preserve">Consider what that meant for your project progress.  What were your successes? What challenges </w:t>
+            </w:r>
+            <w:proofErr w:type="gramStart"/>
+            <w:r>
+              <w:t>still remain</w:t>
+            </w:r>
+            <w:proofErr w:type="gramEnd"/>
+            <w:r>
+              <w:t xml:space="preserve">? </w:t>
             </w:r>
           </w:p>
           <w:p>
             <w:pPr>
               <w:jc w:val="both"/>
             </w:pPr>
+            <w:proofErr w:type="gramStart"/>
             <w:r>
               <w:lastRenderedPageBreak/>
-              <w:t>Certainly helped give a direction with use cases and priorities, realised initial proposal was just plain stupid, overly ambitious, and unrealistic for a college project.</w:t>
+              <w:t>Certainly</w:t>
+            </w:r>
+            <w:proofErr w:type="gramEnd"/>
+            <w:r>
+              <w:t xml:space="preserve"> helped give a direction with use cases and priorities, </w:t>
+            </w:r>
+            <w:proofErr w:type="spellStart"/>
+            <w:r>
+              <w:t>realised</w:t>
+            </w:r>
+            <w:proofErr w:type="spellEnd"/>
+            <w:r>
+              <w:t xml:space="preserve"> initial proposal was just plain stupid, overly ambitious, and unrealistic for a college project.</w:t>
             </w:r>
           </w:p>
         </w:tc>
@@ -21212,7 +21834,15 @@
               <w:jc w:val="both"/>
             </w:pPr>
             <w:r>
-              <w:t>Reflect on what has happened in your project this month?</w:t>
+              <w:t xml:space="preserve">Reflect on what </w:t>
+            </w:r>
+            <w:proofErr w:type="gramStart"/>
+            <w:r>
+              <w:t>has happened</w:t>
+            </w:r>
+            <w:proofErr w:type="gramEnd"/>
+            <w:r>
+              <w:t xml:space="preserve"> in your project this month?</w:t>
             </w:r>
           </w:p>
           <w:p>
@@ -21264,7 +21894,15 @@
               <w:jc w:val="both"/>
             </w:pPr>
             <w:r>
-              <w:t xml:space="preserve">Consider what that meant for your project progress.  What were your successes? What challenges still remain? </w:t>
+              <w:t xml:space="preserve">Consider what that meant for your project progress.  What were your successes? What challenges </w:t>
+            </w:r>
+            <w:proofErr w:type="gramStart"/>
+            <w:r>
+              <w:t>still remain</w:t>
+            </w:r>
+            <w:proofErr w:type="gramEnd"/>
+            <w:r>
+              <w:t xml:space="preserve">? </w:t>
             </w:r>
           </w:p>
           <w:p>
@@ -21274,7 +21912,23 @@
           </w:p>
           <w:p>
             <w:r>
-              <w:t>This change gives visible, behaviour for demos, but some docs still describe the old Monte Carlo approach.</w:t>
+              <w:t xml:space="preserve">This change gives </w:t>
+            </w:r>
+            <w:proofErr w:type="gramStart"/>
+            <w:r>
+              <w:t>visible,</w:t>
+            </w:r>
+            <w:proofErr w:type="gramEnd"/>
+            <w:r>
+              <w:t xml:space="preserve"> </w:t>
+            </w:r>
+            <w:proofErr w:type="spellStart"/>
+            <w:r>
+              <w:t>behaviour</w:t>
+            </w:r>
+            <w:proofErr w:type="spellEnd"/>
+            <w:r>
+              <w:t xml:space="preserve"> for demos, but some docs still describe the old Monte Carlo approach.</w:t>
             </w:r>
           </w:p>
           <w:p>

</xml_diff>

<commit_message>
Design Diagrams and better explanations
</commit_message>
<xml_diff>
--- a/docs/Technical Report Eoin Fitzsimons.docx
+++ b/docs/Technical Report Eoin Fitzsimons.docx
@@ -593,7 +593,25 @@
           <w:sz w:val="18"/>
           <w:szCs w:val="18"/>
         </w:rPr>
-        <w:t>supplied by the Library.  To use other author's written or electronic work is illegal (plagiarism) and may result in disciplinary action.  Students may be required to undergo a viva (oral examination) if there is suspicion about the validity of their submitted work.</w:t>
+        <w:t xml:space="preserve">supplied by the </w:t>
+      </w:r>
+      <w:proofErr w:type="gramStart"/>
+      <w:r>
+        <w:rPr>
+          <w:rFonts w:ascii="Verdana" w:hAnsi="Verdana"/>
+          <w:sz w:val="18"/>
+          <w:szCs w:val="18"/>
+        </w:rPr>
+        <w:t>Library</w:t>
+      </w:r>
+      <w:proofErr w:type="gramEnd"/>
+      <w:r>
+        <w:rPr>
+          <w:rFonts w:ascii="Verdana" w:hAnsi="Verdana"/>
+          <w:sz w:val="18"/>
+          <w:szCs w:val="18"/>
+        </w:rPr>
+        <w:t>.  To use other author's written or electronic work is illegal (plagiarism) and may result in disciplinary action.  Students may be required to undergo a viva (oral examination) if there is suspicion about the validity of their submitted work.</w:t>
       </w:r>
     </w:p>
     <w:p/>
@@ -660,7 +678,25 @@
           <w:bCs/>
           <w:highlight w:val="yellow"/>
         </w:rPr>
-        <w:t>successfully complete the Epigeum Academic Integrity Course</w:t>
+        <w:t xml:space="preserve">successfully complete the </w:t>
+      </w:r>
+      <w:proofErr w:type="spellStart"/>
+      <w:r>
+        <w:rPr>
+          <w:b/>
+          <w:bCs/>
+          <w:highlight w:val="yellow"/>
+        </w:rPr>
+        <w:t>Epigeum</w:t>
+      </w:r>
+      <w:proofErr w:type="spellEnd"/>
+      <w:r>
+        <w:rPr>
+          <w:b/>
+          <w:bCs/>
+          <w:highlight w:val="yellow"/>
+        </w:rPr>
+        <w:t xml:space="preserve"> Academic Integrity Course</w:t>
       </w:r>
       <w:r>
         <w:rPr>
@@ -995,7 +1031,21 @@
         <w:rPr>
           <w:b/>
         </w:rPr>
-        <w:t>Any project/assignment not submitted will be marked as a fail.</w:t>
+        <w:t xml:space="preserve">Any project/assignment not submitted will be marked as a </w:t>
+      </w:r>
+      <w:proofErr w:type="gramStart"/>
+      <w:r>
+        <w:rPr>
+          <w:b/>
+        </w:rPr>
+        <w:t>fail</w:t>
+      </w:r>
+      <w:proofErr w:type="gramEnd"/>
+      <w:r>
+        <w:rPr>
+          <w:b/>
+        </w:rPr>
+        <w:t>.</w:t>
       </w:r>
     </w:p>
     <w:p>
@@ -1019,7 +1069,21 @@
         <w:rPr>
           <w:b/>
         </w:rPr>
-        <w:t>Please check that you read AI and Academic Integrity Acknowledgement Supplments in this document</w:t>
+        <w:t xml:space="preserve">Please check that you read AI and Academic Integrity Acknowledgement </w:t>
+      </w:r>
+      <w:proofErr w:type="spellStart"/>
+      <w:r>
+        <w:rPr>
+          <w:b/>
+        </w:rPr>
+        <w:t>Supplments</w:t>
+      </w:r>
+      <w:proofErr w:type="spellEnd"/>
+      <w:r>
+        <w:rPr>
+          <w:b/>
+        </w:rPr>
+        <w:t xml:space="preserve"> in this document</w:t>
       </w:r>
     </w:p>
     <w:p/>
@@ -5600,35 +5664,55 @@
       <w:bookmarkEnd w:id="2"/>
     </w:p>
     <w:p>
-      <w:r>
-        <w:rPr>
-          <w:highlight w:val="yellow"/>
-        </w:rPr>
-        <w:t>Why did you undertake this project?</w:t>
-      </w:r>
-    </w:p>
-    <w:p>
-      <w:r>
-        <w:t xml:space="preserve">Interest in motorsport and simulation games, felt like existing games have too much going on for a user to fully envelop themselves in the simulation part, I wanted to take it back to the </w:t>
-      </w:r>
-      <w:r>
-        <w:t>bare bones</w:t>
-      </w:r>
-      <w:r>
-        <w:t xml:space="preserve"> of what it takes for drivers to race each other around a circuit.</w:t>
-      </w:r>
-      <w:r>
-        <w:t xml:space="preserve"> I found that other projects that exist in this area</w:t>
-      </w:r>
-      <w:r>
-        <w:t>, such as motorsport manager and f1 manager focus too much on graphical fidelity and immersion to the race that you don’t always get the full picture. They are focused on control of one team whereas I wanted to give the full overview.</w:t>
+      <w:pPr>
+        <w:rPr>
+          <w:rFonts w:eastAsia="Times New Roman"/>
+          <w:lang w:eastAsia="en-IE"/>
+        </w:rPr>
+      </w:pPr>
+      <w:bookmarkStart w:id="3" w:name="_Toc236031525"/>
+      <w:r>
+        <w:rPr>
+          <w:rFonts w:eastAsia="Times New Roman"/>
+          <w:lang w:eastAsia="en-IE"/>
+        </w:rPr>
+        <w:t>Motorsport has long combined engineering, strategy, and human decision-making to produce complex competitive environments. Although several motorsport management games exist, many place significant emphasis on graphical presentation and controlling a single team rather than helping users understand how an entire race develops. As a result, it can be difficult for users to observe the factors that influence race outcomes, such as driver behaviour, vehicle condition, or changing race positions.</w:t>
+      </w:r>
+    </w:p>
+    <w:p>
+      <w:pPr>
+        <w:rPr>
+          <w:rFonts w:eastAsia="Times New Roman"/>
+          <w:lang w:eastAsia="en-IE"/>
+        </w:rPr>
+      </w:pPr>
+      <w:r>
+        <w:rPr>
+          <w:rFonts w:eastAsia="Times New Roman"/>
+          <w:lang w:eastAsia="en-IE"/>
+        </w:rPr>
+        <w:t>Momentum was developed to address this by focusing on race simulation rather than graphical realism. The project presents a complete overview of a race, allowing users to observe every driver simultaneously while viewing live telemetry and performance information. Rather than acting as a team manager, the user acts as an observer of the simulation, making it easier to understand how driver characteristics and race events influence the final outcome.</w:t>
+      </w:r>
+    </w:p>
+    <w:p>
+      <w:pPr>
+        <w:rPr>
+          <w:rFonts w:eastAsia="Times New Roman"/>
+          <w:lang w:eastAsia="en-IE"/>
+        </w:rPr>
+      </w:pPr>
+      <w:r>
+        <w:rPr>
+          <w:rFonts w:eastAsia="Times New Roman"/>
+          <w:lang w:eastAsia="en-IE"/>
+        </w:rPr>
+        <w:t>The project also demonstrates software engineering principles including modular architecture, object-oriented design, automated testing, and graphical user interface development. The result is a prototype that combines a simulation engine with an accessible visual interface while remaining within the scope of a final-year undergraduate software development project.</w:t>
       </w:r>
     </w:p>
     <w:p>
       <w:pPr>
         <w:pStyle w:val="Heading2"/>
       </w:pPr>
-      <w:bookmarkStart w:id="3" w:name="_Toc236031525"/>
       <w:r>
         <w:t>Aims</w:t>
       </w:r>
@@ -5636,24 +5720,96 @@
     </w:p>
     <w:p>
       <w:r>
-        <w:rPr>
-          <w:highlight w:val="yellow"/>
-        </w:rPr>
-        <w:t>What does the project aim to achieve?</w:t>
-      </w:r>
-    </w:p>
-    <w:p>
-      <w:r>
-        <w:t xml:space="preserve">To visualise a motorsport race in clear terms, be able to see why a driver makes a decision based on their </w:t>
-      </w:r>
-      <w:r>
-        <w:t>surroundings</w:t>
-      </w:r>
-      <w:r>
-        <w:t>, capabilities, and mentality.</w:t>
-      </w:r>
-      <w:r>
-        <w:t xml:space="preserve"> </w:t>
+        <w:t>The primary aim of Momentum is to design and implement a desktop application capable of simulating and visualising a motorsport race in a way that is both understandable and informative.</w:t>
+      </w:r>
+    </w:p>
+    <w:p>
+      <w:r>
+        <w:t>To achieve this, the project has the following objectives:</w:t>
+      </w:r>
+    </w:p>
+    <w:p>
+      <w:pPr>
+        <w:pStyle w:val="ListParagraph"/>
+        <w:numPr>
+          <w:ilvl w:val="0"/>
+          <w:numId w:val="48"/>
+        </w:numPr>
+      </w:pPr>
+      <w:r>
+        <w:t xml:space="preserve">simulate race progression using an agent-based simulation engine; </w:t>
+      </w:r>
+    </w:p>
+    <w:p>
+      <w:pPr>
+        <w:pStyle w:val="ListParagraph"/>
+        <w:numPr>
+          <w:ilvl w:val="0"/>
+          <w:numId w:val="48"/>
+        </w:numPr>
+      </w:pPr>
+      <w:r>
+        <w:t xml:space="preserve">provide a graphical representation of the race as it develops; </w:t>
+      </w:r>
+    </w:p>
+    <w:p>
+      <w:pPr>
+        <w:pStyle w:val="ListParagraph"/>
+        <w:numPr>
+          <w:ilvl w:val="0"/>
+          <w:numId w:val="48"/>
+        </w:numPr>
+      </w:pPr>
+      <w:r>
+        <w:t xml:space="preserve">generate and display live telemetry for every driver; </w:t>
+      </w:r>
+    </w:p>
+    <w:p>
+      <w:pPr>
+        <w:pStyle w:val="ListParagraph"/>
+        <w:numPr>
+          <w:ilvl w:val="0"/>
+          <w:numId w:val="48"/>
+        </w:numPr>
+      </w:pPr>
+      <w:r>
+        <w:t xml:space="preserve">present driver attributes that influence race behaviour; </w:t>
+      </w:r>
+    </w:p>
+    <w:p>
+      <w:pPr>
+        <w:pStyle w:val="ListParagraph"/>
+        <w:numPr>
+          <w:ilvl w:val="0"/>
+          <w:numId w:val="48"/>
+        </w:numPr>
+      </w:pPr>
+      <w:r>
+        <w:t xml:space="preserve">display final race classifications and statistics; </w:t>
+      </w:r>
+    </w:p>
+    <w:p>
+      <w:pPr>
+        <w:pStyle w:val="ListParagraph"/>
+        <w:numPr>
+          <w:ilvl w:val="0"/>
+          <w:numId w:val="48"/>
+        </w:numPr>
+      </w:pPr>
+      <w:r>
+        <w:t xml:space="preserve">provide accessibility options to improve usability; </w:t>
+      </w:r>
+    </w:p>
+    <w:p>
+      <w:pPr>
+        <w:pStyle w:val="ListParagraph"/>
+        <w:numPr>
+          <w:ilvl w:val="0"/>
+          <w:numId w:val="48"/>
+        </w:numPr>
+      </w:pPr>
+      <w:r>
+        <w:t>demonstrate the use of modern software engineering techniques including layered architecture, modular design and automated testing.</w:t>
       </w:r>
     </w:p>
     <w:p>
@@ -5668,89 +5824,94 @@
     </w:p>
     <w:p>
       <w:r>
-        <w:rPr>
-          <w:highlight w:val="yellow"/>
-        </w:rPr>
-        <w:t>What technology will you use to achieve what you have set out to do</w:t>
-      </w:r>
-      <w:r>
-        <w:rPr>
-          <w:highlight w:val="yellow"/>
-        </w:rPr>
-        <w:t>,</w:t>
-      </w:r>
-      <w:r>
-        <w:rPr>
-          <w:highlight w:val="yellow"/>
-        </w:rPr>
-        <w:t xml:space="preserve"> and how will you use it?</w:t>
-      </w:r>
-    </w:p>
-    <w:p>
-      <w:r>
-        <w:t>GitHub, GitHub Desktop, GitHub Project</w:t>
-      </w:r>
-    </w:p>
-    <w:p>
-      <w:r>
-        <w:t>VSCode</w:t>
-      </w:r>
-    </w:p>
-    <w:p>
-      <w:r>
-        <w:t>Python</w:t>
-      </w:r>
-    </w:p>
-    <w:p>
-      <w:r>
-        <w:t>PyQt6</w:t>
-      </w:r>
-    </w:p>
-    <w:p>
-      <w:r>
-        <w:t>pathlib – Path</w:t>
-      </w:r>
-    </w:p>
-    <w:p>
-      <w:r>
-        <w:t>sys</w:t>
-      </w:r>
-    </w:p>
-    <w:p>
-      <w:r>
-        <w:t>math – cos, sin, pi</w:t>
-      </w:r>
-    </w:p>
-    <w:p>
-      <w:r>
-        <w:t>typing – List, Dict, Tuple</w:t>
-      </w:r>
-    </w:p>
-    <w:p>
-      <w:r>
-        <w:t>json</w:t>
-      </w:r>
-    </w:p>
-    <w:p>
+        <w:t xml:space="preserve">Momentum is developed as a desktop application using Python as the primary programming language. Python was selected because it provides strong support for object-oriented programming, rapid prototyping, data processing and simulation development. It is used to implement the </w:t>
+      </w:r>
+      <w:r>
+        <w:lastRenderedPageBreak/>
+        <w:t>simulation engine, including driver agents, vehicle models, race progression logic and telemetry generation.</w:t>
+      </w:r>
+    </w:p>
+    <w:p>
+      <w:r>
+        <w:t>PyQt6 is used to develop the graphical user interface. It provides the framework required to create desktop windows, layouts, buttons, tables and custom visual components. Within Momentum, PyQt6 is used to display driver information, accessibility settings, the live race view, telemetry data and final race results.</w:t>
+      </w:r>
+    </w:p>
+    <w:p>
+      <w:r>
+        <w:t>JSON is used for persistent configuration storage. Track definitions and accessibility preferences are stored in JSON files because the data is structured, lightweight and does not require the complexity of a database for the current project scope. The simulation data itself is stored using Python objects in runtime memory while the application is running.</w:t>
+      </w:r>
+    </w:p>
+    <w:p>
+      <w:r>
+        <w:t xml:space="preserve">The </w:t>
+      </w:r>
+      <w:proofErr w:type="spellStart"/>
       <w:r>
         <w:t>dataclasses</w:t>
       </w:r>
-    </w:p>
-    <w:p>
-      <w:r>
-        <w:t>random</w:t>
-      </w:r>
-      <w:r>
-        <w:t xml:space="preserve"> - </w:t>
-      </w:r>
-      <w:r>
-        <w:t>SystemRandom</w:t>
-      </w:r>
-    </w:p>
-    <w:p>
+      <w:proofErr w:type="spellEnd"/>
+      <w:r>
+        <w:t xml:space="preserve"> module is used to create structured representations of system entities such as drivers, cars and race data. This improves code organisation by allowing related attributes and behaviours to be grouped together.</w:t>
+      </w:r>
+    </w:p>
+    <w:p>
+      <w:r>
+        <w:t xml:space="preserve">The </w:t>
+      </w:r>
+      <w:proofErr w:type="spellStart"/>
+      <w:r>
+        <w:t>pathlib</w:t>
+      </w:r>
+      <w:proofErr w:type="spellEnd"/>
+      <w:r>
+        <w:t xml:space="preserve"> and </w:t>
+      </w:r>
+      <w:proofErr w:type="spellStart"/>
       <w:r>
         <w:t>os</w:t>
       </w:r>
+      <w:proofErr w:type="spellEnd"/>
+      <w:r>
+        <w:t xml:space="preserve"> libraries are used for file and directory management. They allow the application to </w:t>
+      </w:r>
+      <w:proofErr w:type="gramStart"/>
+      <w:r>
+        <w:t>locate</w:t>
+      </w:r>
+      <w:proofErr w:type="gramEnd"/>
+      <w:r>
+        <w:t xml:space="preserve"> and load required resources, such as configuration files, independently of the user's operating system environment.</w:t>
+      </w:r>
+    </w:p>
+    <w:p>
+      <w:r>
+        <w:t>The random library is used within the simulation engine to introduce controlled variation into race outcomes. This allows drivers with similar performance levels to produce different results while maintaining a deterministic structure when required through controlled random generation.</w:t>
+      </w:r>
+    </w:p>
+    <w:p>
+      <w:r>
+        <w:t>pytest is used as the automated testing framework. It allows individual components of the application to be tested throughout development, including driver generation and race controller functionality. This improves reliability by identifying errors before the complete system is executed.</w:t>
+      </w:r>
+    </w:p>
+    <w:p>
+      <w:r>
+        <w:t>pytest-qt is used alongside pytest to test PyQt6 components. It provides functionality for interacting with graphical interface elements and verifying that the user interface operates correctly.</w:t>
+      </w:r>
+    </w:p>
+    <w:p>
+      <w:r>
+        <w:t>Git and GitHub are used for version control and project management. Git tracks changes to the source code, allowing previous versions to be restored and development progress to be monitored. GitHub provides remote storage for the project repository and supports maintaining a history of implementation changes.</w:t>
+      </w:r>
+    </w:p>
+    <w:p>
+      <w:r>
+        <w:t>Visual Studio Code is used as the integrated development environment. It provides code editing features, debugging tools, extension support and project management capabilities that support Python development.</w:t>
+      </w:r>
+    </w:p>
+    <w:p>
+      <w:r>
+        <w:t>Together, these technologies provide the required functionality to implement the simulation engine, graphical interface, data management and testing framework while maintaining a modular and maintainable software structure.</w:t>
+      </w:r>
     </w:p>
     <w:p>
       <w:pPr>
@@ -5758,19 +5919,22 @@
       </w:pPr>
       <w:bookmarkStart w:id="5" w:name="_Toc236031527"/>
       <w:r>
+        <w:t>Structure</w:t>
+      </w:r>
+      <w:bookmarkEnd w:id="5"/>
+    </w:p>
+    <w:p>
+      <w:r>
+        <w:t>This report is structured into five main sections. Section 1 introduces the project by describing the background, aims, technology choices, and overall structure of the report.</w:t>
+      </w:r>
+    </w:p>
+    <w:p>
+      <w:r>
+        <w:t xml:space="preserve">Section 2 describes the system implementation. This includes the functional requirements, data requirements, user requirements, environmental requirements, usability requirements, system </w:t>
+      </w:r>
+      <w:r>
         <w:lastRenderedPageBreak/>
-        <w:t>Structure</w:t>
-      </w:r>
-      <w:bookmarkEnd w:id="5"/>
-    </w:p>
-    <w:p>
-      <w:r>
-        <w:t>This report is structured into five main sections. Section 1 introduces the project by describing the background, aims, technology choices, and overall structure of the report.</w:t>
-      </w:r>
-    </w:p>
-    <w:p>
-      <w:r>
-        <w:t>Section 2 describes the system implementation. This includes the functional requirements, data requirements, user requirements, environmental requirements, usability requirements, system architecture, implementation details, graphical user interface, testing approach, and evaluation of the completed system.</w:t>
+        <w:t>architecture, implementation details, graphical user interface, testing approach, and evaluation of the completed system.</w:t>
       </w:r>
     </w:p>
     <w:p>
@@ -6051,7 +6215,15 @@
     </w:p>
     <w:p>
       <w:r>
-        <w:t>The MoSCoW prioritisation method was used to classify functional requirements according to their importance. Core functionality required for the successful completion of a race simulation was classified as Must Have, features that improve the user experience but are not essential to the simulation were classified as Should Have or Could Have, while functionality outside the scope of the minimum viable product (MVP) was classified as Won't Have</w:t>
+        <w:t xml:space="preserve">The </w:t>
+      </w:r>
+      <w:proofErr w:type="spellStart"/>
+      <w:r>
+        <w:t>MoSCoW</w:t>
+      </w:r>
+      <w:proofErr w:type="spellEnd"/>
+      <w:r>
+        <w:t xml:space="preserve"> prioritisation method was used to classify functional requirements according to their importance. Core functionality required for the successful completion of a race simulation was classified as Must Have, features that improve the user experience but are not essential to the simulation were classified as Should Have or Could Have, while functionality outside the scope of the minimum viable product (MVP) was classified as Won't Have</w:t>
       </w:r>
       <w:r>
         <w:t>.</w:t>
@@ -6246,13 +6418,7 @@
               </w:rPr>
             </w:pPr>
             <w:r>
-              <w:t xml:space="preserve">A race </w:t>
-            </w:r>
-            <w:r>
-              <w:t>may</w:t>
-            </w:r>
-            <w:r>
-              <w:t xml:space="preserve"> be predefined, </w:t>
+              <w:t xml:space="preserve">A race may be predefined, </w:t>
             </w:r>
             <w:r>
               <w:t xml:space="preserve">as the </w:t>
@@ -6433,16 +6599,7 @@
               <w:t>display</w:t>
             </w:r>
             <w:r>
-              <w:t xml:space="preserve"> of a </w:t>
-            </w:r>
-            <w:r>
-              <w:t>predefin</w:t>
-            </w:r>
-            <w:r>
-              <w:t>ed</w:t>
-            </w:r>
-            <w:r>
-              <w:t xml:space="preserve"> logical race is more important than </w:t>
+              <w:t xml:space="preserve"> of a predefined logical race is more important than </w:t>
             </w:r>
             <w:r>
               <w:t>allowing users to</w:t>
@@ -6465,7 +6622,6 @@
           </w:tcPr>
           <w:p>
             <w:r>
-              <w:lastRenderedPageBreak/>
               <w:t>FR4</w:t>
             </w:r>
           </w:p>
@@ -6665,10 +6821,7 @@
               </w:rPr>
             </w:pPr>
             <w:r>
-              <w:t xml:space="preserve">The project should be </w:t>
-            </w:r>
-            <w:r>
-              <w:t xml:space="preserve">accessible from the </w:t>
+              <w:t xml:space="preserve">The project should be accessible from the </w:t>
             </w:r>
             <w:r>
               <w:t>outset</w:t>
@@ -6694,6 +6847,7 @@
     </w:tbl>
     <w:p>
       <w:r>
+        <w:lastRenderedPageBreak/>
         <w:t>Use Case Diagrams – What are they?</w:t>
       </w:r>
     </w:p>
@@ -9933,10 +10087,7 @@
         <w:t xml:space="preserve">Environmental requirements are represented within </w:t>
       </w:r>
       <w:r>
-        <w:t>IEEE Computer Society Software Engineering Body of Knowledge</w:t>
-      </w:r>
-      <w:r>
-        <w:t xml:space="preserve"> </w:t>
+        <w:t xml:space="preserve">IEEE Computer Society Software Engineering Body of Knowledge </w:t>
       </w:r>
       <w:r>
         <w:t>(</w:t>
@@ -10349,6 +10500,38 @@
       </w:pPr>
       <w:bookmarkStart w:id="14" w:name="_Toc236031536"/>
       <w:r>
+        <w:t>System Architecture Overview</w:t>
+      </w:r>
+    </w:p>
+    <w:p>
+      <w:r>
+        <w:t>Momentum follows a layered architecture consisting of a graphical user interface layer, application logic layer, and data persistence layer. The architecture separates user interaction from simulation processing and data storage, allowing individual components to be developed and tested independently.</w:t>
+      </w:r>
+    </w:p>
+    <w:p>
+      <w:pPr>
+        <w:rPr>
+          <w:rFonts w:asciiTheme="majorHAnsi" w:eastAsiaTheme="majorEastAsia" w:hAnsiTheme="majorHAnsi" w:cstheme="majorBidi"/>
+          <w:b/>
+          <w:bCs/>
+          <w:color w:val="353839" w:themeColor="text1"/>
+        </w:rPr>
+      </w:pPr>
+      <w:r>
+        <w:t>The user interacts with the system through the PyQt6 graphical interface. The interface communicates with the simulation engine through application services, which manage race configuration, driver behaviour, telemetry generation, and race progression. The simulation engine processes the race logic and stores persistent information using</w:t>
+      </w:r>
+      <w:r>
+        <w:t xml:space="preserve"> JSON</w:t>
+      </w:r>
+      <w:r>
+        <w:t>.</w:t>
+      </w:r>
+    </w:p>
+    <w:p>
+      <w:pPr>
+        <w:pStyle w:val="Heading3"/>
+      </w:pPr>
+      <w:r>
         <w:t>Container Diagram</w:t>
       </w:r>
       <w:bookmarkEnd w:id="14"/>
@@ -10358,19 +10541,153 @@
         <w:rPr>
           <w:noProof/>
         </w:rPr>
+        <mc:AlternateContent>
+          <mc:Choice Requires="wps">
+            <w:drawing>
+              <wp:anchor distT="0" distB="0" distL="114300" distR="114300" simplePos="0" relativeHeight="251692032" behindDoc="0" locked="0" layoutInCell="1" allowOverlap="1" wp14:anchorId="0C38D6F0" wp14:editId="6E5692C1">
+                <wp:simplePos x="0" y="0"/>
+                <wp:positionH relativeFrom="column">
+                  <wp:posOffset>0</wp:posOffset>
+                </wp:positionH>
+                <wp:positionV relativeFrom="paragraph">
+                  <wp:posOffset>5205730</wp:posOffset>
+                </wp:positionV>
+                <wp:extent cx="2009775" cy="635"/>
+                <wp:effectExtent l="0" t="0" r="0" b="0"/>
+                <wp:wrapSquare wrapText="bothSides"/>
+                <wp:docPr id="1390214803" name="Text Box 1"/>
+                <wp:cNvGraphicFramePr/>
+                <a:graphic xmlns:a="http://schemas.openxmlformats.org/drawingml/2006/main">
+                  <a:graphicData uri="http://schemas.microsoft.com/office/word/2010/wordprocessingShape">
+                    <wps:wsp>
+                      <wps:cNvSpPr txBox="1"/>
+                      <wps:spPr>
+                        <a:xfrm>
+                          <a:off x="0" y="0"/>
+                          <a:ext cx="2009775" cy="635"/>
+                        </a:xfrm>
+                        <a:prstGeom prst="rect">
+                          <a:avLst/>
+                        </a:prstGeom>
+                        <a:solidFill>
+                          <a:prstClr val="white"/>
+                        </a:solidFill>
+                        <a:ln>
+                          <a:noFill/>
+                        </a:ln>
+                      </wps:spPr>
+                      <wps:txbx>
+                        <w:txbxContent>
+                          <w:p>
+                            <w:pPr>
+                              <w:pStyle w:val="Caption"/>
+                              <w:rPr>
+                                <w:noProof/>
+                                <w:sz w:val="22"/>
+                                <w:szCs w:val="22"/>
+                              </w:rPr>
+                            </w:pPr>
+                            <w:r>
+                              <w:t xml:space="preserve">Design and Architecture </w:t>
+                            </w:r>
+                            <w:r>
+                              <w:fldChar w:fldCharType="begin"/>
+                            </w:r>
+                            <w:r>
+                              <w:instrText xml:space="preserve"> SEQ Design_and_Architecture \* ARABIC </w:instrText>
+                            </w:r>
+                            <w:r>
+                              <w:fldChar w:fldCharType="separate"/>
+                            </w:r>
+                            <w:r>
+                              <w:rPr>
+                                <w:noProof/>
+                              </w:rPr>
+                              <w:t>1</w:t>
+                            </w:r>
+                            <w:r>
+                              <w:fldChar w:fldCharType="end"/>
+                            </w:r>
+                          </w:p>
+                        </w:txbxContent>
+                      </wps:txbx>
+                      <wps:bodyPr rot="0" spcFirstLastPara="0" vertOverflow="overflow" horzOverflow="overflow" vert="horz" wrap="square" lIns="0" tIns="0" rIns="0" bIns="0" numCol="1" spcCol="0" rtlCol="0" fromWordArt="0" anchor="t" anchorCtr="0" forceAA="0" compatLnSpc="1">
+                        <a:prstTxWarp prst="textNoShape">
+                          <a:avLst/>
+                        </a:prstTxWarp>
+                        <a:spAutoFit/>
+                      </wps:bodyPr>
+                    </wps:wsp>
+                  </a:graphicData>
+                </a:graphic>
+              </wp:anchor>
+            </w:drawing>
+          </mc:Choice>
+          <mc:Fallback>
+            <w:pict>
+              <v:shapetype w14:anchorId="0C38D6F0" id="_x0000_t202" coordsize="21600,21600" o:spt="202" path="m,l,21600r21600,l21600,xe">
+                <v:stroke joinstyle="miter"/>
+                <v:path gradientshapeok="t" o:connecttype="rect"/>
+              </v:shapetype>
+              <v:shape id="Text Box 1" o:spid="_x0000_s1026" type="#_x0000_t202" style="position:absolute;margin-left:0;margin-top:409.9pt;width:158.25pt;height:.05pt;z-index:251692032;visibility:visible;mso-wrap-style:square;mso-wrap-distance-left:9pt;mso-wrap-distance-top:0;mso-wrap-distance-right:9pt;mso-wrap-distance-bottom:0;mso-position-horizontal:absolute;mso-position-horizontal-relative:text;mso-position-vertical:absolute;mso-position-vertical-relative:text;v-text-anchor:top" o:gfxdata="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" stroked="f">
+                <v:textbox style="mso-fit-shape-to-text:t" inset="0,0,0,0">
+                  <w:txbxContent>
+                    <w:p>
+                      <w:pPr>
+                        <w:pStyle w:val="Caption"/>
+                        <w:rPr>
+                          <w:noProof/>
+                          <w:sz w:val="22"/>
+                          <w:szCs w:val="22"/>
+                        </w:rPr>
+                      </w:pPr>
+                      <w:r>
+                        <w:t xml:space="preserve">Design and Architecture </w:t>
+                      </w:r>
+                      <w:r>
+                        <w:fldChar w:fldCharType="begin"/>
+                      </w:r>
+                      <w:r>
+                        <w:instrText xml:space="preserve"> SEQ Design_and_Architecture \* ARABIC </w:instrText>
+                      </w:r>
+                      <w:r>
+                        <w:fldChar w:fldCharType="separate"/>
+                      </w:r>
+                      <w:r>
+                        <w:rPr>
+                          <w:noProof/>
+                        </w:rPr>
+                        <w:t>1</w:t>
+                      </w:r>
+                      <w:r>
+                        <w:fldChar w:fldCharType="end"/>
+                      </w:r>
+                    </w:p>
+                  </w:txbxContent>
+                </v:textbox>
+                <w10:wrap type="square"/>
+              </v:shape>
+            </w:pict>
+          </mc:Fallback>
+        </mc:AlternateContent>
+      </w:r>
+      <w:r>
+        <w:rPr>
+          <w:noProof/>
+        </w:rPr>
         <w:drawing>
-          <wp:anchor distT="0" distB="0" distL="114300" distR="114300" simplePos="0" relativeHeight="251664384" behindDoc="0" locked="0" layoutInCell="1" allowOverlap="1" wp14:anchorId="2C93BCC7" wp14:editId="785C04A9">
+          <wp:anchor distT="0" distB="0" distL="114300" distR="114300" simplePos="0" relativeHeight="251689984" behindDoc="0" locked="0" layoutInCell="1" allowOverlap="1" wp14:anchorId="28D8B8EC" wp14:editId="478441D7">
             <wp:simplePos x="0" y="0"/>
-            <wp:positionH relativeFrom="column">
-              <wp:posOffset>0</wp:posOffset>
+            <wp:positionH relativeFrom="margin">
+              <wp:align>left</wp:align>
             </wp:positionH>
             <wp:positionV relativeFrom="paragraph">
-              <wp:posOffset>-1555</wp:posOffset>
+              <wp:posOffset>26604</wp:posOffset>
             </wp:positionV>
-            <wp:extent cx="2343477" cy="7630590"/>
-            <wp:effectExtent l="0" t="0" r="0" b="8890"/>
+            <wp:extent cx="2009775" cy="5122545"/>
+            <wp:effectExtent l="0" t="0" r="9525" b="1905"/>
             <wp:wrapSquare wrapText="bothSides"/>
-            <wp:docPr id="959775510" name="Picture 1"/>
+            <wp:docPr id="1377750474" name="Picture 10"/>
             <wp:cNvGraphicFramePr>
               <a:graphicFrameLocks xmlns:a="http://schemas.openxmlformats.org/drawingml/2006/main" noChangeAspect="1"/>
             </wp:cNvGraphicFramePr>
@@ -10378,8 +10695,10 @@
               <a:graphicData uri="http://schemas.openxmlformats.org/drawingml/2006/picture">
                 <pic:pic xmlns:pic="http://schemas.openxmlformats.org/drawingml/2006/picture">
                   <pic:nvPicPr>
-                    <pic:cNvPr id="959775510" name=""/>
-                    <pic:cNvPicPr/>
+                    <pic:cNvPr id="0" name="Picture 1"/>
+                    <pic:cNvPicPr>
+                      <a:picLocks noChangeAspect="1" noChangeArrowheads="1"/>
+                    </pic:cNvPicPr>
                   </pic:nvPicPr>
                   <pic:blipFill>
                     <a:blip r:embed="rId20">
@@ -10389,22 +10708,33 @@
                         </a:ext>
                       </a:extLst>
                     </a:blip>
+                    <a:srcRect/>
                     <a:stretch>
                       <a:fillRect/>
                     </a:stretch>
                   </pic:blipFill>
-                  <pic:spPr>
+                  <pic:spPr bwMode="auto">
                     <a:xfrm>
                       <a:off x="0" y="0"/>
-                      <a:ext cx="2343477" cy="7630590"/>
+                      <a:ext cx="2009775" cy="5122545"/>
                     </a:xfrm>
                     <a:prstGeom prst="rect">
                       <a:avLst/>
                     </a:prstGeom>
+                    <a:noFill/>
+                    <a:ln>
+                      <a:noFill/>
+                    </a:ln>
                   </pic:spPr>
                 </pic:pic>
               </a:graphicData>
             </a:graphic>
+            <wp14:sizeRelH relativeFrom="margin">
+              <wp14:pctWidth>0</wp14:pctWidth>
+            </wp14:sizeRelH>
+            <wp14:sizeRelV relativeFrom="margin">
+              <wp14:pctHeight>0</wp14:pctHeight>
+            </wp14:sizeRelV>
           </wp:anchor>
         </w:drawing>
       </w:r>
@@ -10447,25 +10777,73 @@
     </w:p>
     <w:p>
       <w:r>
-        <w:t xml:space="preserve">It is a simple diagram that shows the user </w:t>
-      </w:r>
-      <w:r>
-        <w:t>interacts</w:t>
-      </w:r>
-      <w:r>
-        <w:t xml:space="preserve"> only with the UI and the database only with the </w:t>
-      </w:r>
-      <w:r>
-        <w:t xml:space="preserve">simulation </w:t>
-      </w:r>
-      <w:r>
-        <w:t xml:space="preserve">and so on, no </w:t>
-      </w:r>
-      <w:r>
-        <w:t>stage can bypass one it is directly connected with, everything is linear.</w:t>
-      </w:r>
-    </w:p>
-    <w:p>
+        <w:t>The container diagram</w:t>
+      </w:r>
+      <w:r>
+        <w:t xml:space="preserve"> shown in Design and Architecture 1</w:t>
+      </w:r>
+      <w:r>
+        <w:t xml:space="preserve"> represents the major runtime elements within Momentum and their communication paths. The system consists of </w:t>
+      </w:r>
+      <w:r>
+        <w:t>three</w:t>
+      </w:r>
+      <w:r>
+        <w:t xml:space="preserve"> primary containers:</w:t>
+      </w:r>
+    </w:p>
+    <w:p>
+      <w:r>
+        <w:t>User Interface</w:t>
+      </w:r>
+    </w:p>
+    <w:p>
+      <w:r>
+        <w:t>The user interface provides all user interaction, including accessibility options, race monitoring, and results display. It does not directly access the data or perform simulation calculations.</w:t>
+      </w:r>
+    </w:p>
+    <w:p>
+      <w:r>
+        <w:t xml:space="preserve">Application </w:t>
+      </w:r>
+      <w:r>
+        <w:t>Logic</w:t>
+      </w:r>
+    </w:p>
+    <w:p>
+      <w:r>
+        <w:t xml:space="preserve">The application controller manages communication between the interface and </w:t>
+      </w:r>
+      <w:r>
+        <w:t>data persistence</w:t>
+      </w:r>
+      <w:r>
+        <w:t>. It handles requests from the GUI, creates race sessions, and transfers simulation results back to the presentation layer.</w:t>
+      </w:r>
+    </w:p>
+    <w:p>
+      <w:r>
+        <w:t>Data</w:t>
+      </w:r>
+      <w:r>
+        <w:t xml:space="preserve"> Persistence</w:t>
+      </w:r>
+    </w:p>
+    <w:p>
+      <w:r>
+        <w:t>JSON is used to store track configuration and accessibility settings.</w:t>
+      </w:r>
+    </w:p>
+    <w:p>
+      <w:pPr>
+        <w:rPr>
+          <w:rFonts w:asciiTheme="majorHAnsi" w:eastAsiaTheme="majorEastAsia" w:hAnsiTheme="majorHAnsi" w:cstheme="majorBidi"/>
+          <w:b/>
+          <w:bCs/>
+          <w:color w:val="353839" w:themeColor="text1"/>
+        </w:rPr>
+      </w:pPr>
+      <w:bookmarkStart w:id="15" w:name="_Toc236031537"/>
       <w:r>
         <w:br w:type="page"/>
       </w:r>
@@ -10474,7 +10852,6 @@
       <w:pPr>
         <w:pStyle w:val="Heading3"/>
       </w:pPr>
-      <w:bookmarkStart w:id="15" w:name="_Toc236031537"/>
       <w:r>
         <w:lastRenderedPageBreak/>
         <w:t>Component Diagram</w:t>
@@ -10482,15 +10859,18 @@
       <w:bookmarkEnd w:id="15"/>
     </w:p>
     <w:p>
+      <w:pPr>
+        <w:keepNext/>
+      </w:pPr>
       <w:r>
         <w:rPr>
           <w:noProof/>
         </w:rPr>
         <w:drawing>
-          <wp:inline distT="0" distB="0" distL="0" distR="0" wp14:anchorId="6C5E96DA" wp14:editId="52D8D4FC">
-            <wp:extent cx="5731510" cy="4700270"/>
-            <wp:effectExtent l="0" t="0" r="2540" b="5080"/>
-            <wp:docPr id="161336779" name="Picture 1"/>
+          <wp:inline distT="0" distB="0" distL="0" distR="0" wp14:anchorId="22A5B1E0" wp14:editId="261A3E9B">
+            <wp:extent cx="5722620" cy="5352415"/>
+            <wp:effectExtent l="0" t="0" r="0" b="635"/>
+            <wp:docPr id="1376070368" name="Picture 12"/>
             <wp:cNvGraphicFramePr>
               <a:graphicFrameLocks xmlns:a="http://schemas.openxmlformats.org/drawingml/2006/main" noChangeAspect="1"/>
             </wp:cNvGraphicFramePr>
@@ -10498,23 +10878,36 @@
               <a:graphicData uri="http://schemas.openxmlformats.org/drawingml/2006/picture">
                 <pic:pic xmlns:pic="http://schemas.openxmlformats.org/drawingml/2006/picture">
                   <pic:nvPicPr>
-                    <pic:cNvPr id="161336779" name=""/>
-                    <pic:cNvPicPr/>
+                    <pic:cNvPr id="0" name="Picture 5"/>
+                    <pic:cNvPicPr>
+                      <a:picLocks noChangeAspect="1" noChangeArrowheads="1"/>
+                    </pic:cNvPicPr>
                   </pic:nvPicPr>
                   <pic:blipFill>
-                    <a:blip r:embed="rId21"/>
+                    <a:blip r:embed="rId21">
+                      <a:extLst>
+                        <a:ext uri="{28A0092B-C50C-407E-A947-70E740481C1C}">
+                          <a14:useLocalDpi xmlns:a14="http://schemas.microsoft.com/office/drawing/2010/main" val="0"/>
+                        </a:ext>
+                      </a:extLst>
+                    </a:blip>
+                    <a:srcRect/>
                     <a:stretch>
                       <a:fillRect/>
                     </a:stretch>
                   </pic:blipFill>
-                  <pic:spPr>
+                  <pic:spPr bwMode="auto">
                     <a:xfrm>
                       <a:off x="0" y="0"/>
-                      <a:ext cx="5731510" cy="4700270"/>
+                      <a:ext cx="5722620" cy="5352415"/>
                     </a:xfrm>
                     <a:prstGeom prst="rect">
                       <a:avLst/>
                     </a:prstGeom>
+                    <a:noFill/>
+                    <a:ln>
+                      <a:noFill/>
+                    </a:ln>
                   </pic:spPr>
                 </pic:pic>
               </a:graphicData>
@@ -10525,84 +10918,392 @@
     </w:p>
     <w:p>
       <w:pPr>
+        <w:pStyle w:val="Caption"/>
+      </w:pPr>
+      <w:r>
+        <w:t xml:space="preserve">Design and Architecture </w:t>
+      </w:r>
+      <w:r>
+        <w:fldChar w:fldCharType="begin"/>
+      </w:r>
+      <w:r>
+        <w:instrText xml:space="preserve"> SEQ Design_and_Architecture \* ARABIC </w:instrText>
+      </w:r>
+      <w:r>
+        <w:fldChar w:fldCharType="separate"/>
+      </w:r>
+      <w:r>
+        <w:rPr>
+          <w:noProof/>
+        </w:rPr>
+        <w:t>2</w:t>
+      </w:r>
+      <w:r>
+        <w:fldChar w:fldCharType="end"/>
+      </w:r>
+    </w:p>
+    <w:p>
+      <w:r>
+        <w:t>A component diagram shows how system components depend on one another. Dependency arrows indicate relationships between components, while the absence of an arrow suggests no direct dependency</w:t>
+      </w:r>
+      <w:r>
+        <w:t>.</w:t>
+      </w:r>
+      <w:sdt>
+        <w:sdtPr>
+          <w:id w:val="-511772832"/>
+          <w:citation/>
+        </w:sdtPr>
+        <w:sdtContent>
+          <w:r>
+            <w:fldChar w:fldCharType="begin"/>
+          </w:r>
+          <w:r>
+            <w:rPr>
+              <w:lang w:val="en-GB"/>
+            </w:rPr>
+            <w:instrText xml:space="preserve"> CITATION OMG17 \l 2057 </w:instrText>
+          </w:r>
+          <w:r>
+            <w:fldChar w:fldCharType="separate"/>
+          </w:r>
+          <w:r>
+            <w:rPr>
+              <w:noProof/>
+              <w:lang w:val="en-GB"/>
+            </w:rPr>
+            <w:t xml:space="preserve"> </w:t>
+          </w:r>
+          <w:r>
+            <w:rPr>
+              <w:noProof/>
+              <w:lang w:val="en-GB"/>
+            </w:rPr>
+            <w:t>(OMG UML, 2017)</w:t>
+          </w:r>
+          <w:r>
+            <w:fldChar w:fldCharType="end"/>
+          </w:r>
+        </w:sdtContent>
+      </w:sdt>
+    </w:p>
+    <w:p>
+      <w:r>
+        <w:t xml:space="preserve">Design and Architecture 2 </w:t>
+      </w:r>
+      <w:r>
+        <w:t>shows Momentum’s component diagram with a focus on the application logic and four key components:</w:t>
+      </w:r>
+    </w:p>
+    <w:p>
+      <w:r>
+        <w:t>Race Controller</w:t>
+      </w:r>
+    </w:p>
+    <w:p>
+      <w:r>
+        <w:t>The Race Controller coordinates the execution of the race simulation. It initialises the race by loading the selected track, creating the driver and vehicle objects, and managing the simulation loop. During the race, it updates the state of each driver, processes telemetry information, and determines when the race has finished.</w:t>
+      </w:r>
+    </w:p>
+    <w:p>
+      <w:r>
+        <w:t>Track System</w:t>
+      </w:r>
+    </w:p>
+    <w:p>
+      <w:r>
+        <w:t xml:space="preserve">The Track System represents the circuit on which the race takes place. It loads track information from a JSON configuration file, including the track name, number of laps, sector layout, and any </w:t>
+      </w:r>
+      <w:r>
+        <w:lastRenderedPageBreak/>
+        <w:t>other race-specific parameters. This information is supplied to the Race Controller to govern race progression.</w:t>
+      </w:r>
+    </w:p>
+    <w:p>
+      <w:r>
+        <w:t>Driver Agent</w:t>
+      </w:r>
+    </w:p>
+    <w:p>
+      <w:r>
+        <w:t>The Driver Agent models the behaviour of an individual racing driver during the simulation. Each driver maintains attributes and current race state. During each simulation update, the driver agent determines its performance based on these characteristics and the current race conditions.</w:t>
+      </w:r>
+    </w:p>
+    <w:p>
+      <w:r>
+        <w:t>Vehicle Model</w:t>
+      </w:r>
+    </w:p>
+    <w:p>
+      <w:r>
+        <w:t>The Vehicle Model represents the performance characteristics of a driver's car. It stores runtime information such as tyre condition, fuel load, and other variables that influence lap performance. These values are updated throughout the race and are used by the Race Controller when calculating race progression.</w:t>
+      </w:r>
+    </w:p>
+    <w:p>
+      <w:pPr>
+        <w:pStyle w:val="Heading3"/>
+      </w:pPr>
+      <w:r>
+        <w:t>Runtime Data</w:t>
+      </w:r>
+    </w:p>
+    <w:p>
+      <w:r>
+        <w:t xml:space="preserve">Momentum stores </w:t>
+      </w:r>
+      <w:r>
+        <w:t>most</w:t>
+      </w:r>
+      <w:r>
+        <w:t xml:space="preserve"> application data in runtime memory rather than </w:t>
+      </w:r>
+      <w:r>
+        <w:t>in</w:t>
+      </w:r>
+      <w:r>
+        <w:t xml:space="preserve"> a database management system. </w:t>
+      </w:r>
+      <w:r>
+        <w:t xml:space="preserve">When a race begins, runtime </w:t>
+      </w:r>
+      <w:r>
+        <w:t>objects</w:t>
+      </w:r>
+      <w:r>
+        <w:t xml:space="preserve"> such as </w:t>
+      </w:r>
+      <w:r>
+        <w:t>drivers, vehicles, race state, and telemetry</w:t>
+      </w:r>
+      <w:r>
+        <w:t xml:space="preserve"> are created</w:t>
+      </w:r>
+      <w:r>
+        <w:t>, then</w:t>
+      </w:r>
+      <w:r>
+        <w:t xml:space="preserve"> discarded </w:t>
+      </w:r>
+      <w:r>
+        <w:t>when</w:t>
+      </w:r>
+      <w:r>
+        <w:t xml:space="preserve"> the application closes. Only configuration data, </w:t>
+      </w:r>
+      <w:r>
+        <w:t xml:space="preserve">including </w:t>
+      </w:r>
+      <w:r>
+        <w:t xml:space="preserve">track definitions and accessibility settings, </w:t>
+      </w:r>
+      <w:r>
+        <w:t>is</w:t>
+      </w:r>
+      <w:r>
+        <w:t xml:space="preserve"> stored in JSON files </w:t>
+      </w:r>
+      <w:r>
+        <w:t>so it can</w:t>
+      </w:r>
+      <w:r>
+        <w:t xml:space="preserve"> persist between </w:t>
+      </w:r>
+      <w:r>
+        <w:t xml:space="preserve">sessions. This </w:t>
+      </w:r>
+      <w:r>
+        <w:t xml:space="preserve">approach suits the project’s scope </w:t>
+      </w:r>
+      <w:r>
+        <w:t xml:space="preserve">because </w:t>
+      </w:r>
+      <w:r>
+        <w:t xml:space="preserve">the </w:t>
+      </w:r>
+      <w:r>
+        <w:t xml:space="preserve">system </w:t>
+      </w:r>
+      <w:r>
+        <w:t xml:space="preserve">simulates a single race </w:t>
+      </w:r>
+      <w:r>
+        <w:t>and does not require</w:t>
+      </w:r>
+      <w:r>
+        <w:t xml:space="preserve"> long-term data storage. </w:t>
+      </w:r>
+      <w:r>
+        <w:t>Avoiding</w:t>
+      </w:r>
+      <w:r>
+        <w:t xml:space="preserve"> a database</w:t>
+      </w:r>
+      <w:r>
+        <w:t xml:space="preserve"> keeps</w:t>
+      </w:r>
+      <w:r>
+        <w:t xml:space="preserve"> the application </w:t>
+      </w:r>
+      <w:r>
+        <w:t xml:space="preserve">simpler to implement and reduces the overhead </w:t>
+      </w:r>
+      <w:r>
+        <w:t>of</w:t>
+      </w:r>
+      <w:r>
+        <w:t xml:space="preserve"> persistent data management. However, this </w:t>
+      </w:r>
+      <w:r>
+        <w:t xml:space="preserve">design </w:t>
+      </w:r>
+      <w:r>
+        <w:t xml:space="preserve">has </w:t>
+      </w:r>
+      <w:r>
+        <w:t>scalability</w:t>
+      </w:r>
+      <w:r>
+        <w:t xml:space="preserve"> limitations.</w:t>
+      </w:r>
+      <w:r>
+        <w:t xml:space="preserve"> If Momentum were </w:t>
+      </w:r>
+      <w:r>
+        <w:t>expanded</w:t>
+      </w:r>
+      <w:r>
+        <w:t xml:space="preserve"> to support larger datasets, championship progression, historical race results, or career modes, </w:t>
+      </w:r>
+      <w:r>
+        <w:t>relying on runtime memory</w:t>
+      </w:r>
+      <w:r>
+        <w:t xml:space="preserve"> would become </w:t>
+      </w:r>
+      <w:r>
+        <w:t xml:space="preserve">inefficient and </w:t>
+      </w:r>
+      <w:r>
+        <w:t>harder</w:t>
+      </w:r>
+      <w:r>
+        <w:t xml:space="preserve"> to manage. In </w:t>
+      </w:r>
+      <w:r>
+        <w:t>that case</w:t>
+      </w:r>
+      <w:r>
+        <w:t xml:space="preserve">, a database management system would provide persistent storage, improve data organisation, reduce </w:t>
+      </w:r>
+      <w:r>
+        <w:t>dependence</w:t>
+      </w:r>
+      <w:r>
+        <w:t xml:space="preserve"> on runtime memory, and </w:t>
+      </w:r>
+      <w:r>
+        <w:t>support</w:t>
+      </w:r>
+      <w:r>
+        <w:t xml:space="preserve"> efficient querying and retrieval of large volumes of data.</w:t>
+      </w:r>
+    </w:p>
+    <w:p>
+      <w:pPr>
+        <w:pStyle w:val="Heading3"/>
+      </w:pPr>
+      <w:r>
+        <w:lastRenderedPageBreak/>
+        <w:t>Data Flow</w:t>
+      </w:r>
+    </w:p>
+    <w:p>
+      <w:r>
+        <w:rPr>
+          <w:noProof/>
+        </w:rPr>
+        <w:drawing>
+          <wp:inline distT="0" distB="0" distL="0" distR="0" wp14:anchorId="3BCE1A6B" wp14:editId="0FBCAB9D">
+            <wp:extent cx="4201795" cy="3823335"/>
+            <wp:effectExtent l="0" t="0" r="8255" b="5715"/>
+            <wp:docPr id="983920877" name="Picture 13"/>
+            <wp:cNvGraphicFramePr>
+              <a:graphicFrameLocks xmlns:a="http://schemas.openxmlformats.org/drawingml/2006/main" noChangeAspect="1"/>
+            </wp:cNvGraphicFramePr>
+            <a:graphic xmlns:a="http://schemas.openxmlformats.org/drawingml/2006/main">
+              <a:graphicData uri="http://schemas.openxmlformats.org/drawingml/2006/picture">
+                <pic:pic xmlns:pic="http://schemas.openxmlformats.org/drawingml/2006/picture">
+                  <pic:nvPicPr>
+                    <pic:cNvPr id="0" name="Picture 25"/>
+                    <pic:cNvPicPr>
+                      <a:picLocks noChangeAspect="1" noChangeArrowheads="1"/>
+                    </pic:cNvPicPr>
+                  </pic:nvPicPr>
+                  <pic:blipFill>
+                    <a:blip r:embed="rId22">
+                      <a:extLst>
+                        <a:ext uri="{28A0092B-C50C-407E-A947-70E740481C1C}">
+                          <a14:useLocalDpi xmlns:a14="http://schemas.microsoft.com/office/drawing/2010/main" val="0"/>
+                        </a:ext>
+                      </a:extLst>
+                    </a:blip>
+                    <a:srcRect/>
+                    <a:stretch>
+                      <a:fillRect/>
+                    </a:stretch>
+                  </pic:blipFill>
+                  <pic:spPr bwMode="auto">
+                    <a:xfrm>
+                      <a:off x="0" y="0"/>
+                      <a:ext cx="4201795" cy="3823335"/>
+                    </a:xfrm>
+                    <a:prstGeom prst="rect">
+                      <a:avLst/>
+                    </a:prstGeom>
+                    <a:noFill/>
+                    <a:ln>
+                      <a:noFill/>
+                    </a:ln>
+                  </pic:spPr>
+                </pic:pic>
+              </a:graphicData>
+            </a:graphic>
+          </wp:inline>
+        </w:drawing>
+      </w:r>
+    </w:p>
+    <w:p>
+      <w:r>
+        <w:t xml:space="preserve">The user opens the application to the main </w:t>
+      </w:r>
+      <w:proofErr w:type="gramStart"/>
+      <w:r>
+        <w:t>menu,</w:t>
+      </w:r>
+      <w:proofErr w:type="gramEnd"/>
+      <w:r>
+        <w:t xml:space="preserve"> there they can change accessibility options and start the race.</w:t>
+      </w:r>
+    </w:p>
+    <w:p>
+      <w:r>
+        <w:t>Then within the race they can view the telemetry, watch the race to the end, and end the race early.</w:t>
+      </w:r>
+    </w:p>
+    <w:p>
+      <w:r>
+        <w:t xml:space="preserve">Whether they end the race early or see it through to the end, </w:t>
+      </w:r>
+    </w:p>
+    <w:p/>
+    <w:p>
+      <w:pPr>
         <w:rPr>
           <w:sz w:val="24"/>
           <w:szCs w:val="24"/>
         </w:rPr>
       </w:pPr>
-      <w:r>
-        <w:t xml:space="preserve">A </w:t>
-      </w:r>
-      <w:r>
-        <w:t xml:space="preserve">component-based diagram </w:t>
-      </w:r>
-      <w:r>
-        <w:t xml:space="preserve">is a Unified Modelling Language (UML) structural diagram </w:t>
-      </w:r>
-      <w:r>
-        <w:t xml:space="preserve">that shows how </w:t>
-      </w:r>
-      <w:r>
-        <w:t xml:space="preserve">a system </w:t>
-      </w:r>
-      <w:r>
-        <w:t xml:space="preserve">is organised </w:t>
-      </w:r>
-      <w:r>
-        <w:t xml:space="preserve">into modular components and </w:t>
-      </w:r>
-      <w:r>
-        <w:t>how those components relate to one another</w:t>
-      </w:r>
-      <w:r>
-        <w:t>.</w:t>
-      </w:r>
-    </w:p>
-    <w:p>
-      <w:pPr>
-        <w:rPr>
-          <w:sz w:val="24"/>
-          <w:szCs w:val="24"/>
-        </w:rPr>
-      </w:pPr>
-      <w:r>
-        <w:t>Each component contains</w:t>
-      </w:r>
-      <w:r>
-        <w:t xml:space="preserve"> specific functionality and </w:t>
-      </w:r>
-      <w:r>
-        <w:t>exposes</w:t>
-      </w:r>
-      <w:r>
-        <w:t xml:space="preserve"> interfaces </w:t>
-      </w:r>
-      <w:r>
-        <w:t>that allow it to communicate</w:t>
-      </w:r>
-      <w:r>
-        <w:t xml:space="preserve"> with other components.</w:t>
-      </w:r>
-    </w:p>
-    <w:p>
-      <w:pPr>
-        <w:rPr>
-          <w:kern w:val="2"/>
-          <w:lang w:eastAsia="en-IE"/>
-          <w14:ligatures w14:val="standardContextual"/>
-        </w:rPr>
-      </w:pPr>
-      <w:r>
-        <w:t xml:space="preserve">By showing dependencies and interactions, component diagrams make complex systems easier to understand and maintain. </w:t>
-      </w:r>
-      <w:r>
-        <w:rPr>
-          <w:lang w:val="en-GB"/>
-        </w:rPr>
-        <w:t>(Geeks for Geeks, 2026)</w:t>
-      </w:r>
-    </w:p>
-    <w:p/>
+    </w:p>
     <w:p>
       <w:pPr>
         <w:rPr>
@@ -10743,11 +11444,7 @@
           </mc:Choice>
           <mc:Fallback>
             <w:pict>
-              <v:shapetype w14:anchorId="091C9283" id="_x0000_t202" coordsize="21600,21600" o:spt="202" path="m,l,21600r21600,l21600,xe">
-                <v:stroke joinstyle="miter"/>
-                <v:path gradientshapeok="t" o:connecttype="rect"/>
-              </v:shapetype>
-              <v:shape id="Text Box 1" o:spid="_x0000_s1026" type="#_x0000_t202" style="position:absolute;margin-left:0;margin-top:488.4pt;width:193.65pt;height:.05pt;z-index:251685888;visibility:visible;mso-wrap-style:square;mso-wrap-distance-left:9pt;mso-wrap-distance-top:0;mso-wrap-distance-right:9pt;mso-wrap-distance-bottom:0;mso-position-horizontal:absolute;mso-position-horizontal-relative:text;mso-position-vertical:absolute;mso-position-vertical-relative:text;v-text-anchor:top" o:gfxdata="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" stroked="f">
+              <v:shape w14:anchorId="091C9283" id="_x0000_s1027" type="#_x0000_t202" style="position:absolute;margin-left:0;margin-top:488.4pt;width:193.65pt;height:.05pt;z-index:251685888;visibility:visible;mso-wrap-style:square;mso-wrap-distance-left:9pt;mso-wrap-distance-top:0;mso-wrap-distance-right:9pt;mso-wrap-distance-bottom:0;mso-position-horizontal:absolute;mso-position-horizontal-relative:text;mso-position-vertical:absolute;mso-position-vertical-relative:text;v-text-anchor:top" o:gfxdata="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" stroked="f">
                 <v:textbox style="mso-fit-shape-to-text:t" inset="0,0,0,0">
                   <w:txbxContent>
                     <w:p>
@@ -10820,7 +11517,7 @@
                     <pic:cNvPicPr/>
                   </pic:nvPicPr>
                   <pic:blipFill>
-                    <a:blip r:embed="rId22">
+                    <a:blip r:embed="rId23">
                       <a:extLst>
                         <a:ext uri="{28A0092B-C50C-407E-A947-70E740481C1C}">
                           <a14:useLocalDpi xmlns:a14="http://schemas.microsoft.com/office/drawing/2010/main" val="0"/>
@@ -10862,25 +11559,13 @@
         <w:t>meaning</w:t>
       </w:r>
       <w:r>
-        <w:t xml:space="preserve"> </w:t>
-      </w:r>
-      <w:r>
-        <w:t xml:space="preserve">as much </w:t>
-      </w:r>
-      <w:r>
-        <w:t xml:space="preserve">information </w:t>
-      </w:r>
-      <w:r>
-        <w:t xml:space="preserve">as possible </w:t>
+        <w:t xml:space="preserve"> as much information as possible </w:t>
       </w:r>
       <w:r>
         <w:t xml:space="preserve">should be </w:t>
       </w:r>
       <w:r>
-        <w:t>visible as</w:t>
-      </w:r>
-      <w:r>
-        <w:t xml:space="preserve"> soon as it updates.</w:t>
+        <w:t>visible as soon as it updates.</w:t>
       </w:r>
     </w:p>
     <w:p>
@@ -10945,22 +11630,13 @@
         </w:rPr>
       </w:pPr>
       <w:r>
-        <w:t xml:space="preserve">To implement this, </w:t>
-      </w:r>
-      <w:r>
-        <w:t xml:space="preserve">pseudocode </w:t>
-      </w:r>
-      <w:r>
-        <w:t xml:space="preserve">(Telemetry 1) </w:t>
+        <w:t xml:space="preserve">To implement this, pseudocode (Telemetry 1) </w:t>
       </w:r>
       <w:r>
         <w:t>was first written to show</w:t>
       </w:r>
       <w:r>
-        <w:t xml:space="preserve"> how </w:t>
-      </w:r>
-      <w:r>
-        <w:t xml:space="preserve">this feature </w:t>
+        <w:t xml:space="preserve"> how this feature </w:t>
       </w:r>
       <w:r>
         <w:t xml:space="preserve">should </w:t>
@@ -10972,10 +11648,7 @@
         <w:t xml:space="preserve">, along with </w:t>
       </w:r>
       <w:r>
-        <w:t xml:space="preserve">the </w:t>
-      </w:r>
-      <w:r>
-        <w:t xml:space="preserve">project </w:t>
+        <w:t xml:space="preserve">the project </w:t>
       </w:r>
       <w:r>
         <w:t xml:space="preserve">file </w:t>
@@ -10987,10 +11660,7 @@
         <w:t>would</w:t>
       </w:r>
       <w:r>
-        <w:t xml:space="preserve"> go into.</w:t>
-      </w:r>
-      <w:r>
-        <w:t xml:space="preserve"> This feature exists </w:t>
+        <w:t xml:space="preserve"> go into. This feature exists </w:t>
       </w:r>
       <w:r>
         <w:t xml:space="preserve">in </w:t>
@@ -11002,10 +11672,7 @@
         <w:t>the</w:t>
       </w:r>
       <w:r>
-        <w:t xml:space="preserve"> backend and frontend.</w:t>
-      </w:r>
-      <w:r>
-        <w:t xml:space="preserve"> To </w:t>
+        <w:t xml:space="preserve"> backend and frontend. To </w:t>
       </w:r>
       <w:r>
         <w:t>avoid overburdening</w:t>
@@ -11029,13 +11696,7 @@
         <w:t xml:space="preserve">was written </w:t>
       </w:r>
       <w:r>
-        <w:t xml:space="preserve">for the </w:t>
-      </w:r>
-      <w:r>
-        <w:t>frontend,</w:t>
-      </w:r>
-      <w:r>
-        <w:t xml:space="preserve"> but it is very similar, </w:t>
+        <w:t xml:space="preserve">for the frontend, but it is very similar, </w:t>
       </w:r>
       <w:r>
         <w:t xml:space="preserve">with </w:t>
@@ -11083,7 +11744,7 @@
                     <pic:cNvPicPr/>
                   </pic:nvPicPr>
                   <pic:blipFill>
-                    <a:blip r:embed="rId23"/>
+                    <a:blip r:embed="rId24"/>
                     <a:stretch>
                       <a:fillRect/>
                     </a:stretch>
@@ -11135,7 +11796,15 @@
     </w:p>
     <w:p>
       <w:r>
-        <w:t xml:space="preserve">As seen in Telemetry 2, I create the tables using QHBoxLayout, this lines up widgets horizontally without additional need for manually </w:t>
+        <w:t xml:space="preserve">As seen in Telemetry 2, I create the tables using </w:t>
+      </w:r>
+      <w:proofErr w:type="spellStart"/>
+      <w:r>
+        <w:t>QHBoxLayout</w:t>
+      </w:r>
+      <w:proofErr w:type="spellEnd"/>
+      <w:r>
+        <w:t xml:space="preserve">, this lines up widgets horizontally without additional need for manually </w:t>
       </w:r>
       <w:r>
         <w:t>placing</w:t>
@@ -11209,7 +11878,7 @@
                     <pic:cNvPicPr/>
                   </pic:nvPicPr>
                   <pic:blipFill rotWithShape="1">
-                    <a:blip r:embed="rId24"/>
+                    <a:blip r:embed="rId25"/>
                     <a:srcRect t="6374" r="34809"/>
                     <a:stretch>
                       <a:fillRect/>
@@ -11273,7 +11942,15 @@
         <w:t xml:space="preserve">As seen in Telemetry 3, I have an attribute error stemming from line 64 - </w:t>
       </w:r>
       <w:r>
-        <w:t>self._publish_telemetry()</w:t>
+        <w:t>self._</w:t>
+      </w:r>
+      <w:proofErr w:type="spellStart"/>
+      <w:r>
+        <w:t>publish_telemetry</w:t>
+      </w:r>
+      <w:proofErr w:type="spellEnd"/>
+      <w:r>
+        <w:t>()</w:t>
       </w:r>
       <w:r>
         <w:t>. The root cause of this is the telemetry is being called prior to the creation of tables, Telemetry 2 above shows I do have the creation of these tables within my code. This in an architecture issue rather than a</w:t>
@@ -11318,7 +11995,7 @@
                     <pic:cNvPicPr/>
                   </pic:nvPicPr>
                   <pic:blipFill>
-                    <a:blip r:embed="rId25"/>
+                    <a:blip r:embed="rId26"/>
                     <a:stretch>
                       <a:fillRect/>
                     </a:stretch>
@@ -11374,6 +12051,30 @@
       </w:r>
       <w:r>
         <w:t>, I merely had to remove it from the initialisation, I already had a line to populate the tables once they exist.</w:t>
+      </w:r>
+    </w:p>
+    <w:p>
+      <w:pPr>
+        <w:pStyle w:val="Heading4"/>
+      </w:pPr>
+      <w:r>
+        <w:t>Cutoff</w:t>
+      </w:r>
+    </w:p>
+    <w:p>
+      <w:r>
+        <w:t xml:space="preserve">There is more telemetry that could be recorded and displayed, such as individual tyre wear, modelling tyre temperature, driver fatigue, </w:t>
+      </w:r>
+      <w:r>
+        <w:t xml:space="preserve">track grip levels, mini sector times and comparisons to best sector or best lap. But for the purpose of a college </w:t>
+      </w:r>
+      <w:proofErr w:type="gramStart"/>
+      <w:r>
+        <w:t>project</w:t>
+      </w:r>
+      <w:proofErr w:type="gramEnd"/>
+      <w:r>
+        <w:t xml:space="preserve"> it was important to stay with a minimum viable product and not attempt too much and run out of time.</w:t>
       </w:r>
     </w:p>
     <w:p>
@@ -11495,7 +12196,7 @@
           </mc:Choice>
           <mc:Fallback>
             <w:pict>
-              <v:shape w14:anchorId="43DCAA3E" id="_x0000_s1027" type="#_x0000_t202" style="position:absolute;margin-left:0;margin-top:471.15pt;width:328.5pt;height:.05pt;z-index:251663360;visibility:visible;mso-wrap-style:square;mso-wrap-distance-left:9pt;mso-wrap-distance-top:0;mso-wrap-distance-right:9pt;mso-wrap-distance-bottom:0;mso-position-horizontal:absolute;mso-position-horizontal-relative:text;mso-position-vertical:absolute;mso-position-vertical-relative:text;v-text-anchor:top" o:gfxdata="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" stroked="f">
+              <v:shape w14:anchorId="43DCAA3E" id="_x0000_s1028" type="#_x0000_t202" style="position:absolute;margin-left:0;margin-top:471.15pt;width:328.5pt;height:.05pt;z-index:251663360;visibility:visible;mso-wrap-style:square;mso-wrap-distance-left:9pt;mso-wrap-distance-top:0;mso-wrap-distance-right:9pt;mso-wrap-distance-bottom:0;mso-position-horizontal:absolute;mso-position-horizontal-relative:text;mso-position-vertical:absolute;mso-position-vertical-relative:text;v-text-anchor:top" o:gfxdata="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" stroked="f">
                 <v:textbox style="mso-fit-shape-to-text:t" inset="0,0,0,0">
                   <w:txbxContent>
                     <w:p>
@@ -11563,7 +12264,7 @@
                     <pic:cNvPicPr/>
                   </pic:nvPicPr>
                   <pic:blipFill>
-                    <a:blip r:embed="rId26">
+                    <a:blip r:embed="rId27">
                       <a:extLst>
                         <a:ext uri="{28A0092B-C50C-407E-A947-70E740481C1C}">
                           <a14:useLocalDpi xmlns:a14="http://schemas.microsoft.com/office/drawing/2010/main" val="0"/>
@@ -11640,7 +12341,7 @@
                     <pic:cNvPicPr/>
                   </pic:nvPicPr>
                   <pic:blipFill rotWithShape="1">
-                    <a:blip r:embed="rId27">
+                    <a:blip r:embed="rId28">
                       <a:extLst>
                         <a:ext uri="{28A0092B-C50C-407E-A947-70E740481C1C}">
                           <a14:useLocalDpi xmlns:a14="http://schemas.microsoft.com/office/drawing/2010/main" val="0"/>
@@ -11772,7 +12473,7 @@
                     <pic:cNvPicPr/>
                   </pic:nvPicPr>
                   <pic:blipFill>
-                    <a:blip r:embed="rId28"/>
+                    <a:blip r:embed="rId29"/>
                     <a:stretch>
                       <a:fillRect/>
                     </a:stretch>
@@ -11828,6 +12529,20 @@
       </w:r>
       <w:r>
         <w:t xml:space="preserve"> This and the archetypes give some personification to the drivers to keep users’ attention.</w:t>
+      </w:r>
+    </w:p>
+    <w:p>
+      <w:pPr>
+        <w:pStyle w:val="Heading4"/>
+      </w:pPr>
+      <w:r>
+        <w:lastRenderedPageBreak/>
+        <w:t>Cutoff</w:t>
+      </w:r>
+    </w:p>
+    <w:p>
+      <w:r>
+        <w:t>There are many more countries and names that could be included in the project, as well as more attributes that are hyper focused on specific tasks such as trail braking, recovery from gravel, and more. Another big development would be driver progression over a career, how they train certain weaknesses or drop off with age. These were omitted for time.</w:t>
       </w:r>
     </w:p>
     <w:p>
@@ -11942,7 +12657,7 @@
           </mc:Choice>
           <mc:Fallback>
             <w:pict>
-              <v:shape w14:anchorId="66B0D8BD" id="_x0000_s1028" type="#_x0000_t202" style="position:absolute;left:0;text-align:left;margin-left:0;margin-top:517.3pt;width:340.15pt;height:.05pt;z-index:251668480;visibility:visible;mso-wrap-style:square;mso-wrap-distance-left:9pt;mso-wrap-distance-top:0;mso-wrap-distance-right:9pt;mso-wrap-distance-bottom:0;mso-position-horizontal:absolute;mso-position-horizontal-relative:text;mso-position-vertical:absolute;mso-position-vertical-relative:text;v-text-anchor:top" o:gfxdata="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" stroked="f">
+              <v:shape w14:anchorId="66B0D8BD" id="_x0000_s1029" type="#_x0000_t202" style="position:absolute;left:0;text-align:left;margin-left:0;margin-top:517.3pt;width:340.15pt;height:.05pt;z-index:251668480;visibility:visible;mso-wrap-style:square;mso-wrap-distance-left:9pt;mso-wrap-distance-top:0;mso-wrap-distance-right:9pt;mso-wrap-distance-bottom:0;mso-position-horizontal:absolute;mso-position-horizontal-relative:text;mso-position-vertical:absolute;mso-position-vertical-relative:text;v-text-anchor:top" o:gfxdata="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" stroked="f">
                 <v:textbox style="mso-fit-shape-to-text:t" inset="0,0,0,0">
                   <w:txbxContent>
                     <w:p>
@@ -12018,7 +12733,7 @@
                     <pic:cNvPicPr/>
                   </pic:nvPicPr>
                   <pic:blipFill>
-                    <a:blip r:embed="rId29">
+                    <a:blip r:embed="rId30">
                       <a:extLst>
                         <a:ext uri="{28A0092B-C50C-407E-A947-70E740481C1C}">
                           <a14:useLocalDpi xmlns:a14="http://schemas.microsoft.com/office/drawing/2010/main" val="0"/>
@@ -12167,7 +12882,7 @@
                     <pic:cNvPicPr/>
                   </pic:nvPicPr>
                   <pic:blipFill>
-                    <a:blip r:embed="rId30">
+                    <a:blip r:embed="rId31">
                       <a:extLst>
                         <a:ext uri="{28A0092B-C50C-407E-A947-70E740481C1C}">
                           <a14:useLocalDpi xmlns:a14="http://schemas.microsoft.com/office/drawing/2010/main" val="0"/>
@@ -12315,7 +13030,7 @@
           </mc:Choice>
           <mc:Fallback>
             <w:pict>
-              <v:shape w14:anchorId="0D1F66FD" id="_x0000_s1029" type="#_x0000_t202" style="position:absolute;margin-left:0;margin-top:546.7pt;width:165.75pt;height:.05pt;z-index:251670528;visibility:visible;mso-wrap-style:square;mso-wrap-distance-left:9pt;mso-wrap-distance-top:0;mso-wrap-distance-right:9pt;mso-wrap-distance-bottom:0;mso-position-horizontal:left;mso-position-horizontal-relative:margin;mso-position-vertical:absolute;mso-position-vertical-relative:text;v-text-anchor:top" o:gfxdata="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" stroked="f">
+              <v:shape w14:anchorId="0D1F66FD" id="_x0000_s1030" type="#_x0000_t202" style="position:absolute;margin-left:0;margin-top:546.7pt;width:165.75pt;height:.05pt;z-index:251670528;visibility:visible;mso-wrap-style:square;mso-wrap-distance-left:9pt;mso-wrap-distance-top:0;mso-wrap-distance-right:9pt;mso-wrap-distance-bottom:0;mso-position-horizontal:left;mso-position-horizontal-relative:margin;mso-position-vertical:absolute;mso-position-vertical-relative:text;v-text-anchor:top" o:gfxdata="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" stroked="f">
                 <v:textbox style="mso-fit-shape-to-text:t" inset="0,0,0,0">
                   <w:txbxContent>
                     <w:p>
@@ -12463,7 +13178,7 @@
           </mc:Choice>
           <mc:Fallback>
             <w:pict>
-              <v:shape w14:anchorId="60AF45F6" id="_x0000_s1030" type="#_x0000_t202" style="position:absolute;margin-left:0;margin-top:291.55pt;width:212.25pt;height:.05pt;z-index:251673600;visibility:visible;mso-wrap-style:square;mso-wrap-distance-left:9pt;mso-wrap-distance-top:0;mso-wrap-distance-right:9pt;mso-wrap-distance-bottom:0;mso-position-horizontal:absolute;mso-position-horizontal-relative:text;mso-position-vertical:absolute;mso-position-vertical-relative:text;v-text-anchor:top" o:gfxdata="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" stroked="f">
+              <v:shape w14:anchorId="60AF45F6" id="_x0000_s1031" type="#_x0000_t202" style="position:absolute;margin-left:0;margin-top:291.55pt;width:212.25pt;height:.05pt;z-index:251673600;visibility:visible;mso-wrap-style:square;mso-wrap-distance-left:9pt;mso-wrap-distance-top:0;mso-wrap-distance-right:9pt;mso-wrap-distance-bottom:0;mso-position-horizontal:absolute;mso-position-horizontal-relative:text;mso-position-vertical:absolute;mso-position-vertical-relative:text;v-text-anchor:top" o:gfxdata="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" stroked="f">
                 <v:textbox style="mso-fit-shape-to-text:t" inset="0,0,0,0">
                   <w:txbxContent>
                     <w:p>
@@ -12527,7 +13242,7 @@
                     <pic:cNvPicPr/>
                   </pic:nvPicPr>
                   <pic:blipFill>
-                    <a:blip r:embed="rId31">
+                    <a:blip r:embed="rId32">
                       <a:extLst>
                         <a:ext uri="{28A0092B-C50C-407E-A947-70E740481C1C}">
                           <a14:useLocalDpi xmlns:a14="http://schemas.microsoft.com/office/drawing/2010/main" val="0"/>
@@ -12584,7 +13299,7 @@
                     <pic:cNvPicPr/>
                   </pic:nvPicPr>
                   <pic:blipFill>
-                    <a:blip r:embed="rId32"/>
+                    <a:blip r:embed="rId33"/>
                     <a:stretch>
                       <a:fillRect/>
                     </a:stretch>
@@ -12759,7 +13474,7 @@
           </mc:Choice>
           <mc:Fallback>
             <w:pict>
-              <v:shape w14:anchorId="3D424731" id="_x0000_s1031" type="#_x0000_t202" style="position:absolute;margin-left:0;margin-top:274.3pt;width:187.5pt;height:.05pt;z-index:251677696;visibility:visible;mso-wrap-style:square;mso-wrap-distance-left:9pt;mso-wrap-distance-top:0;mso-wrap-distance-right:9pt;mso-wrap-distance-bottom:0;mso-position-horizontal:absolute;mso-position-horizontal-relative:text;mso-position-vertical:absolute;mso-position-vertical-relative:text;v-text-anchor:top" o:gfxdata="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" stroked="f">
+              <v:shape w14:anchorId="3D424731" id="_x0000_s1032" type="#_x0000_t202" style="position:absolute;margin-left:0;margin-top:274.3pt;width:187.5pt;height:.05pt;z-index:251677696;visibility:visible;mso-wrap-style:square;mso-wrap-distance-left:9pt;mso-wrap-distance-top:0;mso-wrap-distance-right:9pt;mso-wrap-distance-bottom:0;mso-position-horizontal:absolute;mso-position-horizontal-relative:text;mso-position-vertical:absolute;mso-position-vertical-relative:text;v-text-anchor:top" o:gfxdata="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" stroked="f">
                 <v:textbox style="mso-fit-shape-to-text:t" inset="0,0,0,0">
                   <w:txbxContent>
                     <w:p>
@@ -12831,7 +13546,7 @@
                     <pic:cNvPicPr/>
                   </pic:nvPicPr>
                   <pic:blipFill>
-                    <a:blip r:embed="rId33">
+                    <a:blip r:embed="rId34">
                       <a:extLst>
                         <a:ext uri="{28A0092B-C50C-407E-A947-70E740481C1C}">
                           <a14:useLocalDpi xmlns:a14="http://schemas.microsoft.com/office/drawing/2010/main" val="0"/>
@@ -12988,7 +13703,7 @@
                     <pic:cNvPicPr/>
                   </pic:nvPicPr>
                   <pic:blipFill>
-                    <a:blip r:embed="rId34">
+                    <a:blip r:embed="rId35">
                       <a:extLst>
                         <a:ext uri="{28A0092B-C50C-407E-A947-70E740481C1C}">
                           <a14:useLocalDpi xmlns:a14="http://schemas.microsoft.com/office/drawing/2010/main" val="0"/>
@@ -13137,7 +13852,7 @@
           </mc:Choice>
           <mc:Fallback>
             <w:pict>
-              <v:shape w14:anchorId="117D87DF" id="_x0000_s1032" type="#_x0000_t202" style="position:absolute;margin-left:0;margin-top:.4pt;width:345.75pt;height:.05pt;z-index:251679744;visibility:visible;mso-wrap-style:square;mso-wrap-distance-left:9pt;mso-wrap-distance-top:0;mso-wrap-distance-right:9pt;mso-wrap-distance-bottom:0;mso-position-horizontal:left;mso-position-horizontal-relative:margin;mso-position-vertical:absolute;mso-position-vertical-relative:text;v-text-anchor:top" o:gfxdata="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" stroked="f">
+              <v:shape w14:anchorId="117D87DF" id="_x0000_s1033" type="#_x0000_t202" style="position:absolute;margin-left:0;margin-top:.4pt;width:345.75pt;height:.05pt;z-index:251679744;visibility:visible;mso-wrap-style:square;mso-wrap-distance-left:9pt;mso-wrap-distance-top:0;mso-wrap-distance-right:9pt;mso-wrap-distance-bottom:0;mso-position-horizontal:left;mso-position-horizontal-relative:margin;mso-position-vertical:absolute;mso-position-vertical-relative:text;v-text-anchor:top" o:gfxdata="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" stroked="f">
                 <v:textbox style="mso-fit-shape-to-text:t" inset="0,0,0,0">
                   <w:txbxContent>
                     <w:p>
@@ -13194,6 +13909,25 @@
           <w:noProof/>
         </w:rPr>
         <w:t>The solution to this problem was found through trial and error. Setting the check to position &lt; 0.24 was tried but then the checkpoint was offset by a minimal but noticable distance.</w:t>
+      </w:r>
+    </w:p>
+    <w:p>
+      <w:pPr>
+        <w:pStyle w:val="Heading4"/>
+        <w:rPr>
+          <w:noProof/>
+        </w:rPr>
+      </w:pPr>
+      <w:r>
+        <w:rPr>
+          <w:noProof/>
+        </w:rPr>
+        <w:t>Cutoff</w:t>
+      </w:r>
+    </w:p>
+    <w:p>
+      <w:r>
+        <w:t>An element that was cut off for time was the implementation of pit lanes, there is a section in the JSON file and dataclass, but no code was added to implement it as a feature. Another track characteristic that could be worked on is different surfaces such as gravel or tarmac runoff, where there would be less grip and the possibility of retirements.</w:t>
       </w:r>
     </w:p>
     <w:p/>
@@ -13326,7 +14060,7 @@
           </mc:Choice>
           <mc:Fallback>
             <w:pict>
-              <v:shape w14:anchorId="35EA4329" id="_x0000_s1033" type="#_x0000_t202" style="position:absolute;left:0;text-align:left;margin-left:18pt;margin-top:603.95pt;width:234.35pt;height:.05pt;z-index:251688960;visibility:visible;mso-wrap-style:square;mso-wrap-distance-left:9pt;mso-wrap-distance-top:0;mso-wrap-distance-right:9pt;mso-wrap-distance-bottom:0;mso-position-horizontal:absolute;mso-position-horizontal-relative:text;mso-position-vertical:absolute;mso-position-vertical-relative:text;v-text-anchor:top" o:gfxdata="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" stroked="f">
+              <v:shape w14:anchorId="35EA4329" id="_x0000_s1034" type="#_x0000_t202" style="position:absolute;left:0;text-align:left;margin-left:18pt;margin-top:603.95pt;width:234.35pt;height:.05pt;z-index:251688960;visibility:visible;mso-wrap-style:square;mso-wrap-distance-left:9pt;mso-wrap-distance-top:0;mso-wrap-distance-right:9pt;mso-wrap-distance-bottom:0;mso-position-horizontal:absolute;mso-position-horizontal-relative:text;mso-position-vertical:absolute;mso-position-vertical-relative:text;v-text-anchor:top" o:gfxdata="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" stroked="f">
                 <v:textbox style="mso-fit-shape-to-text:t" inset="0,0,0,0">
                   <w:txbxContent>
                     <w:p>
@@ -13396,7 +14130,7 @@
                     <pic:cNvPicPr/>
                   </pic:nvPicPr>
                   <pic:blipFill>
-                    <a:blip r:embed="rId35">
+                    <a:blip r:embed="rId36">
                       <a:extLst>
                         <a:ext uri="{28A0092B-C50C-407E-A947-70E740481C1C}">
                           <a14:useLocalDpi xmlns:a14="http://schemas.microsoft.com/office/drawing/2010/main" val="0"/>
@@ -13461,6 +14195,9 @@
         <w:keepNext/>
       </w:pPr>
       <w:r>
+        <w:rPr>
+          <w:noProof/>
+        </w:rPr>
         <w:drawing>
           <wp:inline distT="0" distB="0" distL="0" distR="0" wp14:anchorId="20694F71" wp14:editId="03196830">
             <wp:extent cx="1924319" cy="2038635"/>
@@ -13477,7 +14214,7 @@
                     <pic:cNvPicPr/>
                   </pic:nvPicPr>
                   <pic:blipFill>
-                    <a:blip r:embed="rId36"/>
+                    <a:blip r:embed="rId37"/>
                     <a:stretch>
                       <a:fillRect/>
                     </a:stretch>
@@ -13544,6 +14281,9 @@
         <w:keepNext/>
       </w:pPr>
       <w:r>
+        <w:rPr>
+          <w:noProof/>
+        </w:rPr>
         <w:drawing>
           <wp:inline distT="0" distB="0" distL="0" distR="0" wp14:anchorId="5E8B9AFF" wp14:editId="2CC61582">
             <wp:extent cx="3197499" cy="6069724"/>
@@ -13560,7 +14300,7 @@
                     <pic:cNvPicPr/>
                   </pic:nvPicPr>
                   <pic:blipFill>
-                    <a:blip r:embed="rId37"/>
+                    <a:blip r:embed="rId38"/>
                     <a:stretch>
                       <a:fillRect/>
                     </a:stretch>
@@ -13645,7 +14385,7 @@
                     <pic:cNvPicPr/>
                   </pic:nvPicPr>
                   <pic:blipFill>
-                    <a:blip r:embed="rId38"/>
+                    <a:blip r:embed="rId39"/>
                     <a:stretch>
                       <a:fillRect/>
                     </a:stretch>
@@ -13732,7 +14472,7 @@
                     <pic:cNvPicPr/>
                   </pic:nvPicPr>
                   <pic:blipFill>
-                    <a:blip r:embed="rId39"/>
+                    <a:blip r:embed="rId40"/>
                     <a:stretch>
                       <a:fillRect/>
                     </a:stretch>
@@ -13803,7 +14543,7 @@
                     <pic:cNvPicPr/>
                   </pic:nvPicPr>
                   <pic:blipFill>
-                    <a:blip r:embed="rId40"/>
+                    <a:blip r:embed="rId41"/>
                     <a:stretch>
                       <a:fillRect/>
                     </a:stretch>
@@ -13891,7 +14631,7 @@
                     <pic:cNvPicPr/>
                   </pic:nvPicPr>
                   <pic:blipFill>
-                    <a:blip r:embed="rId41"/>
+                    <a:blip r:embed="rId42"/>
                     <a:stretch>
                       <a:fillRect/>
                     </a:stretch>
@@ -14042,7 +14782,15 @@
     </w:p>
     <w:p>
       <w:r>
-        <w:t>The src directory was converted into a Python package by adding __init__.py files. These files were added to the main source directory and relevant subdirectories, including:</w:t>
+        <w:t xml:space="preserve">The </w:t>
+      </w:r>
+      <w:proofErr w:type="spellStart"/>
+      <w:r>
+        <w:t>src</w:t>
+      </w:r>
+      <w:proofErr w:type="spellEnd"/>
+      <w:r>
+        <w:t xml:space="preserve"> directory was converted into a Python package by adding __init__.py files. These files were added to the main source directory and relevant subdirectories, including:</w:t>
       </w:r>
     </w:p>
     <w:p>
@@ -14052,8 +14800,13 @@
           <w:numId w:val="37"/>
         </w:numPr>
       </w:pPr>
-      <w:r>
-        <w:t>src/</w:t>
+      <w:proofErr w:type="spellStart"/>
+      <w:r>
+        <w:t>src</w:t>
+      </w:r>
+      <w:proofErr w:type="spellEnd"/>
+      <w:r>
+        <w:t>/</w:t>
       </w:r>
       <w:r>
         <w:t xml:space="preserve"> __init__.py</w:t>
@@ -14069,8 +14822,13 @@
           <w:numId w:val="37"/>
         </w:numPr>
       </w:pPr>
-      <w:r>
-        <w:t>src/core/</w:t>
+      <w:proofErr w:type="spellStart"/>
+      <w:r>
+        <w:t>src</w:t>
+      </w:r>
+      <w:proofErr w:type="spellEnd"/>
+      <w:r>
+        <w:t>/core/</w:t>
       </w:r>
       <w:r>
         <w:t xml:space="preserve"> __init__.py</w:t>
@@ -14086,8 +14844,13 @@
           <w:numId w:val="37"/>
         </w:numPr>
       </w:pPr>
-      <w:r>
-        <w:t>src/models/</w:t>
+      <w:proofErr w:type="spellStart"/>
+      <w:r>
+        <w:t>src</w:t>
+      </w:r>
+      <w:proofErr w:type="spellEnd"/>
+      <w:r>
+        <w:t>/models/</w:t>
       </w:r>
       <w:r>
         <w:t xml:space="preserve"> __init__.py</w:t>
@@ -14112,8 +14875,13 @@
       </w:r>
     </w:p>
     <w:p>
-      <w:r>
-        <w:t>pythonpath = .</w:t>
+      <w:proofErr w:type="spellStart"/>
+      <w:r>
+        <w:t>pythonpath</w:t>
+      </w:r>
+      <w:proofErr w:type="spellEnd"/>
+      <w:r>
+        <w:t xml:space="preserve"> = .</w:t>
       </w:r>
     </w:p>
     <w:p>
@@ -14124,8 +14892,21 @@
         <w:t xml:space="preserve"> </w:t>
       </w:r>
       <w:r>
-        <w:t>from src.core.race_controller import RaceController</w:t>
-      </w:r>
+        <w:t xml:space="preserve">from </w:t>
+      </w:r>
+      <w:proofErr w:type="spellStart"/>
+      <w:r>
+        <w:t>src.core.race_controller</w:t>
+      </w:r>
+      <w:proofErr w:type="spellEnd"/>
+      <w:r>
+        <w:t xml:space="preserve"> import </w:t>
+      </w:r>
+      <w:proofErr w:type="spellStart"/>
+      <w:r>
+        <w:t>RaceController</w:t>
+      </w:r>
+      <w:proofErr w:type="spellEnd"/>
       <w:r>
         <w:t xml:space="preserve"> </w:t>
       </w:r>
@@ -14135,7 +14916,15 @@
     </w:p>
     <w:p>
       <w:r>
-        <w:t>Tests were organised using pytest's default naming conventions. Test files must begin with test_ or end with _test.py to be automatically detected by the pytest test discovery system.</w:t>
+        <w:t xml:space="preserve">Tests were organised using </w:t>
+      </w:r>
+      <w:proofErr w:type="spellStart"/>
+      <w:r>
+        <w:t>pytest's</w:t>
+      </w:r>
+      <w:proofErr w:type="spellEnd"/>
+      <w:r>
+        <w:t xml:space="preserve"> default naming conventions. Test files must begin with test_ or end with _test.py to be automatically detected by the pytest test discovery system.</w:t>
       </w:r>
     </w:p>
     <w:p>
@@ -14335,7 +15124,7 @@
           </mc:Choice>
           <mc:Fallback>
             <w:pict>
-              <v:shape w14:anchorId="4B4FE340" id="_x0000_s1034" type="#_x0000_t202" style="position:absolute;margin-left:-61.45pt;margin-top:116.2pt;width:576.9pt;height:.05pt;z-index:251682816;visibility:visible;mso-wrap-style:square;mso-wrap-distance-left:9pt;mso-wrap-distance-top:0;mso-wrap-distance-right:9pt;mso-wrap-distance-bottom:0;mso-position-horizontal:absolute;mso-position-horizontal-relative:text;mso-position-vertical:absolute;mso-position-vertical-relative:text;v-text-anchor:top" o:gfxdata="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" stroked="f">
+              <v:shape w14:anchorId="4B4FE340" id="_x0000_s1035" type="#_x0000_t202" style="position:absolute;margin-left:-61.45pt;margin-top:116.2pt;width:576.9pt;height:.05pt;z-index:251682816;visibility:visible;mso-wrap-style:square;mso-wrap-distance-left:9pt;mso-wrap-distance-top:0;mso-wrap-distance-right:9pt;mso-wrap-distance-bottom:0;mso-position-horizontal:absolute;mso-position-horizontal-relative:text;mso-position-vertical:absolute;mso-position-vertical-relative:text;v-text-anchor:top" o:gfxdata="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" stroked="f">
                 <v:textbox style="mso-fit-shape-to-text:t" inset="0,0,0,0">
                   <w:txbxContent>
                     <w:p>
@@ -14404,7 +15193,7 @@
                     <pic:cNvPicPr/>
                   </pic:nvPicPr>
                   <pic:blipFill>
-                    <a:blip r:embed="rId42">
+                    <a:blip r:embed="rId43">
                       <a:extLst>
                         <a:ext uri="{28A0092B-C50C-407E-A947-70E740481C1C}">
                           <a14:useLocalDpi xmlns:a14="http://schemas.microsoft.com/office/drawing/2010/main" val="0"/>
@@ -14460,10 +15249,7 @@
         </w:rPr>
       </w:pPr>
       <w:r>
-        <w:t xml:space="preserve">pytest-qt is a pytest plugin </w:t>
-      </w:r>
-      <w:r>
-        <w:t xml:space="preserve">for </w:t>
+        <w:t xml:space="preserve">pytest-qt is a pytest plugin for </w:t>
       </w:r>
       <w:r>
         <w:t xml:space="preserve">testing </w:t>
@@ -14486,16 +15272,21 @@
         <w:t>manages</w:t>
       </w:r>
       <w:r>
-        <w:t xml:space="preserve"> qApp creation </w:t>
+        <w:t xml:space="preserve"> </w:t>
+      </w:r>
+      <w:proofErr w:type="spellStart"/>
+      <w:r>
+        <w:t>qApp</w:t>
+      </w:r>
+      <w:proofErr w:type="spellEnd"/>
+      <w:r>
+        <w:t xml:space="preserve"> creation </w:t>
       </w:r>
       <w:r>
         <w:t>when required</w:t>
       </w:r>
       <w:r>
-        <w:t xml:space="preserve"> through </w:t>
-      </w:r>
-      <w:r>
-        <w:t xml:space="preserve"> and provides methods </w:t>
+        <w:t xml:space="preserve"> through  and provides methods </w:t>
       </w:r>
       <w:r>
         <w:t>for simulating</w:t>
@@ -14523,8 +15314,13 @@
       <w:r>
         <w:t xml:space="preserve">, </w:t>
       </w:r>
-      <w:r>
-        <w:t>qt_api=pyqt6</w:t>
+      <w:proofErr w:type="spellStart"/>
+      <w:r>
+        <w:t>qt_api</w:t>
+      </w:r>
+      <w:proofErr w:type="spellEnd"/>
+      <w:r>
+        <w:t>=pyqt6</w:t>
       </w:r>
       <w:r>
         <w:t xml:space="preserve"> needs to be placed in the pytest.ini file.</w:t>
@@ -15704,7 +16500,7 @@
                     <pic:cNvPicPr/>
                   </pic:nvPicPr>
                   <pic:blipFill>
-                    <a:blip r:embed="rId43"/>
+                    <a:blip r:embed="rId44"/>
                     <a:stretch>
                       <a:fillRect/>
                     </a:stretch>
@@ -15833,7 +16629,31 @@
         <w:t xml:space="preserve">This </w:t>
       </w:r>
       <w:r>
-        <w:t>phase primarily focused on the RaceController class. The tests validated the behaviour of its methods and internal state management. Dependent classes, including Driver, Car, RaceTelemetry, and RaceResult, were used during execution to provide the required objects and verify that the controller operated correctly within the simulation environment.</w:t>
+        <w:t xml:space="preserve">phase primarily focused on the </w:t>
+      </w:r>
+      <w:proofErr w:type="spellStart"/>
+      <w:r>
+        <w:t>RaceController</w:t>
+      </w:r>
+      <w:proofErr w:type="spellEnd"/>
+      <w:r>
+        <w:t xml:space="preserve"> class. The tests validated the behaviour of its methods and internal state management. Dependent classes, including Driver, Car, </w:t>
+      </w:r>
+      <w:proofErr w:type="spellStart"/>
+      <w:r>
+        <w:t>RaceTelemetry</w:t>
+      </w:r>
+      <w:proofErr w:type="spellEnd"/>
+      <w:r>
+        <w:t xml:space="preserve">, and </w:t>
+      </w:r>
+      <w:proofErr w:type="spellStart"/>
+      <w:r>
+        <w:t>RaceResult</w:t>
+      </w:r>
+      <w:proofErr w:type="spellEnd"/>
+      <w:r>
+        <w:t>, were used during execution to provide the required objects and verify that the controller operated correctly within the simulation environment.</w:t>
       </w:r>
     </w:p>
     <w:tbl>
@@ -15977,9 +16797,11 @@
             <w:pPr>
               <w:spacing w:after="160" w:line="259" w:lineRule="auto"/>
             </w:pPr>
+            <w:proofErr w:type="spellStart"/>
             <w:r>
               <w:t>RaceController</w:t>
             </w:r>
+            <w:proofErr w:type="spellEnd"/>
           </w:p>
         </w:tc>
         <w:tc>
@@ -15991,9 +16813,11 @@
             <w:pPr>
               <w:spacing w:after="160" w:line="259" w:lineRule="auto"/>
             </w:pPr>
+            <w:proofErr w:type="spellStart"/>
             <w:r>
               <w:t>TrackDefinition</w:t>
             </w:r>
+            <w:proofErr w:type="spellEnd"/>
           </w:p>
         </w:tc>
         <w:tc>
@@ -16063,9 +16887,11 @@
             <w:pPr>
               <w:spacing w:after="160" w:line="259" w:lineRule="auto"/>
             </w:pPr>
+            <w:proofErr w:type="spellStart"/>
             <w:r>
               <w:t>RaceController</w:t>
             </w:r>
+            <w:proofErr w:type="spellEnd"/>
           </w:p>
         </w:tc>
         <w:tc>
@@ -16149,9 +16975,11 @@
             <w:pPr>
               <w:spacing w:after="160" w:line="259" w:lineRule="auto"/>
             </w:pPr>
+            <w:proofErr w:type="spellStart"/>
             <w:r>
               <w:t>RaceController</w:t>
             </w:r>
+            <w:proofErr w:type="spellEnd"/>
           </w:p>
         </w:tc>
         <w:tc>
@@ -16235,9 +17063,11 @@
             <w:pPr>
               <w:spacing w:after="160" w:line="259" w:lineRule="auto"/>
             </w:pPr>
+            <w:proofErr w:type="spellStart"/>
             <w:r>
               <w:t>RaceController</w:t>
             </w:r>
+            <w:proofErr w:type="spellEnd"/>
           </w:p>
         </w:tc>
         <w:tc>
@@ -16321,9 +17151,11 @@
             <w:pPr>
               <w:spacing w:after="160" w:line="259" w:lineRule="auto"/>
             </w:pPr>
+            <w:proofErr w:type="spellStart"/>
             <w:r>
               <w:t>RaceController</w:t>
             </w:r>
+            <w:proofErr w:type="spellEnd"/>
           </w:p>
         </w:tc>
         <w:tc>
@@ -16336,8 +17168,13 @@
               <w:spacing w:after="160" w:line="259" w:lineRule="auto"/>
             </w:pPr>
             <w:r>
-              <w:t>Driver, Car, RaceTelemetry</w:t>
-            </w:r>
+              <w:t xml:space="preserve">Driver, Car, </w:t>
+            </w:r>
+            <w:proofErr w:type="spellStart"/>
+            <w:r>
+              <w:t>RaceTelemetry</w:t>
+            </w:r>
+            <w:proofErr w:type="spellEnd"/>
           </w:p>
         </w:tc>
         <w:tc>
@@ -16407,9 +17244,11 @@
             <w:pPr>
               <w:spacing w:after="160" w:line="259" w:lineRule="auto"/>
             </w:pPr>
+            <w:proofErr w:type="spellStart"/>
             <w:r>
               <w:t>RaceController</w:t>
             </w:r>
+            <w:proofErr w:type="spellEnd"/>
           </w:p>
         </w:tc>
         <w:tc>
@@ -16493,9 +17332,11 @@
             <w:pPr>
               <w:spacing w:after="160" w:line="259" w:lineRule="auto"/>
             </w:pPr>
+            <w:proofErr w:type="spellStart"/>
             <w:r>
               <w:t>RaceController</w:t>
             </w:r>
+            <w:proofErr w:type="spellEnd"/>
           </w:p>
         </w:tc>
         <w:tc>
@@ -16508,8 +17349,13 @@
               <w:spacing w:after="160" w:line="259" w:lineRule="auto"/>
             </w:pPr>
             <w:r>
-              <w:t>Car, RaceResult</w:t>
-            </w:r>
+              <w:t xml:space="preserve">Car, </w:t>
+            </w:r>
+            <w:proofErr w:type="spellStart"/>
+            <w:r>
+              <w:t>RaceResult</w:t>
+            </w:r>
+            <w:proofErr w:type="spellEnd"/>
           </w:p>
         </w:tc>
         <w:tc>
@@ -16576,7 +17422,7 @@
                     <pic:cNvPicPr/>
                   </pic:nvPicPr>
                   <pic:blipFill>
-                    <a:blip r:embed="rId44"/>
+                    <a:blip r:embed="rId45"/>
                     <a:stretch>
                       <a:fillRect/>
                     </a:stretch>
@@ -16706,7 +17552,23 @@
     </w:p>
     <w:p>
       <w:r>
-        <w:t>The integration testing phase focused on the interaction between the RaceController and the MainMenu interface. The test verified that race data generated by the controller was successfully passed to the user interface, that the driver roster was populated correctly, and that the Start Race control triggered the connected race start callback.</w:t>
+        <w:t xml:space="preserve">The integration testing phase focused on the interaction between the </w:t>
+      </w:r>
+      <w:proofErr w:type="spellStart"/>
+      <w:r>
+        <w:t>RaceController</w:t>
+      </w:r>
+      <w:proofErr w:type="spellEnd"/>
+      <w:r>
+        <w:t xml:space="preserve"> and the </w:t>
+      </w:r>
+      <w:proofErr w:type="spellStart"/>
+      <w:r>
+        <w:t>MainMenu</w:t>
+      </w:r>
+      <w:proofErr w:type="spellEnd"/>
+      <w:r>
+        <w:t xml:space="preserve"> interface. The test verified that race data generated by the controller was successfully passed to the user interface, that the driver roster was populated correctly, and that the Start Race control triggered the connected race start callback.</w:t>
       </w:r>
     </w:p>
     <w:tbl>
@@ -16835,9 +17697,27 @@
             <w:pPr>
               <w:spacing w:after="160" w:line="259" w:lineRule="auto"/>
             </w:pPr>
-            <w:r>
-              <w:t>RaceController, MainMenu, DriverRosterWidget</w:t>
-            </w:r>
+            <w:proofErr w:type="spellStart"/>
+            <w:r>
+              <w:t>RaceController</w:t>
+            </w:r>
+            <w:proofErr w:type="spellEnd"/>
+            <w:r>
+              <w:t xml:space="preserve">, </w:t>
+            </w:r>
+            <w:proofErr w:type="spellStart"/>
+            <w:r>
+              <w:t>MainMenu</w:t>
+            </w:r>
+            <w:proofErr w:type="spellEnd"/>
+            <w:r>
+              <w:t xml:space="preserve">, </w:t>
+            </w:r>
+            <w:proofErr w:type="spellStart"/>
+            <w:r>
+              <w:t>DriverRosterWidget</w:t>
+            </w:r>
+            <w:proofErr w:type="spellEnd"/>
           </w:p>
         </w:tc>
         <w:tc>
@@ -16884,6 +17764,9 @@
         <w:keepNext/>
       </w:pPr>
       <w:r>
+        <w:rPr>
+          <w:noProof/>
+        </w:rPr>
         <w:drawing>
           <wp:inline distT="0" distB="0" distL="0" distR="0" wp14:anchorId="03ED407F" wp14:editId="1BF60A03">
             <wp:extent cx="5731510" cy="401955"/>
@@ -16900,7 +17783,7 @@
                     <pic:cNvPicPr/>
                   </pic:nvPicPr>
                   <pic:blipFill>
-                    <a:blip r:embed="rId45"/>
+                    <a:blip r:embed="rId46"/>
                     <a:stretch>
                       <a:fillRect/>
                     </a:stretch>
@@ -17592,7 +18475,7 @@
                     <pic:cNvPicPr/>
                   </pic:nvPicPr>
                   <pic:blipFill>
-                    <a:blip r:embed="rId41"/>
+                    <a:blip r:embed="rId42"/>
                     <a:stretch>
                       <a:fillRect/>
                     </a:stretch>
@@ -17628,6 +18511,9 @@
     </w:p>
     <w:p>
       <w:r>
+        <w:rPr>
+          <w:noProof/>
+        </w:rPr>
         <w:drawing>
           <wp:inline distT="0" distB="0" distL="0" distR="0" wp14:anchorId="050A250F" wp14:editId="0F3F2A99">
             <wp:extent cx="6187481" cy="3006944"/>
@@ -17644,7 +18530,7 @@
                     <pic:cNvPicPr/>
                   </pic:nvPicPr>
                   <pic:blipFill rotWithShape="1">
-                    <a:blip r:embed="rId46"/>
+                    <a:blip r:embed="rId47"/>
                     <a:srcRect l="32266" t="68702" r="30473"/>
                     <a:stretch>
                       <a:fillRect/>
@@ -17690,6 +18576,9 @@
     </w:p>
     <w:p>
       <w:r>
+        <w:rPr>
+          <w:noProof/>
+        </w:rPr>
         <w:drawing>
           <wp:inline distT="0" distB="0" distL="0" distR="0" wp14:anchorId="3FE137BB" wp14:editId="3FEF5426">
             <wp:extent cx="6130303" cy="1726324"/>
@@ -17706,7 +18595,7 @@
                     <pic:cNvPicPr/>
                   </pic:nvPicPr>
                   <pic:blipFill rotWithShape="1">
-                    <a:blip r:embed="rId46"/>
+                    <a:blip r:embed="rId47"/>
                     <a:srcRect l="11415" t="19493" r="11415" b="42945"/>
                     <a:stretch>
                       <a:fillRect/>
@@ -17751,6 +18640,9 @@
     </w:p>
     <w:p>
       <w:r>
+        <w:rPr>
+          <w:noProof/>
+        </w:rPr>
         <w:drawing>
           <wp:inline distT="0" distB="0" distL="0" distR="0" wp14:anchorId="703EA664" wp14:editId="2E8239D3">
             <wp:extent cx="2095792" cy="2248214"/>
@@ -17767,7 +18659,7 @@
                     <pic:cNvPicPr/>
                   </pic:nvPicPr>
                   <pic:blipFill>
-                    <a:blip r:embed="rId47"/>
+                    <a:blip r:embed="rId48"/>
                     <a:stretch>
                       <a:fillRect/>
                     </a:stretch>
@@ -17788,6 +18680,9 @@
         </w:drawing>
       </w:r>
       <w:r>
+        <w:rPr>
+          <w:noProof/>
+        </w:rPr>
         <w:drawing>
           <wp:inline distT="0" distB="0" distL="0" distR="0" wp14:anchorId="7553A379" wp14:editId="24B34501">
             <wp:extent cx="2172003" cy="2229161"/>
@@ -17804,7 +18699,7 @@
                     <pic:cNvPicPr/>
                   </pic:nvPicPr>
                   <pic:blipFill>
-                    <a:blip r:embed="rId48"/>
+                    <a:blip r:embed="rId49"/>
                     <a:stretch>
                       <a:fillRect/>
                     </a:stretch>
@@ -17827,6 +18722,9 @@
     </w:p>
     <w:p>
       <w:r>
+        <w:rPr>
+          <w:noProof/>
+        </w:rPr>
         <w:drawing>
           <wp:inline distT="0" distB="0" distL="0" distR="0" wp14:anchorId="5E1ED623" wp14:editId="32C3A517">
             <wp:extent cx="2081048" cy="629155"/>
@@ -17843,7 +18741,7 @@
                     <pic:cNvPicPr/>
                   </pic:nvPicPr>
                   <pic:blipFill>
-                    <a:blip r:embed="rId49"/>
+                    <a:blip r:embed="rId50"/>
                     <a:stretch>
                       <a:fillRect/>
                     </a:stretch>
@@ -17864,6 +18762,9 @@
         </w:drawing>
       </w:r>
       <w:r>
+        <w:rPr>
+          <w:noProof/>
+        </w:rPr>
         <w:drawing>
           <wp:inline distT="0" distB="0" distL="0" distR="0" wp14:anchorId="33DA037B" wp14:editId="2F816990">
             <wp:extent cx="1943162" cy="616125"/>
@@ -17880,7 +18781,7 @@
                     <pic:cNvPicPr/>
                   </pic:nvPicPr>
                   <pic:blipFill>
-                    <a:blip r:embed="rId50"/>
+                    <a:blip r:embed="rId51"/>
                     <a:stretch>
                       <a:fillRect/>
                     </a:stretch>
@@ -17917,6 +18818,9 @@
     </w:p>
     <w:p>
       <w:r>
+        <w:rPr>
+          <w:noProof/>
+        </w:rPr>
         <w:drawing>
           <wp:inline distT="0" distB="0" distL="0" distR="0" wp14:anchorId="230AA90A" wp14:editId="6B0399C1">
             <wp:extent cx="3791479" cy="3191320"/>
@@ -17933,7 +18837,7 @@
                     <pic:cNvPicPr/>
                   </pic:nvPicPr>
                   <pic:blipFill>
-                    <a:blip r:embed="rId51"/>
+                    <a:blip r:embed="rId52"/>
                     <a:stretch>
                       <a:fillRect/>
                     </a:stretch>
@@ -17969,6 +18873,9 @@
     </w:p>
     <w:p>
       <w:r>
+        <w:rPr>
+          <w:noProof/>
+        </w:rPr>
         <w:drawing>
           <wp:inline distT="0" distB="0" distL="0" distR="0" wp14:anchorId="30697391" wp14:editId="58835B4A">
             <wp:extent cx="1924319" cy="2038635"/>
@@ -17985,7 +18892,7 @@
                     <pic:cNvPicPr/>
                   </pic:nvPicPr>
                   <pic:blipFill>
-                    <a:blip r:embed="rId36"/>
+                    <a:blip r:embed="rId37"/>
                     <a:stretch>
                       <a:fillRect/>
                     </a:stretch>
@@ -18063,8 +18970,163 @@
           <w:szCs w:val="24"/>
           <w:highlight w:val="yellow"/>
         </w:rPr>
-        <w:t>. It may also include performance evaluations, scalability, correctness, etc. depending on the focus of the project.  Quantative results may be reported in tables or figures.</w:t>
-      </w:r>
+        <w:t xml:space="preserve">. It may also include performance evaluations, scalability, correctness, etc. depending on the focus of the project.  </w:t>
+      </w:r>
+      <w:proofErr w:type="spellStart"/>
+      <w:r>
+        <w:rPr>
+          <w:sz w:val="24"/>
+          <w:szCs w:val="24"/>
+          <w:highlight w:val="yellow"/>
+        </w:rPr>
+        <w:t>Quantative</w:t>
+      </w:r>
+      <w:proofErr w:type="spellEnd"/>
+      <w:r>
+        <w:rPr>
+          <w:sz w:val="24"/>
+          <w:szCs w:val="24"/>
+          <w:highlight w:val="yellow"/>
+        </w:rPr>
+        <w:t xml:space="preserve"> results may be reported in tables or figures.</w:t>
+      </w:r>
+    </w:p>
+    <w:p>
+      <w:pPr>
+        <w:ind w:left="360"/>
+        <w:rPr>
+          <w:sz w:val="24"/>
+          <w:szCs w:val="24"/>
+        </w:rPr>
+      </w:pPr>
+      <w:r>
+        <w:rPr>
+          <w:sz w:val="24"/>
+          <w:szCs w:val="24"/>
+        </w:rPr>
+        <w:t>The completed system was evaluated against the functional requirements, software quality, performance and usability objectives established during the requirements phase.</w:t>
+      </w:r>
+    </w:p>
+    <w:p>
+      <w:pPr>
+        <w:ind w:left="360"/>
+        <w:rPr>
+          <w:sz w:val="24"/>
+          <w:szCs w:val="24"/>
+        </w:rPr>
+      </w:pPr>
+      <w:r>
+        <w:rPr>
+          <w:sz w:val="24"/>
+          <w:szCs w:val="24"/>
+        </w:rPr>
+        <w:t>From a functional perspective, all six planned requirements were successfully implemented. The application allows users to generate drivers, configure accessibility options, simulate a race, observe live race progression, monitor telemetry and review the final race classification. Testing demonstrated that each requirement operated correctly during system testing, indicating that the minimum viable product objectives were achieved.</w:t>
+      </w:r>
+    </w:p>
+    <w:p>
+      <w:pPr>
+        <w:ind w:left="360"/>
+        <w:rPr>
+          <w:sz w:val="24"/>
+          <w:szCs w:val="24"/>
+        </w:rPr>
+      </w:pPr>
+      <w:r>
+        <w:rPr>
+          <w:sz w:val="24"/>
+          <w:szCs w:val="24"/>
+        </w:rPr>
+        <w:t xml:space="preserve">The correctness of the implementation was supported through automated testing using pytest and pytest-qt. Unit testing verified the validity of generated driver data, including attribute ranges and uniqueness constraints. Class testing confirmed that the </w:t>
+      </w:r>
+      <w:proofErr w:type="spellStart"/>
+      <w:r>
+        <w:rPr>
+          <w:sz w:val="24"/>
+          <w:szCs w:val="24"/>
+        </w:rPr>
+        <w:t>RaceController</w:t>
+      </w:r>
+      <w:proofErr w:type="spellEnd"/>
+      <w:r>
+        <w:rPr>
+          <w:sz w:val="24"/>
+          <w:szCs w:val="24"/>
+        </w:rPr>
+        <w:t xml:space="preserve"> correctly initialised race state, generated telemetry and produced valid race results. Integration testing demonstrated successful communication between the simulation engine and graphical interface, while manual system testing confirmed that all user-facing functionality operated as intended. All implemented automated tests passed successfully.</w:t>
+      </w:r>
+    </w:p>
+    <w:p>
+      <w:pPr>
+        <w:ind w:left="360"/>
+        <w:rPr>
+          <w:sz w:val="24"/>
+          <w:szCs w:val="24"/>
+        </w:rPr>
+      </w:pPr>
+      <w:r>
+        <w:rPr>
+          <w:sz w:val="24"/>
+          <w:szCs w:val="24"/>
+        </w:rPr>
+        <w:t>Performance was appropriate for the project's intended scale. The simulation updates ten drivers simultaneously while continuously refreshing telemetry and graphical race information without noticeable delay on standard desktop hardware. Runtime memory usage remains relatively low because objects exist only during execution, while JSON files are used only for configuration data. The absence of a database also reduces implementation complexity and minimises storage overhead for the prototype.</w:t>
+      </w:r>
+    </w:p>
+    <w:p>
+      <w:pPr>
+        <w:ind w:left="360"/>
+        <w:rPr>
+          <w:sz w:val="24"/>
+          <w:szCs w:val="24"/>
+        </w:rPr>
+      </w:pPr>
+      <w:r>
+        <w:rPr>
+          <w:sz w:val="24"/>
+          <w:szCs w:val="24"/>
+        </w:rPr>
+        <w:t>The project demonstrates good maintainability through its modular architecture. Separating the graphical interface, simulation logic, runtime data and configuration files reduces coupling between components and allows individual modules to be modified without affecting unrelated parts of the system. This separation also simplifies future expansion.</w:t>
+      </w:r>
+    </w:p>
+    <w:p>
+      <w:pPr>
+        <w:ind w:left="360"/>
+        <w:rPr>
+          <w:sz w:val="24"/>
+          <w:szCs w:val="24"/>
+        </w:rPr>
+      </w:pPr>
+      <w:r>
+        <w:rPr>
+          <w:sz w:val="24"/>
+          <w:szCs w:val="24"/>
+        </w:rPr>
+        <w:t>There are, however, several limitations. The simulation currently models only a single predefined race and does not support championships, career progression or persistent historical data. Track selection is limited, pit stops are not implemented, and vehicle behaviour remains intentionally simplified to remain within the scope of the project. Consequently, while the system demonstrates the core concepts of race simulation and telemetry visualisation, it should be viewed as a functional prototype rather than a complete motorsport management game.</w:t>
+      </w:r>
+    </w:p>
+    <w:p>
+      <w:pPr>
+        <w:ind w:left="360"/>
+        <w:rPr>
+          <w:sz w:val="24"/>
+          <w:szCs w:val="24"/>
+        </w:rPr>
+      </w:pPr>
+      <w:r>
+        <w:rPr>
+          <w:sz w:val="24"/>
+          <w:szCs w:val="24"/>
+        </w:rPr>
+        <w:lastRenderedPageBreak/>
+        <w:t>Overall, the evaluation indicates that Momentum successfully satisfies the objectives established for the project while providing a strong architectural foundation for future development.</w:t>
+      </w:r>
+    </w:p>
+    <w:p>
+      <w:pPr>
+        <w:rPr>
+          <w:sz w:val="24"/>
+          <w:szCs w:val="24"/>
+        </w:rPr>
+      </w:pPr>
     </w:p>
     <w:p>
       <w:pPr>
@@ -18972,7 +20034,7 @@
           <w:noProof/>
         </w:rPr>
         <w:drawing>
-          <wp:inline distT="0" distB="0" distL="0" distR="0" wp14:anchorId="15905F45" wp14:editId="5DA07B68">
+          <wp:inline distT="0" distB="0" distL="0" distR="0" wp14:anchorId="15905F45" wp14:editId="399E036A">
             <wp:extent cx="1724025" cy="1228725"/>
             <wp:effectExtent l="0" t="0" r="0" b="0"/>
             <wp:docPr id="1287158093" name="Picture 4" descr="A blue and white logo&#10;&#10;AI-generated content may be incorrect."/>
@@ -18989,7 +20051,7 @@
                     </pic:cNvPicPr>
                   </pic:nvPicPr>
                   <pic:blipFill>
-                    <a:blip r:embed="rId52" cstate="print">
+                    <a:blip r:embed="rId53" cstate="print">
                       <a:extLst>
                         <a:ext uri="{28A0092B-C50C-407E-A947-70E740481C1C}">
                           <a14:useLocalDpi xmlns:a14="http://schemas.microsoft.com/office/drawing/2010/main" val="0"/>
@@ -19179,7 +20241,15 @@
     </w:p>
     <w:p>
       <w:r>
-        <w:t>Current motorsport management titles include Motorsport Manager (2016) and F1 Manager (2022–2024). These games present detailed races and authentic visuals, but their simulation depth is fundamentally limited. Driver development is linear and predetermined, making long-term play predictable. Once a player has learned the optimal strategies, the outcomes become repetitive. In contrast, Football Manager maintains replayability by simulating an immense global ecosystem of leagues, players, and staff, where no two careers are the same. This difference highlights the gap between motorsport management games and the broader standard of emergent sports simulations.</w:t>
+        <w:t xml:space="preserve">Current motorsport management titles include Motorsport Manager (2016) and F1 Manager (2022–2024). These games present detailed races and authentic visuals, but their simulation depth is fundamentally limited. Driver development is linear and predetermined, making long-term play predictable. Once a player has learned the optimal strategies, the outcomes become repetitive. In contrast, Football Manager maintains </w:t>
+      </w:r>
+      <w:proofErr w:type="spellStart"/>
+      <w:r>
+        <w:t>replayability</w:t>
+      </w:r>
+      <w:proofErr w:type="spellEnd"/>
+      <w:r>
+        <w:t xml:space="preserve"> by simulating an immense global ecosystem of leagues, players, and staff, where no two careers are the same. This difference highlights the gap between motorsport management games and the broader standard of emergent sports simulations.</w:t>
       </w:r>
     </w:p>
     <w:p>
@@ -19320,7 +20390,15 @@
     </w:p>
     <w:p>
       <w:r>
-        <w:t>Momentum uses Python for both the front-end dashboards and the back-end simulation logic and database management. The system relies on NumPy for fast calculations, Pandas for handling data, and SciPy for advanced statistics. The database uses SQLite to store all the information about drivers, teams, tracks, and championships, making it easy to save and load multi-season histories. All content creation and generation is handled by the database management system.</w:t>
+        <w:t xml:space="preserve">Momentum uses Python for both the front-end dashboards and the back-end simulation logic and database management. The system relies on NumPy for fast calculations, Pandas for handling data, and SciPy for advanced statistics. The database uses SQLite to store all the information about drivers, teams, tracks, and championships, making it easy to save and load multi-season histories. All content creation and generation </w:t>
+      </w:r>
+      <w:proofErr w:type="gramStart"/>
+      <w:r>
+        <w:t>is</w:t>
+      </w:r>
+      <w:proofErr w:type="gramEnd"/>
+      <w:r>
+        <w:t xml:space="preserve"> handled by the database management system.</w:t>
       </w:r>
     </w:p>
     <w:p>
@@ -19337,7 +20415,23 @@
     </w:p>
     <w:p>
       <w:r>
-        <w:t>Race results are produced by a real-time, agent based engine. Each driver is modelled as an autonomous AI agent that makes decisions on every simulation tick, targeting a frame rate of about 30 ticks per second. Agents consider their attributes, car condition, tyre state, fuel, nearby rivals, team orders and track conditions when choosing actions such as attack, defend, overtake or conserve. Discipline specific rules are applied by the engine to reflect differences between single seater, rally, endurance and other formats. Randomness is retained for low probability events such as mechanical failures or incidents so outcomes remain unpredictable, but most race behaviour emerges from agent interactions rather than repeated sampling. Performance sensitive results are cached where appropriate to keep leaderboards and UI queries responsive.</w:t>
+        <w:t xml:space="preserve">Race results are produced by a real-time, </w:t>
+      </w:r>
+      <w:proofErr w:type="gramStart"/>
+      <w:r>
+        <w:t>agent based</w:t>
+      </w:r>
+      <w:proofErr w:type="gramEnd"/>
+      <w:r>
+        <w:t xml:space="preserve"> engine. Each driver is modelled as an autonomous AI agent that makes decisions on every simulation tick, targeting a frame rate of about 30 ticks per second. Agents consider their attributes, car condition, tyre state, fuel, nearby rivals, team orders and track conditions when choosing actions such as attack, defend, overtake or conserve. Discipline specific rules are applied by the engine to reflect differences between single seater, rally, endurance and other formats. Randomness is retained for low probability events such as mechanical failures or </w:t>
+      </w:r>
+      <w:proofErr w:type="gramStart"/>
+      <w:r>
+        <w:t>incidents</w:t>
+      </w:r>
+      <w:proofErr w:type="gramEnd"/>
+      <w:r>
+        <w:t xml:space="preserve"> so outcomes remain unpredictable, but most race behaviour emerges from agent interactions rather than repeated sampling. Performance sensitive results are cached where appropriate to keep leaderboards and UI queries responsive.</w:t>
       </w:r>
     </w:p>
     <w:p>
@@ -19727,7 +20821,7 @@
           <w:noProof/>
         </w:rPr>
         <w:drawing>
-          <wp:inline distT="0" distB="0" distL="0" distR="0" wp14:anchorId="4440363F" wp14:editId="1C0742F5">
+          <wp:inline distT="0" distB="0" distL="0" distR="0" wp14:anchorId="4440363F" wp14:editId="51DA2A85">
             <wp:extent cx="5486400" cy="3838575"/>
             <wp:effectExtent l="0" t="0" r="0" b="9525"/>
             <wp:docPr id="383730404" name="Picture 3" descr="A screenshot of a computer program&#10;&#10;AI-generated content may be incorrect."/>
@@ -19744,7 +20838,7 @@
                     </pic:cNvPicPr>
                   </pic:nvPicPr>
                   <pic:blipFill>
-                    <a:blip r:embed="rId53" cstate="print">
+                    <a:blip r:embed="rId54" cstate="print">
                       <a:extLst>
                         <a:ext uri="{28A0092B-C50C-407E-A947-70E740481C1C}">
                           <a14:useLocalDpi xmlns:a14="http://schemas.microsoft.com/office/drawing/2010/main" val="0"/>
@@ -20579,7 +21673,15 @@
               <w:jc w:val="both"/>
             </w:pPr>
             <w:r>
-              <w:t>I started building a Python prototype for my game. I began work on the team management, car development, financial management, and the race weekend structure and connected them through a basic Python GUI. The current version is only a prototype. None of the systems are fully finished, and the race simulation is not yet implemented. The main goal was to test ideas and system integration before moving to a more advanced platform.</w:t>
+              <w:t xml:space="preserve">I started building a Python prototype for my game. I began work on </w:t>
+            </w:r>
+            <w:proofErr w:type="gramStart"/>
+            <w:r>
+              <w:t>the team</w:t>
+            </w:r>
+            <w:proofErr w:type="gramEnd"/>
+            <w:r>
+              <w:t xml:space="preserve"> management, car development, financial management, and the race weekend structure and connected them through a basic Python GUI. The current version is only a prototype. None of the systems are fully finished, and the race simulation is not yet implemented. The main goal was to test ideas and system integration before moving to a more advanced platform.</w:t>
             </w:r>
           </w:p>
         </w:tc>
@@ -21021,7 +22123,15 @@
               <w:jc w:val="both"/>
             </w:pPr>
             <w:r>
-              <w:t>Reflect on what has happened in your project this month?</w:t>
+              <w:t xml:space="preserve">Reflect on what </w:t>
+            </w:r>
+            <w:proofErr w:type="gramStart"/>
+            <w:r>
+              <w:t>has happened</w:t>
+            </w:r>
+            <w:proofErr w:type="gramEnd"/>
+            <w:r>
+              <w:t xml:space="preserve"> in your project this month?</w:t>
             </w:r>
           </w:p>
           <w:p>
@@ -21044,8 +22154,13 @@
             <w:pPr>
               <w:jc w:val="both"/>
             </w:pPr>
-            <w:r>
-              <w:t>mostly planning stuff</w:t>
+            <w:proofErr w:type="gramStart"/>
+            <w:r>
+              <w:t>mostly</w:t>
+            </w:r>
+            <w:proofErr w:type="gramEnd"/>
+            <w:r>
+              <w:t xml:space="preserve"> planning stuff</w:t>
             </w:r>
           </w:p>
         </w:tc>
@@ -21082,16 +22197,37 @@
               <w:jc w:val="both"/>
             </w:pPr>
             <w:r>
-              <w:t xml:space="preserve">Consider what that meant for your project progress.  What were your successes? What challenges still remain? </w:t>
+              <w:t xml:space="preserve">Consider what that meant for your project progress.  What were your successes? What challenges </w:t>
+            </w:r>
+            <w:proofErr w:type="gramStart"/>
+            <w:r>
+              <w:t>still remain</w:t>
+            </w:r>
+            <w:proofErr w:type="gramEnd"/>
+            <w:r>
+              <w:t xml:space="preserve">? </w:t>
             </w:r>
           </w:p>
           <w:p>
             <w:pPr>
               <w:jc w:val="both"/>
             </w:pPr>
+            <w:proofErr w:type="gramStart"/>
             <w:r>
               <w:lastRenderedPageBreak/>
-              <w:t>Certainly helped give a direction with use cases and priorities, realised initial proposal was just plain stupid, overly ambitious, and unrealistic for a college project.</w:t>
+              <w:t>Certainly</w:t>
+            </w:r>
+            <w:proofErr w:type="gramEnd"/>
+            <w:r>
+              <w:t xml:space="preserve"> helped give a direction with use cases and priorities, </w:t>
+            </w:r>
+            <w:proofErr w:type="spellStart"/>
+            <w:r>
+              <w:t>realised</w:t>
+            </w:r>
+            <w:proofErr w:type="spellEnd"/>
+            <w:r>
+              <w:t xml:space="preserve"> initial proposal was just plain stupid, overly ambitious, and unrealistic for a college project.</w:t>
             </w:r>
           </w:p>
         </w:tc>
@@ -21476,7 +22612,15 @@
               <w:jc w:val="both"/>
             </w:pPr>
             <w:r>
-              <w:t>Reflect on what has happened in your project this month?</w:t>
+              <w:t xml:space="preserve">Reflect on what </w:t>
+            </w:r>
+            <w:proofErr w:type="gramStart"/>
+            <w:r>
+              <w:t>has happened</w:t>
+            </w:r>
+            <w:proofErr w:type="gramEnd"/>
+            <w:r>
+              <w:t xml:space="preserve"> in your project this month?</w:t>
             </w:r>
           </w:p>
           <w:p>
@@ -21528,7 +22672,15 @@
               <w:jc w:val="both"/>
             </w:pPr>
             <w:r>
-              <w:t xml:space="preserve">Consider what that meant for your project progress.  What were your successes? What challenges still remain? </w:t>
+              <w:t xml:space="preserve">Consider what that meant for your project progress.  What were your successes? What challenges </w:t>
+            </w:r>
+            <w:proofErr w:type="gramStart"/>
+            <w:r>
+              <w:t>still remain</w:t>
+            </w:r>
+            <w:proofErr w:type="gramEnd"/>
+            <w:r>
+              <w:t xml:space="preserve">? </w:t>
             </w:r>
           </w:p>
           <w:p>
@@ -21538,7 +22690,23 @@
           </w:p>
           <w:p>
             <w:r>
-              <w:t>This change gives visible, behaviour for demos, but some docs still describe the old Monte Carlo approach.</w:t>
+              <w:t xml:space="preserve">This change gives </w:t>
+            </w:r>
+            <w:proofErr w:type="gramStart"/>
+            <w:r>
+              <w:t>visible,</w:t>
+            </w:r>
+            <w:proofErr w:type="gramEnd"/>
+            <w:r>
+              <w:t xml:space="preserve"> </w:t>
+            </w:r>
+            <w:proofErr w:type="spellStart"/>
+            <w:r>
+              <w:t>behaviour</w:t>
+            </w:r>
+            <w:proofErr w:type="spellEnd"/>
+            <w:r>
+              <w:t xml:space="preserve"> for demos, but some docs still describe the old Monte Carlo approach.</w:t>
             </w:r>
           </w:p>
           <w:p>
@@ -21674,12 +22842,12 @@
       </w:r>
     </w:p>
     <w:sectPr>
-      <w:headerReference w:type="even" r:id="rId54"/>
-      <w:headerReference w:type="default" r:id="rId55"/>
-      <w:footerReference w:type="even" r:id="rId56"/>
-      <w:footerReference w:type="default" r:id="rId57"/>
-      <w:headerReference w:type="first" r:id="rId58"/>
-      <w:footerReference w:type="first" r:id="rId59"/>
+      <w:headerReference w:type="even" r:id="rId55"/>
+      <w:headerReference w:type="default" r:id="rId56"/>
+      <w:footerReference w:type="even" r:id="rId57"/>
+      <w:footerReference w:type="default" r:id="rId58"/>
+      <w:headerReference w:type="first" r:id="rId59"/>
+      <w:footerReference w:type="first" r:id="rId60"/>
       <w:pgSz w:w="11906" w:h="16838" w:code="9"/>
       <w:pgMar w:top="1440" w:right="1440" w:bottom="1440" w:left="1440" w:header="709" w:footer="709" w:gutter="0"/>
       <w:pgNumType w:start="0"/>
@@ -22132,6 +23300,119 @@
     </w:lvl>
   </w:abstractNum>
   <w:abstractNum w:abstractNumId="3" w15:restartNumberingAfterBreak="0">
+    <w:nsid w:val="09AE1C63"/>
+    <w:multiLevelType w:val="hybridMultilevel"/>
+    <w:tmpl w:val="86BE9EFA"/>
+    <w:lvl w:ilvl="0" w:tplc="18090001">
+      <w:start w:val="1"/>
+      <w:numFmt w:val="bullet"/>
+      <w:lvlText w:val=""/>
+      <w:lvlJc w:val="left"/>
+      <w:pPr>
+        <w:ind w:left="720" w:hanging="360"/>
+      </w:pPr>
+      <w:rPr>
+        <w:rFonts w:ascii="Symbol" w:hAnsi="Symbol" w:hint="default"/>
+      </w:rPr>
+    </w:lvl>
+    <w:lvl w:ilvl="1" w:tplc="18090003" w:tentative="1">
+      <w:start w:val="1"/>
+      <w:numFmt w:val="bullet"/>
+      <w:lvlText w:val="o"/>
+      <w:lvlJc w:val="left"/>
+      <w:pPr>
+        <w:ind w:left="1440" w:hanging="360"/>
+      </w:pPr>
+      <w:rPr>
+        <w:rFonts w:ascii="Courier New" w:hAnsi="Courier New" w:cs="Courier New" w:hint="default"/>
+      </w:rPr>
+    </w:lvl>
+    <w:lvl w:ilvl="2" w:tplc="18090005" w:tentative="1">
+      <w:start w:val="1"/>
+      <w:numFmt w:val="bullet"/>
+      <w:lvlText w:val=""/>
+      <w:lvlJc w:val="left"/>
+      <w:pPr>
+        <w:ind w:left="2160" w:hanging="360"/>
+      </w:pPr>
+      <w:rPr>
+        <w:rFonts w:ascii="Wingdings" w:hAnsi="Wingdings" w:hint="default"/>
+      </w:rPr>
+    </w:lvl>
+    <w:lvl w:ilvl="3" w:tplc="18090001" w:tentative="1">
+      <w:start w:val="1"/>
+      <w:numFmt w:val="bullet"/>
+      <w:lvlText w:val=""/>
+      <w:lvlJc w:val="left"/>
+      <w:pPr>
+        <w:ind w:left="2880" w:hanging="360"/>
+      </w:pPr>
+      <w:rPr>
+        <w:rFonts w:ascii="Symbol" w:hAnsi="Symbol" w:hint="default"/>
+      </w:rPr>
+    </w:lvl>
+    <w:lvl w:ilvl="4" w:tplc="18090003" w:tentative="1">
+      <w:start w:val="1"/>
+      <w:numFmt w:val="bullet"/>
+      <w:lvlText w:val="o"/>
+      <w:lvlJc w:val="left"/>
+      <w:pPr>
+        <w:ind w:left="3600" w:hanging="360"/>
+      </w:pPr>
+      <w:rPr>
+        <w:rFonts w:ascii="Courier New" w:hAnsi="Courier New" w:cs="Courier New" w:hint="default"/>
+      </w:rPr>
+    </w:lvl>
+    <w:lvl w:ilvl="5" w:tplc="18090005" w:tentative="1">
+      <w:start w:val="1"/>
+      <w:numFmt w:val="bullet"/>
+      <w:lvlText w:val=""/>
+      <w:lvlJc w:val="left"/>
+      <w:pPr>
+        <w:ind w:left="4320" w:hanging="360"/>
+      </w:pPr>
+      <w:rPr>
+        <w:rFonts w:ascii="Wingdings" w:hAnsi="Wingdings" w:hint="default"/>
+      </w:rPr>
+    </w:lvl>
+    <w:lvl w:ilvl="6" w:tplc="18090001" w:tentative="1">
+      <w:start w:val="1"/>
+      <w:numFmt w:val="bullet"/>
+      <w:lvlText w:val=""/>
+      <w:lvlJc w:val="left"/>
+      <w:pPr>
+        <w:ind w:left="5040" w:hanging="360"/>
+      </w:pPr>
+      <w:rPr>
+        <w:rFonts w:ascii="Symbol" w:hAnsi="Symbol" w:hint="default"/>
+      </w:rPr>
+    </w:lvl>
+    <w:lvl w:ilvl="7" w:tplc="18090003" w:tentative="1">
+      <w:start w:val="1"/>
+      <w:numFmt w:val="bullet"/>
+      <w:lvlText w:val="o"/>
+      <w:lvlJc w:val="left"/>
+      <w:pPr>
+        <w:ind w:left="5760" w:hanging="360"/>
+      </w:pPr>
+      <w:rPr>
+        <w:rFonts w:ascii="Courier New" w:hAnsi="Courier New" w:cs="Courier New" w:hint="default"/>
+      </w:rPr>
+    </w:lvl>
+    <w:lvl w:ilvl="8" w:tplc="18090005" w:tentative="1">
+      <w:start w:val="1"/>
+      <w:numFmt w:val="bullet"/>
+      <w:lvlText w:val=""/>
+      <w:lvlJc w:val="left"/>
+      <w:pPr>
+        <w:ind w:left="6480" w:hanging="360"/>
+      </w:pPr>
+      <w:rPr>
+        <w:rFonts w:ascii="Wingdings" w:hAnsi="Wingdings" w:hint="default"/>
+      </w:rPr>
+    </w:lvl>
+  </w:abstractNum>
+  <w:abstractNum w:abstractNumId="4" w15:restartNumberingAfterBreak="0">
     <w:nsid w:val="0FC657C5"/>
     <w:multiLevelType w:val="hybridMultilevel"/>
     <w:tmpl w:val="D44613F0"/>
@@ -22217,7 +23498,7 @@
       </w:pPr>
     </w:lvl>
   </w:abstractNum>
-  <w:abstractNum w:abstractNumId="4" w15:restartNumberingAfterBreak="0">
+  <w:abstractNum w:abstractNumId="5" w15:restartNumberingAfterBreak="0">
     <w:nsid w:val="13DF0BAB"/>
     <w:multiLevelType w:val="hybridMultilevel"/>
     <w:tmpl w:val="892CFA56"/>
@@ -22303,7 +23584,7 @@
       </w:pPr>
     </w:lvl>
   </w:abstractNum>
-  <w:abstractNum w:abstractNumId="5" w15:restartNumberingAfterBreak="0">
+  <w:abstractNum w:abstractNumId="6" w15:restartNumberingAfterBreak="0">
     <w:nsid w:val="1409600A"/>
     <w:multiLevelType w:val="hybridMultilevel"/>
     <w:tmpl w:val="1548F454"/>
@@ -22392,7 +23673,7 @@
       </w:pPr>
     </w:lvl>
   </w:abstractNum>
-  <w:abstractNum w:abstractNumId="6" w15:restartNumberingAfterBreak="0">
+  <w:abstractNum w:abstractNumId="7" w15:restartNumberingAfterBreak="0">
     <w:nsid w:val="1482775B"/>
     <w:multiLevelType w:val="multilevel"/>
     <w:tmpl w:val="0EBA3C40"/>
@@ -22487,7 +23768,156 @@
       </w:pPr>
     </w:lvl>
   </w:abstractNum>
-  <w:abstractNum w:abstractNumId="7" w15:restartNumberingAfterBreak="0">
+  <w:abstractNum w:abstractNumId="8" w15:restartNumberingAfterBreak="0">
+    <w:nsid w:val="161E36B3"/>
+    <w:multiLevelType w:val="multilevel"/>
+    <w:tmpl w:val="71646198"/>
+    <w:lvl w:ilvl="0">
+      <w:start w:val="1"/>
+      <w:numFmt w:val="bullet"/>
+      <w:lvlText w:val=""/>
+      <w:lvlJc w:val="left"/>
+      <w:pPr>
+        <w:tabs>
+          <w:tab w:val="num" w:pos="720"/>
+        </w:tabs>
+        <w:ind w:left="720" w:hanging="360"/>
+      </w:pPr>
+      <w:rPr>
+        <w:rFonts w:ascii="Symbol" w:hAnsi="Symbol" w:hint="default"/>
+        <w:sz w:val="20"/>
+      </w:rPr>
+    </w:lvl>
+    <w:lvl w:ilvl="1" w:tentative="1">
+      <w:start w:val="1"/>
+      <w:numFmt w:val="bullet"/>
+      <w:lvlText w:val="o"/>
+      <w:lvlJc w:val="left"/>
+      <w:pPr>
+        <w:tabs>
+          <w:tab w:val="num" w:pos="1440"/>
+        </w:tabs>
+        <w:ind w:left="1440" w:hanging="360"/>
+      </w:pPr>
+      <w:rPr>
+        <w:rFonts w:ascii="Courier New" w:hAnsi="Courier New" w:hint="default"/>
+        <w:sz w:val="20"/>
+      </w:rPr>
+    </w:lvl>
+    <w:lvl w:ilvl="2" w:tentative="1">
+      <w:start w:val="1"/>
+      <w:numFmt w:val="bullet"/>
+      <w:lvlText w:val=""/>
+      <w:lvlJc w:val="left"/>
+      <w:pPr>
+        <w:tabs>
+          <w:tab w:val="num" w:pos="2160"/>
+        </w:tabs>
+        <w:ind w:left="2160" w:hanging="360"/>
+      </w:pPr>
+      <w:rPr>
+        <w:rFonts w:ascii="Wingdings" w:hAnsi="Wingdings" w:hint="default"/>
+        <w:sz w:val="20"/>
+      </w:rPr>
+    </w:lvl>
+    <w:lvl w:ilvl="3" w:tentative="1">
+      <w:start w:val="1"/>
+      <w:numFmt w:val="bullet"/>
+      <w:lvlText w:val=""/>
+      <w:lvlJc w:val="left"/>
+      <w:pPr>
+        <w:tabs>
+          <w:tab w:val="num" w:pos="2880"/>
+        </w:tabs>
+        <w:ind w:left="2880" w:hanging="360"/>
+      </w:pPr>
+      <w:rPr>
+        <w:rFonts w:ascii="Wingdings" w:hAnsi="Wingdings" w:hint="default"/>
+        <w:sz w:val="20"/>
+      </w:rPr>
+    </w:lvl>
+    <w:lvl w:ilvl="4" w:tentative="1">
+      <w:start w:val="1"/>
+      <w:numFmt w:val="bullet"/>
+      <w:lvlText w:val=""/>
+      <w:lvlJc w:val="left"/>
+      <w:pPr>
+        <w:tabs>
+          <w:tab w:val="num" w:pos="3600"/>
+        </w:tabs>
+        <w:ind w:left="3600" w:hanging="360"/>
+      </w:pPr>
+      <w:rPr>
+        <w:rFonts w:ascii="Wingdings" w:hAnsi="Wingdings" w:hint="default"/>
+        <w:sz w:val="20"/>
+      </w:rPr>
+    </w:lvl>
+    <w:lvl w:ilvl="5" w:tentative="1">
+      <w:start w:val="1"/>
+      <w:numFmt w:val="bullet"/>
+      <w:lvlText w:val=""/>
+      <w:lvlJc w:val="left"/>
+      <w:pPr>
+        <w:tabs>
+          <w:tab w:val="num" w:pos="4320"/>
+        </w:tabs>
+        <w:ind w:left="4320" w:hanging="360"/>
+      </w:pPr>
+      <w:rPr>
+        <w:rFonts w:ascii="Wingdings" w:hAnsi="Wingdings" w:hint="default"/>
+        <w:sz w:val="20"/>
+      </w:rPr>
+    </w:lvl>
+    <w:lvl w:ilvl="6" w:tentative="1">
+      <w:start w:val="1"/>
+      <w:numFmt w:val="bullet"/>
+      <w:lvlText w:val=""/>
+      <w:lvlJc w:val="left"/>
+      <w:pPr>
+        <w:tabs>
+          <w:tab w:val="num" w:pos="5040"/>
+        </w:tabs>
+        <w:ind w:left="5040" w:hanging="360"/>
+      </w:pPr>
+      <w:rPr>
+        <w:rFonts w:ascii="Wingdings" w:hAnsi="Wingdings" w:hint="default"/>
+        <w:sz w:val="20"/>
+      </w:rPr>
+    </w:lvl>
+    <w:lvl w:ilvl="7" w:tentative="1">
+      <w:start w:val="1"/>
+      <w:numFmt w:val="bullet"/>
+      <w:lvlText w:val=""/>
+      <w:lvlJc w:val="left"/>
+      <w:pPr>
+        <w:tabs>
+          <w:tab w:val="num" w:pos="5760"/>
+        </w:tabs>
+        <w:ind w:left="5760" w:hanging="360"/>
+      </w:pPr>
+      <w:rPr>
+        <w:rFonts w:ascii="Wingdings" w:hAnsi="Wingdings" w:hint="default"/>
+        <w:sz w:val="20"/>
+      </w:rPr>
+    </w:lvl>
+    <w:lvl w:ilvl="8" w:tentative="1">
+      <w:start w:val="1"/>
+      <w:numFmt w:val="bullet"/>
+      <w:lvlText w:val=""/>
+      <w:lvlJc w:val="left"/>
+      <w:pPr>
+        <w:tabs>
+          <w:tab w:val="num" w:pos="6480"/>
+        </w:tabs>
+        <w:ind w:left="6480" w:hanging="360"/>
+      </w:pPr>
+      <w:rPr>
+        <w:rFonts w:ascii="Wingdings" w:hAnsi="Wingdings" w:hint="default"/>
+        <w:sz w:val="20"/>
+      </w:rPr>
+    </w:lvl>
+  </w:abstractNum>
+  <w:abstractNum w:abstractNumId="9" w15:restartNumberingAfterBreak="0">
     <w:nsid w:val="16A57AA8"/>
     <w:multiLevelType w:val="hybridMultilevel"/>
     <w:tmpl w:val="A4FCCF7C"/>
@@ -22573,7 +24003,7 @@
       </w:pPr>
     </w:lvl>
   </w:abstractNum>
-  <w:abstractNum w:abstractNumId="8" w15:restartNumberingAfterBreak="0">
+  <w:abstractNum w:abstractNumId="10" w15:restartNumberingAfterBreak="0">
     <w:nsid w:val="1E8C19C2"/>
     <w:multiLevelType w:val="hybridMultilevel"/>
     <w:tmpl w:val="B1A218F4"/>
@@ -22659,7 +24089,7 @@
       </w:pPr>
     </w:lvl>
   </w:abstractNum>
-  <w:abstractNum w:abstractNumId="9" w15:restartNumberingAfterBreak="0">
+  <w:abstractNum w:abstractNumId="11" w15:restartNumberingAfterBreak="0">
     <w:nsid w:val="22610C7E"/>
     <w:multiLevelType w:val="hybridMultilevel"/>
     <w:tmpl w:val="01CC6414"/>
@@ -22745,7 +24175,7 @@
       </w:pPr>
     </w:lvl>
   </w:abstractNum>
-  <w:abstractNum w:abstractNumId="10" w15:restartNumberingAfterBreak="0">
+  <w:abstractNum w:abstractNumId="12" w15:restartNumberingAfterBreak="0">
     <w:nsid w:val="29223FB8"/>
     <w:multiLevelType w:val="hybridMultilevel"/>
     <w:tmpl w:val="549C3D6E"/>
@@ -22831,7 +24261,7 @@
       </w:pPr>
     </w:lvl>
   </w:abstractNum>
-  <w:abstractNum w:abstractNumId="11" w15:restartNumberingAfterBreak="0">
+  <w:abstractNum w:abstractNumId="13" w15:restartNumberingAfterBreak="0">
     <w:nsid w:val="2B5504A2"/>
     <w:multiLevelType w:val="hybridMultilevel"/>
     <w:tmpl w:val="D6E226C2"/>
@@ -22917,7 +24347,7 @@
       </w:pPr>
     </w:lvl>
   </w:abstractNum>
-  <w:abstractNum w:abstractNumId="12" w15:restartNumberingAfterBreak="0">
+  <w:abstractNum w:abstractNumId="14" w15:restartNumberingAfterBreak="0">
     <w:nsid w:val="2C2A7E0D"/>
     <w:multiLevelType w:val="hybridMultilevel"/>
     <w:tmpl w:val="FB2415A6"/>
@@ -23006,7 +24436,7 @@
       </w:pPr>
     </w:lvl>
   </w:abstractNum>
-  <w:abstractNum w:abstractNumId="13" w15:restartNumberingAfterBreak="0">
+  <w:abstractNum w:abstractNumId="15" w15:restartNumberingAfterBreak="0">
     <w:nsid w:val="310125E9"/>
     <w:multiLevelType w:val="multilevel"/>
     <w:tmpl w:val="3AE6E694"/>
@@ -23155,7 +24585,7 @@
       </w:rPr>
     </w:lvl>
   </w:abstractNum>
-  <w:abstractNum w:abstractNumId="14" w15:restartNumberingAfterBreak="0">
+  <w:abstractNum w:abstractNumId="16" w15:restartNumberingAfterBreak="0">
     <w:nsid w:val="32C72F0D"/>
     <w:multiLevelType w:val="hybridMultilevel"/>
     <w:tmpl w:val="941207FE"/>
@@ -23268,7 +24698,7 @@
       </w:rPr>
     </w:lvl>
   </w:abstractNum>
-  <w:abstractNum w:abstractNumId="15" w15:restartNumberingAfterBreak="0">
+  <w:abstractNum w:abstractNumId="17" w15:restartNumberingAfterBreak="0">
     <w:nsid w:val="32DB29B8"/>
     <w:multiLevelType w:val="multilevel"/>
     <w:tmpl w:val="707823F6"/>
@@ -23417,7 +24847,7 @@
       </w:rPr>
     </w:lvl>
   </w:abstractNum>
-  <w:abstractNum w:abstractNumId="16" w15:restartNumberingAfterBreak="0">
+  <w:abstractNum w:abstractNumId="18" w15:restartNumberingAfterBreak="0">
     <w:nsid w:val="3416640C"/>
     <w:multiLevelType w:val="hybridMultilevel"/>
     <w:tmpl w:val="EC7AC9E0"/>
@@ -23503,7 +24933,7 @@
       </w:pPr>
     </w:lvl>
   </w:abstractNum>
-  <w:abstractNum w:abstractNumId="17" w15:restartNumberingAfterBreak="0">
+  <w:abstractNum w:abstractNumId="19" w15:restartNumberingAfterBreak="0">
     <w:nsid w:val="39F17F83"/>
     <w:multiLevelType w:val="hybridMultilevel"/>
     <w:tmpl w:val="2D00D872"/>
@@ -23616,7 +25046,7 @@
       </w:rPr>
     </w:lvl>
   </w:abstractNum>
-  <w:abstractNum w:abstractNumId="18" w15:restartNumberingAfterBreak="0">
+  <w:abstractNum w:abstractNumId="20" w15:restartNumberingAfterBreak="0">
     <w:nsid w:val="3CE26087"/>
     <w:multiLevelType w:val="hybridMultilevel"/>
     <w:tmpl w:val="E0F6ED1C"/>
@@ -23702,7 +25132,7 @@
       </w:pPr>
     </w:lvl>
   </w:abstractNum>
-  <w:abstractNum w:abstractNumId="19" w15:restartNumberingAfterBreak="0">
+  <w:abstractNum w:abstractNumId="21" w15:restartNumberingAfterBreak="0">
     <w:nsid w:val="48B460ED"/>
     <w:multiLevelType w:val="multilevel"/>
     <w:tmpl w:val="7C2AF9A8"/>
@@ -23835,7 +25265,7 @@
       </w:pPr>
     </w:lvl>
   </w:abstractNum>
-  <w:abstractNum w:abstractNumId="20" w15:restartNumberingAfterBreak="0">
+  <w:abstractNum w:abstractNumId="22" w15:restartNumberingAfterBreak="0">
     <w:nsid w:val="49224F5E"/>
     <w:multiLevelType w:val="hybridMultilevel"/>
     <w:tmpl w:val="3EF25212"/>
@@ -23952,7 +25382,7 @@
       </w:pPr>
     </w:lvl>
   </w:abstractNum>
-  <w:abstractNum w:abstractNumId="21" w15:restartNumberingAfterBreak="0">
+  <w:abstractNum w:abstractNumId="23" w15:restartNumberingAfterBreak="0">
     <w:nsid w:val="4A2779C4"/>
     <w:multiLevelType w:val="multilevel"/>
     <w:tmpl w:val="5518E24A"/>
@@ -24101,7 +25531,7 @@
       </w:rPr>
     </w:lvl>
   </w:abstractNum>
-  <w:abstractNum w:abstractNumId="22" w15:restartNumberingAfterBreak="0">
+  <w:abstractNum w:abstractNumId="24" w15:restartNumberingAfterBreak="0">
     <w:nsid w:val="4D6E4153"/>
     <w:multiLevelType w:val="hybridMultilevel"/>
     <w:tmpl w:val="BDACEDB0"/>
@@ -24187,7 +25617,7 @@
       </w:pPr>
     </w:lvl>
   </w:abstractNum>
-  <w:abstractNum w:abstractNumId="23" w15:restartNumberingAfterBreak="0">
+  <w:abstractNum w:abstractNumId="25" w15:restartNumberingAfterBreak="0">
     <w:nsid w:val="4F692764"/>
     <w:multiLevelType w:val="multilevel"/>
     <w:tmpl w:val="C930DE6A"/>
@@ -24320,7 +25750,7 @@
       </w:pPr>
     </w:lvl>
   </w:abstractNum>
-  <w:abstractNum w:abstractNumId="24" w15:restartNumberingAfterBreak="0">
+  <w:abstractNum w:abstractNumId="26" w15:restartNumberingAfterBreak="0">
     <w:nsid w:val="53407879"/>
     <w:multiLevelType w:val="hybridMultilevel"/>
     <w:tmpl w:val="35044D6A"/>
@@ -24433,7 +25863,7 @@
       </w:rPr>
     </w:lvl>
   </w:abstractNum>
-  <w:abstractNum w:abstractNumId="25" w15:restartNumberingAfterBreak="0">
+  <w:abstractNum w:abstractNumId="27" w15:restartNumberingAfterBreak="0">
     <w:nsid w:val="54283B40"/>
     <w:multiLevelType w:val="hybridMultilevel"/>
     <w:tmpl w:val="534AA008"/>
@@ -24524,7 +25954,7 @@
       </w:pPr>
     </w:lvl>
   </w:abstractNum>
-  <w:abstractNum w:abstractNumId="26" w15:restartNumberingAfterBreak="0">
+  <w:abstractNum w:abstractNumId="28" w15:restartNumberingAfterBreak="0">
     <w:nsid w:val="5445182A"/>
     <w:multiLevelType w:val="multilevel"/>
     <w:tmpl w:val="80D60572"/>
@@ -24673,7 +26103,7 @@
       </w:rPr>
     </w:lvl>
   </w:abstractNum>
-  <w:abstractNum w:abstractNumId="27" w15:restartNumberingAfterBreak="0">
+  <w:abstractNum w:abstractNumId="29" w15:restartNumberingAfterBreak="0">
     <w:nsid w:val="5470089E"/>
     <w:multiLevelType w:val="multilevel"/>
     <w:tmpl w:val="8EE46A0C"/>
@@ -24822,7 +26252,7 @@
       </w:rPr>
     </w:lvl>
   </w:abstractNum>
-  <w:abstractNum w:abstractNumId="28" w15:restartNumberingAfterBreak="0">
+  <w:abstractNum w:abstractNumId="30" w15:restartNumberingAfterBreak="0">
     <w:nsid w:val="63922606"/>
     <w:multiLevelType w:val="multilevel"/>
     <w:tmpl w:val="D8225180"/>
@@ -24971,7 +26401,7 @@
       </w:rPr>
     </w:lvl>
   </w:abstractNum>
-  <w:abstractNum w:abstractNumId="29" w15:restartNumberingAfterBreak="0">
+  <w:abstractNum w:abstractNumId="31" w15:restartNumberingAfterBreak="0">
     <w:nsid w:val="63AA42EC"/>
     <w:multiLevelType w:val="hybridMultilevel"/>
     <w:tmpl w:val="0B3C82B6"/>
@@ -25084,7 +26514,7 @@
       </w:rPr>
     </w:lvl>
   </w:abstractNum>
-  <w:abstractNum w:abstractNumId="30" w15:restartNumberingAfterBreak="0">
+  <w:abstractNum w:abstractNumId="32" w15:restartNumberingAfterBreak="0">
     <w:nsid w:val="65385E90"/>
     <w:multiLevelType w:val="multilevel"/>
     <w:tmpl w:val="1DA46506"/>
@@ -25233,7 +26663,7 @@
       </w:rPr>
     </w:lvl>
   </w:abstractNum>
-  <w:abstractNum w:abstractNumId="31" w15:restartNumberingAfterBreak="0">
+  <w:abstractNum w:abstractNumId="33" w15:restartNumberingAfterBreak="0">
     <w:nsid w:val="66C279BB"/>
     <w:multiLevelType w:val="hybridMultilevel"/>
     <w:tmpl w:val="B234F54E"/>
@@ -25319,7 +26749,7 @@
       </w:pPr>
     </w:lvl>
   </w:abstractNum>
-  <w:abstractNum w:abstractNumId="32" w15:restartNumberingAfterBreak="0">
+  <w:abstractNum w:abstractNumId="34" w15:restartNumberingAfterBreak="0">
     <w:nsid w:val="67D05E22"/>
     <w:multiLevelType w:val="hybridMultilevel"/>
     <w:tmpl w:val="FB186C84"/>
@@ -25432,7 +26862,7 @@
       </w:rPr>
     </w:lvl>
   </w:abstractNum>
-  <w:abstractNum w:abstractNumId="33" w15:restartNumberingAfterBreak="0">
+  <w:abstractNum w:abstractNumId="35" w15:restartNumberingAfterBreak="0">
     <w:nsid w:val="68A009D5"/>
     <w:multiLevelType w:val="hybridMultilevel"/>
     <w:tmpl w:val="EC28536E"/>
@@ -25523,7 +26953,7 @@
       </w:pPr>
     </w:lvl>
   </w:abstractNum>
-  <w:abstractNum w:abstractNumId="34" w15:restartNumberingAfterBreak="0">
+  <w:abstractNum w:abstractNumId="36" w15:restartNumberingAfterBreak="0">
     <w:nsid w:val="6C925FD8"/>
     <w:multiLevelType w:val="hybridMultilevel"/>
     <w:tmpl w:val="3DD6CFB2"/>
@@ -25609,7 +27039,7 @@
       </w:pPr>
     </w:lvl>
   </w:abstractNum>
-  <w:abstractNum w:abstractNumId="35" w15:restartNumberingAfterBreak="0">
+  <w:abstractNum w:abstractNumId="37" w15:restartNumberingAfterBreak="0">
     <w:nsid w:val="7BDA386A"/>
     <w:multiLevelType w:val="hybridMultilevel"/>
     <w:tmpl w:val="C7A4887E"/>
@@ -25723,49 +27153,49 @@
     </w:lvl>
   </w:abstractNum>
   <w:num w:numId="1" w16cid:durableId="1979412930">
+    <w:abstractNumId w:val="22"/>
+  </w:num>
+  <w:num w:numId="2" w16cid:durableId="634263790">
+    <w:abstractNumId w:val="7"/>
+  </w:num>
+  <w:num w:numId="3" w16cid:durableId="1395543426">
+    <w:abstractNumId w:val="16"/>
+  </w:num>
+  <w:num w:numId="4" w16cid:durableId="1315724028">
     <w:abstractNumId w:val="20"/>
   </w:num>
-  <w:num w:numId="2" w16cid:durableId="634263790">
-    <w:abstractNumId w:val="6"/>
-  </w:num>
-  <w:num w:numId="3" w16cid:durableId="1395543426">
-    <w:abstractNumId w:val="14"/>
-  </w:num>
-  <w:num w:numId="4" w16cid:durableId="1315724028">
-    <w:abstractNumId w:val="18"/>
-  </w:num>
   <w:num w:numId="5" w16cid:durableId="1319530745">
-    <w:abstractNumId w:val="22"/>
+    <w:abstractNumId w:val="24"/>
   </w:num>
   <w:num w:numId="6" w16cid:durableId="174268885">
-    <w:abstractNumId w:val="4"/>
+    <w:abstractNumId w:val="5"/>
   </w:num>
   <w:num w:numId="7" w16cid:durableId="1711032297">
     <w:abstractNumId w:val="1"/>
   </w:num>
   <w:num w:numId="8" w16cid:durableId="160319242">
-    <w:abstractNumId w:val="8"/>
+    <w:abstractNumId w:val="10"/>
   </w:num>
   <w:num w:numId="9" w16cid:durableId="357849534">
-    <w:abstractNumId w:val="7"/>
+    <w:abstractNumId w:val="9"/>
   </w:num>
   <w:num w:numId="10" w16cid:durableId="2068801123">
-    <w:abstractNumId w:val="10"/>
+    <w:abstractNumId w:val="12"/>
   </w:num>
   <w:num w:numId="11" w16cid:durableId="1345940828">
+    <w:abstractNumId w:val="13"/>
+  </w:num>
+  <w:num w:numId="12" w16cid:durableId="731390424">
+    <w:abstractNumId w:val="4"/>
+  </w:num>
+  <w:num w:numId="13" w16cid:durableId="1433160782">
     <w:abstractNumId w:val="11"/>
   </w:num>
-  <w:num w:numId="12" w16cid:durableId="731390424">
-    <w:abstractNumId w:val="3"/>
-  </w:num>
-  <w:num w:numId="13" w16cid:durableId="1433160782">
-    <w:abstractNumId w:val="9"/>
-  </w:num>
   <w:num w:numId="14" w16cid:durableId="443305799">
-    <w:abstractNumId w:val="5"/>
+    <w:abstractNumId w:val="6"/>
   </w:num>
   <w:num w:numId="15" w16cid:durableId="15618285">
-    <w:abstractNumId w:val="35"/>
+    <w:abstractNumId w:val="37"/>
   </w:num>
   <w:num w:numId="16" w16cid:durableId="216287957">
     <w:abstractNumId w:val="2"/>
@@ -25774,91 +27204,97 @@
     <w:abstractNumId w:val="0"/>
   </w:num>
   <w:num w:numId="18" w16cid:durableId="752973630">
+    <w:abstractNumId w:val="31"/>
+  </w:num>
+  <w:num w:numId="19" w16cid:durableId="1919554416">
+    <w:abstractNumId w:val="33"/>
+  </w:num>
+  <w:num w:numId="20" w16cid:durableId="1763603534">
+    <w:abstractNumId w:val="18"/>
+  </w:num>
+  <w:num w:numId="21" w16cid:durableId="1105883196">
+    <w:abstractNumId w:val="14"/>
+  </w:num>
+  <w:num w:numId="22" w16cid:durableId="1081488339">
+    <w:abstractNumId w:val="36"/>
+  </w:num>
+  <w:num w:numId="23" w16cid:durableId="1783986655">
+    <w:abstractNumId w:val="35"/>
+  </w:num>
+  <w:num w:numId="24" w16cid:durableId="1650936525">
     <w:abstractNumId w:val="29"/>
   </w:num>
-  <w:num w:numId="19" w16cid:durableId="1919554416">
-    <w:abstractNumId w:val="31"/>
+  <w:num w:numId="25" w16cid:durableId="1766457783">
+    <w:abstractNumId w:val="7"/>
   </w:num>
-  <w:num w:numId="20" w16cid:durableId="1763603534">
-    <w:abstractNumId w:val="16"/>
+  <w:num w:numId="26" w16cid:durableId="1726638886">
+    <w:abstractNumId w:val="7"/>
   </w:num>
-  <w:num w:numId="21" w16cid:durableId="1105883196">
-    <w:abstractNumId w:val="12"/>
+  <w:num w:numId="27" w16cid:durableId="1731341681">
+    <w:abstractNumId w:val="7"/>
   </w:num>
-  <w:num w:numId="22" w16cid:durableId="1081488339">
+  <w:num w:numId="28" w16cid:durableId="2008970896">
+    <w:abstractNumId w:val="7"/>
+  </w:num>
+  <w:num w:numId="29" w16cid:durableId="1383820623">
+    <w:abstractNumId w:val="7"/>
+  </w:num>
+  <w:num w:numId="30" w16cid:durableId="1114328708">
+    <w:abstractNumId w:val="7"/>
+  </w:num>
+  <w:num w:numId="31" w16cid:durableId="1691447629">
+    <w:abstractNumId w:val="7"/>
+  </w:num>
+  <w:num w:numId="32" w16cid:durableId="1675952926">
+    <w:abstractNumId w:val="7"/>
+  </w:num>
+  <w:num w:numId="33" w16cid:durableId="1317756632">
+    <w:abstractNumId w:val="7"/>
+  </w:num>
+  <w:num w:numId="34" w16cid:durableId="1467814799">
+    <w:abstractNumId w:val="7"/>
+  </w:num>
+  <w:num w:numId="35" w16cid:durableId="1794395859">
+    <w:abstractNumId w:val="21"/>
+  </w:num>
+  <w:num w:numId="36" w16cid:durableId="2134782294">
+    <w:abstractNumId w:val="25"/>
+  </w:num>
+  <w:num w:numId="37" w16cid:durableId="1993095279">
+    <w:abstractNumId w:val="17"/>
+  </w:num>
+  <w:num w:numId="38" w16cid:durableId="2051103382">
+    <w:abstractNumId w:val="23"/>
+  </w:num>
+  <w:num w:numId="39" w16cid:durableId="2120181144">
+    <w:abstractNumId w:val="30"/>
+  </w:num>
+  <w:num w:numId="40" w16cid:durableId="694039534">
+    <w:abstractNumId w:val="15"/>
+  </w:num>
+  <w:num w:numId="41" w16cid:durableId="160202146">
+    <w:abstractNumId w:val="32"/>
+  </w:num>
+  <w:num w:numId="42" w16cid:durableId="857619713">
+    <w:abstractNumId w:val="28"/>
+  </w:num>
+  <w:num w:numId="43" w16cid:durableId="1291664462">
+    <w:abstractNumId w:val="27"/>
+  </w:num>
+  <w:num w:numId="44" w16cid:durableId="772360081">
+    <w:abstractNumId w:val="26"/>
+  </w:num>
+  <w:num w:numId="45" w16cid:durableId="552959225">
+    <w:abstractNumId w:val="19"/>
+  </w:num>
+  <w:num w:numId="46" w16cid:durableId="1878351180">
     <w:abstractNumId w:val="34"/>
   </w:num>
-  <w:num w:numId="23" w16cid:durableId="1783986655">
-    <w:abstractNumId w:val="33"/>
+  <w:num w:numId="47" w16cid:durableId="827593670">
+    <w:abstractNumId w:val="8"/>
   </w:num>
-  <w:num w:numId="24" w16cid:durableId="1650936525">
-    <w:abstractNumId w:val="27"/>
-  </w:num>
-  <w:num w:numId="25" w16cid:durableId="1766457783">
-    <w:abstractNumId w:val="6"/>
-  </w:num>
-  <w:num w:numId="26" w16cid:durableId="1726638886">
-    <w:abstractNumId w:val="6"/>
-  </w:num>
-  <w:num w:numId="27" w16cid:durableId="1731341681">
-    <w:abstractNumId w:val="6"/>
-  </w:num>
-  <w:num w:numId="28" w16cid:durableId="2008970896">
-    <w:abstractNumId w:val="6"/>
-  </w:num>
-  <w:num w:numId="29" w16cid:durableId="1383820623">
-    <w:abstractNumId w:val="6"/>
-  </w:num>
-  <w:num w:numId="30" w16cid:durableId="1114328708">
-    <w:abstractNumId w:val="6"/>
-  </w:num>
-  <w:num w:numId="31" w16cid:durableId="1691447629">
-    <w:abstractNumId w:val="6"/>
-  </w:num>
-  <w:num w:numId="32" w16cid:durableId="1675952926">
-    <w:abstractNumId w:val="6"/>
-  </w:num>
-  <w:num w:numId="33" w16cid:durableId="1317756632">
-    <w:abstractNumId w:val="6"/>
-  </w:num>
-  <w:num w:numId="34" w16cid:durableId="1467814799">
-    <w:abstractNumId w:val="6"/>
-  </w:num>
-  <w:num w:numId="35" w16cid:durableId="1794395859">
-    <w:abstractNumId w:val="19"/>
-  </w:num>
-  <w:num w:numId="36" w16cid:durableId="2134782294">
-    <w:abstractNumId w:val="23"/>
-  </w:num>
-  <w:num w:numId="37" w16cid:durableId="1993095279">
-    <w:abstractNumId w:val="15"/>
-  </w:num>
-  <w:num w:numId="38" w16cid:durableId="2051103382">
-    <w:abstractNumId w:val="21"/>
-  </w:num>
-  <w:num w:numId="39" w16cid:durableId="2120181144">
-    <w:abstractNumId w:val="28"/>
-  </w:num>
-  <w:num w:numId="40" w16cid:durableId="694039534">
-    <w:abstractNumId w:val="13"/>
-  </w:num>
-  <w:num w:numId="41" w16cid:durableId="160202146">
-    <w:abstractNumId w:val="30"/>
-  </w:num>
-  <w:num w:numId="42" w16cid:durableId="857619713">
-    <w:abstractNumId w:val="26"/>
-  </w:num>
-  <w:num w:numId="43" w16cid:durableId="1291664462">
-    <w:abstractNumId w:val="25"/>
-  </w:num>
-  <w:num w:numId="44" w16cid:durableId="772360081">
-    <w:abstractNumId w:val="24"/>
-  </w:num>
-  <w:num w:numId="45" w16cid:durableId="552959225">
-    <w:abstractNumId w:val="17"/>
-  </w:num>
-  <w:num w:numId="46" w16cid:durableId="1878351180">
-    <w:abstractNumId w:val="32"/>
+  <w:num w:numId="48" w16cid:durableId="330915526">
+    <w:abstractNumId w:val="3"/>
   </w:num>
   <w:numIdMacAtCleanup w:val="24"/>
 </w:numbering>
@@ -27515,6 +28951,20 @@
       </w:tblBorders>
     </w:tblPr>
   </w:style>
+  <w:style w:type="paragraph" w:customStyle="1" w:styleId="pdq2pgselectionanchorcontainer">
+    <w:name w:val="pdq2pg_selectionanchorcontainer"/>
+    <w:basedOn w:val="Normal"/>
+    <w:rsid w:val="00524D9D"/>
+    <w:pPr>
+      <w:spacing w:before="100" w:beforeAutospacing="1" w:after="100" w:afterAutospacing="1" w:line="240" w:lineRule="auto"/>
+    </w:pPr>
+    <w:rPr>
+      <w:rFonts w:ascii="Times New Roman" w:eastAsia="Times New Roman" w:hAnsi="Times New Roman" w:cs="Times New Roman"/>
+      <w:sz w:val="24"/>
+      <w:szCs w:val="24"/>
+      <w:lang w:eastAsia="en-IE"/>
+    </w:rPr>
+  </w:style>
 </w:styles>
 </file>
 
@@ -27814,6 +29264,67 @@
 </file>
 
 <file path=customXml/item1.xml><?xml version="1.0" encoding="utf-8"?>
+<p:properties xmlns:p="http://schemas.microsoft.com/office/2006/metadata/properties" xmlns:xsi="http://www.w3.org/2001/XMLSchema-instance" xmlns:pc="http://schemas.microsoft.com/office/infopath/2007/PartnerControls">
+  <documentManagement>
+    <Teams_Channel_Section_Location xmlns="ac56161a-35a2-4bac-99b6-8739237dc4f6" xsi:nil="true"/>
+    <Invited_Students xmlns="ac56161a-35a2-4bac-99b6-8739237dc4f6" xsi:nil="true"/>
+    <Distribution_Groups xmlns="ac56161a-35a2-4bac-99b6-8739237dc4f6" xsi:nil="true"/>
+    <Math_Settings xmlns="ac56161a-35a2-4bac-99b6-8739237dc4f6" xsi:nil="true"/>
+    <FolderType xmlns="ac56161a-35a2-4bac-99b6-8739237dc4f6" xsi:nil="true"/>
+    <Teachers xmlns="ac56161a-35a2-4bac-99b6-8739237dc4f6">
+      <UserInfo>
+        <DisplayName/>
+        <AccountId xsi:nil="true"/>
+        <AccountType/>
+      </UserInfo>
+    </Teachers>
+    <Student_Groups xmlns="ac56161a-35a2-4bac-99b6-8739237dc4f6">
+      <UserInfo>
+        <DisplayName/>
+        <AccountId xsi:nil="true"/>
+        <AccountType/>
+      </UserInfo>
+    </Student_Groups>
+    <Self_Registration_Enabled xmlns="ac56161a-35a2-4bac-99b6-8739237dc4f6" xsi:nil="true"/>
+    <CultureName xmlns="ac56161a-35a2-4bac-99b6-8739237dc4f6" xsi:nil="true"/>
+    <Students xmlns="ac56161a-35a2-4bac-99b6-8739237dc4f6">
+      <UserInfo>
+        <DisplayName/>
+        <AccountId xsi:nil="true"/>
+        <AccountType/>
+      </UserInfo>
+    </Students>
+    <Is_Collaboration_Space_Locked xmlns="ac56161a-35a2-4bac-99b6-8739237dc4f6" xsi:nil="true"/>
+    <LMS_Mappings xmlns="ac56161a-35a2-4bac-99b6-8739237dc4f6" xsi:nil="true"/>
+    <IsNotebookLocked xmlns="ac56161a-35a2-4bac-99b6-8739237dc4f6" xsi:nil="true"/>
+    <Owner xmlns="ac56161a-35a2-4bac-99b6-8739237dc4f6">
+      <UserInfo>
+        <DisplayName/>
+        <AccountId xsi:nil="true"/>
+        <AccountType/>
+      </UserInfo>
+    </Owner>
+    <Has_Teacher_Only_SectionGroup xmlns="ac56161a-35a2-4bac-99b6-8739237dc4f6" xsi:nil="true"/>
+    <DefaultSectionNames xmlns="ac56161a-35a2-4bac-99b6-8739237dc4f6" xsi:nil="true"/>
+    <AppVersion xmlns="ac56161a-35a2-4bac-99b6-8739237dc4f6" xsi:nil="true"/>
+    <TeamsChannelId xmlns="ac56161a-35a2-4bac-99b6-8739237dc4f6" xsi:nil="true"/>
+    <Invited_Teachers xmlns="ac56161a-35a2-4bac-99b6-8739237dc4f6" xsi:nil="true"/>
+    <NotebookType xmlns="ac56161a-35a2-4bac-99b6-8739237dc4f6" xsi:nil="true"/>
+    <Templates xmlns="ac56161a-35a2-4bac-99b6-8739237dc4f6" xsi:nil="true"/>
+  </documentManagement>
+</p:properties>
+</file>
+
+<file path=customXml/item2.xml><?xml version="1.0" encoding="utf-8"?>
+<?mso-contentType ?>
+<FormTemplates xmlns="http://schemas.microsoft.com/sharepoint/v3/contenttype/forms">
+  <Display>DocumentLibraryForm</Display>
+  <Edit>DocumentLibraryForm</Edit>
+  <New>DocumentLibraryForm</New>
+</FormTemplates>
+</file>
+
+<file path=customXml/item3.xml><?xml version="1.0" encoding="utf-8"?>
 <ct:contentTypeSchema xmlns:ct="http://schemas.microsoft.com/office/2006/metadata/contentType" xmlns:ma="http://schemas.microsoft.com/office/2006/metadata/properties/metaAttributes" ct:_="" ma:_="" ma:contentTypeName="Document" ma:contentTypeID="0x0101003EE04D916D7611488AA759BAA9A37716" ma:contentTypeVersion="34" ma:contentTypeDescription="Create a new document." ma:contentTypeScope="" ma:versionID="da43fd5ae1f7ae53ffd28d894363bfb4">
   <xsd:schema xmlns:xsd="http://www.w3.org/2001/XMLSchema" xmlns:xs="http://www.w3.org/2001/XMLSchema" xmlns:p="http://schemas.microsoft.com/office/2006/metadata/properties" xmlns:ns3="05ee331b-510f-4173-a5cc-a06d55a316fd" xmlns:ns4="ac56161a-35a2-4bac-99b6-8739237dc4f6" targetNamespace="http://schemas.microsoft.com/office/2006/metadata/properties" ma:root="true" ma:fieldsID="0e753ad016b352eaafbd0268c41c2a23" ns3:_="" ns4:_="">
     <xsd:import namespace="05ee331b-510f-4173-a5cc-a06d55a316fd"/>
@@ -28230,67 +29741,6 @@
 </ct:contentTypeSchema>
 </file>
 
-<file path=customXml/item2.xml><?xml version="1.0" encoding="utf-8"?>
-<p:properties xmlns:p="http://schemas.microsoft.com/office/2006/metadata/properties" xmlns:xsi="http://www.w3.org/2001/XMLSchema-instance" xmlns:pc="http://schemas.microsoft.com/office/infopath/2007/PartnerControls">
-  <documentManagement>
-    <Teams_Channel_Section_Location xmlns="ac56161a-35a2-4bac-99b6-8739237dc4f6" xsi:nil="true"/>
-    <Invited_Students xmlns="ac56161a-35a2-4bac-99b6-8739237dc4f6" xsi:nil="true"/>
-    <Distribution_Groups xmlns="ac56161a-35a2-4bac-99b6-8739237dc4f6" xsi:nil="true"/>
-    <Math_Settings xmlns="ac56161a-35a2-4bac-99b6-8739237dc4f6" xsi:nil="true"/>
-    <FolderType xmlns="ac56161a-35a2-4bac-99b6-8739237dc4f6" xsi:nil="true"/>
-    <Teachers xmlns="ac56161a-35a2-4bac-99b6-8739237dc4f6">
-      <UserInfo>
-        <DisplayName/>
-        <AccountId xsi:nil="true"/>
-        <AccountType/>
-      </UserInfo>
-    </Teachers>
-    <Student_Groups xmlns="ac56161a-35a2-4bac-99b6-8739237dc4f6">
-      <UserInfo>
-        <DisplayName/>
-        <AccountId xsi:nil="true"/>
-        <AccountType/>
-      </UserInfo>
-    </Student_Groups>
-    <Self_Registration_Enabled xmlns="ac56161a-35a2-4bac-99b6-8739237dc4f6" xsi:nil="true"/>
-    <CultureName xmlns="ac56161a-35a2-4bac-99b6-8739237dc4f6" xsi:nil="true"/>
-    <Students xmlns="ac56161a-35a2-4bac-99b6-8739237dc4f6">
-      <UserInfo>
-        <DisplayName/>
-        <AccountId xsi:nil="true"/>
-        <AccountType/>
-      </UserInfo>
-    </Students>
-    <Is_Collaboration_Space_Locked xmlns="ac56161a-35a2-4bac-99b6-8739237dc4f6" xsi:nil="true"/>
-    <LMS_Mappings xmlns="ac56161a-35a2-4bac-99b6-8739237dc4f6" xsi:nil="true"/>
-    <IsNotebookLocked xmlns="ac56161a-35a2-4bac-99b6-8739237dc4f6" xsi:nil="true"/>
-    <Owner xmlns="ac56161a-35a2-4bac-99b6-8739237dc4f6">
-      <UserInfo>
-        <DisplayName/>
-        <AccountId xsi:nil="true"/>
-        <AccountType/>
-      </UserInfo>
-    </Owner>
-    <Has_Teacher_Only_SectionGroup xmlns="ac56161a-35a2-4bac-99b6-8739237dc4f6" xsi:nil="true"/>
-    <DefaultSectionNames xmlns="ac56161a-35a2-4bac-99b6-8739237dc4f6" xsi:nil="true"/>
-    <AppVersion xmlns="ac56161a-35a2-4bac-99b6-8739237dc4f6" xsi:nil="true"/>
-    <TeamsChannelId xmlns="ac56161a-35a2-4bac-99b6-8739237dc4f6" xsi:nil="true"/>
-    <Invited_Teachers xmlns="ac56161a-35a2-4bac-99b6-8739237dc4f6" xsi:nil="true"/>
-    <NotebookType xmlns="ac56161a-35a2-4bac-99b6-8739237dc4f6" xsi:nil="true"/>
-    <Templates xmlns="ac56161a-35a2-4bac-99b6-8739237dc4f6" xsi:nil="true"/>
-  </documentManagement>
-</p:properties>
-</file>
-
-<file path=customXml/item3.xml><?xml version="1.0" encoding="utf-8"?>
-<?mso-contentType ?>
-<FormTemplates xmlns="http://schemas.microsoft.com/sharepoint/v3/contenttype/forms">
-  <Display>DocumentLibraryForm</Display>
-  <Edit>DocumentLibraryForm</Edit>
-  <New>DocumentLibraryForm</New>
-</FormTemplates>
-</file>
-
 <file path=customXml/item4.xml><?xml version="1.0" encoding="utf-8"?>
 <b:Sources xmlns:b="http://schemas.openxmlformats.org/officeDocument/2006/bibliography" xmlns="http://schemas.openxmlformats.org/officeDocument/2006/bibliography" SelectedStyle="\HarvardAnglia2008OfficeOnline.xsl" StyleName="Harvard - Anglia" Version="2008">
   <b:Source>
@@ -28359,7 +29809,7 @@
     <b:MonthAccessed>July</b:MonthAccessed>
     <b:DayAccessed>22</b:DayAccessed>
     <b:URL>https://www.formula1.com/en/latest/article/f1-glossary-p-t.GBhLQtpeu9b8LrK5VM0F1</b:URL>
-    <b:RefOrder>6</b:RefOrder>
+    <b:RefOrder>7</b:RefOrder>
   </b:Source>
   <b:Source>
     <b:Tag>QtG26</b:Tag>
@@ -28376,7 +29826,7 @@
     <b:MonthAccessed>July</b:MonthAccessed>
     <b:DayAccessed>24</b:DayAccessed>
     <b:URL>https://doc.qt.io/qt-6/qhboxlayout.html</b:URL>
-    <b:RefOrder>7</b:RefOrder>
+    <b:RefOrder>8</b:RefOrder>
   </b:Source>
   <b:Source>
     <b:Tag>C4M26</b:Tag>
@@ -28409,7 +29859,7 @@
     <b:MonthAccessed>July</b:MonthAccessed>
     <b:DayAccessed>25</b:DayAccessed>
     <b:URL>https://www.geeksforgeeks.org/software-engineering/component-based-diagram/</b:URL>
-    <b:RefOrder>14</b:RefOrder>
+    <b:RefOrder>15</b:RefOrder>
   </b:Source>
   <b:Source>
     <b:Tag>Pow25</b:Tag>
@@ -28435,7 +29885,7 @@
         </b:NameList>
       </b:Author>
     </b:Author>
-    <b:RefOrder>10</b:RefOrder>
+    <b:RefOrder>11</b:RefOrder>
   </b:Source>
   <b:Source>
     <b:Tag>pyt</b:Tag>
@@ -28452,7 +29902,7 @@
     <b:YearAccessed>2026</b:YearAccessed>
     <b:MonthAccessed>July</b:MonthAccessed>
     <b:DayAccessed>29</b:DayAccessed>
-    <b:RefOrder>8</b:RefOrder>
+    <b:RefOrder>9</b:RefOrder>
   </b:Source>
   <b:Source>
     <b:Tag>McG01</b:Tag>
@@ -28478,7 +29928,7 @@
         </b:NameList>
       </b:Author>
     </b:Author>
-    <b:RefOrder>11</b:RefOrder>
+    <b:RefOrder>12</b:RefOrder>
   </b:Source>
   <b:Source>
     <b:Tag>Pow26</b:Tag>
@@ -28503,7 +29953,7 @@
         </b:NameList>
       </b:Author>
     </b:Author>
-    <b:RefOrder>12</b:RefOrder>
+    <b:RefOrder>13</b:RefOrder>
   </b:Source>
   <b:Source>
     <b:Tag>pyp25</b:Tag>
@@ -28520,7 +29970,7 @@
     <b:MonthAccessed>July</b:MonthAccessed>
     <b:DayAccessed>30</b:DayAccessed>
     <b:URL>https://pypi.org/project/pytest-qt/</b:URL>
-    <b:RefOrder>9</b:RefOrder>
+    <b:RefOrder>10</b:RefOrder>
   </b:Source>
   <b:Source>
     <b:Tag>IBM26</b:Tag>
@@ -28536,7 +29986,7 @@
     <b:MonthAccessed>July</b:MonthAccessed>
     <b:DayAccessed>30</b:DayAccessed>
     <b:URL>https://www.ibm.com/think/topics/system-testing</b:URL>
-    <b:RefOrder>13</b:RefOrder>
+    <b:RefOrder>14</b:RefOrder>
   </b:Source>
   <b:Source>
     <b:Tag>IEE26</b:Tag>
@@ -28552,7 +30002,7 @@
     <b:MonthAccessed>July</b:MonthAccessed>
     <b:DayAccessed>30</b:DayAccessed>
     <b:URL>https://www.computer.org/resources/software-requirements-specifications</b:URL>
-    <b:RefOrder>15</b:RefOrder>
+    <b:RefOrder>16</b:RefOrder>
   </b:Source>
   <b:Source>
     <b:Tag>Hir25</b:Tag>
@@ -28574,10 +30024,43 @@
     <b:Edition>4.0a</b:Edition>
     <b:RefOrder>4</b:RefOrder>
   </b:Source>
+  <b:Source>
+    <b:Tag>OMG17</b:Tag>
+    <b:SourceType>Book</b:SourceType>
+    <b:Guid>{9F9F9603-91AC-4E0B-AE53-1EFC9D35B1FE}</b:Guid>
+    <b:Author>
+      <b:Author>
+        <b:Corporate>OMG UML</b:Corporate>
+      </b:Author>
+    </b:Author>
+    <b:Title>OMG® Unified Modeling Language®</b:Title>
+    <b:Year>2017</b:Year>
+    <b:Publisher>OMG UML</b:Publisher>
+    <b:Edition>2.5.1</b:Edition>
+    <b:RefOrder>6</b:RefOrder>
+  </b:Source>
 </b:Sources>
 </file>
 
 <file path=customXml/itemProps1.xml><?xml version="1.0" encoding="utf-8"?>
+<ds:datastoreItem xmlns:ds="http://schemas.openxmlformats.org/officeDocument/2006/customXml" ds:itemID="{5C51FF54-1CBD-43E8-9B2A-B56F20CDF09A}">
+  <ds:schemaRefs>
+    <ds:schemaRef ds:uri="http://schemas.microsoft.com/office/2006/metadata/properties"/>
+    <ds:schemaRef ds:uri="http://schemas.microsoft.com/office/infopath/2007/PartnerControls"/>
+    <ds:schemaRef ds:uri="ac56161a-35a2-4bac-99b6-8739237dc4f6"/>
+  </ds:schemaRefs>
+</ds:datastoreItem>
+</file>
+
+<file path=customXml/itemProps2.xml><?xml version="1.0" encoding="utf-8"?>
+<ds:datastoreItem xmlns:ds="http://schemas.openxmlformats.org/officeDocument/2006/customXml" ds:itemID="{9B975280-634C-49AE-9293-B75FDC4277EB}">
+  <ds:schemaRefs>
+    <ds:schemaRef ds:uri="http://schemas.microsoft.com/sharepoint/v3/contenttype/forms"/>
+  </ds:schemaRefs>
+</ds:datastoreItem>
+</file>
+
+<file path=customXml/itemProps3.xml><?xml version="1.0" encoding="utf-8"?>
 <ds:datastoreItem xmlns:ds="http://schemas.openxmlformats.org/officeDocument/2006/customXml" ds:itemID="{3B693098-FF00-4095-9757-18FD92BDA8E2}">
   <ds:schemaRefs>
     <ds:schemaRef ds:uri="http://schemas.microsoft.com/office/2006/metadata/contentType"/>
@@ -28596,26 +30079,8 @@
 </ds:datastoreItem>
 </file>
 
-<file path=customXml/itemProps2.xml><?xml version="1.0" encoding="utf-8"?>
-<ds:datastoreItem xmlns:ds="http://schemas.openxmlformats.org/officeDocument/2006/customXml" ds:itemID="{5C51FF54-1CBD-43E8-9B2A-B56F20CDF09A}">
-  <ds:schemaRefs>
-    <ds:schemaRef ds:uri="http://schemas.microsoft.com/office/2006/metadata/properties"/>
-    <ds:schemaRef ds:uri="http://schemas.microsoft.com/office/infopath/2007/PartnerControls"/>
-    <ds:schemaRef ds:uri="ac56161a-35a2-4bac-99b6-8739237dc4f6"/>
-  </ds:schemaRefs>
-</ds:datastoreItem>
-</file>
-
-<file path=customXml/itemProps3.xml><?xml version="1.0" encoding="utf-8"?>
-<ds:datastoreItem xmlns:ds="http://schemas.openxmlformats.org/officeDocument/2006/customXml" ds:itemID="{9B975280-634C-49AE-9293-B75FDC4277EB}">
-  <ds:schemaRefs>
-    <ds:schemaRef ds:uri="http://schemas.microsoft.com/sharepoint/v3/contenttype/forms"/>
-  </ds:schemaRefs>
-</ds:datastoreItem>
-</file>
-
 <file path=customXml/itemProps4.xml><?xml version="1.0" encoding="utf-8"?>
-<ds:datastoreItem xmlns:ds="http://schemas.openxmlformats.org/officeDocument/2006/customXml" ds:itemID="{BDD2CEE1-A355-4261-AE02-6E86C30BCFA1}">
+<ds:datastoreItem xmlns:ds="http://schemas.openxmlformats.org/officeDocument/2006/customXml" ds:itemID="{BD449FC3-E0B9-4AEC-A41C-B91CCEE9F9AE}">
   <ds:schemaRefs>
     <ds:schemaRef ds:uri="http://schemas.openxmlformats.org/officeDocument/2006/bibliography"/>
   </ds:schemaRefs>

</xml_diff>

<commit_message>
Making the race finish after the first car finishes
</commit_message>
<xml_diff>
--- a/docs/Technical Report Eoin Fitzsimons.docx
+++ b/docs/Technical Report Eoin Fitzsimons.docx
@@ -593,25 +593,7 @@
           <w:sz w:val="18"/>
           <w:szCs w:val="18"/>
         </w:rPr>
-        <w:t xml:space="preserve">supplied by the </w:t>
-      </w:r>
-      <w:proofErr w:type="gramStart"/>
-      <w:r>
-        <w:rPr>
-          <w:rFonts w:ascii="Verdana" w:hAnsi="Verdana"/>
-          <w:sz w:val="18"/>
-          <w:szCs w:val="18"/>
-        </w:rPr>
-        <w:t>Library</w:t>
-      </w:r>
-      <w:proofErr w:type="gramEnd"/>
-      <w:r>
-        <w:rPr>
-          <w:rFonts w:ascii="Verdana" w:hAnsi="Verdana"/>
-          <w:sz w:val="18"/>
-          <w:szCs w:val="18"/>
-        </w:rPr>
-        <w:t>.  To use other author's written or electronic work is illegal (plagiarism) and may result in disciplinary action.  Students may be required to undergo a viva (oral examination) if there is suspicion about the validity of their submitted work.</w:t>
+        <w:t>supplied by the Library.  To use other author's written or electronic work is illegal (plagiarism) and may result in disciplinary action.  Students may be required to undergo a viva (oral examination) if there is suspicion about the validity of their submitted work.</w:t>
       </w:r>
     </w:p>
     <w:p/>
@@ -1031,21 +1013,7 @@
         <w:rPr>
           <w:b/>
         </w:rPr>
-        <w:t xml:space="preserve">Any project/assignment not submitted will be marked as a </w:t>
-      </w:r>
-      <w:proofErr w:type="gramStart"/>
-      <w:r>
-        <w:rPr>
-          <w:b/>
-        </w:rPr>
-        <w:t>fail</w:t>
-      </w:r>
-      <w:proofErr w:type="gramEnd"/>
-      <w:r>
-        <w:rPr>
-          <w:b/>
-        </w:rPr>
-        <w:t>.</w:t>
+        <w:t>Any project/assignment not submitted will be marked as a fail.</w:t>
       </w:r>
     </w:p>
     <w:p>
@@ -5872,15 +5840,7 @@
       </w:r>
       <w:proofErr w:type="spellEnd"/>
       <w:r>
-        <w:t xml:space="preserve"> libraries are used for file and directory management. They allow the application to </w:t>
-      </w:r>
-      <w:proofErr w:type="gramStart"/>
-      <w:r>
-        <w:t>locate</w:t>
-      </w:r>
-      <w:proofErr w:type="gramEnd"/>
-      <w:r>
-        <w:t xml:space="preserve"> and load required resources, such as configuration files, independently of the user's operating system environment.</w:t>
+        <w:t xml:space="preserve"> libraries are used for file and directory management. They allow the application to locate and load required resources, such as configuration files, independently of the user's operating system environment.</w:t>
       </w:r>
     </w:p>
     <w:p>
@@ -11274,15 +11234,7 @@
     </w:p>
     <w:p>
       <w:r>
-        <w:t xml:space="preserve">The user opens the application to the main </w:t>
-      </w:r>
-      <w:proofErr w:type="gramStart"/>
-      <w:r>
-        <w:t>menu,</w:t>
-      </w:r>
-      <w:proofErr w:type="gramEnd"/>
-      <w:r>
-        <w:t xml:space="preserve"> there they can change accessibility options and start the race.</w:t>
+        <w:t>The user opens the application to the main menu, there they can change accessibility options and start the race.</w:t>
       </w:r>
     </w:p>
     <w:p>
@@ -12066,15 +12018,7 @@
         <w:t xml:space="preserve">There is more telemetry that could be recorded and displayed, such as individual tyre wear, modelling tyre temperature, driver fatigue, </w:t>
       </w:r>
       <w:r>
-        <w:t xml:space="preserve">track grip levels, mini sector times and comparisons to best sector or best lap. But for the purpose of a college </w:t>
-      </w:r>
-      <w:proofErr w:type="gramStart"/>
-      <w:r>
-        <w:t>project</w:t>
-      </w:r>
-      <w:proofErr w:type="gramEnd"/>
-      <w:r>
-        <w:t xml:space="preserve"> it was important to stay with a minimum viable product and not attempt too much and run out of time.</w:t>
+        <w:t>track grip levels, mini sector times and comparisons to best sector or best lap. But for the purpose of a college project it was important to stay with a minimum viable product and not attempt too much and run out of time.</w:t>
       </w:r>
     </w:p>
     <w:p>
@@ -18942,7 +18886,6 @@
     </w:p>
     <w:p>
       <w:pPr>
-        <w:ind w:left="360"/>
         <w:rPr>
           <w:sz w:val="24"/>
           <w:szCs w:val="24"/>
@@ -18952,48 +18895,541 @@
         <w:rPr>
           <w:sz w:val="24"/>
           <w:szCs w:val="24"/>
-          <w:highlight w:val="yellow"/>
-        </w:rPr>
-        <w:t xml:space="preserve">How was the system evaluated and what are the results? </w:t>
-      </w:r>
-      <w:r>
+        </w:rPr>
+        <w:t>The completed Momentum system was evaluated using software quality and evaluation principles described within the IEEE Software Engineering Body of Knowledge (SWEBOK v4). The evaluation considered whether the implemented system satisfied the functional requirements defined during the requirements phase and assessed relevant software quality characteristics through verification, validation, performance analysis and architectural review.</w:t>
+      </w:r>
+    </w:p>
+    <w:p>
+      <w:pPr>
         <w:rPr>
           <w:sz w:val="24"/>
           <w:szCs w:val="24"/>
-          <w:highlight w:val="yellow"/>
-        </w:rPr>
-        <w:t>This may consist of usage data</w:t>
-      </w:r>
+        </w:rPr>
+      </w:pPr>
       <w:r>
         <w:rPr>
           <w:sz w:val="24"/>
           <w:szCs w:val="24"/>
-          <w:highlight w:val="yellow"/>
-        </w:rPr>
-        <w:t xml:space="preserve">. It may also include performance evaluations, scalability, correctness, etc. depending on the focus of the project.  </w:t>
-      </w:r>
-      <w:proofErr w:type="spellStart"/>
-      <w:r>
+        </w:rPr>
+        <w:t>The evaluation was divided into functional suitability, correctness and reliability, performance efficiency, usability, maintainability and scalability. Evidence was collected from automated testing using pytest and pytest-qt, manual system testing, runtime measurements and analysis of the system architecture.</w:t>
+      </w:r>
+    </w:p>
+    <w:p>
+      <w:pPr>
+        <w:pStyle w:val="Heading3"/>
+      </w:pPr>
+      <w:r>
+        <w:t>Functional Evaluation</w:t>
+      </w:r>
+    </w:p>
+    <w:p>
+      <w:pPr>
         <w:rPr>
           <w:sz w:val="24"/>
           <w:szCs w:val="24"/>
-          <w:highlight w:val="yellow"/>
-        </w:rPr>
-        <w:t>Quantative</w:t>
-      </w:r>
-      <w:proofErr w:type="spellEnd"/>
+        </w:rPr>
+      </w:pPr>
       <w:r>
         <w:rPr>
           <w:sz w:val="24"/>
           <w:szCs w:val="24"/>
-          <w:highlight w:val="yellow"/>
-        </w:rPr>
-        <w:t xml:space="preserve"> results may be reported in tables or figures.</w:t>
-      </w:r>
-    </w:p>
-    <w:p>
-      <w:pPr>
-        <w:ind w:left="360"/>
+        </w:rPr>
+        <w:t>Functional evaluation assessed whether the completed application satisfied the requirements established during the requirements analysis phase. The evaluation was performed using the system testing scenarios defined in Section 2.5.5, where each implemented feature was tested against its expected behaviour.</w:t>
+      </w:r>
+    </w:p>
+    <w:tbl>
+      <w:tblPr>
+        <w:tblStyle w:val="GridTable3-Accent1"/>
+        <w:tblW w:w="0" w:type="auto"/>
+        <w:tblLook w:val="0620" w:firstRow="1" w:lastRow="0" w:firstColumn="0" w:lastColumn="0" w:noHBand="1" w:noVBand="1"/>
+      </w:tblPr>
+      <w:tblGrid>
+        <w:gridCol w:w="3743"/>
+        <w:gridCol w:w="2129"/>
+        <w:gridCol w:w="889"/>
+      </w:tblGrid>
+      <w:tr>
+        <w:trPr>
+          <w:cnfStyle w:val="100000000000" w:firstRow="1" w:lastRow="0" w:firstColumn="0" w:lastColumn="0" w:oddVBand="0" w:evenVBand="0" w:oddHBand="0" w:evenHBand="0" w:firstRowFirstColumn="0" w:firstRowLastColumn="0" w:lastRowFirstColumn="0" w:lastRowLastColumn="0"/>
+        </w:trPr>
+        <w:tc>
+          <w:tcPr>
+            <w:tcW w:w="0" w:type="auto"/>
+            <w:hideMark/>
+          </w:tcPr>
+          <w:p>
+            <w:pPr>
+              <w:spacing w:after="160" w:line="259" w:lineRule="auto"/>
+              <w:rPr>
+                <w:sz w:val="24"/>
+                <w:szCs w:val="24"/>
+              </w:rPr>
+            </w:pPr>
+            <w:r>
+              <w:rPr>
+                <w:sz w:val="24"/>
+                <w:szCs w:val="24"/>
+              </w:rPr>
+              <w:t>Requirement</w:t>
+            </w:r>
+          </w:p>
+        </w:tc>
+        <w:tc>
+          <w:tcPr>
+            <w:tcW w:w="0" w:type="auto"/>
+            <w:hideMark/>
+          </w:tcPr>
+          <w:p>
+            <w:pPr>
+              <w:spacing w:after="160" w:line="259" w:lineRule="auto"/>
+              <w:rPr>
+                <w:sz w:val="24"/>
+                <w:szCs w:val="24"/>
+              </w:rPr>
+            </w:pPr>
+            <w:r>
+              <w:rPr>
+                <w:sz w:val="24"/>
+                <w:szCs w:val="24"/>
+              </w:rPr>
+              <w:t>Evaluation Method</w:t>
+            </w:r>
+          </w:p>
+        </w:tc>
+        <w:tc>
+          <w:tcPr>
+            <w:tcW w:w="0" w:type="auto"/>
+            <w:hideMark/>
+          </w:tcPr>
+          <w:p>
+            <w:pPr>
+              <w:spacing w:after="160" w:line="259" w:lineRule="auto"/>
+              <w:rPr>
+                <w:sz w:val="24"/>
+                <w:szCs w:val="24"/>
+              </w:rPr>
+            </w:pPr>
+            <w:r>
+              <w:rPr>
+                <w:sz w:val="24"/>
+                <w:szCs w:val="24"/>
+              </w:rPr>
+              <w:t>Result</w:t>
+            </w:r>
+          </w:p>
+        </w:tc>
+      </w:tr>
+      <w:tr>
+        <w:tc>
+          <w:tcPr>
+            <w:tcW w:w="0" w:type="auto"/>
+            <w:hideMark/>
+          </w:tcPr>
+          <w:p>
+            <w:pPr>
+              <w:spacing w:after="160" w:line="259" w:lineRule="auto"/>
+              <w:rPr>
+                <w:sz w:val="24"/>
+                <w:szCs w:val="24"/>
+              </w:rPr>
+            </w:pPr>
+            <w:r>
+              <w:rPr>
+                <w:sz w:val="24"/>
+                <w:szCs w:val="24"/>
+              </w:rPr>
+              <w:t>FR1 - View race results</w:t>
+            </w:r>
+          </w:p>
+        </w:tc>
+        <w:tc>
+          <w:tcPr>
+            <w:tcW w:w="0" w:type="auto"/>
+            <w:hideMark/>
+          </w:tcPr>
+          <w:p>
+            <w:pPr>
+              <w:spacing w:after="160" w:line="259" w:lineRule="auto"/>
+              <w:rPr>
+                <w:sz w:val="24"/>
+                <w:szCs w:val="24"/>
+              </w:rPr>
+            </w:pPr>
+            <w:r>
+              <w:rPr>
+                <w:sz w:val="24"/>
+                <w:szCs w:val="24"/>
+              </w:rPr>
+              <w:t>Manual system test</w:t>
+            </w:r>
+          </w:p>
+        </w:tc>
+        <w:tc>
+          <w:tcPr>
+            <w:tcW w:w="0" w:type="auto"/>
+            <w:hideMark/>
+          </w:tcPr>
+          <w:p>
+            <w:pPr>
+              <w:spacing w:after="160" w:line="259" w:lineRule="auto"/>
+              <w:rPr>
+                <w:sz w:val="24"/>
+                <w:szCs w:val="24"/>
+              </w:rPr>
+            </w:pPr>
+            <w:r>
+              <w:rPr>
+                <w:sz w:val="24"/>
+                <w:szCs w:val="24"/>
+              </w:rPr>
+              <w:t>Passed</w:t>
+            </w:r>
+          </w:p>
+        </w:tc>
+      </w:tr>
+      <w:tr>
+        <w:tc>
+          <w:tcPr>
+            <w:tcW w:w="0" w:type="auto"/>
+            <w:hideMark/>
+          </w:tcPr>
+          <w:p>
+            <w:pPr>
+              <w:spacing w:after="160" w:line="259" w:lineRule="auto"/>
+              <w:rPr>
+                <w:sz w:val="24"/>
+                <w:szCs w:val="24"/>
+              </w:rPr>
+            </w:pPr>
+            <w:r>
+              <w:rPr>
+                <w:sz w:val="24"/>
+                <w:szCs w:val="24"/>
+              </w:rPr>
+              <w:t>FR2 - Simulate race progression</w:t>
+            </w:r>
+          </w:p>
+        </w:tc>
+        <w:tc>
+          <w:tcPr>
+            <w:tcW w:w="0" w:type="auto"/>
+            <w:hideMark/>
+          </w:tcPr>
+          <w:p>
+            <w:pPr>
+              <w:spacing w:after="160" w:line="259" w:lineRule="auto"/>
+              <w:rPr>
+                <w:sz w:val="24"/>
+                <w:szCs w:val="24"/>
+              </w:rPr>
+            </w:pPr>
+            <w:r>
+              <w:rPr>
+                <w:sz w:val="24"/>
+                <w:szCs w:val="24"/>
+              </w:rPr>
+              <w:t>Manual system test</w:t>
+            </w:r>
+          </w:p>
+        </w:tc>
+        <w:tc>
+          <w:tcPr>
+            <w:tcW w:w="0" w:type="auto"/>
+            <w:hideMark/>
+          </w:tcPr>
+          <w:p>
+            <w:pPr>
+              <w:spacing w:after="160" w:line="259" w:lineRule="auto"/>
+              <w:rPr>
+                <w:sz w:val="24"/>
+                <w:szCs w:val="24"/>
+              </w:rPr>
+            </w:pPr>
+            <w:r>
+              <w:rPr>
+                <w:sz w:val="24"/>
+                <w:szCs w:val="24"/>
+              </w:rPr>
+              <w:t>Passed</w:t>
+            </w:r>
+          </w:p>
+        </w:tc>
+      </w:tr>
+      <w:tr>
+        <w:tc>
+          <w:tcPr>
+            <w:tcW w:w="0" w:type="auto"/>
+            <w:hideMark/>
+          </w:tcPr>
+          <w:p>
+            <w:pPr>
+              <w:spacing w:after="160" w:line="259" w:lineRule="auto"/>
+              <w:rPr>
+                <w:sz w:val="24"/>
+                <w:szCs w:val="24"/>
+              </w:rPr>
+            </w:pPr>
+            <w:r>
+              <w:rPr>
+                <w:sz w:val="24"/>
+                <w:szCs w:val="24"/>
+              </w:rPr>
+              <w:t>FR3 - View live race</w:t>
+            </w:r>
+          </w:p>
+        </w:tc>
+        <w:tc>
+          <w:tcPr>
+            <w:tcW w:w="0" w:type="auto"/>
+            <w:hideMark/>
+          </w:tcPr>
+          <w:p>
+            <w:pPr>
+              <w:spacing w:after="160" w:line="259" w:lineRule="auto"/>
+              <w:rPr>
+                <w:sz w:val="24"/>
+                <w:szCs w:val="24"/>
+              </w:rPr>
+            </w:pPr>
+            <w:r>
+              <w:rPr>
+                <w:sz w:val="24"/>
+                <w:szCs w:val="24"/>
+              </w:rPr>
+              <w:t>Manual system test</w:t>
+            </w:r>
+          </w:p>
+        </w:tc>
+        <w:tc>
+          <w:tcPr>
+            <w:tcW w:w="0" w:type="auto"/>
+            <w:hideMark/>
+          </w:tcPr>
+          <w:p>
+            <w:pPr>
+              <w:spacing w:after="160" w:line="259" w:lineRule="auto"/>
+              <w:rPr>
+                <w:sz w:val="24"/>
+                <w:szCs w:val="24"/>
+              </w:rPr>
+            </w:pPr>
+            <w:r>
+              <w:rPr>
+                <w:sz w:val="24"/>
+                <w:szCs w:val="24"/>
+              </w:rPr>
+              <w:t>Passed</w:t>
+            </w:r>
+          </w:p>
+        </w:tc>
+      </w:tr>
+      <w:tr>
+        <w:tc>
+          <w:tcPr>
+            <w:tcW w:w="0" w:type="auto"/>
+            <w:hideMark/>
+          </w:tcPr>
+          <w:p>
+            <w:pPr>
+              <w:spacing w:after="160" w:line="259" w:lineRule="auto"/>
+              <w:rPr>
+                <w:sz w:val="24"/>
+                <w:szCs w:val="24"/>
+              </w:rPr>
+            </w:pPr>
+            <w:r>
+              <w:rPr>
+                <w:sz w:val="24"/>
+                <w:szCs w:val="24"/>
+              </w:rPr>
+              <w:t>FR4 - Configure race settings</w:t>
+            </w:r>
+          </w:p>
+        </w:tc>
+        <w:tc>
+          <w:tcPr>
+            <w:tcW w:w="0" w:type="auto"/>
+            <w:hideMark/>
+          </w:tcPr>
+          <w:p>
+            <w:pPr>
+              <w:spacing w:after="160" w:line="259" w:lineRule="auto"/>
+              <w:rPr>
+                <w:sz w:val="24"/>
+                <w:szCs w:val="24"/>
+              </w:rPr>
+            </w:pPr>
+            <w:r>
+              <w:rPr>
+                <w:sz w:val="24"/>
+                <w:szCs w:val="24"/>
+              </w:rPr>
+              <w:t>Manual system test</w:t>
+            </w:r>
+          </w:p>
+        </w:tc>
+        <w:tc>
+          <w:tcPr>
+            <w:tcW w:w="0" w:type="auto"/>
+            <w:hideMark/>
+          </w:tcPr>
+          <w:p>
+            <w:pPr>
+              <w:spacing w:after="160" w:line="259" w:lineRule="auto"/>
+              <w:rPr>
+                <w:sz w:val="24"/>
+                <w:szCs w:val="24"/>
+              </w:rPr>
+            </w:pPr>
+            <w:r>
+              <w:rPr>
+                <w:sz w:val="24"/>
+                <w:szCs w:val="24"/>
+              </w:rPr>
+              <w:t>Passed</w:t>
+            </w:r>
+          </w:p>
+        </w:tc>
+      </w:tr>
+      <w:tr>
+        <w:tc>
+          <w:tcPr>
+            <w:tcW w:w="0" w:type="auto"/>
+            <w:hideMark/>
+          </w:tcPr>
+          <w:p>
+            <w:pPr>
+              <w:spacing w:after="160" w:line="259" w:lineRule="auto"/>
+              <w:rPr>
+                <w:sz w:val="24"/>
+                <w:szCs w:val="24"/>
+              </w:rPr>
+            </w:pPr>
+            <w:r>
+              <w:rPr>
+                <w:sz w:val="24"/>
+                <w:szCs w:val="24"/>
+              </w:rPr>
+              <w:t>FR5 - View driver information</w:t>
+            </w:r>
+          </w:p>
+        </w:tc>
+        <w:tc>
+          <w:tcPr>
+            <w:tcW w:w="0" w:type="auto"/>
+            <w:hideMark/>
+          </w:tcPr>
+          <w:p>
+            <w:pPr>
+              <w:spacing w:after="160" w:line="259" w:lineRule="auto"/>
+              <w:rPr>
+                <w:sz w:val="24"/>
+                <w:szCs w:val="24"/>
+              </w:rPr>
+            </w:pPr>
+            <w:r>
+              <w:rPr>
+                <w:sz w:val="24"/>
+                <w:szCs w:val="24"/>
+              </w:rPr>
+              <w:t>Manual system test</w:t>
+            </w:r>
+          </w:p>
+        </w:tc>
+        <w:tc>
+          <w:tcPr>
+            <w:tcW w:w="0" w:type="auto"/>
+            <w:hideMark/>
+          </w:tcPr>
+          <w:p>
+            <w:pPr>
+              <w:spacing w:after="160" w:line="259" w:lineRule="auto"/>
+              <w:rPr>
+                <w:sz w:val="24"/>
+                <w:szCs w:val="24"/>
+              </w:rPr>
+            </w:pPr>
+            <w:r>
+              <w:rPr>
+                <w:sz w:val="24"/>
+                <w:szCs w:val="24"/>
+              </w:rPr>
+              <w:t>Passed</w:t>
+            </w:r>
+          </w:p>
+        </w:tc>
+      </w:tr>
+      <w:tr>
+        <w:tc>
+          <w:tcPr>
+            <w:tcW w:w="0" w:type="auto"/>
+            <w:hideMark/>
+          </w:tcPr>
+          <w:p>
+            <w:pPr>
+              <w:spacing w:after="160" w:line="259" w:lineRule="auto"/>
+              <w:rPr>
+                <w:sz w:val="24"/>
+                <w:szCs w:val="24"/>
+              </w:rPr>
+            </w:pPr>
+            <w:r>
+              <w:rPr>
+                <w:sz w:val="24"/>
+                <w:szCs w:val="24"/>
+              </w:rPr>
+              <w:t>FR6 - Configure accessibility settings</w:t>
+            </w:r>
+          </w:p>
+        </w:tc>
+        <w:tc>
+          <w:tcPr>
+            <w:tcW w:w="0" w:type="auto"/>
+            <w:hideMark/>
+          </w:tcPr>
+          <w:p>
+            <w:pPr>
+              <w:spacing w:after="160" w:line="259" w:lineRule="auto"/>
+              <w:rPr>
+                <w:sz w:val="24"/>
+                <w:szCs w:val="24"/>
+              </w:rPr>
+            </w:pPr>
+            <w:r>
+              <w:rPr>
+                <w:sz w:val="24"/>
+                <w:szCs w:val="24"/>
+              </w:rPr>
+              <w:t>Manual system test</w:t>
+            </w:r>
+          </w:p>
+        </w:tc>
+        <w:tc>
+          <w:tcPr>
+            <w:tcW w:w="0" w:type="auto"/>
+            <w:hideMark/>
+          </w:tcPr>
+          <w:p>
+            <w:pPr>
+              <w:spacing w:after="160" w:line="259" w:lineRule="auto"/>
+              <w:rPr>
+                <w:sz w:val="24"/>
+                <w:szCs w:val="24"/>
+              </w:rPr>
+            </w:pPr>
+            <w:r>
+              <w:rPr>
+                <w:sz w:val="24"/>
+                <w:szCs w:val="24"/>
+              </w:rPr>
+              <w:t>Passed</w:t>
+            </w:r>
+          </w:p>
+        </w:tc>
+      </w:tr>
+    </w:tbl>
+    <w:p>
+      <w:pPr>
         <w:rPr>
           <w:sz w:val="24"/>
           <w:szCs w:val="24"/>
@@ -19004,12 +19440,11 @@
           <w:sz w:val="24"/>
           <w:szCs w:val="24"/>
         </w:rPr>
-        <w:t>The completed system was evaluated against the functional requirements, software quality, performance and usability objectives established during the requirements phase.</w:t>
-      </w:r>
-    </w:p>
-    <w:p>
-      <w:pPr>
-        <w:ind w:left="360"/>
+        <w:t>All six functional requirements were successfully implemented and validated. The completed system supports the intended user workflow by allowing users to configure application options, inspect generated drivers, execute a race simulation, monitor race progression through telemetry and review the final classification.</w:t>
+      </w:r>
+    </w:p>
+    <w:p>
+      <w:pPr>
         <w:rPr>
           <w:sz w:val="24"/>
           <w:szCs w:val="24"/>
@@ -19020,12 +19455,19 @@
           <w:sz w:val="24"/>
           <w:szCs w:val="24"/>
         </w:rPr>
-        <w:t>From a functional perspective, all six planned requirements were successfully implemented. The application allows users to generate drivers, configure accessibility options, simulate a race, observe live race progression, monitor telemetry and review the final race classification. Testing demonstrated that each requirement operated correctly during system testing, indicating that the minimum viable product objectives were achieved.</w:t>
-      </w:r>
-    </w:p>
-    <w:p>
-      <w:pPr>
-        <w:ind w:left="360"/>
+        <w:t>The results demonstrate that the minimum viable product objectives were achieved. However, the evaluation only considers the implemented project scope and does not indicate that the application contains all functionality expected from a complete motorsport management simulation.</w:t>
+      </w:r>
+    </w:p>
+    <w:p>
+      <w:pPr>
+        <w:pStyle w:val="Heading3"/>
+      </w:pPr>
+      <w:r>
+        <w:t>Correctness and Reliability Evaluation</w:t>
+      </w:r>
+    </w:p>
+    <w:p>
+      <w:pPr>
         <w:rPr>
           <w:sz w:val="24"/>
           <w:szCs w:val="24"/>
@@ -19036,28 +19478,493 @@
           <w:sz w:val="24"/>
           <w:szCs w:val="24"/>
         </w:rPr>
-        <w:t xml:space="preserve">The correctness of the implementation was supported through automated testing using pytest and pytest-qt. Unit testing verified the validity of generated driver data, including attribute ranges and uniqueness constraints. Class testing confirmed that the </w:t>
-      </w:r>
-      <w:proofErr w:type="spellStart"/>
-      <w:r>
+        <w:t>Correctness evaluation focused on verifying that individual components behaved according to their expected specifications and that integrated components communicated correctly. This evaluation was supported by the automated testing activities described in Section 2.5.</w:t>
+      </w:r>
+    </w:p>
+    <w:p>
+      <w:pPr>
         <w:rPr>
           <w:sz w:val="24"/>
           <w:szCs w:val="24"/>
         </w:rPr>
-        <w:t>RaceController</w:t>
-      </w:r>
-      <w:proofErr w:type="spellEnd"/>
+      </w:pPr>
       <w:r>
         <w:rPr>
           <w:sz w:val="24"/>
           <w:szCs w:val="24"/>
         </w:rPr>
-        <w:t xml:space="preserve"> correctly initialised race state, generated telemetry and produced valid race results. Integration testing demonstrated successful communication between the simulation engine and graphical interface, while manual system testing confirmed that all user-facing functionality operated as intended. All implemented automated tests passed successfully.</w:t>
-      </w:r>
-    </w:p>
-    <w:p>
-      <w:pPr>
-        <w:ind w:left="360"/>
+        <w:t>The completed automated test suite consisted of unit, class and integration tests.</w:t>
+      </w:r>
+    </w:p>
+    <w:tbl>
+      <w:tblPr>
+        <w:tblStyle w:val="GridTable3-Accent1"/>
+        <w:tblW w:w="0" w:type="auto"/>
+        <w:tblLook w:val="0620" w:firstRow="1" w:lastRow="0" w:firstColumn="0" w:lastColumn="0" w:noHBand="1" w:noVBand="1"/>
+      </w:tblPr>
+      <w:tblGrid>
+        <w:gridCol w:w="2062"/>
+        <w:gridCol w:w="1861"/>
+        <w:gridCol w:w="904"/>
+        <w:gridCol w:w="813"/>
+      </w:tblGrid>
+      <w:tr>
+        <w:trPr>
+          <w:cnfStyle w:val="100000000000" w:firstRow="1" w:lastRow="0" w:firstColumn="0" w:lastColumn="0" w:oddVBand="0" w:evenVBand="0" w:oddHBand="0" w:evenHBand="0" w:firstRowFirstColumn="0" w:firstRowLastColumn="0" w:lastRowFirstColumn="0" w:lastRowLastColumn="0"/>
+        </w:trPr>
+        <w:tc>
+          <w:tcPr>
+            <w:tcW w:w="0" w:type="auto"/>
+            <w:hideMark/>
+          </w:tcPr>
+          <w:p>
+            <w:pPr>
+              <w:spacing w:after="160" w:line="259" w:lineRule="auto"/>
+              <w:rPr>
+                <w:sz w:val="24"/>
+                <w:szCs w:val="24"/>
+              </w:rPr>
+            </w:pPr>
+            <w:r>
+              <w:rPr>
+                <w:sz w:val="24"/>
+                <w:szCs w:val="24"/>
+              </w:rPr>
+              <w:lastRenderedPageBreak/>
+              <w:t>Testing Category</w:t>
+            </w:r>
+          </w:p>
+        </w:tc>
+        <w:tc>
+          <w:tcPr>
+            <w:tcW w:w="0" w:type="auto"/>
+            <w:hideMark/>
+          </w:tcPr>
+          <w:p>
+            <w:pPr>
+              <w:spacing w:after="160" w:line="259" w:lineRule="auto"/>
+              <w:rPr>
+                <w:sz w:val="24"/>
+                <w:szCs w:val="24"/>
+              </w:rPr>
+            </w:pPr>
+            <w:r>
+              <w:rPr>
+                <w:sz w:val="24"/>
+                <w:szCs w:val="24"/>
+              </w:rPr>
+              <w:t>Number of Tests</w:t>
+            </w:r>
+          </w:p>
+        </w:tc>
+        <w:tc>
+          <w:tcPr>
+            <w:tcW w:w="0" w:type="auto"/>
+            <w:hideMark/>
+          </w:tcPr>
+          <w:p>
+            <w:pPr>
+              <w:spacing w:after="160" w:line="259" w:lineRule="auto"/>
+              <w:rPr>
+                <w:sz w:val="24"/>
+                <w:szCs w:val="24"/>
+              </w:rPr>
+            </w:pPr>
+            <w:r>
+              <w:rPr>
+                <w:sz w:val="24"/>
+                <w:szCs w:val="24"/>
+              </w:rPr>
+              <w:t>Passed</w:t>
+            </w:r>
+          </w:p>
+        </w:tc>
+        <w:tc>
+          <w:tcPr>
+            <w:tcW w:w="0" w:type="auto"/>
+            <w:hideMark/>
+          </w:tcPr>
+          <w:p>
+            <w:pPr>
+              <w:spacing w:after="160" w:line="259" w:lineRule="auto"/>
+              <w:rPr>
+                <w:sz w:val="24"/>
+                <w:szCs w:val="24"/>
+              </w:rPr>
+            </w:pPr>
+            <w:r>
+              <w:rPr>
+                <w:sz w:val="24"/>
+                <w:szCs w:val="24"/>
+              </w:rPr>
+              <w:t>Failed</w:t>
+            </w:r>
+          </w:p>
+        </w:tc>
+      </w:tr>
+      <w:tr>
+        <w:tc>
+          <w:tcPr>
+            <w:tcW w:w="0" w:type="auto"/>
+            <w:hideMark/>
+          </w:tcPr>
+          <w:p>
+            <w:pPr>
+              <w:spacing w:after="160" w:line="259" w:lineRule="auto"/>
+              <w:rPr>
+                <w:sz w:val="24"/>
+                <w:szCs w:val="24"/>
+              </w:rPr>
+            </w:pPr>
+            <w:r>
+              <w:rPr>
+                <w:sz w:val="24"/>
+                <w:szCs w:val="24"/>
+              </w:rPr>
+              <w:t>Unit Testing</w:t>
+            </w:r>
+          </w:p>
+        </w:tc>
+        <w:tc>
+          <w:tcPr>
+            <w:tcW w:w="0" w:type="auto"/>
+            <w:hideMark/>
+          </w:tcPr>
+          <w:p>
+            <w:pPr>
+              <w:spacing w:after="160" w:line="259" w:lineRule="auto"/>
+              <w:rPr>
+                <w:sz w:val="24"/>
+                <w:szCs w:val="24"/>
+              </w:rPr>
+            </w:pPr>
+            <w:r>
+              <w:rPr>
+                <w:sz w:val="24"/>
+                <w:szCs w:val="24"/>
+              </w:rPr>
+              <w:t>11</w:t>
+            </w:r>
+          </w:p>
+        </w:tc>
+        <w:tc>
+          <w:tcPr>
+            <w:tcW w:w="0" w:type="auto"/>
+            <w:hideMark/>
+          </w:tcPr>
+          <w:p>
+            <w:pPr>
+              <w:spacing w:after="160" w:line="259" w:lineRule="auto"/>
+              <w:rPr>
+                <w:sz w:val="24"/>
+                <w:szCs w:val="24"/>
+              </w:rPr>
+            </w:pPr>
+            <w:r>
+              <w:rPr>
+                <w:sz w:val="24"/>
+                <w:szCs w:val="24"/>
+              </w:rPr>
+              <w:t>11</w:t>
+            </w:r>
+          </w:p>
+        </w:tc>
+        <w:tc>
+          <w:tcPr>
+            <w:tcW w:w="0" w:type="auto"/>
+            <w:hideMark/>
+          </w:tcPr>
+          <w:p>
+            <w:pPr>
+              <w:spacing w:after="160" w:line="259" w:lineRule="auto"/>
+              <w:rPr>
+                <w:sz w:val="24"/>
+                <w:szCs w:val="24"/>
+              </w:rPr>
+            </w:pPr>
+            <w:r>
+              <w:rPr>
+                <w:sz w:val="24"/>
+                <w:szCs w:val="24"/>
+              </w:rPr>
+              <w:t>0</w:t>
+            </w:r>
+          </w:p>
+        </w:tc>
+      </w:tr>
+      <w:tr>
+        <w:tc>
+          <w:tcPr>
+            <w:tcW w:w="0" w:type="auto"/>
+            <w:hideMark/>
+          </w:tcPr>
+          <w:p>
+            <w:pPr>
+              <w:spacing w:after="160" w:line="259" w:lineRule="auto"/>
+              <w:rPr>
+                <w:sz w:val="24"/>
+                <w:szCs w:val="24"/>
+              </w:rPr>
+            </w:pPr>
+            <w:r>
+              <w:rPr>
+                <w:sz w:val="24"/>
+                <w:szCs w:val="24"/>
+              </w:rPr>
+              <w:t>Class Testing</w:t>
+            </w:r>
+          </w:p>
+        </w:tc>
+        <w:tc>
+          <w:tcPr>
+            <w:tcW w:w="0" w:type="auto"/>
+            <w:hideMark/>
+          </w:tcPr>
+          <w:p>
+            <w:pPr>
+              <w:spacing w:after="160" w:line="259" w:lineRule="auto"/>
+              <w:rPr>
+                <w:sz w:val="24"/>
+                <w:szCs w:val="24"/>
+              </w:rPr>
+            </w:pPr>
+            <w:r>
+              <w:rPr>
+                <w:sz w:val="24"/>
+                <w:szCs w:val="24"/>
+              </w:rPr>
+              <w:t>7</w:t>
+            </w:r>
+          </w:p>
+        </w:tc>
+        <w:tc>
+          <w:tcPr>
+            <w:tcW w:w="0" w:type="auto"/>
+            <w:hideMark/>
+          </w:tcPr>
+          <w:p>
+            <w:pPr>
+              <w:spacing w:after="160" w:line="259" w:lineRule="auto"/>
+              <w:rPr>
+                <w:sz w:val="24"/>
+                <w:szCs w:val="24"/>
+              </w:rPr>
+            </w:pPr>
+            <w:r>
+              <w:rPr>
+                <w:sz w:val="24"/>
+                <w:szCs w:val="24"/>
+              </w:rPr>
+              <w:t>7</w:t>
+            </w:r>
+          </w:p>
+        </w:tc>
+        <w:tc>
+          <w:tcPr>
+            <w:tcW w:w="0" w:type="auto"/>
+            <w:hideMark/>
+          </w:tcPr>
+          <w:p>
+            <w:pPr>
+              <w:spacing w:after="160" w:line="259" w:lineRule="auto"/>
+              <w:rPr>
+                <w:sz w:val="24"/>
+                <w:szCs w:val="24"/>
+              </w:rPr>
+            </w:pPr>
+            <w:r>
+              <w:rPr>
+                <w:sz w:val="24"/>
+                <w:szCs w:val="24"/>
+              </w:rPr>
+              <w:t>0</w:t>
+            </w:r>
+          </w:p>
+        </w:tc>
+      </w:tr>
+      <w:tr>
+        <w:tc>
+          <w:tcPr>
+            <w:tcW w:w="0" w:type="auto"/>
+            <w:hideMark/>
+          </w:tcPr>
+          <w:p>
+            <w:pPr>
+              <w:spacing w:after="160" w:line="259" w:lineRule="auto"/>
+              <w:rPr>
+                <w:sz w:val="24"/>
+                <w:szCs w:val="24"/>
+              </w:rPr>
+            </w:pPr>
+            <w:r>
+              <w:rPr>
+                <w:sz w:val="24"/>
+                <w:szCs w:val="24"/>
+              </w:rPr>
+              <w:t>Integration Testing</w:t>
+            </w:r>
+          </w:p>
+        </w:tc>
+        <w:tc>
+          <w:tcPr>
+            <w:tcW w:w="0" w:type="auto"/>
+            <w:hideMark/>
+          </w:tcPr>
+          <w:p>
+            <w:pPr>
+              <w:spacing w:after="160" w:line="259" w:lineRule="auto"/>
+              <w:rPr>
+                <w:sz w:val="24"/>
+                <w:szCs w:val="24"/>
+              </w:rPr>
+            </w:pPr>
+            <w:r>
+              <w:rPr>
+                <w:sz w:val="24"/>
+                <w:szCs w:val="24"/>
+              </w:rPr>
+              <w:t>1</w:t>
+            </w:r>
+          </w:p>
+        </w:tc>
+        <w:tc>
+          <w:tcPr>
+            <w:tcW w:w="0" w:type="auto"/>
+            <w:hideMark/>
+          </w:tcPr>
+          <w:p>
+            <w:pPr>
+              <w:spacing w:after="160" w:line="259" w:lineRule="auto"/>
+              <w:rPr>
+                <w:sz w:val="24"/>
+                <w:szCs w:val="24"/>
+              </w:rPr>
+            </w:pPr>
+            <w:r>
+              <w:rPr>
+                <w:sz w:val="24"/>
+                <w:szCs w:val="24"/>
+              </w:rPr>
+              <w:t>1</w:t>
+            </w:r>
+          </w:p>
+        </w:tc>
+        <w:tc>
+          <w:tcPr>
+            <w:tcW w:w="0" w:type="auto"/>
+            <w:hideMark/>
+          </w:tcPr>
+          <w:p>
+            <w:pPr>
+              <w:spacing w:after="160" w:line="259" w:lineRule="auto"/>
+              <w:rPr>
+                <w:sz w:val="24"/>
+                <w:szCs w:val="24"/>
+              </w:rPr>
+            </w:pPr>
+            <w:r>
+              <w:rPr>
+                <w:sz w:val="24"/>
+                <w:szCs w:val="24"/>
+              </w:rPr>
+              <w:t>0</w:t>
+            </w:r>
+          </w:p>
+        </w:tc>
+      </w:tr>
+      <w:tr>
+        <w:tc>
+          <w:tcPr>
+            <w:tcW w:w="0" w:type="auto"/>
+            <w:hideMark/>
+          </w:tcPr>
+          <w:p>
+            <w:pPr>
+              <w:spacing w:after="160" w:line="259" w:lineRule="auto"/>
+              <w:rPr>
+                <w:sz w:val="24"/>
+                <w:szCs w:val="24"/>
+              </w:rPr>
+            </w:pPr>
+            <w:r>
+              <w:rPr>
+                <w:sz w:val="24"/>
+                <w:szCs w:val="24"/>
+              </w:rPr>
+              <w:t>Total</w:t>
+            </w:r>
+          </w:p>
+        </w:tc>
+        <w:tc>
+          <w:tcPr>
+            <w:tcW w:w="0" w:type="auto"/>
+            <w:hideMark/>
+          </w:tcPr>
+          <w:p>
+            <w:pPr>
+              <w:spacing w:after="160" w:line="259" w:lineRule="auto"/>
+              <w:rPr>
+                <w:sz w:val="24"/>
+                <w:szCs w:val="24"/>
+              </w:rPr>
+            </w:pPr>
+            <w:r>
+              <w:rPr>
+                <w:sz w:val="24"/>
+                <w:szCs w:val="24"/>
+              </w:rPr>
+              <w:t>19</w:t>
+            </w:r>
+          </w:p>
+        </w:tc>
+        <w:tc>
+          <w:tcPr>
+            <w:tcW w:w="0" w:type="auto"/>
+            <w:hideMark/>
+          </w:tcPr>
+          <w:p>
+            <w:pPr>
+              <w:spacing w:after="160" w:line="259" w:lineRule="auto"/>
+              <w:rPr>
+                <w:sz w:val="24"/>
+                <w:szCs w:val="24"/>
+              </w:rPr>
+            </w:pPr>
+            <w:r>
+              <w:rPr>
+                <w:sz w:val="24"/>
+                <w:szCs w:val="24"/>
+              </w:rPr>
+              <w:t>19</w:t>
+            </w:r>
+          </w:p>
+        </w:tc>
+        <w:tc>
+          <w:tcPr>
+            <w:tcW w:w="0" w:type="auto"/>
+            <w:hideMark/>
+          </w:tcPr>
+          <w:p>
+            <w:pPr>
+              <w:spacing w:after="160" w:line="259" w:lineRule="auto"/>
+              <w:rPr>
+                <w:sz w:val="24"/>
+                <w:szCs w:val="24"/>
+              </w:rPr>
+            </w:pPr>
+            <w:r>
+              <w:rPr>
+                <w:sz w:val="24"/>
+                <w:szCs w:val="24"/>
+              </w:rPr>
+              <w:t>0</w:t>
+            </w:r>
+          </w:p>
+        </w:tc>
+      </w:tr>
+    </w:tbl>
+    <w:p>
+      <w:pPr>
         <w:rPr>
           <w:sz w:val="24"/>
           <w:szCs w:val="24"/>
@@ -19068,28 +19975,27 @@
           <w:sz w:val="24"/>
           <w:szCs w:val="24"/>
         </w:rPr>
-        <w:t>Performance was appropriate for the project's intended scale. The simulation updates ten drivers simultaneously while continuously refreshing telemetry and graphical race information without noticeable delay on standard desktop hardware. Runtime memory usage remains relatively low because objects exist only during execution, while JSON files are used only for configuration data. The absence of a database also reduces implementation complexity and minimises storage overhead for the prototype.</w:t>
-      </w:r>
-    </w:p>
-    <w:p>
-      <w:pPr>
-        <w:ind w:left="360"/>
+        <w:t xml:space="preserve">Unit testing demonstrated that driver generation produced valid driver objects according to the defined constraints, including valid attributes, age ranges and uniqueness requirements. Class testing verified that the </w:t>
+      </w:r>
+      <w:proofErr w:type="spellStart"/>
+      <w:r>
         <w:rPr>
           <w:sz w:val="24"/>
           <w:szCs w:val="24"/>
         </w:rPr>
-      </w:pPr>
+        <w:t>RaceController</w:t>
+      </w:r>
+      <w:proofErr w:type="spellEnd"/>
       <w:r>
         <w:rPr>
           <w:sz w:val="24"/>
           <w:szCs w:val="24"/>
         </w:rPr>
-        <w:t>The project demonstrates good maintainability through its modular architecture. Separating the graphical interface, simulation logic, runtime data and configuration files reduces coupling between components and allows individual modules to be modified without affecting unrelated parts of the system. This separation also simplifies future expansion.</w:t>
-      </w:r>
-    </w:p>
-    <w:p>
-      <w:pPr>
-        <w:ind w:left="360"/>
+        <w:t xml:space="preserve"> correctly managed race initialisation, simulation updates, telemetry generation and result generation.</w:t>
+      </w:r>
+    </w:p>
+    <w:p>
+      <w:pPr>
         <w:rPr>
           <w:sz w:val="24"/>
           <w:szCs w:val="24"/>
@@ -19100,12 +20006,11 @@
           <w:sz w:val="24"/>
           <w:szCs w:val="24"/>
         </w:rPr>
-        <w:t>There are, however, several limitations. The simulation currently models only a single predefined race and does not support championships, career progression or persistent historical data. Track selection is limited, pit stops are not implemented, and vehicle behaviour remains intentionally simplified to remain within the scope of the project. Consequently, while the system demonstrates the core concepts of race simulation and telemetry visualisation, it should be viewed as a functional prototype rather than a complete motorsport management game.</w:t>
-      </w:r>
-    </w:p>
-    <w:p>
-      <w:pPr>
-        <w:ind w:left="360"/>
+        <w:t>Integration testing confirmed that the simulation logic successfully communicated with the graphical interface. The main menu was able to receive generated race data and trigger race execution correctly.</w:t>
+      </w:r>
+    </w:p>
+    <w:p>
+      <w:pPr>
         <w:rPr>
           <w:sz w:val="24"/>
           <w:szCs w:val="24"/>
@@ -19116,8 +20021,15 @@
           <w:sz w:val="24"/>
           <w:szCs w:val="24"/>
         </w:rPr>
-        <w:lastRenderedPageBreak/>
-        <w:t>Overall, the evaluation indicates that Momentum successfully satisfies the objectives established for the project while providing a strong architectural foundation for future development.</w:t>
+        <w:t>The successful completion of all automated tests provides evidence that the implemented components operate according to their intended behaviour. However, testing cannot guarantee the absence of all defects, as only the implemented test cases and scenarios were evaluated.</w:t>
+      </w:r>
+    </w:p>
+    <w:p>
+      <w:pPr>
+        <w:pStyle w:val="Heading3"/>
+      </w:pPr>
+      <w:r>
+        <w:t>Performance Evaluation</w:t>
       </w:r>
     </w:p>
     <w:p>
@@ -19127,6 +20039,1072 @@
           <w:szCs w:val="24"/>
         </w:rPr>
       </w:pPr>
+      <w:r>
+        <w:rPr>
+          <w:sz w:val="24"/>
+          <w:szCs w:val="24"/>
+        </w:rPr>
+        <w:t>Performance evaluation assessed whether the system could execute the intended race simulation efficiently within the constraints of the project scope. The evaluation focused on simulation execution time, resource consumption and graphical responsiveness.</w:t>
+      </w:r>
+    </w:p>
+    <w:p>
+      <w:pPr>
+        <w:rPr>
+          <w:sz w:val="24"/>
+          <w:szCs w:val="24"/>
+        </w:rPr>
+      </w:pPr>
+      <w:r>
+        <w:rPr>
+          <w:sz w:val="24"/>
+          <w:szCs w:val="24"/>
+        </w:rPr>
+        <w:t>The system was tested using the configured race environment consisting of ten driver agents. Performance measurements were collected by executing the same race configuration multiple times and recording the execution duration.</w:t>
+      </w:r>
+    </w:p>
+    <w:tbl>
+      <w:tblPr>
+        <w:tblW w:w="0" w:type="auto"/>
+        <w:tblCellSpacing w:w="15" w:type="dxa"/>
+        <w:tblCellMar>
+          <w:top w:w="15" w:type="dxa"/>
+          <w:left w:w="15" w:type="dxa"/>
+          <w:bottom w:w="15" w:type="dxa"/>
+          <w:right w:w="15" w:type="dxa"/>
+        </w:tblCellMar>
+        <w:tblLook w:val="04A0" w:firstRow="1" w:lastRow="0" w:firstColumn="1" w:lastColumn="0" w:noHBand="0" w:noVBand="1"/>
+      </w:tblPr>
+      <w:tblGrid>
+        <w:gridCol w:w="3616"/>
+        <w:gridCol w:w="698"/>
+      </w:tblGrid>
+      <w:tr>
+        <w:trPr>
+          <w:tblHeader/>
+          <w:tblCellSpacing w:w="15" w:type="dxa"/>
+        </w:trPr>
+        <w:tc>
+          <w:tcPr>
+            <w:tcW w:w="0" w:type="auto"/>
+            <w:vAlign w:val="center"/>
+            <w:hideMark/>
+          </w:tcPr>
+          <w:p>
+            <w:pPr>
+              <w:rPr>
+                <w:b/>
+                <w:bCs/>
+                <w:sz w:val="24"/>
+                <w:szCs w:val="24"/>
+              </w:rPr>
+            </w:pPr>
+            <w:r>
+              <w:rPr>
+                <w:b/>
+                <w:bCs/>
+                <w:sz w:val="24"/>
+                <w:szCs w:val="24"/>
+              </w:rPr>
+              <w:t>Measurement</w:t>
+            </w:r>
+          </w:p>
+        </w:tc>
+        <w:tc>
+          <w:tcPr>
+            <w:tcW w:w="0" w:type="auto"/>
+            <w:vAlign w:val="center"/>
+            <w:hideMark/>
+          </w:tcPr>
+          <w:p>
+            <w:pPr>
+              <w:rPr>
+                <w:b/>
+                <w:bCs/>
+                <w:sz w:val="24"/>
+                <w:szCs w:val="24"/>
+              </w:rPr>
+            </w:pPr>
+            <w:r>
+              <w:rPr>
+                <w:b/>
+                <w:bCs/>
+                <w:sz w:val="24"/>
+                <w:szCs w:val="24"/>
+              </w:rPr>
+              <w:t>Result</w:t>
+            </w:r>
+          </w:p>
+        </w:tc>
+      </w:tr>
+      <w:tr>
+        <w:trPr>
+          <w:tblCellSpacing w:w="15" w:type="dxa"/>
+        </w:trPr>
+        <w:tc>
+          <w:tcPr>
+            <w:tcW w:w="0" w:type="auto"/>
+            <w:vAlign w:val="center"/>
+            <w:hideMark/>
+          </w:tcPr>
+          <w:p>
+            <w:pPr>
+              <w:rPr>
+                <w:sz w:val="24"/>
+                <w:szCs w:val="24"/>
+              </w:rPr>
+            </w:pPr>
+            <w:r>
+              <w:rPr>
+                <w:sz w:val="24"/>
+                <w:szCs w:val="24"/>
+              </w:rPr>
+              <w:t>Number of drivers</w:t>
+            </w:r>
+          </w:p>
+        </w:tc>
+        <w:tc>
+          <w:tcPr>
+            <w:tcW w:w="0" w:type="auto"/>
+            <w:vAlign w:val="center"/>
+            <w:hideMark/>
+          </w:tcPr>
+          <w:p>
+            <w:pPr>
+              <w:rPr>
+                <w:sz w:val="24"/>
+                <w:szCs w:val="24"/>
+              </w:rPr>
+            </w:pPr>
+            <w:r>
+              <w:rPr>
+                <w:sz w:val="24"/>
+                <w:szCs w:val="24"/>
+              </w:rPr>
+              <w:t>10</w:t>
+            </w:r>
+          </w:p>
+        </w:tc>
+      </w:tr>
+      <w:tr>
+        <w:trPr>
+          <w:tblCellSpacing w:w="15" w:type="dxa"/>
+        </w:trPr>
+        <w:tc>
+          <w:tcPr>
+            <w:tcW w:w="0" w:type="auto"/>
+            <w:vAlign w:val="center"/>
+            <w:hideMark/>
+          </w:tcPr>
+          <w:p>
+            <w:pPr>
+              <w:rPr>
+                <w:sz w:val="24"/>
+                <w:szCs w:val="24"/>
+              </w:rPr>
+            </w:pPr>
+            <w:r>
+              <w:rPr>
+                <w:sz w:val="24"/>
+                <w:szCs w:val="24"/>
+              </w:rPr>
+              <w:t>Number of laps</w:t>
+            </w:r>
+          </w:p>
+        </w:tc>
+        <w:tc>
+          <w:tcPr>
+            <w:tcW w:w="0" w:type="auto"/>
+            <w:vAlign w:val="center"/>
+            <w:hideMark/>
+          </w:tcPr>
+          <w:p>
+            <w:pPr>
+              <w:rPr>
+                <w:sz w:val="24"/>
+                <w:szCs w:val="24"/>
+              </w:rPr>
+            </w:pPr>
+            <w:r>
+              <w:rPr>
+                <w:sz w:val="24"/>
+                <w:szCs w:val="24"/>
+              </w:rPr>
+              <w:t>20</w:t>
+            </w:r>
+          </w:p>
+        </w:tc>
+      </w:tr>
+      <w:tr>
+        <w:trPr>
+          <w:tblCellSpacing w:w="15" w:type="dxa"/>
+        </w:trPr>
+        <w:tc>
+          <w:tcPr>
+            <w:tcW w:w="0" w:type="auto"/>
+            <w:vAlign w:val="center"/>
+            <w:hideMark/>
+          </w:tcPr>
+          <w:p>
+            <w:pPr>
+              <w:rPr>
+                <w:sz w:val="24"/>
+                <w:szCs w:val="24"/>
+              </w:rPr>
+            </w:pPr>
+            <w:r>
+              <w:rPr>
+                <w:sz w:val="24"/>
+                <w:szCs w:val="24"/>
+              </w:rPr>
+              <w:t>Average simulation completion time</w:t>
+            </w:r>
+          </w:p>
+        </w:tc>
+        <w:tc>
+          <w:tcPr>
+            <w:tcW w:w="0" w:type="auto"/>
+            <w:vAlign w:val="center"/>
+            <w:hideMark/>
+          </w:tcPr>
+          <w:p>
+            <w:pPr>
+              <w:rPr>
+                <w:sz w:val="24"/>
+                <w:szCs w:val="24"/>
+              </w:rPr>
+            </w:pPr>
+            <w:r>
+              <w:rPr>
+                <w:sz w:val="24"/>
+                <w:szCs w:val="24"/>
+              </w:rPr>
+              <w:t>60s</w:t>
+            </w:r>
+          </w:p>
+        </w:tc>
+      </w:tr>
+      <w:tr>
+        <w:trPr>
+          <w:tblCellSpacing w:w="15" w:type="dxa"/>
+        </w:trPr>
+        <w:tc>
+          <w:tcPr>
+            <w:tcW w:w="0" w:type="auto"/>
+            <w:vAlign w:val="center"/>
+            <w:hideMark/>
+          </w:tcPr>
+          <w:p>
+            <w:pPr>
+              <w:rPr>
+                <w:sz w:val="24"/>
+                <w:szCs w:val="24"/>
+              </w:rPr>
+            </w:pPr>
+            <w:r>
+              <w:rPr>
+                <w:sz w:val="24"/>
+                <w:szCs w:val="24"/>
+              </w:rPr>
+              <w:t>Average memory usage</w:t>
+            </w:r>
+          </w:p>
+        </w:tc>
+        <w:tc>
+          <w:tcPr>
+            <w:tcW w:w="0" w:type="auto"/>
+            <w:vAlign w:val="center"/>
+            <w:hideMark/>
+          </w:tcPr>
+          <w:p>
+            <w:pPr>
+              <w:rPr>
+                <w:sz w:val="24"/>
+                <w:szCs w:val="24"/>
+              </w:rPr>
+            </w:pPr>
+            <w:r>
+              <w:rPr>
+                <w:sz w:val="24"/>
+                <w:szCs w:val="24"/>
+              </w:rPr>
+              <w:t>40MB</w:t>
+            </w:r>
+          </w:p>
+        </w:tc>
+      </w:tr>
+    </w:tbl>
+    <w:p>
+      <w:pPr>
+        <w:rPr>
+          <w:sz w:val="24"/>
+          <w:szCs w:val="24"/>
+        </w:rPr>
+      </w:pPr>
+      <w:r>
+        <w:rPr>
+          <w:sz w:val="24"/>
+          <w:szCs w:val="24"/>
+        </w:rPr>
+        <w:t>The results indicate that the current implementation is suitable for the intended prototype scale. The simulation only manages a limited number of agents and therefore does not require complex optimisation techniques or external storage systems.</w:t>
+      </w:r>
+      <w:r>
+        <w:rPr>
+          <w:sz w:val="24"/>
+          <w:szCs w:val="24"/>
+        </w:rPr>
+        <w:t xml:space="preserve"> The in-game time is factored at around 30* real time.</w:t>
+      </w:r>
+    </w:p>
+    <w:p>
+      <w:pPr>
+        <w:rPr>
+          <w:sz w:val="24"/>
+          <w:szCs w:val="24"/>
+        </w:rPr>
+      </w:pPr>
+      <w:r>
+        <w:rPr>
+          <w:sz w:val="24"/>
+          <w:szCs w:val="24"/>
+        </w:rPr>
+        <w:t>The current architecture stores active race objects in runtime memory, which provides fast access and reduces implementation complexity. This approach is appropriate for a single-</w:t>
+      </w:r>
+      <w:r>
+        <w:rPr>
+          <w:sz w:val="24"/>
+          <w:szCs w:val="24"/>
+        </w:rPr>
+        <w:lastRenderedPageBreak/>
+        <w:t>race prototype where historical persistence is not required. However, this design would become less suitable as the system grows because larger simulations, championship history and persistent player progression would increase memory requirements.</w:t>
+      </w:r>
+    </w:p>
+    <w:p>
+      <w:pPr>
+        <w:pStyle w:val="Heading3"/>
+      </w:pPr>
+      <w:r>
+        <w:t>Usability Evaluation</w:t>
+      </w:r>
+    </w:p>
+    <w:p>
+      <w:pPr>
+        <w:rPr>
+          <w:sz w:val="24"/>
+          <w:szCs w:val="24"/>
+        </w:rPr>
+      </w:pPr>
+      <w:r>
+        <w:rPr>
+          <w:sz w:val="24"/>
+          <w:szCs w:val="24"/>
+        </w:rPr>
+        <w:t>Usability evaluation considered whether users could successfully interact with the system and understand the information presented by the graphical interface. This evaluation was based on manual system testing and analysis of the implemented user interface features.</w:t>
+      </w:r>
+    </w:p>
+    <w:p>
+      <w:pPr>
+        <w:rPr>
+          <w:sz w:val="24"/>
+          <w:szCs w:val="24"/>
+        </w:rPr>
+      </w:pPr>
+      <w:r>
+        <w:rPr>
+          <w:sz w:val="24"/>
+          <w:szCs w:val="24"/>
+        </w:rPr>
+        <w:t>The application provides a clear workflow consisting of:</w:t>
+      </w:r>
+    </w:p>
+    <w:p>
+      <w:pPr>
+        <w:numPr>
+          <w:ilvl w:val="0"/>
+          <w:numId w:val="49"/>
+        </w:numPr>
+        <w:rPr>
+          <w:sz w:val="24"/>
+          <w:szCs w:val="24"/>
+        </w:rPr>
+      </w:pPr>
+      <w:r>
+        <w:rPr>
+          <w:sz w:val="24"/>
+          <w:szCs w:val="24"/>
+        </w:rPr>
+        <w:t>Viewing generated driver information.</w:t>
+      </w:r>
+    </w:p>
+    <w:p>
+      <w:pPr>
+        <w:numPr>
+          <w:ilvl w:val="0"/>
+          <w:numId w:val="49"/>
+        </w:numPr>
+        <w:rPr>
+          <w:sz w:val="24"/>
+          <w:szCs w:val="24"/>
+        </w:rPr>
+      </w:pPr>
+      <w:r>
+        <w:rPr>
+          <w:sz w:val="24"/>
+          <w:szCs w:val="24"/>
+        </w:rPr>
+        <w:t>Configuring accessibility settings.</w:t>
+      </w:r>
+    </w:p>
+    <w:p>
+      <w:pPr>
+        <w:numPr>
+          <w:ilvl w:val="0"/>
+          <w:numId w:val="49"/>
+        </w:numPr>
+        <w:rPr>
+          <w:sz w:val="24"/>
+          <w:szCs w:val="24"/>
+        </w:rPr>
+      </w:pPr>
+      <w:r>
+        <w:rPr>
+          <w:sz w:val="24"/>
+          <w:szCs w:val="24"/>
+        </w:rPr>
+        <w:t>Starting the race simulation.</w:t>
+      </w:r>
+    </w:p>
+    <w:p>
+      <w:pPr>
+        <w:numPr>
+          <w:ilvl w:val="0"/>
+          <w:numId w:val="49"/>
+        </w:numPr>
+        <w:rPr>
+          <w:sz w:val="24"/>
+          <w:szCs w:val="24"/>
+        </w:rPr>
+      </w:pPr>
+      <w:r>
+        <w:rPr>
+          <w:sz w:val="24"/>
+          <w:szCs w:val="24"/>
+        </w:rPr>
+        <w:t>Monitoring live race information.</w:t>
+      </w:r>
+    </w:p>
+    <w:p>
+      <w:pPr>
+        <w:numPr>
+          <w:ilvl w:val="0"/>
+          <w:numId w:val="49"/>
+        </w:numPr>
+        <w:rPr>
+          <w:sz w:val="24"/>
+          <w:szCs w:val="24"/>
+        </w:rPr>
+      </w:pPr>
+      <w:r>
+        <w:rPr>
+          <w:sz w:val="24"/>
+          <w:szCs w:val="24"/>
+        </w:rPr>
+        <w:t>Reviewing final race results.</w:t>
+      </w:r>
+    </w:p>
+    <w:p>
+      <w:pPr>
+        <w:rPr>
+          <w:sz w:val="24"/>
+          <w:szCs w:val="24"/>
+        </w:rPr>
+      </w:pPr>
+      <w:r>
+        <w:rPr>
+          <w:sz w:val="24"/>
+          <w:szCs w:val="24"/>
+        </w:rPr>
+        <w:t>The interface provides visibility of system state through live race progression, telemetry information and race classification output. Accessibility options improve usability by allowing users to adjust interface settings according to their preferences.</w:t>
+      </w:r>
+    </w:p>
+    <w:p>
+      <w:pPr>
+        <w:rPr>
+          <w:sz w:val="24"/>
+          <w:szCs w:val="24"/>
+        </w:rPr>
+      </w:pPr>
+      <w:r>
+        <w:rPr>
+          <w:sz w:val="24"/>
+          <w:szCs w:val="24"/>
+        </w:rPr>
+        <w:t>A limitation of this evaluation is that formal user testing with external participants was not performed. Therefore, usability conclusions are based on functional interaction testing and developer evaluation rather than statistical user feedback.</w:t>
+      </w:r>
+    </w:p>
+    <w:p>
+      <w:pPr>
+        <w:pStyle w:val="Heading3"/>
+      </w:pPr>
+      <w:r>
+        <w:t>Maintainability Evaluation</w:t>
+      </w:r>
+    </w:p>
+    <w:p>
+      <w:pPr>
+        <w:rPr>
+          <w:sz w:val="24"/>
+          <w:szCs w:val="24"/>
+        </w:rPr>
+      </w:pPr>
+      <w:r>
+        <w:rPr>
+          <w:sz w:val="24"/>
+          <w:szCs w:val="24"/>
+        </w:rPr>
+        <w:t>Maintainability was evaluated through analysis of the system architecture and separation of responsibilities between components.</w:t>
+      </w:r>
+    </w:p>
+    <w:p>
+      <w:pPr>
+        <w:rPr>
+          <w:sz w:val="24"/>
+          <w:szCs w:val="24"/>
+        </w:rPr>
+      </w:pPr>
+      <w:r>
+        <w:rPr>
+          <w:sz w:val="24"/>
+          <w:szCs w:val="24"/>
+        </w:rPr>
+        <w:t>The application separates major responsibilities into independent modules:</w:t>
+      </w:r>
+    </w:p>
+    <w:p>
+      <w:pPr>
+        <w:numPr>
+          <w:ilvl w:val="0"/>
+          <w:numId w:val="50"/>
+        </w:numPr>
+        <w:rPr>
+          <w:sz w:val="24"/>
+          <w:szCs w:val="24"/>
+        </w:rPr>
+      </w:pPr>
+      <w:r>
+        <w:rPr>
+          <w:sz w:val="24"/>
+          <w:szCs w:val="24"/>
+        </w:rPr>
+        <w:t>Graphical interface components handle user interaction and visualisation.</w:t>
+      </w:r>
+    </w:p>
+    <w:p>
+      <w:pPr>
+        <w:numPr>
+          <w:ilvl w:val="0"/>
+          <w:numId w:val="50"/>
+        </w:numPr>
+        <w:rPr>
+          <w:sz w:val="24"/>
+          <w:szCs w:val="24"/>
+        </w:rPr>
+      </w:pPr>
+      <w:proofErr w:type="spellStart"/>
+      <w:r>
+        <w:rPr>
+          <w:sz w:val="24"/>
+          <w:szCs w:val="24"/>
+        </w:rPr>
+        <w:t>RaceController</w:t>
+      </w:r>
+      <w:proofErr w:type="spellEnd"/>
+      <w:r>
+        <w:rPr>
+          <w:sz w:val="24"/>
+          <w:szCs w:val="24"/>
+        </w:rPr>
+        <w:t xml:space="preserve"> manages simulation execution.</w:t>
+      </w:r>
+    </w:p>
+    <w:p>
+      <w:pPr>
+        <w:numPr>
+          <w:ilvl w:val="0"/>
+          <w:numId w:val="50"/>
+        </w:numPr>
+        <w:rPr>
+          <w:sz w:val="24"/>
+          <w:szCs w:val="24"/>
+        </w:rPr>
+      </w:pPr>
+      <w:r>
+        <w:rPr>
+          <w:sz w:val="24"/>
+          <w:szCs w:val="24"/>
+        </w:rPr>
+        <w:t>Model classes represent drivers, cars and telemetry data.</w:t>
+      </w:r>
+    </w:p>
+    <w:p>
+      <w:pPr>
+        <w:numPr>
+          <w:ilvl w:val="0"/>
+          <w:numId w:val="50"/>
+        </w:numPr>
+        <w:rPr>
+          <w:sz w:val="24"/>
+          <w:szCs w:val="24"/>
+        </w:rPr>
+      </w:pPr>
+      <w:r>
+        <w:rPr>
+          <w:sz w:val="24"/>
+          <w:szCs w:val="24"/>
+        </w:rPr>
+        <w:t>Configuration files store adjustable race parameters.</w:t>
+      </w:r>
+    </w:p>
+    <w:p>
+      <w:pPr>
+        <w:rPr>
+          <w:sz w:val="24"/>
+          <w:szCs w:val="24"/>
+        </w:rPr>
+      </w:pPr>
+      <w:r>
+        <w:rPr>
+          <w:sz w:val="24"/>
+          <w:szCs w:val="24"/>
+        </w:rPr>
+        <w:t>This modular design reduces coupling between components and allows individual areas of the system to be modified without requiring changes throughout the entire application. For example, changes to race simulation logic can be implemented independently from graphical interface components.</w:t>
+      </w:r>
+    </w:p>
+    <w:p>
+      <w:pPr>
+        <w:rPr>
+          <w:sz w:val="24"/>
+          <w:szCs w:val="24"/>
+        </w:rPr>
+      </w:pPr>
+      <w:r>
+        <w:rPr>
+          <w:sz w:val="24"/>
+          <w:szCs w:val="24"/>
+        </w:rPr>
+        <w:t>The architecture also supports future development by providing clear locations for additional functionality. However, some limitations remain because the current system does not include persistent data storage or database abstraction.</w:t>
+      </w:r>
+    </w:p>
+    <w:p>
+      <w:pPr>
+        <w:pStyle w:val="Heading3"/>
+      </w:pPr>
+      <w:r>
+        <w:lastRenderedPageBreak/>
+        <w:t>Scalability Evaluation</w:t>
+      </w:r>
+    </w:p>
+    <w:p>
+      <w:pPr>
+        <w:rPr>
+          <w:sz w:val="24"/>
+          <w:szCs w:val="24"/>
+        </w:rPr>
+      </w:pPr>
+      <w:r>
+        <w:rPr>
+          <w:sz w:val="24"/>
+          <w:szCs w:val="24"/>
+        </w:rPr>
+        <w:t>Scalability evaluation considered how effectively the current architecture could support future expansion beyond the project scope.</w:t>
+      </w:r>
+    </w:p>
+    <w:p>
+      <w:pPr>
+        <w:rPr>
+          <w:sz w:val="24"/>
+          <w:szCs w:val="24"/>
+        </w:rPr>
+      </w:pPr>
+      <w:r>
+        <w:rPr>
+          <w:sz w:val="24"/>
+          <w:szCs w:val="24"/>
+        </w:rPr>
+        <w:t>The completed prototype has several intentional limitations:</w:t>
+      </w:r>
+    </w:p>
+    <w:tbl>
+      <w:tblPr>
+        <w:tblStyle w:val="GridTable3-Accent1"/>
+        <w:tblW w:w="0" w:type="auto"/>
+        <w:tblLook w:val="0620" w:firstRow="1" w:lastRow="0" w:firstColumn="0" w:lastColumn="0" w:noHBand="1" w:noVBand="1"/>
+      </w:tblPr>
+      <w:tblGrid>
+        <w:gridCol w:w="1632"/>
+        <w:gridCol w:w="4595"/>
+      </w:tblGrid>
+      <w:tr>
+        <w:trPr>
+          <w:cnfStyle w:val="100000000000" w:firstRow="1" w:lastRow="0" w:firstColumn="0" w:lastColumn="0" w:oddVBand="0" w:evenVBand="0" w:oddHBand="0" w:evenHBand="0" w:firstRowFirstColumn="0" w:firstRowLastColumn="0" w:lastRowFirstColumn="0" w:lastRowLastColumn="0"/>
+        </w:trPr>
+        <w:tc>
+          <w:tcPr>
+            <w:tcW w:w="0" w:type="auto"/>
+            <w:hideMark/>
+          </w:tcPr>
+          <w:p>
+            <w:pPr>
+              <w:spacing w:after="160" w:line="259" w:lineRule="auto"/>
+              <w:rPr>
+                <w:sz w:val="24"/>
+                <w:szCs w:val="24"/>
+              </w:rPr>
+            </w:pPr>
+            <w:r>
+              <w:rPr>
+                <w:sz w:val="24"/>
+                <w:szCs w:val="24"/>
+              </w:rPr>
+              <w:t>Area</w:t>
+            </w:r>
+          </w:p>
+        </w:tc>
+        <w:tc>
+          <w:tcPr>
+            <w:tcW w:w="0" w:type="auto"/>
+            <w:hideMark/>
+          </w:tcPr>
+          <w:p>
+            <w:pPr>
+              <w:spacing w:after="160" w:line="259" w:lineRule="auto"/>
+              <w:rPr>
+                <w:sz w:val="24"/>
+                <w:szCs w:val="24"/>
+              </w:rPr>
+            </w:pPr>
+            <w:r>
+              <w:rPr>
+                <w:sz w:val="24"/>
+                <w:szCs w:val="24"/>
+              </w:rPr>
+              <w:t>Current Implementation</w:t>
+            </w:r>
+          </w:p>
+        </w:tc>
+      </w:tr>
+      <w:tr>
+        <w:tc>
+          <w:tcPr>
+            <w:tcW w:w="0" w:type="auto"/>
+            <w:hideMark/>
+          </w:tcPr>
+          <w:p>
+            <w:pPr>
+              <w:spacing w:after="160" w:line="259" w:lineRule="auto"/>
+              <w:rPr>
+                <w:sz w:val="24"/>
+                <w:szCs w:val="24"/>
+              </w:rPr>
+            </w:pPr>
+            <w:r>
+              <w:rPr>
+                <w:sz w:val="24"/>
+                <w:szCs w:val="24"/>
+              </w:rPr>
+              <w:t>Drivers</w:t>
+            </w:r>
+          </w:p>
+        </w:tc>
+        <w:tc>
+          <w:tcPr>
+            <w:tcW w:w="0" w:type="auto"/>
+            <w:hideMark/>
+          </w:tcPr>
+          <w:p>
+            <w:pPr>
+              <w:spacing w:after="160" w:line="259" w:lineRule="auto"/>
+              <w:rPr>
+                <w:sz w:val="24"/>
+                <w:szCs w:val="24"/>
+              </w:rPr>
+            </w:pPr>
+            <w:r>
+              <w:rPr>
+                <w:sz w:val="24"/>
+                <w:szCs w:val="24"/>
+              </w:rPr>
+              <w:t>Fixed 10-driver grid</w:t>
+            </w:r>
+          </w:p>
+        </w:tc>
+      </w:tr>
+      <w:tr>
+        <w:tc>
+          <w:tcPr>
+            <w:tcW w:w="0" w:type="auto"/>
+            <w:hideMark/>
+          </w:tcPr>
+          <w:p>
+            <w:pPr>
+              <w:spacing w:after="160" w:line="259" w:lineRule="auto"/>
+              <w:rPr>
+                <w:sz w:val="24"/>
+                <w:szCs w:val="24"/>
+              </w:rPr>
+            </w:pPr>
+            <w:r>
+              <w:rPr>
+                <w:sz w:val="24"/>
+                <w:szCs w:val="24"/>
+              </w:rPr>
+              <w:t>Race structure</w:t>
+            </w:r>
+          </w:p>
+        </w:tc>
+        <w:tc>
+          <w:tcPr>
+            <w:tcW w:w="0" w:type="auto"/>
+            <w:hideMark/>
+          </w:tcPr>
+          <w:p>
+            <w:pPr>
+              <w:spacing w:after="160" w:line="259" w:lineRule="auto"/>
+              <w:rPr>
+                <w:sz w:val="24"/>
+                <w:szCs w:val="24"/>
+              </w:rPr>
+            </w:pPr>
+            <w:r>
+              <w:rPr>
+                <w:sz w:val="24"/>
+                <w:szCs w:val="24"/>
+              </w:rPr>
+              <w:t>Single race simulation</w:t>
+            </w:r>
+          </w:p>
+        </w:tc>
+      </w:tr>
+      <w:tr>
+        <w:tc>
+          <w:tcPr>
+            <w:tcW w:w="0" w:type="auto"/>
+            <w:hideMark/>
+          </w:tcPr>
+          <w:p>
+            <w:pPr>
+              <w:spacing w:after="160" w:line="259" w:lineRule="auto"/>
+              <w:rPr>
+                <w:sz w:val="24"/>
+                <w:szCs w:val="24"/>
+              </w:rPr>
+            </w:pPr>
+            <w:r>
+              <w:rPr>
+                <w:sz w:val="24"/>
+                <w:szCs w:val="24"/>
+              </w:rPr>
+              <w:t>Storage</w:t>
+            </w:r>
+          </w:p>
+        </w:tc>
+        <w:tc>
+          <w:tcPr>
+            <w:tcW w:w="0" w:type="auto"/>
+            <w:hideMark/>
+          </w:tcPr>
+          <w:p>
+            <w:pPr>
+              <w:spacing w:after="160" w:line="259" w:lineRule="auto"/>
+              <w:rPr>
+                <w:sz w:val="24"/>
+                <w:szCs w:val="24"/>
+              </w:rPr>
+            </w:pPr>
+            <w:r>
+              <w:rPr>
+                <w:sz w:val="24"/>
+                <w:szCs w:val="24"/>
+              </w:rPr>
+              <w:t>Runtime objects and JSON configuration files</w:t>
+            </w:r>
+          </w:p>
+        </w:tc>
+      </w:tr>
+      <w:tr>
+        <w:tc>
+          <w:tcPr>
+            <w:tcW w:w="0" w:type="auto"/>
+            <w:hideMark/>
+          </w:tcPr>
+          <w:p>
+            <w:pPr>
+              <w:spacing w:after="160" w:line="259" w:lineRule="auto"/>
+              <w:rPr>
+                <w:sz w:val="24"/>
+                <w:szCs w:val="24"/>
+              </w:rPr>
+            </w:pPr>
+            <w:r>
+              <w:rPr>
+                <w:sz w:val="24"/>
+                <w:szCs w:val="24"/>
+              </w:rPr>
+              <w:t>Tracks</w:t>
+            </w:r>
+          </w:p>
+        </w:tc>
+        <w:tc>
+          <w:tcPr>
+            <w:tcW w:w="0" w:type="auto"/>
+            <w:hideMark/>
+          </w:tcPr>
+          <w:p>
+            <w:pPr>
+              <w:spacing w:after="160" w:line="259" w:lineRule="auto"/>
+              <w:rPr>
+                <w:sz w:val="24"/>
+                <w:szCs w:val="24"/>
+              </w:rPr>
+            </w:pPr>
+            <w:r>
+              <w:rPr>
+                <w:sz w:val="24"/>
+                <w:szCs w:val="24"/>
+              </w:rPr>
+              <w:t>Limited configured track data</w:t>
+            </w:r>
+          </w:p>
+        </w:tc>
+      </w:tr>
+      <w:tr>
+        <w:tc>
+          <w:tcPr>
+            <w:tcW w:w="0" w:type="auto"/>
+            <w:hideMark/>
+          </w:tcPr>
+          <w:p>
+            <w:pPr>
+              <w:spacing w:after="160" w:line="259" w:lineRule="auto"/>
+              <w:rPr>
+                <w:sz w:val="24"/>
+                <w:szCs w:val="24"/>
+              </w:rPr>
+            </w:pPr>
+            <w:r>
+              <w:rPr>
+                <w:sz w:val="24"/>
+                <w:szCs w:val="24"/>
+              </w:rPr>
+              <w:t>Progression</w:t>
+            </w:r>
+          </w:p>
+        </w:tc>
+        <w:tc>
+          <w:tcPr>
+            <w:tcW w:w="0" w:type="auto"/>
+            <w:hideMark/>
+          </w:tcPr>
+          <w:p>
+            <w:pPr>
+              <w:spacing w:after="160" w:line="259" w:lineRule="auto"/>
+              <w:rPr>
+                <w:sz w:val="24"/>
+                <w:szCs w:val="24"/>
+              </w:rPr>
+            </w:pPr>
+            <w:r>
+              <w:rPr>
+                <w:sz w:val="24"/>
+                <w:szCs w:val="24"/>
+              </w:rPr>
+              <w:t>No championship or historical records</w:t>
+            </w:r>
+          </w:p>
+        </w:tc>
+      </w:tr>
+    </w:tbl>
+    <w:p>
+      <w:pPr>
+        <w:rPr>
+          <w:sz w:val="24"/>
+          <w:szCs w:val="24"/>
+        </w:rPr>
+      </w:pPr>
+      <w:r>
+        <w:rPr>
+          <w:sz w:val="24"/>
+          <w:szCs w:val="24"/>
+        </w:rPr>
+        <w:t>These limitations were introduced to maintain a realistic project scope and allow focus on the core simulation and visualisation features.</w:t>
+      </w:r>
+    </w:p>
+    <w:p>
+      <w:pPr>
+        <w:rPr>
+          <w:sz w:val="24"/>
+          <w:szCs w:val="24"/>
+        </w:rPr>
+      </w:pPr>
+      <w:r>
+        <w:rPr>
+          <w:sz w:val="24"/>
+          <w:szCs w:val="24"/>
+        </w:rPr>
+        <w:t>For a larger-scale application, additional infrastructure would be required. A database could be introduced to store historical races, driver progression and championship information. The simulation architecture could also be expanded to support additional tracks, larger grids and more complex race behaviour.</w:t>
+      </w:r>
+    </w:p>
+    <w:p>
+      <w:pPr>
+        <w:rPr>
+          <w:sz w:val="24"/>
+          <w:szCs w:val="24"/>
+        </w:rPr>
+      </w:pPr>
+      <w:r>
+        <w:rPr>
+          <w:sz w:val="24"/>
+          <w:szCs w:val="24"/>
+        </w:rPr>
+        <w:t>The existing separation between simulation logic, user interface and data models provides a foundation for these future improvements, although significant additional development would be required before the system could operate at commercial-scale complexity.</w:t>
+      </w:r>
+    </w:p>
+    <w:p>
+      <w:pPr>
+        <w:pStyle w:val="Heading3"/>
+      </w:pPr>
+      <w:r>
+        <w:t>Overall Evaluation</w:t>
+      </w:r>
+    </w:p>
+    <w:p>
+      <w:pPr>
+        <w:rPr>
+          <w:sz w:val="24"/>
+          <w:szCs w:val="24"/>
+        </w:rPr>
+      </w:pPr>
+      <w:r>
+        <w:rPr>
+          <w:sz w:val="24"/>
+          <w:szCs w:val="24"/>
+        </w:rPr>
+        <w:t>The evaluation demonstrates that Momentum successfully achieved the objectives defined for the minimum viable product. All functional requirements were implemented, all automated tests completed successfully and the system demonstrated appropriate performance for its intended prototype scale.</w:t>
+      </w:r>
+    </w:p>
+    <w:p>
+      <w:pPr>
+        <w:rPr>
+          <w:sz w:val="24"/>
+          <w:szCs w:val="24"/>
+        </w:rPr>
+      </w:pPr>
+      <w:r>
+        <w:rPr>
+          <w:sz w:val="24"/>
+          <w:szCs w:val="24"/>
+        </w:rPr>
+        <w:t>The main strengths of the system are its modular architecture, separation between simulation and interface components, and successful implementation of an agent-based race simulation with telemetry visualisation.</w:t>
+      </w:r>
     </w:p>
     <w:p>
       <w:pPr>
@@ -19137,6 +21115,13 @@
           <w:szCs w:val="32"/>
         </w:rPr>
       </w:pPr>
+      <w:r>
+        <w:rPr>
+          <w:sz w:val="24"/>
+          <w:szCs w:val="24"/>
+        </w:rPr>
+        <w:t>The primary limitations are the restricted simulation scope, lack of persistent storage and simplified race mechanics. These limitations are consistent with the project objectives and provide clear areas for future development. Overall, the evaluation indicates that Momentum provides a functional and maintainable foundation for further expansion into a more complete motorsport management simulation.</w:t>
+      </w:r>
       <w:r>
         <w:br w:type="page"/>
       </w:r>
@@ -20390,15 +22375,7 @@
     </w:p>
     <w:p>
       <w:r>
-        <w:t xml:space="preserve">Momentum uses Python for both the front-end dashboards and the back-end simulation logic and database management. The system relies on NumPy for fast calculations, Pandas for handling data, and SciPy for advanced statistics. The database uses SQLite to store all the information about drivers, teams, tracks, and championships, making it easy to save and load multi-season histories. All content creation and generation </w:t>
-      </w:r>
-      <w:proofErr w:type="gramStart"/>
-      <w:r>
-        <w:t>is</w:t>
-      </w:r>
-      <w:proofErr w:type="gramEnd"/>
-      <w:r>
-        <w:t xml:space="preserve"> handled by the database management system.</w:t>
+        <w:t>Momentum uses Python for both the front-end dashboards and the back-end simulation logic and database management. The system relies on NumPy for fast calculations, Pandas for handling data, and SciPy for advanced statistics. The database uses SQLite to store all the information about drivers, teams, tracks, and championships, making it easy to save and load multi-season histories. All content creation and generation is handled by the database management system.</w:t>
       </w:r>
     </w:p>
     <w:p>
@@ -20415,23 +22392,7 @@
     </w:p>
     <w:p>
       <w:r>
-        <w:t xml:space="preserve">Race results are produced by a real-time, </w:t>
-      </w:r>
-      <w:proofErr w:type="gramStart"/>
-      <w:r>
-        <w:t>agent based</w:t>
-      </w:r>
-      <w:proofErr w:type="gramEnd"/>
-      <w:r>
-        <w:t xml:space="preserve"> engine. Each driver is modelled as an autonomous AI agent that makes decisions on every simulation tick, targeting a frame rate of about 30 ticks per second. Agents consider their attributes, car condition, tyre state, fuel, nearby rivals, team orders and track conditions when choosing actions such as attack, defend, overtake or conserve. Discipline specific rules are applied by the engine to reflect differences between single seater, rally, endurance and other formats. Randomness is retained for low probability events such as mechanical failures or </w:t>
-      </w:r>
-      <w:proofErr w:type="gramStart"/>
-      <w:r>
-        <w:t>incidents</w:t>
-      </w:r>
-      <w:proofErr w:type="gramEnd"/>
-      <w:r>
-        <w:t xml:space="preserve"> so outcomes remain unpredictable, but most race behaviour emerges from agent interactions rather than repeated sampling. Performance sensitive results are cached where appropriate to keep leaderboards and UI queries responsive.</w:t>
+        <w:t>Race results are produced by a real-time, agent based engine. Each driver is modelled as an autonomous AI agent that makes decisions on every simulation tick, targeting a frame rate of about 30 ticks per second. Agents consider their attributes, car condition, tyre state, fuel, nearby rivals, team orders and track conditions when choosing actions such as attack, defend, overtake or conserve. Discipline specific rules are applied by the engine to reflect differences between single seater, rally, endurance and other formats. Randomness is retained for low probability events such as mechanical failures or incidents so outcomes remain unpredictable, but most race behaviour emerges from agent interactions rather than repeated sampling. Performance sensitive results are cached where appropriate to keep leaderboards and UI queries responsive.</w:t>
       </w:r>
     </w:p>
     <w:p>
@@ -21673,15 +23634,7 @@
               <w:jc w:val="both"/>
             </w:pPr>
             <w:r>
-              <w:t xml:space="preserve">I started building a Python prototype for my game. I began work on </w:t>
-            </w:r>
-            <w:proofErr w:type="gramStart"/>
-            <w:r>
-              <w:t>the team</w:t>
-            </w:r>
-            <w:proofErr w:type="gramEnd"/>
-            <w:r>
-              <w:t xml:space="preserve"> management, car development, financial management, and the race weekend structure and connected them through a basic Python GUI. The current version is only a prototype. None of the systems are fully finished, and the race simulation is not yet implemented. The main goal was to test ideas and system integration before moving to a more advanced platform.</w:t>
+              <w:t>I started building a Python prototype for my game. I began work on the team management, car development, financial management, and the race weekend structure and connected them through a basic Python GUI. The current version is only a prototype. None of the systems are fully finished, and the race simulation is not yet implemented. The main goal was to test ideas and system integration before moving to a more advanced platform.</w:t>
             </w:r>
           </w:p>
         </w:tc>
@@ -22123,15 +24076,7 @@
               <w:jc w:val="both"/>
             </w:pPr>
             <w:r>
-              <w:t xml:space="preserve">Reflect on what </w:t>
-            </w:r>
-            <w:proofErr w:type="gramStart"/>
-            <w:r>
-              <w:t>has happened</w:t>
-            </w:r>
-            <w:proofErr w:type="gramEnd"/>
-            <w:r>
-              <w:t xml:space="preserve"> in your project this month?</w:t>
+              <w:t>Reflect on what has happened in your project this month?</w:t>
             </w:r>
           </w:p>
           <w:p>
@@ -22154,13 +24099,8 @@
             <w:pPr>
               <w:jc w:val="both"/>
             </w:pPr>
-            <w:proofErr w:type="gramStart"/>
-            <w:r>
-              <w:t>mostly</w:t>
-            </w:r>
-            <w:proofErr w:type="gramEnd"/>
-            <w:r>
-              <w:t xml:space="preserve"> planning stuff</w:t>
+            <w:r>
+              <w:t>mostly planning stuff</w:t>
             </w:r>
           </w:p>
         </w:tc>
@@ -22197,29 +24137,16 @@
               <w:jc w:val="both"/>
             </w:pPr>
             <w:r>
-              <w:t xml:space="preserve">Consider what that meant for your project progress.  What were your successes? What challenges </w:t>
-            </w:r>
-            <w:proofErr w:type="gramStart"/>
-            <w:r>
-              <w:t>still remain</w:t>
-            </w:r>
-            <w:proofErr w:type="gramEnd"/>
-            <w:r>
-              <w:t xml:space="preserve">? </w:t>
+              <w:t xml:space="preserve">Consider what that meant for your project progress.  What were your successes? What challenges still remain? </w:t>
             </w:r>
           </w:p>
           <w:p>
             <w:pPr>
               <w:jc w:val="both"/>
             </w:pPr>
-            <w:proofErr w:type="gramStart"/>
             <w:r>
               <w:lastRenderedPageBreak/>
-              <w:t>Certainly</w:t>
-            </w:r>
-            <w:proofErr w:type="gramEnd"/>
-            <w:r>
-              <w:t xml:space="preserve"> helped give a direction with use cases and priorities, </w:t>
+              <w:t xml:space="preserve">Certainly helped give a direction with use cases and priorities, </w:t>
             </w:r>
             <w:proofErr w:type="spellStart"/>
             <w:r>
@@ -22256,7 +24183,6 @@
               <w:rPr>
                 <w:b/>
               </w:rPr>
-              <w:lastRenderedPageBreak/>
               <w:t xml:space="preserve">Now What? </w:t>
             </w:r>
           </w:p>
@@ -22612,15 +24538,7 @@
               <w:jc w:val="both"/>
             </w:pPr>
             <w:r>
-              <w:t xml:space="preserve">Reflect on what </w:t>
-            </w:r>
-            <w:proofErr w:type="gramStart"/>
-            <w:r>
-              <w:t>has happened</w:t>
-            </w:r>
-            <w:proofErr w:type="gramEnd"/>
-            <w:r>
-              <w:t xml:space="preserve"> in your project this month?</w:t>
+              <w:t>Reflect on what has happened in your project this month?</w:t>
             </w:r>
           </w:p>
           <w:p>
@@ -22672,15 +24590,7 @@
               <w:jc w:val="both"/>
             </w:pPr>
             <w:r>
-              <w:t xml:space="preserve">Consider what that meant for your project progress.  What were your successes? What challenges </w:t>
-            </w:r>
-            <w:proofErr w:type="gramStart"/>
-            <w:r>
-              <w:t>still remain</w:t>
-            </w:r>
-            <w:proofErr w:type="gramEnd"/>
-            <w:r>
-              <w:t xml:space="preserve">? </w:t>
+              <w:t xml:space="preserve">Consider what that meant for your project progress.  What were your successes? What challenges still remain? </w:t>
             </w:r>
           </w:p>
           <w:p>
@@ -22690,15 +24600,7 @@
           </w:p>
           <w:p>
             <w:r>
-              <w:t xml:space="preserve">This change gives </w:t>
-            </w:r>
-            <w:proofErr w:type="gramStart"/>
-            <w:r>
-              <w:t>visible,</w:t>
-            </w:r>
-            <w:proofErr w:type="gramEnd"/>
-            <w:r>
-              <w:t xml:space="preserve"> </w:t>
+              <w:t xml:space="preserve">This change gives visible, </w:t>
             </w:r>
             <w:proofErr w:type="spellStart"/>
             <w:r>
@@ -24176,6 +26078,155 @@
     </w:lvl>
   </w:abstractNum>
   <w:abstractNum w:abstractNumId="12" w15:restartNumberingAfterBreak="0">
+    <w:nsid w:val="236B6770"/>
+    <w:multiLevelType w:val="multilevel"/>
+    <w:tmpl w:val="E720725E"/>
+    <w:lvl w:ilvl="0">
+      <w:start w:val="1"/>
+      <w:numFmt w:val="bullet"/>
+      <w:lvlText w:val=""/>
+      <w:lvlJc w:val="left"/>
+      <w:pPr>
+        <w:tabs>
+          <w:tab w:val="num" w:pos="720"/>
+        </w:tabs>
+        <w:ind w:left="720" w:hanging="360"/>
+      </w:pPr>
+      <w:rPr>
+        <w:rFonts w:ascii="Symbol" w:hAnsi="Symbol" w:hint="default"/>
+        <w:sz w:val="20"/>
+      </w:rPr>
+    </w:lvl>
+    <w:lvl w:ilvl="1" w:tentative="1">
+      <w:start w:val="1"/>
+      <w:numFmt w:val="bullet"/>
+      <w:lvlText w:val="o"/>
+      <w:lvlJc w:val="left"/>
+      <w:pPr>
+        <w:tabs>
+          <w:tab w:val="num" w:pos="1440"/>
+        </w:tabs>
+        <w:ind w:left="1440" w:hanging="360"/>
+      </w:pPr>
+      <w:rPr>
+        <w:rFonts w:ascii="Courier New" w:hAnsi="Courier New" w:hint="default"/>
+        <w:sz w:val="20"/>
+      </w:rPr>
+    </w:lvl>
+    <w:lvl w:ilvl="2" w:tentative="1">
+      <w:start w:val="1"/>
+      <w:numFmt w:val="bullet"/>
+      <w:lvlText w:val=""/>
+      <w:lvlJc w:val="left"/>
+      <w:pPr>
+        <w:tabs>
+          <w:tab w:val="num" w:pos="2160"/>
+        </w:tabs>
+        <w:ind w:left="2160" w:hanging="360"/>
+      </w:pPr>
+      <w:rPr>
+        <w:rFonts w:ascii="Wingdings" w:hAnsi="Wingdings" w:hint="default"/>
+        <w:sz w:val="20"/>
+      </w:rPr>
+    </w:lvl>
+    <w:lvl w:ilvl="3" w:tentative="1">
+      <w:start w:val="1"/>
+      <w:numFmt w:val="bullet"/>
+      <w:lvlText w:val=""/>
+      <w:lvlJc w:val="left"/>
+      <w:pPr>
+        <w:tabs>
+          <w:tab w:val="num" w:pos="2880"/>
+        </w:tabs>
+        <w:ind w:left="2880" w:hanging="360"/>
+      </w:pPr>
+      <w:rPr>
+        <w:rFonts w:ascii="Wingdings" w:hAnsi="Wingdings" w:hint="default"/>
+        <w:sz w:val="20"/>
+      </w:rPr>
+    </w:lvl>
+    <w:lvl w:ilvl="4" w:tentative="1">
+      <w:start w:val="1"/>
+      <w:numFmt w:val="bullet"/>
+      <w:lvlText w:val=""/>
+      <w:lvlJc w:val="left"/>
+      <w:pPr>
+        <w:tabs>
+          <w:tab w:val="num" w:pos="3600"/>
+        </w:tabs>
+        <w:ind w:left="3600" w:hanging="360"/>
+      </w:pPr>
+      <w:rPr>
+        <w:rFonts w:ascii="Wingdings" w:hAnsi="Wingdings" w:hint="default"/>
+        <w:sz w:val="20"/>
+      </w:rPr>
+    </w:lvl>
+    <w:lvl w:ilvl="5" w:tentative="1">
+      <w:start w:val="1"/>
+      <w:numFmt w:val="bullet"/>
+      <w:lvlText w:val=""/>
+      <w:lvlJc w:val="left"/>
+      <w:pPr>
+        <w:tabs>
+          <w:tab w:val="num" w:pos="4320"/>
+        </w:tabs>
+        <w:ind w:left="4320" w:hanging="360"/>
+      </w:pPr>
+      <w:rPr>
+        <w:rFonts w:ascii="Wingdings" w:hAnsi="Wingdings" w:hint="default"/>
+        <w:sz w:val="20"/>
+      </w:rPr>
+    </w:lvl>
+    <w:lvl w:ilvl="6" w:tentative="1">
+      <w:start w:val="1"/>
+      <w:numFmt w:val="bullet"/>
+      <w:lvlText w:val=""/>
+      <w:lvlJc w:val="left"/>
+      <w:pPr>
+        <w:tabs>
+          <w:tab w:val="num" w:pos="5040"/>
+        </w:tabs>
+        <w:ind w:left="5040" w:hanging="360"/>
+      </w:pPr>
+      <w:rPr>
+        <w:rFonts w:ascii="Wingdings" w:hAnsi="Wingdings" w:hint="default"/>
+        <w:sz w:val="20"/>
+      </w:rPr>
+    </w:lvl>
+    <w:lvl w:ilvl="7" w:tentative="1">
+      <w:start w:val="1"/>
+      <w:numFmt w:val="bullet"/>
+      <w:lvlText w:val=""/>
+      <w:lvlJc w:val="left"/>
+      <w:pPr>
+        <w:tabs>
+          <w:tab w:val="num" w:pos="5760"/>
+        </w:tabs>
+        <w:ind w:left="5760" w:hanging="360"/>
+      </w:pPr>
+      <w:rPr>
+        <w:rFonts w:ascii="Wingdings" w:hAnsi="Wingdings" w:hint="default"/>
+        <w:sz w:val="20"/>
+      </w:rPr>
+    </w:lvl>
+    <w:lvl w:ilvl="8" w:tentative="1">
+      <w:start w:val="1"/>
+      <w:numFmt w:val="bullet"/>
+      <w:lvlText w:val=""/>
+      <w:lvlJc w:val="left"/>
+      <w:pPr>
+        <w:tabs>
+          <w:tab w:val="num" w:pos="6480"/>
+        </w:tabs>
+        <w:ind w:left="6480" w:hanging="360"/>
+      </w:pPr>
+      <w:rPr>
+        <w:rFonts w:ascii="Wingdings" w:hAnsi="Wingdings" w:hint="default"/>
+        <w:sz w:val="20"/>
+      </w:rPr>
+    </w:lvl>
+  </w:abstractNum>
+  <w:abstractNum w:abstractNumId="13" w15:restartNumberingAfterBreak="0">
     <w:nsid w:val="29223FB8"/>
     <w:multiLevelType w:val="hybridMultilevel"/>
     <w:tmpl w:val="549C3D6E"/>
@@ -24261,7 +26312,7 @@
       </w:pPr>
     </w:lvl>
   </w:abstractNum>
-  <w:abstractNum w:abstractNumId="13" w15:restartNumberingAfterBreak="0">
+  <w:abstractNum w:abstractNumId="14" w15:restartNumberingAfterBreak="0">
     <w:nsid w:val="2B5504A2"/>
     <w:multiLevelType w:val="hybridMultilevel"/>
     <w:tmpl w:val="D6E226C2"/>
@@ -24347,7 +26398,7 @@
       </w:pPr>
     </w:lvl>
   </w:abstractNum>
-  <w:abstractNum w:abstractNumId="14" w15:restartNumberingAfterBreak="0">
+  <w:abstractNum w:abstractNumId="15" w15:restartNumberingAfterBreak="0">
     <w:nsid w:val="2C2A7E0D"/>
     <w:multiLevelType w:val="hybridMultilevel"/>
     <w:tmpl w:val="FB2415A6"/>
@@ -24436,7 +26487,7 @@
       </w:pPr>
     </w:lvl>
   </w:abstractNum>
-  <w:abstractNum w:abstractNumId="15" w15:restartNumberingAfterBreak="0">
+  <w:abstractNum w:abstractNumId="16" w15:restartNumberingAfterBreak="0">
     <w:nsid w:val="310125E9"/>
     <w:multiLevelType w:val="multilevel"/>
     <w:tmpl w:val="3AE6E694"/>
@@ -24585,7 +26636,7 @@
       </w:rPr>
     </w:lvl>
   </w:abstractNum>
-  <w:abstractNum w:abstractNumId="16" w15:restartNumberingAfterBreak="0">
+  <w:abstractNum w:abstractNumId="17" w15:restartNumberingAfterBreak="0">
     <w:nsid w:val="32C72F0D"/>
     <w:multiLevelType w:val="hybridMultilevel"/>
     <w:tmpl w:val="941207FE"/>
@@ -24698,7 +26749,7 @@
       </w:rPr>
     </w:lvl>
   </w:abstractNum>
-  <w:abstractNum w:abstractNumId="17" w15:restartNumberingAfterBreak="0">
+  <w:abstractNum w:abstractNumId="18" w15:restartNumberingAfterBreak="0">
     <w:nsid w:val="32DB29B8"/>
     <w:multiLevelType w:val="multilevel"/>
     <w:tmpl w:val="707823F6"/>
@@ -24847,7 +26898,7 @@
       </w:rPr>
     </w:lvl>
   </w:abstractNum>
-  <w:abstractNum w:abstractNumId="18" w15:restartNumberingAfterBreak="0">
+  <w:abstractNum w:abstractNumId="19" w15:restartNumberingAfterBreak="0">
     <w:nsid w:val="3416640C"/>
     <w:multiLevelType w:val="hybridMultilevel"/>
     <w:tmpl w:val="EC7AC9E0"/>
@@ -24933,7 +26984,7 @@
       </w:pPr>
     </w:lvl>
   </w:abstractNum>
-  <w:abstractNum w:abstractNumId="19" w15:restartNumberingAfterBreak="0">
+  <w:abstractNum w:abstractNumId="20" w15:restartNumberingAfterBreak="0">
     <w:nsid w:val="39F17F83"/>
     <w:multiLevelType w:val="hybridMultilevel"/>
     <w:tmpl w:val="2D00D872"/>
@@ -25046,7 +27097,7 @@
       </w:rPr>
     </w:lvl>
   </w:abstractNum>
-  <w:abstractNum w:abstractNumId="20" w15:restartNumberingAfterBreak="0">
+  <w:abstractNum w:abstractNumId="21" w15:restartNumberingAfterBreak="0">
     <w:nsid w:val="3CE26087"/>
     <w:multiLevelType w:val="hybridMultilevel"/>
     <w:tmpl w:val="E0F6ED1C"/>
@@ -25132,7 +27183,7 @@
       </w:pPr>
     </w:lvl>
   </w:abstractNum>
-  <w:abstractNum w:abstractNumId="21" w15:restartNumberingAfterBreak="0">
+  <w:abstractNum w:abstractNumId="22" w15:restartNumberingAfterBreak="0">
     <w:nsid w:val="48B460ED"/>
     <w:multiLevelType w:val="multilevel"/>
     <w:tmpl w:val="7C2AF9A8"/>
@@ -25265,7 +27316,7 @@
       </w:pPr>
     </w:lvl>
   </w:abstractNum>
-  <w:abstractNum w:abstractNumId="22" w15:restartNumberingAfterBreak="0">
+  <w:abstractNum w:abstractNumId="23" w15:restartNumberingAfterBreak="0">
     <w:nsid w:val="49224F5E"/>
     <w:multiLevelType w:val="hybridMultilevel"/>
     <w:tmpl w:val="3EF25212"/>
@@ -25382,7 +27433,7 @@
       </w:pPr>
     </w:lvl>
   </w:abstractNum>
-  <w:abstractNum w:abstractNumId="23" w15:restartNumberingAfterBreak="0">
+  <w:abstractNum w:abstractNumId="24" w15:restartNumberingAfterBreak="0">
     <w:nsid w:val="4A2779C4"/>
     <w:multiLevelType w:val="multilevel"/>
     <w:tmpl w:val="5518E24A"/>
@@ -25531,7 +27582,7 @@
       </w:rPr>
     </w:lvl>
   </w:abstractNum>
-  <w:abstractNum w:abstractNumId="24" w15:restartNumberingAfterBreak="0">
+  <w:abstractNum w:abstractNumId="25" w15:restartNumberingAfterBreak="0">
     <w:nsid w:val="4D6E4153"/>
     <w:multiLevelType w:val="hybridMultilevel"/>
     <w:tmpl w:val="BDACEDB0"/>
@@ -25617,7 +27668,7 @@
       </w:pPr>
     </w:lvl>
   </w:abstractNum>
-  <w:abstractNum w:abstractNumId="25" w15:restartNumberingAfterBreak="0">
+  <w:abstractNum w:abstractNumId="26" w15:restartNumberingAfterBreak="0">
     <w:nsid w:val="4F692764"/>
     <w:multiLevelType w:val="multilevel"/>
     <w:tmpl w:val="C930DE6A"/>
@@ -25750,7 +27801,7 @@
       </w:pPr>
     </w:lvl>
   </w:abstractNum>
-  <w:abstractNum w:abstractNumId="26" w15:restartNumberingAfterBreak="0">
+  <w:abstractNum w:abstractNumId="27" w15:restartNumberingAfterBreak="0">
     <w:nsid w:val="53407879"/>
     <w:multiLevelType w:val="hybridMultilevel"/>
     <w:tmpl w:val="35044D6A"/>
@@ -25863,7 +27914,7 @@
       </w:rPr>
     </w:lvl>
   </w:abstractNum>
-  <w:abstractNum w:abstractNumId="27" w15:restartNumberingAfterBreak="0">
+  <w:abstractNum w:abstractNumId="28" w15:restartNumberingAfterBreak="0">
     <w:nsid w:val="54283B40"/>
     <w:multiLevelType w:val="hybridMultilevel"/>
     <w:tmpl w:val="534AA008"/>
@@ -25954,7 +28005,7 @@
       </w:pPr>
     </w:lvl>
   </w:abstractNum>
-  <w:abstractNum w:abstractNumId="28" w15:restartNumberingAfterBreak="0">
+  <w:abstractNum w:abstractNumId="29" w15:restartNumberingAfterBreak="0">
     <w:nsid w:val="5445182A"/>
     <w:multiLevelType w:val="multilevel"/>
     <w:tmpl w:val="80D60572"/>
@@ -26103,7 +28154,7 @@
       </w:rPr>
     </w:lvl>
   </w:abstractNum>
-  <w:abstractNum w:abstractNumId="29" w15:restartNumberingAfterBreak="0">
+  <w:abstractNum w:abstractNumId="30" w15:restartNumberingAfterBreak="0">
     <w:nsid w:val="5470089E"/>
     <w:multiLevelType w:val="multilevel"/>
     <w:tmpl w:val="8EE46A0C"/>
@@ -26252,7 +28303,120 @@
       </w:rPr>
     </w:lvl>
   </w:abstractNum>
-  <w:abstractNum w:abstractNumId="30" w15:restartNumberingAfterBreak="0">
+  <w:abstractNum w:abstractNumId="31" w15:restartNumberingAfterBreak="0">
+    <w:nsid w:val="5E275687"/>
+    <w:multiLevelType w:val="multilevel"/>
+    <w:tmpl w:val="69601FC8"/>
+    <w:lvl w:ilvl="0">
+      <w:start w:val="1"/>
+      <w:numFmt w:val="decimal"/>
+      <w:lvlText w:val="%1."/>
+      <w:lvlJc w:val="left"/>
+      <w:pPr>
+        <w:tabs>
+          <w:tab w:val="num" w:pos="720"/>
+        </w:tabs>
+        <w:ind w:left="720" w:hanging="360"/>
+      </w:pPr>
+    </w:lvl>
+    <w:lvl w:ilvl="1" w:tentative="1">
+      <w:start w:val="1"/>
+      <w:numFmt w:val="decimal"/>
+      <w:lvlText w:val="%2."/>
+      <w:lvlJc w:val="left"/>
+      <w:pPr>
+        <w:tabs>
+          <w:tab w:val="num" w:pos="1440"/>
+        </w:tabs>
+        <w:ind w:left="1440" w:hanging="360"/>
+      </w:pPr>
+    </w:lvl>
+    <w:lvl w:ilvl="2" w:tentative="1">
+      <w:start w:val="1"/>
+      <w:numFmt w:val="decimal"/>
+      <w:lvlText w:val="%3."/>
+      <w:lvlJc w:val="left"/>
+      <w:pPr>
+        <w:tabs>
+          <w:tab w:val="num" w:pos="2160"/>
+        </w:tabs>
+        <w:ind w:left="2160" w:hanging="360"/>
+      </w:pPr>
+    </w:lvl>
+    <w:lvl w:ilvl="3" w:tentative="1">
+      <w:start w:val="1"/>
+      <w:numFmt w:val="decimal"/>
+      <w:lvlText w:val="%4."/>
+      <w:lvlJc w:val="left"/>
+      <w:pPr>
+        <w:tabs>
+          <w:tab w:val="num" w:pos="2880"/>
+        </w:tabs>
+        <w:ind w:left="2880" w:hanging="360"/>
+      </w:pPr>
+    </w:lvl>
+    <w:lvl w:ilvl="4" w:tentative="1">
+      <w:start w:val="1"/>
+      <w:numFmt w:val="decimal"/>
+      <w:lvlText w:val="%5."/>
+      <w:lvlJc w:val="left"/>
+      <w:pPr>
+        <w:tabs>
+          <w:tab w:val="num" w:pos="3600"/>
+        </w:tabs>
+        <w:ind w:left="3600" w:hanging="360"/>
+      </w:pPr>
+    </w:lvl>
+    <w:lvl w:ilvl="5" w:tentative="1">
+      <w:start w:val="1"/>
+      <w:numFmt w:val="decimal"/>
+      <w:lvlText w:val="%6."/>
+      <w:lvlJc w:val="left"/>
+      <w:pPr>
+        <w:tabs>
+          <w:tab w:val="num" w:pos="4320"/>
+        </w:tabs>
+        <w:ind w:left="4320" w:hanging="360"/>
+      </w:pPr>
+    </w:lvl>
+    <w:lvl w:ilvl="6" w:tentative="1">
+      <w:start w:val="1"/>
+      <w:numFmt w:val="decimal"/>
+      <w:lvlText w:val="%7."/>
+      <w:lvlJc w:val="left"/>
+      <w:pPr>
+        <w:tabs>
+          <w:tab w:val="num" w:pos="5040"/>
+        </w:tabs>
+        <w:ind w:left="5040" w:hanging="360"/>
+      </w:pPr>
+    </w:lvl>
+    <w:lvl w:ilvl="7" w:tentative="1">
+      <w:start w:val="1"/>
+      <w:numFmt w:val="decimal"/>
+      <w:lvlText w:val="%8."/>
+      <w:lvlJc w:val="left"/>
+      <w:pPr>
+        <w:tabs>
+          <w:tab w:val="num" w:pos="5760"/>
+        </w:tabs>
+        <w:ind w:left="5760" w:hanging="360"/>
+      </w:pPr>
+    </w:lvl>
+    <w:lvl w:ilvl="8" w:tentative="1">
+      <w:start w:val="1"/>
+      <w:numFmt w:val="decimal"/>
+      <w:lvlText w:val="%9."/>
+      <w:lvlJc w:val="left"/>
+      <w:pPr>
+        <w:tabs>
+          <w:tab w:val="num" w:pos="6480"/>
+        </w:tabs>
+        <w:ind w:left="6480" w:hanging="360"/>
+      </w:pPr>
+    </w:lvl>
+  </w:abstractNum>
+  <w:abstractNum w:abstractNumId="32" w15:restartNumberingAfterBreak="0">
     <w:nsid w:val="63922606"/>
     <w:multiLevelType w:val="multilevel"/>
     <w:tmpl w:val="D8225180"/>
@@ -26401,7 +28565,7 @@
       </w:rPr>
     </w:lvl>
   </w:abstractNum>
-  <w:abstractNum w:abstractNumId="31" w15:restartNumberingAfterBreak="0">
+  <w:abstractNum w:abstractNumId="33" w15:restartNumberingAfterBreak="0">
     <w:nsid w:val="63AA42EC"/>
     <w:multiLevelType w:val="hybridMultilevel"/>
     <w:tmpl w:val="0B3C82B6"/>
@@ -26514,7 +28678,7 @@
       </w:rPr>
     </w:lvl>
   </w:abstractNum>
-  <w:abstractNum w:abstractNumId="32" w15:restartNumberingAfterBreak="0">
+  <w:abstractNum w:abstractNumId="34" w15:restartNumberingAfterBreak="0">
     <w:nsid w:val="65385E90"/>
     <w:multiLevelType w:val="multilevel"/>
     <w:tmpl w:val="1DA46506"/>
@@ -26663,7 +28827,7 @@
       </w:rPr>
     </w:lvl>
   </w:abstractNum>
-  <w:abstractNum w:abstractNumId="33" w15:restartNumberingAfterBreak="0">
+  <w:abstractNum w:abstractNumId="35" w15:restartNumberingAfterBreak="0">
     <w:nsid w:val="66C279BB"/>
     <w:multiLevelType w:val="hybridMultilevel"/>
     <w:tmpl w:val="B234F54E"/>
@@ -26749,7 +28913,7 @@
       </w:pPr>
     </w:lvl>
   </w:abstractNum>
-  <w:abstractNum w:abstractNumId="34" w15:restartNumberingAfterBreak="0">
+  <w:abstractNum w:abstractNumId="36" w15:restartNumberingAfterBreak="0">
     <w:nsid w:val="67D05E22"/>
     <w:multiLevelType w:val="hybridMultilevel"/>
     <w:tmpl w:val="FB186C84"/>
@@ -26862,7 +29026,7 @@
       </w:rPr>
     </w:lvl>
   </w:abstractNum>
-  <w:abstractNum w:abstractNumId="35" w15:restartNumberingAfterBreak="0">
+  <w:abstractNum w:abstractNumId="37" w15:restartNumberingAfterBreak="0">
     <w:nsid w:val="68A009D5"/>
     <w:multiLevelType w:val="hybridMultilevel"/>
     <w:tmpl w:val="EC28536E"/>
@@ -26953,7 +29117,7 @@
       </w:pPr>
     </w:lvl>
   </w:abstractNum>
-  <w:abstractNum w:abstractNumId="36" w15:restartNumberingAfterBreak="0">
+  <w:abstractNum w:abstractNumId="38" w15:restartNumberingAfterBreak="0">
     <w:nsid w:val="6C925FD8"/>
     <w:multiLevelType w:val="hybridMultilevel"/>
     <w:tmpl w:val="3DD6CFB2"/>
@@ -27039,7 +29203,7 @@
       </w:pPr>
     </w:lvl>
   </w:abstractNum>
-  <w:abstractNum w:abstractNumId="37" w15:restartNumberingAfterBreak="0">
+  <w:abstractNum w:abstractNumId="39" w15:restartNumberingAfterBreak="0">
     <w:nsid w:val="7BDA386A"/>
     <w:multiLevelType w:val="hybridMultilevel"/>
     <w:tmpl w:val="C7A4887E"/>
@@ -27153,19 +29317,19 @@
     </w:lvl>
   </w:abstractNum>
   <w:num w:numId="1" w16cid:durableId="1979412930">
-    <w:abstractNumId w:val="22"/>
+    <w:abstractNumId w:val="23"/>
   </w:num>
   <w:num w:numId="2" w16cid:durableId="634263790">
     <w:abstractNumId w:val="7"/>
   </w:num>
   <w:num w:numId="3" w16cid:durableId="1395543426">
-    <w:abstractNumId w:val="16"/>
+    <w:abstractNumId w:val="17"/>
   </w:num>
   <w:num w:numId="4" w16cid:durableId="1315724028">
-    <w:abstractNumId w:val="20"/>
+    <w:abstractNumId w:val="21"/>
   </w:num>
   <w:num w:numId="5" w16cid:durableId="1319530745">
-    <w:abstractNumId w:val="24"/>
+    <w:abstractNumId w:val="25"/>
   </w:num>
   <w:num w:numId="6" w16cid:durableId="174268885">
     <w:abstractNumId w:val="5"/>
@@ -27180,10 +29344,10 @@
     <w:abstractNumId w:val="9"/>
   </w:num>
   <w:num w:numId="10" w16cid:durableId="2068801123">
-    <w:abstractNumId w:val="12"/>
+    <w:abstractNumId w:val="13"/>
   </w:num>
   <w:num w:numId="11" w16cid:durableId="1345940828">
-    <w:abstractNumId w:val="13"/>
+    <w:abstractNumId w:val="14"/>
   </w:num>
   <w:num w:numId="12" w16cid:durableId="731390424">
     <w:abstractNumId w:val="4"/>
@@ -27195,7 +29359,7 @@
     <w:abstractNumId w:val="6"/>
   </w:num>
   <w:num w:numId="15" w16cid:durableId="15618285">
-    <w:abstractNumId w:val="37"/>
+    <w:abstractNumId w:val="39"/>
   </w:num>
   <w:num w:numId="16" w16cid:durableId="216287957">
     <w:abstractNumId w:val="2"/>
@@ -27204,25 +29368,25 @@
     <w:abstractNumId w:val="0"/>
   </w:num>
   <w:num w:numId="18" w16cid:durableId="752973630">
-    <w:abstractNumId w:val="31"/>
+    <w:abstractNumId w:val="33"/>
   </w:num>
   <w:num w:numId="19" w16cid:durableId="1919554416">
-    <w:abstractNumId w:val="33"/>
+    <w:abstractNumId w:val="35"/>
   </w:num>
   <w:num w:numId="20" w16cid:durableId="1763603534">
-    <w:abstractNumId w:val="18"/>
+    <w:abstractNumId w:val="19"/>
   </w:num>
   <w:num w:numId="21" w16cid:durableId="1105883196">
-    <w:abstractNumId w:val="14"/>
+    <w:abstractNumId w:val="15"/>
   </w:num>
   <w:num w:numId="22" w16cid:durableId="1081488339">
-    <w:abstractNumId w:val="36"/>
+    <w:abstractNumId w:val="38"/>
   </w:num>
   <w:num w:numId="23" w16cid:durableId="1783986655">
-    <w:abstractNumId w:val="35"/>
+    <w:abstractNumId w:val="37"/>
   </w:num>
   <w:num w:numId="24" w16cid:durableId="1650936525">
-    <w:abstractNumId w:val="29"/>
+    <w:abstractNumId w:val="30"/>
   </w:num>
   <w:num w:numId="25" w16cid:durableId="1766457783">
     <w:abstractNumId w:val="7"/>
@@ -27255,46 +29419,52 @@
     <w:abstractNumId w:val="7"/>
   </w:num>
   <w:num w:numId="35" w16cid:durableId="1794395859">
-    <w:abstractNumId w:val="21"/>
+    <w:abstractNumId w:val="22"/>
   </w:num>
   <w:num w:numId="36" w16cid:durableId="2134782294">
-    <w:abstractNumId w:val="25"/>
+    <w:abstractNumId w:val="26"/>
   </w:num>
   <w:num w:numId="37" w16cid:durableId="1993095279">
-    <w:abstractNumId w:val="17"/>
+    <w:abstractNumId w:val="18"/>
   </w:num>
   <w:num w:numId="38" w16cid:durableId="2051103382">
-    <w:abstractNumId w:val="23"/>
+    <w:abstractNumId w:val="24"/>
   </w:num>
   <w:num w:numId="39" w16cid:durableId="2120181144">
-    <w:abstractNumId w:val="30"/>
+    <w:abstractNumId w:val="32"/>
   </w:num>
   <w:num w:numId="40" w16cid:durableId="694039534">
-    <w:abstractNumId w:val="15"/>
+    <w:abstractNumId w:val="16"/>
   </w:num>
   <w:num w:numId="41" w16cid:durableId="160202146">
-    <w:abstractNumId w:val="32"/>
+    <w:abstractNumId w:val="34"/>
   </w:num>
   <w:num w:numId="42" w16cid:durableId="857619713">
+    <w:abstractNumId w:val="29"/>
+  </w:num>
+  <w:num w:numId="43" w16cid:durableId="1291664462">
     <w:abstractNumId w:val="28"/>
   </w:num>
-  <w:num w:numId="43" w16cid:durableId="1291664462">
+  <w:num w:numId="44" w16cid:durableId="772360081">
     <w:abstractNumId w:val="27"/>
   </w:num>
-  <w:num w:numId="44" w16cid:durableId="772360081">
-    <w:abstractNumId w:val="26"/>
-  </w:num>
   <w:num w:numId="45" w16cid:durableId="552959225">
-    <w:abstractNumId w:val="19"/>
+    <w:abstractNumId w:val="20"/>
   </w:num>
   <w:num w:numId="46" w16cid:durableId="1878351180">
-    <w:abstractNumId w:val="34"/>
+    <w:abstractNumId w:val="36"/>
   </w:num>
   <w:num w:numId="47" w16cid:durableId="827593670">
     <w:abstractNumId w:val="8"/>
   </w:num>
   <w:num w:numId="48" w16cid:durableId="330915526">
     <w:abstractNumId w:val="3"/>
+  </w:num>
+  <w:num w:numId="49" w16cid:durableId="1248810874">
+    <w:abstractNumId w:val="31"/>
+  </w:num>
+  <w:num w:numId="50" w16cid:durableId="1946227993">
+    <w:abstractNumId w:val="12"/>
   </w:num>
   <w:numIdMacAtCleanup w:val="24"/>
 </w:numbering>

</xml_diff>